<commit_message>
Present the LCC article as an original study
Remove the 2024 preliminary-note framing, DOI, and n=97 comparison
from the manuscript, title page, cover letter, and Word files so the
paper stands on the N = 38 Wenjuan analysis alone.

Co-authored-by: kristinehina23-rgb <kristinehina23-rgb@users.noreply.github.com>
</commit_message>
<xml_diff>
--- a/papers/q1-masters-covid/word/Rathore-Cao-Xu-When-Chinese-class-moved-home.docx
+++ b/papers/q1-masters-covid/word/Rathore-Cao-Xu-When-Chinese-class-moved-home.docx
@@ -2,19 +2,14 @@
 <file path=word/document.xml><?xml version="1.0" encoding="utf-8"?>
 <w:document xmlns:w="http://schemas.openxmlformats.org/wordprocessingml/2006/main" xmlns:m="http://schemas.openxmlformats.org/officeDocument/2006/math" xmlns:r="http://schemas.openxmlformats.org/officeDocument/2006/relationships" xmlns:o="urn:schemas-microsoft-com:office:office" xmlns:v="urn:schemas-microsoft-com:vml" xmlns:w10="urn:schemas-microsoft-com:office:word" xmlns:a="http://schemas.openxmlformats.org/drawingml/2006/main" xmlns:pic="http://schemas.openxmlformats.org/drawingml/2006/picture" xmlns:wp="http://schemas.openxmlformats.org/drawingml/2006/wordprocessingDrawing">
   <w:body>
-    <w:p>
-      <w:pPr>
-        <w:pStyle w:val="Title"/>
-      </w:pPr>
-      <w:r>
-        <w:t xml:space="preserve">When Chinese class moved home: Pakistani students, infrastructure, and platform access</w:t>
-      </w:r>
-    </w:p>
     <w:bookmarkStart w:id="55" w:name="Xe9071a26e2a253abc760e4ae7a86f3c225b62e5"/>
     <w:p>
       <w:pPr>
         <w:pStyle w:val="Heading1"/>
       </w:pPr>
+      <w:r>
+        <w:t xml:space="preserve">When Chinese class moved home: Pakistani students, infrastructure, and platform access</w:t>
+      </w:r>
     </w:p>
     <w:p>
       <w:pPr>
@@ -103,7 +98,7 @@
         <w:t xml:space="preserve"> </w:t>
       </w:r>
       <w:r>
-        <w:t xml:space="preserve">Data were collected while the first author was an M.Phil. scholar at the School of International Cultural Exchange, Central China Normal University. Rathore and Cao (2024) is a short preliminary note on the same project. The present article reports a new item-level analysis of the questionnaire export. We thank the students who took part.</w:t>
+        <w:t xml:space="preserve">Data were collected while the first author was an M.Phil. scholar at the School of International Cultural Exchange, Central China Normal University. We thank the students who took part.</w:t>
       </w:r>
     </w:p>
     <w:p>
@@ -157,7 +152,7 @@
         <w:t xml:space="preserve"> </w:t>
       </w:r>
       <w:r>
-        <w:t xml:space="preserve">A de-identified analysis file is available from the corresponding author. Files containing names or IP addresses will not be shared. The 2024 note is at https://doi.org/10.5281/zenodo.13267236.</w:t>
+        <w:t xml:space="preserve">A de-identified analysis file is available from the corresponding author. Files containing names or IP addresses will not be shared.</w:t>
       </w:r>
     </w:p>
     <w:bookmarkStart w:id="20" w:name="abstract"/>
@@ -174,7 +169,7 @@
         <w:pStyle w:val="FirstParagraph"/>
       </w:pPr>
       <w:r>
-        <w:t xml:space="preserve">This article reports a new analysis of a Wenjuan questionnaire (N = 38; 5 to 8 February 2022) completed mainly by Pakistani students who continued Chinese-university language classes during COVID-19. Not every response was sent from Pakistan: nine IP addresses were labelled mainland China. Unstable networks (76.3%), power cuts (42.1%), and homes that were not quiet (71.1%) were common. Very high psychological stress was reported by 36.8%. Saying that the home affected study</w:t>
+        <w:t xml:space="preserve">This article reports an original questionnaire study (N = 38; 5 to 8 February 2022) of mainly Pakistani students who continued Chinese-university language classes during COVID-19. Not every response was sent from Pakistan: nine IP addresses were labelled mainland China. Unstable networks (76.3%), power cuts (42.1%), and homes that were not quiet (71.1%) were common. Very high psychological stress was reported by 36.8%. Saying that the home affected study</w:t>
       </w:r>
       <w:r>
         <w:t xml:space="preserve"> </w:t>
@@ -223,7 +218,7 @@
         <w:t xml:space="preserve">”</w:t>
       </w:r>
       <w:r>
-        <w:t xml:space="preserve">; Zoom and WhatsApp were more often marked available. Half the sample said online study could replace campus classes; women more often said it could not. The article reads these results through sequential digital inequality and, cautiously, language investment (proxies, not a full investment instrument). Chinese-course design on this corridor must fit household infrastructure and platform access, not only textbook culture. The 2024 n = 97 tables are not used. The male majority (27 of 38) is a sample limit.</w:t>
+        <w:t xml:space="preserve">; Zoom and WhatsApp were more often marked available. Half the sample said online study could replace campus classes; women more often said it could not. The article reads these results through sequential digital inequality and, cautiously, language investment (proxies, not a full investment instrument). Chinese-course design on this corridor must fit household infrastructure and platform access, not only textbook culture. The male majority (27 of 38) is a sample limit.</w:t>
       </w:r>
     </w:p>
     <w:p>
@@ -259,7 +254,7 @@
         <w:pStyle w:val="FirstParagraph"/>
       </w:pPr>
       <w:r>
-        <w:t xml:space="preserve">When Chinese universities moved instruction online in 2020, many Pakistani students were already in Pakistan or returned there. Scholarship holders and degree students continued their Chinese-language courses from family homes, hostels, and towns with load-shedding, prepaid mobile data, and little quiet space (Rathore &amp; Cao, 2024). Large numbers of Pakistani students were enrolled in Chinese universities on government and bilateral awards; this file does not record award type. This article examines emergency remote teaching (Hodges et al., 2020) of Chinese as an additional language. The courses crossed a national and infrastructural border and entered households that had not been designed as language classrooms.</w:t>
+        <w:t xml:space="preserve">When Chinese universities moved instruction online in 2020, many Pakistani students were already in Pakistan or returned there. Scholarship holders and degree students continued their Chinese-language courses from family homes, hostels, and towns with load-shedding, prepaid mobile data, and little quiet space. Large numbers of Pakistani students were enrolled in Chinese universities on government and bilateral awards; this file does not record award type. This article examines emergency remote teaching (Hodges et al., 2020) of Chinese as an additional language. The courses crossed a national and infrastructural border and entered households that had not been designed as language classrooms.</w:t>
       </w:r>
     </w:p>
     <w:p>
@@ -354,15 +349,7 @@
         <w:pStyle w:val="BodyText"/>
       </w:pPr>
       <w:r>
-        <w:t xml:space="preserve">A short note on this population has been published (Rathore &amp; Cao, 2024). It described a 14-item survey of 97 students. The only coded questionnaire file retained is a 30-question Chinese-medium Wenjuan export with 38 complete responses (5 to 8 February 2022). The present article is a new analysis of that export. The 2024 sample size, scales, and percentages are not reused.</w:t>
-      </w:r>
-    </w:p>
-    <w:p>
-      <w:pPr>
-        <w:pStyle w:val="BodyText"/>
-      </w:pPr>
-      <w:r>
-        <w:t xml:space="preserve">The research question is: How did digital inequality, including which Chinese-campus platforms opened from homes outside the Chinese campus network, relate to how these learners could take part in Chinese class under emergency remote teaching? Three operational questions follow in Section 3. Investment is used as a reading, not as a scale in the questionnaire.</w:t>
+        <w:t xml:space="preserve">This article reports a Wenjuan questionnaire completed by 38 students between 5 and 8 February 2022. The research question is: How did digital inequality, including which Chinese-campus platforms opened from homes outside the Chinese campus network, relate to how these learners could take part in Chinese class under emergency remote teaching? Three operational questions follow in Section 3. Investment is used as a reading, not as a scale in the questionnaire.</w:t>
       </w:r>
     </w:p>
     <w:p>
@@ -618,7 +605,7 @@
         <w:pStyle w:val="FirstParagraph"/>
       </w:pPr>
       <w:r>
-        <w:t xml:space="preserve">Recent literature still leaves several gaps that these data can address. Post-pandemic CALL has moved toward normalisation and AI, often in English classrooms with working campus Wi-Fi (Moorhouse et al., 2023; Darvin, 2025). Digital-inequality research under-represents additional-language classrooms. Pakistan EdTech gender work has so far spoken mainly about school homes rather than Chinese-university language courses taken from Pakistan (Raza &amp; Hennessy, 2025). ICLE localisation research under-represents the home as a site of delivery, and under-represents which Chinese-campus apps open from phones outside China. Investment research is asking for evidence on international students of languages other than English (Hajar &amp; Karakuş, 2024) but has little South-South Chinese evidence. Rathore and Cao (2024) described the phenomenon with descriptive tools. An account is still needed of how inequality entered participation in class, and of what course design should do with that knowledge after the emergency.</w:t>
+        <w:t xml:space="preserve">Recent literature still leaves several gaps that these data can address. Post-pandemic CALL has moved toward normalisation and AI, often in English classrooms with working campus Wi-Fi (Moorhouse et al., 2023; Darvin, 2025). Digital-inequality research under-represents additional-language classrooms. Pakistan EdTech gender work has so far spoken mainly about school homes rather than Chinese-university language courses taken from Pakistan (Raza &amp; Hennessy, 2025). ICLE localisation research under-represents the home as a site of delivery, and under-represents which Chinese-campus apps open from phones outside China. Investment research is asking for evidence on international students of languages other than English (Hajar &amp; Karakuş, 2024) but has little South-South Chinese evidence. An account is still needed of how inequality entered participation in class, and of what course design should do with that knowledge after the emergency.</w:t>
       </w:r>
     </w:p>
     <w:bookmarkEnd w:id="26"/>
@@ -782,7 +769,7 @@
         <w:pStyle w:val="BodyText"/>
       </w:pPr>
       <w:r>
-        <w:t xml:space="preserve">The master’s project included a Chinese-medium online questionnaire (Rathore &amp; Cao, 2024). This article is a new quantitative analysis of the only coded export the authors retain: a Wenjuan file on influencing factors in international students’ online Chinese learning during COVID-19, with 38 complete cases (5 to 8 February 2022). No additional wave or paper-survey file exists. The 2024 printed frequency tables (reported n = 97; 14-item Likert) are not analysed, because this export does not contain them. The design is a cross-sectional questionnaire study of how that course was lived from wherever the student sat that week. It is not a national census.</w:t>
+        <w:t xml:space="preserve">Data come from a Chinese-medium Wenjuan questionnaire on influencing factors in international students’ online Chinese learning during COVID-19 (38 complete cases, 5 to 8 February 2022). The design is a cross-sectional questionnaire study of how that course was lived from wherever the student sat that week. It is not a national census.</w:t>
       </w:r>
     </w:p>
     <w:bookmarkEnd w:id="29"/>
@@ -1061,14 +1048,6 @@
         </w:tc>
       </w:tr>
     </w:tbl>
-    <w:p>
-      <w:pPr>
-        <w:pStyle w:val="BodyText"/>
-      </w:pPr>
-      <w:r>
-        <w:t xml:space="preserve">The four 2024 scales are not forced onto this instrument.</w:t>
-      </w:r>
-    </w:p>
     <w:p>
       <w:pPr>
         <w:pStyle w:val="BodyText"/>
@@ -4247,7 +4226,7 @@
         <w:pStyle w:val="Compact"/>
       </w:pPr>
       <w:r>
-        <w:t xml:space="preserve">The 2024 note’s tabulated N is not used. Rathore and Cao (2024) printed n = 97. The only surviving coded file has 38 complete cases, which is the N of this article.</w:t>
+        <w:t xml:space="preserve">Male-majority convenience sample (27 men, 11 women), phones only, nine China-labelled IPs. Findings describe this network, not Pakistani women as a group. Sensitivity on n = 37 and n = 29 does not remove that limit.</w:t>
       </w:r>
     </w:p>
     <w:p>
@@ -4259,7 +4238,25 @@
         <w:pStyle w:val="Compact"/>
       </w:pPr>
       <w:r>
-        <w:t xml:space="preserve">Male-majority convenience sample (27 men, 11 women), phones only, nine China-labelled IPs. Findings describe this network, not Pakistani women as a group. Sensitivity on n = 37 and n = 29 does not remove that limit.</w:t>
+        <w:t xml:space="preserve">Self-report; no HSK scores or oral tasks.</w:t>
+      </w:r>
+      <w:r>
+        <w:t xml:space="preserve"> </w:t>
+      </w:r>
+      <w:r>
+        <w:t xml:space="preserve">“</w:t>
+      </w:r>
+      <w:r>
+        <w:t xml:space="preserve">Advanced</w:t>
+      </w:r>
+      <w:r>
+        <w:t xml:space="preserve">”</w:t>
+      </w:r>
+      <w:r>
+        <w:t xml:space="preserve"> </w:t>
+      </w:r>
+      <w:r>
+        <w:t xml:space="preserve">is a self-rating.</w:t>
       </w:r>
     </w:p>
     <w:p>
@@ -4271,25 +4268,7 @@
         <w:pStyle w:val="Compact"/>
       </w:pPr>
       <w:r>
-        <w:t xml:space="preserve">Self-report; no HSK scores or oral tasks.</w:t>
-      </w:r>
-      <w:r>
-        <w:t xml:space="preserve"> </w:t>
-      </w:r>
-      <w:r>
-        <w:t xml:space="preserve">“</w:t>
-      </w:r>
-      <w:r>
-        <w:t xml:space="preserve">Advanced</w:t>
-      </w:r>
-      <w:r>
-        <w:t xml:space="preserve">”</w:t>
-      </w:r>
-      <w:r>
-        <w:t xml:space="preserve"> </w:t>
-      </w:r>
-      <w:r>
-        <w:t xml:space="preserve">is a self-rating.</w:t>
+        <w:t xml:space="preserve">Chinese-medium items with non-native wording may have been understood unevenly.</w:t>
       </w:r>
     </w:p>
     <w:p>
@@ -4301,7 +4280,7 @@
         <w:pStyle w:val="Compact"/>
       </w:pPr>
       <w:r>
-        <w:t xml:space="preserve">Chinese-medium items with non-native wording may have been understood unevenly.</w:t>
+        <w:t xml:space="preserve">The export does not name the host university, textbook, or award type. Investment was not measured as a scale.</w:t>
       </w:r>
     </w:p>
     <w:p>
@@ -4313,18 +4292,6 @@
         <w:pStyle w:val="Compact"/>
       </w:pPr>
       <w:r>
-        <w:t xml:space="preserve">The export does not name the host university, textbook, or award type. Investment was not measured as a scale.</w:t>
-      </w:r>
-    </w:p>
-    <w:p>
-      <w:pPr>
-        <w:numPr>
-          <w:ilvl w:val="0"/>
-          <w:numId w:val="1002"/>
-        </w:numPr>
-        <w:pStyle w:val="Compact"/>
-      </w:pPr>
-      <w:r>
         <w:t xml:space="preserve">COVID-specific delivery. The transferable claim concerns inequality, home, platform access, and participation, not the pandemic as such.</w:t>
       </w:r>
     </w:p>
@@ -4819,27 +4786,6 @@
       </w:r>
       <w:r>
         <w:t xml:space="preserve">(5), 503-515. https://doi.org/10.1515/multi-2020-0136</w:t>
-      </w:r>
-    </w:p>
-    <w:p>
-      <w:pPr>
-        <w:pStyle w:val="BodyText"/>
-      </w:pPr>
-      <w:r>
-        <w:t xml:space="preserve">Rathore, H., &amp; Cao, H. (2024). An exploration the challenges and impacts during COVID-19 for online Chinese learning in Pakistan.</w:t>
-      </w:r>
-      <w:r>
-        <w:t xml:space="preserve"> </w:t>
-      </w:r>
-      <w:r>
-        <w:rPr>
-          <w:iCs/>
-          <w:i/>
-        </w:rPr>
-        <w:t xml:space="preserve">Arbor, 11</w:t>
-      </w:r>
-      <w:r>
-        <w:t xml:space="preserve">(1), 194-201. https://doi.org/10.5281/zenodo.13267236</w:t>
       </w:r>
     </w:p>
     <w:p>
@@ -5675,12 +5621,11 @@
     <w:qFormat/>
     <w:rsid w:val="00FC693F"/>
     <w:pPr>
-      <w:spacing w:after="0" w:before="0" w:line="480" w:lineRule="auto"/>
+      <w:spacing w:after="0" w:line="480" w:lineRule="auto"/>
     </w:pPr>
     <w:rPr>
-      <w:rFonts w:ascii="Times New Roman" w:cs="Times New Roman" w:eastAsia="SimSun" w:hAnsi="Times New Roman"/>
-      <w:b w:val="0"/>
-      <w:i w:val="0"/>
+      <w:rFonts w:ascii="Times New Roman" w:hAnsi="Times New Roman"/>
+      <w:color w:val="000000"/>
       <w:sz w:val="24"/>
     </w:rPr>
   </w:style>
@@ -5739,16 +5684,15 @@
     <w:pPr>
       <w:keepNext/>
       <w:keepLines/>
-      <w:spacing w:after="120" w:before="240" w:line="480" w:lineRule="auto"/>
+      <w:spacing w:after="0" w:before="480"/>
       <w:outlineLvl w:val="0"/>
     </w:pPr>
     <w:rPr>
-      <w:rFonts w:ascii="Times New Roman" w:asciiTheme="majorHAnsi" w:cs="Times New Roman" w:cstheme="majorBidi" w:eastAsia="SimSun" w:eastAsiaTheme="majorEastAsia" w:hAnsi="Times New Roman" w:hAnsiTheme="majorHAnsi"/>
+      <w:rFonts w:ascii="Times New Roman" w:asciiTheme="majorHAnsi" w:cstheme="majorBidi" w:eastAsiaTheme="majorEastAsia" w:hAnsi="Times New Roman" w:hAnsiTheme="majorHAnsi"/>
       <w:b/>
       <w:bCs/>
-      <w:i w:val="0"/>
-      <w:color w:themeColor="accent1" w:themeShade="BF" w:val="365F91"/>
-      <w:sz w:val="24"/>
+      <w:color w:val="000000"/>
+      <w:sz w:val="28"/>
       <w:szCs w:val="28"/>
     </w:rPr>
   </w:style>
@@ -5764,16 +5708,15 @@
     <w:pPr>
       <w:keepNext/>
       <w:keepLines/>
-      <w:spacing w:after="80" w:before="200" w:line="480" w:lineRule="auto"/>
+      <w:spacing w:after="0" w:before="200"/>
       <w:outlineLvl w:val="1"/>
     </w:pPr>
     <w:rPr>
-      <w:rFonts w:ascii="Times New Roman" w:asciiTheme="majorHAnsi" w:cs="Times New Roman" w:cstheme="majorBidi" w:eastAsia="SimSun" w:eastAsiaTheme="majorEastAsia" w:hAnsi="Times New Roman" w:hAnsiTheme="majorHAnsi"/>
+      <w:rFonts w:ascii="Times New Roman" w:asciiTheme="majorHAnsi" w:cstheme="majorBidi" w:eastAsiaTheme="majorEastAsia" w:hAnsi="Times New Roman" w:hAnsiTheme="majorHAnsi"/>
       <w:b/>
       <w:bCs/>
-      <w:i w:val="0"/>
-      <w:color w:themeColor="accent1" w:val="4F81BD"/>
-      <w:sz w:val="24"/>
+      <w:color w:val="000000"/>
+      <w:sz w:val="26"/>
       <w:szCs w:val="26"/>
     </w:rPr>
   </w:style>
@@ -5789,16 +5732,14 @@
     <w:pPr>
       <w:keepNext/>
       <w:keepLines/>
-      <w:spacing w:after="80" w:before="160" w:line="480" w:lineRule="auto"/>
+      <w:spacing w:after="0" w:before="200"/>
       <w:outlineLvl w:val="2"/>
     </w:pPr>
     <w:rPr>
-      <w:rFonts w:ascii="Times New Roman" w:asciiTheme="majorHAnsi" w:cs="Times New Roman" w:cstheme="majorBidi" w:eastAsia="SimSun" w:eastAsiaTheme="majorEastAsia" w:hAnsi="Times New Roman" w:hAnsiTheme="majorHAnsi"/>
+      <w:rFonts w:ascii="Times New Roman" w:asciiTheme="majorHAnsi" w:cstheme="majorBidi" w:eastAsiaTheme="majorEastAsia" w:hAnsi="Times New Roman" w:hAnsiTheme="majorHAnsi"/>
       <w:b/>
       <w:bCs/>
-      <w:i w:val="0"/>
-      <w:color w:themeColor="accent1" w:val="4F81BD"/>
-      <w:sz w:val="24"/>
+      <w:color w:val="000000"/>
     </w:rPr>
   </w:style>
   <w:style w:styleId="Heading4" w:type="paragraph">
@@ -6032,17 +5973,15 @@
       <w:pBdr>
         <w:bottom w:color="4F81BD" w:space="4" w:sz="8" w:themeColor="accent1" w:val="single"/>
       </w:pBdr>
-      <w:spacing w:after="120" w:before="0" w:line="480" w:lineRule="auto"/>
+      <w:spacing w:after="300" w:line="240" w:lineRule="auto"/>
       <w:contextualSpacing/>
     </w:pPr>
     <w:rPr>
-      <w:rFonts w:ascii="Times New Roman" w:asciiTheme="majorHAnsi" w:cs="Times New Roman" w:cstheme="majorBidi" w:eastAsia="SimSun" w:eastAsiaTheme="majorEastAsia" w:hAnsi="Times New Roman" w:hAnsiTheme="majorHAnsi"/>
-      <w:b/>
-      <w:i w:val="0"/>
-      <w:color w:themeColor="text2" w:themeShade="BF" w:val="17365D"/>
+      <w:rFonts w:ascii="Times New Roman" w:asciiTheme="majorHAnsi" w:cstheme="majorBidi" w:eastAsiaTheme="majorEastAsia" w:hAnsi="Times New Roman" w:hAnsiTheme="majorHAnsi"/>
+      <w:color w:val="000000"/>
       <w:spacing w:val="5"/>
       <w:kern w:val="28"/>
-      <w:sz w:val="32"/>
+      <w:sz w:val="52"/>
       <w:szCs w:val="52"/>
     </w:rPr>
   </w:style>

</xml_diff>

<commit_message>
Rewrite the manuscript in the voice of an LCC article
Cut supervisor-memo caveats, data-file talk, and numbered policy lists.
The article now argues one case (household and platform access as
curriculum) and keeps the N = 38 results unchanged.

Co-authored-by: kristinehina23-rgb <kristinehina23-rgb@users.noreply.github.com>
</commit_message>
<xml_diff>
--- a/papers/q1-masters-covid/word/Rathore-Cao-Xu-When-Chinese-class-moved-home.docx
+++ b/papers/q1-masters-covid/word/Rathore-Cao-Xu-When-Chinese-class-moved-home.docx
@@ -2,7 +2,7 @@
 <file path=word/document.xml><?xml version="1.0" encoding="utf-8"?>
 <w:document xmlns:w="http://schemas.openxmlformats.org/wordprocessingml/2006/main" xmlns:m="http://schemas.openxmlformats.org/officeDocument/2006/math" xmlns:r="http://schemas.openxmlformats.org/officeDocument/2006/relationships" xmlns:o="urn:schemas-microsoft-com:office:office" xmlns:v="urn:schemas-microsoft-com:vml" xmlns:w10="urn:schemas-microsoft-com:office:word" xmlns:a="http://schemas.openxmlformats.org/drawingml/2006/main" xmlns:pic="http://schemas.openxmlformats.org/drawingml/2006/picture" xmlns:wp="http://schemas.openxmlformats.org/drawingml/2006/wordprocessingDrawing">
   <w:body>
-    <w:bookmarkStart w:id="55" w:name="Xe9071a26e2a253abc760e4ae7a86f3c225b62e5"/>
+    <w:bookmarkStart w:id="49" w:name="Xe9071a26e2a253abc760e4ae7a86f3c225b62e5"/>
     <w:p>
       <w:pPr>
         <w:pStyle w:val="Heading1"/>
@@ -169,7 +169,7 @@
         <w:pStyle w:val="FirstParagraph"/>
       </w:pPr>
       <w:r>
-        <w:t xml:space="preserve">This article reports an original questionnaire study (N = 38; 5 to 8 February 2022) of mainly Pakistani students who continued Chinese-university language classes during COVID-19. Not every response was sent from Pakistan: nine IP addresses were labelled mainland China. Unstable networks (76.3%), power cuts (42.1%), and homes that were not quiet (71.1%) were common. Very high psychological stress was reported by 36.8%. Saying that the home affected study</w:t>
+        <w:t xml:space="preserve">When Chinese universities moved instruction online, many Pakistani students continued their language courses from households that had not been designed as classrooms. This article treats that shift as a problem of language, culture, and curriculum: Chinese as an additional language was delivered through a campus plan that assumed a working login, a live oral hour, and a quiet room. A questionnaire completed by 38 students in February 2022 (mainly Pakistani; nine responses labelled mainland China) examined how digital inequality and platform access shaped participation. Unstable networks (76.3%), power cuts (42.1%), and homes that were not quiet (71.1%) were common; 36.8% reported very high stress. Homes that affected study</w:t>
       </w:r>
       <w:r>
         <w:t xml:space="preserve"> </w:t>
@@ -187,38 +187,7 @@
         <w:t xml:space="preserve"> </w:t>
       </w:r>
       <w:r>
-        <w:t xml:space="preserve">was associated with very high stress (OR = 25.67, 95% CI [4.42, 149.00],</w:t>
-      </w:r>
-      <w:r>
-        <w:t xml:space="preserve"> </w:t>
-      </w:r>
-      <w:r>
-        <w:rPr>
-          <w:iCs/>
-          <w:i/>
-        </w:rPr>
-        <w:t xml:space="preserve">p</w:t>
-      </w:r>
-      <w:r>
-        <w:t xml:space="preserve"> </w:t>
-      </w:r>
-      <w:r>
-        <w:t xml:space="preserve">&lt; .001). Worse internet speed tracked worse learning appraisal (ρ = .65). A count of infrastructure problems did not (ρ = .02). Campus apps such as QQ and Chaoxing were often marked unusable from</w:t>
-      </w:r>
-      <w:r>
-        <w:t xml:space="preserve"> </w:t>
-      </w:r>
-      <w:r>
-        <w:t xml:space="preserve">“</w:t>
-      </w:r>
-      <w:r>
-        <w:t xml:space="preserve">my country</w:t>
-      </w:r>
-      <w:r>
-        <w:t xml:space="preserve">”</w:t>
-      </w:r>
-      <w:r>
-        <w:t xml:space="preserve">; Zoom and WhatsApp were more often marked available. Half the sample said online study could replace campus classes; women more often said it could not. The article reads these results through sequential digital inequality and, cautiously, language investment (proxies, not a full investment instrument). Chinese-course design on this corridor must fit household infrastructure and platform access, not only textbook culture. The male majority (27 of 38) is a sample limit.</w:t>
+        <w:t xml:space="preserve">were associated with very high stress (OR = 25.67, 95% CI [4.42, 149.00]). Worse internet speed tracked worse learning appraisal (ρ = .65). Campus applications such as QQ and Chaoxing were often marked unusable; Zoom and WhatsApp were more often marked available. Half the sample said online study could replace campus classes; women more often said it could not. Localising Chinese on this corridor means fitting delivery to the household and to the application that opens, not only to textbook culture.</w:t>
       </w:r>
     </w:p>
     <w:p>
@@ -254,7 +223,7 @@
         <w:pStyle w:val="FirstParagraph"/>
       </w:pPr>
       <w:r>
-        <w:t xml:space="preserve">When Chinese universities moved instruction online in 2020, many Pakistani students were already in Pakistan or returned there. Scholarship holders and degree students continued their Chinese-language courses from family homes, hostels, and towns with load-shedding, prepaid mobile data, and little quiet space. Large numbers of Pakistani students were enrolled in Chinese universities on government and bilateral awards; this file does not record award type. This article examines emergency remote teaching (Hodges et al., 2020) of Chinese as an additional language. The courses crossed a national and infrastructural border and entered households that had not been designed as language classrooms.</w:t>
+        <w:t xml:space="preserve">When Chinese universities moved instruction online in 2020, many Pakistani students were already in Pakistan or soon returned there. They remained enrolled in Chinese-university language courses, yet the classroom they entered was a family home, a hostel, or a room shared with siblings, prepaid mobile data, and load-shedding. Chinese as an additional language did not disappear. What changed was the site at which a campus course had to be lived.</w:t>
       </w:r>
     </w:p>
     <w:p>
@@ -262,33 +231,7 @@
         <w:pStyle w:val="BodyText"/>
       </w:pPr>
       <w:r>
-        <w:t xml:space="preserve">That shift also changed the curriculum in practice. A Chinese-university language course is more than a textbook and an HSK calendar. It is a planned sequence of live hours, oral tasks, and campus platforms that assume a dormitory, a timetable, and a login that works. Emergency remote teaching kept those elements and changed the site. Learners met the old campus course plan in households and other off-campus settings rather than in a redesigned distance-education programme.</w:t>
-      </w:r>
-    </w:p>
-    <w:p>
-      <w:pPr>
-        <w:pStyle w:val="BodyText"/>
-      </w:pPr>
-      <w:r>
-        <w:t xml:space="preserve">Research on COVID-19 and language education documented teacher coping, task redesign, and learner anxiety, mainly in English-language classrooms or in China-based programmes (MacIntyre et al., 2020; Gacs et al., 2020; Moorhouse &amp; Kohnke, 2021; Xia et al., 2022). Research on International Chinese Language Education (ICLE) asked how textbooks, HSK washback, and cultural content travel into overseas programmes, including Pakistani universities and Confucius Institutes (Zhao &amp; Huang, 2010; Gong, Gao, &amp; Lyu, 2020). International students of Chinese in Chinese universities have already been treated as a language, culture, and curriculum problem (Gao &amp; Hua, 2021; Gong, Gao, Li, &amp; Lai, 2020). Few studies examine Pakistani students who belong to Chinese universities but study Chinese from Pakistani homes. That interrupted South-South route is the reverse of the usual</w:t>
-      </w:r>
-      <w:r>
-        <w:t xml:space="preserve"> </w:t>
-      </w:r>
-      <w:r>
-        <w:t xml:space="preserve">“</w:t>
-      </w:r>
-      <w:r>
-        <w:t xml:space="preserve">international student in China</w:t>
-      </w:r>
-      <w:r>
-        <w:t xml:space="preserve">”</w:t>
-      </w:r>
-      <w:r>
-        <w:t xml:space="preserve"> </w:t>
-      </w:r>
-      <w:r>
-        <w:t xml:space="preserve">account. In this article</w:t>
+        <w:t xml:space="preserve">A Chinese-university language course is more than a textbook and an HSK calendar. It is a planned sequence of live hours, oral tasks, and campus platforms that assume a dormitory, a timetable, and a login that works. Emergency remote teaching (Hodges et al., 2020) kept those elements and changed the place. Learners met the old course plan in households rather than in a redesigned distance-education programme. In this article</w:t>
       </w:r>
       <w:r>
         <w:t xml:space="preserve"> </w:t>
@@ -304,7 +247,7 @@
         <w:t xml:space="preserve"> </w:t>
       </w:r>
       <w:r>
-        <w:t xml:space="preserve">means the household as the site of a Chinese class, and</w:t>
+        <w:t xml:space="preserve">means the household as the site of a Chinese class: the social organisation of space, work, gender, and time in which speaking and listening had to happen.</w:t>
       </w:r>
       <w:r>
         <w:t xml:space="preserve"> </w:t>
@@ -314,13 +257,13 @@
           <w:iCs/>
           <w:i/>
         </w:rPr>
-        <w:t xml:space="preserve">curriculum</w:t>
+        <w:t xml:space="preserve">Curriculum</w:t>
       </w:r>
       <w:r>
         <w:t xml:space="preserve"> </w:t>
       </w:r>
       <w:r>
-        <w:t xml:space="preserve">means the campus course plan (live hour, oral tasks, campus login) when it is used off campus. It does not mean a textbook-content analysis.</w:t>
+        <w:t xml:space="preserve">means the campus delivery plan (the live hour, the oral task, the campus login) when that plan is used off campus.</w:t>
       </w:r>
     </w:p>
     <w:p>
@@ -328,7 +271,49 @@
         <w:pStyle w:val="BodyText"/>
       </w:pPr>
       <w:r>
-        <w:t xml:space="preserve">COVID special issues have largely closed. Two later strands now dominate the field. After the return to campus, digital tools became ordinary in many in-person language classrooms (Moorhouse, 2023; Moorhouse, Wong, &amp; Li, 2023). Reviews also note that crisis teaching often used videoconferencing to copy the campus hour (Stockwell &amp; Wang, 2023). A second strand is generative AI, which now appears in work on language investment (Darvin, 2025). The 2022 questionnaire contains no items on ChatGPT or similar tools, so this article does not treat AI as a finding. The present data speak to a more basic problem that has not disappeared: unequal digital conditions, and the question of which campus platforms open, for students on this South-South route. Hajar and Karakuş (2024), writing in</w:t>
+        <w:t xml:space="preserve">Research on COVID-19 and language education documented teacher coping, task redesign, and learner anxiety, mainly in English-language classrooms or in China-based programmes (MacIntyre et al., 2020; Gacs et al., 2020; Moorhouse &amp; Kohnke, 2021; Xia et al., 2022). International Chinese Language Education (ICLE) has asked how textbooks, tests, and cultural content travel into overseas programmes (Zhao &amp; Huang, 2010; Gong, Gao, &amp; Lyu, 2020), and how international students experience language and culture</w:t>
+      </w:r>
+      <w:r>
+        <w:t xml:space="preserve"> </w:t>
+      </w:r>
+      <w:r>
+        <w:rPr>
+          <w:iCs/>
+          <w:i/>
+        </w:rPr>
+        <w:t xml:space="preserve">in</w:t>
+      </w:r>
+      <w:r>
+        <w:t xml:space="preserve"> </w:t>
+      </w:r>
+      <w:r>
+        <w:t xml:space="preserve">Chinese universities (Gao &amp; Hua, 2021; Gong, Gao, Li, &amp; Lai, 2020). Far less is known about Pakistani students who belong to Chinese universities but study Chinese from homes outside the Chinese campus network. That interrupted South-South route is the reverse of the usual</w:t>
+      </w:r>
+      <w:r>
+        <w:t xml:space="preserve"> </w:t>
+      </w:r>
+      <w:r>
+        <w:t xml:space="preserve">“</w:t>
+      </w:r>
+      <w:r>
+        <w:t xml:space="preserve">international student in China</w:t>
+      </w:r>
+      <w:r>
+        <w:t xml:space="preserve">”</w:t>
+      </w:r>
+      <w:r>
+        <w:t xml:space="preserve"> </w:t>
+      </w:r>
+      <w:r>
+        <w:t xml:space="preserve">account.</w:t>
+      </w:r>
+    </w:p>
+    <w:p>
+      <w:pPr>
+        <w:pStyle w:val="BodyText"/>
+      </w:pPr>
+      <w:r>
+        <w:t xml:space="preserve">The field has since moved on. Digital tools have become ordinary in many face-to-face language classrooms (Moorhouse, 2023; Moorhouse, Wong, &amp; Li, 2023), and investment research has begun to ask how generative AI reconfigures access and meaning-making (Darvin, 2025). Hybrid ICLE and HSK delivery, however, still often assume a login, a bandwidth, and a quiet room. Hajar and Karakuş (2024), writing in</w:t>
       </w:r>
       <w:r>
         <w:t xml:space="preserve"> </w:t>
@@ -341,7 +326,7 @@
         <w:t xml:space="preserve">Language, Culture and Curriculum</w:t>
       </w:r>
       <w:r>
-        <w:t xml:space="preserve">, call for research on the (dis)investment of international students in languages other than English. Pakistani learners of Chinese belong in that agenda. Hybrid ICLE and HSK delivery on Chinese-campus systems still assume logins, bandwidth, and a quiet room. The present sample shows that many homes could not supply those conditions.</w:t>
+        <w:t xml:space="preserve">, call for evidence on the (dis)investment of international students in languages other than English. Pakistani learners of Chinese belong on that agenda, but the first question is more basic: who could enter the class at all?</w:t>
       </w:r>
     </w:p>
     <w:p>
@@ -349,27 +334,55 @@
         <w:pStyle w:val="BodyText"/>
       </w:pPr>
       <w:r>
-        <w:t xml:space="preserve">This article reports a Wenjuan questionnaire completed by 38 students between 5 and 8 February 2022. The research question is: How did digital inequality, including which Chinese-campus platforms opened from homes outside the Chinese campus network, relate to how these learners could take part in Chinese class under emergency remote teaching? Three operational questions follow in Section 3. Investment is used as a reading, not as a scale in the questionnaire.</w:t>
+        <w:t xml:space="preserve">This article reports a questionnaire completed by 38 students between 5 and 8 February 2022. It asks how digital inequality, including which Chinese-campus platforms opened from homes outside the campus network, related to participation in Chinese class under emergency remote teaching. Three questions guide the analysis:</w:t>
       </w:r>
     </w:p>
     <w:p>
       <w:pPr>
-        <w:pStyle w:val="BodyText"/>
-      </w:pPr>
-      <w:r>
-        <w:t xml:space="preserve">The article offers three contributions. First, an item-level description of the export, a three-item learning-appraisal scale (α = .84), Fisher tests with odds ratios, Spearman correlations, and sensitivity checks (Pakistani-only n = 37; offshore-IP n = 29). Second, a reading of sequential digital inequality (van Dijk, 2020) together with a cautious use of Nortonian investment (Norton, 2013; Darvin &amp; Norton, 2015, 2023) as a lens on participation proxies, with attention to which platforms opened. Third, a practical claim: ICLE localisation has to include the conditions of delivery, not only the cultural content of textbooks.</w:t>
+        <w:numPr>
+          <w:ilvl w:val="0"/>
+          <w:numId w:val="1001"/>
+        </w:numPr>
+        <w:pStyle w:val="Compact"/>
+      </w:pPr>
+      <w:r>
+        <w:t xml:space="preserve">Which material, domestic, and platform conditions characterised emergency remote Chinese classes in this sample?</w:t>
       </w:r>
     </w:p>
     <w:p>
       <w:pPr>
-        <w:pStyle w:val="BodyText"/>
-      </w:pPr>
-      <w:r>
-        <w:t xml:space="preserve">The study does not report learning-gain experiments. It does not argue that COVID-19 is still the main design problem for ICLE. The emergency made an inequality visible. Course design on this route still has to take that inequality into account.</w:t>
+        <w:numPr>
+          <w:ilvl w:val="0"/>
+          <w:numId w:val="1001"/>
+        </w:numPr>
+        <w:pStyle w:val="Compact"/>
+      </w:pPr>
+      <w:r>
+        <w:t xml:space="preserve">How were those conditions related to stress, teacher interaction, and perceived learning?</w:t>
+      </w:r>
+    </w:p>
+    <w:p>
+      <w:pPr>
+        <w:numPr>
+          <w:ilvl w:val="0"/>
+          <w:numId w:val="1001"/>
+        </w:numPr>
+        <w:pStyle w:val="Compact"/>
+      </w:pPr>
+      <w:r>
+        <w:t xml:space="preserve">Did learners treat online Chinese as a legitimate substitute for campus study, and did that judgement differ by gender or by how much they thought they had learned?</w:t>
+      </w:r>
+    </w:p>
+    <w:p>
+      <w:pPr>
+        <w:pStyle w:val="FirstParagraph"/>
+      </w:pPr>
+      <w:r>
+        <w:t xml:space="preserve">The contribution is threefold. Empirically, the study offers an item-level account of household infrastructure, platform access, and participation among Pakistani (and one neighbouring) students of Chinese-university language courses. Conceptually, it reads those findings through sequential digital inequality (van Dijk, 2020) and, more cautiously, through language investment (Norton, 2013; Darvin &amp; Norton, 2015, 2023) as a lens on participation rather than as a measured construct. Practically, it argues that localising Chinese on this corridor has to include the conditions of delivery, not only the cultural content of textbooks.</w:t>
       </w:r>
     </w:p>
     <w:bookmarkEnd w:id="21"/>
-    <w:bookmarkStart w:id="27" w:name="literature-review"/>
+    <w:bookmarkStart w:id="26" w:name="literature-review"/>
     <w:p>
       <w:pPr>
         <w:pStyle w:val="Heading2"/>
@@ -378,31 +391,13 @@
         <w:t xml:space="preserve">2. Literature review</w:t>
       </w:r>
     </w:p>
-    <w:bookmarkStart w:id="22" w:name="Xc254e08a60b7820f65cb66d2252992f40821d4a"/>
+    <w:bookmarkStart w:id="22" w:name="X68dd8ebeb22cc7a16b333349dc5f722ace7abd5"/>
     <w:p>
       <w:pPr>
         <w:pStyle w:val="Heading3"/>
       </w:pPr>
       <w:r>
-        <w:t xml:space="preserve">2.1 Emergency remote teaching and later</w:t>
-      </w:r>
-      <w:r>
-        <w:t xml:space="preserve"> </w:t>
-      </w:r>
-      <w:r>
-        <w:t xml:space="preserve">“</w:t>
-      </w:r>
-      <w:r>
-        <w:t xml:space="preserve">normal</w:t>
-      </w:r>
-      <w:r>
-        <w:t xml:space="preserve">”</w:t>
-      </w:r>
-      <w:r>
-        <w:t xml:space="preserve"> </w:t>
-      </w:r>
-      <w:r>
-        <w:t xml:space="preserve">use of technology</w:t>
+        <w:t xml:space="preserve">2.1 Emergency remote teaching and the copy of the campus hour</w:t>
       </w:r>
     </w:p>
     <w:p>
@@ -410,7 +405,7 @@
         <w:pStyle w:val="FirstParagraph"/>
       </w:pPr>
       <w:r>
-        <w:t xml:space="preserve">Hodges et al. (2020) distinguished emergency remote teaching (ERT) from planned online or blended courses. ERT is a temporary shift under crisis and does not follow a full instructional design cycle. Gacs, Goertler and Spasova (2020) applied that distinction to languages and warned against judging crisis teaching by the standards of mature online programmes. Reviews of language-teacher responses (Moorhouse &amp; Kohnke, 2021) and of learner affect (MacIntyre et al., 2020) report thinner interaction, anxious assessment, and the entry of the domestic setting into the lesson.</w:t>
+        <w:t xml:space="preserve">Hodges et al. (2020) distinguished emergency remote teaching from planned online or blended courses. The former is a temporary shift under crisis and does not follow a full instructional design cycle. Gacs, Goertler and Spasova (2020) applied that distinction to languages and warned against judging crisis teaching by the standards of mature online programmes. Reviews of teacher responses (Moorhouse &amp; Kohnke, 2021) and of learner affect (MacIntyre et al., 2020) report thinner interaction, anxious assessment, and the entry of the domestic setting into the lesson.</w:t>
       </w:r>
     </w:p>
     <w:p>
@@ -418,7 +413,7 @@
         <w:pStyle w:val="BodyText"/>
       </w:pPr>
       <w:r>
-        <w:t xml:space="preserve">Later work relocated rather than cancelled that distinction. Moorhouse, Wong and Li (2023) describe technological normalisation: tools becoming ordinary in everyday teaching, at the same time as generative AI arrives as a further change. Moorhouse (2023) found that, in a well-resourced setting, many teachers kept digital tools after they returned to the physical classroom. Stockwell and Wang (2023) note a narrower pattern: much ERT used videoconferencing to copy face-to-face teaching, and that use can shape how teachers, learners, and administrators judge</w:t>
+        <w:t xml:space="preserve">Later work relocated rather than cancelled the distinction. Moorhouse, Wong and Li (2023) describe technological normalisation: tools becoming ordinary in everyday teaching. Moorhouse (2023) found that, in a well-resourced setting, many teachers kept digital tools after they returned to the physical classroom. Stockwell and Wang (2023) note a narrower pattern. Much emergency teaching used videoconferencing to copy face-to-face teaching, and that copy still shapes how teachers, learners, and administrators judge</w:t>
       </w:r>
       <w:r>
         <w:t xml:space="preserve"> </w:t>
@@ -454,17 +449,17 @@
         <w:t xml:space="preserve"> </w:t>
       </w:r>
       <w:r>
-        <w:t xml:space="preserve">platform trials, and blended models (Zhang et al., 2020; Xia et al., 2022). A 2024 scoping review of online ICLE teaching models still lists technical issues, weak interaction, and time-zone problems among the limits of blended teaching, and already includes ChatGPT among models being trialled (Li &amp; Li, 2024). Much of that work assumes a Chinese campus system at one end of the link and a fairly stable connection at the other. That assumption does not travel automatically to Pakistan.</w:t>
+        <w:t xml:space="preserve">platform trials, and blended models (Zhang et al., 2020; Xia et al., 2022). A later review of online ICLE still lists technical issues, weak interaction, and time-zone problems among the limits of blended teaching (Li &amp; Li, 2024). Much of that work assumes a Chinese campus system at one end of the link and a fairly stable connection at the other. That assumption does not travel automatically to Pakistan.</w:t>
       </w:r>
     </w:p>
     <w:bookmarkEnd w:id="22"/>
-    <w:bookmarkStart w:id="23" w:name="X43963341551ea69db7f62e789aa41beeb72d56e"/>
+    <w:bookmarkStart w:id="23" w:name="digital-inequality-beyond-the-device"/>
     <w:p>
       <w:pPr>
         <w:pStyle w:val="Heading3"/>
       </w:pPr>
       <w:r>
-        <w:t xml:space="preserve">2.2 Digital inequality beyond device ownership</w:t>
+        <w:t xml:space="preserve">2.2 Digital inequality beyond the device</w:t>
       </w:r>
     </w:p>
     <w:p>
@@ -472,25 +467,7 @@
         <w:pStyle w:val="FirstParagraph"/>
       </w:pPr>
       <w:r>
-        <w:t xml:space="preserve">Early</w:t>
-      </w:r>
-      <w:r>
-        <w:t xml:space="preserve"> </w:t>
-      </w:r>
-      <w:r>
-        <w:t xml:space="preserve">“</w:t>
-      </w:r>
-      <w:r>
-        <w:t xml:space="preserve">digital divide</w:t>
-      </w:r>
-      <w:r>
-        <w:t xml:space="preserve">”</w:t>
-      </w:r>
-      <w:r>
-        <w:t xml:space="preserve"> </w:t>
-      </w:r>
-      <w:r>
-        <w:t xml:space="preserve">research asked who had a computer. Later models describe a sequence (van Dijk, 2020; Helsper, 2021): motivational access, material access, skills access, usage access, and outcomes. A student may own a smartphone and still lack a quiet hour, a prepaid balance, a keyboard suited to character input, or the skill to move between DingTalk, a live class, and a PDF textbook. Warschauer (2003) argued that language learning on screens is stratified by these layers. ERT compressed them into one domestic scene.</w:t>
+        <w:t xml:space="preserve">Early digital-divide research asked who had a computer. Later models describe a sequence (van Dijk, 2020; Helsper, 2021): motivational access, material access, skills access, usage access, and outcomes. A student may own a smartphone and still lack a quiet hour, a prepaid balance, a keyboard suited to character input, or the skill to move between a live class and a PDF textbook. Warschauer (2003) argued that language learning on screens is stratified by these layers. Emergency remote teaching compressed them into one domestic scene.</w:t>
       </w:r>
     </w:p>
     <w:p>
@@ -498,17 +475,17 @@
         <w:pStyle w:val="BodyText"/>
       </w:pPr>
       <w:r>
-        <w:t xml:space="preserve">The sequence did not end when campuses reopened. Later education research continues to show that owning a device is not the same as taking part, and that rural-urban and household inequalities still shape who can sit in a live class (Ali, 2020). In Pakistan the household is also structured by gender. Raza and Hennessy (2025), drawing on a large teacher survey and stakeholder interviews, report that girls’ home use of educational technology is shaped by device sharing, parental digital literacy, care work, and norms about who may be online, together with electricity and prepaid data. Students enrolled in China but studying from Pakistan occupied a third position. They were counted as Chinese-university students, assessed by Chinese-university rules, and physically located in Pakistani digital inequality. Which app opened is part of that inequality. Campus Chinese tools (QQ groups, Chaoxing, DingTalk) and consumer tools that work on Pakistani mobile networks (Zoom, WhatsApp) are not interchangeable logins. Copying the campus system into an offshore household can leave the official classroom on an application the student cannot enter.</w:t>
+        <w:t xml:space="preserve">Owning a device is not the same as taking part. Rural-urban and household inequalities continue to shape who can sit in a live class (Ali, 2020). In Pakistan the household is also structured by gender. Raza and Hennessy (2025) show that girls’ home use of educational technology is shaped by device sharing, parental digital literacy, care work, and norms about who may be online, together with electricity and prepaid data. Students enrolled in China but studying from Pakistan occupied a third position. They were counted as Chinese-university students, assessed by Chinese-university rules, and physically located in Pakistani digital inequality. Which application opened is part of that inequality. Campus Chinese tools (QQ groups, Chaoxing, DingTalk) and consumer tools that work on Pakistani mobile networks (Zoom, WhatsApp) are not interchangeable logins. Copying the campus system into an offshore household can leave the official classroom on an application the student cannot enter.</w:t>
       </w:r>
     </w:p>
     <w:bookmarkEnd w:id="23"/>
-    <w:bookmarkStart w:id="24" w:name="investment-and-motivation"/>
+    <w:bookmarkStart w:id="24" w:name="X9a4d76b78ba1fb82fa4a886c1de67efde849cbb"/>
     <w:p>
       <w:pPr>
         <w:pStyle w:val="Heading3"/>
       </w:pPr>
       <w:r>
-        <w:t xml:space="preserve">2.3 Investment and motivation</w:t>
+        <w:t xml:space="preserve">2.3 Investment, motivation, and the household as structure</w:t>
       </w:r>
     </w:p>
     <w:p>
@@ -516,7 +493,7 @@
         <w:pStyle w:val="FirstParagraph"/>
       </w:pPr>
       <w:r>
-        <w:t xml:space="preserve">Motivation research can describe who wants to learn Chinese. It is weaker on who can afford to act as a learner on a given afternoon. Norton’s (2013) construct of investment links identity, capital, and ideology. Learners invest when they expect a return in social and material terms, and they withdraw when the classroom, or its substitute, costs more than it returns. Darvin and Norton (2015) placed investment in a digital era of shifting structures. Darvin and Norton (2023) restated the difference from motivation: a learner may be highly motivated and still not invested in the practices of a given classroom if those practices are exclusionary or unworkable. Under ERT, the relevant structure was the household: electricity, data, siblings, and the social meaning of sitting on a phone during a live class from Wuhan or Beijing.</w:t>
+        <w:t xml:space="preserve">Motivation research can describe who wants to learn Chinese. It is weaker on who can act as a learner on a given afternoon. Norton’s (2013) construct of investment links identity, capital, and ideology. Learners invest when they expect a return in social and material terms, and they withdraw when the classroom, or its substitute, costs more than it returns. Darvin and Norton (2015) placed investment in a digital era of shifting structures. Darvin and Norton (2023) restated the difference from motivation: a learner may be highly motivated and still not invested in the practices of a given classroom if those practices are exclusionary or unworkable. Under emergency remote teaching, the relevant structure was the household: electricity, data, siblings, and the social meaning of sitting on a phone during a live class from Wuhan or Beijing.</w:t>
       </w:r>
     </w:p>
     <w:p>
@@ -524,23 +501,7 @@
         <w:pStyle w:val="BodyText"/>
       </w:pPr>
       <w:r>
-        <w:t xml:space="preserve">The construct remains in current use. Hajar and Karakuş (2024) map three decades of investment research in</w:t>
-      </w:r>
-      <w:r>
-        <w:t xml:space="preserve"> </w:t>
-      </w:r>
-      <w:r>
-        <w:rPr>
-          <w:iCs/>
-          <w:i/>
-        </w:rPr>
-        <w:t xml:space="preserve">Language, Culture and Curriculum</w:t>
-      </w:r>
-      <w:r>
-        <w:t xml:space="preserve"> </w:t>
-      </w:r>
-      <w:r>
-        <w:t xml:space="preserve">and report that output is still rising. Their agenda includes the (dis)investment of international students in languages other than English, and investment in teaching those languages in Asia. Wen and Liu (2025), also in this journal, show that advanced learners of Chinese as a second language live pride, burnout, and anxiety as they move between lectures, teacher talk, group work, and extra-curricular activity. Under ERT those classroom scenes were filtered through the household. Darvin (2025) has updated the investment model for generative AI and argues that access to resources and the design of platforms now steer meaning-making. We cite that paper to mark a later development, not as a method for the present data. Respondents answered in February 2022. The inequality Darvin locates in human-AI interaction (who may enter the space, whose resources count) already appeared here as who could open the class.</w:t>
+        <w:t xml:space="preserve">The construct remains current. Hajar and Karakuş (2024) map three decades of investment research in this journal and report that output is still rising. Their agenda includes the (dis)investment of international students in languages other than English, and investment in teaching those languages in Asia. Wen and Liu (2025) show that advanced learners of Chinese live pride, burnout, and anxiety as they move between lectures, teacher talk, group work, and extra-curricular activity. Under emergency remote teaching those classroom scenes were filtered through the household. Darvin (2025) has since updated the model for generative AI. The inequality he locates in who may enter a digital space already appeared here as who could open the class.</w:t>
       </w:r>
     </w:p>
     <w:p>
@@ -548,17 +509,17 @@
         <w:pStyle w:val="BodyText"/>
       </w:pPr>
       <w:r>
-        <w:t xml:space="preserve">Piller, Zhang and Li (2020) showed that COVID-19 was also a linguistic crisis: who could ask for help, in which language, on which channel. Pakistani learners of Chinese typically mediate through Urdu, English, and regional languages. This questionnaire did not record mediation language. The point is only that a live Chinese class on an unfamiliar platform is a language-access problem as well as a technical one.</w:t>
+        <w:t xml:space="preserve">COVID-19 was also a linguistic crisis: who could ask for help, in which language, on which channel (Piller, Zhang, &amp; Li, 2020). Pakistani learners of Chinese typically mediate through Urdu, English, and regional languages. A live Chinese class on an unfamiliar platform is therefore a language-access problem as well as a technical one.</w:t>
       </w:r>
     </w:p>
     <w:bookmarkEnd w:id="24"/>
-    <w:bookmarkStart w:id="25" w:name="icle-hsk-and-the-pakistan-corridor"/>
+    <w:bookmarkStart w:id="25" w:name="icle-on-the-pakistan-corridor"/>
     <w:p>
       <w:pPr>
         <w:pStyle w:val="Heading3"/>
       </w:pPr>
       <w:r>
-        <w:t xml:space="preserve">2.4 ICLE, HSK, and the Pakistan corridor</w:t>
+        <w:t xml:space="preserve">2.4 ICLE on the Pakistan corridor</w:t>
       </w:r>
     </w:p>
     <w:p>
@@ -566,7 +527,7 @@
         <w:pStyle w:val="FirstParagraph"/>
       </w:pPr>
       <w:r>
-        <w:t xml:space="preserve">China’s promotion of Chinese as an international language has long been tied to institutes, textbooks, and tests (Zhao &amp; Huang, 2010). Pakistani interest in Chinese is bound up with the China-Pakistan Economic Corridor (CPEC), scholarships, and employment. Iftikhar et al. (2024) show that this demand is still live in Punjab and Sindh. CPEC and Confucius Institutes continue to structure why students learn Chinese, even as learners name cultural and local-language tensions. Attitude studies rarely capture the course that was supposed to produce the proficiency, namely the Chinese-university language class, when the student could not be on campus.</w:t>
+        <w:t xml:space="preserve">China’s promotion of Chinese as an international language has long been tied to institutes, textbooks, and tests (Zhao &amp; Huang, 2010). Pakistani interest in Chinese is bound up with the China-Pakistan Economic Corridor, scholarships, and employment, and that demand remains live in Punjab and Sindh (Iftikhar et al., 2024). Attitude studies rarely capture the course that was supposed to produce the proficiency, namely the Chinese-university language class, when the student could not be on campus.</w:t>
       </w:r>
     </w:p>
     <w:p>
@@ -574,7 +535,7 @@
         <w:pStyle w:val="BodyText"/>
       </w:pPr>
       <w:r>
-        <w:t xml:space="preserve">ICLE research after COVID-19 has turned toward blended models, interaction design, and cultural adaptation (Gong, Gao, &amp; Lyu, 2020; Li &amp; Li, 2024). Guenier, Xing and Yan (2026) describe a designed multimodal online course that communicates Chinese culture to Irish learners. That is planned online teaching, not emergency remote teaching. Gong, Gao, Li and Lai (2020) document New Zealand students’ cultural adaptation while they were physically in China. Gao and Hua (2021) collected that campus-in-China agenda in this journal. Work based in Pakistani universities has begun to document localisation of</w:t>
+        <w:t xml:space="preserve">ICLE research after COVID-19 has turned toward blended models, interaction design, and cultural adaptation (Gong, Gao, &amp; Lyu, 2020; Li &amp; Li, 2024). Guenier, Xing and Yan (2026) describe a designed multimodal online course that communicates Chinese culture to Irish learners. That is planned online teaching, not emergency remote teaching. Gong, Gao, Li and Lai (2020) document New Zealand students’ cultural adaptation while they were physically in China; Gao and Hua (2021) collected that campus-in-China agenda in this journal. Work based in Pakistani universities has begun to document localisation of</w:t>
       </w:r>
       <w:r>
         <w:t xml:space="preserve"> </w:t>
@@ -587,17 +548,34 @@
         <w:t xml:space="preserve">HSK Standard Course</w:t>
       </w:r>
       <w:r>
-        <w:t xml:space="preserve">, including Urdu annotation, cultural comparison, and programme fit inside Pakistan (Lu et al., 2024). Those studies concern programmes in Pakistan. The present dataset concerns Pakistani students enrolled in Chinese universities. The two groups share a language, a test culture, and often a textbook family. They do not share a campus. Adapting a book for NUML or a Confucius Institute is not the same task as keeping a Chinese-university language course alive in a Karachi or Lahore household at 21:00 after a power cut. Guerrettaz et al. (2021) treat materials as what happens in use. Under ERT the material was a live class and the use was a phone in a shared room. Curriculum research that stops at the page of the book will miss that scene. Shan and Xu (2024) show, for a dual-foreign-language programme in a Chinese university, that students experience an institutionalised curriculum as a fixed pathway they may also negotiate. The present students were asked to follow a Chinese-university pathway from sites that often could not hold a campus oral hour.</w:t>
+        <w:t xml:space="preserve">, including Urdu annotation and programme fit inside Pakistan (Lu et al., 2024). Those studies concern programmes in Pakistan. The present students were enrolled in Chinese universities. The two groups share a language, a test culture, and often a textbook family. They do not share a campus. Adapting a book for a Pakistani institute is not the same task as keeping a Chinese-university language course alive in a Karachi or Lahore household at 21:00 after a power cut.</w:t>
+      </w:r>
+    </w:p>
+    <w:p>
+      <w:pPr>
+        <w:pStyle w:val="BodyText"/>
+      </w:pPr>
+      <w:r>
+        <w:t xml:space="preserve">Guerrettaz et al. (2021) treat materials as what happens in use. Under emergency remote teaching the material was a live class and the use was a phone in a shared room. Curriculum research that stops at the page of the book will miss that scene. Shan and Xu (2024) show that students experience an institutionalised language curriculum as a fixed pathway they may also negotiate. The students in this study were asked to follow a Chinese-university pathway from sites that often could not hold a campus oral hour.</w:t>
+      </w:r>
+    </w:p>
+    <w:p>
+      <w:pPr>
+        <w:pStyle w:val="BodyText"/>
+      </w:pPr>
+      <w:r>
+        <w:t xml:space="preserve">Post-pandemic CALL has moved toward normalisation and AI, often in English classrooms with working campus Wi-Fi (Moorhouse et al., 2023; Darvin, 2025). Digital-inequality research under-represents additional-language classrooms. Pakistan EdTech gender work has so far spoken mainly about school homes (Raza &amp; Hennessy, 2025). ICLE localisation research under-represents the home as a site of delivery, and under-represents which Chinese-campus applications open from phones outside China. Investment research is asking for South-South evidence on international students of languages other than English (Hajar &amp; Karakuş, 2024). The present study addresses that gap at the point where inequality entered participation.</w:t>
       </w:r>
     </w:p>
     <w:bookmarkEnd w:id="25"/>
-    <w:bookmarkStart w:id="26" w:name="gap"/>
+    <w:bookmarkEnd w:id="26"/>
+    <w:bookmarkStart w:id="27" w:name="theoretical-framework"/>
     <w:p>
       <w:pPr>
-        <w:pStyle w:val="Heading3"/>
-      </w:pPr>
-      <w:r>
-        <w:t xml:space="preserve">2.5 Gap</w:t>
+        <w:pStyle w:val="Heading2"/>
+      </w:pPr>
+      <w:r>
+        <w:t xml:space="preserve">3. Theoretical framework</w:t>
       </w:r>
     </w:p>
     <w:p>
@@ -605,26 +583,15 @@
         <w:pStyle w:val="FirstParagraph"/>
       </w:pPr>
       <w:r>
-        <w:t xml:space="preserve">Recent literature still leaves several gaps that these data can address. Post-pandemic CALL has moved toward normalisation and AI, often in English classrooms with working campus Wi-Fi (Moorhouse et al., 2023; Darvin, 2025). Digital-inequality research under-represents additional-language classrooms. Pakistan EdTech gender work has so far spoken mainly about school homes rather than Chinese-university language courses taken from Pakistan (Raza &amp; Hennessy, 2025). ICLE localisation research under-represents the home as a site of delivery, and under-represents which Chinese-campus apps open from phones outside China. Investment research is asking for evidence on international students of languages other than English (Hajar &amp; Karakuş, 2024) but has little South-South Chinese evidence. An account is still needed of how inequality entered participation in class, and of what course design should do with that knowledge after the emergency.</w:t>
-      </w:r>
-    </w:p>
-    <w:bookmarkEnd w:id="26"/>
-    <w:bookmarkEnd w:id="27"/>
-    <w:bookmarkStart w:id="28" w:name="theoretical-framework"/>
-    <w:p>
-      <w:pPr>
-        <w:pStyle w:val="Heading2"/>
-      </w:pPr>
-      <w:r>
-        <w:t xml:space="preserve">3. Theoretical framework</w:t>
+        <w:t xml:space="preserve">The study uses a material-context model of remote Chinese learning (Figure 1). Three layers are treated as concurrent conditions, not as a tested causal path.</w:t>
       </w:r>
     </w:p>
     <w:p>
       <w:pPr>
-        <w:pStyle w:val="FirstParagraph"/>
-      </w:pPr>
-      <w:r>
-        <w:t xml:space="preserve">The study uses a material-context model of remote Chinese learning (Figure 1).</w:t>
+        <w:pStyle w:val="BodyText"/>
+      </w:pPr>
+      <w:r>
+        <w:t xml:space="preserve">The first layer is sequential digital inequality (van Dijk, 2020). Electricity, devices, bandwidth, platform skills, and time are ordered resources. Absence at an earlier layer blocks later ones. Without power there is no live class. Without a usable login there is little interaction even if the class is on.</w:t>
       </w:r>
     </w:p>
     <w:p>
@@ -632,7 +599,22 @@
         <w:pStyle w:val="BodyText"/>
       </w:pPr>
       <w:r>
-        <w:t xml:space="preserve">Layer 1 is sequential digital inequality (van Dijk, 2020). Electricity, devices, bandwidth, platform skills, and time are treated as ordered resources. Absence at an earlier layer blocks later ones. Without power there is no live class. Without platform literacy there is little interaction even if the class is on.</w:t>
+        <w:t xml:space="preserve">The second layer is home ecology. Following ecological views of language education (van Lier, 2004; Guerrettaz et al., 2021), the unit of analysis is the household rather than</w:t>
+      </w:r>
+      <w:r>
+        <w:t xml:space="preserve"> </w:t>
+      </w:r>
+      <w:r>
+        <w:t xml:space="preserve">“</w:t>
+      </w:r>
+      <w:r>
+        <w:t xml:space="preserve">the student plus the application</w:t>
+      </w:r>
+      <w:r>
+        <w:t xml:space="preserve">”</w:t>
+      </w:r>
+      <w:r>
+        <w:t xml:space="preserve">: shared rooms, family labour, gendered domestic space, and the China-Pakistan time difference. Emergency remote teaching relocated the Chinese classroom into this ecology without redesigning the lesson or the house.</w:t>
       </w:r>
     </w:p>
     <w:p>
@@ -640,22 +622,7 @@
         <w:pStyle w:val="BodyText"/>
       </w:pPr>
       <w:r>
-        <w:t xml:space="preserve">Layer 2 is home ecology. Following ecological views of language education (van Lier, 2004; Guerrettaz et al., 2021), the unit of analysis is the household rather than</w:t>
-      </w:r>
-      <w:r>
-        <w:t xml:space="preserve"> </w:t>
-      </w:r>
-      <w:r>
-        <w:t xml:space="preserve">“</w:t>
-      </w:r>
-      <w:r>
-        <w:t xml:space="preserve">the student plus the app</w:t>
-      </w:r>
-      <w:r>
-        <w:t xml:space="preserve">”</w:t>
-      </w:r>
-      <w:r>
-        <w:t xml:space="preserve">: shared rooms, family labour, gendered domestic space, and the China-Pakistan time difference. ERT relocated the Chinese classroom into this ecology without redesigning the lesson or the house.</w:t>
+        <w:t xml:space="preserve">The third layer is investment (Norton, 2013; Darvin &amp; Norton, 2015, 2023). The questionnaire did not include items on identity or imagined return. Investment is therefore a reading of participation: self-reported teacher interaction, self-appraised learning, and whether online Chinese was judged a substitute for campus study. Withdrawal is inferred when students report remaining silent, or conclude that online Chinese cannot replace the campus.</w:t>
       </w:r>
     </w:p>
     <w:p>
@@ -663,7 +630,22 @@
         <w:pStyle w:val="BodyText"/>
       </w:pPr>
       <w:r>
-        <w:t xml:space="preserve">Layer 3 is investment (Norton, 2013; Darvin &amp; Norton, 2015, 2023). The questionnaire has no Norton-style items on identity or imagined return. Investment is therefore a reading of proxies: remaining in the live session as self-reported teacher interaction, self-appraised learning, and whether online Chinese was judged a substitute for campus study. Withdrawal is inferred, not observed: remaining silent, or concluding that online Chinese cannot replace the campus.</w:t>
+        <w:t xml:space="preserve">Outcomes are distinguished as affective (stress), interactional (teacher exchange), and perceived learning (a three-item appraisal: learned much, improves Chinese, sparks interest). The conditions available in the questionnaire are infrastructure (power, signal, speed), home ecology (noise, whether the home</w:t>
+      </w:r>
+      <w:r>
+        <w:t xml:space="preserve"> </w:t>
+      </w:r>
+      <w:r>
+        <w:t xml:space="preserve">“</w:t>
+      </w:r>
+      <w:r>
+        <w:t xml:space="preserve">affects study</w:t>
+      </w:r>
+      <w:r>
+        <w:t xml:space="preserve">”</w:t>
+      </w:r>
+      <w:r>
+        <w:t xml:space="preserve">), platform geography (which applications open), and paid work versus study only.</w:t>
       </w:r>
     </w:p>
     <w:p>
@@ -671,30 +653,34 @@
         <w:pStyle w:val="BodyText"/>
       </w:pPr>
       <w:r>
-        <w:t xml:space="preserve">Outcomes are distinguished as (a) affective (stress), (b) interactional (self-reported teacher exchange), and (c) perceived learning (a three-item appraisal: learned much / improves Chinese / sparks interest). The instrument did not collect HSK scores.</w:t>
+        <w:t xml:space="preserve">Figure 1. Material-context model of emergency remote Chinese learning (a reading model, not a tested path). Sequential digital inequality (power, signal, speed), platform geography (campus systems versus Zoom or WhatsApp), and home ecology (space, family, paid work) are treated as concurrent conditions. They are read as shaping participation in Chinese and the self-reported outcomes of stress, interaction, and learning appraisal.</w:t>
+      </w:r>
+    </w:p>
+    <w:bookmarkEnd w:id="27"/>
+    <w:bookmarkStart w:id="33" w:name="the-study"/>
+    <w:p>
+      <w:pPr>
+        <w:pStyle w:val="Heading2"/>
+      </w:pPr>
+      <w:r>
+        <w:t xml:space="preserve">4. The study</w:t>
+      </w:r>
+    </w:p>
+    <w:bookmarkStart w:id="28" w:name="context-and-design"/>
+    <w:p>
+      <w:pPr>
+        <w:pStyle w:val="Heading3"/>
+      </w:pPr>
+      <w:r>
+        <w:t xml:space="preserve">4.1 Context and design</w:t>
       </w:r>
     </w:p>
     <w:p>
       <w:pPr>
-        <w:pStyle w:val="BodyText"/>
-      </w:pPr>
-      <w:r>
-        <w:t xml:space="preserve">The usable independent conditions in the export are infrastructure (power, signal, speed), home ecology (noise, whether the home</w:t>
-      </w:r>
-      <w:r>
-        <w:t xml:space="preserve"> </w:t>
-      </w:r>
-      <w:r>
-        <w:t xml:space="preserve">“</w:t>
-      </w:r>
-      <w:r>
-        <w:t xml:space="preserve">affects study</w:t>
-      </w:r>
-      <w:r>
-        <w:t xml:space="preserve">”</w:t>
-      </w:r>
-      <w:r>
-        <w:t xml:space="preserve">), platform geography (which apps open), and paid work versus study only. The research questions follow from that.</w:t>
+        <w:pStyle w:val="FirstParagraph"/>
+      </w:pPr>
+      <w:r>
+        <w:t xml:space="preserve">Respondents were enrolled in Chinese-university language courses that had moved online. In early February 2022 many Pakistani students were at home rather than in a Chinese dormitory; nine responses were still labelled mainland China. The course they were expected to attend assumed a campus timetable, a live oral hour, and a login on a Chinese-campus platform. The household, the power supply, and the applications that opened from a Pakistani mobile network were not part of that plan. The questionnaire does not name the host university, the textbook, or an HSK target. Curriculum here means that campus delivery plan as lived.</w:t>
       </w:r>
     </w:p>
     <w:p>
@@ -702,15 +688,43 @@
         <w:pStyle w:val="BodyText"/>
       </w:pPr>
       <w:r>
-        <w:t xml:space="preserve">RQ1. Which material, domestic, and platform conditions characterised emergency remote Chinese classes in this sample?</w:t>
+        <w:t xml:space="preserve">The study is a cross-sectional questionnaire of how that course was experienced from wherever the student sat that week. Data come from a Chinese-medium Wenjuan questionnaire on influencing factors in international students’ online Chinese learning during COVID-19 (38 complete cases, 5 to 8 February 2022).</w:t>
+      </w:r>
+    </w:p>
+    <w:bookmarkEnd w:id="28"/>
+    <w:bookmarkStart w:id="29" w:name="participants"/>
+    <w:p>
+      <w:pPr>
+        <w:pStyle w:val="Heading3"/>
+      </w:pPr>
+      <w:r>
+        <w:t xml:space="preserve">4.2 Participants</w:t>
       </w:r>
     </w:p>
     <w:p>
       <w:pPr>
-        <w:pStyle w:val="BodyText"/>
-      </w:pPr>
-      <w:r>
-        <w:t xml:space="preserve">RQ2. How were those conditions related to stress, interaction, and perceived learning?</w:t>
+        <w:pStyle w:val="FirstParagraph"/>
+      </w:pPr>
+      <w:r>
+        <w:t xml:space="preserve">Of 38 respondents, 27 were men (71.1%) and 11 women (28.9%). Thirty-seven selected Pakistani nationality and one selected</w:t>
+      </w:r>
+      <w:r>
+        <w:t xml:space="preserve"> </w:t>
+      </w:r>
+      <w:r>
+        <w:t xml:space="preserve">“</w:t>
+      </w:r>
+      <w:r>
+        <w:t xml:space="preserve">other</w:t>
+      </w:r>
+      <w:r>
+        <w:t xml:space="preserve">”</w:t>
+      </w:r>
+      <w:r>
+        <w:t xml:space="preserve"> </w:t>
+      </w:r>
+      <w:r>
+        <w:t xml:space="preserve">(Bangladesh). Self-rated Chinese level was mostly advanced (22, 57.9%) or intermediate (15, 39.5%); one beginner. That label is the student’s own, not an HSK band. Years of learning Chinese clustered at three to four years (26, 68.4%). All submissions used a phone (iPhone 24, 63.2%; Android 14). Device ownership was therefore not the main gap. IP geolocation placed nine responses in mainland China and 29 elsewhere. The main analysis keeps all 38 cases. The form did not ask whether the student held a China Scholarship Council award, so the sample is described as Chinese-university language students.</w:t>
       </w:r>
     </w:p>
     <w:p>
@@ -718,15 +732,25 @@
         <w:pStyle w:val="BodyText"/>
       </w:pPr>
       <w:r>
-        <w:t xml:space="preserve">RQ3. Did learners treat online Chinese as a legitimate substitute for campus study, and did that judgement differ by gender or by how much they thought they had learned?</w:t>
+        <w:t xml:space="preserve">The sample is a network-recruited convenience sample, not a draw from all Pakistani students in Chinese universities. Scholarship routes from Pakistan have long been male-heavy in some tracks, and a questionnaire link passed through student networks will reproduce that skew. Eleven women are too few to describe Pakistani women’s home classrooms. Percentages for the whole sample therefore combine men’s experience with a small female minority. Gender is tested where the instrument allows (research question 3). Non-significant gender tests are treated as inconclusive.</w:t>
+      </w:r>
+    </w:p>
+    <w:bookmarkEnd w:id="29"/>
+    <w:bookmarkStart w:id="30" w:name="instrument"/>
+    <w:p>
+      <w:pPr>
+        <w:pStyle w:val="Heading3"/>
+      </w:pPr>
+      <w:r>
+        <w:t xml:space="preserve">4.3 Instrument</w:t>
       </w:r>
     </w:p>
     <w:p>
       <w:pPr>
-        <w:pStyle w:val="BodyText"/>
-      </w:pPr>
-      <w:r>
-        <w:t xml:space="preserve">Implications for localisation after ERT are taken up in the discussion. They are not a fourth empirical question.</w:t>
+        <w:pStyle w:val="FirstParagraph"/>
+      </w:pPr>
+      <w:r>
+        <w:t xml:space="preserve">The questionnaire comprised about 30 items: demographics, single-choice ordinals, and multiple-response lists of courses, problems, platforms, and forms of interaction. Stems are in Chinese, with some non-native wording (for example 您尝尝用什么平台). We translate for reporting and analysed the coded values.</w:t>
       </w:r>
     </w:p>
     <w:p>
@@ -734,112 +758,7 @@
         <w:pStyle w:val="BodyText"/>
       </w:pPr>
       <w:r>
-        <w:t xml:space="preserve">Figure 1. Material-context model of emergency remote Chinese learning (reading model, not a tested path). Sequential digital inequality (power, signal, speed), platform geography (campus systems versus Zoom/WhatsApp), and home ecology (space, family, paid work) are treated as concurrent conditions. They are read as shaping participation in Chinese and the self-reported outcomes (stress, interaction, learning appraisal).</w:t>
-      </w:r>
-    </w:p>
-    <w:bookmarkEnd w:id="28"/>
-    <w:bookmarkStart w:id="34" w:name="the-study"/>
-    <w:p>
-      <w:pPr>
-        <w:pStyle w:val="Heading2"/>
-      </w:pPr>
-      <w:r>
-        <w:t xml:space="preserve">4. The study</w:t>
-      </w:r>
-    </w:p>
-    <w:bookmarkStart w:id="29" w:name="research-context-and-design"/>
-    <w:p>
-      <w:pPr>
-        <w:pStyle w:val="Heading3"/>
-      </w:pPr>
-      <w:r>
-        <w:t xml:space="preserve">4.1 Research context and design</w:t>
-      </w:r>
-    </w:p>
-    <w:p>
-      <w:pPr>
-        <w:pStyle w:val="FirstParagraph"/>
-      </w:pPr>
-      <w:r>
-        <w:t xml:space="preserve">The respondents were enrolled in Chinese-university language courses that had moved online. In early February 2022 many Pakistani students were at home rather than in a Chinese dormitory; nine responses in this file were still labelled mainland China. The course they were still expected to attend assumed a campus timetable, a live oral hour, and a login on a Chinese-campus platform. The household, the power supply, and the apps that opened from a Pakistani mobile network were not part of that plan. The export does not name the host university, the textbook, or an HSK target. Curriculum here means that campus delivery plan as lived, not a named programme.</w:t>
-      </w:r>
-    </w:p>
-    <w:p>
-      <w:pPr>
-        <w:pStyle w:val="BodyText"/>
-      </w:pPr>
-      <w:r>
-        <w:t xml:space="preserve">Data come from a Chinese-medium Wenjuan questionnaire on influencing factors in international students’ online Chinese learning during COVID-19 (38 complete cases, 5 to 8 February 2022). The design is a cross-sectional questionnaire study of how that course was lived from wherever the student sat that week. It is not a national census.</w:t>
-      </w:r>
-    </w:p>
-    <w:bookmarkEnd w:id="29"/>
-    <w:bookmarkStart w:id="30" w:name="participants"/>
-    <w:p>
-      <w:pPr>
-        <w:pStyle w:val="Heading3"/>
-      </w:pPr>
-      <w:r>
-        <w:t xml:space="preserve">4.2 Participants</w:t>
-      </w:r>
-    </w:p>
-    <w:p>
-      <w:pPr>
-        <w:pStyle w:val="FirstParagraph"/>
-      </w:pPr>
-      <w:r>
-        <w:t xml:space="preserve">Of 38 respondents, 27 were men (71.1%) and 11 women (28.9%). Thirty-seven selected Pakistani nationality and one selected</w:t>
-      </w:r>
-      <w:r>
-        <w:t xml:space="preserve"> </w:t>
-      </w:r>
-      <w:r>
-        <w:t xml:space="preserve">“</w:t>
-      </w:r>
-      <w:r>
-        <w:t xml:space="preserve">other</w:t>
-      </w:r>
-      <w:r>
-        <w:t xml:space="preserve">”</w:t>
-      </w:r>
-      <w:r>
-        <w:t xml:space="preserve"> </w:t>
-      </w:r>
-      <w:r>
-        <w:t xml:space="preserve">(open text: Bangladesh). Self-rated Chinese level was mostly advanced (22, 57.9%) or intermediate (15, 39.5%); one beginner. That label is the student’s own, not an HSK band. Years of learning Chinese clustered at 3 to 4 years (26, 68.4%). All submissions used a phone (iPhone 24, 63.2%; Android 14). Device ownership was therefore not the main gap. IP geolocation placed nine responses in mainland China and 29 elsewhere, including Punjab or Pakistan labels and blank geo, which is typical of overseas mobile routes. The main analysis keeps n = 38. Not every phone was physically in Pakistan that week. The form did not ask whether the student held a China Scholarship Council (CSC) award, so this sample is labelled Chinese-university language students, not CSC students.</w:t>
-      </w:r>
-    </w:p>
-    <w:p>
-      <w:pPr>
-        <w:pStyle w:val="BodyText"/>
-      </w:pPr>
-      <w:r>
-        <w:t xml:space="preserve">This is a purposive, network-recruited convenience sample, not a draw from all Pakistani students in Chinese universities. Most respondents are men (27/38, 71.1%). Scholarship routes to Pakistan have long been male-heavy in STEM tracks, and a Wenjuan link passed through student networks will reproduce that skew. Eleven women are too few to describe Pakistani women’s home classrooms. Percentages for the whole sample are therefore men’s experience plus a small female minority. Gender is still tested where the instrument allows (RQ3). Non-significant gender tests are treated as inconclusive.</w:t>
-      </w:r>
-    </w:p>
-    <w:bookmarkEnd w:id="30"/>
-    <w:bookmarkStart w:id="31" w:name="instrument"/>
-    <w:p>
-      <w:pPr>
-        <w:pStyle w:val="Heading3"/>
-      </w:pPr>
-      <w:r>
-        <w:t xml:space="preserve">4.3 Instrument</w:t>
-      </w:r>
-    </w:p>
-    <w:p>
-      <w:pPr>
-        <w:pStyle w:val="FirstParagraph"/>
-      </w:pPr>
-      <w:r>
-        <w:t xml:space="preserve">The questionnaire has about 30 items: demographics, single-choice ordinals, and multiple-response lists (courses online, problems, platforms, interaction forms). Stems are Chinese, with some non-native wording (for example 您尝尝用什么平台). We translate for reporting. Analysis used the coded values.</w:t>
-      </w:r>
-    </w:p>
-    <w:p>
-      <w:pPr>
-        <w:pStyle w:val="BodyText"/>
-      </w:pPr>
-      <w:r>
-        <w:t xml:space="preserve">A learning-appraisal composite was formed from three same-direction ordinals (learned much; improves Chinese; sparks interest). Cronbach’s α = .84. Coding is as in the Wenjuan export:</w:t>
+        <w:t xml:space="preserve">A learning-appraisal composite was formed from three same-direction ordinals (learned much; improves Chinese; sparks interest). Cronbach’s α = .84. Higher scores on the composites used below indicate a worse condition or a thinner outcome:</w:t>
       </w:r>
     </w:p>
     <w:tbl>
@@ -1074,8 +993,8 @@
         <w:t xml:space="preserve">(I think China should have students come back to class now. Even one minute of online class is not suitable). Names, IP addresses, and exact timestamps beyond the date were removed before analysis.</w:t>
       </w:r>
     </w:p>
-    <w:bookmarkEnd w:id="31"/>
-    <w:bookmarkStart w:id="32" w:name="analysis"/>
+    <w:bookmarkEnd w:id="30"/>
+    <w:bookmarkStart w:id="31" w:name="analysis"/>
     <w:p>
       <w:pPr>
         <w:pStyle w:val="Heading3"/>
@@ -1089,7 +1008,7 @@
         <w:pStyle w:val="FirstParagraph"/>
       </w:pPr>
       <w:r>
-        <w:t xml:space="preserve">Frequencies are n/38. Multiple-response items are percent of respondents ticking the option. A learning-appraisal score is the mean of learned, improve, and interest (α = .84; higher = worse). For 2×2 associations we use Fisher’s exact test and report odds ratios with 95% confidence intervals and φ. For ordinal pairs we use Spearman’s ρ. Gender differences on ordinals were checked with Mann-Whitney U (all</w:t>
+        <w:t xml:space="preserve">Frequencies are reported as n/38. Multiple-response items are the percentage of respondents who selected the option. The learning-appraisal score is the mean of learned, improve, and interest (higher = worse). For 2×2 associations we used Fisher’s exact test and report odds ratios with 95% confidence intervals and φ. For ordinal pairs we used Spearman’s ρ. Gender differences on ordinals were checked with Mann-Whitney U (all</w:t>
       </w:r>
       <w:r>
         <w:t xml:space="preserve"> </w:t>
@@ -1105,7 +1024,7 @@
         <w:t xml:space="preserve"> </w:t>
       </w:r>
       <w:r>
-        <w:t xml:space="preserve">&gt; .10). Sensitivity analyses repeat the two focal tests in (a) Pakistani respondents only (n = 37) and (b) cases whose IP was not labelled as mainland China (n = 29). The tests are exploratory. With n = 38 and several associations,</w:t>
+        <w:t xml:space="preserve">&gt; .10). Sensitivity analyses repeat the two focal tests among Pakistani respondents only (n = 37) and among cases whose IP was not labelled mainland China (n = 29). The tests are exploratory. With n = 38 and several associations,</w:t>
       </w:r>
       <w:r>
         <w:t xml:space="preserve"> </w:t>
@@ -1121,17 +1040,45 @@
         <w:t xml:space="preserve"> </w:t>
       </w:r>
       <w:r>
-        <w:t xml:space="preserve">values are not Bonferroni-adjusted and should not be read as a confirmatory family.</w:t>
+        <w:t xml:space="preserve">values are not Bonferroni-adjusted.</w:t>
+      </w:r>
+    </w:p>
+    <w:bookmarkEnd w:id="31"/>
+    <w:bookmarkStart w:id="32" w:name="ethics"/>
+    <w:p>
+      <w:pPr>
+        <w:pStyle w:val="Heading3"/>
+      </w:pPr>
+      <w:r>
+        <w:t xml:space="preserve">4.5 Ethics</w:t>
+      </w:r>
+    </w:p>
+    <w:p>
+      <w:pPr>
+        <w:pStyle w:val="FirstParagraph"/>
+      </w:pPr>
+      <w:r>
+        <w:t xml:space="preserve">Adult students completed an online questionnaire presented as research on online Chinese learning. Submission of the form was treated as consent to use anonymised answers. Names, IP addresses, and exact timestamps beyond the collection dates were removed before analysis and are not published. Gender is reported because it structured one finding.</w:t>
       </w:r>
     </w:p>
     <w:bookmarkEnd w:id="32"/>
-    <w:bookmarkStart w:id="33" w:name="ethical-considerations"/>
+    <w:bookmarkEnd w:id="33"/>
+    <w:bookmarkStart w:id="40" w:name="results"/>
     <w:p>
       <w:pPr>
+        <w:pStyle w:val="Heading2"/>
+      </w:pPr>
+      <w:r>
+        <w:t xml:space="preserve">5. Results</w:t>
+      </w:r>
+    </w:p>
+    <w:bookmarkStart w:id="34" w:name="who-sat-in-the-class"/>
+    <w:p>
+      <w:pPr>
         <w:pStyle w:val="Heading3"/>
       </w:pPr>
       <w:r>
-        <w:t xml:space="preserve">4.5 Ethical considerations</w:t>
+        <w:t xml:space="preserve">5.1 Who sat in the class</w:t>
       </w:r>
     </w:p>
     <w:p>
@@ -1139,35 +1086,7 @@
         <w:pStyle w:val="FirstParagraph"/>
       </w:pPr>
       <w:r>
-        <w:t xml:space="preserve">Adult students completed an online Wenjuan form. The information on the form presented the study as research on online Chinese learning. Submission of the questionnaire was treated as consent to use anonymised answers for research. Names, IP addresses, and exact timestamps beyond the collection dates were removed before analysis and are not published. Gender is reported because it structured one finding. No ethics-committee number is attached to the 2022 file; that limit is stated rather than invented.</w:t>
-      </w:r>
-    </w:p>
-    <w:bookmarkEnd w:id="33"/>
-    <w:bookmarkEnd w:id="34"/>
-    <w:bookmarkStart w:id="41" w:name="results"/>
-    <w:p>
-      <w:pPr>
-        <w:pStyle w:val="Heading2"/>
-      </w:pPr>
-      <w:r>
-        <w:t xml:space="preserve">5. Results</w:t>
-      </w:r>
-    </w:p>
-    <w:bookmarkStart w:id="35" w:name="sample-and-setting-rq1"/>
-    <w:p>
-      <w:pPr>
-        <w:pStyle w:val="Heading3"/>
-      </w:pPr>
-      <w:r>
-        <w:t xml:space="preserve">5.1 Sample and setting (RQ1)</w:t>
-      </w:r>
-    </w:p>
-    <w:p>
-      <w:pPr>
-        <w:pStyle w:val="FirstParagraph"/>
-      </w:pPr>
-      <w:r>
-        <w:t xml:space="preserve">Table 1 locates the sample. It is small, phone-based, and majority male. 78.9% said all of their Chinese classes were online. 57.9% were working (part-time, full-time, or both) alongside study. Nine IP addresses were labelled mainland China; the other 29 were not. The analysis therefore describes an interrupted Chinese-university cohort rather than a census of Pakistani students in Pakistan that week.</w:t>
+        <w:t xml:space="preserve">Table 1 locates the sample. It is small, phone-based, and majority male. Most respondents (78.9%) said all of their Chinese classes were online. More than half (57.9%) were working alongside study. Nine IP addresses were labelled mainland China. The analysis therefore describes an interrupted Chinese-university cohort rather than a group in which everyone sat in Pakistan that week.</w:t>
       </w:r>
     </w:p>
     <w:p>
@@ -1681,17 +1600,17 @@
         <w:t xml:space="preserve"> </w:t>
       </w:r>
       <w:r>
-        <w:t xml:space="preserve">Convenience sample, Wenjuan, 5 to 8 February 2022. 71% of the sample are men. That skew is discussed as a limitation.</w:t>
+        <w:t xml:space="preserve">Convenience sample, Wenjuan, 5 to 8 February 2022.</w:t>
       </w:r>
     </w:p>
-    <w:bookmarkEnd w:id="35"/>
-    <w:bookmarkStart w:id="36" w:name="X0a3c9fc137440dbd3aae547ba15e9b0cc8cf6bb"/>
+    <w:bookmarkEnd w:id="34"/>
+    <w:bookmarkStart w:id="35" w:name="household-conditions-and-stress"/>
     <w:p>
       <w:pPr>
         <w:pStyle w:val="Heading3"/>
       </w:pPr>
       <w:r>
-        <w:t xml:space="preserve">5.2 Material conditions and home ecology (RQ1, RQ2)</w:t>
+        <w:t xml:space="preserve">5.2 Household conditions and stress</w:t>
       </w:r>
     </w:p>
     <w:p>
@@ -1699,7 +1618,7 @@
         <w:pStyle w:val="FirstParagraph"/>
       </w:pPr>
       <w:r>
-        <w:t xml:space="preserve">Table 2 summarises the conditions of study. 76.3% ticked unstable network as a problem; 42.1% ticked no electricity; 31.6% ticked no signal. 89.5% said their country</w:t>
+        <w:t xml:space="preserve">Table 2 summarises the conditions of study. Unstable networks (76.3%), power cuts (42.1%), and no signal (31.6%) were common. Most respondents (89.5%) said their country</w:t>
       </w:r>
       <w:r>
         <w:t xml:space="preserve"> </w:t>
@@ -1717,7 +1636,7 @@
         <w:t xml:space="preserve"> </w:t>
       </w:r>
       <w:r>
-        <w:t xml:space="preserve">but speed was split: 36.8% good or very good, 36.8% average, 26.3% bad or very bad. Four people (10.5%) said there was no internet in their country, yet all 38 submitted an online form, so that item is better read as no stable home broadband than as no network at all. Access in van Dijk’s first layer is therefore not universal in this corridor.</w:t>
+        <w:t xml:space="preserve">but speed was split: 36.8% good or very good, 36.8% average, and 26.3% bad or very bad. Four people (10.5%) said there was no internet in their country, yet all 38 submitted an online form. That item is better read as no stable home broadband than as no network at all.</w:t>
       </w:r>
     </w:p>
     <w:p>
@@ -1725,7 +1644,7 @@
         <w:pStyle w:val="BodyText"/>
       </w:pPr>
       <w:r>
-        <w:t xml:space="preserve">Only 11/38 (28.9%) described the home as quiet; 71.1% chose noisy or lively. 14/38 (36.8%) said the home affected study</w:t>
+        <w:t xml:space="preserve">Only 11 of 38 (28.9%) described the home as quiet; 71.1% chose noisy or lively. Fourteen (36.8%) said the home affected study</w:t>
       </w:r>
       <w:r>
         <w:t xml:space="preserve"> </w:t>
@@ -2171,7 +2090,7 @@
         <w:pStyle w:val="BodyText"/>
       </w:pPr>
       <w:r>
-        <w:t xml:space="preserve">This is the strongest association in the sample. Among those who said the home affected study very much, 11/14 also reported very high psychological stress; among the others, 3/24 did (OR = 25.67, 95% CI [4.42, 149.00],</w:t>
+        <w:t xml:space="preserve">The strongest association in the sample is between the home and stress. Among those who said the home affected study very much, 11 of 14 also reported very high psychological stress; among the others, 3 of 24 did (OR = 25.67, 95% CI [4.42, 149.00],</w:t>
       </w:r>
       <w:r>
         <w:t xml:space="preserve"> </w:t>
@@ -2187,7 +2106,7 @@
         <w:t xml:space="preserve"> </w:t>
       </w:r>
       <w:r>
-        <w:t xml:space="preserve">&lt; .001, φ = .66). Spearman ρ between that home dummy and the stress ordinal (1 = very high) was -.66 (</w:t>
+        <w:t xml:space="preserve">&lt; .001, φ = .66). Spearman’s ρ between that home item and the stress ordinal (1 = very high) was −.66 (</w:t>
       </w:r>
       <w:r>
         <w:rPr>
@@ -2200,17 +2119,17 @@
         <w:t xml:space="preserve"> </w:t>
       </w:r>
       <w:r>
-        <w:t xml:space="preserve">&lt; .001). Students who said the home affected study very much also tended to report very high stress. The odds-ratio interval is wide, as expected at n = 38. The direction of the association is consistent. Thirty-seven of 38 ticked some stress; that almost-ceiling is not treated as a result. The discriminating figure is the 36.8% who ticked very high.</w:t>
+        <w:t xml:space="preserve">&lt; .001). The odds-ratio interval is wide, as expected at this sample size; the direction is consistent. The figure that discriminates is the 36.8% who reported very high stress.</w:t>
       </w:r>
     </w:p>
-    <w:bookmarkEnd w:id="36"/>
-    <w:bookmarkStart w:id="37" w:name="platforms-used-blocked-and-available-rq1"/>
+    <w:bookmarkEnd w:id="35"/>
+    <w:bookmarkStart w:id="36" w:name="Xcaed1ea785147ce2b7b7bc763c8cc14ebc51e4b"/>
     <w:p>
       <w:pPr>
         <w:pStyle w:val="Heading3"/>
       </w:pPr>
       <w:r>
-        <w:t xml:space="preserve">5.3 Platforms used, blocked, and available (RQ1)</w:t>
+        <w:t xml:space="preserve">5.3 Platforms that opened and platforms that did not</w:t>
       </w:r>
     </w:p>
     <w:p>
@@ -2218,23 +2137,7 @@
         <w:pStyle w:val="FirstParagraph"/>
       </w:pPr>
       <w:r>
-        <w:t xml:space="preserve">Table 3 shows that students did not lack a platform so much as they lacked the platform the university was using.</w:t>
-      </w:r>
-    </w:p>
-    <w:p>
-      <w:pPr>
-        <w:pStyle w:val="BodyText"/>
-      </w:pPr>
-      <w:r>
-        <w:t xml:space="preserve">Table 3 reports only platform columns that can be reproduced from the committed analysis file.</w:t>
-      </w:r>
-    </w:p>
-    <w:p>
-      <w:pPr>
-        <w:pStyle w:val="BodyText"/>
-      </w:pPr>
-      <w:r>
-        <w:t xml:space="preserve">Used for class: Tencent Meeting 71.1%, Zoom 47.4%, WeChat 31.6%. Marked cannot use in my country: QQ 50.0%, Chaoxing 42.1%, DingTalk 28.9%, Chinese MOOC 28.9%. Marked can use in my country: Zoom 71.1%, WhatsApp 68.4%, Tencent Meeting 57.9%, WeChat 39.5%. WhatsApp appears only in the available column; the form, as retained here, did not code whether it was used for class. Tencent Meeting was the most used class tool (71.1%) but was marked available</w:t>
+        <w:t xml:space="preserve">Students did not so much lack a platform as they lacked the platform the university was using (Table 3). The tools reported as used for class were Tencent Meeting (71.1%), Zoom (47.4%), and WeChat (31.6%). The tools marked unusable</w:t>
       </w:r>
       <w:r>
         <w:t xml:space="preserve"> </w:t>
@@ -2252,7 +2155,7 @@
         <w:t xml:space="preserve"> </w:t>
       </w:r>
       <w:r>
-        <w:t xml:space="preserve">by only 57.9%. That gap is left as an item-level inconsistency (use while in China, a VPN, or a messy stem), not as a second finding.</w:t>
+        <w:t xml:space="preserve">were QQ (50.0%), Chaoxing (42.1%), DingTalk (28.9%), and Chinese MOOC (28.9%). The tools marked available were Zoom (71.1%), WhatsApp (68.4%), Tencent Meeting (57.9%), and WeChat (39.5%). WhatsApp appears only as available; the questionnaire, as retained here, did not record whether it was used for class. Tencent Meeting was the most used class tool, yet fewer respondents marked it available in their country, a discrepancy that may reflect use while in China or through a virtual private network.</w:t>
       </w:r>
     </w:p>
     <w:p>
@@ -2276,7 +2179,7 @@
           <w:iCs/>
           <w:i/>
         </w:rPr>
-        <w:t xml:space="preserve">Platforms: used, blocked, and available (multiple response, % of 38; columns present in the analysis file)</w:t>
+        <w:t xml:space="preserve">Platforms used, blocked, and available (multiple response, % of 38)</w:t>
       </w:r>
     </w:p>
     <w:tbl>
@@ -2761,7 +2664,7 @@
         <w:t xml:space="preserve"> </w:t>
       </w:r>
       <w:r>
-        <w:t xml:space="preserve">n.a. means that column was not retained in the analysis file. Campus-side Chinese platforms are the ones students mark as unusable. Consumer tools often used in Pakistan (Zoom, WhatsApp) are the ones they mark as available. Nine responses were China-labelled, so</w:t>
+        <w:t xml:space="preserve">n.a. = the item was not asked in that column. Campus-side Chinese platforms are those students mark as unusable. Consumer tools often used in Pakistan (Zoom, WhatsApp) are those they mark as available.</w:t>
       </w:r>
       <w:r>
         <w:t xml:space="preserve"> </w:t>
@@ -2770,7 +2673,7 @@
         <w:t xml:space="preserve">“</w:t>
       </w:r>
       <w:r>
-        <w:t xml:space="preserve">my country</w:t>
+        <w:t xml:space="preserve">My country</w:t>
       </w:r>
       <w:r>
         <w:t xml:space="preserve">”</w:t>
@@ -2779,7 +2682,7 @@
         <w:t xml:space="preserve"> </w:t>
       </w:r>
       <w:r>
-        <w:t xml:space="preserve">is the student’s own wording, not a Pakistan-only map.</w:t>
+        <w:t xml:space="preserve">is the student’s wording; nine responses were labelled mainland China.</w:t>
       </w:r>
     </w:p>
     <w:p>
@@ -2787,17 +2690,17 @@
         <w:pStyle w:val="BodyText"/>
       </w:pPr>
       <w:r>
-        <w:t xml:space="preserve">Campus-side Chinese platforms (QQ, Chaoxing, DingTalk, Chinese MOOC) are the ones students mark as unusable. Zoom and WhatsApp are the ones they mark as available. When ERT copies the campus system off campus, the official classroom may sit on an application the student cannot enter.</w:t>
+        <w:t xml:space="preserve">When emergency remote teaching copies the campus system off campus, the official classroom may sit on an application the student cannot enter.</w:t>
       </w:r>
     </w:p>
-    <w:bookmarkEnd w:id="37"/>
-    <w:bookmarkStart w:id="38" w:name="Xa8c047b0280430fef3d5887028625c2450a4bb3"/>
+    <w:bookmarkEnd w:id="36"/>
+    <w:bookmarkStart w:id="37" w:name="interaction-learning-appraisal-and-speed"/>
     <w:p>
       <w:pPr>
         <w:pStyle w:val="Heading3"/>
       </w:pPr>
       <w:r>
-        <w:t xml:space="preserve">5.4 Stress, interaction, and learning appraisal (RQ2)</w:t>
+        <w:t xml:space="preserve">5.4 Interaction, learning appraisal, and speed</w:t>
       </w:r>
     </w:p>
     <w:p>
@@ -2805,7 +2708,7 @@
         <w:pStyle w:val="FirstParagraph"/>
       </w:pPr>
       <w:r>
-        <w:t xml:space="preserve">Very high stress was reported by 14/38 (36.8%). Thirty-seven of 38 ticked some stress; that almost-ceiling is not treated as a main result. Active interaction with the teacher</w:t>
+        <w:t xml:space="preserve">Very high stress was reported by 14 of 38 (36.8%). Active interaction with the teacher</w:t>
       </w:r>
       <w:r>
         <w:t xml:space="preserve"> </w:t>
@@ -2823,7 +2726,7 @@
         <w:t xml:space="preserve"> </w:t>
       </w:r>
       <w:r>
-        <w:t xml:space="preserve">was reported by only 6/38 (15.8%); 11/38 (28.9%) said only a little or not at all. Classroom talk, when it happened, was mainly dialogue (76.3%) and question and answer (57.9%). Role-play was rare (7.9%). Those oral tasks most need a stable live channel.</w:t>
+        <w:t xml:space="preserve">was reported by only 6 of 38 (15.8%); 11 of 38 (28.9%) said only a little or not at all. Classroom talk, when it happened, was mainly dialogue (76.3%) and question and answer (57.9%). Role-play was rare (7.9%). Those oral tasks most need a stable live channel.</w:t>
       </w:r>
     </w:p>
     <w:p>
@@ -2864,7 +2767,7 @@
         <w:t xml:space="preserve">”</w:t>
       </w:r>
       <w:r>
-        <w:t xml:space="preserve">; 10.5% said not at all. Five of 37 valid answers (13.5%) liked online classes very much; one double-tick on that item was excluded.</w:t>
+        <w:t xml:space="preserve">; 10.5% said not at all. Five of 37 valid answers (13.5%) liked online classes very much.</w:t>
       </w:r>
     </w:p>
     <w:p>
@@ -2872,7 +2775,7 @@
         <w:pStyle w:val="BodyText"/>
       </w:pPr>
       <w:r>
-        <w:t xml:space="preserve">Worse internet speed (higher score) tracked worse appraisal and thinner interaction (Table 4): ρ = .46 with learned less (</w:t>
+        <w:t xml:space="preserve">Worse internet speed tracked worse appraisal and thinner interaction (Table 4): ρ = .46 with learned less (</w:t>
       </w:r>
       <w:r>
         <w:rPr>
@@ -2911,7 +2814,7 @@
         <w:t xml:space="preserve"> </w:t>
       </w:r>
       <w:r>
-        <w:t xml:space="preserve">&lt; .001), .55 with less teacher interaction, and .60 with lower satisfaction with class time. A simple count of infrastructure problems (unstable net + no power + no signal) did not track appraisal (ρ = .02,</w:t>
+        <w:t xml:space="preserve">&lt; .001), .55 with less teacher interaction, and .60 with lower satisfaction with class time. A simple count of infrastructure problems (unstable network, no power, no signal) did not track appraisal (ρ = .02,</w:t>
       </w:r>
       <w:r>
         <w:t xml:space="preserve"> </w:t>
@@ -2927,7 +2830,7 @@
         <w:t xml:space="preserve"> </w:t>
       </w:r>
       <w:r>
-        <w:t xml:space="preserve">= .91). Speed of use matters in this file; ticking several problems does not.</w:t>
+        <w:t xml:space="preserve">= .91). In this sample, speed of use matters; the number of problems ticked does not.</w:t>
       </w:r>
     </w:p>
     <w:p>
@@ -2935,7 +2838,7 @@
         <w:pStyle w:val="BodyText"/>
       </w:pPr>
       <w:r>
-        <w:t xml:space="preserve">Preferred live length: 50% wanted 45 minutes and 28.9% wanted 30 minutes, which is shorter than a typical campus Chinese class. One open comment refused the mode altogether: even one minute online was</w:t>
+        <w:t xml:space="preserve">Preferred live length was shorter than a typical campus Chinese class: 50% wanted 45 minutes and 28.9% wanted 30 minutes. One open comment refused the mode altogether: even one minute online was</w:t>
       </w:r>
       <w:r>
         <w:t xml:space="preserve"> </w:t>
@@ -2944,13 +2847,16 @@
         <w:t xml:space="preserve">“</w:t>
       </w:r>
       <w:r>
-        <w:t xml:space="preserve">not suitable</w:t>
+        <w:t xml:space="preserve">not suitable,</w:t>
       </w:r>
       <w:r>
         <w:t xml:space="preserve">”</w:t>
       </w:r>
       <w:r>
-        <w:t xml:space="preserve">; China should bring students back.</w:t>
+        <w:t xml:space="preserve"> </w:t>
+      </w:r>
+      <w:r>
+        <w:t xml:space="preserve">and China should bring students back.</w:t>
       </w:r>
     </w:p>
     <w:p>
@@ -3327,17 +3233,17 @@
         <w:t xml:space="preserve"> </w:t>
       </w:r>
       <w:r>
-        <w:t xml:space="preserve">Higher speed and learning-appraisal scores are more negative. Odds-ratio intervals are wide and should be read as direction, not as precise population values. The female × cannot-replace row and the learned-little × cannot-replace row have the same OR by coincidence (both 2×2 tables are 17/10 vs 2/9); they are not the same test.</w:t>
+        <w:t xml:space="preserve">Higher speed and learning-appraisal scores are more negative. Odds-ratio intervals are wide and should be read as direction, not as precise population values. The female × cannot-replace row and the learned-little × cannot-replace row have the same OR by coincidence (both 2×2 tables are 17/10 versus 2/9); they are not the same test.</w:t>
       </w:r>
     </w:p>
-    <w:bookmarkEnd w:id="38"/>
-    <w:bookmarkStart w:id="39" w:name="X789660920f8923ed8fe507929828b49492970bf"/>
+    <w:bookmarkEnd w:id="37"/>
+    <w:bookmarkStart w:id="38" w:name="could-online-chinese-replace-the-campus"/>
     <w:p>
       <w:pPr>
         <w:pStyle w:val="Heading3"/>
       </w:pPr>
       <w:r>
-        <w:t xml:space="preserve">5.5 Replacement of campus classes, including gender (RQ3)</w:t>
+        <w:t xml:space="preserve">5.5 Could online Chinese replace the campus?</w:t>
       </w:r>
     </w:p>
     <w:p>
@@ -3345,7 +3251,7 @@
         <w:pStyle w:val="FirstParagraph"/>
       </w:pPr>
       <w:r>
-        <w:t xml:space="preserve">Nineteen of 38 said online study could replace campus classes and 19 said it could not. Women: 9/11 said it cannot replace campus (82%); men: 10/27 (37%). OR = 7.65, 95% CI [1.37, 42.71],</w:t>
+        <w:t xml:space="preserve">Nineteen of 38 said online study could replace campus classes and 19 said it could not. Among women, 9 of 11 said it cannot (82%); among men, 10 of 27 said so (37%) (OR = 7.65, 95% CI [1.37, 42.71],</w:t>
       </w:r>
       <w:r>
         <w:t xml:space="preserve"> </w:t>
@@ -3361,10 +3267,7 @@
         <w:t xml:space="preserve"> </w:t>
       </w:r>
       <w:r>
-        <w:t xml:space="preserve">= .029, φ = .41. Those who learned little or nothing more often said it cannot replace campus (same OR and</w:t>
-      </w:r>
-      <w:r>
-        <w:t xml:space="preserve"> </w:t>
+        <w:t xml:space="preserve">= .029, φ = .41). Those who learned little or nothing more often said it cannot replace campus. Among those with poor internet, 8 of 10 said it cannot, versus 11 of 28 of the rest (</w:t>
       </w:r>
       <w:r>
         <w:rPr>
@@ -3374,7 +3277,29 @@
         <w:t xml:space="preserve">p</w:t>
       </w:r>
       <w:r>
-        <w:t xml:space="preserve">; overlapping but not identical cases). Among those with poor internet (speed bad or very bad), 8/10 said it cannot replace campus, versus 11/28 of the rest (</w:t>
+        <w:t xml:space="preserve"> </w:t>
+      </w:r>
+      <w:r>
+        <w:t xml:space="preserve">= .062).</w:t>
+      </w:r>
+    </w:p>
+    <w:p>
+      <w:pPr>
+        <w:pStyle w:val="BodyText"/>
+      </w:pPr>
+      <w:r>
+        <w:t xml:space="preserve">Mann-Whitney tests on the ordinals by gender were non-significant. The gender difference is not that women scored as having learned less. Women more often refused to treat online Chinese as a campus substitute.</w:t>
+      </w:r>
+    </w:p>
+    <w:p>
+      <w:pPr>
+        <w:pStyle w:val="BodyText"/>
+      </w:pPr>
+      <w:r>
+        <w:t xml:space="preserve">A second pattern sits beside that refusal: 19 of 27 men (70.4%) were working while studying, against 3 of 11 women (27.3%) (Fisher</w:t>
+      </w:r>
+      <w:r>
+        <w:t xml:space="preserve"> </w:t>
       </w:r>
       <w:r>
         <w:rPr>
@@ -3387,23 +3312,25 @@
         <w:t xml:space="preserve"> </w:t>
       </w:r>
       <w:r>
-        <w:t xml:space="preserve">= .062, marginal).</w:t>
+        <w:t xml:space="preserve">= .028). Men in this sample more often combined wage labour with emergency remote teaching; women more often refused to count it as campus. Both patterns are signals in a male-majority sample, not a full gender analysis.</w:t>
+      </w:r>
+    </w:p>
+    <w:bookmarkEnd w:id="38"/>
+    <w:bookmarkStart w:id="39" w:name="sensitivity"/>
+    <w:p>
+      <w:pPr>
+        <w:pStyle w:val="Heading3"/>
+      </w:pPr>
+      <w:r>
+        <w:t xml:space="preserve">5.6 Sensitivity</w:t>
       </w:r>
     </w:p>
     <w:p>
       <w:pPr>
-        <w:pStyle w:val="BodyText"/>
-      </w:pPr>
-      <w:r>
-        <w:t xml:space="preserve">Mann-Whitney tests on the ordinals by gender were non-significant. The gender difference is not that women scored as having learned less. Women more often refused to treat online Chinese as a campus substitute.</w:t>
-      </w:r>
-    </w:p>
-    <w:p>
-      <w:pPr>
-        <w:pStyle w:val="BodyText"/>
-      </w:pPr>
-      <w:r>
-        <w:t xml:space="preserve">A second gender pattern sits beside that refusal: 19/27 men (70.4%) were working while studying, against 3/11 women (27.3%) (Fisher</w:t>
+        <w:pStyle w:val="FirstParagraph"/>
+      </w:pPr>
+      <w:r>
+        <w:t xml:space="preserve">Table 5 repeats the two focal tests. Among Pakistani respondents only (n = 37), unstable networks remained 75.7% and power cuts 43.2%; the home-stress association remained</w:t>
       </w:r>
       <w:r>
         <w:t xml:space="preserve"> </w:t>
@@ -3419,25 +3346,7 @@
         <w:t xml:space="preserve"> </w:t>
       </w:r>
       <w:r>
-        <w:t xml:space="preserve">= .028). Men in this sample more often combined wage labour with ERT; women more often refused to count ERT as campus. Both patterns are signals in a male-majority sample. They are not a full gender analysis. With 11 women we cannot say whether quieter homes, care work, or device sharing produced the refusal.</w:t>
-      </w:r>
-    </w:p>
-    <w:bookmarkEnd w:id="39"/>
-    <w:bookmarkStart w:id="40" w:name="sensitivity"/>
-    <w:p>
-      <w:pPr>
-        <w:pStyle w:val="Heading3"/>
-      </w:pPr>
-      <w:r>
-        <w:t xml:space="preserve">5.6 Sensitivity</w:t>
-      </w:r>
-    </w:p>
-    <w:p>
-      <w:pPr>
-        <w:pStyle w:val="FirstParagraph"/>
-      </w:pPr>
-      <w:r>
-        <w:t xml:space="preserve">Table 5 repeats the two focal tests. Pakistani-only (n = 37): unstable network 75.7%, no power 43.2%; home × very high stress still</w:t>
+        <w:t xml:space="preserve">&lt; .001 and speed × appraisal was ρ = .67. Among responses whose IP was not labelled mainland China (n = 29), the same figures were 75.9%, 41.4%,</w:t>
       </w:r>
       <w:r>
         <w:t xml:space="preserve"> </w:t>
@@ -3453,23 +3362,7 @@
         <w:t xml:space="preserve"> </w:t>
       </w:r>
       <w:r>
-        <w:t xml:space="preserve">&lt; .001; speed × appraisal ρ = .67. Offshore-IP (n = 29): unstable network 75.9%, no power 41.4%; home × stress still</w:t>
-      </w:r>
-      <w:r>
-        <w:t xml:space="preserve"> </w:t>
-      </w:r>
-      <w:r>
-        <w:rPr>
-          <w:iCs/>
-          <w:i/>
-        </w:rPr>
-        <w:t xml:space="preserve">p</w:t>
-      </w:r>
-      <w:r>
-        <w:t xml:space="preserve"> </w:t>
-      </w:r>
-      <w:r>
-        <w:t xml:space="preserve">&lt; .001; speed × appraisal ρ = .70. Dropping the Bangladeshi case and the China-labelled IPs does not reverse the associations.</w:t>
+        <w:t xml:space="preserve">&lt; .001, and ρ = .70. Restricting the sample does not reverse the associations.</w:t>
       </w:r>
     </w:p>
     <w:p>
@@ -3841,42 +3734,24 @@
         </w:tc>
       </w:tr>
     </w:tbl>
+    <w:bookmarkEnd w:id="39"/>
+    <w:bookmarkEnd w:id="40"/>
+    <w:bookmarkStart w:id="45" w:name="discussion"/>
     <w:p>
       <w:pPr>
-        <w:pStyle w:val="BodyText"/>
-      </w:pPr>
-      <w:r>
-        <w:rPr>
-          <w:iCs/>
-          <w:i/>
-        </w:rPr>
-        <w:t xml:space="preserve">Note.</w:t>
-      </w:r>
-      <w:r>
-        <w:t xml:space="preserve"> </w:t>
-      </w:r>
-      <w:r>
-        <w:t xml:space="preserve">The home-stress link and the speed-appraisal link remain in the same direction when the Bangladeshi case and China-IP cases are dropped.</w:t>
+        <w:pStyle w:val="Heading2"/>
+      </w:pPr>
+      <w:r>
+        <w:t xml:space="preserve">6. Discussion</w:t>
       </w:r>
     </w:p>
-    <w:bookmarkEnd w:id="40"/>
-    <w:bookmarkEnd w:id="41"/>
-    <w:bookmarkStart w:id="47" w:name="discussion"/>
+    <w:bookmarkStart w:id="41" w:name="a-campus-curriculum-without-the-campus"/>
     <w:p>
       <w:pPr>
-        <w:pStyle w:val="Heading2"/>
-      </w:pPr>
-      <w:r>
-        <w:t xml:space="preserve">6. Discussion</w:t>
-      </w:r>
-    </w:p>
-    <w:bookmarkStart w:id="42" w:name="south-south-mobility-without-the-campus"/>
-    <w:p>
-      <w:pPr>
         <w:pStyle w:val="Heading3"/>
       </w:pPr>
       <w:r>
-        <w:t xml:space="preserve">6.1 South-South mobility without the campus</w:t>
+        <w:t xml:space="preserve">6.1 A campus curriculum without the campus</w:t>
       </w:r>
     </w:p>
     <w:p>
@@ -3884,25 +3759,7 @@
         <w:pStyle w:val="FirstParagraph"/>
       </w:pPr>
       <w:r>
-        <w:t xml:space="preserve">Chinese-university language programmes imagine a campus: dormitory, classroom, extra-curricular Chinese, and an HSK calendar. ERT kept the assessment plan and removed the campus for those who were offshore. Stress at 36.8% very high is not only pandemic psychology. It is also language-learning psychology once speaking and listening, the skills that most need a live other, meet an unstable connection and a lively room (cf. MacIntyre et al., 2020). The home-stress odds ratio is the empirical core of that claim. The 97.4%</w:t>
-      </w:r>
-      <w:r>
-        <w:t xml:space="preserve"> </w:t>
-      </w:r>
-      <w:r>
-        <w:t xml:space="preserve">“</w:t>
-      </w:r>
-      <w:r>
-        <w:t xml:space="preserve">any stress</w:t>
-      </w:r>
-      <w:r>
-        <w:t xml:space="preserve">”</w:t>
-      </w:r>
-      <w:r>
-        <w:t xml:space="preserve"> </w:t>
-      </w:r>
-      <w:r>
-        <w:t xml:space="preserve">figure is not.</w:t>
+        <w:t xml:space="preserve">Chinese-university language programmes imagine a campus: a dormitory, a classroom, extra-curricular Chinese, and an HSK calendar. Emergency remote teaching kept the assessment plan and removed the campus for those who were offshore. Very high stress at 36.8% is not only pandemic psychology. It is also language-learning psychology once speaking and listening, the skills that most need a live other, meet an unstable connection and a lively room (cf. MacIntyre et al., 2020). The home-stress association is the empirical core of that claim.</w:t>
       </w:r>
     </w:p>
     <w:p>
@@ -3910,17 +3767,53 @@
         <w:pStyle w:val="BodyText"/>
       </w:pPr>
       <w:r>
-        <w:t xml:space="preserve">The data remain relevant after the emergency because hybrid ICLE and HSK delivery on Chinese-campus systems are still designed as if the login, the hour, and the room were campus-like. Moorhouse et al. (2023) describe technological normalisation after return to class. Stockwell and Wang (2023) warn that treating videoconferencing as a copy of campus teaching is a limited lesson from ERT. This corridor did not reach that normalisation. Before a learner can invest in a later digital practice such as generative AI (Darvin, 2025), the class has to open, the current has to hold, and the house has to allow a voice.</w:t>
+        <w:t xml:space="preserve">The finding remains relevant after the emergency because hybrid ICLE and HSK delivery on Chinese-campus systems are still often designed as if the login, the hour, and the room were campus-like. Moorhouse et al. (2023) describe technological normalisation after the return to class. Stockwell and Wang (2023) warn that treating videoconferencing as a copy of campus teaching is a limited lesson from the crisis. This corridor did not reach that normalisation. Before a learner can invest in a later digital practice such as generative AI (Darvin, 2025), the class has to open, the current has to hold, and the house has to allow a voice.</w:t>
+      </w:r>
+    </w:p>
+    <w:bookmarkEnd w:id="41"/>
+    <w:bookmarkStart w:id="42" w:name="X3acea38e0eaa813d07faf5a60d129f027ed62fe"/>
+    <w:p>
+      <w:pPr>
+        <w:pStyle w:val="Heading3"/>
+      </w:pPr>
+      <w:r>
+        <w:t xml:space="preserve">6.2 Sequence, speed, and the geography of the login</w:t>
+      </w:r>
+    </w:p>
+    <w:p>
+      <w:pPr>
+        <w:pStyle w:val="FirstParagraph"/>
+      </w:pPr>
+      <w:r>
+        <w:t xml:space="preserve">The findings fit van Dijk’s order better than a single</w:t>
+      </w:r>
+      <w:r>
+        <w:t xml:space="preserve"> </w:t>
+      </w:r>
+      <w:r>
+        <w:t xml:space="preserve">“</w:t>
+      </w:r>
+      <w:r>
+        <w:t xml:space="preserve">poor internet</w:t>
+      </w:r>
+      <w:r>
+        <w:t xml:space="preserve">”</w:t>
+      </w:r>
+      <w:r>
+        <w:t xml:space="preserve"> </w:t>
+      </w:r>
+      <w:r>
+        <w:t xml:space="preserve">headline. Power and signal sit under speed. Speed tracks learning appraisal and interaction. A tally of infrastructure problems does not. Campus platforms sit in another country from the applications that actually open. Training teachers in Chaoxing breakout rooms addresses a layer many of these students could not enter. For this corridor the earlier layers are household electricity and whether the campus login opens on the phone the student has.</w:t>
       </w:r>
     </w:p>
     <w:bookmarkEnd w:id="42"/>
-    <w:bookmarkStart w:id="43" w:name="X49e8e1ce33381e66831ca96dfec006da4ceef99"/>
+    <w:bookmarkStart w:id="43" w:name="investment-as-a-reading-of-participation"/>
     <w:p>
       <w:pPr>
         <w:pStyle w:val="Heading3"/>
       </w:pPr>
       <w:r>
-        <w:t xml:space="preserve">6.2 Sequential inequality in the present sample</w:t>
+        <w:t xml:space="preserve">6.3 Investment as a reading of participation</w:t>
       </w:r>
     </w:p>
     <w:p>
@@ -3928,7 +3821,7 @@
         <w:pStyle w:val="FirstParagraph"/>
       </w:pPr>
       <w:r>
-        <w:t xml:space="preserve">The findings fit van Dijk’s order better than a single</w:t>
+        <w:t xml:space="preserve">Norton’s model is often used to describe learners who insist on speaking. It also describes withdrawal that is rational under cost. Darvin and Norton (2023) distinguish this from motivation: a student may still want Chinese and yet not be invested in the practices of a given class. If the imagined return of Chinese remains high, but the daily cost (data, a lively house, a job, a class that will not load) remains higher, the emergency class can be unworkable even when motivation is not. Only 15.8% said they interacted with the teacher</w:t>
       </w:r>
       <w:r>
         <w:t xml:space="preserve"> </w:t>
@@ -3937,26 +3830,31 @@
         <w:t xml:space="preserve">“</w:t>
       </w:r>
       <w:r>
-        <w:t xml:space="preserve">poor internet</w:t>
+        <w:t xml:space="preserve">very much</w:t>
       </w:r>
       <w:r>
         <w:t xml:space="preserve">”</w:t>
       </w:r>
       <w:r>
-        <w:t xml:space="preserve"> </w:t>
-      </w:r>
-      <w:r>
-        <w:t xml:space="preserve">headline. Power and signal sit under speed. Speed tracks learning appraisal and interaction. A tally of infrastructure ticks does not. Campus platforms sit in another country from the apps that actually open. Training teachers in Chaoxing breakout rooms addresses a layer many of these students could not enter. For this corridor the earlier layers are household electricity and whether the campus login opens on the phone the student has.</w:t>
+        <w:t xml:space="preserve">; 28.9% learned little or nothing. The even split on replacement is a disagreement over whether emergency remote teaching counts as Chinese class. Women in this sample more often settled that disagreement in the negative. These are proxies for participation and legitimacy, not a full measure of investment.</w:t>
+      </w:r>
+    </w:p>
+    <w:p>
+      <w:pPr>
+        <w:pStyle w:val="BodyText"/>
+      </w:pPr>
+      <w:r>
+        <w:t xml:space="preserve">Darvin and Norton (2015) argued that digital spaces reconfigure capital. Campus Chinese offers embodied speaking practice. Home emergency teaching, on these items, offered thinner teacher interaction and mixed learning appraisal. That is a plausible loss of oral practice, not a measured loss of oral capital. It is the kind of (dis)investment among international students of languages other than English that Hajar and Karakuş (2024) place on the current agenda.</w:t>
       </w:r>
     </w:p>
     <w:bookmarkEnd w:id="43"/>
-    <w:bookmarkStart w:id="44" w:name="investment-and-completing-required-time"/>
+    <w:bookmarkStart w:id="44" w:name="X39950e1efabcdc47d874a9648c402485941641e"/>
     <w:p>
       <w:pPr>
         <w:pStyle w:val="Heading3"/>
       </w:pPr>
       <w:r>
-        <w:t xml:space="preserve">6.3 Investment and completing required time</w:t>
+        <w:t xml:space="preserve">6.4 Localising delivery, not only cultural content</w:t>
       </w:r>
     </w:p>
     <w:p>
@@ -3964,22 +3862,7 @@
         <w:pStyle w:val="FirstParagraph"/>
       </w:pPr>
       <w:r>
-        <w:t xml:space="preserve">Norton’s model is often used to describe learners who insist on speaking. It also describes withdrawal that is rational under cost. Darvin and Norton (2023) distinguish this from motivation: a student may still want Chinese and yet not be invested in the practices of a given class. If the imagined return of Chinese remains high, but the daily cost (data, a lively house, a job, a class that will not load) remains higher, the emergency class can be unworkable even when motivation is not. Only 15.8% said they interacted with the teacher</w:t>
-      </w:r>
-      <w:r>
-        <w:t xml:space="preserve"> </w:t>
-      </w:r>
-      <w:r>
-        <w:t xml:space="preserve">“</w:t>
-      </w:r>
-      <w:r>
-        <w:t xml:space="preserve">very much</w:t>
-      </w:r>
-      <w:r>
-        <w:t xml:space="preserve">”</w:t>
-      </w:r>
-      <w:r>
-        <w:t xml:space="preserve">; 28.9% learned little or nothing. The even split on replacement is a disagreement over whether ERT counts as Chinese class. Women in this sample more often settle that disagreement in the negative. These are proxies for participation and legitimacy, not a full measure of investment.</w:t>
+        <w:t xml:space="preserve">ICLE debates on localisation often ask whether a textbook should replace Beijing place names with local names, or whether festival content needs Islamic-context mediation. Those questions belong in work on materials in Pakistani universities. The present data push localisation into course delivery. A culturally adapted lesson still fails if it is a synchronous oral lesson delivered into load-shedding. Material-context fit means whether this component of the course can be used by these learners in this programme ecology. In the emergency, the programme ecology was a Chinese-university timetable, the users sat in Pakistani houses, and the material was a live class that assumed campus conditions. Hybrid ICLE that still copies that timetable onto Tencent Meeting or Chaoxing, without asking whether the application opens and whether the house can hold a 45-minute oral hour, repeats the misfit after the pandemic.</w:t>
       </w:r>
     </w:p>
     <w:p>
@@ -3987,195 +3870,23 @@
         <w:pStyle w:val="BodyText"/>
       </w:pPr>
       <w:r>
-        <w:t xml:space="preserve">Darvin and Norton (2015) argued that digital spaces reconfigure capital. Campus Chinese offers embodied speaking practice. Home ERT, on these items, offered thinner teacher interaction and mixed learning appraisal. That is a plausible loss of oral practice, not a measured loss of oral capital. It is the kind of (dis)investment among international students of languages other than English that Hajar and Karakuş (2024) place on the current agenda. South-South Chinese cases remain scarce on that map.</w:t>
-      </w:r>
-    </w:p>
-    <w:bookmarkEnd w:id="44"/>
-    <w:bookmarkStart w:id="45" w:name="X9ef7777cc74a7114421d0af40c95e1657e9b22c"/>
-    <w:p>
-      <w:pPr>
-        <w:pStyle w:val="Heading3"/>
-      </w:pPr>
-      <w:r>
-        <w:t xml:space="preserve">6.4 Localisation as delivery, not only cultural content</w:t>
+        <w:t xml:space="preserve">What follows for course design is modest and local to this sample. Disruption-ready Chinese is a curriculum problem, not only a platform subscription. Asynchronous oral alternatives (short voice tasks with delayed feedback; voice notes that survive low bandwidth) belong in the language-course handbook rather than being invented in a crisis. If speaking was structurally difficult to practise, progression decisions should not rest on oral-equivalent standards without adjustment. Prepaid data for offshore students is a language-learning resource in the same sense that textbooks are. If live classes follow Beijing time, attendance measures electricity and the clock as well as diligence. And if Chaoxing and QQ do not open, the usable classroom is the tool that does. WhatsApp was marked available here; it was not recorded as used for class.</w:t>
       </w:r>
     </w:p>
     <w:p>
       <w:pPr>
-        <w:pStyle w:val="FirstParagraph"/>
-      </w:pPr>
-      <w:r>
-        <w:t xml:space="preserve">ICLE debates on localisation often ask whether a textbook should replace Beijing place names with local names, or whether festival content needs Islamic-context mediation. Those questions belong in a separate paper on materials in Pakistani universities. The present data push localisation into course delivery. A culturally adapted lesson still fails if it is a synchronous oral lesson delivered into load-shedding. Material-context fit means whether this component of the course can be used by these learners in this programme ecology. In the emergency, the programme ecology was a Chinese-university timetable, the users sat in Pakistani houses, and the material was a live class that assumed campus conditions. Hybrid ICLE that still copies that timetable onto Tencent Meeting or Chaoxing, without asking whether the app opens and whether the house can hold a 45-minute oral hour, repeats the misfit after the pandemic.</w:t>
-      </w:r>
-    </w:p>
-    <w:bookmarkEnd w:id="45"/>
-    <w:bookmarkStart w:id="46" w:name="the-male-majority-sample"/>
-    <w:p>
-      <w:pPr>
-        <w:pStyle w:val="Heading3"/>
-      </w:pPr>
-      <w:r>
-        <w:t xml:space="preserve">6.5 The male-majority sample</w:t>
+        <w:pStyle w:val="BodyText"/>
+      </w:pPr>
+      <w:r>
+        <w:t xml:space="preserve">The same households send students to Confucius Institutes and to Chinese universities. Hybrid institute teaching that assumes uninterrupted Zoom reproduces the same misfit. Localisation for Pakistani Chinese teachers has to include checks of power, devices, and mediation language as well as textbook adaptation.</w:t>
       </w:r>
     </w:p>
     <w:p>
       <w:pPr>
-        <w:pStyle w:val="FirstParagraph"/>
-      </w:pPr>
-      <w:r>
-        <w:t xml:space="preserve">The sample is 71% male (11 women). That limits what can be claimed. Table 1 records the skew; the limit is on interpretation. Digital inequality in Pakistani households is gendered. Privacy, care, and who owns the phone structure who can sit in a live Chinese class. Raza and Hennessy (2025) document that pattern for home educational technology in Pakistani schools. A Chinese-university language sample recruited through male-dense student networks will under-represent it.</w:t>
-      </w:r>
-    </w:p>
-    <w:p>
-      <w:pPr>
         <w:pStyle w:val="BodyText"/>
       </w:pPr>
       <w:r>
-        <w:t xml:space="preserve">On most ordinals, men and women did not differ. On replacement, women more often said no. On paid work, men more often said yes. The data cannot show how women lived the noisy home, the power cut, or the blocked Chaoxing login. Future ICLE work on this corridor should oversample Pakistani women on Chinese-university and Confucius Institute routes rather than treat a 70% male network sample as</w:t>
-      </w:r>
-      <w:r>
-        <w:t xml:space="preserve"> </w:t>
-      </w:r>
-      <w:r>
-        <w:t xml:space="preserve">“</w:t>
-      </w:r>
-      <w:r>
-        <w:t xml:space="preserve">Pakistani students.</w:t>
-      </w:r>
-      <w:r>
-        <w:t xml:space="preserve">”</w:t>
-      </w:r>
-    </w:p>
-    <w:p>
-      <w:pPr>
-        <w:pStyle w:val="BodyText"/>
-      </w:pPr>
-      <w:r>
-        <w:t xml:space="preserve">Nine China-labelled IPs mean the sample is also not a group in which everyone sat in Pakistan. The mechanism (home and platform access) still holds for an interrupted cohort. The gender limitation remains.</w:t>
-      </w:r>
-    </w:p>
-    <w:bookmarkEnd w:id="46"/>
-    <w:bookmarkEnd w:id="47"/>
-    <w:bookmarkStart w:id="51" w:name="implications"/>
-    <w:p>
-      <w:pPr>
-        <w:pStyle w:val="Heading2"/>
-      </w:pPr>
-      <w:r>
-        <w:t xml:space="preserve">7. Implications</w:t>
-      </w:r>
-    </w:p>
-    <w:bookmarkStart w:id="48" w:name="Xb4d3ca923462a90bf9ff52f0f0d75b5ec6a810a"/>
-    <w:p>
-      <w:pPr>
-        <w:pStyle w:val="Heading3"/>
-      </w:pPr>
-      <w:r>
-        <w:t xml:space="preserve">7.1 For Chinese universities hosting Pakistani language students</w:t>
-      </w:r>
-    </w:p>
-    <w:p>
-      <w:pPr>
-        <w:pStyle w:val="FirstParagraph"/>
-      </w:pPr>
-      <w:r>
-        <w:t xml:space="preserve">These points are suggestions from this sample, not a national evaluation of CSC or of the Center for Language Education and Cooperation (CLEC).</w:t>
-      </w:r>
-    </w:p>
-    <w:p>
-      <w:pPr>
-        <w:numPr>
-          <w:ilvl w:val="0"/>
-          <w:numId w:val="1001"/>
-        </w:numPr>
-        <w:pStyle w:val="Compact"/>
-      </w:pPr>
-      <w:r>
-        <w:t xml:space="preserve">Treat disruption-ready Chinese as a course-design problem rather than a platform subscription. Asynchronous oral alternatives (short voice tasks with delayed feedback; SMS or WhatsApp voice notes that survive low bandwidth) should be in the language-course handbook rather than invented in a crisis.</w:t>
-      </w:r>
-    </w:p>
-    <w:p>
-      <w:pPr>
-        <w:numPr>
-          <w:ilvl w:val="0"/>
-          <w:numId w:val="1001"/>
-        </w:numPr>
-        <w:pStyle w:val="Compact"/>
-      </w:pPr>
-      <w:r>
-        <w:t xml:space="preserve">Do not assess emergency or offshore cohorts as if they had campus oral hours. If speaking was structurally difficult to practise, proficiency claims and progression decisions should not rest on oral-equivalent standards without adjustment.</w:t>
-      </w:r>
-    </w:p>
-    <w:p>
-      <w:pPr>
-        <w:numPr>
-          <w:ilvl w:val="0"/>
-          <w:numId w:val="1001"/>
-        </w:numPr>
-        <w:pStyle w:val="Compact"/>
-      </w:pPr>
-      <w:r>
-        <w:t xml:space="preserve">Budget prepaid data for offshore students as a language-learning resource, as textbooks are budgeted. This sample already had phones (63% iPhone); the gap was power, speed, and login, not device ownership.</w:t>
-      </w:r>
-    </w:p>
-    <w:p>
-      <w:pPr>
-        <w:numPr>
-          <w:ilvl w:val="0"/>
-          <w:numId w:val="1001"/>
-        </w:numPr>
-        <w:pStyle w:val="Compact"/>
-      </w:pPr>
-      <w:r>
-        <w:t xml:space="preserve">If live classes follow Beijing time, name that in timetabling for students sitting in Pakistan. Attendance then measures electricity and the clock as well as diligence.</w:t>
-      </w:r>
-    </w:p>
-    <w:p>
-      <w:pPr>
-        <w:numPr>
-          <w:ilvl w:val="0"/>
-          <w:numId w:val="1001"/>
-        </w:numPr>
-        <w:pStyle w:val="Compact"/>
-      </w:pPr>
-      <w:r>
-        <w:t xml:space="preserve">Do not assume the campus platform system. If Chaoxing and QQ do not open, the usable classroom is Zoom or another tool that opens, not a voice-note substitute invented only in a crisis. WhatsApp was marked available here; it was not coded as used for class.</w:t>
-      </w:r>
-    </w:p>
-    <w:bookmarkEnd w:id="48"/>
-    <w:bookmarkStart w:id="49" w:name="X494cf576f793175e57850172bdce479b5ba6678"/>
-    <w:p>
-      <w:pPr>
-        <w:pStyle w:val="Heading3"/>
-      </w:pPr>
-      <w:r>
-        <w:t xml:space="preserve">7.2 For Pakistani universities and Confucius Institutes</w:t>
-      </w:r>
-    </w:p>
-    <w:p>
-      <w:pPr>
-        <w:pStyle w:val="FirstParagraph"/>
-      </w:pPr>
-      <w:r>
-        <w:t xml:space="preserve">The same households send students to Confucius Institutes and to Chinese universities. Hybrid Institute teaching that assumes uninterrupted Zoom reproduces the same misfit. Localisation workshops for Pakistani Chinese teachers should include checks of power, devices, and mediation language as well as textbook adaptation.</w:t>
-      </w:r>
-    </w:p>
-    <w:bookmarkEnd w:id="49"/>
-    <w:bookmarkStart w:id="50" w:name="for-research"/>
-    <w:p>
-      <w:pPr>
-        <w:pStyle w:val="Heading3"/>
-      </w:pPr>
-      <w:r>
-        <w:t xml:space="preserve">7.3 For research</w:t>
-      </w:r>
-    </w:p>
-    <w:p>
-      <w:pPr>
-        <w:pStyle w:val="FirstParagraph"/>
-      </w:pPr>
-      <w:r>
-        <w:t xml:space="preserve">Future work should (a) oversample Pakistani women on Chinese-university and related routes rather than reuse a male-dense snowball; (b) compare home learners enrolled in China with Confucius Institute learners in the same cities; (c) follow oral and written skill splits with tasks, not only self-report. The material-context question can then move from emergency delivery to ordinary curriculum, including, in later work, how</w:t>
+        <w:t xml:space="preserve">The sample is 71% male. Digital inequality in Pakistani households is gendered (Raza &amp; Hennessy, 2025), and a Chinese-university sample recruited through male-dense networks will under-represent that pattern. On most ordinals, men and women did not differ. On replacement, women more often said no. On paid work, men more often said yes. The data cannot show how women lived the noisy home, the power cut, or the blocked Chaoxing login. Future work on this corridor should oversample Pakistani women, compare home learners enrolled in China with Confucius Institute learners in the same cities, and follow oral and written skill with tasks rather than only self-report. How</w:t>
       </w:r>
       <w:r>
         <w:t xml:space="preserve"> </w:t>
@@ -4191,130 +3902,66 @@
         <w:t xml:space="preserve"> </w:t>
       </w:r>
       <w:r>
-        <w:t xml:space="preserve">is used in Pakistani universities. That is a different paper.</w:t>
+        <w:t xml:space="preserve">is used in Pakistani universities is a different paper.</w:t>
       </w:r>
     </w:p>
-    <w:bookmarkEnd w:id="50"/>
-    <w:bookmarkEnd w:id="51"/>
-    <w:bookmarkStart w:id="52" w:name="limitations"/>
+    <w:bookmarkEnd w:id="44"/>
+    <w:bookmarkEnd w:id="45"/>
+    <w:bookmarkStart w:id="46" w:name="limitations"/>
     <w:p>
       <w:pPr>
         <w:pStyle w:val="Heading2"/>
       </w:pPr>
       <w:r>
-        <w:t xml:space="preserve">8. Limitations</w:t>
+        <w:t xml:space="preserve">7. Limitations</w:t>
       </w:r>
     </w:p>
     <w:p>
       <w:pPr>
-        <w:numPr>
-          <w:ilvl w:val="0"/>
-          <w:numId w:val="1002"/>
-        </w:numPr>
-        <w:pStyle w:val="Compact"/>
-      </w:pPr>
-      <w:r>
-        <w:t xml:space="preserve">n = 38. Odds-ratio intervals are wide. They are reported as direction plus exact tests, not as precise population values.</w:t>
+        <w:pStyle w:val="FirstParagraph"/>
+      </w:pPr>
+      <w:r>
+        <w:t xml:space="preserve">The sample is small (N = 38), and odds-ratio intervals are wide; they are reported as direction plus exact tests, not as precise population values. It is a male-majority convenience sample of phone users, with nine responses labelled mainland China, so the findings describe this network rather than Pakistani women as a group or a census of students in Pakistan that week. Sensitivity analyses on n = 37 and n = 29 do not remove that limit. All outcomes are self-report; there are no HSK scores or oral tasks, and</w:t>
+      </w:r>
+      <w:r>
+        <w:t xml:space="preserve"> </w:t>
+      </w:r>
+      <w:r>
+        <w:t xml:space="preserve">“</w:t>
+      </w:r>
+      <w:r>
+        <w:t xml:space="preserve">advanced</w:t>
+      </w:r>
+      <w:r>
+        <w:t xml:space="preserve">”</w:t>
+      </w:r>
+      <w:r>
+        <w:t xml:space="preserve"> </w:t>
+      </w:r>
+      <w:r>
+        <w:t xml:space="preserve">is a self-rating. Chinese-medium items with non-native wording may have been understood unevenly. The questionnaire does not name the host university, textbook, or award type, and investment was not measured as a scale. The 2022 collection was not assigned an institutional ethics number. The transferable claim concerns inequality, home, platform access, and participation, not the pandemic as such.</w:t>
+      </w:r>
+    </w:p>
+    <w:bookmarkEnd w:id="46"/>
+    <w:bookmarkStart w:id="47" w:name="conclusion"/>
+    <w:p>
+      <w:pPr>
+        <w:pStyle w:val="Heading2"/>
+      </w:pPr>
+      <w:r>
+        <w:t xml:space="preserve">8. Conclusion</w:t>
       </w:r>
     </w:p>
     <w:p>
       <w:pPr>
-        <w:numPr>
-          <w:ilvl w:val="0"/>
-          <w:numId w:val="1002"/>
-        </w:numPr>
-        <w:pStyle w:val="Compact"/>
-      </w:pPr>
-      <w:r>
-        <w:t xml:space="preserve">Male-majority convenience sample (27 men, 11 women), phones only, nine China-labelled IPs. Findings describe this network, not Pakistani women as a group. Sensitivity on n = 37 and n = 29 does not remove that limit.</w:t>
+        <w:pStyle w:val="FirstParagraph"/>
+      </w:pPr>
+      <w:r>
+        <w:t xml:space="preserve">Pakistani students who learned Chinese through this emergency did not mainly fail to adapt to online learning. Many homes were asked to carry a Chinese-university class. Many had no quiet room, no stable power, and no login that matched the campus system. Digital inequality entered as electricity, speed, and platform access. Participation looked like thin interaction, mixed learning appraisal, and an even split over whether this counted as class. Women in the sample more often refused that count. Localising Chinese teaching for this corridor means fitting delivery to the house and to the application that actually opens. That is a problem of language, culture, and curriculum. The field has moved on to blended normalisation and generative AI. The inequality in these data has not.</w:t>
       </w:r>
     </w:p>
-    <w:p>
-      <w:pPr>
-        <w:numPr>
-          <w:ilvl w:val="0"/>
-          <w:numId w:val="1002"/>
-        </w:numPr>
-        <w:pStyle w:val="Compact"/>
-      </w:pPr>
-      <w:r>
-        <w:t xml:space="preserve">Self-report; no HSK scores or oral tasks.</w:t>
-      </w:r>
-      <w:r>
-        <w:t xml:space="preserve"> </w:t>
-      </w:r>
-      <w:r>
-        <w:t xml:space="preserve">“</w:t>
-      </w:r>
-      <w:r>
-        <w:t xml:space="preserve">Advanced</w:t>
-      </w:r>
-      <w:r>
-        <w:t xml:space="preserve">”</w:t>
-      </w:r>
-      <w:r>
-        <w:t xml:space="preserve"> </w:t>
-      </w:r>
-      <w:r>
-        <w:t xml:space="preserve">is a self-rating.</w:t>
-      </w:r>
-    </w:p>
-    <w:p>
-      <w:pPr>
-        <w:numPr>
-          <w:ilvl w:val="0"/>
-          <w:numId w:val="1002"/>
-        </w:numPr>
-        <w:pStyle w:val="Compact"/>
-      </w:pPr>
-      <w:r>
-        <w:t xml:space="preserve">Chinese-medium items with non-native wording may have been understood unevenly.</w:t>
-      </w:r>
-    </w:p>
-    <w:p>
-      <w:pPr>
-        <w:numPr>
-          <w:ilvl w:val="0"/>
-          <w:numId w:val="1002"/>
-        </w:numPr>
-        <w:pStyle w:val="Compact"/>
-      </w:pPr>
-      <w:r>
-        <w:t xml:space="preserve">The export does not name the host university, textbook, or award type. Investment was not measured as a scale.</w:t>
-      </w:r>
-    </w:p>
-    <w:p>
-      <w:pPr>
-        <w:numPr>
-          <w:ilvl w:val="0"/>
-          <w:numId w:val="1002"/>
-        </w:numPr>
-        <w:pStyle w:val="Compact"/>
-      </w:pPr>
-      <w:r>
-        <w:t xml:space="preserve">COVID-specific delivery. The transferable claim concerns inequality, home, platform access, and participation, not the pandemic as such.</w:t>
-      </w:r>
-    </w:p>
-    <w:bookmarkEnd w:id="52"/>
-    <w:bookmarkStart w:id="53" w:name="conclusion"/>
-    <w:p>
-      <w:pPr>
-        <w:pStyle w:val="Heading2"/>
-      </w:pPr>
-      <w:r>
-        <w:t xml:space="preserve">9. Conclusion</w:t>
-      </w:r>
-    </w:p>
-    <w:p>
-      <w:pPr>
-        <w:pStyle w:val="FirstParagraph"/>
-      </w:pPr>
-      <w:r>
-        <w:t xml:space="preserve">Pakistani (and one neighbouring) students who learned Chinese through this emergency did not mainly fail to adapt to online learning. Many homes were asked to carry a Chinese-university class. Many had no quiet room, no stable power, and no login that matched the campus system. Digital inequality entered as electricity, speed, and platform access. Participation looked like thin interaction, mixed learning appraisal, and an even split over whether this counted as class. Women in the sample more often refused that count. Localising Chinese teaching for this corridor means fitting delivery to the house and to the app that actually opens. That is a problem of language, culture, and curriculum. The field has moved on to blended normalisation and generative AI. The inequality in these data has not.</w:t>
-      </w:r>
-    </w:p>
-    <w:bookmarkEnd w:id="53"/>
-    <w:bookmarkStart w:id="54" w:name="references"/>
+    <w:bookmarkEnd w:id="47"/>
+    <w:bookmarkStart w:id="48" w:name="references"/>
     <w:p>
       <w:pPr>
         <w:pStyle w:val="Heading2"/>
@@ -4998,8 +4645,8 @@
         <w:t xml:space="preserve">, 127-142. https://doi.org/10.1007/s10671-009-9078-1</w:t>
       </w:r>
     </w:p>
-    <w:bookmarkEnd w:id="54"/>
-    <w:bookmarkEnd w:id="55"/>
+    <w:bookmarkEnd w:id="48"/>
+    <w:bookmarkEnd w:id="49"/>
     <w:sectPr>
       <w:pgSz w:h="15840" w:w="12240"/>
       <w:pgMar w:bottom="1440" w:footer="720" w:gutter="0" w:header="720" w:left="1440" w:right="1440" w:top="1440"/>
@@ -5398,36 +5045,6 @@
     <w:abstractNumId w:val="990"/>
   </w:num>
   <w:num w:numId="1001">
-    <w:abstractNumId w:val="99411"/>
-    <w:lvlOverride w:ilvl="0">
-      <w:startOverride w:val="1"/>
-    </w:lvlOverride>
-    <w:lvlOverride w:ilvl="1">
-      <w:startOverride w:val="1"/>
-    </w:lvlOverride>
-    <w:lvlOverride w:ilvl="2">
-      <w:startOverride w:val="1"/>
-    </w:lvlOverride>
-    <w:lvlOverride w:ilvl="3">
-      <w:startOverride w:val="1"/>
-    </w:lvlOverride>
-    <w:lvlOverride w:ilvl="4">
-      <w:startOverride w:val="1"/>
-    </w:lvlOverride>
-    <w:lvlOverride w:ilvl="5">
-      <w:startOverride w:val="1"/>
-    </w:lvlOverride>
-    <w:lvlOverride w:ilvl="6">
-      <w:startOverride w:val="1"/>
-    </w:lvlOverride>
-    <w:lvlOverride w:ilvl="7">
-      <w:startOverride w:val="1"/>
-    </w:lvlOverride>
-    <w:lvlOverride w:ilvl="8">
-      <w:startOverride w:val="1"/>
-    </w:lvlOverride>
-  </w:num>
-  <w:num w:numId="1002">
     <w:abstractNumId w:val="99411"/>
     <w:lvlOverride w:ilvl="0">
       <w:startOverride w:val="1"/>

</xml_diff>

<commit_message>
Answer four Q1 concerns: theory, statistics, position, culture
Use a two-layer model (inequality and home); keep investment as a
discussion lens only. Lead with cell counts, not the large odds ratio.
State the paper as curriculum implementation. Justify culture as the
social world of the household class, not textbook representation.

Co-authored-by: kristinehina23-rgb <kristinehina23-rgb@users.noreply.github.com>
</commit_message>
<xml_diff>
--- a/papers/q1-masters-covid/word/Rathore-Cao-Xu-When-Chinese-class-moved-home.docx
+++ b/papers/q1-masters-covid/word/Rathore-Cao-Xu-When-Chinese-class-moved-home.docx
@@ -169,7 +169,7 @@
         <w:pStyle w:val="FirstParagraph"/>
       </w:pPr>
       <w:r>
-        <w:t xml:space="preserve">When Chinese universities moved instruction online, many Pakistani students continued their language courses from households that had not been designed as classrooms. This article treats that shift as a problem of language, culture, and curriculum: Chinese as an additional language was delivered through a campus plan that assumed a working login, a live oral hour, and a quiet room. A questionnaire completed by 38 students in February 2022 (mainly Pakistani; nine responses labelled mainland China) examined how digital inequality and platform access shaped participation. Unstable networks (76.3%), power cuts (42.1%), and homes that were not quiet (71.1%) were common; 36.8% reported very high stress. Homes that affected study</w:t>
+        <w:t xml:space="preserve">When Chinese universities moved instruction online, many Pakistani students continued their language courses from households that had not been designed as classrooms. This article is a study of curriculum implementation: it examines how a Chinese-university language course was delivered, under emergency remote teaching, into homes structured by digital inequality and uneven platform access. A questionnaire completed by 38 students in February 2022 (mainly Pakistani; nine responses labelled mainland China) found unstable networks (76.3%), power cuts (42.1%), and homes that were not quiet (71.1%) to be common; 36.8% reported very high stress. Eleven of the 14 students who said the home affected study</w:t>
       </w:r>
       <w:r>
         <w:t xml:space="preserve"> </w:t>
@@ -187,7 +187,7 @@
         <w:t xml:space="preserve"> </w:t>
       </w:r>
       <w:r>
-        <w:t xml:space="preserve">were associated with very high stress (OR = 25.67, 95% CI [4.42, 149.00]). Worse internet speed tracked worse learning appraisal (ρ = .65). Campus applications such as QQ and Chaoxing were often marked unusable; Zoom and WhatsApp were more often marked available. Half the sample said online study could replace campus classes; women more often said it could not. Localising Chinese on this corridor means fitting delivery to the household and to the application that opens, not only to textbook culture.</w:t>
+        <w:t xml:space="preserve">also reported very high stress, compared with 3 of the 24 others. Worse internet speed tracked worse learning appraisal (ρ = .65). Campus applications such as QQ and Chaoxing were often marked unusable; Zoom and WhatsApp were more often marked available. Half the sample said online study could replace campus classes; women more often said it could not. The implication, bounded by this sample, is that localising delivery on this corridor means fitting the live hour to the household and to the application that opens, not only adapting textbook content.</w:t>
       </w:r>
     </w:p>
     <w:p>
@@ -205,7 +205,7 @@
         <w:t xml:space="preserve"> </w:t>
       </w:r>
       <w:r>
-        <w:t xml:space="preserve">emergency remote teaching; Chinese as an additional language; digital inequality; language investment; Pakistan; curriculum</w:t>
+        <w:t xml:space="preserve">emergency remote teaching; Chinese as an additional language; digital inequality; curriculum implementation; Pakistan; household</w:t>
       </w:r>
     </w:p>
     <w:bookmarkEnd w:id="20"/>
@@ -231,7 +231,15 @@
         <w:pStyle w:val="BodyText"/>
       </w:pPr>
       <w:r>
-        <w:t xml:space="preserve">A Chinese-university language course is more than a textbook and an HSK calendar. It is a planned sequence of live hours, oral tasks, and campus platforms that assume a dormitory, a timetable, and a login that works. Emergency remote teaching (Hodges et al., 2020) kept those elements and changed the place. Learners met the old course plan in households rather than in a redesigned distance-education programme. In this article</w:t>
+        <w:t xml:space="preserve">A Chinese-university language course is more than a textbook and an HSK calendar. It is a planned sequence of live hours, oral tasks, and campus platforms that assume a dormitory, a timetable, and a login that works. Emergency remote teaching (Hodges et al., 2020) kept those elements and changed the place. Learners met the old course plan in households rather than in a redesigned distance-education programme.</w:t>
+      </w:r>
+    </w:p>
+    <w:p>
+      <w:pPr>
+        <w:pStyle w:val="BodyText"/>
+      </w:pPr>
+      <w:r>
+        <w:t xml:space="preserve">The article is therefore about one thing, not four. Emergency remote teaching is the occasion. Digital inequality and platform access are the mechanism. Localisation of</w:t>
       </w:r>
       <w:r>
         <w:t xml:space="preserve"> </w:t>
@@ -241,17 +249,19 @@
           <w:iCs/>
           <w:i/>
         </w:rPr>
-        <w:t xml:space="preserve">culture</w:t>
+        <w:t xml:space="preserve">delivery</w:t>
       </w:r>
       <w:r>
         <w:t xml:space="preserve"> </w:t>
       </w:r>
       <w:r>
-        <w:t xml:space="preserve">means the household as the site of a Chinese class: the social organisation of space, work, gender, and time in which speaking and listening had to happen.</w:t>
-      </w:r>
-      <w:r>
-        <w:t xml:space="preserve"> </w:t>
-      </w:r>
+        <w:t xml:space="preserve">is the implication. The paper is a study of curriculum implementation: how a campus language course was used off campus.</w:t>
+      </w:r>
+    </w:p>
+    <w:p>
+      <w:pPr>
+        <w:pStyle w:val="BodyText"/>
+      </w:pPr>
       <w:r>
         <w:rPr>
           <w:iCs/>
@@ -260,10 +270,54 @@
         <w:t xml:space="preserve">Curriculum</w:t>
       </w:r>
       <w:r>
+        <w:t xml:space="preserve">, accordingly, means the campus delivery plan (the live hour, the oral task, the campus login) when that plan is used away from campus.</w:t>
+      </w:r>
+      <w:r>
         <w:t xml:space="preserve"> </w:t>
       </w:r>
       <w:r>
-        <w:t xml:space="preserve">means the campus delivery plan (the live hour, the oral task, the campus login) when that plan is used off campus.</w:t>
+        <w:rPr>
+          <w:iCs/>
+          <w:i/>
+        </w:rPr>
+        <w:t xml:space="preserve">Culture</w:t>
+      </w:r>
+      <w:r>
+        <w:t xml:space="preserve"> </w:t>
+      </w:r>
+      <w:r>
+        <w:t xml:space="preserve">is used in a narrower sense than textbook representation of Chinese festivals, values, or national images. Work in this journal already treats international students’ experience of Chinese education as a language-and-culture problem (Gao &amp; Hua, 2021; Gong, Gao, Li, &amp; Lai, 2020). Ecological and materials-in-use research locates that problem in the social setting of the class, not only in the page of the book (van Lier, 2004; Guerrettaz et al., 2021). When the class moves into a Pakistani household, the relevant cultural arrangement is who may speak, who owns the phone, whose paid or care work is interrupted, and what a</w:t>
+      </w:r>
+      <w:r>
+        <w:t xml:space="preserve"> </w:t>
+      </w:r>
+      <w:r>
+        <w:t xml:space="preserve">“</w:t>
+      </w:r>
+      <w:r>
+        <w:t xml:space="preserve">Chinese class</w:t>
+      </w:r>
+      <w:r>
+        <w:t xml:space="preserve">”</w:t>
+      </w:r>
+      <w:r>
+        <w:t xml:space="preserve"> </w:t>
+      </w:r>
+      <w:r>
+        <w:t xml:space="preserve">is allowed to mean in family space (Norton, 2013; Raza &amp; Hennessy, 2025). That is culture as the social world of additional-language practice. It is not an ethnography of Pakistani values, and it is not an analysis of how China is represented in</w:t>
+      </w:r>
+      <w:r>
+        <w:t xml:space="preserve"> </w:t>
+      </w:r>
+      <w:r>
+        <w:rPr>
+          <w:iCs/>
+          <w:i/>
+        </w:rPr>
+        <w:t xml:space="preserve">HSK Standard Course</w:t>
+      </w:r>
+      <w:r>
+        <w:t xml:space="preserve">.</w:t>
       </w:r>
     </w:p>
     <w:p>
@@ -313,20 +367,7 @@
         <w:pStyle w:val="BodyText"/>
       </w:pPr>
       <w:r>
-        <w:t xml:space="preserve">The field has since moved on. Digital tools have become ordinary in many face-to-face language classrooms (Moorhouse, 2023; Moorhouse, Wong, &amp; Li, 2023), and investment research has begun to ask how generative AI reconfigures access and meaning-making (Darvin, 2025). Hybrid ICLE and HSK delivery, however, still often assume a login, a bandwidth, and a quiet room. Hajar and Karakuş (2024), writing in</w:t>
-      </w:r>
-      <w:r>
-        <w:t xml:space="preserve"> </w:t>
-      </w:r>
-      <w:r>
-        <w:rPr>
-          <w:iCs/>
-          <w:i/>
-        </w:rPr>
-        <w:t xml:space="preserve">Language, Culture and Curriculum</w:t>
-      </w:r>
-      <w:r>
-        <w:t xml:space="preserve">, call for evidence on the (dis)investment of international students in languages other than English. Pakistani learners of Chinese belong on that agenda, but the first question is more basic: who could enter the class at all?</w:t>
+        <w:t xml:space="preserve">The field has since moved on. Digital tools have become ordinary in many face-to-face language classrooms (Moorhouse, 2023; Moorhouse, Wong, &amp; Li, 2023), and later work asks how generative AI reconfigures access (Darvin, 2025). Hybrid ICLE and HSK delivery, however, still often assume a login, a bandwidth, and a quiet room. The first question on this corridor is more basic: who could enter the class at all?</w:t>
       </w:r>
     </w:p>
     <w:p>
@@ -378,7 +419,23 @@
         <w:pStyle w:val="FirstParagraph"/>
       </w:pPr>
       <w:r>
-        <w:t xml:space="preserve">The contribution is threefold. Empirically, the study offers an item-level account of household infrastructure, platform access, and participation among Pakistani (and one neighbouring) students of Chinese-university language courses. Conceptually, it reads those findings through sequential digital inequality (van Dijk, 2020) and, more cautiously, through language investment (Norton, 2013; Darvin &amp; Norton, 2015, 2023) as a lens on participation rather than as a measured construct. Practically, it argues that localising Chinese on this corridor has to include the conditions of delivery, not only the cultural content of textbooks.</w:t>
+        <w:t xml:space="preserve">The contribution is empirical and curricular. The study describes household infrastructure, platform access, and participation among Pakistani (and one neighbouring) students of Chinese-university language courses. It reads those findings through sequential digital inequality (van Dijk, 2020) and home ecology. Language investment (Norton, 2013; Darvin &amp; Norton, 2015, 2023) is used only in the discussion, as a way of interpreting thin interaction and the split over whether online study counted as class. It is not a third measured construct and it is not required to follow the results. The practical claim is bounded: localising</w:t>
+      </w:r>
+      <w:r>
+        <w:t xml:space="preserve"> </w:t>
+      </w:r>
+      <w:r>
+        <w:rPr>
+          <w:iCs/>
+          <w:i/>
+        </w:rPr>
+        <w:t xml:space="preserve">delivery</w:t>
+      </w:r>
+      <w:r>
+        <w:t xml:space="preserve"> </w:t>
+      </w:r>
+      <w:r>
+        <w:t xml:space="preserve">on this corridor has to include the household and the application that opens, not only the cultural content of textbooks.</w:t>
       </w:r>
     </w:p>
     <w:bookmarkEnd w:id="21"/>
@@ -479,13 +536,13 @@
       </w:r>
     </w:p>
     <w:bookmarkEnd w:id="23"/>
-    <w:bookmarkStart w:id="24" w:name="X9a4d76b78ba1fb82fa4a886c1de67efde849cbb"/>
+    <w:bookmarkStart w:id="24" w:name="X75f45f70ef24a8c055acda28896abcb2b6eeb84"/>
     <w:p>
       <w:pPr>
         <w:pStyle w:val="Heading3"/>
       </w:pPr>
       <w:r>
-        <w:t xml:space="preserve">2.3 Investment, motivation, and the household as structure</w:t>
+        <w:t xml:space="preserve">2.3 Participation, not a measured investment scale</w:t>
       </w:r>
     </w:p>
     <w:p>
@@ -493,7 +550,7 @@
         <w:pStyle w:val="FirstParagraph"/>
       </w:pPr>
       <w:r>
-        <w:t xml:space="preserve">Motivation research can describe who wants to learn Chinese. It is weaker on who can act as a learner on a given afternoon. Norton’s (2013) construct of investment links identity, capital, and ideology. Learners invest when they expect a return in social and material terms, and they withdraw when the classroom, or its substitute, costs more than it returns. Darvin and Norton (2015) placed investment in a digital era of shifting structures. Darvin and Norton (2023) restated the difference from motivation: a learner may be highly motivated and still not invested in the practices of a given classroom if those practices are exclusionary or unworkable. Under emergency remote teaching, the relevant structure was the household: electricity, data, siblings, and the social meaning of sitting on a phone during a live class from Wuhan or Beijing.</w:t>
+        <w:t xml:space="preserve">Motivation research can describe who wants to learn Chinese. It is weaker on who can act as a learner on a given afternoon. Norton’s (2013) construct of investment links identity, capital, and ideology, and Darvin and Norton (2023) distinguish it from motivation: a learner may still want Chinese and yet not be invested in the practices of a given class if those practices are unworkable. Hajar and Karakuş (2024) place the (dis)investment of international students in languages other than English on this journal’s agenda. Wen and Liu (2025) show that advanced learners of Chinese live pride, burnout, and anxiety across classroom scenes that, under emergency remote teaching, were filtered through the household.</w:t>
       </w:r>
     </w:p>
     <w:p>
@@ -501,15 +558,7 @@
         <w:pStyle w:val="BodyText"/>
       </w:pPr>
       <w:r>
-        <w:t xml:space="preserve">The construct remains current. Hajar and Karakuş (2024) map three decades of investment research in this journal and report that output is still rising. Their agenda includes the (dis)investment of international students in languages other than English, and investment in teaching those languages in Asia. Wen and Liu (2025) show that advanced learners of Chinese live pride, burnout, and anxiety as they move between lectures, teacher talk, group work, and extra-curricular activity. Under emergency remote teaching those classroom scenes were filtered through the household. Darvin (2025) has since updated the model for generative AI. The inequality he locates in who may enter a digital space already appeared here as who could open the class.</w:t>
-      </w:r>
-    </w:p>
-    <w:p>
-      <w:pPr>
-        <w:pStyle w:val="BodyText"/>
-      </w:pPr>
-      <w:r>
-        <w:t xml:space="preserve">COVID-19 was also a linguistic crisis: who could ask for help, in which language, on which channel (Piller, Zhang, &amp; Li, 2020). Pakistani learners of Chinese typically mediate through Urdu, English, and regional languages. A live Chinese class on an unfamiliar platform is therefore a language-access problem as well as a technical one.</w:t>
+        <w:t xml:space="preserve">That literature is used later as a discussion lens, not as the design of the questionnaire. The form did not ask about identity, imagined return, or withdrawal. What it recorded is participation: teacher interaction, learning appraisal, and whether online Chinese was judged a substitute for campus study. COVID-19 was also a linguistic crisis (Piller, Zhang, &amp; Li, 2020). A live Chinese class on an unfamiliar platform is a language-access problem as well as a technical one.</w:t>
       </w:r>
     </w:p>
     <w:bookmarkEnd w:id="24"/>
@@ -564,7 +613,20 @@
         <w:pStyle w:val="BodyText"/>
       </w:pPr>
       <w:r>
-        <w:t xml:space="preserve">Post-pandemic CALL has moved toward normalisation and AI, often in English classrooms with working campus Wi-Fi (Moorhouse et al., 2023; Darvin, 2025). Digital-inequality research under-represents additional-language classrooms. Pakistan EdTech gender work has so far spoken mainly about school homes (Raza &amp; Hennessy, 2025). ICLE localisation research under-represents the home as a site of delivery, and under-represents which Chinese-campus applications open from phones outside China. Investment research is asking for South-South evidence on international students of languages other than English (Hajar &amp; Karakuş, 2024). The present study addresses that gap at the point where inequality entered participation.</w:t>
+        <w:t xml:space="preserve">Post-pandemic CALL has moved toward normalisation and AI, often in English classrooms with working campus Wi-Fi (Moorhouse et al., 2023; Darvin, 2025). Digital-inequality research under-represents additional-language classrooms. Pakistan EdTech gender work has so far spoken mainly about school homes (Raza &amp; Hennessy, 2025). ICLE localisation research under-represents the home as a site of</w:t>
+      </w:r>
+      <w:r>
+        <w:t xml:space="preserve"> </w:t>
+      </w:r>
+      <w:r>
+        <w:rPr>
+          <w:iCs/>
+          <w:i/>
+        </w:rPr>
+        <w:t xml:space="preserve">delivery</w:t>
+      </w:r>
+      <w:r>
+        <w:t xml:space="preserve">, and under-represents which Chinese-campus applications open from phones outside China. The present study addresses that gap at the point where a campus curriculum entered the household.</w:t>
       </w:r>
     </w:p>
     <w:bookmarkEnd w:id="25"/>
@@ -583,7 +645,7 @@
         <w:pStyle w:val="FirstParagraph"/>
       </w:pPr>
       <w:r>
-        <w:t xml:space="preserve">The study uses a material-context model of remote Chinese learning (Figure 1). Three layers are treated as concurrent conditions, not as a tested causal path.</w:t>
+        <w:t xml:space="preserve">The study uses a two-layer material-context model (Figure 1). The model is a reading of the questionnaire, not a tested path and not a structural equation.</w:t>
       </w:r>
     </w:p>
     <w:p>
@@ -591,7 +653,7 @@
         <w:pStyle w:val="BodyText"/>
       </w:pPr>
       <w:r>
-        <w:t xml:space="preserve">The first layer is sequential digital inequality (van Dijk, 2020). Electricity, devices, bandwidth, platform skills, and time are ordered resources. Absence at an earlier layer blocks later ones. Without power there is no live class. Without a usable login there is little interaction even if the class is on.</w:t>
+        <w:t xml:space="preserve">The first layer is sequential digital inequality, including platform geography (van Dijk, 2020). Electricity, devices, bandwidth, and time are ordered resources. Which application opens is part of that sequence: campus Chinese tools and consumer tools that work on Pakistani mobile networks are not interchangeable logins. Absence at an earlier layer blocks later ones. Without power there is no live class. Without a usable login there is little interaction even if the class is on.</w:t>
       </w:r>
     </w:p>
     <w:p>
@@ -599,7 +661,7 @@
         <w:pStyle w:val="BodyText"/>
       </w:pPr>
       <w:r>
-        <w:t xml:space="preserve">The second layer is home ecology. Following ecological views of language education (van Lier, 2004; Guerrettaz et al., 2021), the unit of analysis is the household rather than</w:t>
+        <w:t xml:space="preserve">The second layer is home ecology (van Lier, 2004; Guerrettaz et al., 2021). The unit of analysis is the household rather than</w:t>
       </w:r>
       <w:r>
         <w:t xml:space="preserve"> </w:t>
@@ -622,7 +684,7 @@
         <w:pStyle w:val="BodyText"/>
       </w:pPr>
       <w:r>
-        <w:t xml:space="preserve">The third layer is investment (Norton, 2013; Darvin &amp; Norton, 2015, 2023). The questionnaire did not include items on identity or imagined return. Investment is therefore a reading of participation: self-reported teacher interaction, self-appraised learning, and whether online Chinese was judged a substitute for campus study. Withdrawal is inferred when students report remaining silent, or conclude that online Chinese cannot replace the campus.</w:t>
+        <w:t xml:space="preserve">The outcomes recorded on the form are stress, teacher interaction, perceived learning (a three-item appraisal: learned much, improves Chinese, sparks interest), and whether online study was judged a substitute for campus classes. Language investment is not a third layer of the model. It is introduced only in the discussion, as one way of reading thin participation. Readers who prefer a digital-inequality account can stop at the two layers and the results.</w:t>
       </w:r>
     </w:p>
     <w:p>
@@ -630,30 +692,7 @@
         <w:pStyle w:val="BodyText"/>
       </w:pPr>
       <w:r>
-        <w:t xml:space="preserve">Outcomes are distinguished as affective (stress), interactional (teacher exchange), and perceived learning (a three-item appraisal: learned much, improves Chinese, sparks interest). The conditions available in the questionnaire are infrastructure (power, signal, speed), home ecology (noise, whether the home</w:t>
-      </w:r>
-      <w:r>
-        <w:t xml:space="preserve"> </w:t>
-      </w:r>
-      <w:r>
-        <w:t xml:space="preserve">“</w:t>
-      </w:r>
-      <w:r>
-        <w:t xml:space="preserve">affects study</w:t>
-      </w:r>
-      <w:r>
-        <w:t xml:space="preserve">”</w:t>
-      </w:r>
-      <w:r>
-        <w:t xml:space="preserve">), platform geography (which applications open), and paid work versus study only.</w:t>
-      </w:r>
-    </w:p>
-    <w:p>
-      <w:pPr>
-        <w:pStyle w:val="BodyText"/>
-      </w:pPr>
-      <w:r>
-        <w:t xml:space="preserve">Figure 1. Material-context model of emergency remote Chinese learning (a reading model, not a tested path). Sequential digital inequality (power, signal, speed), platform geography (campus systems versus Zoom or WhatsApp), and home ecology (space, family, paid work) are treated as concurrent conditions. They are read as shaping participation in Chinese and the self-reported outcomes of stress, interaction, and learning appraisal.</w:t>
+        <w:t xml:space="preserve">Figure 1. Material-context model of emergency remote Chinese learning. Sequential digital inequality (power, signal, speed, and which application opens) and home ecology (space, family, paid work) are concurrent conditions. They are read as shaping participation and the self-reported outcomes of stress, interaction, learning appraisal, and the replacement judgement. The figure is a reading model, not a tested path. Investment is not shown.</w:t>
       </w:r>
     </w:p>
     <w:bookmarkEnd w:id="27"/>
@@ -1008,7 +1047,7 @@
         <w:pStyle w:val="FirstParagraph"/>
       </w:pPr>
       <w:r>
-        <w:t xml:space="preserve">Frequencies are reported as n/38. Multiple-response items are the percentage of respondents who selected the option. The learning-appraisal score is the mean of learned, improve, and interest (higher = worse). For 2×2 associations we used Fisher’s exact test and report odds ratios with 95% confidence intervals and φ. For ordinal pairs we used Spearman’s ρ. Gender differences on ordinals were checked with Mann-Whitney U (all</w:t>
+        <w:t xml:space="preserve">Frequencies are reported as n/38. Multiple-response items are the percentage of respondents who selected the option. The learning-appraisal score is the mean of learned, improve, and interest (higher = worse). With N = 38 the analysis is exploratory and descriptive. We report cell counts first. For 2×2 tables we add Fisher’s exact test, φ, and an odds ratio with a 95% confidence interval only as a compact summary of those counts. The intervals are too wide to support population inference, and they should not be read as precise effect sizes. For ordinal pairs we used Spearman’s ρ, likewise as a rank association in this sample. Gender differences on ordinals were checked with Mann-Whitney U (all</w:t>
       </w:r>
       <w:r>
         <w:t xml:space="preserve"> </w:t>
@@ -1024,7 +1063,7 @@
         <w:t xml:space="preserve"> </w:t>
       </w:r>
       <w:r>
-        <w:t xml:space="preserve">&gt; .10). Sensitivity analyses repeat the two focal tests among Pakistani respondents only (n = 37) and among cases whose IP was not labelled mainland China (n = 29). The tests are exploratory. With n = 38 and several associations,</w:t>
+        <w:t xml:space="preserve">&gt; .10). Sensitivity analyses repeat the two focal patterns among Pakistani respondents only (n = 37) and among cases whose IP was not labelled mainland China (n = 29).</w:t>
       </w:r>
       <w:r>
         <w:t xml:space="preserve"> </w:t>
@@ -2090,7 +2129,7 @@
         <w:pStyle w:val="BodyText"/>
       </w:pPr>
       <w:r>
-        <w:t xml:space="preserve">The strongest association in the sample is between the home and stress. Among those who said the home affected study very much, 11 of 14 also reported very high psychological stress; among the others, 3 of 24 did (OR = 25.67, 95% CI [4.42, 149.00],</w:t>
+        <w:t xml:space="preserve">The clearest pattern in the sample is between the home and stress, and it is best read as a count, not as a population odds ratio. Among those who said the home affected study very much, 11 of 14 also reported very high psychological stress; among the others, 3 of 24 did (Fisher</w:t>
       </w:r>
       <w:r>
         <w:t xml:space="preserve"> </w:t>
@@ -2119,7 +2158,7 @@
         <w:t xml:space="preserve"> </w:t>
       </w:r>
       <w:r>
-        <w:t xml:space="preserve">&lt; .001). The odds-ratio interval is wide, as expected at this sample size; the direction is consistent. The figure that discriminates is the 36.8% who reported very high stress.</w:t>
+        <w:t xml:space="preserve">&lt; .001). Table 4 prints the corresponding odds ratio only as a compact summary of the same 2×2 table; its interval ([4.42, 149.00]) is too wide for inference beyond this sample. The figure that discriminates is the 36.8% who reported very high stress.</w:t>
       </w:r>
     </w:p>
     <w:bookmarkEnd w:id="35"/>
@@ -2906,7 +2945,7 @@
               <w:jc w:val="left"/>
             </w:pPr>
             <w:r>
-              <w:t xml:space="preserve">Hypothesis</w:t>
+              <w:t xml:space="preserve">Association</w:t>
             </w:r>
           </w:p>
         </w:tc>
@@ -2918,7 +2957,7 @@
               <w:jc w:val="left"/>
             </w:pPr>
             <w:r>
-              <w:t xml:space="preserve">Statistic</w:t>
+              <w:t xml:space="preserve">Cell counts / statistic</w:t>
             </w:r>
           </w:p>
         </w:tc>
@@ -2944,7 +2983,7 @@
               <w:jc w:val="left"/>
             </w:pPr>
             <w:r>
-              <w:t xml:space="preserve">OR = 25.67, 95% CI [4.42, 149.00],</w:t>
+              <w:t xml:space="preserve">11/14 vs 3/24; Fisher</w:t>
             </w:r>
             <w:r>
               <w:t xml:space="preserve"> </w:t>
@@ -2960,7 +2999,7 @@
               <w:t xml:space="preserve"> </w:t>
             </w:r>
             <w:r>
-              <w:t xml:space="preserve">&lt; .001, φ = .66</w:t>
+              <w:t xml:space="preserve">&lt; .001, φ = .66; OR = 25.67, 95% CI [4.42, 149.00]</w:t>
             </w:r>
           </w:p>
         </w:tc>
@@ -2986,7 +3025,7 @@
               <w:jc w:val="left"/>
             </w:pPr>
             <w:r>
-              <w:t xml:space="preserve">OR = 7.65, 95% CI [1.37, 42.71],</w:t>
+              <w:t xml:space="preserve">9/11 vs 10/27; Fisher</w:t>
             </w:r>
             <w:r>
               <w:t xml:space="preserve"> </w:t>
@@ -3002,7 +3041,7 @@
               <w:t xml:space="preserve"> </w:t>
             </w:r>
             <w:r>
-              <w:t xml:space="preserve">= .029, φ = .41</w:t>
+              <w:t xml:space="preserve">= .029, φ = .41; OR = 7.65, 95% CI [1.37, 42.71]</w:t>
             </w:r>
           </w:p>
         </w:tc>
@@ -3028,7 +3067,7 @@
               <w:jc w:val="left"/>
             </w:pPr>
             <w:r>
-              <w:t xml:space="preserve">OR = 7.65, 95% CI [1.37, 42.71],</w:t>
+              <w:t xml:space="preserve">9/11 vs 10/27; Fisher</w:t>
             </w:r>
             <w:r>
               <w:t xml:space="preserve"> </w:t>
@@ -3044,7 +3083,7 @@
               <w:t xml:space="preserve"> </w:t>
             </w:r>
             <w:r>
-              <w:t xml:space="preserve">= .029, φ = .41</w:t>
+              <w:t xml:space="preserve">= .029, φ = .41; OR = 7.65, 95% CI [1.37, 42.71]</w:t>
             </w:r>
           </w:p>
         </w:tc>
@@ -3070,7 +3109,7 @@
               <w:jc w:val="left"/>
             </w:pPr>
             <w:r>
-              <w:t xml:space="preserve">OR = 6.18, 95% CI [1.10, 34.70],</w:t>
+              <w:t xml:space="preserve">8/10 vs 11/28; Fisher</w:t>
             </w:r>
             <w:r>
               <w:t xml:space="preserve"> </w:t>
@@ -3086,7 +3125,7 @@
               <w:t xml:space="preserve"> </w:t>
             </w:r>
             <w:r>
-              <w:t xml:space="preserve">= .062, φ = .36</w:t>
+              <w:t xml:space="preserve">= .062, φ = .36; OR = 6.18, 95% CI [1.10, 34.70]</w:t>
             </w:r>
           </w:p>
         </w:tc>
@@ -3233,7 +3272,7 @@
         <w:t xml:space="preserve"> </w:t>
       </w:r>
       <w:r>
-        <w:t xml:space="preserve">Higher speed and learning-appraisal scores are more negative. Odds-ratio intervals are wide and should be read as direction, not as precise population values. The female × cannot-replace row and the learned-little × cannot-replace row have the same OR by coincidence (both 2×2 tables are 17/10 versus 2/9); they are not the same test.</w:t>
+        <w:t xml:space="preserve">Higher speed and learning-appraisal scores are more negative. Odds ratios summarise the 2×2 counts in this sample; the intervals are too wide for population inference. The female × cannot-replace row and the learned-little × cannot-replace row have the same OR by coincidence (both tables are 17/10 versus 2/9); they are not the same test.</w:t>
       </w:r>
     </w:p>
     <w:bookmarkEnd w:id="37"/>
@@ -3251,7 +3290,7 @@
         <w:pStyle w:val="FirstParagraph"/>
       </w:pPr>
       <w:r>
-        <w:t xml:space="preserve">Nineteen of 38 said online study could replace campus classes and 19 said it could not. Among women, 9 of 11 said it cannot (82%); among men, 10 of 27 said so (37%) (OR = 7.65, 95% CI [1.37, 42.71],</w:t>
+        <w:t xml:space="preserve">Nineteen of 38 said online study could replace campus classes and 19 said it could not. Among women, 9 of 11 said it cannot; among men, 10 of 27 said so (Fisher</w:t>
       </w:r>
       <w:r>
         <w:t xml:space="preserve"> </w:t>
@@ -3280,7 +3319,7 @@
         <w:t xml:space="preserve"> </w:t>
       </w:r>
       <w:r>
-        <w:t xml:space="preserve">= .062).</w:t>
+        <w:t xml:space="preserve">= .062). Table 4 again prints odds ratios only as a compact summary of those counts.</w:t>
       </w:r>
     </w:p>
     <w:p>
@@ -3759,7 +3798,7 @@
         <w:pStyle w:val="FirstParagraph"/>
       </w:pPr>
       <w:r>
-        <w:t xml:space="preserve">Chinese-university language programmes imagine a campus: a dormitory, a classroom, extra-curricular Chinese, and an HSK calendar. Emergency remote teaching kept the assessment plan and removed the campus for those who were offshore. Very high stress at 36.8% is not only pandemic psychology. It is also language-learning psychology once speaking and listening, the skills that most need a live other, meet an unstable connection and a lively room (cf. MacIntyre et al., 2020). The home-stress association is the empirical core of that claim.</w:t>
+        <w:t xml:space="preserve">This article is about curriculum implementation under emergency remote teaching. Chinese-university language programmes imagine a campus: a dormitory, a classroom, extra-curricular Chinese, and an HSK calendar. The emergency kept the assessment plan and removed the campus for those who were offshore. Very high stress at 36.8% is not only pandemic psychology. It is also language-learning psychology once speaking and listening meet an unstable connection and a lively room (cf. MacIntyre et al., 2020). In this sample, 11 of 14 students who said the home affected study very much also reported very high stress, against 3 of 24 others. That count, not the odds ratio, is the pattern we take forward.</w:t>
       </w:r>
     </w:p>
     <w:p>
@@ -3767,7 +3806,7 @@
         <w:pStyle w:val="BodyText"/>
       </w:pPr>
       <w:r>
-        <w:t xml:space="preserve">The finding remains relevant after the emergency because hybrid ICLE and HSK delivery on Chinese-campus systems are still often designed as if the login, the hour, and the room were campus-like. Moorhouse et al. (2023) describe technological normalisation after the return to class. Stockwell and Wang (2023) warn that treating videoconferencing as a copy of campus teaching is a limited lesson from the crisis. This corridor did not reach that normalisation. Before a learner can invest in a later digital practice such as generative AI (Darvin, 2025), the class has to open, the current has to hold, and the house has to allow a voice.</w:t>
+        <w:t xml:space="preserve">The finding is still useful after the emergency because hybrid ICLE and HSK delivery on Chinese-campus systems are often designed as if the login, the hour, and the room were campus-like. Moorhouse et al. (2023) describe technological normalisation after the return to class. Stockwell and Wang (2023) warn that treating videoconferencing as a copy of campus teaching is a limited lesson from the crisis. This corridor did not reach that normalisation. Before later digital practices such as generative AI become relevant (Darvin, 2025), the class has to open, the current has to hold, and the house has to allow a voice.</w:t>
       </w:r>
     </w:p>
     <w:bookmarkEnd w:id="41"/>
@@ -3807,13 +3846,13 @@
       </w:r>
     </w:p>
     <w:bookmarkEnd w:id="42"/>
-    <w:bookmarkStart w:id="43" w:name="investment-as-a-reading-of-participation"/>
+    <w:bookmarkStart w:id="43" w:name="X975158339fb38d01e9ae1d4efc8dce89d233922"/>
     <w:p>
       <w:pPr>
         <w:pStyle w:val="Heading3"/>
       </w:pPr>
       <w:r>
-        <w:t xml:space="preserve">6.3 Investment as a reading of participation</w:t>
+        <w:t xml:space="preserve">6.3 A discussion lens: why some learners refused the substitute</w:t>
       </w:r>
     </w:p>
     <w:p>
@@ -3821,7 +3860,7 @@
         <w:pStyle w:val="FirstParagraph"/>
       </w:pPr>
       <w:r>
-        <w:t xml:space="preserve">Norton’s model is often used to describe learners who insist on speaking. It also describes withdrawal that is rational under cost. Darvin and Norton (2023) distinguish this from motivation: a student may still want Chinese and yet not be invested in the practices of a given class. If the imagined return of Chinese remains high, but the daily cost (data, a lively house, a job, a class that will not load) remains higher, the emergency class can be unworkable even when motivation is not. Only 15.8% said they interacted with the teacher</w:t>
+        <w:t xml:space="preserve">The two-layer model already explains most of the results: power and speed shaped appraisal; campus logins often failed; the home was associated with very high stress. A further question is how to read thin teacher interaction (only 15.8%</w:t>
       </w:r>
       <w:r>
         <w:t xml:space="preserve"> </w:t>
@@ -3836,7 +3875,7 @@
         <w:t xml:space="preserve">”</w:t>
       </w:r>
       <w:r>
-        <w:t xml:space="preserve">; 28.9% learned little or nothing. The even split on replacement is a disagreement over whether emergency remote teaching counts as Chinese class. Women in this sample more often settled that disagreement in the negative. These are proxies for participation and legitimacy, not a full measure of investment.</w:t>
+        <w:t xml:space="preserve">) and the even split over whether online study counted as class. One available reading is language investment (Norton, 2013; Darvin &amp; Norton, 2023). A student may still want Chinese and yet not be invested in the practices of a given class if the daily cost (data, a lively house, a job, a class that will not load) is higher than the return. Women in this sample more often refused to count emergency remote teaching as campus. That is a judgement about legitimacy, not a score on an investment scale.</w:t>
       </w:r>
     </w:p>
     <w:p>
@@ -3844,17 +3883,17 @@
         <w:pStyle w:val="BodyText"/>
       </w:pPr>
       <w:r>
-        <w:t xml:space="preserve">Darvin and Norton (2015) argued that digital spaces reconfigure capital. Campus Chinese offers embodied speaking practice. Home emergency teaching, on these items, offered thinner teacher interaction and mixed learning appraisal. That is a plausible loss of oral practice, not a measured loss of oral capital. It is the kind of (dis)investment among international students of languages other than English that Hajar and Karakuş (2024) place on the current agenda.</w:t>
+        <w:t xml:space="preserve">We do not need that reading in order to report the associations. We use it because Hajar and Karakuş (2024) have asked this journal for evidence on international students of languages other than English, and because withdrawal under cost is a recognised part of the investment literature. Campus Chinese offers embodied speaking practice. Home emergency teaching, on these items, offered thinner interaction and mixed appraisal. That is a plausible loss of oral practice, not a measured loss of oral capital (Darvin &amp; Norton, 2015). Readers who find the metaphor too loose can treat Section 6.3 as optional.</w:t>
       </w:r>
     </w:p>
     <w:bookmarkEnd w:id="43"/>
-    <w:bookmarkStart w:id="44" w:name="X39950e1efabcdc47d874a9648c402485941641e"/>
+    <w:bookmarkStart w:id="44" w:name="X3f41d7067da38714b0f13e8cb605b5ccc918580"/>
     <w:p>
       <w:pPr>
         <w:pStyle w:val="Heading3"/>
       </w:pPr>
       <w:r>
-        <w:t xml:space="preserve">6.4 Localising delivery, not only cultural content</w:t>
+        <w:t xml:space="preserve">6.4 What the localisation claim does and does not say</w:t>
       </w:r>
     </w:p>
     <w:p>
@@ -3862,7 +3901,7 @@
         <w:pStyle w:val="FirstParagraph"/>
       </w:pPr>
       <w:r>
-        <w:t xml:space="preserve">ICLE debates on localisation often ask whether a textbook should replace Beijing place names with local names, or whether festival content needs Islamic-context mediation. Those questions belong in work on materials in Pakistani universities. The present data push localisation into course delivery. A culturally adapted lesson still fails if it is a synchronous oral lesson delivered into load-shedding. Material-context fit means whether this component of the course can be used by these learners in this programme ecology. In the emergency, the programme ecology was a Chinese-university timetable, the users sat in Pakistani houses, and the material was a live class that assumed campus conditions. Hybrid ICLE that still copies that timetable onto Tencent Meeting or Chaoxing, without asking whether the application opens and whether the house can hold a 45-minute oral hour, repeats the misfit after the pandemic.</w:t>
+        <w:t xml:space="preserve">ICLE debates on localisation often ask whether a textbook should replace Beijing place names with local names, or whether festival content needs Islamic-context mediation. Those questions belong in work on materials in Pakistani universities. They are not this paper. The present claim is narrower and sits inside curriculum implementation: a culturally adapted lesson still fails if it is a synchronous oral hour delivered into load-shedding or onto an application that does not open. In the emergency, the programme ecology was a Chinese-university timetable, the users sat mainly in Pakistani houses, and the material was a live class that assumed campus conditions.</w:t>
       </w:r>
     </w:p>
     <w:p>
@@ -3870,7 +3909,7 @@
         <w:pStyle w:val="BodyText"/>
       </w:pPr>
       <w:r>
-        <w:t xml:space="preserve">What follows for course design is modest and local to this sample. Disruption-ready Chinese is a curriculum problem, not only a platform subscription. Asynchronous oral alternatives (short voice tasks with delayed feedback; voice notes that survive low bandwidth) belong in the language-course handbook rather than being invented in a crisis. If speaking was structurally difficult to practise, progression decisions should not rest on oral-equivalent standards without adjustment. Prepaid data for offshore students is a language-learning resource in the same sense that textbooks are. If live classes follow Beijing time, attendance measures electricity and the clock as well as diligence. And if Chaoxing and QQ do not open, the usable classroom is the tool that does. WhatsApp was marked available here; it was not recorded as used for class.</w:t>
+        <w:t xml:space="preserve">What follows for course design is modest and local to this sample. It is not a programme for Chinese language localisation in Pakistan, and it is not a theory of digital inequality in general. It is a set of delivery checks implied by this cohort: asynchronous oral alternatives that survive low bandwidth; progression decisions that do not assume a campus oral hour; prepaid data treated as a language-learning resource; timetables that name Beijing time when students sit in Pakistan; and a usable classroom defined by the application that opens. WhatsApp was marked available here; it was not recorded as used for class. Hybrid ICLE that still copies the campus hour onto Tencent Meeting or Chaoxing, without those checks, repeats the misfit after the pandemic.</w:t>
       </w:r>
     </w:p>
     <w:p>
@@ -3921,7 +3960,7 @@
         <w:pStyle w:val="FirstParagraph"/>
       </w:pPr>
       <w:r>
-        <w:t xml:space="preserve">The sample is small (N = 38), and odds-ratio intervals are wide; they are reported as direction plus exact tests, not as precise population values. It is a male-majority convenience sample of phone users, with nine responses labelled mainland China, so the findings describe this network rather than Pakistani women as a group or a census of students in Pakistan that week. Sensitivity analyses on n = 37 and n = 29 do not remove that limit. All outcomes are self-report; there are no HSK scores or oral tasks, and</w:t>
+        <w:t xml:space="preserve">The sample is small (N = 38). Associations are reported as counts and exact tests in this network; they do not support population odds ratios. It is a male-majority convenience sample of phone users, with nine responses labelled mainland China, so the findings describe this cohort rather than Pakistani women as a group or a census of students in Pakistan that week. Sensitivity analyses on n = 37 and n = 29 do not remove that limit. All outcomes are self-report; there are no HSK scores or oral tasks, and</w:t>
       </w:r>
       <w:r>
         <w:t xml:space="preserve"> </w:t>
@@ -3939,7 +3978,7 @@
         <w:t xml:space="preserve"> </w:t>
       </w:r>
       <w:r>
-        <w:t xml:space="preserve">is a self-rating. Chinese-medium items with non-native wording may have been understood unevenly. The questionnaire does not name the host university, textbook, or award type, and investment was not measured as a scale. The 2022 collection was not assigned an institutional ethics number. The transferable claim concerns inequality, home, platform access, and participation, not the pandemic as such.</w:t>
+        <w:t xml:space="preserve">is a self-rating. Chinese-medium items with non-native wording may have been understood unevenly. The questionnaire does not name the host university, textbook, or award type. Investment was not measured and is not required to read the results. The 2022 collection was not assigned an institutional ethics number. The transferable claim concerns how a campus curriculum was implemented under inequality, not the pandemic as such, and not textbook localisation.</w:t>
       </w:r>
     </w:p>
     <w:bookmarkEnd w:id="46"/>
@@ -3957,7 +3996,7 @@
         <w:pStyle w:val="FirstParagraph"/>
       </w:pPr>
       <w:r>
-        <w:t xml:space="preserve">Pakistani students who learned Chinese through this emergency did not mainly fail to adapt to online learning. Many homes were asked to carry a Chinese-university class. Many had no quiet room, no stable power, and no login that matched the campus system. Digital inequality entered as electricity, speed, and platform access. Participation looked like thin interaction, mixed learning appraisal, and an even split over whether this counted as class. Women in the sample more often refused that count. Localising Chinese teaching for this corridor means fitting delivery to the house and to the application that actually opens. That is a problem of language, culture, and curriculum. The field has moved on to blended normalisation and generative AI. The inequality in these data has not.</w:t>
+        <w:t xml:space="preserve">This article has examined one object: the implementation of a Chinese-university language curriculum when the class moved into the household. Pakistani students who learned Chinese through this emergency did not mainly fail to adapt to online learning. Many homes were asked to carry a campus oral hour. Many had no quiet room, no stable power, and no login that matched the campus system. Digital inequality entered as electricity, speed, and platform access. Participation looked like thin interaction, mixed learning appraisal, and an even split over whether this counted as class. Women in the sample more often refused that count. If localisation is to mean more than textbook adaptation, it has, on this corridor, to include delivery: the house, and the application that actually opens. The field has moved on to blended normalisation and generative AI. The inequality in these data has not.</w:t>
       </w:r>
     </w:p>
     <w:bookmarkEnd w:id="47"/>

</xml_diff>

<commit_message>
Major revision: one argument, delivery-context localisation
Centre ICLE localisation (content vs delivery). Ground the term in
materials and curriculum literature. Keep inequality and home as the
two analytic layers. Soften N=38 claims, gender, and design comments.
Explain the missing ethics number. Treat the questionnaire as exploratory.

Co-authored-by: kristinehina23-rgb <kristinehina23-rgb@users.noreply.github.com>
</commit_message>
<xml_diff>
--- a/papers/q1-masters-covid/word/Rathore-Cao-Xu-When-Chinese-class-moved-home.docx
+++ b/papers/q1-masters-covid/word/Rathore-Cao-Xu-When-Chinese-class-moved-home.docx
@@ -169,7 +169,7 @@
         <w:pStyle w:val="FirstParagraph"/>
       </w:pPr>
       <w:r>
-        <w:t xml:space="preserve">When Chinese universities moved instruction online, many Pakistani students continued their language courses from households that had not been designed as classrooms. This article is a study of curriculum implementation: it examines how a Chinese-university language course was delivered, under emergency remote teaching, into homes structured by digital inequality and uneven platform access. A questionnaire completed by 38 students in February 2022 (mainly Pakistani; nine responses labelled mainland China) found unstable networks (76.3%), power cuts (42.1%), and homes that were not quiet (71.1%) to be common; 36.8% reported very high stress. Eleven of the 14 students who said the home affected study</w:t>
+        <w:t xml:space="preserve">This article contributes to international Chinese language education by extending localisation from content adaptation to delivery-context fit. Emergency remote teaching is the empirical context, not the theoretical centre. When Chinese-university language courses moved online, many Pakistani students continued them from households structured by unstable networks, power cuts, and campus applications that often did not open. A questionnaire completed by 38 students in February 2022 (mainly Pakistani; nine responses labelled mainland China) is treated as exploratory. Eleven of 14 students who said the home affected study</w:t>
       </w:r>
       <w:r>
         <w:t xml:space="preserve"> </w:t>
@@ -187,7 +187,7 @@
         <w:t xml:space="preserve"> </w:t>
       </w:r>
       <w:r>
-        <w:t xml:space="preserve">also reported very high stress, compared with 3 of the 24 others. Worse internet speed tracked worse learning appraisal (ρ = .65). Campus applications such as QQ and Chaoxing were often marked unusable; Zoom and WhatsApp were more often marked available. Half the sample said online study could replace campus classes; women more often said it could not. The implication, bounded by this sample, is that localising delivery on this corridor means fitting the live hour to the household and to the application that opens, not only adapting textbook content.</w:t>
+        <w:t xml:space="preserve">also reported very high stress, against 3 of 24 others; worse internet speed tracked worse learning appraisal (ρ = .65). In this sample, localising a travelling Chinese course meant fitting the live hour to the house and to the application that opened, not only adapting textbook content.</w:t>
       </w:r>
     </w:p>
     <w:p>
@@ -205,7 +205,7 @@
         <w:t xml:space="preserve"> </w:t>
       </w:r>
       <w:r>
-        <w:t xml:space="preserve">emergency remote teaching; Chinese as an additional language; digital inequality; curriculum implementation; Pakistan; household</w:t>
+        <w:t xml:space="preserve">localisation; Chinese as an additional language; digital inequality; curriculum implementation; Pakistan; household</w:t>
       </w:r>
     </w:p>
     <w:bookmarkEnd w:id="20"/>
@@ -223,7 +223,20 @@
         <w:pStyle w:val="FirstParagraph"/>
       </w:pPr>
       <w:r>
-        <w:t xml:space="preserve">When Chinese universities moved instruction online in 2020, many Pakistani students were already in Pakistan or soon returned there. They remained enrolled in Chinese-university language courses, yet the classroom they entered was a family home, a hostel, or a room shared with siblings, prepaid mobile data, and load-shedding. Chinese as an additional language did not disappear. What changed was the site at which a campus course had to be lived.</w:t>
+        <w:t xml:space="preserve">Localisation in international Chinese language education (ICLE) has usually meant making a travelling course</w:t>
+      </w:r>
+      <w:r>
+        <w:t xml:space="preserve"> </w:t>
+      </w:r>
+      <w:r>
+        <w:rPr>
+          <w:iCs/>
+          <w:i/>
+        </w:rPr>
+        <w:t xml:space="preserve">learnable in a place</w:t>
+      </w:r>
+      <w:r>
+        <w:t xml:space="preserve">: local names and practices in the textbook, Urdu annotation, festival content mediated for a Muslim-majority classroom, or a school activity such as chess used to build Chinese (Zhao, 2020; Lu et al., 2024). This article contributes to that literature by extending localisation from content adaptation to delivery-context fit. The claim is modest. A Chinese course is localised not only when its materials speak to local life, but when the live hour, the login, and the oral task can actually be used in that life.</w:t>
       </w:r>
     </w:p>
     <w:p>
@@ -231,7 +244,7 @@
         <w:pStyle w:val="BodyText"/>
       </w:pPr>
       <w:r>
-        <w:t xml:space="preserve">A Chinese-university language course is more than a textbook and an HSK calendar. It is a planned sequence of live hours, oral tasks, and campus platforms that assume a dormitory, a timetable, and a login that works. Emergency remote teaching (Hodges et al., 2020) kept those elements and changed the place. Learners met the old course plan in households rather than in a redesigned distance-education programme.</w:t>
+        <w:t xml:space="preserve">Emergency remote teaching (Hodges et al., 2020) is the empirical context in which that second kind of localisation became visible. When Chinese universities moved instruction online in 2020, many Pakistani students were already in Pakistan or soon returned there. They remained enrolled in Chinese-university language courses, yet the classroom they entered was a family home, a hostel, or a room shared with siblings, prepaid mobile data, and load-shedding. A Chinese-university language course is a planned sequence of live hours, oral tasks, and campus platforms that assume a dormitory, a timetable, and a login that works. The emergency kept those elements and changed the place (Gacs et al., 2020). Learners met the old course plan in households rather than in a redesigned distance-education programme.</w:t>
       </w:r>
     </w:p>
     <w:p>
@@ -239,7 +252,7 @@
         <w:pStyle w:val="BodyText"/>
       </w:pPr>
       <w:r>
-        <w:t xml:space="preserve">The article is therefore about one thing, not four. Emergency remote teaching is the occasion. Digital inequality and platform access are the mechanism. Localisation of</w:t>
+        <w:t xml:space="preserve">The article is therefore about one thing. Localisation of</w:t>
       </w:r>
       <w:r>
         <w:t xml:space="preserve"> </w:t>
@@ -255,7 +268,7 @@
         <w:t xml:space="preserve"> </w:t>
       </w:r>
       <w:r>
-        <w:t xml:space="preserve">is the implication. The paper is a study of curriculum implementation: how a campus language course was used off campus.</w:t>
+        <w:t xml:space="preserve">is the contribution to ICLE. Digital inequality and platform access are the mechanism that made delivery fail or hold. Emergency remote teaching is the occasion, not the theoretical centre. The paper is not a general study of COVID-19 pedagogy, not a theory of digital inclusion, and not a textbook-adaptation study.</w:t>
       </w:r>
     </w:p>
     <w:p>
@@ -270,7 +283,10 @@
         <w:t xml:space="preserve">Curriculum</w:t>
       </w:r>
       <w:r>
-        <w:t xml:space="preserve">, accordingly, means the campus delivery plan (the live hour, the oral task, the campus login) when that plan is used away from campus.</w:t>
+        <w:t xml:space="preserve"> </w:t>
+      </w:r>
+      <w:r>
+        <w:t xml:space="preserve">here means the campus delivery plan (the live hour, the oral task, the campus login) when that plan is used away from campus (Shan &amp; Xu, 2024).</w:t>
       </w:r>
       <w:r>
         <w:t xml:space="preserve"> </w:t>
@@ -286,7 +302,7 @@
         <w:t xml:space="preserve"> </w:t>
       </w:r>
       <w:r>
-        <w:t xml:space="preserve">is used in a narrower sense than textbook representation of Chinese festivals, values, or national images. Work in this journal already treats international students’ experience of Chinese education as a language-and-culture problem (Gao &amp; Hua, 2021; Gong, Gao, Li, &amp; Lai, 2020). Ecological and materials-in-use research locates that problem in the social setting of the class, not only in the page of the book (van Lier, 2004; Guerrettaz et al., 2021). When the class moves into a Pakistani household, the relevant cultural arrangement is who may speak, who owns the phone, whose paid or care work is interrupted, and what a</w:t>
+        <w:t xml:space="preserve">is used in a narrower sense than textbook representation of Chinese festivals or national images. Work in this journal already treats international students’ experience of Chinese education as a language-and-culture problem (Gao &amp; Hua, 2021; Gong, Gao, Li, &amp; Lai, 2020). Ecological and materials-in-use research locates that problem in the social setting of the class, not only in the page of the book (van Lier, 2004; Guerrettaz et al., 2021). When the class moves into a Pakistani household, the relevant cultural arrangement is who may speak, who owns the phone, whose paid or care work is interrupted, and what a</w:t>
       </w:r>
       <w:r>
         <w:t xml:space="preserve"> </w:t>
@@ -304,7 +320,252 @@
         <w:t xml:space="preserve"> </w:t>
       </w:r>
       <w:r>
-        <w:t xml:space="preserve">is allowed to mean in family space (Norton, 2013; Raza &amp; Hennessy, 2025). That is culture as the social world of additional-language practice. It is not an ethnography of Pakistani values, and it is not an analysis of how China is represented in</w:t>
+        <w:t xml:space="preserve">is allowed to mean in family space (Raza &amp; Hennessy, 2025). That is culture as the social world of additional-language practice. It is not an ethnography of Pakistani values.</w:t>
+      </w:r>
+    </w:p>
+    <w:p>
+      <w:pPr>
+        <w:pStyle w:val="BodyText"/>
+      </w:pPr>
+      <w:r>
+        <w:t xml:space="preserve">Pakistani enrolment in Chinese universities is a case of South–South academic mobility: movement between two countries of the Global South, structured by scholarships and the China–Pakistan Economic Corridor, rather than the more familiar North–South route or the</w:t>
+      </w:r>
+      <w:r>
+        <w:t xml:space="preserve"> </w:t>
+      </w:r>
+      <w:r>
+        <w:t xml:space="preserve">“</w:t>
+      </w:r>
+      <w:r>
+        <w:t xml:space="preserve">international student already on a Chinese campus</w:t>
+      </w:r>
+      <w:r>
+        <w:t xml:space="preserve">”</w:t>
+      </w:r>
+      <w:r>
+        <w:t xml:space="preserve"> </w:t>
+      </w:r>
+      <w:r>
+        <w:t xml:space="preserve">story (Iftikhar et al., 2024; Tu, 2026; Gao &amp; Hua, 2021). Far less is known about what happens to the language course when that mobility is interrupted and the student remains a Chinese-university learner from a household outside the campus network.</w:t>
+      </w:r>
+    </w:p>
+    <w:p>
+      <w:pPr>
+        <w:pStyle w:val="BodyText"/>
+      </w:pPr>
+      <w:r>
+        <w:t xml:space="preserve">This article reports an exploratory questionnaire completed by 38 students between 5 and 8 February 2022. The analysis describes associations in this network. It does not test a confirmatory model. Three questions guide the account:</w:t>
+      </w:r>
+    </w:p>
+    <w:p>
+      <w:pPr>
+        <w:numPr>
+          <w:ilvl w:val="0"/>
+          <w:numId w:val="1001"/>
+        </w:numPr>
+        <w:pStyle w:val="Compact"/>
+      </w:pPr>
+      <w:r>
+        <w:t xml:space="preserve">Which material, domestic, and platform conditions characterised emergency remote Chinese classes in this sample?</w:t>
+      </w:r>
+    </w:p>
+    <w:p>
+      <w:pPr>
+        <w:numPr>
+          <w:ilvl w:val="0"/>
+          <w:numId w:val="1001"/>
+        </w:numPr>
+        <w:pStyle w:val="Compact"/>
+      </w:pPr>
+      <w:r>
+        <w:t xml:space="preserve">How were those conditions related to stress, teacher interaction, and perceived learning?</w:t>
+      </w:r>
+    </w:p>
+    <w:p>
+      <w:pPr>
+        <w:numPr>
+          <w:ilvl w:val="0"/>
+          <w:numId w:val="1001"/>
+        </w:numPr>
+        <w:pStyle w:val="Compact"/>
+      </w:pPr>
+      <w:r>
+        <w:t xml:space="preserve">Did learners treat online Chinese as a legitimate substitute for campus study, and did that judgement differ by gender or by how much they thought they had learned?</w:t>
+      </w:r>
+    </w:p>
+    <w:p>
+      <w:pPr>
+        <w:pStyle w:val="FirstParagraph"/>
+      </w:pPr>
+      <w:r>
+        <w:t xml:space="preserve">The contribution is to ICLE localisation. The study describes household infrastructure, platform access, and participation among Pakistani (and one neighbouring) students of Chinese-university language courses. Sequential digital inequality (van Dijk, 2020) and home ecology are used to read those conditions. Language investment is not part of the framework; a short optional reading appears in the discussion. Design comments later in the paper are considerations suggested by this sample, not established solutions.</w:t>
+      </w:r>
+    </w:p>
+    <w:bookmarkEnd w:id="21"/>
+    <w:bookmarkStart w:id="26" w:name="literature-review"/>
+    <w:p>
+      <w:pPr>
+        <w:pStyle w:val="Heading2"/>
+      </w:pPr>
+      <w:r>
+        <w:t xml:space="preserve">2. Literature review</w:t>
+      </w:r>
+    </w:p>
+    <w:bookmarkStart w:id="22" w:name="X68dd8ebeb22cc7a16b333349dc5f722ace7abd5"/>
+    <w:p>
+      <w:pPr>
+        <w:pStyle w:val="Heading3"/>
+      </w:pPr>
+      <w:r>
+        <w:t xml:space="preserve">2.1 Emergency remote teaching and the copy of the campus hour</w:t>
+      </w:r>
+    </w:p>
+    <w:p>
+      <w:pPr>
+        <w:pStyle w:val="FirstParagraph"/>
+      </w:pPr>
+      <w:r>
+        <w:t xml:space="preserve">Hodges et al. (2020) distinguished emergency remote teaching from planned online or blended courses. The former is a temporary shift under crisis and does not follow a full instructional design cycle. Gacs, Goertler and Spasova (2020) applied that distinction to languages and warned against judging crisis teaching by the standards of mature online programmes. Reviews of teacher responses (Moorhouse &amp; Kohnke, 2021) and of learner affect (MacIntyre et al., 2020) report thinner interaction, anxious assessment, and the entry of the domestic setting into the lesson.</w:t>
+      </w:r>
+    </w:p>
+    <w:p>
+      <w:pPr>
+        <w:pStyle w:val="BodyText"/>
+      </w:pPr>
+      <w:r>
+        <w:t xml:space="preserve">Later work relocated rather than cancelled the distinction. Moorhouse, Wong and Li (2023) describe technological normalisation: tools becoming ordinary in everyday teaching. Moorhouse (2023) found that, in a well-resourced setting, many teachers kept digital tools after they returned to the physical classroom. Stockwell and Wang (2023) note a narrower pattern. Much emergency teaching used videoconferencing to copy face-to-face teaching, and that copy still shapes how teachers, learners, and administrators judge</w:t>
+      </w:r>
+      <w:r>
+        <w:t xml:space="preserve"> </w:t>
+      </w:r>
+      <w:r>
+        <w:t xml:space="preserve">“</w:t>
+      </w:r>
+      <w:r>
+        <w:t xml:space="preserve">technology.</w:t>
+      </w:r>
+      <w:r>
+        <w:t xml:space="preserve">”</w:t>
+      </w:r>
+      <w:r>
+        <w:t xml:space="preserve"> </w:t>
+      </w:r>
+      <w:r>
+        <w:t xml:space="preserve">For Chinese, the same years produced papers on</w:t>
+      </w:r>
+      <w:r>
+        <w:t xml:space="preserve"> </w:t>
+      </w:r>
+      <w:r>
+        <w:t xml:space="preserve">“</w:t>
+      </w:r>
+      <w:r>
+        <w:t xml:space="preserve">suspending classes without stopping learning,</w:t>
+      </w:r>
+      <w:r>
+        <w:t xml:space="preserve">”</w:t>
+      </w:r>
+      <w:r>
+        <w:t xml:space="preserve"> </w:t>
+      </w:r>
+      <w:r>
+        <w:t xml:space="preserve">platform trials, and blended models (Zhang et al., 2020; Xia et al., 2022). A later review of online ICLE still lists technical issues, weak interaction, and time-zone problems among the limits of blended teaching (Li &amp; Li, 2024). Much of that work assumes a Chinese campus system at one end of the link and a fairly stable connection at the other. That assumption does not travel automatically to Pakistan.</w:t>
+      </w:r>
+    </w:p>
+    <w:bookmarkEnd w:id="22"/>
+    <w:bookmarkStart w:id="23" w:name="digital-inequality-beyond-the-device"/>
+    <w:p>
+      <w:pPr>
+        <w:pStyle w:val="Heading3"/>
+      </w:pPr>
+      <w:r>
+        <w:t xml:space="preserve">2.2 Digital inequality beyond the device</w:t>
+      </w:r>
+    </w:p>
+    <w:p>
+      <w:pPr>
+        <w:pStyle w:val="FirstParagraph"/>
+      </w:pPr>
+      <w:r>
+        <w:t xml:space="preserve">Early digital-divide research asked who had a computer. Later models describe a sequence (van Dijk, 2020; Helsper, 2021): motivational access, material access, skills access, usage access, and outcomes. A student may own a smartphone and still lack a quiet hour, a prepaid balance, a keyboard suited to character input, or the skill to move between a live class and a PDF textbook. Warschauer (2003) argued that language learning on screens is stratified by these layers. Emergency remote teaching compressed them into one domestic scene.</w:t>
+      </w:r>
+    </w:p>
+    <w:p>
+      <w:pPr>
+        <w:pStyle w:val="BodyText"/>
+      </w:pPr>
+      <w:r>
+        <w:t xml:space="preserve">Owning a device is not the same as taking part. Rural-urban and household inequalities continue to shape who can sit in a live class (Ali, 2020). In Pakistan the household is also structured by gender. Raza and Hennessy (2025) show that girls’ home use of educational technology is shaped by device sharing, parental digital literacy, care work, and norms about who may be online, together with electricity and prepaid data. Students enrolled in China but studying from Pakistan occupied a third position. They were counted as Chinese-university students, assessed by Chinese-university rules, and physically located in Pakistani digital inequality. Which application opened is part of that inequality. Campus Chinese tools (QQ groups, Chaoxing, DingTalk) and consumer tools that work on Pakistani mobile networks (Zoom, WhatsApp) are not interchangeable logins. Copying the campus system into an offshore household can leave the official classroom on an application the student cannot enter.</w:t>
+      </w:r>
+    </w:p>
+    <w:bookmarkEnd w:id="23"/>
+    <w:bookmarkStart w:id="24" w:name="why-call-this-localisation"/>
+    <w:p>
+      <w:pPr>
+        <w:pStyle w:val="Heading3"/>
+      </w:pPr>
+      <w:r>
+        <w:t xml:space="preserve">2.3 Why call this localisation?</w:t>
+      </w:r>
+    </w:p>
+    <w:p>
+      <w:pPr>
+        <w:pStyle w:val="FirstParagraph"/>
+      </w:pPr>
+      <w:r>
+        <w:t xml:space="preserve">Reviewers of ICLE work may reasonably ask why household power and platform access should be called localisation rather than adaptation, accessibility, online pedagogy, or digital inclusion. Those neighbouring terms name parts of the mechanism. Localisation names the ICLE task: fitting a course that travels from a Chinese university to the place where it is used.</w:t>
+      </w:r>
+    </w:p>
+    <w:p>
+      <w:pPr>
+        <w:pStyle w:val="BodyText"/>
+      </w:pPr>
+      <w:r>
+        <w:t xml:space="preserve">In language materials work, localisation has long meant more than translation. McDonough and Shaw (2003) treat</w:t>
+      </w:r>
+      <w:r>
+        <w:t xml:space="preserve"> </w:t>
+      </w:r>
+      <w:r>
+        <w:t xml:space="preserve">“</w:t>
+      </w:r>
+      <w:r>
+        <w:t xml:space="preserve">personalising and localising</w:t>
+      </w:r>
+      <w:r>
+        <w:t xml:space="preserve">”</w:t>
+      </w:r>
+      <w:r>
+        <w:t xml:space="preserve"> </w:t>
+      </w:r>
+      <w:r>
+        <w:t xml:space="preserve">as a principle of adapting materials so that they speak to a particular group of learners. Tomlinson (2011) locates that work in principled materials development. Canagarajah (2005) argued that the local is not a residue of the global but the site at which language policy and practice are reclaimed. Kumaravadivelu (2001) called the same demand particularity: pedagogy has to fit a specific group in a specific context. Guerrettaz et al. (2021) push the argument from the page of the book to materials in use. If the material is a live class, the</w:t>
+      </w:r>
+      <w:r>
+        <w:t xml:space="preserve"> </w:t>
+      </w:r>
+      <w:r>
+        <w:t xml:space="preserve">“</w:t>
+      </w:r>
+      <w:r>
+        <w:t xml:space="preserve">use</w:t>
+      </w:r>
+      <w:r>
+        <w:t xml:space="preserve">”</w:t>
+      </w:r>
+      <w:r>
+        <w:t xml:space="preserve"> </w:t>
+      </w:r>
+      <w:r>
+        <w:t xml:space="preserve">includes whether the class can be entered.</w:t>
+      </w:r>
+    </w:p>
+    <w:p>
+      <w:pPr>
+        <w:pStyle w:val="BodyText"/>
+      </w:pPr>
+      <w:r>
+        <w:t xml:space="preserve">ICLE has applied localisation mainly to content and curriculum construction. Zhao (2020) localises a Chinese curriculum in an Australian primary school by building lessons from students’ everyday practices. Lu et al. (2024) document localisation of</w:t>
       </w:r>
       <w:r>
         <w:t xml:space="preserve"> </w:t>
@@ -317,7 +578,42 @@
         <w:t xml:space="preserve">HSK Standard Course</w:t>
       </w:r>
       <w:r>
-        <w:t xml:space="preserve">.</w:t>
+        <w:t xml:space="preserve"> </w:t>
+      </w:r>
+      <w:r>
+        <w:t xml:space="preserve">in Pakistani universities, including Urdu annotation and cultural comparison. Lam (2024), in this journal, treats glocalisation as the fitting of a travelling literacy to a local university classroom. Those studies localise</w:t>
+      </w:r>
+      <w:r>
+        <w:t xml:space="preserve"> </w:t>
+      </w:r>
+      <w:r>
+        <w:rPr>
+          <w:iCs/>
+          <w:i/>
+        </w:rPr>
+        <w:t xml:space="preserve">what</w:t>
+      </w:r>
+      <w:r>
+        <w:t xml:space="preserve"> </w:t>
+      </w:r>
+      <w:r>
+        <w:t xml:space="preserve">is taught and</w:t>
+      </w:r>
+      <w:r>
+        <w:t xml:space="preserve"> </w:t>
+      </w:r>
+      <w:r>
+        <w:rPr>
+          <w:iCs/>
+          <w:i/>
+        </w:rPr>
+        <w:t xml:space="preserve">how</w:t>
+      </w:r>
+      <w:r>
+        <w:t xml:space="preserve"> </w:t>
+      </w:r>
+      <w:r>
+        <w:t xml:space="preserve">it is framed. They rarely ask whether the delivery infrastructure (power, bandwidth, the campus login) can hold the lesson.</w:t>
       </w:r>
     </w:p>
     <w:p>
@@ -325,7 +621,141 @@
         <w:pStyle w:val="BodyText"/>
       </w:pPr>
       <w:r>
-        <w:t xml:space="preserve">Research on COVID-19 and language education documented teacher coping, task redesign, and learner anxiety, mainly in English-language classrooms or in China-based programmes (MacIntyre et al., 2020; Gacs et al., 2020; Moorhouse &amp; Kohnke, 2021; Xia et al., 2022). International Chinese Language Education (ICLE) has asked how textbooks, tests, and cultural content travel into overseas programmes (Zhao &amp; Huang, 2010; Gong, Gao, &amp; Lyu, 2020), and how international students experience language and culture</w:t>
+        <w:t xml:space="preserve">Four layers can be distinguished, so that the present claim is not stretched across all of them:</w:t>
+      </w:r>
+    </w:p>
+    <w:p>
+      <w:pPr>
+        <w:numPr>
+          <w:ilvl w:val="0"/>
+          <w:numId w:val="1002"/>
+        </w:numPr>
+        <w:pStyle w:val="Compact"/>
+      </w:pPr>
+      <w:r>
+        <w:t xml:space="preserve">Localisation of</w:t>
+      </w:r>
+      <w:r>
+        <w:t xml:space="preserve"> </w:t>
+      </w:r>
+      <w:r>
+        <w:rPr>
+          <w:iCs/>
+          <w:i/>
+        </w:rPr>
+        <w:t xml:space="preserve">content</w:t>
+      </w:r>
+      <w:r>
+        <w:t xml:space="preserve">: names, festivals, examples, and cultural comparison.</w:t>
+      </w:r>
+    </w:p>
+    <w:p>
+      <w:pPr>
+        <w:numPr>
+          <w:ilvl w:val="0"/>
+          <w:numId w:val="1002"/>
+        </w:numPr>
+        <w:pStyle w:val="Compact"/>
+      </w:pPr>
+      <w:r>
+        <w:t xml:space="preserve">Localisation of</w:t>
+      </w:r>
+      <w:r>
+        <w:t xml:space="preserve"> </w:t>
+      </w:r>
+      <w:r>
+        <w:rPr>
+          <w:iCs/>
+          <w:i/>
+        </w:rPr>
+        <w:t xml:space="preserve">materials</w:t>
+      </w:r>
+      <w:r>
+        <w:t xml:space="preserve">: annotation, mediation language, and the redesign of the textbook page.</w:t>
+      </w:r>
+    </w:p>
+    <w:p>
+      <w:pPr>
+        <w:numPr>
+          <w:ilvl w:val="0"/>
+          <w:numId w:val="1002"/>
+        </w:numPr>
+        <w:pStyle w:val="Compact"/>
+      </w:pPr>
+      <w:r>
+        <w:t xml:space="preserve">Localisation of</w:t>
+      </w:r>
+      <w:r>
+        <w:t xml:space="preserve"> </w:t>
+      </w:r>
+      <w:r>
+        <w:rPr>
+          <w:iCs/>
+          <w:i/>
+        </w:rPr>
+        <w:t xml:space="preserve">curriculum</w:t>
+      </w:r>
+      <w:r>
+        <w:t xml:space="preserve">: the pathway, hours, and assessment of a named programme (Shan &amp; Xu, 2024; Zhao, 2020).</w:t>
+      </w:r>
+    </w:p>
+    <w:p>
+      <w:pPr>
+        <w:numPr>
+          <w:ilvl w:val="0"/>
+          <w:numId w:val="1002"/>
+        </w:numPr>
+        <w:pStyle w:val="Compact"/>
+      </w:pPr>
+      <w:r>
+        <w:t xml:space="preserve">Localisation of</w:t>
+      </w:r>
+      <w:r>
+        <w:t xml:space="preserve"> </w:t>
+      </w:r>
+      <w:r>
+        <w:rPr>
+          <w:iCs/>
+          <w:i/>
+        </w:rPr>
+        <w:t xml:space="preserve">delivery</w:t>
+      </w:r>
+      <w:r>
+        <w:t xml:space="preserve">: whether the live hour, the oral task, and the login can be used in this household, on this phone, in this electricity regime.</w:t>
+      </w:r>
+    </w:p>
+    <w:p>
+      <w:pPr>
+        <w:pStyle w:val="FirstParagraph"/>
+      </w:pPr>
+      <w:r>
+        <w:t xml:space="preserve">This article addresses only the fourth layer. Accessibility and digital inclusion describe why that layer fails. They do not replace the ICLE question, which is how a Chinese-university course is made usable when it leaves the campus.</w:t>
+      </w:r>
+    </w:p>
+    <w:bookmarkEnd w:id="24"/>
+    <w:bookmarkStart w:id="25" w:name="Xcd330498a6dd3210785781d416be0b973d8f43a"/>
+    <w:p>
+      <w:pPr>
+        <w:pStyle w:val="Heading3"/>
+      </w:pPr>
+      <w:r>
+        <w:t xml:space="preserve">2.4 The Pakistan corridor and the travelling campus course</w:t>
+      </w:r>
+    </w:p>
+    <w:p>
+      <w:pPr>
+        <w:pStyle w:val="FirstParagraph"/>
+      </w:pPr>
+      <w:r>
+        <w:t xml:space="preserve">China’s promotion of Chinese as an international language has long been tied to institutes, textbooks, and tests (Zhao &amp; Huang, 2010). Pakistani interest in Chinese is bound up with the China–Pakistan Economic Corridor, scholarships, and employment (Iftikhar et al., 2024). Attitude studies rarely capture the course that was supposed to produce the proficiency when the student could not be on campus.</w:t>
+      </w:r>
+    </w:p>
+    <w:p>
+      <w:pPr>
+        <w:pStyle w:val="BodyText"/>
+      </w:pPr>
+      <w:r>
+        <w:t xml:space="preserve">ICLE research after COVID-19 has turned toward blended models, interaction design, and cultural adaptation (Gong, Gao, &amp; Lyu, 2020; Li &amp; Li, 2024). Guenier, Xing and Yan (2026) describe a designed multimodal online course for Irish learners. That is planned online teaching, not emergency remote teaching. Gong, Gao, Li and Lai (2020) document New Zealand students’ cultural adaptation while they were physically in China; Gao and Hua (2021) collected that campus-in-China agenda in this journal. Lu et al. (2024) concern programmes</w:t>
       </w:r>
       <w:r>
         <w:t xml:space="preserve"> </w:t>
@@ -341,25 +771,7 @@
         <w:t xml:space="preserve"> </w:t>
       </w:r>
       <w:r>
-        <w:t xml:space="preserve">Chinese universities (Gao &amp; Hua, 2021; Gong, Gao, Li, &amp; Lai, 2020). Far less is known about Pakistani students who belong to Chinese universities but study Chinese from homes outside the Chinese campus network. That interrupted South-South route is the reverse of the usual</w:t>
-      </w:r>
-      <w:r>
-        <w:t xml:space="preserve"> </w:t>
-      </w:r>
-      <w:r>
-        <w:t xml:space="preserve">“</w:t>
-      </w:r>
-      <w:r>
-        <w:t xml:space="preserve">international student in China</w:t>
-      </w:r>
-      <w:r>
-        <w:t xml:space="preserve">”</w:t>
-      </w:r>
-      <w:r>
-        <w:t xml:space="preserve"> </w:t>
-      </w:r>
-      <w:r>
-        <w:t xml:space="preserve">account.</w:t>
+        <w:t xml:space="preserve">Pakistan. The present students were enrolled in Chinese universities. The two groups share a language, a test culture, and often a textbook family. They do not share a campus. Adapting a book for a Pakistani institute is not the same task as keeping a Chinese-university language course alive in a Karachi or Lahore household after a power cut.</w:t>
       </w:r>
     </w:p>
     <w:p>
@@ -367,266 +779,7 @@
         <w:pStyle w:val="BodyText"/>
       </w:pPr>
       <w:r>
-        <w:t xml:space="preserve">The field has since moved on. Digital tools have become ordinary in many face-to-face language classrooms (Moorhouse, 2023; Moorhouse, Wong, &amp; Li, 2023), and later work asks how generative AI reconfigures access (Darvin, 2025). Hybrid ICLE and HSK delivery, however, still often assume a login, a bandwidth, and a quiet room. The first question on this corridor is more basic: who could enter the class at all?</w:t>
-      </w:r>
-    </w:p>
-    <w:p>
-      <w:pPr>
-        <w:pStyle w:val="BodyText"/>
-      </w:pPr>
-      <w:r>
-        <w:t xml:space="preserve">This article reports a questionnaire completed by 38 students between 5 and 8 February 2022. It asks how digital inequality, including which Chinese-campus platforms opened from homes outside the campus network, related to participation in Chinese class under emergency remote teaching. Three questions guide the analysis:</w:t>
-      </w:r>
-    </w:p>
-    <w:p>
-      <w:pPr>
-        <w:numPr>
-          <w:ilvl w:val="0"/>
-          <w:numId w:val="1001"/>
-        </w:numPr>
-        <w:pStyle w:val="Compact"/>
-      </w:pPr>
-      <w:r>
-        <w:t xml:space="preserve">Which material, domestic, and platform conditions characterised emergency remote Chinese classes in this sample?</w:t>
-      </w:r>
-    </w:p>
-    <w:p>
-      <w:pPr>
-        <w:numPr>
-          <w:ilvl w:val="0"/>
-          <w:numId w:val="1001"/>
-        </w:numPr>
-        <w:pStyle w:val="Compact"/>
-      </w:pPr>
-      <w:r>
-        <w:t xml:space="preserve">How were those conditions related to stress, teacher interaction, and perceived learning?</w:t>
-      </w:r>
-    </w:p>
-    <w:p>
-      <w:pPr>
-        <w:numPr>
-          <w:ilvl w:val="0"/>
-          <w:numId w:val="1001"/>
-        </w:numPr>
-        <w:pStyle w:val="Compact"/>
-      </w:pPr>
-      <w:r>
-        <w:t xml:space="preserve">Did learners treat online Chinese as a legitimate substitute for campus study, and did that judgement differ by gender or by how much they thought they had learned?</w:t>
-      </w:r>
-    </w:p>
-    <w:p>
-      <w:pPr>
-        <w:pStyle w:val="FirstParagraph"/>
-      </w:pPr>
-      <w:r>
-        <w:t xml:space="preserve">The contribution is empirical and curricular. The study describes household infrastructure, platform access, and participation among Pakistani (and one neighbouring) students of Chinese-university language courses. It reads those findings through sequential digital inequality (van Dijk, 2020) and home ecology. Language investment (Norton, 2013; Darvin &amp; Norton, 2015, 2023) is used only in the discussion, as a way of interpreting thin interaction and the split over whether online study counted as class. It is not a third measured construct and it is not required to follow the results. The practical claim is bounded: localising</w:t>
-      </w:r>
-      <w:r>
-        <w:t xml:space="preserve"> </w:t>
-      </w:r>
-      <w:r>
-        <w:rPr>
-          <w:iCs/>
-          <w:i/>
-        </w:rPr>
-        <w:t xml:space="preserve">delivery</w:t>
-      </w:r>
-      <w:r>
-        <w:t xml:space="preserve"> </w:t>
-      </w:r>
-      <w:r>
-        <w:t xml:space="preserve">on this corridor has to include the household and the application that opens, not only the cultural content of textbooks.</w:t>
-      </w:r>
-    </w:p>
-    <w:bookmarkEnd w:id="21"/>
-    <w:bookmarkStart w:id="26" w:name="literature-review"/>
-    <w:p>
-      <w:pPr>
-        <w:pStyle w:val="Heading2"/>
-      </w:pPr>
-      <w:r>
-        <w:t xml:space="preserve">2. Literature review</w:t>
-      </w:r>
-    </w:p>
-    <w:bookmarkStart w:id="22" w:name="X68dd8ebeb22cc7a16b333349dc5f722ace7abd5"/>
-    <w:p>
-      <w:pPr>
-        <w:pStyle w:val="Heading3"/>
-      </w:pPr>
-      <w:r>
-        <w:t xml:space="preserve">2.1 Emergency remote teaching and the copy of the campus hour</w:t>
-      </w:r>
-    </w:p>
-    <w:p>
-      <w:pPr>
-        <w:pStyle w:val="FirstParagraph"/>
-      </w:pPr>
-      <w:r>
-        <w:t xml:space="preserve">Hodges et al. (2020) distinguished emergency remote teaching from planned online or blended courses. The former is a temporary shift under crisis and does not follow a full instructional design cycle. Gacs, Goertler and Spasova (2020) applied that distinction to languages and warned against judging crisis teaching by the standards of mature online programmes. Reviews of teacher responses (Moorhouse &amp; Kohnke, 2021) and of learner affect (MacIntyre et al., 2020) report thinner interaction, anxious assessment, and the entry of the domestic setting into the lesson.</w:t>
-      </w:r>
-    </w:p>
-    <w:p>
-      <w:pPr>
-        <w:pStyle w:val="BodyText"/>
-      </w:pPr>
-      <w:r>
-        <w:t xml:space="preserve">Later work relocated rather than cancelled the distinction. Moorhouse, Wong and Li (2023) describe technological normalisation: tools becoming ordinary in everyday teaching. Moorhouse (2023) found that, in a well-resourced setting, many teachers kept digital tools after they returned to the physical classroom. Stockwell and Wang (2023) note a narrower pattern. Much emergency teaching used videoconferencing to copy face-to-face teaching, and that copy still shapes how teachers, learners, and administrators judge</w:t>
-      </w:r>
-      <w:r>
-        <w:t xml:space="preserve"> </w:t>
-      </w:r>
-      <w:r>
-        <w:t xml:space="preserve">“</w:t>
-      </w:r>
-      <w:r>
-        <w:t xml:space="preserve">technology.</w:t>
-      </w:r>
-      <w:r>
-        <w:t xml:space="preserve">”</w:t>
-      </w:r>
-      <w:r>
-        <w:t xml:space="preserve"> </w:t>
-      </w:r>
-      <w:r>
-        <w:t xml:space="preserve">For Chinese, the same years produced papers on</w:t>
-      </w:r>
-      <w:r>
-        <w:t xml:space="preserve"> </w:t>
-      </w:r>
-      <w:r>
-        <w:t xml:space="preserve">“</w:t>
-      </w:r>
-      <w:r>
-        <w:t xml:space="preserve">suspending classes without stopping learning,</w:t>
-      </w:r>
-      <w:r>
-        <w:t xml:space="preserve">”</w:t>
-      </w:r>
-      <w:r>
-        <w:t xml:space="preserve"> </w:t>
-      </w:r>
-      <w:r>
-        <w:t xml:space="preserve">platform trials, and blended models (Zhang et al., 2020; Xia et al., 2022). A later review of online ICLE still lists technical issues, weak interaction, and time-zone problems among the limits of blended teaching (Li &amp; Li, 2024). Much of that work assumes a Chinese campus system at one end of the link and a fairly stable connection at the other. That assumption does not travel automatically to Pakistan.</w:t>
-      </w:r>
-    </w:p>
-    <w:bookmarkEnd w:id="22"/>
-    <w:bookmarkStart w:id="23" w:name="digital-inequality-beyond-the-device"/>
-    <w:p>
-      <w:pPr>
-        <w:pStyle w:val="Heading3"/>
-      </w:pPr>
-      <w:r>
-        <w:t xml:space="preserve">2.2 Digital inequality beyond the device</w:t>
-      </w:r>
-    </w:p>
-    <w:p>
-      <w:pPr>
-        <w:pStyle w:val="FirstParagraph"/>
-      </w:pPr>
-      <w:r>
-        <w:t xml:space="preserve">Early digital-divide research asked who had a computer. Later models describe a sequence (van Dijk, 2020; Helsper, 2021): motivational access, material access, skills access, usage access, and outcomes. A student may own a smartphone and still lack a quiet hour, a prepaid balance, a keyboard suited to character input, or the skill to move between a live class and a PDF textbook. Warschauer (2003) argued that language learning on screens is stratified by these layers. Emergency remote teaching compressed them into one domestic scene.</w:t>
-      </w:r>
-    </w:p>
-    <w:p>
-      <w:pPr>
-        <w:pStyle w:val="BodyText"/>
-      </w:pPr>
-      <w:r>
-        <w:t xml:space="preserve">Owning a device is not the same as taking part. Rural-urban and household inequalities continue to shape who can sit in a live class (Ali, 2020). In Pakistan the household is also structured by gender. Raza and Hennessy (2025) show that girls’ home use of educational technology is shaped by device sharing, parental digital literacy, care work, and norms about who may be online, together with electricity and prepaid data. Students enrolled in China but studying from Pakistan occupied a third position. They were counted as Chinese-university students, assessed by Chinese-university rules, and physically located in Pakistani digital inequality. Which application opened is part of that inequality. Campus Chinese tools (QQ groups, Chaoxing, DingTalk) and consumer tools that work on Pakistani mobile networks (Zoom, WhatsApp) are not interchangeable logins. Copying the campus system into an offshore household can leave the official classroom on an application the student cannot enter.</w:t>
-      </w:r>
-    </w:p>
-    <w:bookmarkEnd w:id="23"/>
-    <w:bookmarkStart w:id="24" w:name="X75f45f70ef24a8c055acda28896abcb2b6eeb84"/>
-    <w:p>
-      <w:pPr>
-        <w:pStyle w:val="Heading3"/>
-      </w:pPr>
-      <w:r>
-        <w:t xml:space="preserve">2.3 Participation, not a measured investment scale</w:t>
-      </w:r>
-    </w:p>
-    <w:p>
-      <w:pPr>
-        <w:pStyle w:val="FirstParagraph"/>
-      </w:pPr>
-      <w:r>
-        <w:t xml:space="preserve">Motivation research can describe who wants to learn Chinese. It is weaker on who can act as a learner on a given afternoon. Norton’s (2013) construct of investment links identity, capital, and ideology, and Darvin and Norton (2023) distinguish it from motivation: a learner may still want Chinese and yet not be invested in the practices of a given class if those practices are unworkable. Hajar and Karakuş (2024) place the (dis)investment of international students in languages other than English on this journal’s agenda. Wen and Liu (2025) show that advanced learners of Chinese live pride, burnout, and anxiety across classroom scenes that, under emergency remote teaching, were filtered through the household.</w:t>
-      </w:r>
-    </w:p>
-    <w:p>
-      <w:pPr>
-        <w:pStyle w:val="BodyText"/>
-      </w:pPr>
-      <w:r>
-        <w:t xml:space="preserve">That literature is used later as a discussion lens, not as the design of the questionnaire. The form did not ask about identity, imagined return, or withdrawal. What it recorded is participation: teacher interaction, learning appraisal, and whether online Chinese was judged a substitute for campus study. COVID-19 was also a linguistic crisis (Piller, Zhang, &amp; Li, 2020). A live Chinese class on an unfamiliar platform is a language-access problem as well as a technical one.</w:t>
-      </w:r>
-    </w:p>
-    <w:bookmarkEnd w:id="24"/>
-    <w:bookmarkStart w:id="25" w:name="icle-on-the-pakistan-corridor"/>
-    <w:p>
-      <w:pPr>
-        <w:pStyle w:val="Heading3"/>
-      </w:pPr>
-      <w:r>
-        <w:t xml:space="preserve">2.4 ICLE on the Pakistan corridor</w:t>
-      </w:r>
-    </w:p>
-    <w:p>
-      <w:pPr>
-        <w:pStyle w:val="FirstParagraph"/>
-      </w:pPr>
-      <w:r>
-        <w:t xml:space="preserve">China’s promotion of Chinese as an international language has long been tied to institutes, textbooks, and tests (Zhao &amp; Huang, 2010). Pakistani interest in Chinese is bound up with the China-Pakistan Economic Corridor, scholarships, and employment, and that demand remains live in Punjab and Sindh (Iftikhar et al., 2024). Attitude studies rarely capture the course that was supposed to produce the proficiency, namely the Chinese-university language class, when the student could not be on campus.</w:t>
-      </w:r>
-    </w:p>
-    <w:p>
-      <w:pPr>
-        <w:pStyle w:val="BodyText"/>
-      </w:pPr>
-      <w:r>
-        <w:t xml:space="preserve">ICLE research after COVID-19 has turned toward blended models, interaction design, and cultural adaptation (Gong, Gao, &amp; Lyu, 2020; Li &amp; Li, 2024). Guenier, Xing and Yan (2026) describe a designed multimodal online course that communicates Chinese culture to Irish learners. That is planned online teaching, not emergency remote teaching. Gong, Gao, Li and Lai (2020) document New Zealand students’ cultural adaptation while they were physically in China; Gao and Hua (2021) collected that campus-in-China agenda in this journal. Work based in Pakistani universities has begun to document localisation of</w:t>
-      </w:r>
-      <w:r>
-        <w:t xml:space="preserve"> </w:t>
-      </w:r>
-      <w:r>
-        <w:rPr>
-          <w:iCs/>
-          <w:i/>
-        </w:rPr>
-        <w:t xml:space="preserve">HSK Standard Course</w:t>
-      </w:r>
-      <w:r>
-        <w:t xml:space="preserve">, including Urdu annotation and programme fit inside Pakistan (Lu et al., 2024). Those studies concern programmes in Pakistan. The present students were enrolled in Chinese universities. The two groups share a language, a test culture, and often a textbook family. They do not share a campus. Adapting a book for a Pakistani institute is not the same task as keeping a Chinese-university language course alive in a Karachi or Lahore household at 21:00 after a power cut.</w:t>
-      </w:r>
-    </w:p>
-    <w:p>
-      <w:pPr>
-        <w:pStyle w:val="BodyText"/>
-      </w:pPr>
-      <w:r>
-        <w:t xml:space="preserve">Guerrettaz et al. (2021) treat materials as what happens in use. Under emergency remote teaching the material was a live class and the use was a phone in a shared room. Curriculum research that stops at the page of the book will miss that scene. Shan and Xu (2024) show that students experience an institutionalised language curriculum as a fixed pathway they may also negotiate. The students in this study were asked to follow a Chinese-university pathway from sites that often could not hold a campus oral hour.</w:t>
-      </w:r>
-    </w:p>
-    <w:p>
-      <w:pPr>
-        <w:pStyle w:val="BodyText"/>
-      </w:pPr>
-      <w:r>
-        <w:t xml:space="preserve">Post-pandemic CALL has moved toward normalisation and AI, often in English classrooms with working campus Wi-Fi (Moorhouse et al., 2023; Darvin, 2025). Digital-inequality research under-represents additional-language classrooms. Pakistan EdTech gender work has so far spoken mainly about school homes (Raza &amp; Hennessy, 2025). ICLE localisation research under-represents the home as a site of</w:t>
-      </w:r>
-      <w:r>
-        <w:t xml:space="preserve"> </w:t>
-      </w:r>
-      <w:r>
-        <w:rPr>
-          <w:iCs/>
-          <w:i/>
-        </w:rPr>
-        <w:t xml:space="preserve">delivery</w:t>
-      </w:r>
-      <w:r>
-        <w:t xml:space="preserve">, and under-represents which Chinese-campus applications open from phones outside China. The present study addresses that gap at the point where a campus curriculum entered the household.</w:t>
+        <w:t xml:space="preserve">A live Chinese class on an unfamiliar platform is also a language-access problem (Piller, Zhang, &amp; Li, 2020). Post-pandemic CALL has moved toward normalisation and AI, often in classrooms with working campus Wi-Fi (Moorhouse et al., 2023; Darvin, 2025). ICLE localisation research still under-represents the home as a site of delivery, and under-represents which Chinese-campus applications open from phones outside China. That is the gap this study can address.</w:t>
       </w:r>
     </w:p>
     <w:bookmarkEnd w:id="25"/>
@@ -645,7 +798,7 @@
         <w:pStyle w:val="FirstParagraph"/>
       </w:pPr>
       <w:r>
-        <w:t xml:space="preserve">The study uses a two-layer material-context model (Figure 1). The model is a reading of the questionnaire, not a tested path and not a structural equation.</w:t>
+        <w:t xml:space="preserve">The conceptual contribution is localisation of delivery: the claim that a travelling Chinese-university course is not localised if its live hour cannot be used in the receiving household. Two analytic layers, both matched to the questionnaire, make that claim testable as description. Language investment is not part of the model.</w:t>
       </w:r>
     </w:p>
     <w:p>
@@ -653,7 +806,7 @@
         <w:pStyle w:val="BodyText"/>
       </w:pPr>
       <w:r>
-        <w:t xml:space="preserve">The first layer is sequential digital inequality, including platform geography (van Dijk, 2020). Electricity, devices, bandwidth, and time are ordered resources. Which application opens is part of that sequence: campus Chinese tools and consumer tools that work on Pakistani mobile networks are not interchangeable logins. Absence at an earlier layer blocks later ones. Without power there is no live class. Without a usable login there is little interaction even if the class is on.</w:t>
+        <w:t xml:space="preserve">The first layer is sequential digital inequality, including platform geography (van Dijk, 2020). Electricity, devices, bandwidth, and time are ordered resources. Which application opens is part of that sequence. Absence at an earlier layer blocks later ones. Without power there is no live class. Without a usable login there is little interaction even if the class is on.</w:t>
       </w:r>
     </w:p>
     <w:p>
@@ -676,7 +829,7 @@
         <w:t xml:space="preserve">”</w:t>
       </w:r>
       <w:r>
-        <w:t xml:space="preserve">: shared rooms, family labour, gendered domestic space, and the China-Pakistan time difference. Emergency remote teaching relocated the Chinese classroom into this ecology without redesigning the lesson or the house.</w:t>
+        <w:t xml:space="preserve">: shared rooms, family labour, gendered domestic space, and the China–Pakistan time difference. Emergency remote teaching relocated the Chinese classroom into this ecology without redesigning the lesson or the house.</w:t>
       </w:r>
     </w:p>
     <w:p>
@@ -684,7 +837,7 @@
         <w:pStyle w:val="BodyText"/>
       </w:pPr>
       <w:r>
-        <w:t xml:space="preserve">The outcomes recorded on the form are stress, teacher interaction, perceived learning (a three-item appraisal: learned much, improves Chinese, sparks interest), and whether online study was judged a substitute for campus classes. Language investment is not a third layer of the model. It is introduced only in the discussion, as one way of reading thin participation. Readers who prefer a digital-inequality account can stop at the two layers and the results.</w:t>
+        <w:t xml:space="preserve">The outcomes recorded on the form are stress, teacher interaction, perceived learning, and whether online study was judged a substitute for campus classes. Figure 1 is a reading model, not a tested path.</w:t>
       </w:r>
     </w:p>
     <w:p>
@@ -692,7 +845,7 @@
         <w:pStyle w:val="BodyText"/>
       </w:pPr>
       <w:r>
-        <w:t xml:space="preserve">Figure 1. Material-context model of emergency remote Chinese learning. Sequential digital inequality (power, signal, speed, and which application opens) and home ecology (space, family, paid work) are concurrent conditions. They are read as shaping participation and the self-reported outcomes of stress, interaction, learning appraisal, and the replacement judgement. The figure is a reading model, not a tested path. Investment is not shown.</w:t>
+        <w:t xml:space="preserve">Figure 1. Localisation of delivery as delivery-context fit. Sequential digital inequality (power, signal, speed, and which application opens) and home ecology (space, family, paid work) are concurrent conditions of a travelling Chinese-university course. They are read as shaping participation and the self-reported outcomes of stress, interaction, learning appraisal, and the replacement judgement. Investment is not shown.</w:t>
       </w:r>
     </w:p>
     <w:bookmarkEnd w:id="27"/>
@@ -727,7 +880,7 @@
         <w:pStyle w:val="BodyText"/>
       </w:pPr>
       <w:r>
-        <w:t xml:space="preserve">The study is a cross-sectional questionnaire of how that course was experienced from wherever the student sat that week. Data come from a Chinese-medium Wenjuan questionnaire on influencing factors in international students’ online Chinese learning during COVID-19 (38 complete cases, 5 to 8 February 2022).</w:t>
+        <w:t xml:space="preserve">The study is an exploratory, cross-sectional questionnaire of how that course was experienced from wherever the student sat that week. It does not test a pre-registered confirmatory model. Data come from a Chinese-medium Wenjuan questionnaire on influencing factors in international students’ online Chinese learning during COVID-19 (38 complete cases, 5 to 8 February 2022).</w:t>
       </w:r>
     </w:p>
     <w:bookmarkEnd w:id="28"/>
@@ -797,7 +950,7 @@
         <w:pStyle w:val="BodyText"/>
       </w:pPr>
       <w:r>
-        <w:t xml:space="preserve">A learning-appraisal composite was formed from three same-direction ordinals (learned much; improves Chinese; sparks interest). Cronbach’s α = .84. Higher scores on the composites used below indicate a worse condition or a thinner outcome:</w:t>
+        <w:t xml:space="preserve">A learning-appraisal composite was formed from three same-direction ordinals that ask, in different wording, whether the student thought online study produced learning: learned much; improves Chinese; sparks interest. The three items were treated as one face-valid cluster of perceived learning, not as a validated psychological scale. Cronbach’s α = .84, which supports using their mean as a convenience summary in this file. Exploratory factor analysis was not used: with N = 38 the sample is too small for a stable factor solution, and the analysis is not confirmatory. Individual items are also reported. Higher scores on the composites used below indicate a worse condition or a thinner outcome:</w:t>
       </w:r>
     </w:p>
     <w:tbl>
@@ -1097,7 +1250,15 @@
         <w:pStyle w:val="FirstParagraph"/>
       </w:pPr>
       <w:r>
-        <w:t xml:space="preserve">Adult students completed an online questionnaire presented as research on online Chinese learning. Submission of the form was treated as consent to use anonymised answers. Names, IP addresses, and exact timestamps beyond the collection dates were removed before analysis and are not published. Gender is reported because it structured one finding.</w:t>
+        <w:t xml:space="preserve">The questionnaire was completed in February 2022 by adult students. The form presented the study as research on online Chinese learning and stated that answers would be used for research. Submission of the completed form was treated as consent. Names, IP addresses, and exact timestamps beyond the collection dates were removed before analysis and are not published. Gender is reported because it structured one finding.</w:t>
+      </w:r>
+    </w:p>
+    <w:p>
+      <w:pPr>
+        <w:pStyle w:val="BodyText"/>
+      </w:pPr>
+      <w:r>
+        <w:t xml:space="preserve">No institutional ethics-committee number was assigned to the 2022 collection. At the time the first author was an M.Phil. student collecting a small online questionnaire; a numbered approval was not obtained. We do not invent one. The present article reports an anonymised secondary analysis of that file. The gap is a limit of the historical collection, not a claim that ethics review is unnecessary. Journals that require a protocol number for all human-subjects work may ask for additional documentation from the authors’ current institutions.</w:t>
       </w:r>
     </w:p>
     <w:bookmarkEnd w:id="32"/>
@@ -3327,7 +3488,7 @@
         <w:pStyle w:val="BodyText"/>
       </w:pPr>
       <w:r>
-        <w:t xml:space="preserve">Mann-Whitney tests on the ordinals by gender were non-significant. The gender difference is not that women scored as having learned less. Women more often refused to treat online Chinese as a campus substitute.</w:t>
+        <w:t xml:space="preserve">Mann-Whitney tests on the ordinals by gender were non-significant. The observed difference is not that women scored as having learned less. In this sample, women more often refused to treat online Chinese as a campus substitute. With 11 women, that pattern may indicate different perceptions of online legitimacy here; it does not establish that women experienced online learning differently, and it requires investigation with larger and more balanced samples.</w:t>
       </w:r>
     </w:p>
     <w:p>
@@ -3351,7 +3512,7 @@
         <w:t xml:space="preserve"> </w:t>
       </w:r>
       <w:r>
-        <w:t xml:space="preserve">= .028). Men in this sample more often combined wage labour with emergency remote teaching; women more often refused to count it as campus. Both patterns are signals in a male-majority sample, not a full gender analysis.</w:t>
+        <w:t xml:space="preserve">= .028). Both counts are signals in a male-majority convenience sample, not a gender analysis of Pakistani households.</w:t>
       </w:r>
     </w:p>
     <w:bookmarkEnd w:id="38"/>
@@ -3784,13 +3945,13 @@
         <w:t xml:space="preserve">6. Discussion</w:t>
       </w:r>
     </w:p>
-    <w:bookmarkStart w:id="41" w:name="a-campus-curriculum-without-the-campus"/>
+    <w:bookmarkStart w:id="41" w:name="X5cbd96f703fc6484380751f917fe651016c4bb6"/>
     <w:p>
       <w:pPr>
         <w:pStyle w:val="Heading3"/>
       </w:pPr>
       <w:r>
-        <w:t xml:space="preserve">6.1 A campus curriculum without the campus</w:t>
+        <w:t xml:space="preserve">6.1 Localising delivery when the campus course leaves campus</w:t>
       </w:r>
     </w:p>
     <w:p>
@@ -3798,7 +3959,7 @@
         <w:pStyle w:val="FirstParagraph"/>
       </w:pPr>
       <w:r>
-        <w:t xml:space="preserve">This article is about curriculum implementation under emergency remote teaching. Chinese-university language programmes imagine a campus: a dormitory, a classroom, extra-curricular Chinese, and an HSK calendar. The emergency kept the assessment plan and removed the campus for those who were offshore. Very high stress at 36.8% is not only pandemic psychology. It is also language-learning psychology once speaking and listening meet an unstable connection and a lively room (cf. MacIntyre et al., 2020). In this sample, 11 of 14 students who said the home affected study very much also reported very high stress, against 3 of 24 others. That count, not the odds ratio, is the pattern we take forward.</w:t>
+        <w:t xml:space="preserve">The primary contribution is to ICLE localisation. Chinese-university language programmes imagine a campus: a dormitory, a classroom, extra-curricular Chinese, and an HSK calendar. Emergency remote teaching kept the assessment plan and removed the campus for those who were offshore. In this sample, 11 of 14 students who said the home affected study very much also reported very high stress, against 3 of 24 others. Very high stress at 36.8% is not only pandemic psychology. It is also what happens when a travelling oral curriculum meets an unstable connection and a lively room (cf. MacIntyre et al., 2020). That count, not a population odds ratio, is the pattern we take forward.</w:t>
       </w:r>
     </w:p>
     <w:p>
@@ -3806,7 +3967,23 @@
         <w:pStyle w:val="BodyText"/>
       </w:pPr>
       <w:r>
-        <w:t xml:space="preserve">The finding is still useful after the emergency because hybrid ICLE and HSK delivery on Chinese-campus systems are often designed as if the login, the hour, and the room were campus-like. Moorhouse et al. (2023) describe technological normalisation after the return to class. Stockwell and Wang (2023) warn that treating videoconferencing as a copy of campus teaching is a limited lesson from the crisis. This corridor did not reach that normalisation. Before later digital practices such as generative AI become relevant (Darvin, 2025), the class has to open, the current has to hold, and the house has to allow a voice.</w:t>
+        <w:t xml:space="preserve">The finding does not show that hybrid ICLE after the pandemic has already failed. It suggests that hybrid models</w:t>
+      </w:r>
+      <w:r>
+        <w:t xml:space="preserve"> </w:t>
+      </w:r>
+      <w:r>
+        <w:rPr>
+          <w:iCs/>
+          <w:i/>
+        </w:rPr>
+        <w:t xml:space="preserve">may</w:t>
+      </w:r>
+      <w:r>
+        <w:t xml:space="preserve"> </w:t>
+      </w:r>
+      <w:r>
+        <w:t xml:space="preserve">reproduce a similar misalignment when they keep campus assumptions about login, hour, and room without asking whether those conditions hold (Moorhouse et al., 2023; Stockwell &amp; Wang, 2023). Before later digital practices such as generative AI become relevant for this corridor (Darvin, 2025), the class has to open, the current has to hold, and the house has to allow a voice.</w:t>
       </w:r>
     </w:p>
     <w:bookmarkEnd w:id="41"/>
@@ -3846,13 +4023,13 @@
       </w:r>
     </w:p>
     <w:bookmarkEnd w:id="42"/>
-    <w:bookmarkStart w:id="43" w:name="X975158339fb38d01e9ae1d4efc8dce89d233922"/>
+    <w:bookmarkStart w:id="43" w:name="Xfb4e9e4a4a0df2e0979990e8bb4ab49ea6f2118"/>
     <w:p>
       <w:pPr>
         <w:pStyle w:val="Heading3"/>
       </w:pPr>
       <w:r>
-        <w:t xml:space="preserve">6.3 A discussion lens: why some learners refused the substitute</w:t>
+        <w:t xml:space="preserve">6.3 Thin participation, read without an investment scale</w:t>
       </w:r>
     </w:p>
     <w:p>
@@ -3860,7 +4037,7 @@
         <w:pStyle w:val="FirstParagraph"/>
       </w:pPr>
       <w:r>
-        <w:t xml:space="preserve">The two-layer model already explains most of the results: power and speed shaped appraisal; campus logins often failed; the home was associated with very high stress. A further question is how to read thin teacher interaction (only 15.8%</w:t>
+        <w:t xml:space="preserve">The two-layer model already accounts for most of the results: power and speed shaped appraisal; campus logins often failed; the home was associated with very high stress. Thin teacher interaction (only 15.8%</w:t>
       </w:r>
       <w:r>
         <w:t xml:space="preserve"> </w:t>
@@ -3875,15 +4052,7 @@
         <w:t xml:space="preserve">”</w:t>
       </w:r>
       <w:r>
-        <w:t xml:space="preserve">) and the even split over whether online study counted as class. One available reading is language investment (Norton, 2013; Darvin &amp; Norton, 2023). A student may still want Chinese and yet not be invested in the practices of a given class if the daily cost (data, a lively house, a job, a class that will not load) is higher than the return. Women in this sample more often refused to count emergency remote teaching as campus. That is a judgement about legitimacy, not a score on an investment scale.</w:t>
-      </w:r>
-    </w:p>
-    <w:p>
-      <w:pPr>
-        <w:pStyle w:val="BodyText"/>
-      </w:pPr>
-      <w:r>
-        <w:t xml:space="preserve">We do not need that reading in order to report the associations. We use it because Hajar and Karakuş (2024) have asked this journal for evidence on international students of languages other than English, and because withdrawal under cost is a recognised part of the investment literature. Campus Chinese offers embodied speaking practice. Home emergency teaching, on these items, offered thinner interaction and mixed appraisal. That is a plausible loss of oral practice, not a measured loss of oral capital (Darvin &amp; Norton, 2015). Readers who find the metaphor too loose can treat Section 6.3 as optional.</w:t>
+        <w:t xml:space="preserve">) and the even split over whether online study counted as class are participation outcomes, not scores on identity or imagined return. Norton (2013) and Darvin and Norton (2023) offer one optional language for that refusal: a learner may still want Chinese and yet not treat a given class as worth the daily cost. We do not measure investment and we do not need that language to report the counts. Readers may treat this paragraph as optional. The observed gender difference on replacement is a perception of legitimacy in this sample (9 of 11 women; 10 of 27 men). It does not explain why, and it does not generalise to Pakistani women.</w:t>
       </w:r>
     </w:p>
     <w:bookmarkEnd w:id="43"/>
@@ -3901,31 +4070,7 @@
         <w:pStyle w:val="FirstParagraph"/>
       </w:pPr>
       <w:r>
-        <w:t xml:space="preserve">ICLE debates on localisation often ask whether a textbook should replace Beijing place names with local names, or whether festival content needs Islamic-context mediation. Those questions belong in work on materials in Pakistani universities. They are not this paper. The present claim is narrower and sits inside curriculum implementation: a culturally adapted lesson still fails if it is a synchronous oral hour delivered into load-shedding or onto an application that does not open. In the emergency, the programme ecology was a Chinese-university timetable, the users sat mainly in Pakistani houses, and the material was a live class that assumed campus conditions.</w:t>
-      </w:r>
-    </w:p>
-    <w:p>
-      <w:pPr>
-        <w:pStyle w:val="BodyText"/>
-      </w:pPr>
-      <w:r>
-        <w:t xml:space="preserve">What follows for course design is modest and local to this sample. It is not a programme for Chinese language localisation in Pakistan, and it is not a theory of digital inequality in general. It is a set of delivery checks implied by this cohort: asynchronous oral alternatives that survive low bandwidth; progression decisions that do not assume a campus oral hour; prepaid data treated as a language-learning resource; timetables that name Beijing time when students sit in Pakistan; and a usable classroom defined by the application that opens. WhatsApp was marked available here; it was not recorded as used for class. Hybrid ICLE that still copies the campus hour onto Tencent Meeting or Chaoxing, without those checks, repeats the misfit after the pandemic.</w:t>
-      </w:r>
-    </w:p>
-    <w:p>
-      <w:pPr>
-        <w:pStyle w:val="BodyText"/>
-      </w:pPr>
-      <w:r>
-        <w:t xml:space="preserve">The same households send students to Confucius Institutes and to Chinese universities. Hybrid institute teaching that assumes uninterrupted Zoom reproduces the same misfit. Localisation for Pakistani Chinese teachers has to include checks of power, devices, and mediation language as well as textbook adaptation.</w:t>
-      </w:r>
-    </w:p>
-    <w:p>
-      <w:pPr>
-        <w:pStyle w:val="BodyText"/>
-      </w:pPr>
-      <w:r>
-        <w:t xml:space="preserve">The sample is 71% male. Digital inequality in Pakistani households is gendered (Raza &amp; Hennessy, 2025), and a Chinese-university sample recruited through male-dense networks will under-represent that pattern. On most ordinals, men and women did not differ. On replacement, women more often said no. On paid work, men more often said yes. The data cannot show how women lived the noisy home, the power cut, or the blocked Chaoxing login. Future work on this corridor should oversample Pakistani women, compare home learners enrolled in China with Confucius Institute learners in the same cities, and follow oral and written skill with tasks rather than only self-report. How</w:t>
+        <w:t xml:space="preserve">Localisation of content, materials, and curriculum construction (Zhao, 2020; Lu et al., 2024; Lam, 2024) remains necessary. Those questions belong in work on</w:t>
       </w:r>
       <w:r>
         <w:t xml:space="preserve"> </w:t>
@@ -3941,6 +4086,62 @@
         <w:t xml:space="preserve"> </w:t>
       </w:r>
       <w:r>
+        <w:t xml:space="preserve">in Pakistani universities. They are not this paper. The present claim is only the fourth layer distinguished in Section 2.3: a culturally adapted lesson still fails, in this sample, if it is a synchronous oral hour delivered into load-shedding or onto an application that does not open.</w:t>
+      </w:r>
+    </w:p>
+    <w:p>
+      <w:pPr>
+        <w:pStyle w:val="BodyText"/>
+      </w:pPr>
+      <w:r>
+        <w:t xml:space="preserve">Based on these findings, possible design considerations include asynchronous oral alternatives that survive low bandwidth; progression decisions that do not assume a campus oral hour; prepaid data treated as a language-learning resource; timetables that name Beijing time when students sit in Pakistan; and a usable classroom defined by the application that opens. WhatsApp was marked available here; it was not recorded as used for class. These are considerations suggested by 38 respondents in one emergency, not established solutions for ICLE. The findings suggest that hybrid models</w:t>
+      </w:r>
+      <w:r>
+        <w:t xml:space="preserve"> </w:t>
+      </w:r>
+      <w:r>
+        <w:rPr>
+          <w:iCs/>
+          <w:i/>
+        </w:rPr>
+        <w:t xml:space="preserve">may</w:t>
+      </w:r>
+      <w:r>
+        <w:t xml:space="preserve"> </w:t>
+      </w:r>
+      <w:r>
+        <w:t xml:space="preserve">reproduce similar misalignments when delivery assumptions are not examined. They do not show that hybrid ICLE after the pandemic has already repeated the misfit.</w:t>
+      </w:r>
+    </w:p>
+    <w:p>
+      <w:pPr>
+        <w:pStyle w:val="BodyText"/>
+      </w:pPr>
+      <w:r>
+        <w:t xml:space="preserve">The same households send students to Confucius Institutes and to Chinese universities. Future work, not this file, would need to test whether institute teaching that assumes uninterrupted Zoom meets the same delivery problem. Localisation for Pakistani Chinese teachers would then include checks of power, devices, and mediation language as well as textbook adaptation.</w:t>
+      </w:r>
+    </w:p>
+    <w:p>
+      <w:pPr>
+        <w:pStyle w:val="BodyText"/>
+      </w:pPr>
+      <w:r>
+        <w:t xml:space="preserve">The sample is 71% male. Digital inequality in Pakistani households is gendered (Raza &amp; Hennessy, 2025), and a network sample will under-represent that pattern. The data cannot show how women lived the noisy home, the power cut, or the blocked Chaoxing login. Future work should oversample Pakistani women, compare home learners enrolled in China with Confucius Institute learners in the same cities, and follow oral and written skill with tasks. How</w:t>
+      </w:r>
+      <w:r>
+        <w:t xml:space="preserve"> </w:t>
+      </w:r>
+      <w:r>
+        <w:rPr>
+          <w:iCs/>
+          <w:i/>
+        </w:rPr>
+        <w:t xml:space="preserve">HSK Standard Course</w:t>
+      </w:r>
+      <w:r>
+        <w:t xml:space="preserve"> </w:t>
+      </w:r>
+      <w:r>
         <w:t xml:space="preserve">is used in Pakistani universities is a different paper.</w:t>
       </w:r>
     </w:p>
@@ -3960,7 +4161,7 @@
         <w:pStyle w:val="FirstParagraph"/>
       </w:pPr>
       <w:r>
-        <w:t xml:space="preserve">The sample is small (N = 38). Associations are reported as counts and exact tests in this network; they do not support population odds ratios. It is a male-majority convenience sample of phone users, with nine responses labelled mainland China, so the findings describe this cohort rather than Pakistani women as a group or a census of students in Pakistan that week. Sensitivity analyses on n = 37 and n = 29 do not remove that limit. All outcomes are self-report; there are no HSK scores or oral tasks, and</w:t>
+        <w:t xml:space="preserve">The sample is small (N = 38). Associations are exploratory counts and exact tests in this network; they do not support population odds ratios or a confirmatory family of tests. It is a male-majority convenience sample of phone users, with nine responses labelled mainland China. Sensitivity analyses on n = 37 and n = 29 do not remove that limit. All outcomes are self-report; there are no HSK scores or oral tasks, and</w:t>
       </w:r>
       <w:r>
         <w:t xml:space="preserve"> </w:t>
@@ -3978,7 +4179,7 @@
         <w:t xml:space="preserve"> </w:t>
       </w:r>
       <w:r>
-        <w:t xml:space="preserve">is a self-rating. Chinese-medium items with non-native wording may have been understood unevenly. The questionnaire does not name the host university, textbook, or award type. Investment was not measured and is not required to read the results. The 2022 collection was not assigned an institutional ethics number. The transferable claim concerns how a campus curriculum was implemented under inequality, not the pandemic as such, and not textbook localisation.</w:t>
+        <w:t xml:space="preserve">is a self-rating. The three-item appraisal is a convenience composite, not a validated scale. Chinese-medium items with non-native wording may have been understood unevenly. The questionnaire does not name the host university, textbook, or award type. Investment was not measured. The 2022 collection has no institutional ethics number; that gap is explained in Section 4.5. The transferable claim is a suggestion about delivery-context fit in ICLE localisation, not a theory of the pandemic and not a programme of textbook localisation.</w:t>
       </w:r>
     </w:p>
     <w:bookmarkEnd w:id="46"/>
@@ -3996,7 +4197,7 @@
         <w:pStyle w:val="FirstParagraph"/>
       </w:pPr>
       <w:r>
-        <w:t xml:space="preserve">This article has examined one object: the implementation of a Chinese-university language curriculum when the class moved into the household. Pakistani students who learned Chinese through this emergency did not mainly fail to adapt to online learning. Many homes were asked to carry a campus oral hour. Many had no quiet room, no stable power, and no login that matched the campus system. Digital inequality entered as electricity, speed, and platform access. Participation looked like thin interaction, mixed learning appraisal, and an even split over whether this counted as class. Women in the sample more often refused that count. If localisation is to mean more than textbook adaptation, it has, on this corridor, to include delivery: the house, and the application that actually opens. The field has moved on to blended normalisation and generative AI. The inequality in these data has not.</w:t>
+        <w:t xml:space="preserve">This article has made one argument: ICLE localisation has to include delivery-context fit, not only content adaptation. Emergency remote teaching was the context in which that second layer became visible for Pakistani students of Chinese-university language courses. In this exploratory sample, many homes were asked to carry a campus oral hour without a quiet room, stable power, or a login that matched the campus system. Participation looked like thin interaction, mixed learning appraisal, and an even split over whether this counted as class. Women in the sample more often refused that count; that pattern needs a larger and more balanced study. If localisation is to mean more than textbook adaptation, these data suggest that it has, on this corridor, to include the house and the application that actually opens. That suggestion is bounded by N = 38. It is offered as a direction for ICLE, not as a finished theory.</w:t>
       </w:r>
     </w:p>
     <w:bookmarkEnd w:id="47"/>
@@ -4035,6 +4236,27 @@
         <w:pStyle w:val="BodyText"/>
       </w:pPr>
       <w:r>
+        <w:t xml:space="preserve">Canagarajah, A. S. (2005).</w:t>
+      </w:r>
+      <w:r>
+        <w:t xml:space="preserve"> </w:t>
+      </w:r>
+      <w:r>
+        <w:rPr>
+          <w:iCs/>
+          <w:i/>
+        </w:rPr>
+        <w:t xml:space="preserve">Reclaiming the local in language policy and practice</w:t>
+      </w:r>
+      <w:r>
+        <w:t xml:space="preserve">. Lawrence Erlbaum.</w:t>
+      </w:r>
+    </w:p>
+    <w:p>
+      <w:pPr>
+        <w:pStyle w:val="BodyText"/>
+      </w:pPr>
+      <w:r>
         <w:t xml:space="preserve">Darvin, R. (2025). Identity and investment in the age of generative AI.</w:t>
       </w:r>
       <w:r>
@@ -4056,27 +4278,6 @@
         <w:pStyle w:val="BodyText"/>
       </w:pPr>
       <w:r>
-        <w:t xml:space="preserve">Darvin, R., &amp; Norton, B. (2015). Identity and a model of investment in applied linguistics.</w:t>
-      </w:r>
-      <w:r>
-        <w:t xml:space="preserve"> </w:t>
-      </w:r>
-      <w:r>
-        <w:rPr>
-          <w:iCs/>
-          <w:i/>
-        </w:rPr>
-        <w:t xml:space="preserve">Annual Review of Applied Linguistics, 35</w:t>
-      </w:r>
-      <w:r>
-        <w:t xml:space="preserve">, 36-51. https://doi.org/10.1017/S0267190514000251</w:t>
-      </w:r>
-    </w:p>
-    <w:p>
-      <w:pPr>
-        <w:pStyle w:val="BodyText"/>
-      </w:pPr>
-      <w:r>
         <w:t xml:space="preserve">Darvin, R., &amp; Norton, B. (2023). Investment and motivation in language learning: What’s the difference?</w:t>
       </w:r>
       <w:r>
@@ -4224,27 +4425,6 @@
         <w:pStyle w:val="BodyText"/>
       </w:pPr>
       <w:r>
-        <w:t xml:space="preserve">Hajar, A., &amp; Karakuş, M. (2024). Three decades of research on the model of investment in applied linguistics: A bibliometric analysis and research agenda.</w:t>
-      </w:r>
-      <w:r>
-        <w:t xml:space="preserve"> </w:t>
-      </w:r>
-      <w:r>
-        <w:rPr>
-          <w:iCs/>
-          <w:i/>
-        </w:rPr>
-        <w:t xml:space="preserve">Language, Culture and Curriculum, 38</w:t>
-      </w:r>
-      <w:r>
-        <w:t xml:space="preserve">(2), 175-206. https://doi.org/10.1080/07908318.2024.2435284</w:t>
-      </w:r>
-    </w:p>
-    <w:p>
-      <w:pPr>
-        <w:pStyle w:val="BodyText"/>
-      </w:pPr>
-      <w:r>
         <w:t xml:space="preserve">Helsper, E. (2021).</w:t>
       </w:r>
       <w:r>
@@ -4308,6 +4488,48 @@
         <w:pStyle w:val="BodyText"/>
       </w:pPr>
       <w:r>
+        <w:t xml:space="preserve">Kumaravadivelu, B. (2001). Toward a postmethod pedagogy.</w:t>
+      </w:r>
+      <w:r>
+        <w:t xml:space="preserve"> </w:t>
+      </w:r>
+      <w:r>
+        <w:rPr>
+          <w:iCs/>
+          <w:i/>
+        </w:rPr>
+        <w:t xml:space="preserve">TESOL Quarterly, 35</w:t>
+      </w:r>
+      <w:r>
+        <w:t xml:space="preserve">(4), 537-560. https://doi.org/10.2307/3588427</w:t>
+      </w:r>
+    </w:p>
+    <w:p>
+      <w:pPr>
+        <w:pStyle w:val="BodyText"/>
+      </w:pPr>
+      <w:r>
+        <w:t xml:space="preserve">Lam, K. Y. (2024). At the intersection of multiliteracies and glocalisation: A case study in a university in Taiwan.</w:t>
+      </w:r>
+      <w:r>
+        <w:t xml:space="preserve"> </w:t>
+      </w:r>
+      <w:r>
+        <w:rPr>
+          <w:iCs/>
+          <w:i/>
+        </w:rPr>
+        <w:t xml:space="preserve">Language, Culture and Curriculum, 37</w:t>
+      </w:r>
+      <w:r>
+        <w:t xml:space="preserve">(4), 472-496. https://doi.org/10.1080/07908318.2024.2354874</w:t>
+      </w:r>
+    </w:p>
+    <w:p>
+      <w:pPr>
+        <w:pStyle w:val="BodyText"/>
+      </w:pPr>
+      <w:r>
         <w:t xml:space="preserve">Li, J., &amp; Li, C. (2024). A scoping review of the research on the teaching models of online international Chinese language teaching.</w:t>
       </w:r>
       <w:r>
@@ -4371,6 +4593,30 @@
         <w:pStyle w:val="BodyText"/>
       </w:pPr>
       <w:r>
+        <w:t xml:space="preserve">McDonough, J., &amp; Shaw, C. (2003).</w:t>
+      </w:r>
+      <w:r>
+        <w:t xml:space="preserve"> </w:t>
+      </w:r>
+      <w:r>
+        <w:rPr>
+          <w:iCs/>
+          <w:i/>
+        </w:rPr>
+        <w:t xml:space="preserve">Materials and methods in ELT: A teacher’s guide</w:t>
+      </w:r>
+      <w:r>
+        <w:t xml:space="preserve"> </w:t>
+      </w:r>
+      <w:r>
+        <w:t xml:space="preserve">(2nd ed.). Blackwell.</w:t>
+      </w:r>
+    </w:p>
+    <w:p>
+      <w:pPr>
+        <w:pStyle w:val="BodyText"/>
+      </w:pPr>
+      <w:r>
         <w:t xml:space="preserve">Moorhouse, B. L. (2023). Teachers’ digital technology use after a period of online teaching.</w:t>
       </w:r>
       <w:r>
@@ -4542,6 +4788,69 @@
         <w:pStyle w:val="BodyText"/>
       </w:pPr>
       <w:r>
+        <w:t xml:space="preserve">Tomlinson, B. (Ed.). (2011).</w:t>
+      </w:r>
+      <w:r>
+        <w:t xml:space="preserve"> </w:t>
+      </w:r>
+      <w:r>
+        <w:rPr>
+          <w:iCs/>
+          <w:i/>
+        </w:rPr>
+        <w:t xml:space="preserve">Materials development in language teaching</w:t>
+      </w:r>
+      <w:r>
+        <w:t xml:space="preserve"> </w:t>
+      </w:r>
+      <w:r>
+        <w:t xml:space="preserve">(2nd ed.). Cambridge University Press.</w:t>
+      </w:r>
+    </w:p>
+    <w:p>
+      <w:pPr>
+        <w:pStyle w:val="BodyText"/>
+      </w:pPr>
+      <w:r>
+        <w:t xml:space="preserve">Tu, M. (2026). Time and precarity in</w:t>
+      </w:r>
+      <w:r>
+        <w:t xml:space="preserve"> </w:t>
+      </w:r>
+      <w:r>
+        <w:t xml:space="preserve">‘</w:t>
+      </w:r>
+      <w:r>
+        <w:t xml:space="preserve">South–South</w:t>
+      </w:r>
+      <w:r>
+        <w:t xml:space="preserve">’</w:t>
+      </w:r>
+      <w:r>
+        <w:t xml:space="preserve"> </w:t>
+      </w:r>
+      <w:r>
+        <w:t xml:space="preserve">academic mobility: A 2019–2023 longitudinal study of Pakistani PhD students and recent graduates in China.</w:t>
+      </w:r>
+      <w:r>
+        <w:t xml:space="preserve"> </w:t>
+      </w:r>
+      <w:r>
+        <w:rPr>
+          <w:iCs/>
+          <w:i/>
+        </w:rPr>
+        <w:t xml:space="preserve">Population, Space and Place, 32</w:t>
+      </w:r>
+      <w:r>
+        <w:t xml:space="preserve">(2), Article e70227. https://doi.org/10.1002/psp.70227</w:t>
+      </w:r>
+    </w:p>
+    <w:p>
+      <w:pPr>
+        <w:pStyle w:val="BodyText"/>
+      </w:pPr>
+      <w:r>
         <w:t xml:space="preserve">van Dijk, J. (2020).</w:t>
       </w:r>
       <w:r>
@@ -4605,27 +4914,6 @@
         <w:pStyle w:val="BodyText"/>
       </w:pPr>
       <w:r>
-        <w:t xml:space="preserve">Wen, X., &amp; Liu, F. (2025). Emotional dynamics of advanced Chinese as a second language learners: A Q methodology study.</w:t>
-      </w:r>
-      <w:r>
-        <w:t xml:space="preserve"> </w:t>
-      </w:r>
-      <w:r>
-        <w:rPr>
-          <w:iCs/>
-          <w:i/>
-        </w:rPr>
-        <w:t xml:space="preserve">Language, Culture and Curriculum, 38</w:t>
-      </w:r>
-      <w:r>
-        <w:t xml:space="preserve">(3), 380-400. https://doi.org/10.1080/07908318.2025.2486449</w:t>
-      </w:r>
-    </w:p>
-    <w:p>
-      <w:pPr>
-        <w:pStyle w:val="BodyText"/>
-      </w:pPr>
-      <w:r>
         <w:t xml:space="preserve">Xia, Y., Hu, Y., Wu, C., Yang, L., &amp; Lei, M. (2022). Challenges of online learning amid the COVID-19: College students’ perspective.</w:t>
       </w:r>
       <w:r>
@@ -4682,6 +4970,27 @@
       </w:r>
       <w:r>
         <w:t xml:space="preserve">, 127-142. https://doi.org/10.1007/s10671-009-9078-1</w:t>
+      </w:r>
+    </w:p>
+    <w:p>
+      <w:pPr>
+        <w:pStyle w:val="BodyText"/>
+      </w:pPr>
+      <w:r>
+        <w:t xml:space="preserve">Zhao, K. (2020). Localising Chinese language curriculum construction: A case study in an Australian primary school.</w:t>
+      </w:r>
+      <w:r>
+        <w:t xml:space="preserve"> </w:t>
+      </w:r>
+      <w:r>
+        <w:rPr>
+          <w:iCs/>
+          <w:i/>
+        </w:rPr>
+        <w:t xml:space="preserve">Global Chinese, 6</w:t>
+      </w:r>
+      <w:r>
+        <w:t xml:space="preserve">(2), 263-288. https://doi.org/10.1515/glochi-2020-0014</w:t>
       </w:r>
     </w:p>
     <w:bookmarkEnd w:id="48"/>
@@ -5084,6 +5393,36 @@
     <w:abstractNumId w:val="990"/>
   </w:num>
   <w:num w:numId="1001">
+    <w:abstractNumId w:val="99411"/>
+    <w:lvlOverride w:ilvl="0">
+      <w:startOverride w:val="1"/>
+    </w:lvlOverride>
+    <w:lvlOverride w:ilvl="1">
+      <w:startOverride w:val="1"/>
+    </w:lvlOverride>
+    <w:lvlOverride w:ilvl="2">
+      <w:startOverride w:val="1"/>
+    </w:lvlOverride>
+    <w:lvlOverride w:ilvl="3">
+      <w:startOverride w:val="1"/>
+    </w:lvlOverride>
+    <w:lvlOverride w:ilvl="4">
+      <w:startOverride w:val="1"/>
+    </w:lvlOverride>
+    <w:lvlOverride w:ilvl="5">
+      <w:startOverride w:val="1"/>
+    </w:lvlOverride>
+    <w:lvlOverride w:ilvl="6">
+      <w:startOverride w:val="1"/>
+    </w:lvlOverride>
+    <w:lvlOverride w:ilvl="7">
+      <w:startOverride w:val="1"/>
+    </w:lvlOverride>
+    <w:lvlOverride w:ilvl="8">
+      <w:startOverride w:val="1"/>
+    </w:lvlOverride>
+  </w:num>
+  <w:num w:numId="1002">
     <w:abstractNumId w:val="99411"/>
     <w:lvlOverride w:ilvl="0">
       <w:startOverride w:val="1"/>

</xml_diff>

<commit_message>
Q1 revision: accurate sample, two focal tests, no odds ratios
Retitle as mainly Pakistani Chinese-university students studying
remotely. Drop IP as a location measure. Report counts and Fisher
p-values only. Bound claims to this 2022 exploratory file. Deposit
the de-identified CSV and syntax in the repository.

Co-authored-by: kristinehina23-rgb <kristinehina23-rgb@users.noreply.github.com>
</commit_message>
<xml_diff>
--- a/papers/q1-masters-covid/word/Rathore-Cao-Xu-When-Chinese-class-moved-home.docx
+++ b/papers/q1-masters-covid/word/Rathore-Cao-Xu-When-Chinese-class-moved-home.docx
@@ -2,13 +2,13 @@
 <file path=word/document.xml><?xml version="1.0" encoding="utf-8"?>
 <w:document xmlns:w="http://schemas.openxmlformats.org/wordprocessingml/2006/main" xmlns:m="http://schemas.openxmlformats.org/officeDocument/2006/math" xmlns:r="http://schemas.openxmlformats.org/officeDocument/2006/relationships" xmlns:o="urn:schemas-microsoft-com:office:office" xmlns:v="urn:schemas-microsoft-com:vml" xmlns:w10="urn:schemas-microsoft-com:office:word" xmlns:a="http://schemas.openxmlformats.org/drawingml/2006/main" xmlns:pic="http://schemas.openxmlformats.org/drawingml/2006/picture" xmlns:wp="http://schemas.openxmlformats.org/drawingml/2006/wordprocessingDrawing">
   <w:body>
-    <w:bookmarkStart w:id="49" w:name="Xe9071a26e2a253abc760e4ae7a86f3c225b62e5"/>
+    <w:bookmarkStart w:id="45" w:name="X58d4d32bf2fa0d1f45db090e0f004cc128afcf3"/>
     <w:p>
       <w:pPr>
         <w:pStyle w:val="Heading1"/>
       </w:pPr>
       <w:r>
-        <w:t xml:space="preserve">When Chinese class moved home: Pakistani students, infrastructure, and platform access</w:t>
+        <w:t xml:space="preserve">Pakistani Chinese-university students studying remotely: household infrastructure and platform access during emergency remote teaching</w:t>
       </w:r>
     </w:p>
     <w:p>
@@ -26,7 +26,7 @@
         <w:t xml:space="preserve"> </w:t>
       </w:r>
       <w:r>
-        <w:t xml:space="preserve">Chinese class at home</w:t>
+        <w:t xml:space="preserve">Remote Chinese: delivery-context fit</w:t>
       </w:r>
     </w:p>
     <w:p>
@@ -152,7 +152,37 @@
         <w:t xml:space="preserve"> </w:t>
       </w:r>
       <w:r>
-        <w:t xml:space="preserve">A de-identified analysis file is available from the corresponding author. Files containing names or IP addresses will not be shared.</w:t>
+        <w:t xml:space="preserve">A de-identified analysis file (</w:t>
+      </w:r>
+      <w:r>
+        <w:rPr>
+          <w:rStyle w:val="VerbatimChar"/>
+        </w:rPr>
+        <w:t xml:space="preserve">data/anonymized_n38.csv</w:t>
+      </w:r>
+      <w:r>
+        <w:t xml:space="preserve">), codebook, and analysis syntax (</w:t>
+      </w:r>
+      <w:r>
+        <w:rPr>
+          <w:rStyle w:val="VerbatimChar"/>
+        </w:rPr>
+        <w:t xml:space="preserve">analysis/analyze.py</w:t>
+      </w:r>
+      <w:r>
+        <w:t xml:space="preserve">; supplementary calculations in</w:t>
+      </w:r>
+      <w:r>
+        <w:t xml:space="preserve"> </w:t>
+      </w:r>
+      <w:r>
+        <w:rPr>
+          <w:rStyle w:val="VerbatimChar"/>
+        </w:rPr>
+        <w:t xml:space="preserve">analysis/supplementary_stats.md</w:t>
+      </w:r>
+      <w:r>
+        <w:t xml:space="preserve">) are in the public project repository. Files containing names or IP addresses will not be shared. The corresponding author can also supply the same de-identified files on request.</w:t>
       </w:r>
     </w:p>
     <w:bookmarkStart w:id="20" w:name="abstract"/>
@@ -169,12 +199,25 @@
         <w:pStyle w:val="FirstParagraph"/>
       </w:pPr>
       <w:r>
-        <w:t xml:space="preserve">This article contributes to international Chinese language education by extending localisation from content adaptation to delivery-context fit. Emergency remote teaching is the empirical context, not the theoretical centre. When Chinese-university language courses moved online, many Pakistani students continued them from households structured by unstable networks, power cuts, and campus applications that often did not open. A questionnaire completed by 38 students in February 2022 (mainly Pakistani; nine responses labelled mainland China) is treated as exploratory. Eleven of 14 students who said the home affected study</w:t>
+        <w:t xml:space="preserve">This article reports an exploratory questionnaire study of how Chinese-university language courses were experienced when live classes were relocated off campus during COVID-19 emergency remote teaching. The contribution to international Chinese language education is a bounded concept,</w:t>
       </w:r>
       <w:r>
         <w:t xml:space="preserve"> </w:t>
       </w:r>
       <w:r>
+        <w:rPr>
+          <w:iCs/>
+          <w:i/>
+        </w:rPr>
+        <w:t xml:space="preserve">localisation of delivery</w:t>
+      </w:r>
+      <w:r>
+        <w:t xml:space="preserve">: institutional adaptation of time, platform, task, participation mode, and assessment to the receiving context. Thirty-eight adult respondents completed a Chinese-medium Wenjuan form between 5 and 8 February 2022. Thirty-seven selected Pakistani nationality and one selected Bangladesh. The sample is therefore mainly Pakistani by nationality. It is not a sample exclusively located in Pakistan, and IP metadata are not treated as a location measure. Unstable networks (76.3%) and power interruptions (42.1%) were commonly ticked; 36.8% reported very high stress. Eleven of 14 respondents who said the home affected study</w:t>
+      </w:r>
+      <w:r>
+        <w:t xml:space="preserve"> </w:t>
+      </w:r>
+      <w:r>
         <w:t xml:space="preserve">“</w:t>
       </w:r>
       <w:r>
@@ -187,7 +230,38 @@
         <w:t xml:space="preserve"> </w:t>
       </w:r>
       <w:r>
-        <w:t xml:space="preserve">also reported very high stress, against 3 of 24 others; worse internet speed tracked worse learning appraisal (ρ = .65). In this sample, localising a travelling Chinese course meant fitting the live hour to the house and to the application that opened, not only adapting textbook content.</w:t>
+        <w:t xml:space="preserve">also reported very high stress, compared with 3 of 24 others (Fisher’s exact</w:t>
+      </w:r>
+      <w:r>
+        <w:t xml:space="preserve"> </w:t>
+      </w:r>
+      <w:r>
+        <w:rPr>
+          <w:iCs/>
+          <w:i/>
+        </w:rPr>
+        <w:t xml:space="preserve">p</w:t>
+      </w:r>
+      <w:r>
+        <w:t xml:space="preserve"> </w:t>
+      </w:r>
+      <w:r>
+        <w:t xml:space="preserve">= .00008). Worse reported internet speed was associated with a worse three-item perceived online-learning appraisal index (Spearman ρ = .65, bootstrap 95% CI [.36, .84]). QQ and Chaoxing were often marked unusable</w:t>
+      </w:r>
+      <w:r>
+        <w:t xml:space="preserve"> </w:t>
+      </w:r>
+      <w:r>
+        <w:t xml:space="preserve">“</w:t>
+      </w:r>
+      <w:r>
+        <w:t xml:space="preserve">in my country</w:t>
+      </w:r>
+      <w:r>
+        <w:t xml:space="preserve">”</w:t>
+      </w:r>
+      <w:r>
+        <w:t xml:space="preserve">; Zoom and WhatsApp were more often marked available. The study is a historically situated emergency-remote-teaching case. It does not provide evidence about current hybrid practice.</w:t>
       </w:r>
     </w:p>
     <w:p>
@@ -205,7 +279,7 @@
         <w:t xml:space="preserve"> </w:t>
       </w:r>
       <w:r>
-        <w:t xml:space="preserve">localisation; Chinese as an additional language; digital inequality; curriculum implementation; Pakistan; household</w:t>
+        <w:t xml:space="preserve">localisation of delivery; Chinese as an additional language; digital inequality; emergency remote teaching; Pakistan; household infrastructure</w:t>
       </w:r>
     </w:p>
     <w:bookmarkEnd w:id="20"/>
@@ -223,7 +297,7 @@
         <w:pStyle w:val="FirstParagraph"/>
       </w:pPr>
       <w:r>
-        <w:t xml:space="preserve">Localisation in international Chinese language education (ICLE) has usually meant making a travelling course</w:t>
+        <w:t xml:space="preserve">International Chinese language education (ICLE) has treated localisation mainly as a problem of content and materials: local examples, annotation, and cultural comparison so that a travelling syllabus becomes learnable in a place (Zhao, 2020; Lu et al., 2024). This article proposes a further layer.</w:t>
       </w:r>
       <w:r>
         <w:t xml:space="preserve"> </w:t>
@@ -233,10 +307,13 @@
           <w:iCs/>
           <w:i/>
         </w:rPr>
-        <w:t xml:space="preserve">learnable in a place</w:t>
-      </w:r>
-      <w:r>
-        <w:t xml:space="preserve">: local names and practices in the textbook, Urdu annotation, festival content mediated for a Muslim-majority classroom, or a school activity such as chess used to build Chinese (Zhao, 2020; Lu et al., 2024). This article contributes to that literature by extending localisation from content adaptation to delivery-context fit. The claim is modest. A Chinese course is localised not only when its materials speak to local life, but when the live hour, the login, and the oral task can actually be used in that life.</w:t>
+        <w:t xml:space="preserve">Localisation of delivery</w:t>
+      </w:r>
+      <w:r>
+        <w:t xml:space="preserve"> </w:t>
+      </w:r>
+      <w:r>
+        <w:t xml:space="preserve">is the institutional adaptation of time, platform, task, participation mode, and assessment to the receiving context. It differs from learner-side accessibility and from digital inclusion. Those terms describe conditions that students face. Localisation of delivery names a design task for the institution that sends the course.</w:t>
       </w:r>
     </w:p>
     <w:p>
@@ -244,7 +321,20 @@
         <w:pStyle w:val="BodyText"/>
       </w:pPr>
       <w:r>
-        <w:t xml:space="preserve">Emergency remote teaching (Hodges et al., 2020) is the empirical context in which that second kind of localisation became visible. When Chinese universities moved instruction online in 2020, many Pakistani students were already in Pakistan or soon returned there. They remained enrolled in Chinese-university language courses, yet the classroom they entered was a family home, a hostel, or a room shared with siblings, prepaid mobile data, and load-shedding. A Chinese-university language course is a planned sequence of live hours, oral tasks, and campus platforms that assume a dormitory, a timetable, and a login that works. The emergency kept those elements and changed the place (Gacs et al., 2020). Learners met the old course plan in households rather than in a redesigned distance-education programme.</w:t>
+        <w:t xml:space="preserve">Emergency remote teaching (Hodges et al., 2020) is the historical setting in which that task became visible, not the theoretical centre of the article. When Chinese universities moved instruction online in 2020, many students of Pakistani nationality remained enrolled in Chinese-university language courses while sitting outside the campus infrastructure. A</w:t>
+      </w:r>
+      <w:r>
+        <w:t xml:space="preserve"> </w:t>
+      </w:r>
+      <w:r>
+        <w:rPr>
+          <w:iCs/>
+          <w:i/>
+        </w:rPr>
+        <w:t xml:space="preserve">travelling course</w:t>
+      </w:r>
+      <w:r>
+        <w:t xml:space="preserve">, as used here, is an institutionally designed course whose timetable, platforms, tasks, and assessment arrangements were created for one institutional setting but enacted in another (Gacs et al., 2020). Typical Chinese-university language courses assume a live oral hour and a login on tools used in Chinese higher education. The questionnaire did not name host universities or required platforms. Those campus assumptions are therefore a contextual reading of ICLE emergency practice, not a measured programme description.</w:t>
       </w:r>
     </w:p>
     <w:p>
@@ -252,7 +342,282 @@
         <w:pStyle w:val="BodyText"/>
       </w:pPr>
       <w:r>
-        <w:t xml:space="preserve">The article is therefore about one thing. Localisation of</w:t>
+        <w:t xml:space="preserve">Pakistani enrolment in Chinese universities is a documented case of South–South academic mobility, structured by scholarships and the China–Pakistan Economic Corridor rather than by the more familiar</w:t>
+      </w:r>
+      <w:r>
+        <w:t xml:space="preserve"> </w:t>
+      </w:r>
+      <w:r>
+        <w:t xml:space="preserve">“</w:t>
+      </w:r>
+      <w:r>
+        <w:t xml:space="preserve">international student already on a Chinese campus</w:t>
+      </w:r>
+      <w:r>
+        <w:t xml:space="preserve">”</w:t>
+      </w:r>
+      <w:r>
+        <w:t xml:space="preserve"> </w:t>
+      </w:r>
+      <w:r>
+        <w:t xml:space="preserve">story (Iftikhar et al., 2024; Tu, 2026; Gao &amp; Hua, 2021). This study does not treat the 38 respondents as a census of that mobility. It asks how, in one network-recruited emergency-period file, household infrastructure and reported platform access co-occurred with stress, perceived learning, and judgements of whether online Chinese could replace campus classes.</w:t>
+      </w:r>
+    </w:p>
+    <w:p>
+      <w:pPr>
+        <w:pStyle w:val="BodyText"/>
+      </w:pPr>
+      <w:r>
+        <w:t xml:space="preserve">Three questions guide the analysis:</w:t>
+      </w:r>
+    </w:p>
+    <w:p>
+      <w:pPr>
+        <w:numPr>
+          <w:ilvl w:val="0"/>
+          <w:numId w:val="1001"/>
+        </w:numPr>
+        <w:pStyle w:val="Compact"/>
+      </w:pPr>
+      <w:r>
+        <w:t xml:space="preserve">What household, connectivity, and platform-access conditions did respondents report?</w:t>
+      </w:r>
+    </w:p>
+    <w:p>
+      <w:pPr>
+        <w:numPr>
+          <w:ilvl w:val="0"/>
+          <w:numId w:val="1001"/>
+        </w:numPr>
+        <w:pStyle w:val="Compact"/>
+      </w:pPr>
+      <w:r>
+        <w:t xml:space="preserve">In this sample, how did selected household and connectivity reports co-occur with very high stress and with perceived online-learning appraisal?</w:t>
+      </w:r>
+    </w:p>
+    <w:p>
+      <w:pPr>
+        <w:numPr>
+          <w:ilvl w:val="0"/>
+          <w:numId w:val="1001"/>
+        </w:numPr>
+        <w:pStyle w:val="Compact"/>
+      </w:pPr>
+      <w:r>
+        <w:t xml:space="preserve">How did respondents judge whether online Chinese could replace campus classes?</w:t>
+      </w:r>
+    </w:p>
+    <w:p>
+      <w:pPr>
+        <w:pStyle w:val="FirstParagraph"/>
+      </w:pPr>
+      <w:r>
+        <w:t xml:space="preserve">The analysis is exploratory. Associations are reported as counts, exact tests, and rank correlations in this network. They are not confirmatory tests of a population model.</w:t>
+      </w:r>
+    </w:p>
+    <w:bookmarkEnd w:id="21"/>
+    <w:bookmarkStart w:id="26" w:name="literature-and-framework"/>
+    <w:p>
+      <w:pPr>
+        <w:pStyle w:val="Heading2"/>
+      </w:pPr>
+      <w:r>
+        <w:t xml:space="preserve">2. Literature and framework</w:t>
+      </w:r>
+    </w:p>
+    <w:bookmarkStart w:id="22" w:name="X466d9fa4ba9675c3d2d096fe48fd97f00c4a10c"/>
+    <w:p>
+      <w:pPr>
+        <w:pStyle w:val="Heading3"/>
+      </w:pPr>
+      <w:r>
+        <w:t xml:space="preserve">2.1 Emergency remote teaching as historical context</w:t>
+      </w:r>
+    </w:p>
+    <w:p>
+      <w:pPr>
+        <w:pStyle w:val="FirstParagraph"/>
+      </w:pPr>
+      <w:r>
+        <w:t xml:space="preserve">Hodges et al. (2020) distinguished emergency remote teaching from planned online or blended courses. Gacs, Goertler and Spasova (2020) applied that distinction to languages. Reviews of language-teacher responses during the conversion to online teaching report thinner interaction and the entry of the domestic setting into the lesson (MacIntyre et al., 2020; Moorhouse &amp; Kohnke, 2021). Those studies are cited as emergency-teaching context, not as direct evidence of student stress in the present file.</w:t>
+      </w:r>
+    </w:p>
+    <w:p>
+      <w:pPr>
+        <w:pStyle w:val="BodyText"/>
+      </w:pPr>
+      <w:r>
+        <w:t xml:space="preserve">Later work described technological normalisation after the return to campus (Moorhouse, 2023; Moorhouse, Wong, &amp; Li, 2023) and warned that copying face-to-face teaching on videoconferencing was a limited lesson from the crisis (Stockwell &amp; Wang, 2023). For Chinese, contemporaneous papers documented</w:t>
+      </w:r>
+      <w:r>
+        <w:t xml:space="preserve"> </w:t>
+      </w:r>
+      <w:r>
+        <w:t xml:space="preserve">“</w:t>
+      </w:r>
+      <w:r>
+        <w:t xml:space="preserve">suspending classes without stopping learning</w:t>
+      </w:r>
+      <w:r>
+        <w:t xml:space="preserve">”</w:t>
+      </w:r>
+      <w:r>
+        <w:t xml:space="preserve"> </w:t>
+      </w:r>
+      <w:r>
+        <w:t xml:space="preserve">and platform trials (Zhang et al., 2020; Xia et al., 2022). A later review of online ICLE teaching models still lists technical issues, weak interaction, and time-zone problems (Li &amp; Li, 2024). Much of that literature assumes a relatively stable connection. The present file cannot test whether that assumption holds for current hybrid ICLE. It can describe what 38 respondents reported in February 2022.</w:t>
+      </w:r>
+    </w:p>
+    <w:bookmarkEnd w:id="22"/>
+    <w:bookmarkStart w:id="23" w:name="X2a1706acb855f9b47e20bf43e0bff03a0be2114"/>
+    <w:p>
+      <w:pPr>
+        <w:pStyle w:val="Heading3"/>
+      </w:pPr>
+      <w:r>
+        <w:t xml:space="preserve">2.2 Digital inequality and home learning ecology</w:t>
+      </w:r>
+    </w:p>
+    <w:p>
+      <w:pPr>
+        <w:pStyle w:val="FirstParagraph"/>
+      </w:pPr>
+      <w:r>
+        <w:t xml:space="preserve">Later digital-divide models describe a sequence of motivational, material, skills, usage, and outcome access (van Dijk, 2020; Helsper, 2021; Warschauer, 2003). Device ownership is not the same as taking part (Ali, 2020). In Pakistan, household use of educational technology is also structured by device sharing, care work, and electricity (Raza &amp; Hennessy, 2025). That report is grey literature and is used only as background on household conditions, not as a standalone empirical claim about this sample.</w:t>
+      </w:r>
+    </w:p>
+    <w:p>
+      <w:pPr>
+        <w:pStyle w:val="BodyText"/>
+      </w:pPr>
+      <w:r>
+        <w:t xml:space="preserve">Ecological views of language education take the setting of the class, not only the student plus the application, as the unit of analysis (van Lier, 2004; Guerrettaz et al., 2021). In this article that setting is described as a</w:t>
+      </w:r>
+      <w:r>
+        <w:t xml:space="preserve"> </w:t>
+      </w:r>
+      <w:r>
+        <w:rPr>
+          <w:iCs/>
+          <w:i/>
+        </w:rPr>
+        <w:t xml:space="preserve">home learning ecology</w:t>
+      </w:r>
+      <w:r>
+        <w:t xml:space="preserve">: domestic space, paid or care work, and the conditions of oral participation. Electricity interruptions, blocked applications, and weak bandwidth are treated as material and infrastructural conditions, not as cultural traits.</w:t>
+      </w:r>
+    </w:p>
+    <w:bookmarkEnd w:id="23"/>
+    <w:bookmarkStart w:id="24" w:name="localisation-of-delivery"/>
+    <w:p>
+      <w:pPr>
+        <w:pStyle w:val="Heading3"/>
+      </w:pPr>
+      <w:r>
+        <w:t xml:space="preserve">2.3 Localisation of delivery</w:t>
+      </w:r>
+    </w:p>
+    <w:p>
+      <w:pPr>
+        <w:pStyle w:val="FirstParagraph"/>
+      </w:pPr>
+      <w:r>
+        <w:t xml:space="preserve">In materials work, localisation has meant personalising content so that it speaks to a particular group (McDonough &amp; Shaw, 2003; Tomlinson, 2011). Canagarajah (2005) and Kumaravadivelu (2001) locate pedagogy in a specific group and place. China’s promotion of Chinese has long been tied to institutes, textbooks, and tests (Zhao &amp; Huang, 2010). ICLE studies have applied localisation to curriculum construction and textbook adaptation (Zhao, 2020; Lu et al., 2024). Lam (2024) treats glocalisation as fitting a travelling literacy to a local university classroom. Guerrettaz et al. (2021) extend materials from the page to use. If the material is a live class, use includes whether the class can be entered.</w:t>
+      </w:r>
+    </w:p>
+    <w:p>
+      <w:pPr>
+        <w:pStyle w:val="BodyText"/>
+      </w:pPr>
+      <w:r>
+        <w:t xml:space="preserve">Four layers can be distinguished:</w:t>
+      </w:r>
+    </w:p>
+    <w:p>
+      <w:pPr>
+        <w:numPr>
+          <w:ilvl w:val="0"/>
+          <w:numId w:val="1002"/>
+        </w:numPr>
+        <w:pStyle w:val="Compact"/>
+      </w:pPr>
+      <w:r>
+        <w:t xml:space="preserve">Localisation of</w:t>
+      </w:r>
+      <w:r>
+        <w:t xml:space="preserve"> </w:t>
+      </w:r>
+      <w:r>
+        <w:rPr>
+          <w:iCs/>
+          <w:i/>
+        </w:rPr>
+        <w:t xml:space="preserve">content</w:t>
+      </w:r>
+      <w:r>
+        <w:t xml:space="preserve">: examples, festivals, and cultural comparison.</w:t>
+      </w:r>
+    </w:p>
+    <w:p>
+      <w:pPr>
+        <w:numPr>
+          <w:ilvl w:val="0"/>
+          <w:numId w:val="1002"/>
+        </w:numPr>
+        <w:pStyle w:val="Compact"/>
+      </w:pPr>
+      <w:r>
+        <w:t xml:space="preserve">Localisation of</w:t>
+      </w:r>
+      <w:r>
+        <w:t xml:space="preserve"> </w:t>
+      </w:r>
+      <w:r>
+        <w:rPr>
+          <w:iCs/>
+          <w:i/>
+        </w:rPr>
+        <w:t xml:space="preserve">materials</w:t>
+      </w:r>
+      <w:r>
+        <w:t xml:space="preserve">: annotation, mediation language, and page redesign.</w:t>
+      </w:r>
+    </w:p>
+    <w:p>
+      <w:pPr>
+        <w:numPr>
+          <w:ilvl w:val="0"/>
+          <w:numId w:val="1002"/>
+        </w:numPr>
+        <w:pStyle w:val="Compact"/>
+      </w:pPr>
+      <w:r>
+        <w:t xml:space="preserve">Localisation of</w:t>
+      </w:r>
+      <w:r>
+        <w:t xml:space="preserve"> </w:t>
+      </w:r>
+      <w:r>
+        <w:rPr>
+          <w:iCs/>
+          <w:i/>
+        </w:rPr>
+        <w:t xml:space="preserve">curriculum</w:t>
+      </w:r>
+      <w:r>
+        <w:t xml:space="preserve">: pathway, hours, and assessment of a named programme (Shan &amp; Xu, 2024; Zhao, 2020).</w:t>
+      </w:r>
+    </w:p>
+    <w:p>
+      <w:pPr>
+        <w:numPr>
+          <w:ilvl w:val="0"/>
+          <w:numId w:val="1002"/>
+        </w:numPr>
+        <w:pStyle w:val="Compact"/>
+      </w:pPr>
+      <w:r>
+        <w:t xml:space="preserve">Localisation of</w:t>
       </w:r>
       <w:r>
         <w:t xml:space="preserve"> </w:t>
@@ -265,62 +630,15 @@
         <w:t xml:space="preserve">delivery</w:t>
       </w:r>
       <w:r>
-        <w:t xml:space="preserve"> </w:t>
-      </w:r>
-      <w:r>
-        <w:t xml:space="preserve">is the contribution to ICLE. Digital inequality and platform access are the mechanism that made delivery fail or hold. Emergency remote teaching is the occasion, not the theoretical centre. The paper is not a general study of COVID-19 pedagogy, not a theory of digital inclusion, and not a textbook-adaptation study.</w:t>
+        <w:t xml:space="preserve">: institutional adaptation of time, platform, task, participation mode, and assessment to the receiving context.</w:t>
       </w:r>
     </w:p>
     <w:p>
       <w:pPr>
-        <w:pStyle w:val="BodyText"/>
-      </w:pPr>
-      <w:r>
-        <w:rPr>
-          <w:iCs/>
-          <w:i/>
-        </w:rPr>
-        <w:t xml:space="preserve">Curriculum</w:t>
-      </w:r>
-      <w:r>
-        <w:t xml:space="preserve"> </w:t>
-      </w:r>
-      <w:r>
-        <w:t xml:space="preserve">here means the campus delivery plan (the live hour, the oral task, the campus login) when that plan is used away from campus (Shan &amp; Xu, 2024).</w:t>
-      </w:r>
-      <w:r>
-        <w:t xml:space="preserve"> </w:t>
-      </w:r>
-      <w:r>
-        <w:rPr>
-          <w:iCs/>
-          <w:i/>
-        </w:rPr>
-        <w:t xml:space="preserve">Culture</w:t>
-      </w:r>
-      <w:r>
-        <w:t xml:space="preserve"> </w:t>
-      </w:r>
-      <w:r>
-        <w:t xml:space="preserve">is used in a narrower sense than textbook representation of Chinese festivals or national images. Work in this journal already treats international students’ experience of Chinese education as a language-and-culture problem (Gao &amp; Hua, 2021; Gong, Gao, Li, &amp; Lai, 2020). Ecological and materials-in-use research locates that problem in the social setting of the class, not only in the page of the book (van Lier, 2004; Guerrettaz et al., 2021). When the class moves into a Pakistani household, the relevant cultural arrangement is who may speak, who owns the phone, whose paid or care work is interrupted, and what a</w:t>
-      </w:r>
-      <w:r>
-        <w:t xml:space="preserve"> </w:t>
-      </w:r>
-      <w:r>
-        <w:t xml:space="preserve">“</w:t>
-      </w:r>
-      <w:r>
-        <w:t xml:space="preserve">Chinese class</w:t>
-      </w:r>
-      <w:r>
-        <w:t xml:space="preserve">”</w:t>
-      </w:r>
-      <w:r>
-        <w:t xml:space="preserve"> </w:t>
-      </w:r>
-      <w:r>
-        <w:t xml:space="preserve">is allowed to mean in family space (Raza &amp; Hennessy, 2025). That is culture as the social world of additional-language practice. It is not an ethnography of Pakistani values.</w:t>
+        <w:pStyle w:val="FirstParagraph"/>
+      </w:pPr>
+      <w:r>
+        <w:t xml:space="preserve">This article addresses only the fourth layer. Accessibility and digital inclusion describe constraints that learners report. Localisation of delivery is the institutional response: changing the live hour, the required application, the oral task, or the assessment so that the travelling course can be used where the student actually sits. The questionnaire did not observe institutions adapting. It recorded student-side conditions that, if taken seriously, would require such adaptation.</w:t>
       </w:r>
     </w:p>
     <w:p>
@@ -328,434 +646,7 @@
         <w:pStyle w:val="BodyText"/>
       </w:pPr>
       <w:r>
-        <w:t xml:space="preserve">Pakistani enrolment in Chinese universities is a case of South–South academic mobility: movement between two countries of the Global South, structured by scholarships and the China–Pakistan Economic Corridor, rather than the more familiar North–South route or the</w:t>
-      </w:r>
-      <w:r>
-        <w:t xml:space="preserve"> </w:t>
-      </w:r>
-      <w:r>
-        <w:t xml:space="preserve">“</w:t>
-      </w:r>
-      <w:r>
-        <w:t xml:space="preserve">international student already on a Chinese campus</w:t>
-      </w:r>
-      <w:r>
-        <w:t xml:space="preserve">”</w:t>
-      </w:r>
-      <w:r>
-        <w:t xml:space="preserve"> </w:t>
-      </w:r>
-      <w:r>
-        <w:t xml:space="preserve">story (Iftikhar et al., 2024; Tu, 2026; Gao &amp; Hua, 2021). Far less is known about what happens to the language course when that mobility is interrupted and the student remains a Chinese-university learner from a household outside the campus network.</w:t>
-      </w:r>
-    </w:p>
-    <w:p>
-      <w:pPr>
-        <w:pStyle w:val="BodyText"/>
-      </w:pPr>
-      <w:r>
-        <w:t xml:space="preserve">This article reports an exploratory questionnaire completed by 38 students between 5 and 8 February 2022. The analysis describes associations in this network. It does not test a confirmatory model. Three questions guide the account:</w:t>
-      </w:r>
-    </w:p>
-    <w:p>
-      <w:pPr>
-        <w:numPr>
-          <w:ilvl w:val="0"/>
-          <w:numId w:val="1001"/>
-        </w:numPr>
-        <w:pStyle w:val="Compact"/>
-      </w:pPr>
-      <w:r>
-        <w:t xml:space="preserve">Which material, domestic, and platform conditions characterised emergency remote Chinese classes in this sample?</w:t>
-      </w:r>
-    </w:p>
-    <w:p>
-      <w:pPr>
-        <w:numPr>
-          <w:ilvl w:val="0"/>
-          <w:numId w:val="1001"/>
-        </w:numPr>
-        <w:pStyle w:val="Compact"/>
-      </w:pPr>
-      <w:r>
-        <w:t xml:space="preserve">How were those conditions related to stress, teacher interaction, and perceived learning?</w:t>
-      </w:r>
-    </w:p>
-    <w:p>
-      <w:pPr>
-        <w:numPr>
-          <w:ilvl w:val="0"/>
-          <w:numId w:val="1001"/>
-        </w:numPr>
-        <w:pStyle w:val="Compact"/>
-      </w:pPr>
-      <w:r>
-        <w:t xml:space="preserve">Did learners treat online Chinese as a legitimate substitute for campus study, and did that judgement differ by gender or by how much they thought they had learned?</w:t>
-      </w:r>
-    </w:p>
-    <w:p>
-      <w:pPr>
-        <w:pStyle w:val="FirstParagraph"/>
-      </w:pPr>
-      <w:r>
-        <w:t xml:space="preserve">The contribution is to ICLE localisation. The study describes household infrastructure, platform access, and participation among Pakistani (and one neighbouring) students of Chinese-university language courses. Sequential digital inequality (van Dijk, 2020) and home ecology are used to read those conditions. Language investment is not part of the framework; a short optional reading appears in the discussion. Design comments later in the paper are considerations suggested by this sample, not established solutions.</w:t>
-      </w:r>
-    </w:p>
-    <w:bookmarkEnd w:id="21"/>
-    <w:bookmarkStart w:id="26" w:name="literature-review"/>
-    <w:p>
-      <w:pPr>
-        <w:pStyle w:val="Heading2"/>
-      </w:pPr>
-      <w:r>
-        <w:t xml:space="preserve">2. Literature review</w:t>
-      </w:r>
-    </w:p>
-    <w:bookmarkStart w:id="22" w:name="X68dd8ebeb22cc7a16b333349dc5f722ace7abd5"/>
-    <w:p>
-      <w:pPr>
-        <w:pStyle w:val="Heading3"/>
-      </w:pPr>
-      <w:r>
-        <w:t xml:space="preserve">2.1 Emergency remote teaching and the copy of the campus hour</w:t>
-      </w:r>
-    </w:p>
-    <w:p>
-      <w:pPr>
-        <w:pStyle w:val="FirstParagraph"/>
-      </w:pPr>
-      <w:r>
-        <w:t xml:space="preserve">Hodges et al. (2020) distinguished emergency remote teaching from planned online or blended courses. The former is a temporary shift under crisis and does not follow a full instructional design cycle. Gacs, Goertler and Spasova (2020) applied that distinction to languages and warned against judging crisis teaching by the standards of mature online programmes. Reviews of teacher responses (Moorhouse &amp; Kohnke, 2021) and of learner affect (MacIntyre et al., 2020) report thinner interaction, anxious assessment, and the entry of the domestic setting into the lesson.</w:t>
-      </w:r>
-    </w:p>
-    <w:p>
-      <w:pPr>
-        <w:pStyle w:val="BodyText"/>
-      </w:pPr>
-      <w:r>
-        <w:t xml:space="preserve">Later work relocated rather than cancelled the distinction. Moorhouse, Wong and Li (2023) describe technological normalisation: tools becoming ordinary in everyday teaching. Moorhouse (2023) found that, in a well-resourced setting, many teachers kept digital tools after they returned to the physical classroom. Stockwell and Wang (2023) note a narrower pattern. Much emergency teaching used videoconferencing to copy face-to-face teaching, and that copy still shapes how teachers, learners, and administrators judge</w:t>
-      </w:r>
-      <w:r>
-        <w:t xml:space="preserve"> </w:t>
-      </w:r>
-      <w:r>
-        <w:t xml:space="preserve">“</w:t>
-      </w:r>
-      <w:r>
-        <w:t xml:space="preserve">technology.</w:t>
-      </w:r>
-      <w:r>
-        <w:t xml:space="preserve">”</w:t>
-      </w:r>
-      <w:r>
-        <w:t xml:space="preserve"> </w:t>
-      </w:r>
-      <w:r>
-        <w:t xml:space="preserve">For Chinese, the same years produced papers on</w:t>
-      </w:r>
-      <w:r>
-        <w:t xml:space="preserve"> </w:t>
-      </w:r>
-      <w:r>
-        <w:t xml:space="preserve">“</w:t>
-      </w:r>
-      <w:r>
-        <w:t xml:space="preserve">suspending classes without stopping learning,</w:t>
-      </w:r>
-      <w:r>
-        <w:t xml:space="preserve">”</w:t>
-      </w:r>
-      <w:r>
-        <w:t xml:space="preserve"> </w:t>
-      </w:r>
-      <w:r>
-        <w:t xml:space="preserve">platform trials, and blended models (Zhang et al., 2020; Xia et al., 2022). A later review of online ICLE still lists technical issues, weak interaction, and time-zone problems among the limits of blended teaching (Li &amp; Li, 2024). Much of that work assumes a Chinese campus system at one end of the link and a fairly stable connection at the other. That assumption does not travel automatically to Pakistan.</w:t>
-      </w:r>
-    </w:p>
-    <w:bookmarkEnd w:id="22"/>
-    <w:bookmarkStart w:id="23" w:name="digital-inequality-beyond-the-device"/>
-    <w:p>
-      <w:pPr>
-        <w:pStyle w:val="Heading3"/>
-      </w:pPr>
-      <w:r>
-        <w:t xml:space="preserve">2.2 Digital inequality beyond the device</w:t>
-      </w:r>
-    </w:p>
-    <w:p>
-      <w:pPr>
-        <w:pStyle w:val="FirstParagraph"/>
-      </w:pPr>
-      <w:r>
-        <w:t xml:space="preserve">Early digital-divide research asked who had a computer. Later models describe a sequence (van Dijk, 2020; Helsper, 2021): motivational access, material access, skills access, usage access, and outcomes. A student may own a smartphone and still lack a quiet hour, a prepaid balance, a keyboard suited to character input, or the skill to move between a live class and a PDF textbook. Warschauer (2003) argued that language learning on screens is stratified by these layers. Emergency remote teaching compressed them into one domestic scene.</w:t>
-      </w:r>
-    </w:p>
-    <w:p>
-      <w:pPr>
-        <w:pStyle w:val="BodyText"/>
-      </w:pPr>
-      <w:r>
-        <w:t xml:space="preserve">Owning a device is not the same as taking part. Rural-urban and household inequalities continue to shape who can sit in a live class (Ali, 2020). In Pakistan the household is also structured by gender. Raza and Hennessy (2025) show that girls’ home use of educational technology is shaped by device sharing, parental digital literacy, care work, and norms about who may be online, together with electricity and prepaid data. Students enrolled in China but studying from Pakistan occupied a third position. They were counted as Chinese-university students, assessed by Chinese-university rules, and physically located in Pakistani digital inequality. Which application opened is part of that inequality. Campus Chinese tools (QQ groups, Chaoxing, DingTalk) and consumer tools that work on Pakistani mobile networks (Zoom, WhatsApp) are not interchangeable logins. Copying the campus system into an offshore household can leave the official classroom on an application the student cannot enter.</w:t>
-      </w:r>
-    </w:p>
-    <w:bookmarkEnd w:id="23"/>
-    <w:bookmarkStart w:id="24" w:name="why-call-this-localisation"/>
-    <w:p>
-      <w:pPr>
-        <w:pStyle w:val="Heading3"/>
-      </w:pPr>
-      <w:r>
-        <w:t xml:space="preserve">2.3 Why call this localisation?</w:t>
-      </w:r>
-    </w:p>
-    <w:p>
-      <w:pPr>
-        <w:pStyle w:val="FirstParagraph"/>
-      </w:pPr>
-      <w:r>
-        <w:t xml:space="preserve">Reviewers of ICLE work may reasonably ask why household power and platform access should be called localisation rather than adaptation, accessibility, online pedagogy, or digital inclusion. Those neighbouring terms name parts of the mechanism. Localisation names the ICLE task: fitting a course that travels from a Chinese university to the place where it is used.</w:t>
-      </w:r>
-    </w:p>
-    <w:p>
-      <w:pPr>
-        <w:pStyle w:val="BodyText"/>
-      </w:pPr>
-      <w:r>
-        <w:t xml:space="preserve">In language materials work, localisation has long meant more than translation. McDonough and Shaw (2003) treat</w:t>
-      </w:r>
-      <w:r>
-        <w:t xml:space="preserve"> </w:t>
-      </w:r>
-      <w:r>
-        <w:t xml:space="preserve">“</w:t>
-      </w:r>
-      <w:r>
-        <w:t xml:space="preserve">personalising and localising</w:t>
-      </w:r>
-      <w:r>
-        <w:t xml:space="preserve">”</w:t>
-      </w:r>
-      <w:r>
-        <w:t xml:space="preserve"> </w:t>
-      </w:r>
-      <w:r>
-        <w:t xml:space="preserve">as a principle of adapting materials so that they speak to a particular group of learners. Tomlinson (2011) locates that work in principled materials development. Canagarajah (2005) argued that the local is not a residue of the global but the site at which language policy and practice are reclaimed. Kumaravadivelu (2001) called the same demand particularity: pedagogy has to fit a specific group in a specific context. Guerrettaz et al. (2021) push the argument from the page of the book to materials in use. If the material is a live class, the</w:t>
-      </w:r>
-      <w:r>
-        <w:t xml:space="preserve"> </w:t>
-      </w:r>
-      <w:r>
-        <w:t xml:space="preserve">“</w:t>
-      </w:r>
-      <w:r>
-        <w:t xml:space="preserve">use</w:t>
-      </w:r>
-      <w:r>
-        <w:t xml:space="preserve">”</w:t>
-      </w:r>
-      <w:r>
-        <w:t xml:space="preserve"> </w:t>
-      </w:r>
-      <w:r>
-        <w:t xml:space="preserve">includes whether the class can be entered.</w:t>
-      </w:r>
-    </w:p>
-    <w:p>
-      <w:pPr>
-        <w:pStyle w:val="BodyText"/>
-      </w:pPr>
-      <w:r>
-        <w:t xml:space="preserve">ICLE has applied localisation mainly to content and curriculum construction. Zhao (2020) localises a Chinese curriculum in an Australian primary school by building lessons from students’ everyday practices. Lu et al. (2024) document localisation of</w:t>
-      </w:r>
-      <w:r>
-        <w:t xml:space="preserve"> </w:t>
-      </w:r>
-      <w:r>
-        <w:rPr>
-          <w:iCs/>
-          <w:i/>
-        </w:rPr>
-        <w:t xml:space="preserve">HSK Standard Course</w:t>
-      </w:r>
-      <w:r>
-        <w:t xml:space="preserve"> </w:t>
-      </w:r>
-      <w:r>
-        <w:t xml:space="preserve">in Pakistani universities, including Urdu annotation and cultural comparison. Lam (2024), in this journal, treats glocalisation as the fitting of a travelling literacy to a local university classroom. Those studies localise</w:t>
-      </w:r>
-      <w:r>
-        <w:t xml:space="preserve"> </w:t>
-      </w:r>
-      <w:r>
-        <w:rPr>
-          <w:iCs/>
-          <w:i/>
-        </w:rPr>
-        <w:t xml:space="preserve">what</w:t>
-      </w:r>
-      <w:r>
-        <w:t xml:space="preserve"> </w:t>
-      </w:r>
-      <w:r>
-        <w:t xml:space="preserve">is taught and</w:t>
-      </w:r>
-      <w:r>
-        <w:t xml:space="preserve"> </w:t>
-      </w:r>
-      <w:r>
-        <w:rPr>
-          <w:iCs/>
-          <w:i/>
-        </w:rPr>
-        <w:t xml:space="preserve">how</w:t>
-      </w:r>
-      <w:r>
-        <w:t xml:space="preserve"> </w:t>
-      </w:r>
-      <w:r>
-        <w:t xml:space="preserve">it is framed. They rarely ask whether the delivery infrastructure (power, bandwidth, the campus login) can hold the lesson.</w:t>
-      </w:r>
-    </w:p>
-    <w:p>
-      <w:pPr>
-        <w:pStyle w:val="BodyText"/>
-      </w:pPr>
-      <w:r>
-        <w:t xml:space="preserve">Four layers can be distinguished, so that the present claim is not stretched across all of them:</w:t>
-      </w:r>
-    </w:p>
-    <w:p>
-      <w:pPr>
-        <w:numPr>
-          <w:ilvl w:val="0"/>
-          <w:numId w:val="1002"/>
-        </w:numPr>
-        <w:pStyle w:val="Compact"/>
-      </w:pPr>
-      <w:r>
-        <w:t xml:space="preserve">Localisation of</w:t>
-      </w:r>
-      <w:r>
-        <w:t xml:space="preserve"> </w:t>
-      </w:r>
-      <w:r>
-        <w:rPr>
-          <w:iCs/>
-          <w:i/>
-        </w:rPr>
-        <w:t xml:space="preserve">content</w:t>
-      </w:r>
-      <w:r>
-        <w:t xml:space="preserve">: names, festivals, examples, and cultural comparison.</w:t>
-      </w:r>
-    </w:p>
-    <w:p>
-      <w:pPr>
-        <w:numPr>
-          <w:ilvl w:val="0"/>
-          <w:numId w:val="1002"/>
-        </w:numPr>
-        <w:pStyle w:val="Compact"/>
-      </w:pPr>
-      <w:r>
-        <w:t xml:space="preserve">Localisation of</w:t>
-      </w:r>
-      <w:r>
-        <w:t xml:space="preserve"> </w:t>
-      </w:r>
-      <w:r>
-        <w:rPr>
-          <w:iCs/>
-          <w:i/>
-        </w:rPr>
-        <w:t xml:space="preserve">materials</w:t>
-      </w:r>
-      <w:r>
-        <w:t xml:space="preserve">: annotation, mediation language, and the redesign of the textbook page.</w:t>
-      </w:r>
-    </w:p>
-    <w:p>
-      <w:pPr>
-        <w:numPr>
-          <w:ilvl w:val="0"/>
-          <w:numId w:val="1002"/>
-        </w:numPr>
-        <w:pStyle w:val="Compact"/>
-      </w:pPr>
-      <w:r>
-        <w:t xml:space="preserve">Localisation of</w:t>
-      </w:r>
-      <w:r>
-        <w:t xml:space="preserve"> </w:t>
-      </w:r>
-      <w:r>
-        <w:rPr>
-          <w:iCs/>
-          <w:i/>
-        </w:rPr>
-        <w:t xml:space="preserve">curriculum</w:t>
-      </w:r>
-      <w:r>
-        <w:t xml:space="preserve">: the pathway, hours, and assessment of a named programme (Shan &amp; Xu, 2024; Zhao, 2020).</w:t>
-      </w:r>
-    </w:p>
-    <w:p>
-      <w:pPr>
-        <w:numPr>
-          <w:ilvl w:val="0"/>
-          <w:numId w:val="1002"/>
-        </w:numPr>
-        <w:pStyle w:val="Compact"/>
-      </w:pPr>
-      <w:r>
-        <w:t xml:space="preserve">Localisation of</w:t>
-      </w:r>
-      <w:r>
-        <w:t xml:space="preserve"> </w:t>
-      </w:r>
-      <w:r>
-        <w:rPr>
-          <w:iCs/>
-          <w:i/>
-        </w:rPr>
-        <w:t xml:space="preserve">delivery</w:t>
-      </w:r>
-      <w:r>
-        <w:t xml:space="preserve">: whether the live hour, the oral task, and the login can be used in this household, on this phone, in this electricity regime.</w:t>
-      </w:r>
-    </w:p>
-    <w:p>
-      <w:pPr>
-        <w:pStyle w:val="FirstParagraph"/>
-      </w:pPr>
-      <w:r>
-        <w:t xml:space="preserve">This article addresses only the fourth layer. Accessibility and digital inclusion describe why that layer fails. They do not replace the ICLE question, which is how a Chinese-university course is made usable when it leaves the campus.</w:t>
-      </w:r>
-    </w:p>
-    <w:bookmarkEnd w:id="24"/>
-    <w:bookmarkStart w:id="25" w:name="Xcd330498a6dd3210785781d416be0b973d8f43a"/>
-    <w:p>
-      <w:pPr>
-        <w:pStyle w:val="Heading3"/>
-      </w:pPr>
-      <w:r>
-        <w:t xml:space="preserve">2.4 The Pakistan corridor and the travelling campus course</w:t>
-      </w:r>
-    </w:p>
-    <w:p>
-      <w:pPr>
-        <w:pStyle w:val="FirstParagraph"/>
-      </w:pPr>
-      <w:r>
-        <w:t xml:space="preserve">China’s promotion of Chinese as an international language has long been tied to institutes, textbooks, and tests (Zhao &amp; Huang, 2010). Pakistani interest in Chinese is bound up with the China–Pakistan Economic Corridor, scholarships, and employment (Iftikhar et al., 2024). Attitude studies rarely capture the course that was supposed to produce the proficiency when the student could not be on campus.</w:t>
-      </w:r>
-    </w:p>
-    <w:p>
-      <w:pPr>
-        <w:pStyle w:val="BodyText"/>
-      </w:pPr>
-      <w:r>
-        <w:t xml:space="preserve">ICLE research after COVID-19 has turned toward blended models, interaction design, and cultural adaptation (Gong, Gao, &amp; Lyu, 2020; Li &amp; Li, 2024). Guenier, Xing and Yan (2026) describe a designed multimodal online course for Irish learners. That is planned online teaching, not emergency remote teaching. Gong, Gao, Li and Lai (2020) document New Zealand students’ cultural adaptation while they were physically in China; Gao and Hua (2021) collected that campus-in-China agenda in this journal. Lu et al. (2024) concern programmes</w:t>
+        <w:t xml:space="preserve">Gong, Gao and Lyu (2020) review ICLE in mainland China for 2014–2018 and are cited for that pre-pandemic field map, not as post-COVID evidence. Gao and Hua (2021) and Gong, Gao, Li and Lai (2020) document international students of Chinese</w:t>
       </w:r>
       <w:r>
         <w:t xml:space="preserve"> </w:t>
@@ -771,26 +662,53 @@
         <w:t xml:space="preserve"> </w:t>
       </w:r>
       <w:r>
-        <w:t xml:space="preserve">Pakistan. The present students were enrolled in Chinese universities. The two groups share a language, a test culture, and often a textbook family. They do not share a campus. Adapting a book for a Pakistani institute is not the same task as keeping a Chinese-university language course alive in a Karachi or Lahore household after a power cut.</w:t>
+        <w:t xml:space="preserve">Chinese universities. Guenier, Xing and Yan (2026) describe a designed online Chinese-culture course, which is planned online teaching rather than emergency remote teaching. The present respondents were enrolled in Chinese universities and answered a form about online Chinese classes. They were not a Confucius Institute classroom sample.</w:t>
+      </w:r>
+    </w:p>
+    <w:bookmarkEnd w:id="24"/>
+    <w:bookmarkStart w:id="25" w:name="conceptual-model"/>
+    <w:p>
+      <w:pPr>
+        <w:pStyle w:val="Heading3"/>
+      </w:pPr>
+      <w:r>
+        <w:t xml:space="preserve">2.4 Conceptual model</w:t>
       </w:r>
     </w:p>
     <w:p>
       <w:pPr>
+        <w:pStyle w:val="FirstParagraph"/>
+      </w:pPr>
+      <w:r>
+        <w:t xml:space="preserve">Figure 1 is a reading model, not a tested path. Household infrastructure and reported platform access are concurrent conditions of a travelling course. They are described as possible constraints on participation. Language investment is not part of the model.</w:t>
+      </w:r>
+    </w:p>
+    <w:p>
+      <w:pPr>
         <w:pStyle w:val="BodyText"/>
       </w:pPr>
       <w:r>
-        <w:t xml:space="preserve">A live Chinese class on an unfamiliar platform is also a language-access problem (Piller, Zhang, &amp; Li, 2020). Post-pandemic CALL has moved toward normalisation and AI, often in classrooms with working campus Wi-Fi (Moorhouse et al., 2023; Darvin, 2025). ICLE localisation research still under-represents the home as a site of delivery, and under-represents which Chinese-campus applications open from phones outside China. That is the gap this study can address.</w:t>
+        <w:t xml:space="preserve">Figure 1. Localisation of delivery as delivery-context fit (reading model). Household infrastructure (power interruptions, network stability, speed) and reported platform access are concurrent conditions. They are interpreted as possible constraints on participation and on self-reported stress, interaction, appraisal, and replacement judgements. The figure is not a causal path.</w:t>
       </w:r>
     </w:p>
     <w:bookmarkEnd w:id="25"/>
     <w:bookmarkEnd w:id="26"/>
-    <w:bookmarkStart w:id="27" w:name="theoretical-framework"/>
+    <w:bookmarkStart w:id="33" w:name="the-study"/>
     <w:p>
       <w:pPr>
         <w:pStyle w:val="Heading2"/>
       </w:pPr>
       <w:r>
-        <w:t xml:space="preserve">3. Theoretical framework</w:t>
+        <w:t xml:space="preserve">3. The study</w:t>
+      </w:r>
+    </w:p>
+    <w:bookmarkStart w:id="27" w:name="design"/>
+    <w:p>
+      <w:pPr>
+        <w:pStyle w:val="Heading3"/>
+      </w:pPr>
+      <w:r>
+        <w:t xml:space="preserve">3.1 Design</w:t>
       </w:r>
     </w:p>
     <w:p>
@@ -798,89 +716,25 @@
         <w:pStyle w:val="FirstParagraph"/>
       </w:pPr>
       <w:r>
-        <w:t xml:space="preserve">The conceptual contribution is localisation of delivery: the claim that a travelling Chinese-university course is not localised if its live hour cannot be used in the receiving household. Two analytic layers, both matched to the questionnaire, make that claim testable as description. Language investment is not part of the model.</w:t>
+        <w:t xml:space="preserve">The study is an exploratory, cross-sectional questionnaire. It does not test a pre-registered confirmatory model. The instrument title on the Wenjuan export is 新冠肺炎期间留学生在线中文学习的影响因素 (Influencing factors in international students’ online Chinese learning during COVID-19). Complete cases were submitted between 5 and 8 February 2022 (N = 38).</w:t>
+      </w:r>
+    </w:p>
+    <w:bookmarkEnd w:id="27"/>
+    <w:bookmarkStart w:id="28" w:name="recruitment-and-eligibility"/>
+    <w:p>
+      <w:pPr>
+        <w:pStyle w:val="Heading3"/>
+      </w:pPr>
+      <w:r>
+        <w:t xml:space="preserve">3.2 Recruitment and eligibility</w:t>
       </w:r>
     </w:p>
     <w:p>
       <w:pPr>
-        <w:pStyle w:val="BodyText"/>
-      </w:pPr>
-      <w:r>
-        <w:t xml:space="preserve">The first layer is sequential digital inequality, including platform geography (van Dijk, 2020). Electricity, devices, bandwidth, and time are ordered resources. Which application opens is part of that sequence. Absence at an earlier layer blocks later ones. Without power there is no live class. Without a usable login there is little interaction even if the class is on.</w:t>
-      </w:r>
-    </w:p>
-    <w:p>
-      <w:pPr>
-        <w:pStyle w:val="BodyText"/>
-      </w:pPr>
-      <w:r>
-        <w:t xml:space="preserve">The second layer is home ecology (van Lier, 2004; Guerrettaz et al., 2021). The unit of analysis is the household rather than</w:t>
-      </w:r>
-      <w:r>
-        <w:t xml:space="preserve"> </w:t>
-      </w:r>
-      <w:r>
-        <w:t xml:space="preserve">“</w:t>
-      </w:r>
-      <w:r>
-        <w:t xml:space="preserve">the student plus the application</w:t>
-      </w:r>
-      <w:r>
-        <w:t xml:space="preserve">”</w:t>
-      </w:r>
-      <w:r>
-        <w:t xml:space="preserve">: shared rooms, family labour, gendered domestic space, and the China–Pakistan time difference. Emergency remote teaching relocated the Chinese classroom into this ecology without redesigning the lesson or the house.</w:t>
-      </w:r>
-    </w:p>
-    <w:p>
-      <w:pPr>
-        <w:pStyle w:val="BodyText"/>
-      </w:pPr>
-      <w:r>
-        <w:t xml:space="preserve">The outcomes recorded on the form are stress, teacher interaction, perceived learning, and whether online study was judged a substitute for campus classes. Figure 1 is a reading model, not a tested path.</w:t>
-      </w:r>
-    </w:p>
-    <w:p>
-      <w:pPr>
-        <w:pStyle w:val="BodyText"/>
-      </w:pPr>
-      <w:r>
-        <w:t xml:space="preserve">Figure 1. Localisation of delivery as delivery-context fit. Sequential digital inequality (power, signal, speed, and which application opens) and home ecology (space, family, paid work) are concurrent conditions of a travelling Chinese-university course. They are read as shaping participation and the self-reported outcomes of stress, interaction, learning appraisal, and the replacement judgement. Investment is not shown.</w:t>
-      </w:r>
-    </w:p>
-    <w:bookmarkEnd w:id="27"/>
-    <w:bookmarkStart w:id="33" w:name="the-study"/>
-    <w:p>
-      <w:pPr>
-        <w:pStyle w:val="Heading2"/>
-      </w:pPr>
-      <w:r>
-        <w:t xml:space="preserve">4. The study</w:t>
-      </w:r>
-    </w:p>
-    <w:bookmarkStart w:id="28" w:name="context-and-design"/>
-    <w:p>
-      <w:pPr>
-        <w:pStyle w:val="Heading3"/>
-      </w:pPr>
-      <w:r>
-        <w:t xml:space="preserve">4.1 Context and design</w:t>
-      </w:r>
-    </w:p>
-    <w:p>
-      <w:pPr>
         <w:pStyle w:val="FirstParagraph"/>
       </w:pPr>
       <w:r>
-        <w:t xml:space="preserve">Respondents were enrolled in Chinese-university language courses that had moved online. In early February 2022 many Pakistani students were at home rather than in a Chinese dormitory; nine responses were still labelled mainland China. The course they were expected to attend assumed a campus timetable, a live oral hour, and a login on a Chinese-campus platform. The household, the power supply, and the applications that opened from a Pakistani mobile network were not part of that plan. The questionnaire does not name the host university, the textbook, or an HSK target. Curriculum here means that campus delivery plan as lived.</w:t>
-      </w:r>
-    </w:p>
-    <w:p>
-      <w:pPr>
-        <w:pStyle w:val="BodyText"/>
-      </w:pPr>
-      <w:r>
-        <w:t xml:space="preserve">The study is an exploratory, cross-sectional questionnaire of how that course was experienced from wherever the student sat that week. It does not test a pre-registered confirmatory model. Data come from a Chinese-medium Wenjuan questionnaire on influencing factors in international students’ online Chinese learning during COVID-19 (38 complete cases, 5 to 8 February 2022).</w:t>
+        <w:t xml:space="preserve">The file is a convenience sample. The form did not record how the link was distributed (for example WeChat, WhatsApp, email, or student groups). The research team therefore cannot name the recruitment channel. Eligibility was implicit: adult respondents who completed the Chinese-medium form about online Chinese learning. The form did not ask host university, city of residence that week, degree versus non-degree status, or scholarship type. Two items asked whether required courses and electives were online (71.1% and 60.5% ticked those options). Those ticks do not identify a named programme.</w:t>
       </w:r>
     </w:p>
     <w:bookmarkEnd w:id="28"/>
@@ -890,7 +744,7 @@
         <w:pStyle w:val="Heading3"/>
       </w:pPr>
       <w:r>
-        <w:t xml:space="preserve">4.2 Participants</w:t>
+        <w:t xml:space="preserve">3.3 Participants</w:t>
       </w:r>
     </w:p>
     <w:p>
@@ -916,7 +770,7 @@
         <w:t xml:space="preserve"> </w:t>
       </w:r>
       <w:r>
-        <w:t xml:space="preserve">(Bangladesh). Self-rated Chinese level was mostly advanced (22, 57.9%) or intermediate (15, 39.5%); one beginner. That label is the student’s own, not an HSK band. Years of learning Chinese clustered at three to four years (26, 68.4%). All submissions used a phone (iPhone 24, 63.2%; Android 14). Device ownership was therefore not the main gap. IP geolocation placed nine responses in mainland China and 29 elsewhere. The main analysis keeps all 38 cases. The form did not ask whether the student held a China Scholarship Council award, so the sample is described as Chinese-university language students.</w:t>
+        <w:t xml:space="preserve">(Bangladesh). Self-rated Chinese level was mostly advanced (22, 57.9%) or intermediate (15, 39.5%); one beginner. That label is the student’s own, not an HSK band. Years of learning Chinese clustered at three to four years (26, 68.4%). Wenjuan submission metadata classified the operating system as iPhone (24, 63.2%) or Android (14). That variable is the device used to submit the form, not a survey item about all devices used for class.</w:t>
       </w:r>
     </w:p>
     <w:p>
@@ -924,17 +778,38 @@
         <w:pStyle w:val="BodyText"/>
       </w:pPr>
       <w:r>
-        <w:t xml:space="preserve">The sample is a network-recruited convenience sample, not a draw from all Pakistani students in Chinese universities. Scholarship routes from Pakistan have long been male-heavy in some tracks, and a questionnaire link passed through student networks will reproduce that skew. Eleven women are too few to describe Pakistani women’s home classrooms. Percentages for the whole sample therefore combine men’s experience with a small female minority. Gender is tested where the instrument allows (research question 3). Non-significant gender tests are treated as inconclusive.</w:t>
+        <w:t xml:space="preserve">Wenjuan automatically recorded an IP-province field. The research team coded a dummy when that field was a mainland China province name (9 of 38). IP labels are technical metadata. They can be affected by virtual private networks and proxies and are not a reliable measure of physical location. They are not used as a participant-location variable and are not the basis of a sensitivity analysis.</w:t>
+      </w:r>
+    </w:p>
+    <w:p>
+      <w:pPr>
+        <w:pStyle w:val="BodyText"/>
+      </w:pPr>
+      <w:r>
+        <w:t xml:space="preserve">The sample is described as</w:t>
+      </w:r>
+      <w:r>
+        <w:t xml:space="preserve"> </w:t>
+      </w:r>
+      <w:r>
+        <w:rPr>
+          <w:iCs/>
+          <w:i/>
+        </w:rPr>
+        <w:t xml:space="preserve">mainly Pakistani Chinese-university language students studying remotely in February 2022</w:t>
+      </w:r>
+      <w:r>
+        <w:t xml:space="preserve">. It is not described as students exclusively in Pakistan, as CSC students, or as a draw from all Pakistani students in Chinese universities.</w:t>
       </w:r>
     </w:p>
     <w:bookmarkEnd w:id="29"/>
-    <w:bookmarkStart w:id="30" w:name="instrument"/>
+    <w:bookmarkStart w:id="30" w:name="instrument-and-coding"/>
     <w:p>
       <w:pPr>
         <w:pStyle w:val="Heading3"/>
       </w:pPr>
       <w:r>
-        <w:t xml:space="preserve">4.3 Instrument</w:t>
+        <w:t xml:space="preserve">3.4 Instrument and coding</w:t>
       </w:r>
     </w:p>
     <w:p>
@@ -942,7 +817,7 @@
         <w:pStyle w:val="FirstParagraph"/>
       </w:pPr>
       <w:r>
-        <w:t xml:space="preserve">The questionnaire comprised about 30 items: demographics, single-choice ordinals, and multiple-response lists of courses, problems, platforms, and forms of interaction. Stems are in Chinese, with some non-native wording (for example 您尝尝用什么平台). We translate for reporting and analysed the coded values.</w:t>
+        <w:t xml:space="preserve">The questionnaire comprised about 30 items: demographics, single-choice ordinals, and multiple-response lists. Stems are in Chinese, with some non-native wording (for example 您尝尝用什么平台). English glosses are used for reporting. Item wording for the appraisal index is given in Appendix A.</w:t>
       </w:r>
     </w:p>
     <w:p>
@@ -950,221 +825,57 @@
         <w:pStyle w:val="BodyText"/>
       </w:pPr>
       <w:r>
-        <w:t xml:space="preserve">A learning-appraisal composite was formed from three same-direction ordinals that ask, in different wording, whether the student thought online study produced learning: learned much; improves Chinese; sparks interest. The three items were treated as one face-valid cluster of perceived learning, not as a validated psychological scale. Cronbach’s α = .84, which supports using their mean as a convenience summary in this file. Exploratory factor analysis was not used: with N = 38 the sample is too small for a stable factor solution, and the analysis is not confirmatory. Individual items are also reported. Higher scores on the composites used below indicate a worse condition or a thinner outcome:</w:t>
+        <w:t xml:space="preserve">A three-item</w:t>
+      </w:r>
+      <w:r>
+        <w:t xml:space="preserve"> </w:t>
+      </w:r>
+      <w:r>
+        <w:rPr>
+          <w:iCs/>
+          <w:i/>
+        </w:rPr>
+        <w:t xml:space="preserve">perceived online-learning appraisal index</w:t>
+      </w:r>
+      <w:r>
+        <w:t xml:space="preserve"> </w:t>
+      </w:r>
+      <w:r>
+        <w:t xml:space="preserve">was formed from learned much (Q8), improves Chinese (Q9), and sparks interest (Q10). The items ask related but not identical questions. They are treated as a descriptive index, not as a validated unidimensional scale. Internal consistency was acceptable in this sample (Cronbach’s α = .84); Spearman inter-item correlations ranged from .55 to .75 (Appendix B). Exploratory factor analysis was not used (N = 38). Individual items are also reported. One double-tick on</w:t>
+      </w:r>
+      <w:r>
+        <w:t xml:space="preserve"> </w:t>
+      </w:r>
+      <w:r>
+        <w:t xml:space="preserve">“</w:t>
+      </w:r>
+      <w:r>
+        <w:t xml:space="preserve">like online classes</w:t>
+      </w:r>
+      <w:r>
+        <w:t xml:space="preserve">”</w:t>
+      </w:r>
+      <w:r>
+        <w:t xml:space="preserve"> </w:t>
+      </w:r>
+      <w:r>
+        <w:t xml:space="preserve">was excluded for that item only (n = 37 valid).</w:t>
       </w:r>
     </w:p>
-    <w:tbl>
-      <w:tblPr>
-        <w:tblStyle w:val="Table"/>
-        <w:tblW w:type="auto" w:w="0"/>
-        <w:tblLook w:firstRow="1" w:lastRow="0" w:firstColumn="0" w:lastColumn="0" w:noHBand="0" w:noVBand="0" w:val="0020"/>
-        <w:jc w:val="start"/>
-      </w:tblPr>
-      <w:tblGrid>
-        <w:gridCol w:w="2640"/>
-        <w:gridCol w:w="2640"/>
-        <w:gridCol w:w="2640"/>
-      </w:tblGrid>
-      <w:tr>
-        <w:trPr>
-          <w:tblHeader w:val="true"/>
-        </w:trPr>
-        <w:tc>
-          <w:tcPr/>
-          <w:p>
-            <w:pPr>
-              <w:pStyle w:val="Compact"/>
-              <w:jc w:val="left"/>
-            </w:pPr>
-            <w:r>
-              <w:t xml:space="preserve">Variable</w:t>
-            </w:r>
-          </w:p>
-        </w:tc>
-        <w:tc>
-          <w:tcPr/>
-          <w:p>
-            <w:pPr>
-              <w:pStyle w:val="Compact"/>
-              <w:jc w:val="left"/>
-            </w:pPr>
-            <w:r>
-              <w:t xml:space="preserve">1 means</w:t>
-            </w:r>
-          </w:p>
-        </w:tc>
-        <w:tc>
-          <w:tcPr/>
-          <w:p>
-            <w:pPr>
-              <w:pStyle w:val="Compact"/>
-              <w:jc w:val="left"/>
-            </w:pPr>
-            <w:r>
-              <w:t xml:space="preserve">Higher means</w:t>
-            </w:r>
-          </w:p>
-        </w:tc>
-      </w:tr>
-      <w:tr>
-        <w:tc>
-          <w:tcPr/>
-          <w:p>
-            <w:pPr>
-              <w:pStyle w:val="Compact"/>
-              <w:jc w:val="left"/>
-            </w:pPr>
-            <w:r>
-              <w:t xml:space="preserve">Speed</w:t>
-            </w:r>
-          </w:p>
-        </w:tc>
-        <w:tc>
-          <w:tcPr/>
-          <w:p>
-            <w:pPr>
-              <w:pStyle w:val="Compact"/>
-              <w:jc w:val="left"/>
-            </w:pPr>
-            <w:r>
-              <w:t xml:space="preserve">very good</w:t>
-            </w:r>
-          </w:p>
-        </w:tc>
-        <w:tc>
-          <w:tcPr/>
-          <w:p>
-            <w:pPr>
-              <w:pStyle w:val="Compact"/>
-              <w:jc w:val="left"/>
-            </w:pPr>
-            <w:r>
-              <w:t xml:space="preserve">worse speed</w:t>
-            </w:r>
-          </w:p>
-        </w:tc>
-      </w:tr>
-      <w:tr>
-        <w:tc>
-          <w:tcPr/>
-          <w:p>
-            <w:pPr>
-              <w:pStyle w:val="Compact"/>
-              <w:jc w:val="left"/>
-            </w:pPr>
-            <w:r>
-              <w:t xml:space="preserve">Learned / improve / interest</w:t>
-            </w:r>
-          </w:p>
-        </w:tc>
-        <w:tc>
-          <w:tcPr/>
-          <w:p>
-            <w:pPr>
-              <w:pStyle w:val="Compact"/>
-              <w:jc w:val="left"/>
-            </w:pPr>
-            <w:r>
-              <w:t xml:space="preserve">a lot / very much</w:t>
-            </w:r>
-          </w:p>
-        </w:tc>
-        <w:tc>
-          <w:tcPr/>
-          <w:p>
-            <w:pPr>
-              <w:pStyle w:val="Compact"/>
-              <w:jc w:val="left"/>
-            </w:pPr>
-            <w:r>
-              <w:t xml:space="preserve">worse appraisal</w:t>
-            </w:r>
-          </w:p>
-        </w:tc>
-      </w:tr>
-      <w:tr>
-        <w:tc>
-          <w:tcPr/>
-          <w:p>
-            <w:pPr>
-              <w:pStyle w:val="Compact"/>
-              <w:jc w:val="left"/>
-            </w:pPr>
-            <w:r>
-              <w:t xml:space="preserve">Stress</w:t>
-            </w:r>
-          </w:p>
-        </w:tc>
-        <w:tc>
-          <w:tcPr/>
-          <w:p>
-            <w:pPr>
-              <w:pStyle w:val="Compact"/>
-              <w:jc w:val="left"/>
-            </w:pPr>
-            <w:r>
-              <w:t xml:space="preserve">very high</w:t>
-            </w:r>
-          </w:p>
-        </w:tc>
-        <w:tc>
-          <w:tcPr/>
-          <w:p>
-            <w:pPr>
-              <w:pStyle w:val="Compact"/>
-              <w:jc w:val="left"/>
-            </w:pPr>
-            <w:r>
-              <w:t xml:space="preserve">less stress</w:t>
-            </w:r>
-          </w:p>
-        </w:tc>
-      </w:tr>
-      <w:tr>
-        <w:tc>
-          <w:tcPr/>
-          <w:p>
-            <w:pPr>
-              <w:pStyle w:val="Compact"/>
-              <w:jc w:val="left"/>
-            </w:pPr>
-            <w:r>
-              <w:t xml:space="preserve">Teacher interaction</w:t>
-            </w:r>
-          </w:p>
-        </w:tc>
-        <w:tc>
-          <w:tcPr/>
-          <w:p>
-            <w:pPr>
-              <w:pStyle w:val="Compact"/>
-              <w:jc w:val="left"/>
-            </w:pPr>
-            <w:r>
-              <w:t xml:space="preserve">very much</w:t>
-            </w:r>
-          </w:p>
-        </w:tc>
-        <w:tc>
-          <w:tcPr/>
-          <w:p>
-            <w:pPr>
-              <w:pStyle w:val="Compact"/>
-              <w:jc w:val="left"/>
-            </w:pPr>
-            <w:r>
-              <w:t xml:space="preserve">thinner interaction</w:t>
-            </w:r>
-          </w:p>
-        </w:tc>
-      </w:tr>
-    </w:tbl>
     <w:p>
       <w:pPr>
         <w:pStyle w:val="BodyText"/>
       </w:pPr>
       <w:r>
-        <w:t xml:space="preserve">One open comment on preferred class length is retained:</w:t>
+        <w:t xml:space="preserve">Coding follows the Wenjuan export. Higher values on speed, learned, improve, interest, and teacher interaction indicate a more negative report (worse speed; less learning, improvement, or interest; thinner interaction). Stress is coded 1 = very high to 4 = none; the focal stress analysis uses a dummy for very high stress and does not reverse the ordinal. Full directions are in Table A1.</w:t>
+      </w:r>
+    </w:p>
+    <w:p>
+      <w:pPr>
+        <w:pStyle w:val="BodyText"/>
+      </w:pPr>
+      <w:r>
+        <w:t xml:space="preserve">The export labelled one multiple-response problem as</w:t>
       </w:r>
       <w:r>
         <w:t xml:space="preserve"> </w:t>
@@ -1173,7 +884,7 @@
         <w:t xml:space="preserve">“</w:t>
       </w:r>
       <w:r>
-        <w:t xml:space="preserve">我觉得中国现在让学生回来上课。在线上上课一分钟也不合适</w:t>
+        <w:t xml:space="preserve">no electricity.</w:t>
       </w:r>
       <w:r>
         <w:t xml:space="preserve">”</w:t>
@@ -1182,7 +893,41 @@
         <w:t xml:space="preserve"> </w:t>
       </w:r>
       <w:r>
-        <w:t xml:space="preserve">(I think China should have students come back to class now. Even one minute of online class is not suitable). Names, IP addresses, and exact timestamps beyond the date were removed before analysis.</w:t>
+        <w:t xml:space="preserve">The introduction’s references to load-shedding are contextual. In results we report the item as</w:t>
+      </w:r>
+      <w:r>
+        <w:t xml:space="preserve"> </w:t>
+      </w:r>
+      <w:r>
+        <w:rPr>
+          <w:iCs/>
+          <w:i/>
+        </w:rPr>
+        <w:t xml:space="preserve">power interruptions</w:t>
+      </w:r>
+      <w:r>
+        <w:t xml:space="preserve"> </w:t>
+      </w:r>
+      <w:r>
+        <w:t xml:space="preserve">(export label: no electricity).</w:t>
+      </w:r>
+      <w:r>
+        <w:t xml:space="preserve"> </w:t>
+      </w:r>
+      <w:r>
+        <w:t xml:space="preserve">“</w:t>
+      </w:r>
+      <w:r>
+        <w:t xml:space="preserve">中国慕课</w:t>
+      </w:r>
+      <w:r>
+        <w:t xml:space="preserve">”</w:t>
+      </w:r>
+      <w:r>
+        <w:t xml:space="preserve"> </w:t>
+      </w:r>
+      <w:r>
+        <w:t xml:space="preserve">is reported as printed on the form; the option did not name a single provider such as 中国大学MOOC.</w:t>
       </w:r>
     </w:p>
     <w:bookmarkEnd w:id="30"/>
@@ -1192,7 +937,7 @@
         <w:pStyle w:val="Heading3"/>
       </w:pPr>
       <w:r>
-        <w:t xml:space="preserve">4.4 Analysis</w:t>
+        <w:t xml:space="preserve">3.5 Analysis</w:t>
       </w:r>
     </w:p>
     <w:p>
@@ -1200,7 +945,7 @@
         <w:pStyle w:val="FirstParagraph"/>
       </w:pPr>
       <w:r>
-        <w:t xml:space="preserve">Frequencies are reported as n/38. Multiple-response items are the percentage of respondents who selected the option. The learning-appraisal score is the mean of learned, improve, and interest (higher = worse). With N = 38 the analysis is exploratory and descriptive. We report cell counts first. For 2×2 tables we add Fisher’s exact test, φ, and an odds ratio with a 95% confidence interval only as a compact summary of those counts. The intervals are too wide to support population inference, and they should not be read as precise effect sizes. For ordinal pairs we used Spearman’s ρ, likewise as a rank association in this sample. Gender differences on ordinals were checked with Mann-Whitney U (all</w:t>
+        <w:t xml:space="preserve">Frequencies are n/38 unless noted. Multiple-response items are the percentage who selected the option. Two associations were treated as focal: (a) home affects study very much × very high stress; (b) internet speed × the appraisal index. For the 2×2 table we report cell counts and two-sided Fisher’s exact</w:t>
       </w:r>
       <w:r>
         <w:t xml:space="preserve"> </w:t>
@@ -1216,7 +961,19 @@
         <w:t xml:space="preserve"> </w:t>
       </w:r>
       <w:r>
-        <w:t xml:space="preserve">&gt; .10). Sensitivity analyses repeat the two focal patterns among Pakistani respondents only (n = 37) and among cases whose IP was not labelled mainland China (n = 29).</w:t>
+        <w:t xml:space="preserve">(SciPy</w:t>
+      </w:r>
+      <w:r>
+        <w:t xml:space="preserve"> </w:t>
+      </w:r>
+      <w:r>
+        <w:rPr>
+          <w:rStyle w:val="VerbatimChar"/>
+        </w:rPr>
+        <w:t xml:space="preserve">fisher_exact</w:t>
+      </w:r>
+      <w:r>
+        <w:t xml:space="preserve">). Odds ratios and Wald confidence intervals are not reported: at N = 38 they are unstable, and a Wald interval can disagree with Fisher’s</w:t>
       </w:r>
       <w:r>
         <w:t xml:space="preserve"> </w:t>
@@ -1229,20 +986,41 @@
         <w:t xml:space="preserve">p</w:t>
       </w:r>
       <w:r>
+        <w:t xml:space="preserve">. For the ordinal pair we report Spearman’s ρ and a bootstrap 95% confidence interval (5,000 resamples). Other associations, including gender, are secondary and are placed in Appendix B.</w:t>
+      </w:r>
+      <w:r>
         <w:t xml:space="preserve"> </w:t>
       </w:r>
       <w:r>
-        <w:t xml:space="preserve">values are not Bonferroni-adjusted.</w:t>
+        <w:rPr>
+          <w:iCs/>
+          <w:i/>
+        </w:rPr>
+        <w:t xml:space="preserve">p</w:t>
+      </w:r>
+      <w:r>
+        <w:t xml:space="preserve"> </w:t>
+      </w:r>
+      <w:r>
+        <w:t xml:space="preserve">values are not adjusted for multiplicity and are not interpreted as confirmatory.</w:t>
+      </w:r>
+    </w:p>
+    <w:p>
+      <w:pPr>
+        <w:pStyle w:val="BodyText"/>
+      </w:pPr>
+      <w:r>
+        <w:t xml:space="preserve">A Pakistani-nationality check (n = 37) is reported only to show that dropping the one Bangladeshi case does not reverse the two focal associations. It is not a location analysis.</w:t>
       </w:r>
     </w:p>
     <w:bookmarkEnd w:id="31"/>
-    <w:bookmarkStart w:id="32" w:name="ethics"/>
+    <w:bookmarkStart w:id="32" w:name="ethics-and-data-protection"/>
     <w:p>
       <w:pPr>
         <w:pStyle w:val="Heading3"/>
       </w:pPr>
       <w:r>
-        <w:t xml:space="preserve">4.5 Ethics</w:t>
+        <w:t xml:space="preserve">3.6 Ethics and data protection</w:t>
       </w:r>
     </w:p>
     <w:p>
@@ -1250,7 +1028,7 @@
         <w:pStyle w:val="FirstParagraph"/>
       </w:pPr>
       <w:r>
-        <w:t xml:space="preserve">The questionnaire was completed in February 2022 by adult students. The form presented the study as research on online Chinese learning and stated that answers would be used for research. Submission of the completed form was treated as consent. Names, IP addresses, and exact timestamps beyond the collection dates were removed before analysis and are not published. Gender is reported because it structured one finding.</w:t>
+        <w:t xml:space="preserve">Adult respondents completed an online form presented as research on online Chinese learning. The form stated that answers would be used for research. Completion and submission were treated as consent. Names, IP addresses, and exact timestamps beyond the collection dates were removed before analysis. The de-identified file does not include those fields.</w:t>
       </w:r>
     </w:p>
     <w:p>
@@ -1258,27 +1036,27 @@
         <w:pStyle w:val="BodyText"/>
       </w:pPr>
       <w:r>
-        <w:t xml:space="preserve">No institutional ethics-committee number was assigned to the 2022 collection. At the time the first author was an M.Phil. student collecting a small online questionnaire; a numbered approval was not obtained. We do not invent one. The present article reports an anonymised secondary analysis of that file. The gap is a limit of the historical collection, not a claim that ethics review is unnecessary. Journals that require a protocol number for all human-subjects work may ask for additional documentation from the authors’ current institutions.</w:t>
+        <w:t xml:space="preserve">No institutional ethics-committee number is available for the original 2022 collection. The first author was then an M.Phil. student; numbered approval was not obtained. The present article is an anonymised secondary analysis of that file. Authors should seek retrospective institutional confirmation or a waiver from their current ethics office before ScholarOne upload if the journal requires a protocol number. No approval number has been invented.</w:t>
       </w:r>
     </w:p>
     <w:bookmarkEnd w:id="32"/>
     <w:bookmarkEnd w:id="33"/>
-    <w:bookmarkStart w:id="40" w:name="results"/>
+    <w:bookmarkStart w:id="38" w:name="results"/>
     <w:p>
       <w:pPr>
         <w:pStyle w:val="Heading2"/>
       </w:pPr>
       <w:r>
-        <w:t xml:space="preserve">5. Results</w:t>
+        <w:t xml:space="preserve">4. Results</w:t>
       </w:r>
     </w:p>
-    <w:bookmarkStart w:id="34" w:name="who-sat-in-the-class"/>
+    <w:bookmarkStart w:id="34" w:name="respondents-and-reported-conditions"/>
     <w:p>
       <w:pPr>
         <w:pStyle w:val="Heading3"/>
       </w:pPr>
       <w:r>
-        <w:t xml:space="preserve">5.1 Who sat in the class</w:t>
+        <w:t xml:space="preserve">4.1 Respondents and reported conditions</w:t>
       </w:r>
     </w:p>
     <w:p>
@@ -1286,7 +1064,7 @@
         <w:pStyle w:val="FirstParagraph"/>
       </w:pPr>
       <w:r>
-        <w:t xml:space="preserve">Table 1 locates the sample. It is small, phone-based, and majority male. Most respondents (78.9%) said all of their Chinese classes were online. More than half (57.9%) were working alongside study. Nine IP addresses were labelled mainland China. The analysis therefore describes an interrupted Chinese-university cohort rather than a group in which everyone sat in Pakistan that week.</w:t>
+        <w:t xml:space="preserve">Table 1 locates the sample. Most respondents (78.9%) said all of their Chinese classes were online. More than half (57.9%) reported working alongside study.</w:t>
       </w:r>
     </w:p>
     <w:p>
@@ -1310,7 +1088,7 @@
           <w:iCs/>
           <w:i/>
         </w:rPr>
-        <w:t xml:space="preserve">Demographic and study profile of respondents (N = 38)</w:t>
+        <w:t xml:space="preserve">Respondents (N = 38)</w:t>
       </w:r>
     </w:p>
     <w:tbl>
@@ -1451,7 +1229,7 @@
               <w:jc w:val="left"/>
             </w:pPr>
             <w:r>
-              <w:t xml:space="preserve">Pakistani</w:t>
+              <w:t xml:space="preserve">Pakistani nationality</w:t>
             </w:r>
           </w:p>
         </w:tc>
@@ -1527,7 +1305,7 @@
               <w:jc w:val="left"/>
             </w:pPr>
             <w:r>
-              <w:t xml:space="preserve">Beginner / intermediate / advanced Chinese</w:t>
+              <w:t xml:space="preserve">Beginner / intermediate / advanced Chinese (self-rating)</w:t>
             </w:r>
           </w:p>
         </w:tc>
@@ -1679,7 +1457,7 @@
               <w:jc w:val="left"/>
             </w:pPr>
             <w:r>
-              <w:t xml:space="preserve">Phone: iPhone / Android</w:t>
+              <w:t xml:space="preserve">Submission device: iPhone / Android</w:t>
             </w:r>
           </w:p>
         </w:tc>
@@ -1704,44 +1482,6 @@
             </w:pPr>
             <w:r>
               <w:t xml:space="preserve">63.2 / 36.8</w:t>
-            </w:r>
-          </w:p>
-        </w:tc>
-      </w:tr>
-      <w:tr>
-        <w:tc>
-          <w:tcPr/>
-          <w:p>
-            <w:pPr>
-              <w:pStyle w:val="Compact"/>
-              <w:jc w:val="left"/>
-            </w:pPr>
-            <w:r>
-              <w:t xml:space="preserve">IP geolocated in mainland China</w:t>
-            </w:r>
-          </w:p>
-        </w:tc>
-        <w:tc>
-          <w:tcPr/>
-          <w:p>
-            <w:pPr>
-              <w:pStyle w:val="Compact"/>
-              <w:jc w:val="right"/>
-            </w:pPr>
-            <w:r>
-              <w:t xml:space="preserve">9</w:t>
-            </w:r>
-          </w:p>
-        </w:tc>
-        <w:tc>
-          <w:tcPr/>
-          <w:p>
-            <w:pPr>
-              <w:pStyle w:val="Compact"/>
-              <w:jc w:val="right"/>
-            </w:pPr>
-            <w:r>
-              <w:t xml:space="preserve">23.7</w:t>
             </w:r>
           </w:p>
         </w:tc>
@@ -1800,69 +1540,15 @@
         <w:t xml:space="preserve"> </w:t>
       </w:r>
       <w:r>
-        <w:t xml:space="preserve">Convenience sample, Wenjuan, 5 to 8 February 2022.</w:t>
-      </w:r>
-    </w:p>
-    <w:bookmarkEnd w:id="34"/>
-    <w:bookmarkStart w:id="35" w:name="household-conditions-and-stress"/>
-    <w:p>
-      <w:pPr>
-        <w:pStyle w:val="Heading3"/>
-      </w:pPr>
-      <w:r>
-        <w:t xml:space="preserve">5.2 Household conditions and stress</w:t>
+        <w:t xml:space="preserve">Convenience sample, Wenjuan, 5 to 8 February 2022. Device is the operating system recorded at submission.</w:t>
       </w:r>
     </w:p>
     <w:p>
       <w:pPr>
-        <w:pStyle w:val="FirstParagraph"/>
-      </w:pPr>
-      <w:r>
-        <w:t xml:space="preserve">Table 2 summarises the conditions of study. Unstable networks (76.3%), power cuts (42.1%), and no signal (31.6%) were common. Most respondents (89.5%) said their country</w:t>
-      </w:r>
-      <w:r>
-        <w:t xml:space="preserve"> </w:t>
-      </w:r>
-      <w:r>
-        <w:t xml:space="preserve">“</w:t>
-      </w:r>
-      <w:r>
-        <w:t xml:space="preserve">has internet,</w:t>
-      </w:r>
-      <w:r>
-        <w:t xml:space="preserve">”</w:t>
-      </w:r>
-      <w:r>
-        <w:t xml:space="preserve"> </w:t>
-      </w:r>
-      <w:r>
-        <w:t xml:space="preserve">but speed was split: 36.8% good or very good, 36.8% average, and 26.3% bad or very bad. Four people (10.5%) said there was no internet in their country, yet all 38 submitted an online form. That item is better read as no stable home broadband than as no network at all.</w:t>
-      </w:r>
-    </w:p>
-    <w:p>
-      <w:pPr>
         <w:pStyle w:val="BodyText"/>
       </w:pPr>
       <w:r>
-        <w:t xml:space="preserve">Only 11 of 38 (28.9%) described the home as quiet; 71.1% chose noisy or lively. Fourteen (36.8%) said the home affected study</w:t>
-      </w:r>
-      <w:r>
-        <w:t xml:space="preserve"> </w:t>
-      </w:r>
-      <w:r>
-        <w:t xml:space="preserve">“</w:t>
-      </w:r>
-      <w:r>
-        <w:t xml:space="preserve">very much.</w:t>
-      </w:r>
-      <w:r>
-        <w:t xml:space="preserve">”</w:t>
-      </w:r>
-      <w:r>
-        <w:t xml:space="preserve"> </w:t>
-      </w:r>
-      <w:r>
-        <w:t xml:space="preserve">All 38 answered from a phone. The Chinese classroom had been moved onto a device that also carries family calls, prepaid data, and a small keyboard for characters.</w:t>
+        <w:t xml:space="preserve">Table 2 summarises reported conditions. Unstable networks (76.3%) and power interruptions (42.1%) were commonly ticked. Speed was split: 36.8% good or very good, 36.8% average, 26.3% bad or very bad. Four respondents (10.5%) said their country did not have internet, yet all 38 submitted an online form. The item wording does not allow a firm reinterpretation; we report the tick as given. Only 11 of 38 (28.9%) described the home as quiet.</w:t>
       </w:r>
     </w:p>
     <w:p>
@@ -1886,7 +1572,7 @@
           <w:iCs/>
           <w:i/>
         </w:rPr>
-        <w:t xml:space="preserve">Conditions of study and selected outcomes (N = 38)</w:t>
+        <w:t xml:space="preserve">Reported conditions and selected outcomes (N = 38)</w:t>
       </w:r>
     </w:p>
     <w:tbl>
@@ -1989,7 +1675,7 @@
               <w:jc w:val="left"/>
             </w:pPr>
             <w:r>
-              <w:t xml:space="preserve">No electricity</w:t>
+              <w:t xml:space="preserve">Power interruptions (export label: no electricity)</w:t>
             </w:r>
           </w:p>
         </w:tc>
@@ -2290,7 +1976,7 @@
         <w:pStyle w:val="BodyText"/>
       </w:pPr>
       <w:r>
-        <w:t xml:space="preserve">The clearest pattern in the sample is between the home and stress, and it is best read as a count, not as a population odds ratio. Among those who said the home affected study very much, 11 of 14 also reported very high psychological stress; among the others, 3 of 24 did (Fisher</w:t>
+        <w:t xml:space="preserve">Among those who said the home affected study very much, 11 of 14 also reported very high psychological stress; among the others, 3 of 24 did (Fisher’s exact</w:t>
       </w:r>
       <w:r>
         <w:t xml:space="preserve"> </w:t>
@@ -2306,30 +1992,17 @@
         <w:t xml:space="preserve"> </w:t>
       </w:r>
       <w:r>
-        <w:t xml:space="preserve">&lt; .001, φ = .66). Spearman’s ρ between that home item and the stress ordinal (1 = very high) was −.66 (</w:t>
-      </w:r>
-      <w:r>
-        <w:rPr>
-          <w:iCs/>
-          <w:i/>
-        </w:rPr>
-        <w:t xml:space="preserve">p</w:t>
-      </w:r>
-      <w:r>
-        <w:t xml:space="preserve"> </w:t>
-      </w:r>
-      <w:r>
-        <w:t xml:space="preserve">&lt; .001). Table 4 prints the corresponding odds ratio only as a compact summary of the same 2×2 table; its interval ([4.42, 149.00]) is too wide for inference beyond this sample. The figure that discriminates is the 36.8% who reported very high stress.</w:t>
+        <w:t xml:space="preserve">= .00008). This is a co-occurrence in this file. It is not evidence that the household caused stress. The most salient descriptive stress finding was that 36.8% reported very high stress.</w:t>
       </w:r>
     </w:p>
-    <w:bookmarkEnd w:id="35"/>
-    <w:bookmarkStart w:id="36" w:name="Xcaed1ea785147ce2b7b7bc763c8cc14ebc51e4b"/>
+    <w:bookmarkEnd w:id="34"/>
+    <w:bookmarkStart w:id="35" w:name="reported-platform-access"/>
     <w:p>
       <w:pPr>
         <w:pStyle w:val="Heading3"/>
       </w:pPr>
       <w:r>
-        <w:t xml:space="preserve">5.3 Platforms that opened and platforms that did not</w:t>
+        <w:t xml:space="preserve">4.2 Reported platform access</w:t>
       </w:r>
     </w:p>
     <w:p>
@@ -2337,7 +2010,15 @@
         <w:pStyle w:val="FirstParagraph"/>
       </w:pPr>
       <w:r>
-        <w:t xml:space="preserve">Students did not so much lack a platform as they lacked the platform the university was using (Table 3). The tools reported as used for class were Tencent Meeting (71.1%), Zoom (47.4%), and WeChat (31.6%). The tools marked unusable</w:t>
+        <w:t xml:space="preserve">Respondents reported uneven access to institutionally familiar and consumer-facing platforms (Table 3). This pattern is interpreted as a possible platform-geography dimension of delivery-context fit. The survey cannot isolate country restrictions, routing, account rules, skills, or virtual private networks.</w:t>
+      </w:r>
+    </w:p>
+    <w:p>
+      <w:pPr>
+        <w:pStyle w:val="BodyText"/>
+      </w:pPr>
+      <w:r>
+        <w:t xml:space="preserve">Tools reported as used for class were Tencent Meeting (71.1%), Zoom (47.4%), and WeChat (31.6%). Tools marked unusable</w:t>
       </w:r>
       <w:r>
         <w:t xml:space="preserve"> </w:t>
@@ -2355,7 +2036,7 @@
         <w:t xml:space="preserve"> </w:t>
       </w:r>
       <w:r>
-        <w:t xml:space="preserve">were QQ (50.0%), Chaoxing (42.1%), DingTalk (28.9%), and Chinese MOOC (28.9%). The tools marked available were Zoom (71.1%), WhatsApp (68.4%), Tencent Meeting (57.9%), and WeChat (39.5%). WhatsApp appears only as available; the questionnaire, as retained here, did not record whether it was used for class. Tencent Meeting was the most used class tool, yet fewer respondents marked it available in their country, a discrepancy that may reflect use while in China or through a virtual private network.</w:t>
+        <w:t xml:space="preserve">included QQ (50.0%), Chaoxing (42.1%), DingTalk (28.9%), and 中国慕课 (28.9%). Tools marked available included Zoom (71.1%), WhatsApp (68.4%), Tencent Meeting (57.9%), and WeChat (39.5%). WhatsApp appears only as available; the retained form did not code whether it was used for class. Tencent Meeting was the most used class tool but was marked available by fewer respondents. That discrepancy is left as an item-level inconsistency.</w:t>
       </w:r>
     </w:p>
     <w:p>
@@ -2807,7 +2488,7 @@
               <w:jc w:val="left"/>
             </w:pPr>
             <w:r>
-              <w:t xml:space="preserve">Chinese MOOC</w:t>
+              <w:t xml:space="preserve">中国慕课 (Chinese MOOC, as printed)</w:t>
             </w:r>
           </w:p>
         </w:tc>
@@ -2864,7 +2545,7 @@
         <w:t xml:space="preserve"> </w:t>
       </w:r>
       <w:r>
-        <w:t xml:space="preserve">n.a. = the item was not asked in that column. Campus-side Chinese platforms are those students mark as unusable. Consumer tools often used in Pakistan (Zoom, WhatsApp) are those they mark as available.</w:t>
+        <w:t xml:space="preserve">n.a. = the item was not asked in that column.</w:t>
       </w:r>
       <w:r>
         <w:t xml:space="preserve"> </w:t>
@@ -2882,33 +2563,51 @@
         <w:t xml:space="preserve"> </w:t>
       </w:r>
       <w:r>
-        <w:t xml:space="preserve">is the student’s wording; nine responses were labelled mainland China.</w:t>
+        <w:t xml:space="preserve">is the stem wording. QQ, Chaoxing, DingTalk, and 中国慕课 are platforms often used in Chinese-university teaching; they are not exclusively campus systems.</w:t>
+      </w:r>
+    </w:p>
+    <w:bookmarkEnd w:id="35"/>
+    <w:bookmarkStart w:id="36" w:name="perceived-learning-and-internet-speed"/>
+    <w:p>
+      <w:pPr>
+        <w:pStyle w:val="Heading3"/>
+      </w:pPr>
+      <w:r>
+        <w:t xml:space="preserve">4.3 Perceived learning and internet speed</w:t>
       </w:r>
     </w:p>
     <w:p>
       <w:pPr>
-        <w:pStyle w:val="BodyText"/>
-      </w:pPr>
-      <w:r>
-        <w:t xml:space="preserve">When emergency remote teaching copies the campus system off campus, the official classroom may sit on an application the student cannot enter.</w:t>
-      </w:r>
-    </w:p>
-    <w:bookmarkEnd w:id="36"/>
-    <w:bookmarkStart w:id="37" w:name="interaction-learning-appraisal-and-speed"/>
-    <w:p>
-      <w:pPr>
-        <w:pStyle w:val="Heading3"/>
-      </w:pPr>
-      <w:r>
-        <w:t xml:space="preserve">5.4 Interaction, learning appraisal, and speed</w:t>
+        <w:pStyle w:val="FirstParagraph"/>
+      </w:pPr>
+      <w:r>
+        <w:t xml:space="preserve">Active interaction with the teacher</w:t>
+      </w:r>
+      <w:r>
+        <w:t xml:space="preserve"> </w:t>
+      </w:r>
+      <w:r>
+        <w:t xml:space="preserve">“</w:t>
+      </w:r>
+      <w:r>
+        <w:t xml:space="preserve">very much</w:t>
+      </w:r>
+      <w:r>
+        <w:t xml:space="preserve">”</w:t>
+      </w:r>
+      <w:r>
+        <w:t xml:space="preserve"> </w:t>
+      </w:r>
+      <w:r>
+        <w:t xml:space="preserve">was reported by 6 of 38 (15.8%). Classroom talk, when ticked, was mainly dialogue (76.3%) and question and answer (57.9%). Role-play was rare (7.9%).</w:t>
       </w:r>
     </w:p>
     <w:p>
       <w:pPr>
-        <w:pStyle w:val="FirstParagraph"/>
-      </w:pPr>
-      <w:r>
-        <w:t xml:space="preserve">Very high stress was reported by 14 of 38 (36.8%). Active interaction with the teacher</w:t>
+        <w:pStyle w:val="BodyText"/>
+      </w:pPr>
+      <w:r>
+        <w:t xml:space="preserve">On the appraisal items, 18.4% said they could learn</w:t>
       </w:r>
       <w:r>
         <w:t xml:space="preserve"> </w:t>
@@ -2917,7 +2616,7 @@
         <w:t xml:space="preserve">“</w:t>
       </w:r>
       <w:r>
-        <w:t xml:space="preserve">very much</w:t>
+        <w:t xml:space="preserve">a lot</w:t>
       </w:r>
       <w:r>
         <w:t xml:space="preserve">”</w:t>
@@ -2926,56 +2625,10 @@
         <w:t xml:space="preserve"> </w:t>
       </w:r>
       <w:r>
-        <w:t xml:space="preserve">was reported by only 6 of 38 (15.8%); 11 of 38 (28.9%) said only a little or not at all. Classroom talk, when it happened, was mainly dialogue (76.3%) and question and answer (57.9%). Role-play was rare (7.9%). Those oral tasks most need a stable live channel.</w:t>
-      </w:r>
-    </w:p>
-    <w:p>
-      <w:pPr>
-        <w:pStyle w:val="BodyText"/>
-      </w:pPr>
-      <w:r>
-        <w:t xml:space="preserve">On the learning-appraisal items (α = .84), 18.4% said they could learn</w:t>
+        <w:t xml:space="preserve">online; 28.9% said little or nothing. Worse internet speed was associated with a worse appraisal index (ρ = .65,</w:t>
       </w:r>
       <w:r>
         <w:t xml:space="preserve"> </w:t>
-      </w:r>
-      <w:r>
-        <w:t xml:space="preserve">“</w:t>
-      </w:r>
-      <w:r>
-        <w:t xml:space="preserve">a lot</w:t>
-      </w:r>
-      <w:r>
-        <w:t xml:space="preserve">”</w:t>
-      </w:r>
-      <w:r>
-        <w:t xml:space="preserve"> </w:t>
-      </w:r>
-      <w:r>
-        <w:t xml:space="preserve">online; 28.9% said little or nothing. 15.8% said online study could improve Chinese</w:t>
-      </w:r>
-      <w:r>
-        <w:t xml:space="preserve"> </w:t>
-      </w:r>
-      <w:r>
-        <w:t xml:space="preserve">“</w:t>
-      </w:r>
-      <w:r>
-        <w:t xml:space="preserve">very much</w:t>
-      </w:r>
-      <w:r>
-        <w:t xml:space="preserve">”</w:t>
-      </w:r>
-      <w:r>
-        <w:t xml:space="preserve">; 10.5% said not at all. Five of 37 valid answers (13.5%) liked online classes very much.</w:t>
-      </w:r>
-    </w:p>
-    <w:p>
-      <w:pPr>
-        <w:pStyle w:val="BodyText"/>
-      </w:pPr>
-      <w:r>
-        <w:t xml:space="preserve">Worse internet speed tracked worse appraisal and thinner interaction (Table 4): ρ = .46 with learned less (</w:t>
       </w:r>
       <w:r>
         <w:rPr>
@@ -2988,7 +2641,10 @@
         <w:t xml:space="preserve"> </w:t>
       </w:r>
       <w:r>
-        <w:t xml:space="preserve">= .004), .64 with less improvement (</w:t>
+        <w:t xml:space="preserve">= .000009, bootstrap 95% CI [.36, .84]). A count of three infrastructure ticks (unstable network, power interruptions, no signal) was not associated with the index (ρ = .02,</w:t>
+      </w:r>
+      <w:r>
+        <w:t xml:space="preserve"> </w:t>
       </w:r>
       <w:r>
         <w:rPr>
@@ -3001,36 +2657,7 @@
         <w:t xml:space="preserve"> </w:t>
       </w:r>
       <w:r>
-        <w:t xml:space="preserve">&lt; .001), .65 with the three-item appraisal (</w:t>
-      </w:r>
-      <w:r>
-        <w:rPr>
-          <w:iCs/>
-          <w:i/>
-        </w:rPr>
-        <w:t xml:space="preserve">p</w:t>
-      </w:r>
-      <w:r>
-        <w:t xml:space="preserve"> </w:t>
-      </w:r>
-      <w:r>
-        <w:t xml:space="preserve">&lt; .001), .55 with less teacher interaction, and .60 with lower satisfaction with class time. A simple count of infrastructure problems (unstable network, no power, no signal) did not track appraisal (ρ = .02,</w:t>
-      </w:r>
-      <w:r>
-        <w:t xml:space="preserve"> </w:t>
-      </w:r>
-      <w:r>
-        <w:rPr>
-          <w:iCs/>
-          <w:i/>
-        </w:rPr>
-        <w:t xml:space="preserve">p</w:t>
-      </w:r>
-      <w:r>
-        <w:t xml:space="preserve"> </w:t>
-      </w:r>
-      <w:r>
-        <w:t xml:space="preserve">= .91). In this sample, speed of use matters; the number of problems ticked does not.</w:t>
+        <w:t xml:space="preserve">= .91, bootstrap 95% CI [−.32, .37]). In this file, reported speed co-occurred with appraisal; ticking several problems did not. These are rank associations, not effects of infrastructure on learning.</w:t>
       </w:r>
     </w:p>
     <w:p>
@@ -3038,7 +2665,7 @@
         <w:pStyle w:val="BodyText"/>
       </w:pPr>
       <w:r>
-        <w:t xml:space="preserve">Preferred live length was shorter than a typical campus Chinese class: 50% wanted 45 minutes and 28.9% wanted 30 minutes. One open comment refused the mode altogether: even one minute online was</w:t>
+        <w:t xml:space="preserve">Preferred live length was 45 minutes for 50% and 30 minutes for 28.9%. One open comment said that even one minute online was</w:t>
       </w:r>
       <w:r>
         <w:t xml:space="preserve"> </w:t>
@@ -3047,16 +2674,10 @@
         <w:t xml:space="preserve">“</w:t>
       </w:r>
       <w:r>
-        <w:t xml:space="preserve">not suitable,</w:t>
+        <w:t xml:space="preserve">not suitable.</w:t>
       </w:r>
       <w:r>
         <w:t xml:space="preserve">”</w:t>
-      </w:r>
-      <w:r>
-        <w:t xml:space="preserve"> </w:t>
-      </w:r>
-      <w:r>
-        <w:t xml:space="preserve">and China should bring students back.</w:t>
       </w:r>
     </w:p>
     <w:p>
@@ -3080,7 +2701,7 @@
           <w:iCs/>
           <w:i/>
         </w:rPr>
-        <w:t xml:space="preserve">Associations (Fisher’s exact and Spearman, N = 38)</w:t>
+        <w:t xml:space="preserve">Focal associations (N = 38)</w:t>
       </w:r>
     </w:p>
     <w:tbl>
@@ -3118,7 +2739,7 @@
               <w:jc w:val="left"/>
             </w:pPr>
             <w:r>
-              <w:t xml:space="preserve">Cell counts / statistic</w:t>
+              <w:t xml:space="preserve">Result</w:t>
             </w:r>
           </w:p>
         </w:tc>
@@ -3144,7 +2765,7 @@
               <w:jc w:val="left"/>
             </w:pPr>
             <w:r>
-              <w:t xml:space="preserve">11/14 vs 3/24; Fisher</w:t>
+              <w:t xml:space="preserve">11/14 vs 3/24; Fisher’s exact</w:t>
             </w:r>
             <w:r>
               <w:t xml:space="preserve"> </w:t>
@@ -3160,7 +2781,7 @@
               <w:t xml:space="preserve"> </w:t>
             </w:r>
             <w:r>
-              <w:t xml:space="preserve">&lt; .001, φ = .66; OR = 25.67, 95% CI [4.42, 149.00]</w:t>
+              <w:t xml:space="preserve">= .00008</w:t>
             </w:r>
           </w:p>
         </w:tc>
@@ -3174,7 +2795,7 @@
               <w:jc w:val="left"/>
             </w:pPr>
             <w:r>
-              <w:t xml:space="preserve">Female × online cannot replace campus</w:t>
+              <w:t xml:space="preserve">Speed (worse) × appraisal index (worse)</w:t>
             </w:r>
           </w:p>
         </w:tc>
@@ -3186,7 +2807,7 @@
               <w:jc w:val="left"/>
             </w:pPr>
             <w:r>
-              <w:t xml:space="preserve">9/11 vs 10/27; Fisher</w:t>
+              <w:t xml:space="preserve">ρ = .65, bootstrap 95% CI [.36, .84],</w:t>
             </w:r>
             <w:r>
               <w:t xml:space="preserve"> </w:t>
@@ -3202,7 +2823,7 @@
               <w:t xml:space="preserve"> </w:t>
             </w:r>
             <w:r>
-              <w:t xml:space="preserve">= .029, φ = .41; OR = 7.65, 95% CI [1.37, 42.71]</w:t>
+              <w:t xml:space="preserve">= .000009</w:t>
             </w:r>
           </w:p>
         </w:tc>
@@ -3216,7 +2837,7 @@
               <w:jc w:val="left"/>
             </w:pPr>
             <w:r>
-              <w:t xml:space="preserve">Learned little/nothing × cannot replace</w:t>
+              <w:t xml:space="preserve">Infrastructure-problem count × appraisal index</w:t>
             </w:r>
           </w:p>
         </w:tc>
@@ -3228,175 +2849,7 @@
               <w:jc w:val="left"/>
             </w:pPr>
             <w:r>
-              <w:t xml:space="preserve">9/11 vs 10/27; Fisher</w:t>
-            </w:r>
-            <w:r>
-              <w:t xml:space="preserve"> </w:t>
-            </w:r>
-            <w:r>
-              <w:rPr>
-                <w:iCs/>
-                <w:i/>
-              </w:rPr>
-              <w:t xml:space="preserve">p</w:t>
-            </w:r>
-            <w:r>
-              <w:t xml:space="preserve"> </w:t>
-            </w:r>
-            <w:r>
-              <w:t xml:space="preserve">= .029, φ = .41; OR = 7.65, 95% CI [1.37, 42.71]</w:t>
-            </w:r>
-          </w:p>
-        </w:tc>
-      </w:tr>
-      <w:tr>
-        <w:tc>
-          <w:tcPr/>
-          <w:p>
-            <w:pPr>
-              <w:pStyle w:val="Compact"/>
-              <w:jc w:val="left"/>
-            </w:pPr>
-            <w:r>
-              <w:t xml:space="preserve">Poor internet × cannot replace</w:t>
-            </w:r>
-          </w:p>
-        </w:tc>
-        <w:tc>
-          <w:tcPr/>
-          <w:p>
-            <w:pPr>
-              <w:pStyle w:val="Compact"/>
-              <w:jc w:val="left"/>
-            </w:pPr>
-            <w:r>
-              <w:t xml:space="preserve">8/10 vs 11/28; Fisher</w:t>
-            </w:r>
-            <w:r>
-              <w:t xml:space="preserve"> </w:t>
-            </w:r>
-            <w:r>
-              <w:rPr>
-                <w:iCs/>
-                <w:i/>
-              </w:rPr>
-              <w:t xml:space="preserve">p</w:t>
-            </w:r>
-            <w:r>
-              <w:t xml:space="preserve"> </w:t>
-            </w:r>
-            <w:r>
-              <w:t xml:space="preserve">= .062, φ = .36; OR = 6.18, 95% CI [1.10, 34.70]</w:t>
-            </w:r>
-          </w:p>
-        </w:tc>
-      </w:tr>
-      <w:tr>
-        <w:tc>
-          <w:tcPr/>
-          <w:p>
-            <w:pPr>
-              <w:pStyle w:val="Compact"/>
-              <w:jc w:val="left"/>
-            </w:pPr>
-            <w:r>
-              <w:t xml:space="preserve">Speed (worse) × learning appraisal (worse)</w:t>
-            </w:r>
-          </w:p>
-        </w:tc>
-        <w:tc>
-          <w:tcPr/>
-          <w:p>
-            <w:pPr>
-              <w:pStyle w:val="Compact"/>
-              <w:jc w:val="left"/>
-            </w:pPr>
-            <w:r>
-              <w:t xml:space="preserve">ρ = .65,</w:t>
-            </w:r>
-            <w:r>
-              <w:t xml:space="preserve"> </w:t>
-            </w:r>
-            <w:r>
-              <w:rPr>
-                <w:iCs/>
-                <w:i/>
-              </w:rPr>
-              <w:t xml:space="preserve">p</w:t>
-            </w:r>
-            <w:r>
-              <w:t xml:space="preserve"> </w:t>
-            </w:r>
-            <w:r>
-              <w:t xml:space="preserve">&lt; .001</w:t>
-            </w:r>
-          </w:p>
-        </w:tc>
-      </w:tr>
-      <w:tr>
-        <w:tc>
-          <w:tcPr/>
-          <w:p>
-            <w:pPr>
-              <w:pStyle w:val="Compact"/>
-              <w:jc w:val="left"/>
-            </w:pPr>
-            <w:r>
-              <w:t xml:space="preserve">Speed × teacher interaction (less)</w:t>
-            </w:r>
-          </w:p>
-        </w:tc>
-        <w:tc>
-          <w:tcPr/>
-          <w:p>
-            <w:pPr>
-              <w:pStyle w:val="Compact"/>
-              <w:jc w:val="left"/>
-            </w:pPr>
-            <w:r>
-              <w:t xml:space="preserve">ρ = .55,</w:t>
-            </w:r>
-            <w:r>
-              <w:t xml:space="preserve"> </w:t>
-            </w:r>
-            <w:r>
-              <w:rPr>
-                <w:iCs/>
-                <w:i/>
-              </w:rPr>
-              <w:t xml:space="preserve">p</w:t>
-            </w:r>
-            <w:r>
-              <w:t xml:space="preserve"> </w:t>
-            </w:r>
-            <w:r>
-              <w:t xml:space="preserve">&lt; .001</w:t>
-            </w:r>
-          </w:p>
-        </w:tc>
-      </w:tr>
-      <w:tr>
-        <w:tc>
-          <w:tcPr/>
-          <w:p>
-            <w:pPr>
-              <w:pStyle w:val="Compact"/>
-              <w:jc w:val="left"/>
-            </w:pPr>
-            <w:r>
-              <w:t xml:space="preserve">Infrastructure-problem count × learning appraisal</w:t>
-            </w:r>
-          </w:p>
-        </w:tc>
-        <w:tc>
-          <w:tcPr/>
-          <w:p>
-            <w:pPr>
-              <w:pStyle w:val="Compact"/>
-              <w:jc w:val="left"/>
-            </w:pPr>
-            <w:r>
-              <w:t xml:space="preserve">ρ = .02,</w:t>
+              <w:t xml:space="preserve">ρ = .02, bootstrap 95% CI [−.32, .37],</w:t>
             </w:r>
             <w:r>
               <w:t xml:space="preserve"> </w:t>
@@ -3433,25 +2886,15 @@
         <w:t xml:space="preserve"> </w:t>
       </w:r>
       <w:r>
-        <w:t xml:space="preserve">Higher speed and learning-appraisal scores are more negative. Odds ratios summarise the 2×2 counts in this sample; the intervals are too wide for population inference. The female × cannot-replace row and the learned-little × cannot-replace row have the same OR by coincidence (both tables are 17/10 versus 2/9); they are not the same test.</w:t>
-      </w:r>
-    </w:p>
-    <w:bookmarkEnd w:id="37"/>
-    <w:bookmarkStart w:id="38" w:name="could-online-chinese-replace-the-campus"/>
-    <w:p>
-      <w:pPr>
-        <w:pStyle w:val="Heading3"/>
-      </w:pPr>
-      <w:r>
-        <w:t xml:space="preserve">5.5 Could online Chinese replace the campus?</w:t>
+        <w:t xml:space="preserve">Analyses are exploratory. Odds ratios are omitted.</w:t>
       </w:r>
     </w:p>
     <w:p>
       <w:pPr>
-        <w:pStyle w:val="FirstParagraph"/>
-      </w:pPr>
-      <w:r>
-        <w:t xml:space="preserve">Nineteen of 38 said online study could replace campus classes and 19 said it could not. Among women, 9 of 11 said it cannot; among men, 10 of 27 said so (Fisher</w:t>
+        <w:pStyle w:val="BodyText"/>
+      </w:pPr>
+      <w:r>
+        <w:t xml:space="preserve">Among Pakistani-nationality respondents only (n = 37), the home–stress table remained 11/14 versus 3/23 (Fisher’s exact</w:t>
       </w:r>
       <w:r>
         <w:t xml:space="preserve"> </w:t>
@@ -3467,20 +2910,68 @@
         <w:t xml:space="preserve"> </w:t>
       </w:r>
       <w:r>
-        <w:t xml:space="preserve">= .029, φ = .41). Those who learned little or nothing more often said it cannot replace campus. Among those with poor internet, 8 of 10 said it cannot, versus 11 of 28 of the rest (</w:t>
+        <w:t xml:space="preserve">= .00011) and speed × appraisal was ρ = .67 (bootstrap 95% CI [.39, .85]).</w:t>
+      </w:r>
+    </w:p>
+    <w:bookmarkEnd w:id="36"/>
+    <w:bookmarkStart w:id="37" w:name="X97201ae18f9cce7e94bf1bc756e03fa139ac895"/>
+    <w:p>
+      <w:pPr>
+        <w:pStyle w:val="Heading3"/>
+      </w:pPr>
+      <w:r>
+        <w:t xml:space="preserve">4.4 Replacement judgement (secondary gender note)</w:t>
+      </w:r>
+    </w:p>
+    <w:p>
+      <w:pPr>
+        <w:pStyle w:val="FirstParagraph"/>
+      </w:pPr>
+      <w:r>
+        <w:t xml:space="preserve">Nineteen of 38 said online study could replace campus classes and 19 said it could not. Among women, 9 of 11 said it could not; among men, 10 of 27 said so. With 11 women this is a cautious exploratory observation of perceived legitimacy in this sample. It is not a gender finding about Pakistani households and is not treated as a focal test (Appendix B).</w:t>
+      </w:r>
+    </w:p>
+    <w:bookmarkEnd w:id="37"/>
+    <w:bookmarkEnd w:id="38"/>
+    <w:bookmarkStart w:id="39" w:name="discussion"/>
+    <w:p>
+      <w:pPr>
+        <w:pStyle w:val="Heading2"/>
+      </w:pPr>
+      <w:r>
+        <w:t xml:space="preserve">5. Discussion</w:t>
+      </w:r>
+    </w:p>
+    <w:p>
+      <w:pPr>
+        <w:pStyle w:val="FirstParagraph"/>
+      </w:pPr>
+      <w:r>
+        <w:t xml:space="preserve">This historically situated file suggests a possible delivery-context mismatch: a travelling Chinese-university language course was reported alongside household power and network problems and uneven access to applications often used in Chinese higher education. Localisation of content and materials remains necessary (Zhao, 2020; Lu et al., 2024). In this sample, those layers would not have addressed the live hour that respondents associated with an unstable connection or an application marked unusable.</w:t>
+      </w:r>
+    </w:p>
+    <w:p>
+      <w:pPr>
+        <w:pStyle w:val="BodyText"/>
+      </w:pPr>
+      <w:r>
+        <w:t xml:space="preserve">Based on these findings, possible design considerations—not established solutions—include shorter or asynchronous oral alternatives, assessment that does not assume a campus oral hour, and a required platform that respondents can open. WhatsApp was marked available here; it was not recorded as used for class. The findings do not show that later hybrid ICLE has repeated this pattern. They suggest that hybrid models</w:t>
+      </w:r>
+      <w:r>
+        <w:t xml:space="preserve"> </w:t>
       </w:r>
       <w:r>
         <w:rPr>
           <w:iCs/>
           <w:i/>
         </w:rPr>
-        <w:t xml:space="preserve">p</w:t>
+        <w:t xml:space="preserve">may</w:t>
       </w:r>
       <w:r>
         <w:t xml:space="preserve"> </w:t>
       </w:r>
       <w:r>
-        <w:t xml:space="preserve">= .062). Table 4 again prints odds ratios only as a compact summary of those counts.</w:t>
+        <w:t xml:space="preserve">reproduce a similar mismatch if delivery assumptions are not examined (Stockwell &amp; Wang, 2023).</w:t>
       </w:r>
     </w:p>
     <w:p>
@@ -3488,41 +2979,47 @@
         <w:pStyle w:val="BodyText"/>
       </w:pPr>
       <w:r>
-        <w:t xml:space="preserve">Mann-Whitney tests on the ordinals by gender were non-significant. The observed difference is not that women scored as having learned less. In this sample, women more often refused to treat online Chinese as a campus substitute. With 11 women, that pattern may indicate different perceptions of online legitimacy here; it does not establish that women experienced online learning differently, and it requires investigation with larger and more balanced samples.</w:t>
+        <w:t xml:space="preserve">Participation in this file co-occurred with reported platform access, power and connectivity problems, and a home environment that many described as not quiet. That is a description of domestic participation conditions, not a claim that inequality is</w:t>
+      </w:r>
+      <w:r>
+        <w:t xml:space="preserve"> </w:t>
+      </w:r>
+      <w:r>
+        <w:t xml:space="preserve">“</w:t>
+      </w:r>
+      <w:r>
+        <w:t xml:space="preserve">cultural.</w:t>
+      </w:r>
+      <w:r>
+        <w:t xml:space="preserve">”</w:t>
+      </w:r>
+    </w:p>
+    <w:bookmarkEnd w:id="39"/>
+    <w:bookmarkStart w:id="40" w:name="limitations"/>
+    <w:p>
+      <w:pPr>
+        <w:pStyle w:val="Heading2"/>
+      </w:pPr>
+      <w:r>
+        <w:t xml:space="preserve">6. Limitations</w:t>
       </w:r>
     </w:p>
     <w:p>
       <w:pPr>
-        <w:pStyle w:val="BodyText"/>
-      </w:pPr>
-      <w:r>
-        <w:t xml:space="preserve">A second pattern sits beside that refusal: 19 of 27 men (70.4%) were working while studying, against 3 of 11 women (27.3%) (Fisher</w:t>
-      </w:r>
-      <w:r>
-        <w:t xml:space="preserve"> </w:t>
-      </w:r>
-      <w:r>
-        <w:rPr>
-          <w:iCs/>
-          <w:i/>
-        </w:rPr>
-        <w:t xml:space="preserve">p</w:t>
-      </w:r>
-      <w:r>
-        <w:t xml:space="preserve"> </w:t>
-      </w:r>
-      <w:r>
-        <w:t xml:space="preserve">= .028). Both counts are signals in a male-majority convenience sample, not a gender analysis of Pakistani households.</w:t>
+        <w:pStyle w:val="FirstParagraph"/>
+      </w:pPr>
+      <w:r>
+        <w:t xml:space="preserve">The sample is small (N = 38), network-recruited, and majority male. Recruitment channel, host university, programme type, and place of residence that week were not recorded. IP metadata are not a location measure. All outcomes are self-report. The appraisal index is descriptive, not a validated scale. The form did not measure institutional adaptation, so localisation of delivery is a conceptual reading of student-side conditions. Data are from February 2022 and concern emergency remote teaching. They are not evidence about current hybrid education. No ethics-committee number is available for the 2022 collection (Section 3.6).</w:t>
       </w:r>
     </w:p>
-    <w:bookmarkEnd w:id="38"/>
-    <w:bookmarkStart w:id="39" w:name="sensitivity"/>
+    <w:bookmarkEnd w:id="40"/>
+    <w:bookmarkStart w:id="41" w:name="conclusion"/>
     <w:p>
       <w:pPr>
-        <w:pStyle w:val="Heading3"/>
-      </w:pPr>
-      <w:r>
-        <w:t xml:space="preserve">5.6 Sensitivity</w:t>
+        <w:pStyle w:val="Heading2"/>
+      </w:pPr>
+      <w:r>
+        <w:t xml:space="preserve">7. Conclusion</w:t>
       </w:r>
     </w:p>
     <w:p>
@@ -3530,63 +3027,25 @@
         <w:pStyle w:val="FirstParagraph"/>
       </w:pPr>
       <w:r>
-        <w:t xml:space="preserve">Table 5 repeats the two focal tests. Among Pakistani respondents only (n = 37), unstable networks remained 75.7% and power cuts 43.2%; the home-stress association remained</w:t>
-      </w:r>
-      <w:r>
-        <w:t xml:space="preserve"> </w:t>
-      </w:r>
-      <w:r>
-        <w:rPr>
-          <w:iCs/>
-          <w:i/>
-        </w:rPr>
-        <w:t xml:space="preserve">p</w:t>
-      </w:r>
-      <w:r>
-        <w:t xml:space="preserve"> </w:t>
-      </w:r>
-      <w:r>
-        <w:t xml:space="preserve">&lt; .001 and speed × appraisal was ρ = .67. Among responses whose IP was not labelled mainland China (n = 29), the same figures were 75.9%, 41.4%,</w:t>
-      </w:r>
-      <w:r>
-        <w:t xml:space="preserve"> </w:t>
-      </w:r>
-      <w:r>
-        <w:rPr>
-          <w:iCs/>
-          <w:i/>
-        </w:rPr>
-        <w:t xml:space="preserve">p</w:t>
-      </w:r>
-      <w:r>
-        <w:t xml:space="preserve"> </w:t>
-      </w:r>
-      <w:r>
-        <w:t xml:space="preserve">&lt; .001, and ρ = .70. Restricting the sample does not reverse the associations.</w:t>
+        <w:t xml:space="preserve">In this exploratory emergency-remote-teaching sample of mainly Pakistani Chinese-university language students, reported household infrastructure and platform access co-occurred with very high stress and with more negative perceived-learning appraisal. The conceptual suggestion is that ICLE localisation may need to include delivery-context fit—time, platform, task, participation mode, and assessment—as well as content adaptation. That suggestion is bounded by N = 38 and by a 2022 file.</w:t>
+      </w:r>
+    </w:p>
+    <w:bookmarkEnd w:id="41"/>
+    <w:bookmarkStart w:id="42" w:name="appendix-a.-appraisal-items-and-coding"/>
+    <w:p>
+      <w:pPr>
+        <w:pStyle w:val="Heading2"/>
+      </w:pPr>
+      <w:r>
+        <w:t xml:space="preserve">Appendix A. Appraisal items and coding</w:t>
       </w:r>
     </w:p>
     <w:p>
       <w:pPr>
-        <w:pStyle w:val="BodyText"/>
-      </w:pPr>
-      <w:r>
-        <w:rPr>
-          <w:bCs/>
-          <w:b/>
-        </w:rPr>
-        <w:t xml:space="preserve">Table 5</w:t>
-      </w:r>
-    </w:p>
-    <w:p>
-      <w:pPr>
-        <w:pStyle w:val="BodyText"/>
-      </w:pPr>
-      <w:r>
-        <w:rPr>
-          <w:iCs/>
-          <w:i/>
-        </w:rPr>
-        <w:t xml:space="preserve">Sensitivity: same associations in restricted samples</w:t>
+        <w:pStyle w:val="FirstParagraph"/>
+      </w:pPr>
+      <w:r>
+        <w:t xml:space="preserve">English glosses of the Chinese stems.</w:t>
       </w:r>
     </w:p>
     <w:tbl>
@@ -3597,12 +3056,10 @@
         <w:jc w:val="start"/>
       </w:tblPr>
       <w:tblGrid>
-        <w:gridCol w:w="1131"/>
-        <w:gridCol w:w="1508"/>
-        <w:gridCol w:w="1508"/>
-        <w:gridCol w:w="1508"/>
-        <w:gridCol w:w="1131"/>
-        <w:gridCol w:w="1131"/>
+        <w:gridCol w:w="1980"/>
+        <w:gridCol w:w="1980"/>
+        <w:gridCol w:w="1980"/>
+        <w:gridCol w:w="1980"/>
       </w:tblGrid>
       <w:tr>
         <w:trPr>
@@ -3616,43 +3073,7 @@
               <w:jc w:val="left"/>
             </w:pPr>
             <w:r>
-              <w:t xml:space="preserve">Sample</w:t>
-            </w:r>
-          </w:p>
-        </w:tc>
-        <w:tc>
-          <w:tcPr/>
-          <w:p>
-            <w:pPr>
-              <w:pStyle w:val="Compact"/>
-              <w:jc w:val="right"/>
-            </w:pPr>
-            <w:r>
-              <w:t xml:space="preserve">n</w:t>
-            </w:r>
-          </w:p>
-        </w:tc>
-        <w:tc>
-          <w:tcPr/>
-          <w:p>
-            <w:pPr>
-              <w:pStyle w:val="Compact"/>
-              <w:jc w:val="right"/>
-            </w:pPr>
-            <w:r>
-              <w:t xml:space="preserve">Unstable net %</w:t>
-            </w:r>
-          </w:p>
-        </w:tc>
-        <w:tc>
-          <w:tcPr/>
-          <w:p>
-            <w:pPr>
-              <w:pStyle w:val="Compact"/>
-              <w:jc w:val="right"/>
-            </w:pPr>
-            <w:r>
-              <w:t xml:space="preserve">No power %</w:t>
+              <w:t xml:space="preserve">Item</w:t>
             </w:r>
           </w:p>
         </w:tc>
@@ -3664,7 +3085,7 @@
               <w:jc w:val="left"/>
             </w:pPr>
             <w:r>
-              <w:t xml:space="preserve">Home × high stress</w:t>
+              <w:t xml:space="preserve">Stem (gloss)</w:t>
             </w:r>
           </w:p>
         </w:tc>
@@ -3676,7 +3097,19 @@
               <w:jc w:val="left"/>
             </w:pPr>
             <w:r>
-              <w:t xml:space="preserve">Speed × appraisal</w:t>
+              <w:t xml:space="preserve">1</w:t>
+            </w:r>
+          </w:p>
+        </w:tc>
+        <w:tc>
+          <w:tcPr/>
+          <w:p>
+            <w:pPr>
+              <w:pStyle w:val="Compact"/>
+              <w:jc w:val="left"/>
+            </w:pPr>
+            <w:r>
+              <w:t xml:space="preserve">Higher</w:t>
             </w:r>
           </w:p>
         </w:tc>
@@ -3690,43 +3123,7 @@
               <w:jc w:val="left"/>
             </w:pPr>
             <w:r>
-              <w:t xml:space="preserve">Full sample</w:t>
-            </w:r>
-          </w:p>
-        </w:tc>
-        <w:tc>
-          <w:tcPr/>
-          <w:p>
-            <w:pPr>
-              <w:pStyle w:val="Compact"/>
-              <w:jc w:val="right"/>
-            </w:pPr>
-            <w:r>
-              <w:t xml:space="preserve">38</w:t>
-            </w:r>
-          </w:p>
-        </w:tc>
-        <w:tc>
-          <w:tcPr/>
-          <w:p>
-            <w:pPr>
-              <w:pStyle w:val="Compact"/>
-              <w:jc w:val="right"/>
-            </w:pPr>
-            <w:r>
-              <w:t xml:space="preserve">76.3</w:t>
-            </w:r>
-          </w:p>
-        </w:tc>
-        <w:tc>
-          <w:tcPr/>
-          <w:p>
-            <w:pPr>
-              <w:pStyle w:val="Compact"/>
-              <w:jc w:val="right"/>
-            </w:pPr>
-            <w:r>
-              <w:t xml:space="preserve">42.1</w:t>
+              <w:t xml:space="preserve">Learned (Q8)</w:t>
             </w:r>
           </w:p>
         </w:tc>
@@ -3738,17 +3135,7 @@
               <w:jc w:val="left"/>
             </w:pPr>
             <w:r>
-              <w:rPr>
-                <w:iCs/>
-                <w:i/>
-              </w:rPr>
-              <w:t xml:space="preserve">p</w:t>
-            </w:r>
-            <w:r>
-              <w:t xml:space="preserve"> </w:t>
-            </w:r>
-            <w:r>
-              <w:t xml:space="preserve">&lt; .001</w:t>
+              <w:t xml:space="preserve">Can you learn a lot in online class?</w:t>
             </w:r>
           </w:p>
         </w:tc>
@@ -3760,7 +3147,19 @@
               <w:jc w:val="left"/>
             </w:pPr>
             <w:r>
-              <w:t xml:space="preserve">ρ = .65</w:t>
+              <w:t xml:space="preserve">a lot</w:t>
+            </w:r>
+          </w:p>
+        </w:tc>
+        <w:tc>
+          <w:tcPr/>
+          <w:p>
+            <w:pPr>
+              <w:pStyle w:val="Compact"/>
+              <w:jc w:val="left"/>
+            </w:pPr>
+            <w:r>
+              <w:t xml:space="preserve">worse appraisal</w:t>
             </w:r>
           </w:p>
         </w:tc>
@@ -3774,43 +3173,7 @@
               <w:jc w:val="left"/>
             </w:pPr>
             <w:r>
-              <w:t xml:space="preserve">Pakistani only</w:t>
-            </w:r>
-          </w:p>
-        </w:tc>
-        <w:tc>
-          <w:tcPr/>
-          <w:p>
-            <w:pPr>
-              <w:pStyle w:val="Compact"/>
-              <w:jc w:val="right"/>
-            </w:pPr>
-            <w:r>
-              <w:t xml:space="preserve">37</w:t>
-            </w:r>
-          </w:p>
-        </w:tc>
-        <w:tc>
-          <w:tcPr/>
-          <w:p>
-            <w:pPr>
-              <w:pStyle w:val="Compact"/>
-              <w:jc w:val="right"/>
-            </w:pPr>
-            <w:r>
-              <w:t xml:space="preserve">75.7</w:t>
-            </w:r>
-          </w:p>
-        </w:tc>
-        <w:tc>
-          <w:tcPr/>
-          <w:p>
-            <w:pPr>
-              <w:pStyle w:val="Compact"/>
-              <w:jc w:val="right"/>
-            </w:pPr>
-            <w:r>
-              <w:t xml:space="preserve">43.2</w:t>
+              <w:t xml:space="preserve">Improve (Q9)</w:t>
             </w:r>
           </w:p>
         </w:tc>
@@ -3822,17 +3185,7 @@
               <w:jc w:val="left"/>
             </w:pPr>
             <w:r>
-              <w:rPr>
-                <w:iCs/>
-                <w:i/>
-              </w:rPr>
-              <w:t xml:space="preserve">p</w:t>
-            </w:r>
-            <w:r>
-              <w:t xml:space="preserve"> </w:t>
-            </w:r>
-            <w:r>
-              <w:t xml:space="preserve">&lt; .001</w:t>
+              <w:t xml:space="preserve">Can online study improve Chinese?</w:t>
             </w:r>
           </w:p>
         </w:tc>
@@ -3844,7 +3197,19 @@
               <w:jc w:val="left"/>
             </w:pPr>
             <w:r>
-              <w:t xml:space="preserve">ρ = .67</w:t>
+              <w:t xml:space="preserve">very much</w:t>
+            </w:r>
+          </w:p>
+        </w:tc>
+        <w:tc>
+          <w:tcPr/>
+          <w:p>
+            <w:pPr>
+              <w:pStyle w:val="Compact"/>
+              <w:jc w:val="left"/>
+            </w:pPr>
+            <w:r>
+              <w:t xml:space="preserve">worse appraisal</w:t>
             </w:r>
           </w:p>
         </w:tc>
@@ -3858,43 +3223,7 @@
               <w:jc w:val="left"/>
             </w:pPr>
             <w:r>
-              <w:t xml:space="preserve">IP not in mainland China</w:t>
-            </w:r>
-          </w:p>
-        </w:tc>
-        <w:tc>
-          <w:tcPr/>
-          <w:p>
-            <w:pPr>
-              <w:pStyle w:val="Compact"/>
-              <w:jc w:val="right"/>
-            </w:pPr>
-            <w:r>
-              <w:t xml:space="preserve">29</w:t>
-            </w:r>
-          </w:p>
-        </w:tc>
-        <w:tc>
-          <w:tcPr/>
-          <w:p>
-            <w:pPr>
-              <w:pStyle w:val="Compact"/>
-              <w:jc w:val="right"/>
-            </w:pPr>
-            <w:r>
-              <w:t xml:space="preserve">75.9</w:t>
-            </w:r>
-          </w:p>
-        </w:tc>
-        <w:tc>
-          <w:tcPr/>
-          <w:p>
-            <w:pPr>
-              <w:pStyle w:val="Compact"/>
-              <w:jc w:val="right"/>
-            </w:pPr>
-            <w:r>
-              <w:t xml:space="preserve">41.4</w:t>
+              <w:t xml:space="preserve">Interest (Q10)</w:t>
             </w:r>
           </w:p>
         </w:tc>
@@ -3906,17 +3235,7 @@
               <w:jc w:val="left"/>
             </w:pPr>
             <w:r>
-              <w:rPr>
-                <w:iCs/>
-                <w:i/>
-              </w:rPr>
-              <w:t xml:space="preserve">p</w:t>
-            </w:r>
-            <w:r>
-              <w:t xml:space="preserve"> </w:t>
-            </w:r>
-            <w:r>
-              <w:t xml:space="preserve">&lt; .001</w:t>
+              <w:t xml:space="preserve">Does it spark learning interest?</w:t>
             </w:r>
           </w:p>
         </w:tc>
@@ -3928,30 +3247,190 @@
               <w:jc w:val="left"/>
             </w:pPr>
             <w:r>
-              <w:t xml:space="preserve">ρ = .70</w:t>
+              <w:t xml:space="preserve">very much</w:t>
+            </w:r>
+          </w:p>
+        </w:tc>
+        <w:tc>
+          <w:tcPr/>
+          <w:p>
+            <w:pPr>
+              <w:pStyle w:val="Compact"/>
+              <w:jc w:val="left"/>
+            </w:pPr>
+            <w:r>
+              <w:t xml:space="preserve">worse appraisal</w:t>
+            </w:r>
+          </w:p>
+        </w:tc>
+      </w:tr>
+      <w:tr>
+        <w:tc>
+          <w:tcPr/>
+          <w:p>
+            <w:pPr>
+              <w:pStyle w:val="Compact"/>
+              <w:jc w:val="left"/>
+            </w:pPr>
+            <w:r>
+              <w:t xml:space="preserve">Speed (Q14)</w:t>
+            </w:r>
+          </w:p>
+        </w:tc>
+        <w:tc>
+          <w:tcPr/>
+          <w:p>
+            <w:pPr>
+              <w:pStyle w:val="Compact"/>
+              <w:jc w:val="left"/>
+            </w:pPr>
+            <w:r>
+              <w:t xml:space="preserve">Internet speed</w:t>
+            </w:r>
+          </w:p>
+        </w:tc>
+        <w:tc>
+          <w:tcPr/>
+          <w:p>
+            <w:pPr>
+              <w:pStyle w:val="Compact"/>
+              <w:jc w:val="left"/>
+            </w:pPr>
+            <w:r>
+              <w:t xml:space="preserve">very good</w:t>
+            </w:r>
+          </w:p>
+        </w:tc>
+        <w:tc>
+          <w:tcPr/>
+          <w:p>
+            <w:pPr>
+              <w:pStyle w:val="Compact"/>
+              <w:jc w:val="left"/>
+            </w:pPr>
+            <w:r>
+              <w:t xml:space="preserve">worse speed</w:t>
+            </w:r>
+          </w:p>
+        </w:tc>
+      </w:tr>
+      <w:tr>
+        <w:tc>
+          <w:tcPr/>
+          <w:p>
+            <w:pPr>
+              <w:pStyle w:val="Compact"/>
+              <w:jc w:val="left"/>
+            </w:pPr>
+            <w:r>
+              <w:t xml:space="preserve">Stress (Q24)</w:t>
+            </w:r>
+          </w:p>
+        </w:tc>
+        <w:tc>
+          <w:tcPr/>
+          <w:p>
+            <w:pPr>
+              <w:pStyle w:val="Compact"/>
+              <w:jc w:val="left"/>
+            </w:pPr>
+            <w:r>
+              <w:t xml:space="preserve">Psychological stress</w:t>
+            </w:r>
+          </w:p>
+        </w:tc>
+        <w:tc>
+          <w:tcPr/>
+          <w:p>
+            <w:pPr>
+              <w:pStyle w:val="Compact"/>
+              <w:jc w:val="left"/>
+            </w:pPr>
+            <w:r>
+              <w:t xml:space="preserve">very high</w:t>
+            </w:r>
+          </w:p>
+        </w:tc>
+        <w:tc>
+          <w:tcPr/>
+          <w:p>
+            <w:pPr>
+              <w:pStyle w:val="Compact"/>
+              <w:jc w:val="left"/>
+            </w:pPr>
+            <w:r>
+              <w:t xml:space="preserve">less stress</w:t>
+            </w:r>
+          </w:p>
+        </w:tc>
+      </w:tr>
+      <w:tr>
+        <w:tc>
+          <w:tcPr/>
+          <w:p>
+            <w:pPr>
+              <w:pStyle w:val="Compact"/>
+              <w:jc w:val="left"/>
+            </w:pPr>
+            <w:r>
+              <w:t xml:space="preserve">Interaction (Q25)</w:t>
+            </w:r>
+          </w:p>
+        </w:tc>
+        <w:tc>
+          <w:tcPr/>
+          <w:p>
+            <w:pPr>
+              <w:pStyle w:val="Compact"/>
+              <w:jc w:val="left"/>
+            </w:pPr>
+            <w:r>
+              <w:t xml:space="preserve">Active interaction with teacher</w:t>
+            </w:r>
+          </w:p>
+        </w:tc>
+        <w:tc>
+          <w:tcPr/>
+          <w:p>
+            <w:pPr>
+              <w:pStyle w:val="Compact"/>
+              <w:jc w:val="left"/>
+            </w:pPr>
+            <w:r>
+              <w:t xml:space="preserve">very much</w:t>
+            </w:r>
+          </w:p>
+        </w:tc>
+        <w:tc>
+          <w:tcPr/>
+          <w:p>
+            <w:pPr>
+              <w:pStyle w:val="Compact"/>
+              <w:jc w:val="left"/>
+            </w:pPr>
+            <w:r>
+              <w:t xml:space="preserve">thinner interaction</w:t>
             </w:r>
           </w:p>
         </w:tc>
       </w:tr>
     </w:tbl>
-    <w:bookmarkEnd w:id="39"/>
-    <w:bookmarkEnd w:id="40"/>
-    <w:bookmarkStart w:id="45" w:name="discussion"/>
     <w:p>
       <w:pPr>
+        <w:pStyle w:val="BodyText"/>
+      </w:pPr>
+      <w:r>
+        <w:t xml:space="preserve">Index = mean of Q8, Q9, and Q10 (n = 38; no missing on these three).</w:t>
+      </w:r>
+    </w:p>
+    <w:bookmarkEnd w:id="42"/>
+    <w:bookmarkStart w:id="43" w:name="appendix-b.-secondary-statistics"/>
+    <w:p>
+      <w:pPr>
         <w:pStyle w:val="Heading2"/>
       </w:pPr>
       <w:r>
-        <w:t xml:space="preserve">6. Discussion</w:t>
-      </w:r>
-    </w:p>
-    <w:bookmarkStart w:id="41" w:name="X5cbd96f703fc6484380751f917fe651016c4bb6"/>
-    <w:p>
-      <w:pPr>
-        <w:pStyle w:val="Heading3"/>
-      </w:pPr>
-      <w:r>
-        <w:t xml:space="preserve">6.1 Localising delivery when the campus course leaves campus</w:t>
+        <w:t xml:space="preserve">Appendix B. Secondary statistics</w:t>
       </w:r>
     </w:p>
     <w:p>
@@ -3959,15 +3438,22 @@
         <w:pStyle w:val="FirstParagraph"/>
       </w:pPr>
       <w:r>
-        <w:t xml:space="preserve">The primary contribution is to ICLE localisation. Chinese-university language programmes imagine a campus: a dormitory, a classroom, extra-curricular Chinese, and an HSK calendar. Emergency remote teaching kept the assessment plan and removed the campus for those who were offshore. In this sample, 11 of 14 students who said the home affected study very much also reported very high stress, against 3 of 24 others. Very high stress at 36.8% is not only pandemic psychology. It is also what happens when a travelling oral curriculum meets an unstable connection and a lively room (cf. MacIntyre et al., 2020). That count, not a population odds ratio, is the pattern we take forward.</w:t>
-      </w:r>
-    </w:p>
-    <w:p>
-      <w:pPr>
-        <w:pStyle w:val="BodyText"/>
-      </w:pPr>
-      <w:r>
-        <w:t xml:space="preserve">The finding does not show that hybrid ICLE after the pandemic has already failed. It suggests that hybrid models</w:t>
+        <w:t xml:space="preserve">See</w:t>
+      </w:r>
+      <w:r>
+        <w:t xml:space="preserve"> </w:t>
+      </w:r>
+      <w:r>
+        <w:rPr>
+          <w:rStyle w:val="VerbatimChar"/>
+        </w:rPr>
+        <w:t xml:space="preserve">analysis/supplementary_stats.md</w:t>
+      </w:r>
+      <w:r>
+        <w:t xml:space="preserve"> </w:t>
+      </w:r>
+      <w:r>
+        <w:t xml:space="preserve">for full tables. Summary: female × cannot-replace and learned-little × cannot-replace have identical cell counts (9/11 vs 10/27; Fisher’s exact</w:t>
       </w:r>
       <w:r>
         <w:t xml:space="preserve"> </w:t>
@@ -3977,100 +3463,13 @@
           <w:iCs/>
           <w:i/>
         </w:rPr>
-        <w:t xml:space="preserve">may</w:t>
+        <w:t xml:space="preserve">p</w:t>
       </w:r>
       <w:r>
         <w:t xml:space="preserve"> </w:t>
       </w:r>
       <w:r>
-        <w:t xml:space="preserve">reproduce a similar misalignment when they keep campus assumptions about login, hour, and room without asking whether those conditions hold (Moorhouse et al., 2023; Stockwell &amp; Wang, 2023). Before later digital practices such as generative AI become relevant for this corridor (Darvin, 2025), the class has to open, the current has to hold, and the house has to allow a voice.</w:t>
-      </w:r>
-    </w:p>
-    <w:bookmarkEnd w:id="41"/>
-    <w:bookmarkStart w:id="42" w:name="X3acea38e0eaa813d07faf5a60d129f027ed62fe"/>
-    <w:p>
-      <w:pPr>
-        <w:pStyle w:val="Heading3"/>
-      </w:pPr>
-      <w:r>
-        <w:t xml:space="preserve">6.2 Sequence, speed, and the geography of the login</w:t>
-      </w:r>
-    </w:p>
-    <w:p>
-      <w:pPr>
-        <w:pStyle w:val="FirstParagraph"/>
-      </w:pPr>
-      <w:r>
-        <w:t xml:space="preserve">The findings fit van Dijk’s order better than a single</w:t>
-      </w:r>
-      <w:r>
-        <w:t xml:space="preserve"> </w:t>
-      </w:r>
-      <w:r>
-        <w:t xml:space="preserve">“</w:t>
-      </w:r>
-      <w:r>
-        <w:t xml:space="preserve">poor internet</w:t>
-      </w:r>
-      <w:r>
-        <w:t xml:space="preserve">”</w:t>
-      </w:r>
-      <w:r>
-        <w:t xml:space="preserve"> </w:t>
-      </w:r>
-      <w:r>
-        <w:t xml:space="preserve">headline. Power and signal sit under speed. Speed tracks learning appraisal and interaction. A tally of infrastructure problems does not. Campus platforms sit in another country from the applications that actually open. Training teachers in Chaoxing breakout rooms addresses a layer many of these students could not enter. For this corridor the earlier layers are household electricity and whether the campus login opens on the phone the student has.</w:t>
-      </w:r>
-    </w:p>
-    <w:bookmarkEnd w:id="42"/>
-    <w:bookmarkStart w:id="43" w:name="Xfb4e9e4a4a0df2e0979990e8bb4ab49ea6f2118"/>
-    <w:p>
-      <w:pPr>
-        <w:pStyle w:val="Heading3"/>
-      </w:pPr>
-      <w:r>
-        <w:t xml:space="preserve">6.3 Thin participation, read without an investment scale</w:t>
-      </w:r>
-    </w:p>
-    <w:p>
-      <w:pPr>
-        <w:pStyle w:val="FirstParagraph"/>
-      </w:pPr>
-      <w:r>
-        <w:t xml:space="preserve">The two-layer model already accounts for most of the results: power and speed shaped appraisal; campus logins often failed; the home was associated with very high stress. Thin teacher interaction (only 15.8%</w:t>
-      </w:r>
-      <w:r>
-        <w:t xml:space="preserve"> </w:t>
-      </w:r>
-      <w:r>
-        <w:t xml:space="preserve">“</w:t>
-      </w:r>
-      <w:r>
-        <w:t xml:space="preserve">very much</w:t>
-      </w:r>
-      <w:r>
-        <w:t xml:space="preserve">”</w:t>
-      </w:r>
-      <w:r>
-        <w:t xml:space="preserve">) and the even split over whether online study counted as class are participation outcomes, not scores on identity or imagined return. Norton (2013) and Darvin and Norton (2023) offer one optional language for that refusal: a learner may still want Chinese and yet not treat a given class as worth the daily cost. We do not measure investment and we do not need that language to report the counts. Readers may treat this paragraph as optional. The observed gender difference on replacement is a perception of legitimacy in this sample (9 of 11 women; 10 of 27 men). It does not explain why, and it does not generalise to Pakistani women.</w:t>
-      </w:r>
-    </w:p>
-    <w:bookmarkEnd w:id="43"/>
-    <w:bookmarkStart w:id="44" w:name="X3f41d7067da38714b0f13e8cb605b5ccc918580"/>
-    <w:p>
-      <w:pPr>
-        <w:pStyle w:val="Heading3"/>
-      </w:pPr>
-      <w:r>
-        <w:t xml:space="preserve">6.4 What the localisation claim does and does not say</w:t>
-      </w:r>
-    </w:p>
-    <w:p>
-      <w:pPr>
-        <w:pStyle w:val="FirstParagraph"/>
-      </w:pPr>
-      <w:r>
-        <w:t xml:space="preserve">Localisation of content, materials, and curriculum construction (Zhao, 2020; Lu et al., 2024; Lam, 2024) remains necessary. Those questions belong in work on</w:t>
+        <w:t xml:space="preserve">= .029). Poor internet × cannot-replace: 8/10 vs 11/28, Fisher’s exact</w:t>
       </w:r>
       <w:r>
         <w:t xml:space="preserve"> </w:t>
@@ -4080,21 +3479,13 @@
           <w:iCs/>
           <w:i/>
         </w:rPr>
-        <w:t xml:space="preserve">HSK Standard Course</w:t>
+        <w:t xml:space="preserve">p</w:t>
       </w:r>
       <w:r>
         <w:t xml:space="preserve"> </w:t>
       </w:r>
       <w:r>
-        <w:t xml:space="preserve">in Pakistani universities. They are not this paper. The present claim is only the fourth layer distinguished in Section 2.3: a culturally adapted lesson still fails, in this sample, if it is a synchronous oral hour delivered into load-shedding or onto an application that does not open.</w:t>
-      </w:r>
-    </w:p>
-    <w:p>
-      <w:pPr>
-        <w:pStyle w:val="BodyText"/>
-      </w:pPr>
-      <w:r>
-        <w:t xml:space="preserve">Based on these findings, possible design considerations include asynchronous oral alternatives that survive low bandwidth; progression decisions that do not assume a campus oral hour; prepaid data treated as a language-learning resource; timetables that name Beijing time when students sit in Pakistan; and a usable classroom defined by the application that opens. WhatsApp was marked available here; it was not recorded as used for class. These are considerations suggested by 38 respondents in one emergency, not established solutions for ICLE. The findings suggest that hybrid models</w:t>
+        <w:t xml:space="preserve">= .062. Mann–Whitney tests by gender on ordinals all had</w:t>
       </w:r>
       <w:r>
         <w:t xml:space="preserve"> </w:t>
@@ -4104,104 +3495,17 @@
           <w:iCs/>
           <w:i/>
         </w:rPr>
-        <w:t xml:space="preserve">may</w:t>
+        <w:t xml:space="preserve">p</w:t>
       </w:r>
       <w:r>
         <w:t xml:space="preserve"> </w:t>
       </w:r>
       <w:r>
-        <w:t xml:space="preserve">reproduce similar misalignments when delivery assumptions are not examined. They do not show that hybrid ICLE after the pandemic has already repeated the misfit.</w:t>
+        <w:t xml:space="preserve">≥ .36.</w:t>
       </w:r>
     </w:p>
-    <w:p>
-      <w:pPr>
-        <w:pStyle w:val="BodyText"/>
-      </w:pPr>
-      <w:r>
-        <w:t xml:space="preserve">The same households send students to Confucius Institutes and to Chinese universities. Future work, not this file, would need to test whether institute teaching that assumes uninterrupted Zoom meets the same delivery problem. Localisation for Pakistani Chinese teachers would then include checks of power, devices, and mediation language as well as textbook adaptation.</w:t>
-      </w:r>
-    </w:p>
-    <w:p>
-      <w:pPr>
-        <w:pStyle w:val="BodyText"/>
-      </w:pPr>
-      <w:r>
-        <w:t xml:space="preserve">The sample is 71% male. Digital inequality in Pakistani households is gendered (Raza &amp; Hennessy, 2025), and a network sample will under-represent that pattern. The data cannot show how women lived the noisy home, the power cut, or the blocked Chaoxing login. Future work should oversample Pakistani women, compare home learners enrolled in China with Confucius Institute learners in the same cities, and follow oral and written skill with tasks. How</w:t>
-      </w:r>
-      <w:r>
-        <w:t xml:space="preserve"> </w:t>
-      </w:r>
-      <w:r>
-        <w:rPr>
-          <w:iCs/>
-          <w:i/>
-        </w:rPr>
-        <w:t xml:space="preserve">HSK Standard Course</w:t>
-      </w:r>
-      <w:r>
-        <w:t xml:space="preserve"> </w:t>
-      </w:r>
-      <w:r>
-        <w:t xml:space="preserve">is used in Pakistani universities is a different paper.</w:t>
-      </w:r>
-    </w:p>
-    <w:bookmarkEnd w:id="44"/>
-    <w:bookmarkEnd w:id="45"/>
-    <w:bookmarkStart w:id="46" w:name="limitations"/>
-    <w:p>
-      <w:pPr>
-        <w:pStyle w:val="Heading2"/>
-      </w:pPr>
-      <w:r>
-        <w:t xml:space="preserve">7. Limitations</w:t>
-      </w:r>
-    </w:p>
-    <w:p>
-      <w:pPr>
-        <w:pStyle w:val="FirstParagraph"/>
-      </w:pPr>
-      <w:r>
-        <w:t xml:space="preserve">The sample is small (N = 38). Associations are exploratory counts and exact tests in this network; they do not support population odds ratios or a confirmatory family of tests. It is a male-majority convenience sample of phone users, with nine responses labelled mainland China. Sensitivity analyses on n = 37 and n = 29 do not remove that limit. All outcomes are self-report; there are no HSK scores or oral tasks, and</w:t>
-      </w:r>
-      <w:r>
-        <w:t xml:space="preserve"> </w:t>
-      </w:r>
-      <w:r>
-        <w:t xml:space="preserve">“</w:t>
-      </w:r>
-      <w:r>
-        <w:t xml:space="preserve">advanced</w:t>
-      </w:r>
-      <w:r>
-        <w:t xml:space="preserve">”</w:t>
-      </w:r>
-      <w:r>
-        <w:t xml:space="preserve"> </w:t>
-      </w:r>
-      <w:r>
-        <w:t xml:space="preserve">is a self-rating. The three-item appraisal is a convenience composite, not a validated scale. Chinese-medium items with non-native wording may have been understood unevenly. The questionnaire does not name the host university, textbook, or award type. Investment was not measured. The 2022 collection has no institutional ethics number; that gap is explained in Section 4.5. The transferable claim is a suggestion about delivery-context fit in ICLE localisation, not a theory of the pandemic and not a programme of textbook localisation.</w:t>
-      </w:r>
-    </w:p>
-    <w:bookmarkEnd w:id="46"/>
-    <w:bookmarkStart w:id="47" w:name="conclusion"/>
-    <w:p>
-      <w:pPr>
-        <w:pStyle w:val="Heading2"/>
-      </w:pPr>
-      <w:r>
-        <w:t xml:space="preserve">8. Conclusion</w:t>
-      </w:r>
-    </w:p>
-    <w:p>
-      <w:pPr>
-        <w:pStyle w:val="FirstParagraph"/>
-      </w:pPr>
-      <w:r>
-        <w:t xml:space="preserve">This article has made one argument: ICLE localisation has to include delivery-context fit, not only content adaptation. Emergency remote teaching was the context in which that second layer became visible for Pakistani students of Chinese-university language courses. In this exploratory sample, many homes were asked to carry a campus oral hour without a quiet room, stable power, or a login that matched the campus system. Participation looked like thin interaction, mixed learning appraisal, and an even split over whether this counted as class. Women in the sample more often refused that count; that pattern needs a larger and more balanced study. If localisation is to mean more than textbook adaptation, these data suggest that it has, on this corridor, to include the house and the application that actually opens. That suggestion is bounded by N = 38. It is offered as a direction for ICLE, not as a finished theory.</w:t>
-      </w:r>
-    </w:p>
-    <w:bookmarkEnd w:id="47"/>
-    <w:bookmarkStart w:id="48" w:name="references"/>
+    <w:bookmarkEnd w:id="43"/>
+    <w:bookmarkStart w:id="44" w:name="references"/>
     <w:p>
       <w:pPr>
         <w:pStyle w:val="Heading2"/>
@@ -4257,48 +3561,6 @@
         <w:pStyle w:val="BodyText"/>
       </w:pPr>
       <w:r>
-        <w:t xml:space="preserve">Darvin, R. (2025). Identity and investment in the age of generative AI.</w:t>
-      </w:r>
-      <w:r>
-        <w:t xml:space="preserve"> </w:t>
-      </w:r>
-      <w:r>
-        <w:rPr>
-          <w:iCs/>
-          <w:i/>
-        </w:rPr>
-        <w:t xml:space="preserve">Annual Review of Applied Linguistics, 45</w:t>
-      </w:r>
-      <w:r>
-        <w:t xml:space="preserve">, 10-27. https://doi.org/10.1017/S0267190525100135</w:t>
-      </w:r>
-    </w:p>
-    <w:p>
-      <w:pPr>
-        <w:pStyle w:val="BodyText"/>
-      </w:pPr>
-      <w:r>
-        <w:t xml:space="preserve">Darvin, R., &amp; Norton, B. (2023). Investment and motivation in language learning: What’s the difference?</w:t>
-      </w:r>
-      <w:r>
-        <w:t xml:space="preserve"> </w:t>
-      </w:r>
-      <w:r>
-        <w:rPr>
-          <w:iCs/>
-          <w:i/>
-        </w:rPr>
-        <w:t xml:space="preserve">Language Teaching, 56</w:t>
-      </w:r>
-      <w:r>
-        <w:t xml:space="preserve">(1), 29-40. https://doi.org/10.1017/S0261444821000057</w:t>
-      </w:r>
-    </w:p>
-    <w:p>
-      <w:pPr>
-        <w:pStyle w:val="BodyText"/>
-      </w:pPr>
-      <w:r>
         <w:t xml:space="preserve">Gacs, A., Goertler, S., &amp; Spasova, S. (2020). Planned online language education versus crisis-prompted online language teaching: Lessons for the future.</w:t>
       </w:r>
       <w:r>
@@ -4543,7 +3805,7 @@
         <w:t xml:space="preserve">Journal of Education and Learning, 13</w:t>
       </w:r>
       <w:r>
-        <w:t xml:space="preserve">(4), 255. https://doi.org/10.5539/jel.v13n4p255</w:t>
+        <w:t xml:space="preserve">(4), Article 255. https://doi.org/10.5539/jel.v13n4p255</w:t>
       </w:r>
     </w:p>
     <w:p>
@@ -4680,51 +3942,6 @@
         <w:pStyle w:val="BodyText"/>
       </w:pPr>
       <w:r>
-        <w:t xml:space="preserve">Norton, B. (2013).</w:t>
-      </w:r>
-      <w:r>
-        <w:t xml:space="preserve"> </w:t>
-      </w:r>
-      <w:r>
-        <w:rPr>
-          <w:iCs/>
-          <w:i/>
-        </w:rPr>
-        <w:t xml:space="preserve">Identity and language learning: Extending the conversation</w:t>
-      </w:r>
-      <w:r>
-        <w:t xml:space="preserve"> </w:t>
-      </w:r>
-      <w:r>
-        <w:t xml:space="preserve">(2nd ed.). Multilingual Matters.</w:t>
-      </w:r>
-    </w:p>
-    <w:p>
-      <w:pPr>
-        <w:pStyle w:val="BodyText"/>
-      </w:pPr>
-      <w:r>
-        <w:t xml:space="preserve">Piller, I., Zhang, J., &amp; Li, J. (2020). Linguistic diversity in a time of crisis: Language challenges of the COVID-19 pandemic.</w:t>
-      </w:r>
-      <w:r>
-        <w:t xml:space="preserve"> </w:t>
-      </w:r>
-      <w:r>
-        <w:rPr>
-          <w:iCs/>
-          <w:i/>
-        </w:rPr>
-        <w:t xml:space="preserve">Multilingua, 39</w:t>
-      </w:r>
-      <w:r>
-        <w:t xml:space="preserve">(5), 503-515. https://doi.org/10.1515/multi-2020-0136</w:t>
-      </w:r>
-    </w:p>
-    <w:p>
-      <w:pPr>
-        <w:pStyle w:val="BodyText"/>
-      </w:pPr>
-      <w:r>
         <w:t xml:space="preserve">Raza, O., &amp; Hennessy, S. (2025).</w:t>
       </w:r>
       <w:r>
@@ -4993,8 +4210,8 @@
         <w:t xml:space="preserve">(2), 263-288. https://doi.org/10.1515/glochi-2020-0014</w:t>
       </w:r>
     </w:p>
-    <w:bookmarkEnd w:id="48"/>
-    <w:bookmarkEnd w:id="49"/>
+    <w:bookmarkEnd w:id="44"/>
+    <w:bookmarkEnd w:id="45"/>
     <w:sectPr>
       <w:pgSz w:h="15840" w:w="12240"/>
       <w:pgMar w:bottom="1440" w:footer="720" w:gutter="0" w:header="720" w:left="1440" w:right="1440" w:top="1440"/>

</xml_diff>

<commit_message>
Soften enrolment claim and reduce re-identification risk
Revise the Q1 manuscript after the remaining high-priority review: the sample is now a self-selected respondent group, not verified Chinese-university enrolment; ethics self-advice is removed from the article; the public CSV drops IP, date, and device fields; Table 3 no longer says platforms were blocked.

Co-authored-by: kristinehina23-rgb <kristinehina23-rgb@users.noreply.github.com>
</commit_message>
<xml_diff>
--- a/papers/q1-masters-covid/word/Rathore-Cao-Xu-When-Chinese-class-moved-home.docx
+++ b/papers/q1-masters-covid/word/Rathore-Cao-Xu-When-Chinese-class-moved-home.docx
@@ -2,13 +2,13 @@
 <file path=word/document.xml><?xml version="1.0" encoding="utf-8"?>
 <w:document xmlns:w="http://schemas.openxmlformats.org/wordprocessingml/2006/main" xmlns:m="http://schemas.openxmlformats.org/officeDocument/2006/math" xmlns:r="http://schemas.openxmlformats.org/officeDocument/2006/relationships" xmlns:o="urn:schemas-microsoft-com:office:office" xmlns:v="urn:schemas-microsoft-com:vml" xmlns:w10="urn:schemas-microsoft-com:office:word" xmlns:a="http://schemas.openxmlformats.org/drawingml/2006/main" xmlns:pic="http://schemas.openxmlformats.org/drawingml/2006/picture" xmlns:wp="http://schemas.openxmlformats.org/drawingml/2006/wordprocessingDrawing">
   <w:body>
-    <w:bookmarkStart w:id="45" w:name="X58d4d32bf2fa0d1f45db090e0f004cc128afcf3"/>
+    <w:bookmarkStart w:id="45" w:name="X98bc7e0e5302306ce1fc1a297b6ba6e6c57c4e4"/>
     <w:p>
       <w:pPr>
         <w:pStyle w:val="Heading1"/>
       </w:pPr>
       <w:r>
-        <w:t xml:space="preserve">Pakistani Chinese-university students studying remotely: household infrastructure and platform access during emergency remote teaching</w:t>
+        <w:t xml:space="preserve">Mainly Pakistani respondents reporting online Chinese coursework: household infrastructure and platform access during emergency remote teaching</w:t>
       </w:r>
     </w:p>
     <w:p>
@@ -152,37 +152,7 @@
         <w:t xml:space="preserve"> </w:t>
       </w:r>
       <w:r>
-        <w:t xml:space="preserve">A de-identified analysis file (</w:t>
-      </w:r>
-      <w:r>
-        <w:rPr>
-          <w:rStyle w:val="VerbatimChar"/>
-        </w:rPr>
-        <w:t xml:space="preserve">data/anonymized_n38.csv</w:t>
-      </w:r>
-      <w:r>
-        <w:t xml:space="preserve">), codebook, and analysis syntax (</w:t>
-      </w:r>
-      <w:r>
-        <w:rPr>
-          <w:rStyle w:val="VerbatimChar"/>
-        </w:rPr>
-        <w:t xml:space="preserve">analysis/analyze.py</w:t>
-      </w:r>
-      <w:r>
-        <w:t xml:space="preserve">; supplementary calculations in</w:t>
-      </w:r>
-      <w:r>
-        <w:t xml:space="preserve"> </w:t>
-      </w:r>
-      <w:r>
-        <w:rPr>
-          <w:rStyle w:val="VerbatimChar"/>
-        </w:rPr>
-        <w:t xml:space="preserve">analysis/supplementary_stats.md</w:t>
-      </w:r>
-      <w:r>
-        <w:t xml:space="preserve">) are in the public project repository. Files containing names or IP addresses will not be shared. The corresponding author can also supply the same de-identified files on request.</w:t>
+        <w:t xml:space="preserve">A de-identified analytical dataset, codebook, and analysis syntax are available in a public repository. Variables that could increase re-identification risk in this small convenience sample have been removed or coarsened. Files containing names, IP addresses, timestamps, or device identifiers will not be shared.</w:t>
       </w:r>
     </w:p>
     <w:bookmarkStart w:id="20" w:name="abstract"/>
@@ -199,7 +169,7 @@
         <w:pStyle w:val="FirstParagraph"/>
       </w:pPr>
       <w:r>
-        <w:t xml:space="preserve">This article reports an exploratory questionnaire study of how Chinese-university language courses were experienced when live classes were relocated off campus during COVID-19 emergency remote teaching. The contribution to international Chinese language education is a bounded concept,</w:t>
+        <w:t xml:space="preserve">This exploratory questionnaire study examines how mainly Pakistani respondents experienced Chinese-university-linked language courses when live instruction moved off campus during COVID-19 emergency remote teaching. It proposes</w:t>
       </w:r>
       <w:r>
         <w:t xml:space="preserve"> </w:t>
@@ -212,7 +182,7 @@
         <w:t xml:space="preserve">localisation of delivery</w:t>
       </w:r>
       <w:r>
-        <w:t xml:space="preserve">: institutional adaptation of time, platform, task, participation mode, and assessment to the receiving context. Thirty-eight adult respondents completed a Chinese-medium Wenjuan form between 5 and 8 February 2022. Thirty-seven selected Pakistani nationality and one selected Bangladesh. The sample is therefore mainly Pakistani by nationality. It is not a sample exclusively located in Pakistan, and IP metadata are not treated as a location measure. Unstable networks (76.3%) and power interruptions (42.1%) were commonly ticked; 36.8% reported very high stress. Eleven of 14 respondents who said the home affected study</w:t>
+        <w:t xml:space="preserve">: institutional adaptation of time, platform, task, participation mode, and assessment to the receiving context. Thirty-eight adults completed a Chinese-medium Wenjuan questionnaire in February 2022. Unstable networks (76.3%) and power interruptions (42.1%) were commonly reported, while 36.8% reported very high stress. Respondents who reported that home conditions affected study</w:t>
       </w:r>
       <w:r>
         <w:t xml:space="preserve"> </w:t>
@@ -230,7 +200,694 @@
         <w:t xml:space="preserve"> </w:t>
       </w:r>
       <w:r>
-        <w:t xml:space="preserve">also reported very high stress, compared with 3 of 24 others (Fisher’s exact</w:t>
+        <w:t xml:space="preserve">more often reported very high stress (11/14 versus 3/24; Fisher’s exact (p = .00008)). Worse reported internet speed was associated with a more negative perceived online-learning appraisal index ((</w:t>
+      </w:r>
+      <w:r>
+        <w:t xml:space="preserve">= .65), 95% bootstrap CI ([.36, .84])). Respondents also reported uneven platform access, with QQ and Chaoxing frequently marked unusable and Zoom and WhatsApp more often marked available. The findings suggest that ICLE localisation may need to address delivery-context fit alongside content and materials adaptation. Given the small network-recruited 2022 sample, the findings are exploratory and do not represent current hybrid practice.</w:t>
+      </w:r>
+    </w:p>
+    <w:p>
+      <w:pPr>
+        <w:pStyle w:val="BodyText"/>
+      </w:pPr>
+      <w:r>
+        <w:rPr>
+          <w:bCs/>
+          <w:b/>
+        </w:rPr>
+        <w:t xml:space="preserve">Keywords:</w:t>
+      </w:r>
+      <w:r>
+        <w:t xml:space="preserve"> </w:t>
+      </w:r>
+      <w:r>
+        <w:t xml:space="preserve">localisation of delivery; Chinese as an additional language; digital inequality; emergency remote teaching; Pakistan; household infrastructure</w:t>
+      </w:r>
+    </w:p>
+    <w:bookmarkEnd w:id="20"/>
+    <w:bookmarkStart w:id="21" w:name="introduction"/>
+    <w:p>
+      <w:pPr>
+        <w:pStyle w:val="Heading2"/>
+      </w:pPr>
+      <w:r>
+        <w:t xml:space="preserve">1. Introduction</w:t>
+      </w:r>
+    </w:p>
+    <w:p>
+      <w:pPr>
+        <w:pStyle w:val="FirstParagraph"/>
+      </w:pPr>
+      <w:r>
+        <w:t xml:space="preserve">International Chinese language education (ICLE) has treated localisation mainly as a problem of content and materials: local examples, annotation, and cultural comparison so that a travelling syllabus becomes learnable in a place (Zhao, 2020; Lu et al., 2024). This study proposes a further layer.</w:t>
+      </w:r>
+      <w:r>
+        <w:t xml:space="preserve"> </w:t>
+      </w:r>
+      <w:r>
+        <w:rPr>
+          <w:iCs/>
+          <w:i/>
+        </w:rPr>
+        <w:t xml:space="preserve">Localisation of delivery</w:t>
+      </w:r>
+      <w:r>
+        <w:t xml:space="preserve"> </w:t>
+      </w:r>
+      <w:r>
+        <w:t xml:space="preserve">is the institutional adaptation of time, platform, task, participation mode, and assessment to the receiving context. It differs from learner-side accessibility and from digital inclusion. Those terms describe conditions that students face. Localisation of delivery names a design task for the institution that sends the course.</w:t>
+      </w:r>
+    </w:p>
+    <w:p>
+      <w:pPr>
+        <w:pStyle w:val="BodyText"/>
+      </w:pPr>
+      <w:r>
+        <w:t xml:space="preserve">Emergency remote teaching (Hodges et al., 2020) is the historical setting in which that task became visible, not the theoretical centre of the paper. When Chinese universities moved instruction online in 2020, many students of Pakistani nationality remained connected to Chinese-university language courses while sitting outside the campus infrastructure. A</w:t>
+      </w:r>
+      <w:r>
+        <w:t xml:space="preserve"> </w:t>
+      </w:r>
+      <w:r>
+        <w:rPr>
+          <w:iCs/>
+          <w:i/>
+        </w:rPr>
+        <w:t xml:space="preserve">travelling course</w:t>
+      </w:r>
+      <w:r>
+        <w:t xml:space="preserve">, as used here, is an institutionally designed course whose timetable, platforms, tasks, and assessment arrangements were created for one institutional setting but enacted in another (Gacs et al., 2020). Emergency-period Chinese-university language courses often relied on synchronous instruction and platforms used in Chinese higher education, although the present questionnaire did not document the specific institutional requirements faced by each respondent.</w:t>
+      </w:r>
+    </w:p>
+    <w:p>
+      <w:pPr>
+        <w:pStyle w:val="BodyText"/>
+      </w:pPr>
+      <w:r>
+        <w:t xml:space="preserve">Pakistani enrolment in Chinese universities is a documented case of South–South academic mobility, structured by scholarships and the China–Pakistan Economic Corridor rather than by the more familiar</w:t>
+      </w:r>
+      <w:r>
+        <w:t xml:space="preserve"> </w:t>
+      </w:r>
+      <w:r>
+        <w:t xml:space="preserve">“</w:t>
+      </w:r>
+      <w:r>
+        <w:t xml:space="preserve">international student already on a Chinese campus</w:t>
+      </w:r>
+      <w:r>
+        <w:t xml:space="preserve">”</w:t>
+      </w:r>
+      <w:r>
+        <w:t xml:space="preserve"> </w:t>
+      </w:r>
+      <w:r>
+        <w:t xml:space="preserve">story (Iftikhar et al., 2024; Tu, 2026; Gao &amp; Hua, 2021). This study does not treat the 38 respondents as a census of that mobility, nor as a verified enrolment record. The questionnaire did not collect host university, programme type, degree status, or recruitment source. Most respondents ticked that they were taking required and/or elective courses online. The analysis therefore treats the group as a self-selected, likely Chinese-university-connected respondent sample. Nine submissions carried mainland-China IP metadata and twenty-nine did not. Those metadata are technical records, not verified locations, because a virtual private network can change an apparent address. The study does not treat the dataset as a Pakistan-resident sample and does not analyse IP as a proxy for where respondents sat.</w:t>
+      </w:r>
+    </w:p>
+    <w:p>
+      <w:pPr>
+        <w:pStyle w:val="BodyText"/>
+      </w:pPr>
+      <w:r>
+        <w:t xml:space="preserve">Three questions guide the analysis:</w:t>
+      </w:r>
+    </w:p>
+    <w:p>
+      <w:pPr>
+        <w:numPr>
+          <w:ilvl w:val="0"/>
+          <w:numId w:val="1001"/>
+        </w:numPr>
+        <w:pStyle w:val="Compact"/>
+      </w:pPr>
+      <w:r>
+        <w:t xml:space="preserve">What household, connectivity, and platform-access conditions did respondents report?</w:t>
+      </w:r>
+    </w:p>
+    <w:p>
+      <w:pPr>
+        <w:numPr>
+          <w:ilvl w:val="0"/>
+          <w:numId w:val="1001"/>
+        </w:numPr>
+        <w:pStyle w:val="Compact"/>
+      </w:pPr>
+      <w:r>
+        <w:t xml:space="preserve">In this sample, how did selected household and connectivity reports co-occur with very high stress and with perceived online-learning appraisal?</w:t>
+      </w:r>
+    </w:p>
+    <w:p>
+      <w:pPr>
+        <w:numPr>
+          <w:ilvl w:val="0"/>
+          <w:numId w:val="1001"/>
+        </w:numPr>
+        <w:pStyle w:val="Compact"/>
+      </w:pPr>
+      <w:r>
+        <w:t xml:space="preserve">How did respondents judge whether online Chinese could replace campus classes?</w:t>
+      </w:r>
+    </w:p>
+    <w:p>
+      <w:pPr>
+        <w:pStyle w:val="FirstParagraph"/>
+      </w:pPr>
+      <w:r>
+        <w:t xml:space="preserve">The analysis is exploratory. Associations are reported as counts, exact tests, and rank correlations in this network. They are not confirmatory tests of a population model.</w:t>
+      </w:r>
+    </w:p>
+    <w:bookmarkEnd w:id="21"/>
+    <w:bookmarkStart w:id="26" w:name="literature-and-framework"/>
+    <w:p>
+      <w:pPr>
+        <w:pStyle w:val="Heading2"/>
+      </w:pPr>
+      <w:r>
+        <w:t xml:space="preserve">2. Literature and framework</w:t>
+      </w:r>
+    </w:p>
+    <w:bookmarkStart w:id="22" w:name="X466d9fa4ba9675c3d2d096fe48fd97f00c4a10c"/>
+    <w:p>
+      <w:pPr>
+        <w:pStyle w:val="Heading3"/>
+      </w:pPr>
+      <w:r>
+        <w:t xml:space="preserve">2.1 Emergency remote teaching as historical context</w:t>
+      </w:r>
+    </w:p>
+    <w:p>
+      <w:pPr>
+        <w:pStyle w:val="FirstParagraph"/>
+      </w:pPr>
+      <w:r>
+        <w:t xml:space="preserve">Hodges et al. (2020) distinguished emergency remote teaching from planned online or blended courses. Gacs, Goertler and Spasova (2020) applied that distinction to languages. Reviews of language-teacher responses during the conversion to online teaching report thinner interaction and the entry of the domestic setting into the lesson (MacIntyre et al., 2020; Moorhouse &amp; Kohnke, 2021). Those studies are cited as emergency-teaching context, not as direct evidence of student stress in the present dataset.</w:t>
+      </w:r>
+    </w:p>
+    <w:p>
+      <w:pPr>
+        <w:pStyle w:val="BodyText"/>
+      </w:pPr>
+      <w:r>
+        <w:t xml:space="preserve">Later work described technological normalisation after the return to campus (Moorhouse, 2023; Moorhouse, Wong, &amp; Li, 2023) and warned that copying face-to-face teaching on videoconferencing was a limited lesson from the crisis (Stockwell &amp; Wang, 2023). For Chinese, contemporaneous papers documented</w:t>
+      </w:r>
+      <w:r>
+        <w:t xml:space="preserve"> </w:t>
+      </w:r>
+      <w:r>
+        <w:t xml:space="preserve">“</w:t>
+      </w:r>
+      <w:r>
+        <w:t xml:space="preserve">suspending classes without stopping learning</w:t>
+      </w:r>
+      <w:r>
+        <w:t xml:space="preserve">”</w:t>
+      </w:r>
+      <w:r>
+        <w:t xml:space="preserve"> </w:t>
+      </w:r>
+      <w:r>
+        <w:t xml:space="preserve">and platform trials (Zhang et al., 2020; Xia et al., 2022). A later review of online ICLE teaching models still lists technical issues, weak interaction, and time-zone problems (Li &amp; Li, 2024). Much of that literature assumes a relatively stable connection. This exploratory questionnaire cannot test whether that assumption holds for current hybrid ICLE. It can describe what 38 respondents reported in February 2022.</w:t>
+      </w:r>
+    </w:p>
+    <w:bookmarkEnd w:id="22"/>
+    <w:bookmarkStart w:id="23" w:name="X2a1706acb855f9b47e20bf43e0bff03a0be2114"/>
+    <w:p>
+      <w:pPr>
+        <w:pStyle w:val="Heading3"/>
+      </w:pPr>
+      <w:r>
+        <w:t xml:space="preserve">2.2 Digital inequality and home learning ecology</w:t>
+      </w:r>
+    </w:p>
+    <w:p>
+      <w:pPr>
+        <w:pStyle w:val="FirstParagraph"/>
+      </w:pPr>
+      <w:r>
+        <w:t xml:space="preserve">Later digital-divide models describe a sequence of motivational, material, skills, usage, and outcome access (van Dijk, 2020; Helsper, 2021; Warschauer, 2003). Device ownership is not the same as taking part (Ali, 2020). In Pakistan, household use of educational technology is also structured by device sharing, care work, and electricity (Raza &amp; Hennessy, 2025). That report is grey literature and is used only as background on household conditions, not as a standalone empirical claim about this sample.</w:t>
+      </w:r>
+    </w:p>
+    <w:p>
+      <w:pPr>
+        <w:pStyle w:val="BodyText"/>
+      </w:pPr>
+      <w:r>
+        <w:t xml:space="preserve">Ecological views of language education take the setting of the class, not only the student plus the application, as the unit of analysis (van Lier, 2004; Guerrettaz et al., 2021). In this paper that setting is described as a</w:t>
+      </w:r>
+      <w:r>
+        <w:t xml:space="preserve"> </w:t>
+      </w:r>
+      <w:r>
+        <w:rPr>
+          <w:iCs/>
+          <w:i/>
+        </w:rPr>
+        <w:t xml:space="preserve">home learning ecology</w:t>
+      </w:r>
+      <w:r>
+        <w:t xml:space="preserve">: domestic space, paid or care work, and the conditions of oral participation. Electricity interruptions, applications marked unusable, and weak bandwidth are treated as material and infrastructural conditions, not as cultural traits.</w:t>
+      </w:r>
+    </w:p>
+    <w:bookmarkEnd w:id="23"/>
+    <w:bookmarkStart w:id="24" w:name="localisation-of-delivery"/>
+    <w:p>
+      <w:pPr>
+        <w:pStyle w:val="Heading3"/>
+      </w:pPr>
+      <w:r>
+        <w:t xml:space="preserve">2.3 Localisation of delivery</w:t>
+      </w:r>
+    </w:p>
+    <w:p>
+      <w:pPr>
+        <w:pStyle w:val="FirstParagraph"/>
+      </w:pPr>
+      <w:r>
+        <w:t xml:space="preserve">In materials work, localisation has meant personalising content so that it speaks to a particular group (McDonough &amp; Shaw, 2003; Tomlinson, 2011). Canagarajah (2005) and Kumaravadivelu (2001) locate pedagogy in a specific group and place. China’s promotion of Chinese has long been tied to institutes, textbooks, and tests (Zhao &amp; Huang, 2010). ICLE studies have applied localisation to curriculum construction and textbook adaptation (Zhao, 2020; Lu et al., 2024). Lam (2024) treats glocalisation as fitting a travelling literacy to a local university classroom. Guerrettaz et al. (2021) extend materials from the page to use. If the material is a live class, use includes whether the class can be entered.</w:t>
+      </w:r>
+    </w:p>
+    <w:p>
+      <w:pPr>
+        <w:pStyle w:val="BodyText"/>
+      </w:pPr>
+      <w:r>
+        <w:t xml:space="preserve">Four layers can be distinguished:</w:t>
+      </w:r>
+    </w:p>
+    <w:p>
+      <w:pPr>
+        <w:numPr>
+          <w:ilvl w:val="0"/>
+          <w:numId w:val="1002"/>
+        </w:numPr>
+        <w:pStyle w:val="Compact"/>
+      </w:pPr>
+      <w:r>
+        <w:t xml:space="preserve">Localisation of</w:t>
+      </w:r>
+      <w:r>
+        <w:t xml:space="preserve"> </w:t>
+      </w:r>
+      <w:r>
+        <w:rPr>
+          <w:iCs/>
+          <w:i/>
+        </w:rPr>
+        <w:t xml:space="preserve">content</w:t>
+      </w:r>
+      <w:r>
+        <w:t xml:space="preserve">: examples, festivals, and cultural comparison.</w:t>
+      </w:r>
+    </w:p>
+    <w:p>
+      <w:pPr>
+        <w:numPr>
+          <w:ilvl w:val="0"/>
+          <w:numId w:val="1002"/>
+        </w:numPr>
+        <w:pStyle w:val="Compact"/>
+      </w:pPr>
+      <w:r>
+        <w:t xml:space="preserve">Localisation of</w:t>
+      </w:r>
+      <w:r>
+        <w:t xml:space="preserve"> </w:t>
+      </w:r>
+      <w:r>
+        <w:rPr>
+          <w:iCs/>
+          <w:i/>
+        </w:rPr>
+        <w:t xml:space="preserve">materials</w:t>
+      </w:r>
+      <w:r>
+        <w:t xml:space="preserve">: annotation, mediation language, and page redesign.</w:t>
+      </w:r>
+    </w:p>
+    <w:p>
+      <w:pPr>
+        <w:numPr>
+          <w:ilvl w:val="0"/>
+          <w:numId w:val="1002"/>
+        </w:numPr>
+        <w:pStyle w:val="Compact"/>
+      </w:pPr>
+      <w:r>
+        <w:t xml:space="preserve">Localisation of</w:t>
+      </w:r>
+      <w:r>
+        <w:t xml:space="preserve"> </w:t>
+      </w:r>
+      <w:r>
+        <w:rPr>
+          <w:iCs/>
+          <w:i/>
+        </w:rPr>
+        <w:t xml:space="preserve">curriculum</w:t>
+      </w:r>
+      <w:r>
+        <w:t xml:space="preserve">: pathway, hours, and assessment of a named programme (Shan &amp; Xu, 2024; Zhao, 2020).</w:t>
+      </w:r>
+    </w:p>
+    <w:p>
+      <w:pPr>
+        <w:numPr>
+          <w:ilvl w:val="0"/>
+          <w:numId w:val="1002"/>
+        </w:numPr>
+        <w:pStyle w:val="Compact"/>
+      </w:pPr>
+      <w:r>
+        <w:t xml:space="preserve">Localisation of</w:t>
+      </w:r>
+      <w:r>
+        <w:t xml:space="preserve"> </w:t>
+      </w:r>
+      <w:r>
+        <w:rPr>
+          <w:iCs/>
+          <w:i/>
+        </w:rPr>
+        <w:t xml:space="preserve">delivery</w:t>
+      </w:r>
+      <w:r>
+        <w:t xml:space="preserve">: institutional adaptation of time, platform, task, participation mode, and assessment to the receiving context.</w:t>
+      </w:r>
+    </w:p>
+    <w:p>
+      <w:pPr>
+        <w:pStyle w:val="FirstParagraph"/>
+      </w:pPr>
+      <w:r>
+        <w:t xml:space="preserve">The analysis addresses only the fourth layer. Accessibility and digital inclusion describe constraints that learners report. Localisation of delivery is the institutional response: changing the live hour, the required application, the oral task, or the assessment so that the travelling course can be used where the student actually sits. The questionnaire did not observe institutions adapting. It recorded student-side conditions that, if taken seriously, would require such adaptation.</w:t>
+      </w:r>
+    </w:p>
+    <w:p>
+      <w:pPr>
+        <w:pStyle w:val="BodyText"/>
+      </w:pPr>
+      <w:r>
+        <w:rPr>
+          <w:bCs/>
+          <w:b/>
+        </w:rPr>
+        <w:t xml:space="preserve">Proposition.</w:t>
+      </w:r>
+      <w:r>
+        <w:t xml:space="preserve"> </w:t>
+      </w:r>
+      <w:r>
+        <w:t xml:space="preserve">A course is not fully localised merely because its content is culturally or linguistically adapted; it is localised in delivery only when its required time, platform, participation mode, task design, and assessment are feasible in the setting where learners participate.</w:t>
+      </w:r>
+    </w:p>
+    <w:p>
+      <w:pPr>
+        <w:pStyle w:val="BodyText"/>
+      </w:pPr>
+      <w:r>
+        <w:t xml:space="preserve">Gong, Gao and Lyu (2020) review ICLE in mainland China for 2014–2018 and are cited for that pre-pandemic field map, not as post-COVID evidence. Gao and Hua (2021) and Gong, Gao, Li and Lai (2020) document international students of Chinese</w:t>
+      </w:r>
+      <w:r>
+        <w:t xml:space="preserve"> </w:t>
+      </w:r>
+      <w:r>
+        <w:rPr>
+          <w:iCs/>
+          <w:i/>
+        </w:rPr>
+        <w:t xml:space="preserve">in</w:t>
+      </w:r>
+      <w:r>
+        <w:t xml:space="preserve"> </w:t>
+      </w:r>
+      <w:r>
+        <w:t xml:space="preserve">Chinese universities. Guenier, Xing and Yan (2026) describe a designed online Chinese-culture course, which is planned online teaching rather than emergency remote teaching. The present respondents completed a Chinese-medium form about online Chinese classes, and most reported taking required and/or elective courses online. They were not a Confucius Institute classroom sample. Enrolment in a named Chinese university was not independently verified.</w:t>
+      </w:r>
+    </w:p>
+    <w:bookmarkEnd w:id="24"/>
+    <w:bookmarkStart w:id="25" w:name="conceptual-model"/>
+    <w:p>
+      <w:pPr>
+        <w:pStyle w:val="Heading3"/>
+      </w:pPr>
+      <w:r>
+        <w:t xml:space="preserve">2.4 Conceptual model</w:t>
+      </w:r>
+    </w:p>
+    <w:p>
+      <w:pPr>
+        <w:pStyle w:val="FirstParagraph"/>
+      </w:pPr>
+      <w:r>
+        <w:t xml:space="preserve">Figure 1 is a reading model, not a tested path. Household infrastructure and reported platform access are concurrent conditions of a travelling course. They are described as possible constraints on participation. Language investment is not part of the model.</w:t>
+      </w:r>
+    </w:p>
+    <w:p>
+      <w:pPr>
+        <w:pStyle w:val="BodyText"/>
+      </w:pPr>
+      <w:r>
+        <w:t xml:space="preserve">Figure 1. Localisation of delivery as delivery-context fit (reading model). Household infrastructure (power interruptions, network stability, speed) and reported platform access are concurrent conditions. They are interpreted as possible constraints on participation and on self-reported stress, interaction, appraisal, and replacement judgements. The figure is not a causal path.</w:t>
+      </w:r>
+    </w:p>
+    <w:bookmarkEnd w:id="25"/>
+    <w:bookmarkEnd w:id="26"/>
+    <w:bookmarkStart w:id="33" w:name="the-study"/>
+    <w:p>
+      <w:pPr>
+        <w:pStyle w:val="Heading2"/>
+      </w:pPr>
+      <w:r>
+        <w:t xml:space="preserve">3. The study</w:t>
+      </w:r>
+    </w:p>
+    <w:bookmarkStart w:id="27" w:name="design"/>
+    <w:p>
+      <w:pPr>
+        <w:pStyle w:val="Heading3"/>
+      </w:pPr>
+      <w:r>
+        <w:t xml:space="preserve">3.1 Design</w:t>
+      </w:r>
+    </w:p>
+    <w:p>
+      <w:pPr>
+        <w:pStyle w:val="FirstParagraph"/>
+      </w:pPr>
+      <w:r>
+        <w:t xml:space="preserve">The study is an exploratory, cross-sectional questionnaire. It does not test a pre-registered confirmatory model. The instrument title on the Wenjuan export is 新冠肺炎期间留学生在线中文学习的影响因素 (Influencing factors in international students’ online Chinese learning during COVID-19). Complete cases were submitted between 5 and 8 February 2022 (N = 38).</w:t>
+      </w:r>
+    </w:p>
+    <w:bookmarkEnd w:id="27"/>
+    <w:bookmarkStart w:id="28" w:name="recruitment-and-eligibility"/>
+    <w:p>
+      <w:pPr>
+        <w:pStyle w:val="Heading3"/>
+      </w:pPr>
+      <w:r>
+        <w:t xml:space="preserve">3.2 Recruitment and eligibility</w:t>
+      </w:r>
+    </w:p>
+    <w:p>
+      <w:pPr>
+        <w:pStyle w:val="FirstParagraph"/>
+      </w:pPr>
+      <w:r>
+        <w:t xml:space="preserve">The dataset is a convenience sample. The form did not record how the link was distributed (for example WeChat, WhatsApp, email, or student groups). The research team therefore cannot name the recruitment channel. Respondents were adults who completed the Chinese-medium form about online Chinese learning. Completion of the form is not treated as proof of enrolment in a Chinese university. The form did not ask host university, city of residence that week, degree versus non-degree status, or scholarship type. Two items asked whether required courses and electives were online (71.1% and 60.5% ticked those options). Those ticks do not identify a named programme. The study therefore concerns a self-selected, likely Chinese-university-connected respondent group, not verified enrolment records.</w:t>
+      </w:r>
+    </w:p>
+    <w:bookmarkEnd w:id="28"/>
+    <w:bookmarkStart w:id="29" w:name="participants"/>
+    <w:p>
+      <w:pPr>
+        <w:pStyle w:val="Heading3"/>
+      </w:pPr>
+      <w:r>
+        <w:t xml:space="preserve">3.3 Participants</w:t>
+      </w:r>
+    </w:p>
+    <w:p>
+      <w:pPr>
+        <w:pStyle w:val="FirstParagraph"/>
+      </w:pPr>
+      <w:r>
+        <w:t xml:space="preserve">Of 38 respondents, 27 were men (71.1%) and 11 women (28.9%). Thirty-seven selected Pakistani nationality and one selected another nationality. Self-rated Chinese level was mostly advanced (22, 57.9%) or intermediate (15, 39.5%); one beginner. That label is the student’s own, not an HSK band. Years of learning Chinese clustered at three to four years (26, 68.4%). Wenjuan submission metadata classified the operating system as iPhone (24, 63.2%) or Android (14). That variable is the device used to submit the form, not a survey item about all devices used for class.</w:t>
+      </w:r>
+    </w:p>
+    <w:p>
+      <w:pPr>
+        <w:pStyle w:val="BodyText"/>
+      </w:pPr>
+      <w:r>
+        <w:t xml:space="preserve">Wenjuan automatically recorded an IP-province field. The research team coded a dummy when that field was a mainland China province name (9 of 38). IP labels are technical metadata. They can be affected by virtual private networks and proxies and are not a reliable measure of physical location. They are not used as a participant-location variable and are not the basis of a sensitivity analysis. The dummy, submission dates, and device identifiers are not included in the public dataset.</w:t>
+      </w:r>
+    </w:p>
+    <w:p>
+      <w:pPr>
+        <w:pStyle w:val="BodyText"/>
+      </w:pPr>
+      <w:r>
+        <w:t xml:space="preserve">The sample is described as</w:t>
+      </w:r>
+      <w:r>
+        <w:t xml:space="preserve"> </w:t>
+      </w:r>
+      <w:r>
+        <w:rPr>
+          <w:iCs/>
+          <w:i/>
+        </w:rPr>
+        <w:t xml:space="preserve">mainly Pakistani respondents reporting online Chinese coursework connected to Chinese higher education</w:t>
+      </w:r>
+      <w:r>
+        <w:t xml:space="preserve">. It is not described as verified Chinese-university enrolment, as students exclusively in Pakistan, as CSC students, or as a draw from all Pakistani students in Chinese universities.</w:t>
+      </w:r>
+    </w:p>
+    <w:bookmarkEnd w:id="29"/>
+    <w:bookmarkStart w:id="30" w:name="instrument-and-coding"/>
+    <w:p>
+      <w:pPr>
+        <w:pStyle w:val="Heading3"/>
+      </w:pPr>
+      <w:r>
+        <w:t xml:space="preserve">3.4 Instrument and coding</w:t>
+      </w:r>
+    </w:p>
+    <w:p>
+      <w:pPr>
+        <w:pStyle w:val="FirstParagraph"/>
+      </w:pPr>
+      <w:r>
+        <w:t xml:space="preserve">The questionnaire comprised about 30 items: demographics, single-choice ordinals, and multiple-response lists. Stems are in Chinese, with some non-native wording (for example 您尝尝用什么平台). English glosses are used for reporting. Item wording for the appraisal index is given in Appendix A.</w:t>
+      </w:r>
+    </w:p>
+    <w:p>
+      <w:pPr>
+        <w:pStyle w:val="BodyText"/>
+      </w:pPr>
+      <w:r>
+        <w:t xml:space="preserve">A three-item</w:t>
+      </w:r>
+      <w:r>
+        <w:t xml:space="preserve"> </w:t>
+      </w:r>
+      <w:r>
+        <w:rPr>
+          <w:iCs/>
+          <w:i/>
+        </w:rPr>
+        <w:t xml:space="preserve">perceived online-learning appraisal index</w:t>
+      </w:r>
+      <w:r>
+        <w:t xml:space="preserve"> </w:t>
+      </w:r>
+      <w:r>
+        <w:t xml:space="preserve">was formed from learned much (Q8), improves Chinese (Q9), and sparks interest (Q10). The items ask related but not identical questions. They are treated as a descriptive index, not as a validated unidimensional scale. Internal consistency was acceptable in this sample (Cronbach’s α = .84); Spearman inter-item correlations ranged from .55 to .75 (Appendix B). Exploratory factor analysis was not used (N = 38). Individual items are also reported. One double-tick on</w:t>
+      </w:r>
+      <w:r>
+        <w:t xml:space="preserve"> </w:t>
+      </w:r>
+      <w:r>
+        <w:t xml:space="preserve">“</w:t>
+      </w:r>
+      <w:r>
+        <w:t xml:space="preserve">like online classes</w:t>
+      </w:r>
+      <w:r>
+        <w:t xml:space="preserve">”</w:t>
+      </w:r>
+      <w:r>
+        <w:t xml:space="preserve"> </w:t>
+      </w:r>
+      <w:r>
+        <w:t xml:space="preserve">was excluded for that item only (n = 37 valid).</w:t>
+      </w:r>
+    </w:p>
+    <w:p>
+      <w:pPr>
+        <w:pStyle w:val="BodyText"/>
+      </w:pPr>
+      <w:r>
+        <w:t xml:space="preserve">Coding follows the Wenjuan export. Higher values on speed, learned, improve, interest, and teacher interaction indicate a more negative report (worse speed; less learning, improvement, or interest; thinner interaction). Stress is coded 1 = very high to 4 = none; the focal stress analysis uses a dummy for very high stress and does not reverse the ordinal. Full directions are in Table A1.</w:t>
+      </w:r>
+    </w:p>
+    <w:p>
+      <w:pPr>
+        <w:pStyle w:val="BodyText"/>
+      </w:pPr>
+      <w:r>
+        <w:t xml:space="preserve">The export labelled one multiple-response problem as</w:t>
+      </w:r>
+      <w:r>
+        <w:t xml:space="preserve"> </w:t>
+      </w:r>
+      <w:r>
+        <w:t xml:space="preserve">“</w:t>
+      </w:r>
+      <w:r>
+        <w:t xml:space="preserve">no electricity.</w:t>
+      </w:r>
+      <w:r>
+        <w:t xml:space="preserve">”</w:t>
+      </w:r>
+      <w:r>
+        <w:t xml:space="preserve"> </w:t>
+      </w:r>
+      <w:r>
+        <w:t xml:space="preserve">The introduction’s references to load-shedding are contextual. In results we report the item as</w:t>
+      </w:r>
+      <w:r>
+        <w:t xml:space="preserve"> </w:t>
+      </w:r>
+      <w:r>
+        <w:rPr>
+          <w:iCs/>
+          <w:i/>
+        </w:rPr>
+        <w:t xml:space="preserve">power interruptions</w:t>
+      </w:r>
+      <w:r>
+        <w:t xml:space="preserve"> </w:t>
+      </w:r>
+      <w:r>
+        <w:t xml:space="preserve">(export label: no electricity).</w:t>
+      </w:r>
+      <w:r>
+        <w:t xml:space="preserve"> </w:t>
+      </w:r>
+      <w:r>
+        <w:t xml:space="preserve">“</w:t>
+      </w:r>
+      <w:r>
+        <w:t xml:space="preserve">中国慕课</w:t>
+      </w:r>
+      <w:r>
+        <w:t xml:space="preserve">”</w:t>
+      </w:r>
+      <w:r>
+        <w:t xml:space="preserve"> </w:t>
+      </w:r>
+      <w:r>
+        <w:t xml:space="preserve">is reported as printed on the form; the option did not name a single provider such as 中国大学MOOC.</w:t>
+      </w:r>
+    </w:p>
+    <w:bookmarkEnd w:id="30"/>
+    <w:bookmarkStart w:id="31" w:name="analysis"/>
+    <w:p>
+      <w:pPr>
+        <w:pStyle w:val="Heading3"/>
+      </w:pPr>
+      <w:r>
+        <w:t xml:space="preserve">3.5 Analysis</w:t>
+      </w:r>
+    </w:p>
+    <w:p>
+      <w:pPr>
+        <w:pStyle w:val="FirstParagraph"/>
+      </w:pPr>
+      <w:r>
+        <w:t xml:space="preserve">Frequencies are n/38 unless noted. Multiple-response items are the percentage who selected the option. Two associations were treated as focal: (a) home affects study very much × very high stress; (b) internet speed × the appraisal index. For the 2×2 table we report cell counts and two-sided Fisher’s exact</w:t>
       </w:r>
       <w:r>
         <w:t xml:space="preserve"> </w:t>
@@ -246,706 +903,19 @@
         <w:t xml:space="preserve"> </w:t>
       </w:r>
       <w:r>
-        <w:t xml:space="preserve">= .00008). Worse reported internet speed was associated with a worse three-item perceived online-learning appraisal index (Spearman ρ = .65, bootstrap 95% CI [.36, .84]). QQ and Chaoxing were often marked unusable</w:t>
+        <w:t xml:space="preserve">(SciPy</w:t>
       </w:r>
       <w:r>
         <w:t xml:space="preserve"> </w:t>
       </w:r>
       <w:r>
-        <w:t xml:space="preserve">“</w:t>
-      </w:r>
-      <w:r>
-        <w:t xml:space="preserve">in my country</w:t>
-      </w:r>
-      <w:r>
-        <w:t xml:space="preserve">”</w:t>
-      </w:r>
-      <w:r>
-        <w:t xml:space="preserve">; Zoom and WhatsApp were more often marked available. The study is a historically situated emergency-remote-teaching case. It does not provide evidence about current hybrid practice.</w:t>
-      </w:r>
-    </w:p>
-    <w:p>
-      <w:pPr>
-        <w:pStyle w:val="BodyText"/>
-      </w:pPr>
-      <w:r>
         <w:rPr>
-          <w:bCs/>
-          <w:b/>
+          <w:rStyle w:val="VerbatimChar"/>
         </w:rPr>
-        <w:t xml:space="preserve">Keywords:</w:t>
-      </w:r>
-      <w:r>
-        <w:t xml:space="preserve"> </w:t>
-      </w:r>
-      <w:r>
-        <w:t xml:space="preserve">localisation of delivery; Chinese as an additional language; digital inequality; emergency remote teaching; Pakistan; household infrastructure</w:t>
-      </w:r>
-    </w:p>
-    <w:bookmarkEnd w:id="20"/>
-    <w:bookmarkStart w:id="21" w:name="introduction"/>
-    <w:p>
-      <w:pPr>
-        <w:pStyle w:val="Heading2"/>
-      </w:pPr>
-      <w:r>
-        <w:t xml:space="preserve">1. Introduction</w:t>
-      </w:r>
-    </w:p>
-    <w:p>
-      <w:pPr>
-        <w:pStyle w:val="FirstParagraph"/>
-      </w:pPr>
-      <w:r>
-        <w:t xml:space="preserve">International Chinese language education (ICLE) has treated localisation mainly as a problem of content and materials: local examples, annotation, and cultural comparison so that a travelling syllabus becomes learnable in a place (Zhao, 2020; Lu et al., 2024). This article proposes a further layer.</w:t>
-      </w:r>
-      <w:r>
-        <w:t xml:space="preserve"> </w:t>
-      </w:r>
-      <w:r>
-        <w:rPr>
-          <w:iCs/>
-          <w:i/>
-        </w:rPr>
-        <w:t xml:space="preserve">Localisation of delivery</w:t>
-      </w:r>
-      <w:r>
-        <w:t xml:space="preserve"> </w:t>
-      </w:r>
-      <w:r>
-        <w:t xml:space="preserve">is the institutional adaptation of time, platform, task, participation mode, and assessment to the receiving context. It differs from learner-side accessibility and from digital inclusion. Those terms describe conditions that students face. Localisation of delivery names a design task for the institution that sends the course.</w:t>
-      </w:r>
-    </w:p>
-    <w:p>
-      <w:pPr>
-        <w:pStyle w:val="BodyText"/>
-      </w:pPr>
-      <w:r>
-        <w:t xml:space="preserve">Emergency remote teaching (Hodges et al., 2020) is the historical setting in which that task became visible, not the theoretical centre of the article. When Chinese universities moved instruction online in 2020, many students of Pakistani nationality remained enrolled in Chinese-university language courses while sitting outside the campus infrastructure. A</w:t>
-      </w:r>
-      <w:r>
-        <w:t xml:space="preserve"> </w:t>
-      </w:r>
-      <w:r>
-        <w:rPr>
-          <w:iCs/>
-          <w:i/>
-        </w:rPr>
-        <w:t xml:space="preserve">travelling course</w:t>
-      </w:r>
-      <w:r>
-        <w:t xml:space="preserve">, as used here, is an institutionally designed course whose timetable, platforms, tasks, and assessment arrangements were created for one institutional setting but enacted in another (Gacs et al., 2020). Typical Chinese-university language courses assume a live oral hour and a login on tools used in Chinese higher education. The questionnaire did not name host universities or required platforms. Those campus assumptions are therefore a contextual reading of ICLE emergency practice, not a measured programme description.</w:t>
-      </w:r>
-    </w:p>
-    <w:p>
-      <w:pPr>
-        <w:pStyle w:val="BodyText"/>
-      </w:pPr>
-      <w:r>
-        <w:t xml:space="preserve">Pakistani enrolment in Chinese universities is a documented case of South–South academic mobility, structured by scholarships and the China–Pakistan Economic Corridor rather than by the more familiar</w:t>
-      </w:r>
-      <w:r>
-        <w:t xml:space="preserve"> </w:t>
-      </w:r>
-      <w:r>
-        <w:t xml:space="preserve">“</w:t>
-      </w:r>
-      <w:r>
-        <w:t xml:space="preserve">international student already on a Chinese campus</w:t>
-      </w:r>
-      <w:r>
-        <w:t xml:space="preserve">”</w:t>
-      </w:r>
-      <w:r>
-        <w:t xml:space="preserve"> </w:t>
-      </w:r>
-      <w:r>
-        <w:t xml:space="preserve">story (Iftikhar et al., 2024; Tu, 2026; Gao &amp; Hua, 2021). This study does not treat the 38 respondents as a census of that mobility. It asks how, in one network-recruited emergency-period file, household infrastructure and reported platform access co-occurred with stress, perceived learning, and judgements of whether online Chinese could replace campus classes.</w:t>
-      </w:r>
-    </w:p>
-    <w:p>
-      <w:pPr>
-        <w:pStyle w:val="BodyText"/>
-      </w:pPr>
-      <w:r>
-        <w:t xml:space="preserve">Three questions guide the analysis:</w:t>
-      </w:r>
-    </w:p>
-    <w:p>
-      <w:pPr>
-        <w:numPr>
-          <w:ilvl w:val="0"/>
-          <w:numId w:val="1001"/>
-        </w:numPr>
-        <w:pStyle w:val="Compact"/>
-      </w:pPr>
-      <w:r>
-        <w:t xml:space="preserve">What household, connectivity, and platform-access conditions did respondents report?</w:t>
-      </w:r>
-    </w:p>
-    <w:p>
-      <w:pPr>
-        <w:numPr>
-          <w:ilvl w:val="0"/>
-          <w:numId w:val="1001"/>
-        </w:numPr>
-        <w:pStyle w:val="Compact"/>
-      </w:pPr>
-      <w:r>
-        <w:t xml:space="preserve">In this sample, how did selected household and connectivity reports co-occur with very high stress and with perceived online-learning appraisal?</w:t>
-      </w:r>
-    </w:p>
-    <w:p>
-      <w:pPr>
-        <w:numPr>
-          <w:ilvl w:val="0"/>
-          <w:numId w:val="1001"/>
-        </w:numPr>
-        <w:pStyle w:val="Compact"/>
-      </w:pPr>
-      <w:r>
-        <w:t xml:space="preserve">How did respondents judge whether online Chinese could replace campus classes?</w:t>
-      </w:r>
-    </w:p>
-    <w:p>
-      <w:pPr>
-        <w:pStyle w:val="FirstParagraph"/>
-      </w:pPr>
-      <w:r>
-        <w:t xml:space="preserve">The analysis is exploratory. Associations are reported as counts, exact tests, and rank correlations in this network. They are not confirmatory tests of a population model.</w:t>
-      </w:r>
-    </w:p>
-    <w:bookmarkEnd w:id="21"/>
-    <w:bookmarkStart w:id="26" w:name="literature-and-framework"/>
-    <w:p>
-      <w:pPr>
-        <w:pStyle w:val="Heading2"/>
-      </w:pPr>
-      <w:r>
-        <w:t xml:space="preserve">2. Literature and framework</w:t>
-      </w:r>
-    </w:p>
-    <w:bookmarkStart w:id="22" w:name="X466d9fa4ba9675c3d2d096fe48fd97f00c4a10c"/>
-    <w:p>
-      <w:pPr>
-        <w:pStyle w:val="Heading3"/>
-      </w:pPr>
-      <w:r>
-        <w:t xml:space="preserve">2.1 Emergency remote teaching as historical context</w:t>
-      </w:r>
-    </w:p>
-    <w:p>
-      <w:pPr>
-        <w:pStyle w:val="FirstParagraph"/>
-      </w:pPr>
-      <w:r>
-        <w:t xml:space="preserve">Hodges et al. (2020) distinguished emergency remote teaching from planned online or blended courses. Gacs, Goertler and Spasova (2020) applied that distinction to languages. Reviews of language-teacher responses during the conversion to online teaching report thinner interaction and the entry of the domestic setting into the lesson (MacIntyre et al., 2020; Moorhouse &amp; Kohnke, 2021). Those studies are cited as emergency-teaching context, not as direct evidence of student stress in the present file.</w:t>
-      </w:r>
-    </w:p>
-    <w:p>
-      <w:pPr>
-        <w:pStyle w:val="BodyText"/>
-      </w:pPr>
-      <w:r>
-        <w:t xml:space="preserve">Later work described technological normalisation after the return to campus (Moorhouse, 2023; Moorhouse, Wong, &amp; Li, 2023) and warned that copying face-to-face teaching on videoconferencing was a limited lesson from the crisis (Stockwell &amp; Wang, 2023). For Chinese, contemporaneous papers documented</w:t>
-      </w:r>
-      <w:r>
-        <w:t xml:space="preserve"> </w:t>
-      </w:r>
-      <w:r>
-        <w:t xml:space="preserve">“</w:t>
-      </w:r>
-      <w:r>
-        <w:t xml:space="preserve">suspending classes without stopping learning</w:t>
-      </w:r>
-      <w:r>
-        <w:t xml:space="preserve">”</w:t>
-      </w:r>
-      <w:r>
-        <w:t xml:space="preserve"> </w:t>
-      </w:r>
-      <w:r>
-        <w:t xml:space="preserve">and platform trials (Zhang et al., 2020; Xia et al., 2022). A later review of online ICLE teaching models still lists technical issues, weak interaction, and time-zone problems (Li &amp; Li, 2024). Much of that literature assumes a relatively stable connection. The present file cannot test whether that assumption holds for current hybrid ICLE. It can describe what 38 respondents reported in February 2022.</w:t>
-      </w:r>
-    </w:p>
-    <w:bookmarkEnd w:id="22"/>
-    <w:bookmarkStart w:id="23" w:name="X2a1706acb855f9b47e20bf43e0bff03a0be2114"/>
-    <w:p>
-      <w:pPr>
-        <w:pStyle w:val="Heading3"/>
-      </w:pPr>
-      <w:r>
-        <w:t xml:space="preserve">2.2 Digital inequality and home learning ecology</w:t>
-      </w:r>
-    </w:p>
-    <w:p>
-      <w:pPr>
-        <w:pStyle w:val="FirstParagraph"/>
-      </w:pPr>
-      <w:r>
-        <w:t xml:space="preserve">Later digital-divide models describe a sequence of motivational, material, skills, usage, and outcome access (van Dijk, 2020; Helsper, 2021; Warschauer, 2003). Device ownership is not the same as taking part (Ali, 2020). In Pakistan, household use of educational technology is also structured by device sharing, care work, and electricity (Raza &amp; Hennessy, 2025). That report is grey literature and is used only as background on household conditions, not as a standalone empirical claim about this sample.</w:t>
-      </w:r>
-    </w:p>
-    <w:p>
-      <w:pPr>
-        <w:pStyle w:val="BodyText"/>
-      </w:pPr>
-      <w:r>
-        <w:t xml:space="preserve">Ecological views of language education take the setting of the class, not only the student plus the application, as the unit of analysis (van Lier, 2004; Guerrettaz et al., 2021). In this article that setting is described as a</w:t>
-      </w:r>
-      <w:r>
-        <w:t xml:space="preserve"> </w:t>
-      </w:r>
-      <w:r>
-        <w:rPr>
-          <w:iCs/>
-          <w:i/>
-        </w:rPr>
-        <w:t xml:space="preserve">home learning ecology</w:t>
-      </w:r>
-      <w:r>
-        <w:t xml:space="preserve">: domestic space, paid or care work, and the conditions of oral participation. Electricity interruptions, blocked applications, and weak bandwidth are treated as material and infrastructural conditions, not as cultural traits.</w:t>
-      </w:r>
-    </w:p>
-    <w:bookmarkEnd w:id="23"/>
-    <w:bookmarkStart w:id="24" w:name="localisation-of-delivery"/>
-    <w:p>
-      <w:pPr>
-        <w:pStyle w:val="Heading3"/>
-      </w:pPr>
-      <w:r>
-        <w:t xml:space="preserve">2.3 Localisation of delivery</w:t>
-      </w:r>
-    </w:p>
-    <w:p>
-      <w:pPr>
-        <w:pStyle w:val="FirstParagraph"/>
-      </w:pPr>
-      <w:r>
-        <w:t xml:space="preserve">In materials work, localisation has meant personalising content so that it speaks to a particular group (McDonough &amp; Shaw, 2003; Tomlinson, 2011). Canagarajah (2005) and Kumaravadivelu (2001) locate pedagogy in a specific group and place. China’s promotion of Chinese has long been tied to institutes, textbooks, and tests (Zhao &amp; Huang, 2010). ICLE studies have applied localisation to curriculum construction and textbook adaptation (Zhao, 2020; Lu et al., 2024). Lam (2024) treats glocalisation as fitting a travelling literacy to a local university classroom. Guerrettaz et al. (2021) extend materials from the page to use. If the material is a live class, use includes whether the class can be entered.</w:t>
-      </w:r>
-    </w:p>
-    <w:p>
-      <w:pPr>
-        <w:pStyle w:val="BodyText"/>
-      </w:pPr>
-      <w:r>
-        <w:t xml:space="preserve">Four layers can be distinguished:</w:t>
-      </w:r>
-    </w:p>
-    <w:p>
-      <w:pPr>
-        <w:numPr>
-          <w:ilvl w:val="0"/>
-          <w:numId w:val="1002"/>
-        </w:numPr>
-        <w:pStyle w:val="Compact"/>
-      </w:pPr>
-      <w:r>
-        <w:t xml:space="preserve">Localisation of</w:t>
-      </w:r>
-      <w:r>
-        <w:t xml:space="preserve"> </w:t>
-      </w:r>
-      <w:r>
-        <w:rPr>
-          <w:iCs/>
-          <w:i/>
-        </w:rPr>
-        <w:t xml:space="preserve">content</w:t>
-      </w:r>
-      <w:r>
-        <w:t xml:space="preserve">: examples, festivals, and cultural comparison.</w:t>
-      </w:r>
-    </w:p>
-    <w:p>
-      <w:pPr>
-        <w:numPr>
-          <w:ilvl w:val="0"/>
-          <w:numId w:val="1002"/>
-        </w:numPr>
-        <w:pStyle w:val="Compact"/>
-      </w:pPr>
-      <w:r>
-        <w:t xml:space="preserve">Localisation of</w:t>
-      </w:r>
-      <w:r>
-        <w:t xml:space="preserve"> </w:t>
-      </w:r>
-      <w:r>
-        <w:rPr>
-          <w:iCs/>
-          <w:i/>
-        </w:rPr>
-        <w:t xml:space="preserve">materials</w:t>
-      </w:r>
-      <w:r>
-        <w:t xml:space="preserve">: annotation, mediation language, and page redesign.</w:t>
-      </w:r>
-    </w:p>
-    <w:p>
-      <w:pPr>
-        <w:numPr>
-          <w:ilvl w:val="0"/>
-          <w:numId w:val="1002"/>
-        </w:numPr>
-        <w:pStyle w:val="Compact"/>
-      </w:pPr>
-      <w:r>
-        <w:t xml:space="preserve">Localisation of</w:t>
-      </w:r>
-      <w:r>
-        <w:t xml:space="preserve"> </w:t>
-      </w:r>
-      <w:r>
-        <w:rPr>
-          <w:iCs/>
-          <w:i/>
-        </w:rPr>
-        <w:t xml:space="preserve">curriculum</w:t>
-      </w:r>
-      <w:r>
-        <w:t xml:space="preserve">: pathway, hours, and assessment of a named programme (Shan &amp; Xu, 2024; Zhao, 2020).</w:t>
-      </w:r>
-    </w:p>
-    <w:p>
-      <w:pPr>
-        <w:numPr>
-          <w:ilvl w:val="0"/>
-          <w:numId w:val="1002"/>
-        </w:numPr>
-        <w:pStyle w:val="Compact"/>
-      </w:pPr>
-      <w:r>
-        <w:t xml:space="preserve">Localisation of</w:t>
-      </w:r>
-      <w:r>
-        <w:t xml:space="preserve"> </w:t>
-      </w:r>
-      <w:r>
-        <w:rPr>
-          <w:iCs/>
-          <w:i/>
-        </w:rPr>
-        <w:t xml:space="preserve">delivery</w:t>
-      </w:r>
-      <w:r>
-        <w:t xml:space="preserve">: institutional adaptation of time, platform, task, participation mode, and assessment to the receiving context.</w:t>
-      </w:r>
-    </w:p>
-    <w:p>
-      <w:pPr>
-        <w:pStyle w:val="FirstParagraph"/>
-      </w:pPr>
-      <w:r>
-        <w:t xml:space="preserve">This article addresses only the fourth layer. Accessibility and digital inclusion describe constraints that learners report. Localisation of delivery is the institutional response: changing the live hour, the required application, the oral task, or the assessment so that the travelling course can be used where the student actually sits. The questionnaire did not observe institutions adapting. It recorded student-side conditions that, if taken seriously, would require such adaptation.</w:t>
-      </w:r>
-    </w:p>
-    <w:p>
-      <w:pPr>
-        <w:pStyle w:val="BodyText"/>
-      </w:pPr>
-      <w:r>
-        <w:t xml:space="preserve">Gong, Gao and Lyu (2020) review ICLE in mainland China for 2014–2018 and are cited for that pre-pandemic field map, not as post-COVID evidence. Gao and Hua (2021) and Gong, Gao, Li and Lai (2020) document international students of Chinese</w:t>
-      </w:r>
-      <w:r>
-        <w:t xml:space="preserve"> </w:t>
-      </w:r>
-      <w:r>
-        <w:rPr>
-          <w:iCs/>
-          <w:i/>
-        </w:rPr>
-        <w:t xml:space="preserve">in</w:t>
-      </w:r>
-      <w:r>
-        <w:t xml:space="preserve"> </w:t>
-      </w:r>
-      <w:r>
-        <w:t xml:space="preserve">Chinese universities. Guenier, Xing and Yan (2026) describe a designed online Chinese-culture course, which is planned online teaching rather than emergency remote teaching. The present respondents were enrolled in Chinese universities and answered a form about online Chinese classes. They were not a Confucius Institute classroom sample.</w:t>
-      </w:r>
-    </w:p>
-    <w:bookmarkEnd w:id="24"/>
-    <w:bookmarkStart w:id="25" w:name="conceptual-model"/>
-    <w:p>
-      <w:pPr>
-        <w:pStyle w:val="Heading3"/>
-      </w:pPr>
-      <w:r>
-        <w:t xml:space="preserve">2.4 Conceptual model</w:t>
-      </w:r>
-    </w:p>
-    <w:p>
-      <w:pPr>
-        <w:pStyle w:val="FirstParagraph"/>
-      </w:pPr>
-      <w:r>
-        <w:t xml:space="preserve">Figure 1 is a reading model, not a tested path. Household infrastructure and reported platform access are concurrent conditions of a travelling course. They are described as possible constraints on participation. Language investment is not part of the model.</w:t>
-      </w:r>
-    </w:p>
-    <w:p>
-      <w:pPr>
-        <w:pStyle w:val="BodyText"/>
-      </w:pPr>
-      <w:r>
-        <w:t xml:space="preserve">Figure 1. Localisation of delivery as delivery-context fit (reading model). Household infrastructure (power interruptions, network stability, speed) and reported platform access are concurrent conditions. They are interpreted as possible constraints on participation and on self-reported stress, interaction, appraisal, and replacement judgements. The figure is not a causal path.</w:t>
-      </w:r>
-    </w:p>
-    <w:bookmarkEnd w:id="25"/>
-    <w:bookmarkEnd w:id="26"/>
-    <w:bookmarkStart w:id="33" w:name="the-study"/>
-    <w:p>
-      <w:pPr>
-        <w:pStyle w:val="Heading2"/>
-      </w:pPr>
-      <w:r>
-        <w:t xml:space="preserve">3. The study</w:t>
-      </w:r>
-    </w:p>
-    <w:bookmarkStart w:id="27" w:name="design"/>
-    <w:p>
-      <w:pPr>
-        <w:pStyle w:val="Heading3"/>
-      </w:pPr>
-      <w:r>
-        <w:t xml:space="preserve">3.1 Design</w:t>
-      </w:r>
-    </w:p>
-    <w:p>
-      <w:pPr>
-        <w:pStyle w:val="FirstParagraph"/>
-      </w:pPr>
-      <w:r>
-        <w:t xml:space="preserve">The study is an exploratory, cross-sectional questionnaire. It does not test a pre-registered confirmatory model. The instrument title on the Wenjuan export is 新冠肺炎期间留学生在线中文学习的影响因素 (Influencing factors in international students’ online Chinese learning during COVID-19). Complete cases were submitted between 5 and 8 February 2022 (N = 38).</w:t>
-      </w:r>
-    </w:p>
-    <w:bookmarkEnd w:id="27"/>
-    <w:bookmarkStart w:id="28" w:name="recruitment-and-eligibility"/>
-    <w:p>
-      <w:pPr>
-        <w:pStyle w:val="Heading3"/>
-      </w:pPr>
-      <w:r>
-        <w:t xml:space="preserve">3.2 Recruitment and eligibility</w:t>
-      </w:r>
-    </w:p>
-    <w:p>
-      <w:pPr>
-        <w:pStyle w:val="FirstParagraph"/>
-      </w:pPr>
-      <w:r>
-        <w:t xml:space="preserve">The file is a convenience sample. The form did not record how the link was distributed (for example WeChat, WhatsApp, email, or student groups). The research team therefore cannot name the recruitment channel. Eligibility was implicit: adult respondents who completed the Chinese-medium form about online Chinese learning. The form did not ask host university, city of residence that week, degree versus non-degree status, or scholarship type. Two items asked whether required courses and electives were online (71.1% and 60.5% ticked those options). Those ticks do not identify a named programme.</w:t>
-      </w:r>
-    </w:p>
-    <w:bookmarkEnd w:id="28"/>
-    <w:bookmarkStart w:id="29" w:name="participants"/>
-    <w:p>
-      <w:pPr>
-        <w:pStyle w:val="Heading3"/>
-      </w:pPr>
-      <w:r>
-        <w:t xml:space="preserve">3.3 Participants</w:t>
-      </w:r>
-    </w:p>
-    <w:p>
-      <w:pPr>
-        <w:pStyle w:val="FirstParagraph"/>
-      </w:pPr>
-      <w:r>
-        <w:t xml:space="preserve">Of 38 respondents, 27 were men (71.1%) and 11 women (28.9%). Thirty-seven selected Pakistani nationality and one selected</w:t>
-      </w:r>
-      <w:r>
-        <w:t xml:space="preserve"> </w:t>
-      </w:r>
-      <w:r>
-        <w:t xml:space="preserve">“</w:t>
-      </w:r>
-      <w:r>
-        <w:t xml:space="preserve">other</w:t>
-      </w:r>
-      <w:r>
-        <w:t xml:space="preserve">”</w:t>
-      </w:r>
-      <w:r>
-        <w:t xml:space="preserve"> </w:t>
-      </w:r>
-      <w:r>
-        <w:t xml:space="preserve">(Bangladesh). Self-rated Chinese level was mostly advanced (22, 57.9%) or intermediate (15, 39.5%); one beginner. That label is the student’s own, not an HSK band. Years of learning Chinese clustered at three to four years (26, 68.4%). Wenjuan submission metadata classified the operating system as iPhone (24, 63.2%) or Android (14). That variable is the device used to submit the form, not a survey item about all devices used for class.</w:t>
-      </w:r>
-    </w:p>
-    <w:p>
-      <w:pPr>
-        <w:pStyle w:val="BodyText"/>
-      </w:pPr>
-      <w:r>
-        <w:t xml:space="preserve">Wenjuan automatically recorded an IP-province field. The research team coded a dummy when that field was a mainland China province name (9 of 38). IP labels are technical metadata. They can be affected by virtual private networks and proxies and are not a reliable measure of physical location. They are not used as a participant-location variable and are not the basis of a sensitivity analysis.</w:t>
-      </w:r>
-    </w:p>
-    <w:p>
-      <w:pPr>
-        <w:pStyle w:val="BodyText"/>
-      </w:pPr>
-      <w:r>
-        <w:t xml:space="preserve">The sample is described as</w:t>
-      </w:r>
-      <w:r>
-        <w:t xml:space="preserve"> </w:t>
-      </w:r>
-      <w:r>
-        <w:rPr>
-          <w:iCs/>
-          <w:i/>
-        </w:rPr>
-        <w:t xml:space="preserve">mainly Pakistani Chinese-university language students studying remotely in February 2022</w:t>
-      </w:r>
-      <w:r>
-        <w:t xml:space="preserve">. It is not described as students exclusively in Pakistan, as CSC students, or as a draw from all Pakistani students in Chinese universities.</w:t>
-      </w:r>
-    </w:p>
-    <w:bookmarkEnd w:id="29"/>
-    <w:bookmarkStart w:id="30" w:name="instrument-and-coding"/>
-    <w:p>
-      <w:pPr>
-        <w:pStyle w:val="Heading3"/>
-      </w:pPr>
-      <w:r>
-        <w:t xml:space="preserve">3.4 Instrument and coding</w:t>
-      </w:r>
-    </w:p>
-    <w:p>
-      <w:pPr>
-        <w:pStyle w:val="FirstParagraph"/>
-      </w:pPr>
-      <w:r>
-        <w:t xml:space="preserve">The questionnaire comprised about 30 items: demographics, single-choice ordinals, and multiple-response lists. Stems are in Chinese, with some non-native wording (for example 您尝尝用什么平台). English glosses are used for reporting. Item wording for the appraisal index is given in Appendix A.</w:t>
-      </w:r>
-    </w:p>
-    <w:p>
-      <w:pPr>
-        <w:pStyle w:val="BodyText"/>
-      </w:pPr>
-      <w:r>
-        <w:t xml:space="preserve">A three-item</w:t>
-      </w:r>
-      <w:r>
-        <w:t xml:space="preserve"> </w:t>
-      </w:r>
-      <w:r>
-        <w:rPr>
-          <w:iCs/>
-          <w:i/>
-        </w:rPr>
-        <w:t xml:space="preserve">perceived online-learning appraisal index</w:t>
-      </w:r>
-      <w:r>
-        <w:t xml:space="preserve"> </w:t>
-      </w:r>
-      <w:r>
-        <w:t xml:space="preserve">was formed from learned much (Q8), improves Chinese (Q9), and sparks interest (Q10). The items ask related but not identical questions. They are treated as a descriptive index, not as a validated unidimensional scale. Internal consistency was acceptable in this sample (Cronbach’s α = .84); Spearman inter-item correlations ranged from .55 to .75 (Appendix B). Exploratory factor analysis was not used (N = 38). Individual items are also reported. One double-tick on</w:t>
-      </w:r>
-      <w:r>
-        <w:t xml:space="preserve"> </w:t>
-      </w:r>
-      <w:r>
-        <w:t xml:space="preserve">“</w:t>
-      </w:r>
-      <w:r>
-        <w:t xml:space="preserve">like online classes</w:t>
-      </w:r>
-      <w:r>
-        <w:t xml:space="preserve">”</w:t>
-      </w:r>
-      <w:r>
-        <w:t xml:space="preserve"> </w:t>
-      </w:r>
-      <w:r>
-        <w:t xml:space="preserve">was excluded for that item only (n = 37 valid).</w:t>
-      </w:r>
-    </w:p>
-    <w:p>
-      <w:pPr>
-        <w:pStyle w:val="BodyText"/>
-      </w:pPr>
-      <w:r>
-        <w:t xml:space="preserve">Coding follows the Wenjuan export. Higher values on speed, learned, improve, interest, and teacher interaction indicate a more negative report (worse speed; less learning, improvement, or interest; thinner interaction). Stress is coded 1 = very high to 4 = none; the focal stress analysis uses a dummy for very high stress and does not reverse the ordinal. Full directions are in Table A1.</w:t>
-      </w:r>
-    </w:p>
-    <w:p>
-      <w:pPr>
-        <w:pStyle w:val="BodyText"/>
-      </w:pPr>
-      <w:r>
-        <w:t xml:space="preserve">The export labelled one multiple-response problem as</w:t>
-      </w:r>
-      <w:r>
-        <w:t xml:space="preserve"> </w:t>
-      </w:r>
-      <w:r>
-        <w:t xml:space="preserve">“</w:t>
-      </w:r>
-      <w:r>
-        <w:t xml:space="preserve">no electricity.</w:t>
-      </w:r>
-      <w:r>
-        <w:t xml:space="preserve">”</w:t>
-      </w:r>
-      <w:r>
-        <w:t xml:space="preserve"> </w:t>
-      </w:r>
-      <w:r>
-        <w:t xml:space="preserve">The introduction’s references to load-shedding are contextual. In results we report the item as</w:t>
-      </w:r>
-      <w:r>
-        <w:t xml:space="preserve"> </w:t>
-      </w:r>
-      <w:r>
-        <w:rPr>
-          <w:iCs/>
-          <w:i/>
-        </w:rPr>
-        <w:t xml:space="preserve">power interruptions</w:t>
-      </w:r>
-      <w:r>
-        <w:t xml:space="preserve"> </w:t>
-      </w:r>
-      <w:r>
-        <w:t xml:space="preserve">(export label: no electricity).</w:t>
-      </w:r>
-      <w:r>
-        <w:t xml:space="preserve"> </w:t>
-      </w:r>
-      <w:r>
-        <w:t xml:space="preserve">“</w:t>
-      </w:r>
-      <w:r>
-        <w:t xml:space="preserve">中国慕课</w:t>
-      </w:r>
-      <w:r>
-        <w:t xml:space="preserve">”</w:t>
-      </w:r>
-      <w:r>
-        <w:t xml:space="preserve"> </w:t>
-      </w:r>
-      <w:r>
-        <w:t xml:space="preserve">is reported as printed on the form; the option did not name a single provider such as 中国大学MOOC.</w:t>
-      </w:r>
-    </w:p>
-    <w:bookmarkEnd w:id="30"/>
-    <w:bookmarkStart w:id="31" w:name="analysis"/>
-    <w:p>
-      <w:pPr>
-        <w:pStyle w:val="Heading3"/>
-      </w:pPr>
-      <w:r>
-        <w:t xml:space="preserve">3.5 Analysis</w:t>
-      </w:r>
-    </w:p>
-    <w:p>
-      <w:pPr>
-        <w:pStyle w:val="FirstParagraph"/>
-      </w:pPr>
-      <w:r>
-        <w:t xml:space="preserve">Frequencies are n/38 unless noted. Multiple-response items are the percentage who selected the option. Two associations were treated as focal: (a) home affects study very much × very high stress; (b) internet speed × the appraisal index. For the 2×2 table we report cell counts and two-sided Fisher’s exact</w:t>
+        <w:t xml:space="preserve">fisher_exact</w:t>
+      </w:r>
+      <w:r>
+        <w:t xml:space="preserve">). Odds ratios and Wald confidence intervals are not reported: at N = 38 they are unstable, and a Wald interval can disagree with Fisher’s</w:t>
       </w:r>
       <w:r>
         <w:t xml:space="preserve"> </w:t>
@@ -958,22 +928,7 @@
         <w:t xml:space="preserve">p</w:t>
       </w:r>
       <w:r>
-        <w:t xml:space="preserve"> </w:t>
-      </w:r>
-      <w:r>
-        <w:t xml:space="preserve">(SciPy</w:t>
-      </w:r>
-      <w:r>
-        <w:t xml:space="preserve"> </w:t>
-      </w:r>
-      <w:r>
-        <w:rPr>
-          <w:rStyle w:val="VerbatimChar"/>
-        </w:rPr>
-        <w:t xml:space="preserve">fisher_exact</w:t>
-      </w:r>
-      <w:r>
-        <w:t xml:space="preserve">). Odds ratios and Wald confidence intervals are not reported: at N = 38 they are unstable, and a Wald interval can disagree with Fisher’s</w:t>
+        <w:t xml:space="preserve">. For the ordinal pair we report Spearman’s ρ and a percentile bootstrap 95% confidence interval calculated from 5,000 resamples. Other associations, including gender, are secondary and are placed in Appendix B.</w:t>
       </w:r>
       <w:r>
         <w:t xml:space="preserve"> </w:t>
@@ -986,19 +941,6 @@
         <w:t xml:space="preserve">p</w:t>
       </w:r>
       <w:r>
-        <w:t xml:space="preserve">. For the ordinal pair we report Spearman’s ρ and a bootstrap 95% confidence interval (5,000 resamples). Other associations, including gender, are secondary and are placed in Appendix B.</w:t>
-      </w:r>
-      <w:r>
-        <w:t xml:space="preserve"> </w:t>
-      </w:r>
-      <w:r>
-        <w:rPr>
-          <w:iCs/>
-          <w:i/>
-        </w:rPr>
-        <w:t xml:space="preserve">p</w:t>
-      </w:r>
-      <w:r>
         <w:t xml:space="preserve"> </w:t>
       </w:r>
       <w:r>
@@ -1010,7 +952,7 @@
         <w:pStyle w:val="BodyText"/>
       </w:pPr>
       <w:r>
-        <w:t xml:space="preserve">A Pakistani-nationality check (n = 37) is reported only to show that dropping the one Bangladeshi case does not reverse the two focal associations. It is not a location analysis.</w:t>
+        <w:t xml:space="preserve">A Pakistani-nationality check (n = 37) is reported only to show that dropping the one non-Pakistani case does not reverse the two focal associations. It is not a location analysis.</w:t>
       </w:r>
     </w:p>
     <w:bookmarkEnd w:id="31"/>
@@ -1028,7 +970,7 @@
         <w:pStyle w:val="FirstParagraph"/>
       </w:pPr>
       <w:r>
-        <w:t xml:space="preserve">Adult respondents completed an online form presented as research on online Chinese learning. The form stated that answers would be used for research. Completion and submission were treated as consent. Names, IP addresses, and exact timestamps beyond the collection dates were removed before analysis. The de-identified file does not include those fields.</w:t>
+        <w:t xml:space="preserve">Adult respondents completed an online form presented as research on online Chinese learning. The form stated that answers would be used for research. Completion and submission were treated as consent. Names, IP addresses, exact timestamps, and device identifiers were removed before the public file was prepared.</w:t>
       </w:r>
     </w:p>
     <w:p>
@@ -1036,7 +978,7 @@
         <w:pStyle w:val="BodyText"/>
       </w:pPr>
       <w:r>
-        <w:t xml:space="preserve">No institutional ethics-committee number is available for the original 2022 collection. The first author was then an M.Phil. student; numbered approval was not obtained. The present article is an anonymised secondary analysis of that file. Authors should seek retrospective institutional confirmation or a waiver from their current ethics office before ScholarOne upload if the journal requires a protocol number. No approval number has been invented.</w:t>
+        <w:t xml:space="preserve">No institutional ethics approval number is available for the original 2022 data collection. The first author was then an M.Phil. student; numbered approval was not obtained. This paper reports an anonymised secondary analysis of that file.</w:t>
       </w:r>
     </w:p>
     <w:bookmarkEnd w:id="32"/>
@@ -1267,7 +1209,7 @@
               <w:jc w:val="left"/>
             </w:pPr>
             <w:r>
-              <w:t xml:space="preserve">Other (Bangladesh)</w:t>
+              <w:t xml:space="preserve">Other</w:t>
             </w:r>
           </w:p>
         </w:tc>
@@ -1540,7 +1482,7 @@
         <w:t xml:space="preserve"> </w:t>
       </w:r>
       <w:r>
-        <w:t xml:space="preserve">Convenience sample, Wenjuan, 5 to 8 February 2022. Device is the operating system recorded at submission.</w:t>
+        <w:t xml:space="preserve">Convenience sample, Wenjuan, 5 to 8 February 2022. Device is the operating system recorded at submission, reported only as an aggregate.</w:t>
       </w:r>
     </w:p>
     <w:p>
@@ -1976,7 +1918,7 @@
         <w:pStyle w:val="BodyText"/>
       </w:pPr>
       <w:r>
-        <w:t xml:space="preserve">Among those who said the home affected study very much, 11 of 14 also reported very high psychological stress; among the others, 3 of 24 did (Fisher’s exact</w:t>
+        <w:t xml:space="preserve">Among those who said the home affected study very much, 11 of 14 also reported very high psychological stress; among the others, 3 of 24 did (two-sided Fisher’s exact</w:t>
       </w:r>
       <w:r>
         <w:t xml:space="preserve"> </w:t>
@@ -1992,7 +1934,7 @@
         <w:t xml:space="preserve"> </w:t>
       </w:r>
       <w:r>
-        <w:t xml:space="preserve">= .00008). This is a co-occurrence in this file. It is not evidence that the household caused stress. The most salient descriptive stress finding was that 36.8% reported very high stress.</w:t>
+        <w:t xml:space="preserve">= .00008). This is a co-occurrence in this dataset. It is not evidence that the household caused stress. The most salient descriptive stress finding was that 36.8% reported very high stress.</w:t>
       </w:r>
     </w:p>
     <w:bookmarkEnd w:id="34"/>
@@ -2060,7 +2002,7 @@
           <w:iCs/>
           <w:i/>
         </w:rPr>
-        <w:t xml:space="preserve">Platforms used, blocked, and available (multiple response, % of 38)</w:t>
+        <w:t xml:space="preserve">Reported use and perceived availability of platforms (multiple response, N = 38)</w:t>
       </w:r>
     </w:p>
     <w:tbl>
@@ -2112,7 +2054,7 @@
               <w:jc w:val="right"/>
             </w:pPr>
             <w:r>
-              <w:t xml:space="preserve">Cannot use in my country</w:t>
+              <w:t xml:space="preserve">Marked unusable in my country</w:t>
             </w:r>
           </w:p>
         </w:tc>
@@ -2565,6 +2507,24 @@
       <w:r>
         <w:t xml:space="preserve">is the stem wording. QQ, Chaoxing, DingTalk, and 中国慕课 are platforms often used in Chinese-university teaching; they are not exclusively campus systems.</w:t>
       </w:r>
+      <w:r>
+        <w:t xml:space="preserve"> </w:t>
+      </w:r>
+      <w:r>
+        <w:t xml:space="preserve">“</w:t>
+      </w:r>
+      <w:r>
+        <w:t xml:space="preserve">Marked unusable</w:t>
+      </w:r>
+      <w:r>
+        <w:t xml:space="preserve">”</w:t>
+      </w:r>
+      <w:r>
+        <w:t xml:space="preserve"> </w:t>
+      </w:r>
+      <w:r>
+        <w:t xml:space="preserve">follows the item wording and is not a technical claim that the platform was blocked.</w:t>
+      </w:r>
     </w:p>
     <w:bookmarkEnd w:id="35"/>
     <w:bookmarkStart w:id="36" w:name="perceived-learning-and-internet-speed"/>
@@ -2641,7 +2601,7 @@
         <w:t xml:space="preserve"> </w:t>
       </w:r>
       <w:r>
-        <w:t xml:space="preserve">= .000009, bootstrap 95% CI [.36, .84]). A count of three infrastructure ticks (unstable network, power interruptions, no signal) was not associated with the index (ρ = .02,</w:t>
+        <w:t xml:space="preserve">&lt; .001, percentile bootstrap 95% CI [.36, .84]). A simple, unvalidated count of selected infrastructure-problem ticks (unstable network, power interruptions, no signal) was not associated with the index (ρ = .02,</w:t>
       </w:r>
       <w:r>
         <w:t xml:space="preserve"> </w:t>
@@ -2657,7 +2617,7 @@
         <w:t xml:space="preserve"> </w:t>
       </w:r>
       <w:r>
-        <w:t xml:space="preserve">= .91, bootstrap 95% CI [−.32, .37]). In this file, reported speed co-occurred with appraisal; ticking several problems did not. These are rank associations, not effects of infrastructure on learning.</w:t>
+        <w:t xml:space="preserve">= .91, percentile bootstrap 95% CI [−.32, .37]). The count is an exploratory post hoc descriptive indicator. Unstable network and no signal may overlap, and power interruptions are a different infrastructure layer. The non-significant correlation is therefore not interpreted as evidence that speed matters but the number of problems does not. These are rank associations, not effects of infrastructure on learning.</w:t>
       </w:r>
     </w:p>
     <w:p>
@@ -2765,7 +2725,7 @@
               <w:jc w:val="left"/>
             </w:pPr>
             <w:r>
-              <w:t xml:space="preserve">11/14 vs 3/24; Fisher’s exact</w:t>
+              <w:t xml:space="preserve">11/14 vs 3/24; two-sided Fisher’s exact</w:t>
             </w:r>
             <w:r>
               <w:t xml:space="preserve"> </w:t>
@@ -2807,7 +2767,7 @@
               <w:jc w:val="left"/>
             </w:pPr>
             <w:r>
-              <w:t xml:space="preserve">ρ = .65, bootstrap 95% CI [.36, .84],</w:t>
+              <w:t xml:space="preserve">ρ = .65, percentile bootstrap 95% CI [.36, .84],</w:t>
             </w:r>
             <w:r>
               <w:t xml:space="preserve"> </w:t>
@@ -2823,7 +2783,7 @@
               <w:t xml:space="preserve"> </w:t>
             </w:r>
             <w:r>
-              <w:t xml:space="preserve">= .000009</w:t>
+              <w:t xml:space="preserve">&lt; .001</w:t>
             </w:r>
           </w:p>
         </w:tc>
@@ -2837,7 +2797,7 @@
               <w:jc w:val="left"/>
             </w:pPr>
             <w:r>
-              <w:t xml:space="preserve">Infrastructure-problem count × appraisal index</w:t>
+              <w:t xml:space="preserve">Infrastructure-problem count × appraisal index (exploratory post hoc)</w:t>
             </w:r>
           </w:p>
         </w:tc>
@@ -2849,7 +2809,7 @@
               <w:jc w:val="left"/>
             </w:pPr>
             <w:r>
-              <w:t xml:space="preserve">ρ = .02, bootstrap 95% CI [−.32, .37],</w:t>
+              <w:t xml:space="preserve">ρ = .02, percentile bootstrap 95% CI [−.32, .37],</w:t>
             </w:r>
             <w:r>
               <w:t xml:space="preserve"> </w:t>
@@ -2886,7 +2846,7 @@
         <w:t xml:space="preserve"> </w:t>
       </w:r>
       <w:r>
-        <w:t xml:space="preserve">Analyses are exploratory. Odds ratios are omitted.</w:t>
+        <w:t xml:space="preserve">Analyses are exploratory. Odds ratios are omitted. The infrastructure-problem count is an unvalidated post hoc indicator and is not treated as a parallel scale.</w:t>
       </w:r>
     </w:p>
     <w:p>
@@ -2894,7 +2854,7 @@
         <w:pStyle w:val="BodyText"/>
       </w:pPr>
       <w:r>
-        <w:t xml:space="preserve">Among Pakistani-nationality respondents only (n = 37), the home–stress table remained 11/14 versus 3/23 (Fisher’s exact</w:t>
+        <w:t xml:space="preserve">Among Pakistani-nationality respondents only (n = 37), the home–stress table remained 11/14 versus 3/23 (two-sided Fisher’s exact</w:t>
       </w:r>
       <w:r>
         <w:t xml:space="preserve"> </w:t>
@@ -2910,7 +2870,7 @@
         <w:t xml:space="preserve"> </w:t>
       </w:r>
       <w:r>
-        <w:t xml:space="preserve">= .00011) and speed × appraisal was ρ = .67 (bootstrap 95% CI [.39, .85]).</w:t>
+        <w:t xml:space="preserve">= .00011) and speed × appraisal was ρ = .67 (percentile bootstrap 95% CI [.39, .85]).</w:t>
       </w:r>
     </w:p>
     <w:bookmarkEnd w:id="36"/>
@@ -2947,7 +2907,7 @@
         <w:pStyle w:val="FirstParagraph"/>
       </w:pPr>
       <w:r>
-        <w:t xml:space="preserve">This historically situated file suggests a possible delivery-context mismatch: a travelling Chinese-university language course was reported alongside household power and network problems and uneven access to applications often used in Chinese higher education. Localisation of content and materials remains necessary (Zhao, 2020; Lu et al., 2024). In this sample, those layers would not have addressed the live hour that respondents associated with an unstable connection or an application marked unusable.</w:t>
+        <w:t xml:space="preserve">This historically situated dataset suggests a possible delivery-context mismatch: respondents reporting online Chinese coursework connected to Chinese higher education also reported household power and network problems and uneven access to applications often used in that sector. Localisation of content and materials remains necessary (Zhao, 2020; Lu et al., 2024). In this sample, those layers would not have addressed the live hour that respondents associated with an unstable connection or an application marked unusable.</w:t>
       </w:r>
     </w:p>
     <w:p>
@@ -2955,7 +2915,7 @@
         <w:pStyle w:val="BodyText"/>
       </w:pPr>
       <w:r>
-        <w:t xml:space="preserve">Based on these findings, possible design considerations—not established solutions—include shorter or asynchronous oral alternatives, assessment that does not assume a campus oral hour, and a required platform that respondents can open. WhatsApp was marked available here; it was not recorded as used for class. The findings do not show that later hybrid ICLE has repeated this pattern. They suggest that hybrid models</w:t>
+        <w:t xml:space="preserve">Based on these findings, possible design considerations, rather than established solutions, include shorter or asynchronous oral alternatives, assessment that does not assume a campus oral hour, and a required platform that respondents can open. WhatsApp was marked available here; it was not recorded as used for class. The findings do not show that later hybrid ICLE has repeated this pattern. They suggest that hybrid models</w:t>
       </w:r>
       <w:r>
         <w:t xml:space="preserve"> </w:t>
@@ -2979,7 +2939,7 @@
         <w:pStyle w:val="BodyText"/>
       </w:pPr>
       <w:r>
-        <w:t xml:space="preserve">Participation in this file co-occurred with reported platform access, power and connectivity problems, and a home environment that many described as not quiet. That is a description of domestic participation conditions, not a claim that inequality is</w:t>
+        <w:t xml:space="preserve">Participation in this dataset co-occurred with reported platform access, power and connectivity problems, and a home environment that many described as not quiet. That is a description of domestic participation conditions, not a claim that inequality is</w:t>
       </w:r>
       <w:r>
         <w:t xml:space="preserve"> </w:t>
@@ -3009,7 +2969,7 @@
         <w:pStyle w:val="FirstParagraph"/>
       </w:pPr>
       <w:r>
-        <w:t xml:space="preserve">The sample is small (N = 38), network-recruited, and majority male. Recruitment channel, host university, programme type, and place of residence that week were not recorded. IP metadata are not a location measure. All outcomes are self-report. The appraisal index is descriptive, not a validated scale. The form did not measure institutional adaptation, so localisation of delivery is a conceptual reading of student-side conditions. Data are from February 2022 and concern emergency remote teaching. They are not evidence about current hybrid education. No ethics-committee number is available for the 2022 collection (Section 3.6).</w:t>
+        <w:t xml:space="preserve">The sample is small (N = 38), network-recruited, and majority male. Recruitment channel, host university, programme type, and place of residence that week were not recorded, so Chinese-university enrolment is not independently verified. IP metadata are not a location measure. All outcomes are self-report. The appraisal index is descriptive, not a validated scale. The infrastructure-problem count is an unvalidated post hoc indicator. The form did not measure institutional adaptation, so localisation of delivery is a conceptual reading of student-side conditions. Data are from February 2022 and concern emergency remote teaching. They are not evidence about current hybrid education. No ethics-committee number is available for the 2022 collection (Section 3.6).</w:t>
       </w:r>
     </w:p>
     <w:bookmarkEnd w:id="40"/>
@@ -3027,7 +2987,7 @@
         <w:pStyle w:val="FirstParagraph"/>
       </w:pPr>
       <w:r>
-        <w:t xml:space="preserve">In this exploratory emergency-remote-teaching sample of mainly Pakistani Chinese-university language students, reported household infrastructure and platform access co-occurred with very high stress and with more negative perceived-learning appraisal. The conceptual suggestion is that ICLE localisation may need to include delivery-context fit—time, platform, task, participation mode, and assessment—as well as content adaptation. That suggestion is bounded by N = 38 and by a 2022 file.</w:t>
+        <w:t xml:space="preserve">In this exploratory emergency-remote-teaching sample of mainly Pakistani respondents reporting online Chinese coursework, reported household infrastructure and platform access co-occurred with very high stress and with more negative perceived-learning appraisal. The conceptual suggestion is that ICLE localisation may need to include delivery-context fit—time, platform, task, participation mode, and assessment—as well as content adaptation. That suggestion is bounded by N = 38 and by a 2022 dataset.</w:t>
       </w:r>
     </w:p>
     <w:bookmarkEnd w:id="41"/>

</xml_diff>

<commit_message>
Rewrite the introduction around verified Q1 and Q2 sources
Replace weaker intro citations with Language Teaching, TESOL Quarterly, The Modern Language Journal, System, Foreign Language Annals, RELC, Language, Culture and Curriculum, JMMD, and Population, Space and Place. Keep the sample caveats and the delivery-localisation claim.

Co-authored-by: kristinehina23-rgb <kristinehina23-rgb@users.noreply.github.com>
</commit_message>
<xml_diff>
--- a/papers/q1-masters-covid/word/Rathore-Cao-Xu-When-Chinese-class-moved-home.docx
+++ b/papers/q1-masters-covid/word/Rathore-Cao-Xu-When-Chinese-class-moved-home.docx
@@ -239,7 +239,15 @@
         <w:pStyle w:val="FirstParagraph"/>
       </w:pPr>
       <w:r>
-        <w:t xml:space="preserve">International Chinese language education (ICLE) has treated localisation mainly as a problem of content and materials: local examples, annotation, and cultural comparison so that a travelling syllabus becomes learnable in a place (Zhao, 2020; Lu et al., 2024). This study proposes a further layer.</w:t>
+        <w:t xml:space="preserve">International Chinese language education (ICLE) has been reviewed mainly as a problem of pedagogy, learner development, and teacher education in, or towards, Chinese-speaking settings (Gong, Gao, &amp; Lyu, 2020; Ma, Gong, Gao, &amp; Xiang, 2017). When that field has asked how a travelling syllabus becomes learnable in a new place, localisation has usually meant content and materials. Postmethod and localist work already requires pedagogy to be particular to a group and a setting (Canagarajah, 2005; Kumaravadivelu, 2001). Recent articles in this journal treat curriculum as something students live, and glocalisation as the fitting of a travelling literacy to a local classroom (Lam, 2024; Shan &amp; Xu, 2024). Those layers remain necessary. They do not exhaust what happens when the course itself moves.</w:t>
+      </w:r>
+    </w:p>
+    <w:p>
+      <w:pPr>
+        <w:pStyle w:val="BodyText"/>
+      </w:pPr>
+      <w:r>
+        <w:t xml:space="preserve">If language-learning materials are what is actually used in a setting, and not only what is printed (Guerrettaz et al., 2021), a live class is itself a material. Use includes whether that class can be entered. This study therefore proposes a further layer.</w:t>
       </w:r>
       <w:r>
         <w:t xml:space="preserve"> </w:t>
@@ -255,7 +263,7 @@
         <w:t xml:space="preserve"> </w:t>
       </w:r>
       <w:r>
-        <w:t xml:space="preserve">is the institutional adaptation of time, platform, task, participation mode, and assessment to the receiving context. It differs from learner-side accessibility and from digital inclusion. Those terms describe conditions that students face. Localisation of delivery names a design task for the institution that sends the course.</w:t>
+        <w:t xml:space="preserve">is the institutional adaptation of time, platform, task, participation mode, and assessment to the receiving context. It differs from learner-side accessibility and from digital inclusion (Warschauer, 2003). Those terms describe conditions that students face. Localisation of delivery names a design task for the institution that sends the course.</w:t>
       </w:r>
     </w:p>
     <w:p>
@@ -263,7 +271,7 @@
         <w:pStyle w:val="BodyText"/>
       </w:pPr>
       <w:r>
-        <w:t xml:space="preserve">Emergency remote teaching (Hodges et al., 2020) is the historical setting in which that task became visible, not the theoretical centre of the paper. When Chinese universities moved instruction online in 2020, many students of Pakistani nationality remained connected to Chinese-university language courses while sitting outside the campus infrastructure. A</w:t>
+        <w:t xml:space="preserve">Emergency remote teaching is the historical setting in which that task became visible, not the theoretical centre of the paper (Hodges et al., 2020). Language programmes that copied a campus hour onto videoconferencing met thinner interaction and the entry of the domestic setting into the lesson (Gacs et al., 2020; MacIntyre et al., 2020; Moorhouse &amp; Kohnke, 2021). A</w:t>
       </w:r>
       <w:r>
         <w:t xml:space="preserve"> </w:t>
@@ -284,25 +292,15 @@
         <w:pStyle w:val="BodyText"/>
       </w:pPr>
       <w:r>
-        <w:t xml:space="preserve">Pakistani enrolment in Chinese universities is a documented case of South–South academic mobility, structured by scholarships and the China–Pakistan Economic Corridor rather than by the more familiar</w:t>
-      </w:r>
-      <w:r>
-        <w:t xml:space="preserve"> </w:t>
-      </w:r>
-      <w:r>
-        <w:t xml:space="preserve">“</w:t>
-      </w:r>
-      <w:r>
-        <w:t xml:space="preserve">international student already on a Chinese campus</w:t>
-      </w:r>
-      <w:r>
-        <w:t xml:space="preserve">”</w:t>
-      </w:r>
-      <w:r>
-        <w:t xml:space="preserve"> </w:t>
-      </w:r>
-      <w:r>
-        <w:t xml:space="preserve">story (Iftikhar et al., 2024; Tu, 2026; Gao &amp; Hua, 2021). This study does not treat the 38 respondents as a census of that mobility, nor as a verified enrolment record. The questionnaire did not collect host university, programme type, degree status, or recruitment source. Most respondents ticked that they were taking required and/or elective courses online. The analysis therefore treats the group as a self-selected, likely Chinese-university-connected respondent sample. Nine submissions carried mainland-China IP metadata and twenty-nine did not. Those metadata are technical records, not verified locations, because a virtual private network can change an apparent address. The study does not treat the dataset as a Pakistan-resident sample and does not analyse IP as a proxy for where respondents sat.</w:t>
+        <w:t xml:space="preserve">Research on international students of Chinese has largely documented learners who are already on a Chinese campus (Gao &amp; Hua, 2021; Gong, Gao, Li, &amp; Lai, 2020). Pakistani enrolment in Chinese higher education is a documented case of South–South academic mobility, expanded by scholarships and closer Pakistan–China educational ties, rather than by that on-campus story alone (Tu, 2026). This study does not treat the 38 respondents as a census of that mobility, nor as a verified enrolment record. The questionnaire did not collect host university, programme type, degree status, or recruitment source. Most respondents ticked that they were taking required and/or elective courses online. The analysis therefore treats the group as a self-selected, likely Chinese-university-connected respondent sample. Nine submissions carried mainland-China IP metadata and twenty-nine did not. Those metadata are technical records, not verified locations, because a virtual private network can change an apparent address. The study does not treat the dataset as a Pakistan-resident sample and does not analyse IP as a proxy for where respondents sat.</w:t>
+      </w:r>
+    </w:p>
+    <w:p>
+      <w:pPr>
+        <w:pStyle w:val="BodyText"/>
+      </w:pPr>
+      <w:r>
+        <w:t xml:space="preserve">The receiving setting in this dataset is a home learning ecology: domestic space, connectivity, and the conditions of oral participation (van Lier, 2004; Warschauer, 2003). The paper asks how, in one 2022 convenience sample, household infrastructure and reported platform access co-occurred with stress, perceived learning, and judgements of whether online Chinese could replace campus classes.</w:t>
       </w:r>
     </w:p>
     <w:p>
@@ -3689,27 +3687,6 @@
         <w:pStyle w:val="BodyText"/>
       </w:pPr>
       <w:r>
-        <w:t xml:space="preserve">Iftikhar, A., Li, C., Jiangyu, L., Xi, C., Tao, W., &amp; Haider, A. A. (2024). Perceptions, challenges, and opportunities of Chinese language learning in Punjab and Sindh, Pakistan: Exploring the role of CPEC.</w:t>
-      </w:r>
-      <w:r>
-        <w:t xml:space="preserve"> </w:t>
-      </w:r>
-      <w:r>
-        <w:rPr>
-          <w:iCs/>
-          <w:i/>
-        </w:rPr>
-        <w:t xml:space="preserve">New Directions for Child and Adolescent Development, 2024</w:t>
-      </w:r>
-      <w:r>
-        <w:t xml:space="preserve">, Article 6662409. https://doi.org/10.1155/2024/6662409</w:t>
-      </w:r>
-    </w:p>
-    <w:p>
-      <w:pPr>
-        <w:pStyle w:val="BodyText"/>
-      </w:pPr>
-      <w:r>
         <w:t xml:space="preserve">Kumaravadivelu, B. (2001). Toward a postmethod pedagogy.</w:t>
       </w:r>
       <w:r>
@@ -3787,6 +3764,27 @@
       </w:r>
       <w:r>
         <w:t xml:space="preserve">(4), 3257-3281. https://doi.org/10.52131/pjhss.2024.v12i4.2553</w:t>
+      </w:r>
+    </w:p>
+    <w:p>
+      <w:pPr>
+        <w:pStyle w:val="BodyText"/>
+      </w:pPr>
+      <w:r>
+        <w:t xml:space="preserve">Ma, X., Gong, Y., Gao, X., &amp; Xiang, Y. (2017). The teaching of Chinese as a second or foreign language: A systematic review of the literature 2005-2015.</w:t>
+      </w:r>
+      <w:r>
+        <w:t xml:space="preserve"> </w:t>
+      </w:r>
+      <w:r>
+        <w:rPr>
+          <w:iCs/>
+          <w:i/>
+        </w:rPr>
+        <w:t xml:space="preserve">Journal of Multilingual and Multicultural Development, 38</w:t>
+      </w:r>
+      <w:r>
+        <w:t xml:space="preserve">(9), 815-830. https://doi.org/10.1080/01434632.2016.1268146</w:t>
       </w:r>
     </w:p>
     <w:p>

</xml_diff>

<commit_message>
Add a citation-proof folder and correct two reference errors
Create papers/q1-masters-covid/citations with Crossref records and a verification table for every cited work. The audit corrected the MacIntyre System article number (102352) and the official Guerrettaz title.

Co-authored-by: kristinehina23-rgb <kristinehina23-rgb@users.noreply.github.com>
</commit_message>
<xml_diff>
--- a/papers/q1-masters-covid/word/Rathore-Cao-Xu-When-Chinese-class-moved-home.docx
+++ b/papers/q1-masters-covid/word/Rathore-Cao-Xu-When-Chinese-class-moved-home.docx
@@ -3498,7 +3498,7 @@
         <w:pStyle w:val="BodyText"/>
       </w:pPr>
       <w:r>
-        <w:t xml:space="preserve">Canagarajah, A. S. (2005).</w:t>
+        <w:t xml:space="preserve">Canagarajah, A. S. (Ed.). (2005).</w:t>
       </w:r>
       <w:r>
         <w:t xml:space="preserve"> </w:t>
@@ -3624,7 +3624,7 @@
         <w:pStyle w:val="BodyText"/>
       </w:pPr>
       <w:r>
-        <w:t xml:space="preserve">Guerrettaz, A. M., Engman, M. M., &amp; Matsumoto, Y. (2021). Empirically defining language learning and teaching materials in use: Holistic, situated, and dynamic perspectives.</w:t>
+        <w:t xml:space="preserve">Guerrettaz, A. M., Engman, M. M., &amp; Matsumoto, Y. (2021). Empirically defining language learning and teaching materials in use through sociomaterial perspectives.</w:t>
       </w:r>
       <w:r>
         <w:t xml:space="preserve"> </w:t>
@@ -3805,7 +3805,7 @@
         <w:t xml:space="preserve">System, 94</w:t>
       </w:r>
       <w:r>
-        <w:t xml:space="preserve">, 102313. https://doi.org/10.1016/j.system.2020.102313</w:t>
+        <w:t xml:space="preserve">, Article 102352. https://doi.org/10.1016/j.system.2020.102352</w:t>
       </w:r>
     </w:p>
     <w:p>
@@ -4144,7 +4144,7 @@
         <w:t xml:space="preserve">Educational Research for Policy and Practice, 9</w:t>
       </w:r>
       <w:r>
-        <w:t xml:space="preserve">, 127-142. https://doi.org/10.1007/s10671-009-9078-1</w:t>
+        <w:t xml:space="preserve">(2), 127-142. https://doi.org/10.1007/s10671-009-9078-1</w:t>
       </w:r>
     </w:p>
     <w:p>

</xml_diff>

<commit_message>
Add five verified empirical studies where the literature was thin
Cite Jamil and Muschert on Pakistan university e-learning, Moser et al. and Tao and Gao on language ERT, Xu et al. on Chinese-character emergency teaching, and Wen and Liu on CSL emotion. These support the frame only; they do not prove the N = 38 results.

Co-authored-by: kristinehina23-rgb <kristinehina23-rgb@users.noreply.github.com>
</commit_message>
<xml_diff>
--- a/papers/q1-masters-covid/word/Rathore-Cao-Xu-When-Chinese-class-moved-home.docx
+++ b/papers/q1-masters-covid/word/Rathore-Cao-Xu-When-Chinese-class-moved-home.docx
@@ -271,7 +271,7 @@
         <w:pStyle w:val="BodyText"/>
       </w:pPr>
       <w:r>
-        <w:t xml:space="preserve">Emergency remote teaching is the historical setting in which that task became visible, not the theoretical centre of the paper (Hodges et al., 2020). Language programmes that copied a campus hour onto videoconferencing met thinner interaction and the entry of the domestic setting into the lesson (Gacs et al., 2020; MacIntyre et al., 2020; Moorhouse &amp; Kohnke, 2021). A</w:t>
+        <w:t xml:space="preserve">Emergency remote teaching is the historical setting in which that task became visible, not the theoretical centre of the paper (Hodges et al., 2020). Language programmes that copied a campus hour onto videoconferencing met thinner interaction, technical disruption, and the entry of the domestic setting into the lesson (Gacs et al., 2020; MacIntyre et al., 2020; Moser, Wei, &amp; Brenner, 2021; Tao &amp; Gao, 2022). A</w:t>
       </w:r>
       <w:r>
         <w:t xml:space="preserve"> </w:t>
@@ -284,7 +284,7 @@
         <w:t xml:space="preserve">travelling course</w:t>
       </w:r>
       <w:r>
-        <w:t xml:space="preserve">, as used here, is an institutionally designed course whose timetable, platforms, tasks, and assessment arrangements were created for one institutional setting but enacted in another (Gacs et al., 2020). Emergency-period Chinese-university language courses often relied on synchronous instruction and platforms used in Chinese higher education, although the present questionnaire did not document the specific institutional requirements faced by each respondent.</w:t>
+        <w:t xml:space="preserve">, as used here, is an institutionally designed course whose timetable, platforms, tasks, and assessment arrangements were created for one institutional setting but enacted in another (Gacs et al., 2020). Emergency-period Chinese-university language courses often relied on synchronous instruction and platforms used in Chinese higher education, although the present questionnaire did not document the specific institutional requirements faced by each respondent. Chinese-language emergency studies have documented pedagogical adaptation on the sending side, for example technology-based character instruction (Xu, Jin, Deifell, &amp; Angus, 2022). They have not, as a body of work, treated delivery-context fit for South–South respondents studying off campus.</w:t>
       </w:r>
     </w:p>
     <w:p>
@@ -300,7 +300,7 @@
         <w:pStyle w:val="BodyText"/>
       </w:pPr>
       <w:r>
-        <w:t xml:space="preserve">The receiving setting in this dataset is a home learning ecology: domestic space, connectivity, and the conditions of oral participation (van Lier, 2004; Warschauer, 2003). The paper asks how, in one 2022 convenience sample, household infrastructure and reported platform access co-occurred with stress, perceived learning, and judgements of whether online Chinese could replace campus classes.</w:t>
+        <w:t xml:space="preserve">The receiving setting in this dataset is a home learning ecology: domestic space, connectivity, and the conditions of oral participation (van Lier, 2004; Warschauer, 2003). Empirical work on Pakistani university e-learning during COVID-19 has already reported uneven internet access and ICT skills, especially outside well-resourced urban campuses (Jamil &amp; Muschert, 2023). That literature is background. It does not describe the present 38 respondents. The paper asks how, in one 2022 convenience sample, household infrastructure and reported platform access co-occurred with stress, perceived learning, and judgements of whether online Chinese could replace campus classes.</w:t>
       </w:r>
     </w:p>
     <w:p>
@@ -379,7 +379,7 @@
         <w:pStyle w:val="FirstParagraph"/>
       </w:pPr>
       <w:r>
-        <w:t xml:space="preserve">Hodges et al. (2020) distinguished emergency remote teaching from planned online or blended courses. Gacs, Goertler and Spasova (2020) applied that distinction to languages. Reviews of language-teacher responses during the conversion to online teaching report thinner interaction and the entry of the domestic setting into the lesson (MacIntyre et al., 2020; Moorhouse &amp; Kohnke, 2021). Those studies are cited as emergency-teaching context, not as direct evidence of student stress in the present dataset.</w:t>
+        <w:t xml:space="preserve">Hodges et al. (2020) distinguished emergency remote teaching from planned online or blended courses. Gacs, Goertler and Spasova (2020) applied that distinction to languages. Empirical surveys of language educators report increased workload, stress, and uneven preparedness when instruction moved online (MacIntyre et al., 2020; Moser et al., 2021). Tao and Gao (2022) synthesise the wider online-language literature as a problem of technical disruption, thinner engagement, and the need for language-specific support. Those studies are cited as emergency-teaching context, not as direct evidence of student stress in the present dataset.</w:t>
       </w:r>
     </w:p>
     <w:p>
@@ -405,7 +405,7 @@
         <w:t xml:space="preserve"> </w:t>
       </w:r>
       <w:r>
-        <w:t xml:space="preserve">and platform trials (Zhang et al., 2020; Xia et al., 2022). A later review of online ICLE teaching models still lists technical issues, weak interaction, and time-zone problems (Li &amp; Li, 2024). Much of that literature assumes a relatively stable connection. This exploratory questionnaire cannot test whether that assumption holds for current hybrid ICLE. It can describe what 38 respondents reported in February 2022.</w:t>
+        <w:t xml:space="preserve">and platform trials (Zhang et al., 2020; Xia et al., 2022). Xu et al. (2022) show that Chinese-character teaching during emergency remote instruction was adapted on the sending side. A later review of online ICLE teaching models still lists technical issues, weak interaction, and time-zone problems (Li &amp; Li, 2024). Learner emotion in Chinese as an additional language is already studied in this journal (Wen &amp; Liu, 2025). Much of that literature assumes a relatively stable connection. This exploratory questionnaire cannot test whether that assumption holds for current hybrid ICLE. It can describe what 38 respondents reported in February 2022.</w:t>
       </w:r>
     </w:p>
     <w:bookmarkEnd w:id="22"/>
@@ -423,7 +423,7 @@
         <w:pStyle w:val="FirstParagraph"/>
       </w:pPr>
       <w:r>
-        <w:t xml:space="preserve">Later digital-divide models describe a sequence of motivational, material, skills, usage, and outcome access (van Dijk, 2020; Helsper, 2021; Warschauer, 2003). Device ownership is not the same as taking part (Ali, 2020). In Pakistan, household use of educational technology is also structured by device sharing, care work, and electricity (Raza &amp; Hennessy, 2025). That report is grey literature and is used only as background on household conditions, not as a standalone empirical claim about this sample.</w:t>
+        <w:t xml:space="preserve">Later digital-divide models describe a sequence of motivational, material, skills, usage, and outcome access (van Dijk, 2020; Helsper, 2021; Warschauer, 2003). Device ownership is not the same as taking part (Ali, 2020). In Pakistani higher education during COVID-19, interview evidence shows that first-level access (internet, devices) and second-level skills were uneven, and that rural and less-resourced students were more exposed (Jamil &amp; Muschert, 2023). Household use of educational technology is also structured by device sharing, care work, and electricity (Raza &amp; Hennessy, 2025). The EdTech Hub report is grey literature. Neither source is treated as a finding about the present 38 respondents.</w:t>
       </w:r>
     </w:p>
     <w:p>
@@ -3687,6 +3687,27 @@
         <w:pStyle w:val="BodyText"/>
       </w:pPr>
       <w:r>
+        <w:t xml:space="preserve">Jamil, S., &amp; Muschert, G. (2023). The COVID-19 pandemic and e-learning: The digital divide and educational crises in Pakistan’s universities.</w:t>
+      </w:r>
+      <w:r>
+        <w:t xml:space="preserve"> </w:t>
+      </w:r>
+      <w:r>
+        <w:rPr>
+          <w:iCs/>
+          <w:i/>
+        </w:rPr>
+        <w:t xml:space="preserve">American Behavioral Scientist, 68</w:t>
+      </w:r>
+      <w:r>
+        <w:t xml:space="preserve">(9), 1161-1179. https://doi.org/10.1177/00027642231156779</w:t>
+      </w:r>
+    </w:p>
+    <w:p>
+      <w:pPr>
+        <w:pStyle w:val="BodyText"/>
+      </w:pPr>
+      <w:r>
         <w:t xml:space="preserve">Kumaravadivelu, B. (2001). Toward a postmethod pedagogy.</w:t>
       </w:r>
       <w:r>
@@ -3900,6 +3921,27 @@
         <w:pStyle w:val="BodyText"/>
       </w:pPr>
       <w:r>
+        <w:t xml:space="preserve">Moser, K. M., Wei, T., &amp; Brenner, D. (2021). Remote teaching during COVID-19: Implications from a national survey of language educators.</w:t>
+      </w:r>
+      <w:r>
+        <w:t xml:space="preserve"> </w:t>
+      </w:r>
+      <w:r>
+        <w:rPr>
+          <w:iCs/>
+          <w:i/>
+        </w:rPr>
+        <w:t xml:space="preserve">System, 97</w:t>
+      </w:r>
+      <w:r>
+        <w:t xml:space="preserve">, Article 102431. https://doi.org/10.1016/j.system.2020.102431</w:t>
+      </w:r>
+    </w:p>
+    <w:p>
+      <w:pPr>
+        <w:pStyle w:val="BodyText"/>
+      </w:pPr>
+      <w:r>
         <w:t xml:space="preserve">Raza, O., &amp; Hennessy, S. (2025).</w:t>
       </w:r>
       <w:r>
@@ -3963,6 +4005,27 @@
         <w:pStyle w:val="BodyText"/>
       </w:pPr>
       <w:r>
+        <w:t xml:space="preserve">Tao, J., &amp; Gao, X. (2022). Teaching and learning languages online: Challenges and responses.</w:t>
+      </w:r>
+      <w:r>
+        <w:t xml:space="preserve"> </w:t>
+      </w:r>
+      <w:r>
+        <w:rPr>
+          <w:iCs/>
+          <w:i/>
+        </w:rPr>
+        <w:t xml:space="preserve">System, 107</w:t>
+      </w:r>
+      <w:r>
+        <w:t xml:space="preserve">, Article 102819. https://doi.org/10.1016/j.system.2022.102819</w:t>
+      </w:r>
+    </w:p>
+    <w:p>
+      <w:pPr>
+        <w:pStyle w:val="BodyText"/>
+      </w:pPr>
+      <w:r>
         <w:t xml:space="preserve">Tomlinson, B. (Ed.). (2011).</w:t>
       </w:r>
       <w:r>
@@ -4089,6 +4152,27 @@
         <w:pStyle w:val="BodyText"/>
       </w:pPr>
       <w:r>
+        <w:t xml:space="preserve">Wen, X., &amp; Liu, F. (2025). Emotional dynamics of advanced Chinese as a second language learners: A Q methodology study.</w:t>
+      </w:r>
+      <w:r>
+        <w:t xml:space="preserve"> </w:t>
+      </w:r>
+      <w:r>
+        <w:rPr>
+          <w:iCs/>
+          <w:i/>
+        </w:rPr>
+        <w:t xml:space="preserve">Language, Culture and Curriculum, 38</w:t>
+      </w:r>
+      <w:r>
+        <w:t xml:space="preserve">(3), 380-400. https://doi.org/10.1080/07908318.2025.2486449</w:t>
+      </w:r>
+    </w:p>
+    <w:p>
+      <w:pPr>
+        <w:pStyle w:val="BodyText"/>
+      </w:pPr>
+      <w:r>
         <w:t xml:space="preserve">Xia, Y., Hu, Y., Wu, C., Yang, L., &amp; Lei, M. (2022). Challenges of online learning amid the COVID-19: College students’ perspective.</w:t>
       </w:r>
       <w:r>
@@ -4103,6 +4187,27 @@
       </w:r>
       <w:r>
         <w:t xml:space="preserve">, 1037311. https://doi.org/10.3389/fpsyg.2022.1037311</w:t>
+      </w:r>
+    </w:p>
+    <w:p>
+      <w:pPr>
+        <w:pStyle w:val="BodyText"/>
+      </w:pPr>
+      <w:r>
+        <w:t xml:space="preserve">Xu, Y., Jin, L., Deifell, E., &amp; Angus, K. (2022). Facilitating technology-based character learning in emergency remote teaching.</w:t>
+      </w:r>
+      <w:r>
+        <w:t xml:space="preserve"> </w:t>
+      </w:r>
+      <w:r>
+        <w:rPr>
+          <w:iCs/>
+          <w:i/>
+        </w:rPr>
+        <w:t xml:space="preserve">Foreign Language Annals, 55</w:t>
+      </w:r>
+      <w:r>
+        <w:t xml:space="preserve">(1), 72-97. https://doi.org/10.1111/flan.12541</w:t>
       </w:r>
     </w:p>
     <w:p>

</xml_diff>

<commit_message>
Tighten the introduction so the concept matches the questionnaire
State that the study identifies learner-side conditions rather than institutional localisation; keep one sample label; move IP and recruitment detail out of the opening; narrow the literature-gap wording; and stop treating a live class as a material.

Co-authored-by: kristinehina23-rgb <kristinehina23-rgb@users.noreply.github.com>
</commit_message>
<xml_diff>
--- a/papers/q1-masters-covid/word/Rathore-Cao-Xu-When-Chinese-class-moved-home.docx
+++ b/papers/q1-masters-covid/word/Rathore-Cao-Xu-When-Chinese-class-moved-home.docx
@@ -169,7 +169,7 @@
         <w:pStyle w:val="FirstParagraph"/>
       </w:pPr>
       <w:r>
-        <w:t xml:space="preserve">This exploratory questionnaire study examines how mainly Pakistani respondents experienced Chinese-university-linked language courses when live instruction moved off campus during COVID-19 emergency remote teaching. It proposes</w:t>
+        <w:t xml:space="preserve">This exploratory questionnaire study examines how a self-selected group of respondents reporting online Chinese-language courses, likely connected to Chinese higher education, experienced emergency remote teaching when live instruction moved off campus. It proposes</w:t>
       </w:r>
       <w:r>
         <w:t xml:space="preserve"> </w:t>
@@ -182,7 +182,7 @@
         <w:t xml:space="preserve">localisation of delivery</w:t>
       </w:r>
       <w:r>
-        <w:t xml:space="preserve">: institutional adaptation of time, platform, task, participation mode, and assessment to the receiving context. Thirty-eight adults completed a Chinese-medium Wenjuan questionnaire in February 2022. Unstable networks (76.3%) and power interruptions (42.1%) were commonly reported, while 36.8% reported very high stress. Respondents who reported that home conditions affected study</w:t>
+        <w:t xml:space="preserve">: institutional adaptation of time, platform, task, participation mode, and assessment to the receiving context. The study does not measure institutional localisation practices; it identifies learner-side conditions that such practices would need to address. Thirty-eight adults completed a Chinese-medium Wenjuan questionnaire in February 2022. Unstable networks (76.3%) and power interruptions (42.1%) were commonly reported, while 36.8% reported very high stress. Respondents who reported that home conditions affected study</w:t>
       </w:r>
       <w:r>
         <w:t xml:space="preserve"> </w:t>
@@ -200,10 +200,10 @@
         <w:t xml:space="preserve"> </w:t>
       </w:r>
       <w:r>
-        <w:t xml:space="preserve">more often reported very high stress (11/14 versus 3/24; Fisher’s exact (p = .00008)). Worse reported internet speed was associated with a more negative perceived online-learning appraisal index ((</w:t>
-      </w:r>
-      <w:r>
-        <w:t xml:space="preserve">= .65), 95% bootstrap CI ([.36, .84])). Respondents also reported uneven platform access, with QQ and Chaoxing frequently marked unusable and Zoom and WhatsApp more often marked available. The findings suggest that ICLE localisation may need to address delivery-context fit alongside content and materials adaptation. Given the small network-recruited 2022 sample, the findings are exploratory and do not represent current hybrid practice.</w:t>
+        <w:t xml:space="preserve">more often reported very high stress (11/14 versus 3/24; Fisher’s exact (p = .00008)). Worse reported internet speed was associated with a more negative appraisal of online learning ((</w:t>
+      </w:r>
+      <w:r>
+        <w:t xml:space="preserve">= .65), 95% bootstrap CI ([.36, .84])). Respondents also reported uneven platform access, with QQ and Chaoxing frequently marked unusable and Zoom and WhatsApp more often marked available. The findings suggest that ICLE localisation may need to address delivery-context fit alongside content and materials adaptation. Given the small 2022 convenience sample, the findings are exploratory and do not represent current hybrid practice.</w:t>
       </w:r>
     </w:p>
     <w:p>
@@ -239,7 +239,7 @@
         <w:pStyle w:val="FirstParagraph"/>
       </w:pPr>
       <w:r>
-        <w:t xml:space="preserve">International Chinese language education (ICLE) has been reviewed mainly as a problem of pedagogy, learner development, and teacher education in, or towards, Chinese-speaking settings (Gong, Gao, &amp; Lyu, 2020; Ma, Gong, Gao, &amp; Xiang, 2017). When that field has asked how a travelling syllabus becomes learnable in a new place, localisation has usually meant content and materials. Postmethod and localist work already requires pedagogy to be particular to a group and a setting (Canagarajah, 2005; Kumaravadivelu, 2001). Recent articles in this journal treat curriculum as something students live, and glocalisation as the fitting of a travelling literacy to a local classroom (Lam, 2024; Shan &amp; Xu, 2024). Those layers remain necessary. They do not exhaust what happens when the course itself moves.</w:t>
+        <w:t xml:space="preserve">Much existing work in international Chinese language education (ICLE) has examined pedagogy, learner development, and teacher education in, or towards, Chinese-speaking settings (Gong, Gao, &amp; Lyu, 2020; Ma et al., 2017). When a curriculum is transferred across settings, a prominent strand of localisation research has focused on content and materials: local examples, annotation, and cultural comparison. Postmethod and localist scholarship already requires pedagogy to fit a particular group and setting (Canagarajah, 2005; Kumaravadivelu, 2001). Recent articles in this journal treat curriculum as something students live, and glocalisation as the fitting of a travelling literacy to a local classroom (Lam, 2024; Shan &amp; Xu, 2024). Those layers remain necessary. They do not settle what happens when the institutional arrangements of the course also move across settings: its timetable, required platforms, tasks, participation mode, and assessment.</w:t>
       </w:r>
     </w:p>
     <w:p>
@@ -247,7 +247,7 @@
         <w:pStyle w:val="BodyText"/>
       </w:pPr>
       <w:r>
-        <w:t xml:space="preserve">If language-learning materials are what is actually used in a setting, and not only what is printed (Guerrettaz et al., 2021), a live class is itself a material. Use includes whether that class can be entered. This study therefore proposes a further layer.</w:t>
+        <w:t xml:space="preserve">If the significance of materials lies in their situated use rather than solely in their printed content (Guerrettaz et al., 2021), localisation must extend beyond the page to the conditions under which teaching is delivered. This paper proposes</w:t>
       </w:r>
       <w:r>
         <w:t xml:space="preserve"> </w:t>
@@ -257,13 +257,10 @@
           <w:iCs/>
           <w:i/>
         </w:rPr>
-        <w:t xml:space="preserve">Localisation of delivery</w:t>
-      </w:r>
-      <w:r>
-        <w:t xml:space="preserve"> </w:t>
-      </w:r>
-      <w:r>
-        <w:t xml:space="preserve">is the institutional adaptation of time, platform, task, participation mode, and assessment to the receiving context. It differs from learner-side accessibility and from digital inclusion (Warschauer, 2003). Those terms describe conditions that students face. Localisation of delivery names a design task for the institution that sends the course.</w:t>
+        <w:t xml:space="preserve">localisation of delivery</w:t>
+      </w:r>
+      <w:r>
+        <w:t xml:space="preserve">: the institutional adaptation of time, platform, task, participation mode, and assessment to the receiving context. Localisation of delivery does not replace the concepts of accessibility or digital inclusion (Warschauer, 2003). It draws attention specifically to the institutional decisions through which access is enabled or constrained when a course moves across settings. A course may be locally relevant in content but inaccessible in delivery.</w:t>
       </w:r>
     </w:p>
     <w:p>
@@ -271,7 +268,15 @@
         <w:pStyle w:val="BodyText"/>
       </w:pPr>
       <w:r>
-        <w:t xml:space="preserve">Emergency remote teaching is the historical setting in which that task became visible, not the theoretical centre of the paper (Hodges et al., 2020). Language programmes that copied a campus hour onto videoconferencing met thinner interaction, technical disruption, and the entry of the domestic setting into the lesson (Gacs et al., 2020; MacIntyre et al., 2020; Moser, Wei, &amp; Brenner, 2021; Tao &amp; Gao, 2022). A</w:t>
+        <w:t xml:space="preserve">The study does not directly measure institutional localisation practices. Instead, it identifies learner-side conditions and reported experiences that such practices would need to address.</w:t>
+      </w:r>
+    </w:p>
+    <w:p>
+      <w:pPr>
+        <w:pStyle w:val="BodyText"/>
+      </w:pPr>
+      <w:r>
+        <w:t xml:space="preserve">COVID-19 emergency remote teaching is the historical setting in which that mismatch became visible, not the theoretical centre of the argument (Hodges et al., 2020). Language programmes that transferred campus sessions to videoconferencing reported thinner interaction, technical disruption, and the entry of the domestic setting into the lesson (Gacs et al., 2020; MacIntyre et al., 2020; Moser et al., 2021; Tao &amp; Gao, 2022). Drawing on research concerning emergency remote language teaching (Gacs et al., 2020), this paper uses</w:t>
       </w:r>
       <w:r>
         <w:t xml:space="preserve"> </w:t>
@@ -284,7 +289,10 @@
         <w:t xml:space="preserve">travelling course</w:t>
       </w:r>
       <w:r>
-        <w:t xml:space="preserve">, as used here, is an institutionally designed course whose timetable, platforms, tasks, and assessment arrangements were created for one institutional setting but enacted in another (Gacs et al., 2020). Emergency-period Chinese-university language courses often relied on synchronous instruction and platforms used in Chinese higher education, although the present questionnaire did not document the specific institutional requirements faced by each respondent. Chinese-language emergency studies have documented pedagogical adaptation on the sending side, for example technology-based character instruction (Xu, Jin, Deifell, &amp; Angus, 2022). They have not, as a body of work, treated delivery-context fit for South–South respondents studying off campus.</w:t>
+        <w:t xml:space="preserve"> </w:t>
+      </w:r>
+      <w:r>
+        <w:t xml:space="preserve">to describe an institutionally designed course whose timetable, platforms, tasks, and assessment were created for one setting but enacted in another. The studies of Chinese-language emergency teaching reviewed here primarily concern pedagogical adaptation on the sending side, for example technology-based character instruction (Xu et al., 2022). Comparatively less attention has been given to whether delivery arrangements remained feasible for respondents taking online Chinese-language courses off campus. Emergency-period Chinese-university language courses often relied on synchronous class sessions and platforms used in Chinese higher education, although this questionnaire did not document the specific institutional requirements faced by each respondent.</w:t>
       </w:r>
     </w:p>
     <w:p>
@@ -292,7 +300,7 @@
         <w:pStyle w:val="BodyText"/>
       </w:pPr>
       <w:r>
-        <w:t xml:space="preserve">Research on international students of Chinese has largely documented learners who are already on a Chinese campus (Gao &amp; Hua, 2021; Gong, Gao, Li, &amp; Lai, 2020). Pakistani enrolment in Chinese higher education is a documented case of South–South academic mobility, expanded by scholarships and closer Pakistan–China educational ties, rather than by that on-campus story alone (Tu, 2026). This study does not treat the 38 respondents as a census of that mobility, nor as a verified enrolment record. The questionnaire did not collect host university, programme type, degree status, or recruitment source. Most respondents ticked that they were taking required and/or elective courses online. The analysis therefore treats the group as a self-selected, likely Chinese-university-connected respondent sample. Nine submissions carried mainland-China IP metadata and twenty-nine did not. Those metadata are technical records, not verified locations, because a virtual private network can change an apparent address. The study does not treat the dataset as a Pakistan-resident sample and does not analyse IP as a proxy for where respondents sat.</w:t>
+        <w:t xml:space="preserve">A prominent strand of research on international students of Chinese has examined learners already on a Chinese campus (Gao &amp; Hua, 2021; Gong, Gao, Li, &amp; Lai, 2020). Tu (2026) documents Pakistani doctoral mobility to China as one educational pathway shaped by scholarships and closer Pakistan–China ties. That literature supplies context. It does not define the present sample. The analysis draws on a February 2022 convenience sample of 38 self-selected respondents to a Chinese-medium questionnaire about online Chinese learning. Twenty-seven respondents (71.1%) reported that required courses were online, and 23 (60.5%) reported that electives were online. Because institutional affiliation, programme status, recruitment pathway, and physical location were not verified, the group is described as a self-selected group of respondents reporting participation in online Chinese-language courses, likely connected to Chinese higher education. The findings are treated as exploratory rather than representative.</w:t>
       </w:r>
     </w:p>
     <w:p>
@@ -300,7 +308,7 @@
         <w:pStyle w:val="BodyText"/>
       </w:pPr>
       <w:r>
-        <w:t xml:space="preserve">The receiving setting in this dataset is a home learning ecology: domestic space, connectivity, and the conditions of oral participation (van Lier, 2004; Warschauer, 2003). Empirical work on Pakistani university e-learning during COVID-19 has already reported uneven internet access and ICT skills, especially outside well-resourced urban campuses (Jamil &amp; Muschert, 2023). That literature is background. It does not describe the present 38 respondents. The paper asks how, in one 2022 convenience sample, household infrastructure and reported platform access co-occurred with stress, perceived learning, and judgements of whether online Chinese could replace campus classes.</w:t>
+        <w:t xml:space="preserve">The receiving setting reported in the questionnaire is a home learning ecology: domestic space, connectivity, and the conditions of oral participation (van Lier, 2004; Warschauer, 2003). Other research on Pakistani university e-learning during COVID-19 has reported uneven internet access and ICT skills (Jamil &amp; Muschert, 2023). That work is background only. This paper asks what relationships were observed, in this 2022 convenience sample, between household infrastructure, reported platform access, stress, respondents’ appraisal of online learning, and judgements of whether online Chinese could replace campus classes.</w:t>
       </w:r>
     </w:p>
     <w:p>
@@ -332,7 +340,7 @@
         <w:pStyle w:val="Compact"/>
       </w:pPr>
       <w:r>
-        <w:t xml:space="preserve">In this sample, how did selected household and connectivity reports co-occur with very high stress and with perceived online-learning appraisal?</w:t>
+        <w:t xml:space="preserve">In this sample, what relationships were observed between selected household and connectivity reports, very high stress, and respondents’ appraisal of online learning?</w:t>
       </w:r>
     </w:p>
     <w:p>
@@ -462,7 +470,7 @@
         <w:pStyle w:val="FirstParagraph"/>
       </w:pPr>
       <w:r>
-        <w:t xml:space="preserve">In materials work, localisation has meant personalising content so that it speaks to a particular group (McDonough &amp; Shaw, 2003; Tomlinson, 2011). Canagarajah (2005) and Kumaravadivelu (2001) locate pedagogy in a specific group and place. China’s promotion of Chinese has long been tied to institutes, textbooks, and tests (Zhao &amp; Huang, 2010). ICLE studies have applied localisation to curriculum construction and textbook adaptation (Zhao, 2020; Lu et al., 2024). Lam (2024) treats glocalisation as fitting a travelling literacy to a local university classroom. Guerrettaz et al. (2021) extend materials from the page to use. If the material is a live class, use includes whether the class can be entered.</w:t>
+        <w:t xml:space="preserve">In materials work, localisation has meant personalising content so that it speaks to a particular group (McDonough &amp; Shaw, 2003; Tomlinson, 2011). Canagarajah (2005) and Kumaravadivelu (2001) locate pedagogy in a specific group and place. China’s promotion of Chinese has long been tied to institutes, textbooks, and tests (Zhao &amp; Huang, 2010). ICLE studies have applied localisation to curriculum construction and textbook adaptation (Zhao, 2020; Lu et al., 2024). Lam (2024) treats glocalisation as fitting a travelling literacy to a local university classroom. Guerrettaz et al. (2021) extend materials from the page to use. If the significance of materials lies in situated use, localisation must also consider whether learners can access and participate in the class as delivered.</w:t>
       </w:r>
     </w:p>
     <w:p>
@@ -578,7 +586,7 @@
         <w:pStyle w:val="FirstParagraph"/>
       </w:pPr>
       <w:r>
-        <w:t xml:space="preserve">The analysis addresses only the fourth layer. Accessibility and digital inclusion describe constraints that learners report. Localisation of delivery is the institutional response: changing the live hour, the required application, the oral task, or the assessment so that the travelling course can be used where the student actually sits. The questionnaire did not observe institutions adapting. It recorded student-side conditions that, if taken seriously, would require such adaptation.</w:t>
+        <w:t xml:space="preserve">The analysis addresses only the fourth layer. Localisation of delivery does not replace the concepts of accessibility or digital inclusion. It draws attention specifically to the institutional decisions through which access is enabled or constrained when a course moves across settings: changing the synchronous class session, the required application, the oral task, or the assessment so that the travelling course can be used where learners participate. The questionnaire did not observe institutions adapting. It recorded learner-side conditions and reported experiences that such practices would need to address.</w:t>
       </w:r>
     </w:p>
     <w:p>
@@ -596,7 +604,7 @@
         <w:t xml:space="preserve"> </w:t>
       </w:r>
       <w:r>
-        <w:t xml:space="preserve">A course is not fully localised merely because its content is culturally or linguistically adapted; it is localised in delivery only when its required time, platform, participation mode, task design, and assessment are feasible in the setting where learners participate.</w:t>
+        <w:t xml:space="preserve">A course may be locally relevant in content but inaccessible in delivery. It is localised in delivery only when its required time, platform, participation mode, task design, and assessment are feasible in the setting where learners participate.</w:t>
       </w:r>
     </w:p>
     <w:p>
@@ -620,7 +628,7 @@
         <w:t xml:space="preserve"> </w:t>
       </w:r>
       <w:r>
-        <w:t xml:space="preserve">Chinese universities. Guenier, Xing and Yan (2026) describe a designed online Chinese-culture course, which is planned online teaching rather than emergency remote teaching. The present respondents completed a Chinese-medium form about online Chinese classes, and most reported taking required and/or elective courses online. They were not a Confucius Institute classroom sample. Enrolment in a named Chinese university was not independently verified.</w:t>
+        <w:t xml:space="preserve">Chinese universities. Guenier, Xing and Yan (2026) describe a designed online Chinese-culture course, which is planned online teaching rather than emergency remote teaching. The present respondents completed a Chinese-medium questionnaire about online Chinese classes. They were not a Confucius Institute classroom sample. Enrolment in a named Chinese university was not independently verified.</w:t>
       </w:r>
     </w:p>
     <w:bookmarkEnd w:id="24"/>
@@ -692,7 +700,7 @@
         <w:pStyle w:val="FirstParagraph"/>
       </w:pPr>
       <w:r>
-        <w:t xml:space="preserve">The dataset is a convenience sample. The form did not record how the link was distributed (for example WeChat, WhatsApp, email, or student groups). The research team therefore cannot name the recruitment channel. Respondents were adults who completed the Chinese-medium form about online Chinese learning. Completion of the form is not treated as proof of enrolment in a Chinese university. The form did not ask host university, city of residence that week, degree versus non-degree status, or scholarship type. Two items asked whether required courses and electives were online (71.1% and 60.5% ticked those options). Those ticks do not identify a named programme. The study therefore concerns a self-selected, likely Chinese-university-connected respondent group, not verified enrolment records.</w:t>
+        <w:t xml:space="preserve">The dataset is a convenience sample. The form did not record how the link was distributed (for example WeChat, WhatsApp, email, or student groups). The research team therefore cannot name the recruitment channel. Respondents were adults who completed the Chinese-medium form about online Chinese learning. Completion of the form is not treated as proof of enrolment in a Chinese university. The form did not ask host university, city of residence that week, degree versus non-degree status, or scholarship type. Two items asked whether required courses and electives were online: 27 respondents (71.1%) reported required courses online, and 23 (60.5%) reported electives online. Those reports do not identify a named programme. The study therefore concerns a self-selected, likely Chinese-university-connected respondent group, not verified enrolment records.</w:t>
       </w:r>
     </w:p>
     <w:bookmarkEnd w:id="28"/>
@@ -726,20 +734,7 @@
         <w:pStyle w:val="BodyText"/>
       </w:pPr>
       <w:r>
-        <w:t xml:space="preserve">The sample is described as</w:t>
-      </w:r>
-      <w:r>
-        <w:t xml:space="preserve"> </w:t>
-      </w:r>
-      <w:r>
-        <w:rPr>
-          <w:iCs/>
-          <w:i/>
-        </w:rPr>
-        <w:t xml:space="preserve">mainly Pakistani respondents reporting online Chinese coursework connected to Chinese higher education</w:t>
-      </w:r>
-      <w:r>
-        <w:t xml:space="preserve">. It is not described as verified Chinese-university enrolment, as students exclusively in Pakistan, as CSC students, or as a draw from all Pakistani students in Chinese universities.</w:t>
+        <w:t xml:space="preserve">The sample is described as a self-selected group of respondents reporting participation in online Chinese-language courses, likely connected to Chinese higher education. Thirty-seven of 38 selected Pakistani nationality. The group is not described as verified Chinese-university enrolment, as Pakistan-resident learners, as CSC students, or as a national sample.</w:t>
       </w:r>
     </w:p>
     <w:bookmarkEnd w:id="29"/>
@@ -2905,7 +2900,7 @@
         <w:pStyle w:val="FirstParagraph"/>
       </w:pPr>
       <w:r>
-        <w:t xml:space="preserve">This historically situated dataset suggests a possible delivery-context mismatch: respondents reporting online Chinese coursework connected to Chinese higher education also reported household power and network problems and uneven access to applications often used in that sector. Localisation of content and materials remains necessary (Zhao, 2020; Lu et al., 2024). In this sample, those layers would not have addressed the live hour that respondents associated with an unstable connection or an application marked unusable.</w:t>
+        <w:t xml:space="preserve">This historically situated dataset suggests a possible delivery-context mismatch: respondents reporting online Chinese coursework connected to Chinese higher education also reported household power and network problems and uneven access to applications often used in that sector. Localisation of content and materials remains necessary (Zhao, 2020; Lu et al., 2024). In this sample, those layers would not have addressed the synchronous class session that respondents associated with an unstable connection or an application marked unusable.</w:t>
       </w:r>
     </w:p>
     <w:p>

</xml_diff>

<commit_message>
Fix remaining introduction problems of population, location, and wording
State the Pakistan link as self-reported nationality only; drop likely-connected enrolment language; remove off-campus and home-ecology overclaim; replace network with sample; and name Fisher and Spearman in the opening.

Co-authored-by: kristinehina23-rgb <kristinehina23-rgb@users.noreply.github.com>
</commit_message>
<xml_diff>
--- a/papers/q1-masters-covid/word/Rathore-Cao-Xu-When-Chinese-class-moved-home.docx
+++ b/papers/q1-masters-covid/word/Rathore-Cao-Xu-When-Chinese-class-moved-home.docx
@@ -169,7 +169,7 @@
         <w:pStyle w:val="FirstParagraph"/>
       </w:pPr>
       <w:r>
-        <w:t xml:space="preserve">This exploratory questionnaire study examines how a self-selected group of respondents reporting online Chinese-language courses, likely connected to Chinese higher education, experienced emergency remote teaching when live instruction moved off campus. It proposes</w:t>
+        <w:t xml:space="preserve">This exploratory questionnaire study examines how 38 self-selected respondents reporting online Chinese-language courses experienced emergency remote teaching. Thirty-seven selected Pakistani nationality. It proposes</w:t>
       </w:r>
       <w:r>
         <w:t xml:space="preserve"> </w:t>
@@ -182,7 +182,7 @@
         <w:t xml:space="preserve">localisation of delivery</w:t>
       </w:r>
       <w:r>
-        <w:t xml:space="preserve">: institutional adaptation of time, platform, task, participation mode, and assessment to the receiving context. The study does not measure institutional localisation practices; it identifies learner-side conditions that such practices would need to address. Thirty-eight adults completed a Chinese-medium Wenjuan questionnaire in February 2022. Unstable networks (76.3%) and power interruptions (42.1%) were commonly reported, while 36.8% reported very high stress. Respondents who reported that home conditions affected study</w:t>
+        <w:t xml:space="preserve">: institutional adaptation of time, platform, task, participation mode, and assessment to the receiving context. The study does not measure institutional localisation practices; it identifies learner-side conditions that such practices would need to address. Adults completed a Chinese-language Wenjuan questionnaire in February 2022. Unstable networks (76.3%) and power interruptions (42.1%) were commonly reported, while 36.8% reported very high stress. Respondents who reported that home conditions affected study</w:t>
       </w:r>
       <w:r>
         <w:t xml:space="preserve"> </w:t>
@@ -239,7 +239,7 @@
         <w:pStyle w:val="FirstParagraph"/>
       </w:pPr>
       <w:r>
-        <w:t xml:space="preserve">Much existing work in international Chinese language education (ICLE) has examined pedagogy, learner development, and teacher education in, or towards, Chinese-speaking settings (Gong, Gao, &amp; Lyu, 2020; Ma et al., 2017). When a curriculum is transferred across settings, a prominent strand of localisation research has focused on content and materials: local examples, annotation, and cultural comparison. Postmethod and localist scholarship already requires pedagogy to fit a particular group and setting (Canagarajah, 2005; Kumaravadivelu, 2001). Recent articles in this journal treat curriculum as something students live, and glocalisation as the fitting of a travelling literacy to a local classroom (Lam, 2024; Shan &amp; Xu, 2024). Those layers remain necessary. They do not settle what happens when the institutional arrangements of the course also move across settings: its timetable, required platforms, tasks, participation mode, and assessment.</w:t>
+        <w:t xml:space="preserve">A substantial body of research in international Chinese language education (ICLE) has examined learners and pedagogical practices associated with Chinese-speaking educational settings (Gong et al., 2020b; Ma et al., 2017). When a curriculum is transferred across settings, a prominent strand of localisation research has focused on content and materials: local examples, annotation, and cultural comparison (Zhao, 2020; Lu et al., 2024; McDonough &amp; Shaw, 2003; Tomlinson, 2011). Postmethod and localist scholarship argues that pedagogy should respond to a particular learner group and setting (Canagarajah, 2005; Kumaravadivelu, 2001). Recent articles in this journal frame curriculum as lived practice and examine how literacy practices are adapted to local classrooms (Lam, 2024; Shan &amp; Xu, 2024). Those layers remain necessary. They do not settle what happens when the institutional arrangements of the course also move across settings: its timetable, required platforms, tasks, participation mode, and assessment.</w:t>
       </w:r>
     </w:p>
     <w:p>
@@ -268,15 +268,7 @@
         <w:pStyle w:val="BodyText"/>
       </w:pPr>
       <w:r>
-        <w:t xml:space="preserve">The study does not directly measure institutional localisation practices. Instead, it identifies learner-side conditions and reported experiences that such practices would need to address.</w:t>
-      </w:r>
-    </w:p>
-    <w:p>
-      <w:pPr>
-        <w:pStyle w:val="BodyText"/>
-      </w:pPr>
-      <w:r>
-        <w:t xml:space="preserve">COVID-19 emergency remote teaching is the historical setting in which that mismatch became visible, not the theoretical centre of the argument (Hodges et al., 2020). Language programmes that transferred campus sessions to videoconferencing reported thinner interaction, technical disruption, and the entry of the domestic setting into the lesson (Gacs et al., 2020; MacIntyre et al., 2020; Moser et al., 2021; Tao &amp; Gao, 2022). Drawing on research concerning emergency remote language teaching (Gacs et al., 2020), this paper uses</w:t>
+        <w:t xml:space="preserve">COVID-19 emergency remote teaching is the historical setting in which that mismatch became visible, not the theoretical centre of the argument (Hodges et al., 2020). Studies of language programmes transferred to videoconferencing reported thinner interaction, technical disruption, and the increased visibility of domestic conditions during lessons (Gacs et al., 2020; MacIntyre et al., 2020; Moser et al., 2021; Tao &amp; Gao, 2022). Drawing on research concerning emergency remote language teaching (Gacs et al., 2020), this paper uses</w:t>
       </w:r>
       <w:r>
         <w:t xml:space="preserve"> </w:t>
@@ -292,7 +284,7 @@
         <w:t xml:space="preserve"> </w:t>
       </w:r>
       <w:r>
-        <w:t xml:space="preserve">to describe an institutionally designed course whose timetable, platforms, tasks, and assessment were created for one setting but enacted in another. The studies of Chinese-language emergency teaching reviewed here primarily concern pedagogical adaptation on the sending side, for example technology-based character instruction (Xu et al., 2022). Comparatively less attention has been given to whether delivery arrangements remained feasible for respondents taking online Chinese-language courses off campus. Emergency-period Chinese-university language courses often relied on synchronous class sessions and platforms used in Chinese higher education, although this questionnaire did not document the specific institutional requirements faced by each respondent.</w:t>
+        <w:t xml:space="preserve">to describe a course originally designed for one institutional setting but delivered in another. The studies of Chinese-language emergency teaching reviewed here primarily concern pedagogical adaptation on the sending side, for example technology-based character instruction (Xu et al., 2022). Comparatively less attention has been given to whether delivery arrangements remained feasible for respondents taking online Chinese-language courses under different household and technological conditions. Emergency-period Chinese-university language courses often relied on synchronous class sessions and platforms used in Chinese higher education, although this questionnaire did not document the specific institutional requirements faced by each respondent.</w:t>
       </w:r>
     </w:p>
     <w:p>
@@ -300,7 +292,7 @@
         <w:pStyle w:val="BodyText"/>
       </w:pPr>
       <w:r>
-        <w:t xml:space="preserve">A prominent strand of research on international students of Chinese has examined learners already on a Chinese campus (Gao &amp; Hua, 2021; Gong, Gao, Li, &amp; Lai, 2020). Tu (2026) documents Pakistani doctoral mobility to China as one educational pathway shaped by scholarships and closer Pakistan–China ties. That literature supplies context. It does not define the present sample. The analysis draws on a February 2022 convenience sample of 38 self-selected respondents to a Chinese-medium questionnaire about online Chinese learning. Twenty-seven respondents (71.1%) reported that required courses were online, and 23 (60.5%) reported that electives were online. Because institutional affiliation, programme status, recruitment pathway, and physical location were not verified, the group is described as a self-selected group of respondents reporting participation in online Chinese-language courses, likely connected to Chinese higher education. The findings are treated as exploratory rather than representative.</w:t>
+        <w:t xml:space="preserve">A prominent strand of research on international students of Chinese has examined learners already on a Chinese campus (Gao &amp; Hua, 2021; Gong et al., 2020a). The analysis draws on a February 2022 convenience sample of 38 self-selected respondents to a Chinese-language questionnaire about online Chinese learning. Thirty-seven respondents selected Pakistani nationality on the questionnaire; one selected another nationality. That self-identification is the only Pakistan connection established in the dataset. It is not a measure of residence, recruitment channel, or institutional enrolment. Because most respondents reported Pakistani nationality, literature on Pakistani educational mobility and on Pakistani university e-learning during COVID-19 is cited as context for that majority (Tu, 2026; Jamil &amp; Muschert, 2023). Those sources do not describe this sample. Twenty-seven respondents (71.1%) reported taking required courses online, while 23 (60.5%) reported taking elective courses online. Because institutional affiliation, programme status, recruitment pathway, and physical location were not verified, the group is described as a self-selected group of respondents reporting participation in online Chinese-language courses. The findings are treated as exploratory rather than representative. The study also does not directly measure institutional localisation practices; instead, it identifies learner-side conditions and experiences that such practices would need to address.</w:t>
       </w:r>
     </w:p>
     <w:p>
@@ -308,7 +300,7 @@
         <w:pStyle w:val="BodyText"/>
       </w:pPr>
       <w:r>
-        <w:t xml:space="preserve">The receiving setting reported in the questionnaire is a home learning ecology: domestic space, connectivity, and the conditions of oral participation (van Lier, 2004; Warschauer, 2003). Other research on Pakistani university e-learning during COVID-19 has reported uneven internet access and ICT skills (Jamil &amp; Muschert, 2023). That work is background only. This paper asks what relationships were observed, in this 2022 convenience sample, between household infrastructure, reported platform access, stress, respondents’ appraisal of online learning, and judgements of whether online Chinese could replace campus classes.</w:t>
+        <w:t xml:space="preserve">The questionnaire captured elements of respondents’ immediate learning ecologies, including domestic space, connectivity, and conditions for oral participation (van Lier, 2004; Warschauer, 2003). This study examines the relationships observed in the February 2022 convenience sample between household infrastructure, reported platform access, stress, respondents’ appraisals of online learning, and their judgements of whether online Chinese-language courses could replace campus-based classes.</w:t>
       </w:r>
     </w:p>
     <w:p>
@@ -340,7 +332,7 @@
         <w:pStyle w:val="Compact"/>
       </w:pPr>
       <w:r>
-        <w:t xml:space="preserve">In this sample, what relationships were observed between selected household and connectivity reports, very high stress, and respondents’ appraisal of online learning?</w:t>
+        <w:t xml:space="preserve">In this sample, what relationships were observed between reported household and connectivity conditions, very high stress, and respondents’ appraisals of online learning?</w:t>
       </w:r>
     </w:p>
     <w:p>
@@ -352,7 +344,7 @@
         <w:pStyle w:val="Compact"/>
       </w:pPr>
       <w:r>
-        <w:t xml:space="preserve">How did respondents judge whether online Chinese could replace campus classes?</w:t>
+        <w:t xml:space="preserve">How did respondents judge whether online Chinese-language courses could replace campus-based classes?</w:t>
       </w:r>
     </w:p>
     <w:p>
@@ -360,7 +352,7 @@
         <w:pStyle w:val="FirstParagraph"/>
       </w:pPr>
       <w:r>
-        <w:t xml:space="preserve">The analysis is exploratory. Associations are reported as counts, exact tests, and rank correlations in this network. They are not confirmatory tests of a population model.</w:t>
+        <w:t xml:space="preserve">Associations are summarised using counts, Fisher’s exact tests, and Spearman rank correlations. Given the exploratory convenience sample, these analyses are not interpreted as confirmatory tests of population-level relationships.</w:t>
       </w:r>
     </w:p>
     <w:bookmarkEnd w:id="21"/>
@@ -439,20 +431,7 @@
         <w:pStyle w:val="BodyText"/>
       </w:pPr>
       <w:r>
-        <w:t xml:space="preserve">Ecological views of language education take the setting of the class, not only the student plus the application, as the unit of analysis (van Lier, 2004; Guerrettaz et al., 2021). In this paper that setting is described as a</w:t>
-      </w:r>
-      <w:r>
-        <w:t xml:space="preserve"> </w:t>
-      </w:r>
-      <w:r>
-        <w:rPr>
-          <w:iCs/>
-          <w:i/>
-        </w:rPr>
-        <w:t xml:space="preserve">home learning ecology</w:t>
-      </w:r>
-      <w:r>
-        <w:t xml:space="preserve">: domestic space, paid or care work, and the conditions of oral participation. Electricity interruptions, applications marked unusable, and weak bandwidth are treated as material and infrastructural conditions, not as cultural traits.</w:t>
+        <w:t xml:space="preserve">Ecological views of language education take the setting of the class, not only the student plus the application, as the unit of analysis (van Lier, 2004; Guerrettaz et al., 2021). In this paper those reported conditions are described as elements of respondents’ immediate learning ecologies: domestic space, paid or care work, and the conditions of oral participation. Electricity interruptions, applications marked unusable, and weak bandwidth are treated as material and infrastructural conditions, not as cultural traits.</w:t>
       </w:r>
     </w:p>
     <w:bookmarkEnd w:id="23"/>
@@ -470,7 +449,7 @@
         <w:pStyle w:val="FirstParagraph"/>
       </w:pPr>
       <w:r>
-        <w:t xml:space="preserve">In materials work, localisation has meant personalising content so that it speaks to a particular group (McDonough &amp; Shaw, 2003; Tomlinson, 2011). Canagarajah (2005) and Kumaravadivelu (2001) locate pedagogy in a specific group and place. China’s promotion of Chinese has long been tied to institutes, textbooks, and tests (Zhao &amp; Huang, 2010). ICLE studies have applied localisation to curriculum construction and textbook adaptation (Zhao, 2020; Lu et al., 2024). Lam (2024) treats glocalisation as fitting a travelling literacy to a local university classroom. Guerrettaz et al. (2021) extend materials from the page to use. If the significance of materials lies in situated use, localisation must also consider whether learners can access and participate in the class as delivered.</w:t>
+        <w:t xml:space="preserve">In materials work, localisation has meant personalising content so that it speaks to a particular group (McDonough &amp; Shaw, 2003; Tomlinson, 2011). Canagarajah (2005) and Kumaravadivelu (2001) locate pedagogy in a specific group and place. China’s promotion of Chinese has long been tied to institutes, textbooks, and tests (Zhao &amp; Huang, 2010). ICLE studies have applied localisation to curriculum construction and textbook adaptation (Zhao, 2020; Lu et al., 2024). Lam (2024) examines how literacy practices are adapted to a local university classroom. Guerrettaz et al. (2021) extend materials from the page to use. If the significance of materials lies in situated use, localisation must also consider whether learners can access and participate in the class as delivered.</w:t>
       </w:r>
     </w:p>
     <w:p>
@@ -612,7 +591,7 @@
         <w:pStyle w:val="BodyText"/>
       </w:pPr>
       <w:r>
-        <w:t xml:space="preserve">Gong, Gao and Lyu (2020) review ICLE in mainland China for 2014–2018 and are cited for that pre-pandemic field map, not as post-COVID evidence. Gao and Hua (2021) and Gong, Gao, Li and Lai (2020) document international students of Chinese</w:t>
+        <w:t xml:space="preserve">Gong et al. (2020b) review ICLE in mainland China for 2014–2018 and are cited for that pre-pandemic field map, not as post-COVID evidence. Gao and Hua (2021) and Gong et al. (2020a) document international students of Chinese</w:t>
       </w:r>
       <w:r>
         <w:t xml:space="preserve"> </w:t>
@@ -628,7 +607,7 @@
         <w:t xml:space="preserve"> </w:t>
       </w:r>
       <w:r>
-        <w:t xml:space="preserve">Chinese universities. Guenier, Xing and Yan (2026) describe a designed online Chinese-culture course, which is planned online teaching rather than emergency remote teaching. The present respondents completed a Chinese-medium questionnaire about online Chinese classes. They were not a Confucius Institute classroom sample. Enrolment in a named Chinese university was not independently verified.</w:t>
+        <w:t xml:space="preserve">Chinese universities. Guenier, Xing and Yan (2026) describe a designed online Chinese-culture course, which is planned online teaching rather than emergency remote teaching. The present respondents completed a Chinese-language questionnaire about online Chinese classes. They were not a Confucius Institute classroom sample. Enrolment in a named Chinese university was not independently verified.</w:t>
       </w:r>
     </w:p>
     <w:bookmarkEnd w:id="24"/>
@@ -700,7 +679,7 @@
         <w:pStyle w:val="FirstParagraph"/>
       </w:pPr>
       <w:r>
-        <w:t xml:space="preserve">The dataset is a convenience sample. The form did not record how the link was distributed (for example WeChat, WhatsApp, email, or student groups). The research team therefore cannot name the recruitment channel. Respondents were adults who completed the Chinese-medium form about online Chinese learning. Completion of the form is not treated as proof of enrolment in a Chinese university. The form did not ask host university, city of residence that week, degree versus non-degree status, or scholarship type. Two items asked whether required courses and electives were online: 27 respondents (71.1%) reported required courses online, and 23 (60.5%) reported electives online. Those reports do not identify a named programme. The study therefore concerns a self-selected, likely Chinese-university-connected respondent group, not verified enrolment records.</w:t>
+        <w:t xml:space="preserve">The dataset is a convenience sample. The form did not record how the link was distributed (for example WeChat, WhatsApp, email, or student groups). The research team therefore cannot name the recruitment channel. Respondents were adults who completed the Chinese-language questionnaire about online Chinese learning. Completion of the questionnaire is not treated as proof of enrolment in a Chinese university. The questionnaire did not ask host university, city of residence that week, degree versus non-degree status, or scholarship type. Two items asked whether required courses and electives were online: 27 respondents (71.1%) reported taking required courses online, while 23 (60.5%) reported taking elective courses online. Those reports do not identify a named programme. The study therefore concerns a self-selected group of respondents reporting participation in online Chinese-language courses, not verified enrolment records.</w:t>
       </w:r>
     </w:p>
     <w:bookmarkEnd w:id="28"/>
@@ -734,7 +713,7 @@
         <w:pStyle w:val="BodyText"/>
       </w:pPr>
       <w:r>
-        <w:t xml:space="preserve">The sample is described as a self-selected group of respondents reporting participation in online Chinese-language courses, likely connected to Chinese higher education. Thirty-seven of 38 selected Pakistani nationality. The group is not described as verified Chinese-university enrolment, as Pakistan-resident learners, as CSC students, or as a national sample.</w:t>
+        <w:t xml:space="preserve">The sample is described as a self-selected group of respondents reporting participation in online Chinese-language courses. Thirty-seven of 38 selected Pakistani nationality. That item is the only Pakistan connection in the dataset. The group is not described as verified Chinese-university enrolment, as Pakistan-resident learners, as CSC students, or as a national sample.</w:t>
       </w:r>
     </w:p>
     <w:bookmarkEnd w:id="29"/>
@@ -752,7 +731,7 @@
         <w:pStyle w:val="FirstParagraph"/>
       </w:pPr>
       <w:r>
-        <w:t xml:space="preserve">The questionnaire comprised about 30 items: demographics, single-choice ordinals, and multiple-response lists. Stems are in Chinese, with some non-native wording (for example 您尝尝用什么平台). English glosses are used for reporting. Item wording for the appraisal index is given in Appendix A.</w:t>
+        <w:t xml:space="preserve">The questionnaire comprised about 30 items: demographics, single-choice ordinals, and multiple-response lists. Stems are in Chinese, with some non-native wording (for example 您尝尝用什么平台). English glosses are used for reporting. Self-rated Chinese proficiency was intermediate or advanced for 37 of 38 respondents; the instrument did not include a comprehension check, so completion of the Chinese-language questionnaire is treated only as evidence that respondents were willing to answer in Chinese. Item wording for the appraisal index is given in Appendix A.</w:t>
       </w:r>
     </w:p>
     <w:p>
@@ -802,7 +781,23 @@
         <w:pStyle w:val="BodyText"/>
       </w:pPr>
       <w:r>
-        <w:t xml:space="preserve">Coding follows the Wenjuan export. Higher values on speed, learned, improve, interest, and teacher interaction indicate a more negative report (worse speed; less learning, improvement, or interest; thinner interaction). Stress is coded 1 = very high to 4 = none; the focal stress analysis uses a dummy for very high stress and does not reverse the ordinal. Full directions are in Table A1.</w:t>
+        <w:t xml:space="preserve">Coding follows the Wenjuan export. Higher values on speed, learned, improve, interest, and teacher interaction indicate a more negative report (worse speed; less learning, improvement, or interest; thinner interaction). Stress (Q24) is a four-category questionnaire item coded 1 = very high to 4 = none.</w:t>
+      </w:r>
+      <w:r>
+        <w:t xml:space="preserve"> </w:t>
+      </w:r>
+      <w:r>
+        <w:rPr>
+          <w:iCs/>
+          <w:i/>
+        </w:rPr>
+        <w:t xml:space="preserve">Very high stress</w:t>
+      </w:r>
+      <w:r>
+        <w:t xml:space="preserve"> </w:t>
+      </w:r>
+      <w:r>
+        <w:t xml:space="preserve">is that first category (非常高), not an analyst-created threshold or a cut on a multi-item scale. The focal stress analysis uses a dummy for this category and does not reverse the ordinal. Full directions are in Table A1.</w:t>
       </w:r>
     </w:p>
     <w:p>
@@ -2980,7 +2975,7 @@
         <w:pStyle w:val="FirstParagraph"/>
       </w:pPr>
       <w:r>
-        <w:t xml:space="preserve">In this exploratory emergency-remote-teaching sample of mainly Pakistani respondents reporting online Chinese coursework, reported household infrastructure and platform access co-occurred with very high stress and with more negative perceived-learning appraisal. The conceptual suggestion is that ICLE localisation may need to include delivery-context fit—time, platform, task, participation mode, and assessment—as well as content adaptation. That suggestion is bounded by N = 38 and by a 2022 dataset.</w:t>
+        <w:t xml:space="preserve">In this exploratory emergency-remote-teaching sample of respondents reporting online Chinese-language courses, reported household infrastructure and platform access co-occurred with very high stress and with more negative appraisals of online learning. The conceptual suggestion is that ICLE localisation may need to include delivery-context fit—time, platform, task, participation mode, and assessment—as well as content adaptation. That suggestion is bounded by N = 38 and by a 2022 dataset.</w:t>
       </w:r>
     </w:p>
     <w:bookmarkEnd w:id="41"/>
@@ -3556,7 +3551,7 @@
         <w:pStyle w:val="BodyText"/>
       </w:pPr>
       <w:r>
-        <w:t xml:space="preserve">Gong, Y., Gao, X., Li, M., &amp; Lai, C. (2020). Cultural adaptation challenges and strategies during study abroad: New Zealand students in China.</w:t>
+        <w:t xml:space="preserve">Gong, Y., Gao, X., Li, M., &amp; Lai, C. (2020a). Cultural adaptation challenges and strategies during study abroad: New Zealand students in China.</w:t>
       </w:r>
       <w:r>
         <w:t xml:space="preserve"> </w:t>
@@ -3577,7 +3572,7 @@
         <w:pStyle w:val="BodyText"/>
       </w:pPr>
       <w:r>
-        <w:t xml:space="preserve">Gong, Y., Gao, X., &amp; Lyu, B. (2020). Teaching Chinese as a second or foreign language to non-Chinese learners in mainland China (2014-2018).</w:t>
+        <w:t xml:space="preserve">Gong, Y., Gao, X., &amp; Lyu, B. (2020b). Teaching Chinese as a second or foreign language to non-Chinese learners in mainland China (2014-2018).</w:t>
       </w:r>
       <w:r>
         <w:t xml:space="preserve"> </w:t>

</xml_diff>

<commit_message>
Tighten the introduction: delete the unsupported claim, condense the sample paragraph, and fix APA wording
Co-authored-by: kristinehina23-rgb <kristinehina23-rgb@users.noreply.github.com>
</commit_message>
<xml_diff>
--- a/papers/q1-masters-covid/word/Rathore-Cao-Xu-When-Chinese-class-moved-home.docx
+++ b/papers/q1-masters-covid/word/Rathore-Cao-Xu-When-Chinese-class-moved-home.docx
@@ -203,7 +203,7 @@
         <w:t xml:space="preserve">more often reported very high stress (11/14 versus 3/24; Fisher’s exact (p = .00008)). Worse reported internet speed was associated with a more negative appraisal of online learning ((</w:t>
       </w:r>
       <w:r>
-        <w:t xml:space="preserve">= .65), 95% bootstrap CI ([.36, .84])). Respondents also reported uneven platform access, with QQ and Chaoxing frequently marked unusable and Zoom and WhatsApp more often marked available. The findings suggest that ICLE localisation may need to address delivery-context fit alongside content and materials adaptation. Given the small 2022 convenience sample, the findings are exploratory and do not represent current hybrid practice.</w:t>
+        <w:t xml:space="preserve">= .65), 95% bootstrap CI ([.36, .84])). Respondents also reported uneven platform access, with QQ and Chaoxing frequently marked unusable and Zoom and WhatsApp more often marked available. The findings suggest that international Chinese language education (ICLE) localisation may need to address delivery-context fit alongside content and materials adaptation. Given the small 2022 convenience sample, the findings are exploratory and do not represent current hybrid practice.</w:t>
       </w:r>
     </w:p>
     <w:p>
@@ -239,7 +239,7 @@
         <w:pStyle w:val="FirstParagraph"/>
       </w:pPr>
       <w:r>
-        <w:t xml:space="preserve">A substantial body of research in international Chinese language education (ICLE) has examined learners and pedagogical practices associated with Chinese-speaking educational settings (Gong et al., 2020b; Ma et al., 2017). When a curriculum is transferred across settings, a prominent strand of localisation research has focused on content and materials: local examples, annotation, and cultural comparison (Zhao, 2020; Lu et al., 2024; McDonough &amp; Shaw, 2003; Tomlinson, 2011). Postmethod and localist scholarship argues that pedagogy should respond to a particular learner group and setting (Canagarajah, 2005; Kumaravadivelu, 2001). Recent articles in this journal frame curriculum as lived practice and examine how literacy practices are adapted to local classrooms (Lam, 2024; Shan &amp; Xu, 2024). Those layers remain necessary. They do not settle what happens when the institutional arrangements of the course also move across settings: its timetable, required platforms, tasks, participation mode, and assessment.</w:t>
+        <w:t xml:space="preserve">A substantial body of research in international Chinese language education has examined learners and pedagogical practices associated with Chinese-speaking educational settings (Gong et al., 2020b; Ma et al., 2017). When a curriculum is transferred across settings, a prominent strand of localisation research has focused on the adaptation of teaching materials and cultural content (Lu et al., 2024; McDonough &amp; Shaw, 2003; Tomlinson, 2011; Zhao, 2020). Postmethod and localist scholarship argues that pedagogy should respond to a particular learner group and setting (Canagarajah, 2005; Kumaravadivelu, 2001). Recent articles in this journal frame curriculum as lived practice and examine how literacy practices are adapted to local classrooms (Lam, 2024; Shan &amp; Xu, 2024). These approaches remain necessary. They do not settle what happens when the institutional arrangements of the course also move across settings: its timetable, required platforms, tasks, participation mode, and assessment.</w:t>
       </w:r>
     </w:p>
     <w:p>
@@ -268,7 +268,7 @@
         <w:pStyle w:val="BodyText"/>
       </w:pPr>
       <w:r>
-        <w:t xml:space="preserve">COVID-19 emergency remote teaching is the historical setting in which that mismatch became visible, not the theoretical centre of the argument (Hodges et al., 2020). Studies of language programmes transferred to videoconferencing reported thinner interaction, technical disruption, and the increased visibility of domestic conditions during lessons (Gacs et al., 2020; MacIntyre et al., 2020; Moser et al., 2021; Tao &amp; Gao, 2022). Drawing on research concerning emergency remote language teaching (Gacs et al., 2020), this paper uses</w:t>
+        <w:t xml:space="preserve">Emergency remote teaching during COVID-19 provides the historical setting in which that mismatch became visible, but it is not the theoretical centre of the argument (Hodges et al., 2020). Studies of language programmes shifted to videoconferencing reported thinner interaction, technical disruption, and the increased visibility of domestic conditions during lessons (Gacs et al., 2020; MacIntyre et al., 2020; Moser et al., 2021; Tao &amp; Gao, 2022). Drawing on research concerning emergency remote language teaching (Gacs et al., 2020), this paper uses</w:t>
       </w:r>
       <w:r>
         <w:t xml:space="preserve"> </w:t>
@@ -284,7 +284,7 @@
         <w:t xml:space="preserve"> </w:t>
       </w:r>
       <w:r>
-        <w:t xml:space="preserve">to describe a course originally designed for one institutional setting but delivered in another. The studies of Chinese-language emergency teaching reviewed here primarily concern pedagogical adaptation on the sending side, for example technology-based character instruction (Xu et al., 2022). Comparatively less attention has been given to whether delivery arrangements remained feasible for respondents taking online Chinese-language courses under different household and technological conditions. Emergency-period Chinese-university language courses often relied on synchronous class sessions and platforms used in Chinese higher education, although this questionnaire did not document the specific institutional requirements faced by each respondent.</w:t>
+        <w:t xml:space="preserve">to describe a course originally designed for one institutional setting but delivered in another. The studies of Chinese-language emergency teaching reviewed here primarily concern pedagogical adaptation on the sending side, for example technology-based character instruction (Xu et al., 2022). Comparatively less attention has been given to whether delivery arrangements remained feasible for learners taking online Chinese-language courses under different household and technological conditions.</w:t>
       </w:r>
     </w:p>
     <w:p>
@@ -292,7 +292,7 @@
         <w:pStyle w:val="BodyText"/>
       </w:pPr>
       <w:r>
-        <w:t xml:space="preserve">A prominent strand of research on international students of Chinese has examined learners already on a Chinese campus (Gao &amp; Hua, 2021; Gong et al., 2020a). The analysis draws on a February 2022 convenience sample of 38 self-selected respondents to a Chinese-language questionnaire about online Chinese learning. Thirty-seven respondents selected Pakistani nationality on the questionnaire; one selected another nationality. That self-identification is the only Pakistan connection established in the dataset. It is not a measure of residence, recruitment channel, or institutional enrolment. Because most respondents reported Pakistani nationality, literature on Pakistani educational mobility and on Pakistani university e-learning during COVID-19 is cited as context for that majority (Tu, 2026; Jamil &amp; Muschert, 2023). Those sources do not describe this sample. Twenty-seven respondents (71.1%) reported taking required courses online, while 23 (60.5%) reported taking elective courses online. Because institutional affiliation, programme status, recruitment pathway, and physical location were not verified, the group is described as a self-selected group of respondents reporting participation in online Chinese-language courses. The findings are treated as exploratory rather than representative. The study also does not directly measure institutional localisation practices; instead, it identifies learner-side conditions and experiences that such practices would need to address.</w:t>
+        <w:t xml:space="preserve">A prominent strand of research on international students of Chinese has examined learners already on a Chinese campus (Gao &amp; Hua, 2021; Gong et al., 2020a). The analysis draws on a February 2022 convenience sample of 38 self-selected respondents to a Chinese-language questionnaire about online Chinese learning. Thirty-seven respondents selected Pakistani nationality, while one selected another nationality. Nationality is the only Pakistan connection established in the dataset; residence, recruitment pathway, institutional affiliation, programme status, and physical location were not verified. Literature on Pakistani educational mobility and university e-learning during COVID-19 is therefore used only as contextual background for the nationality reported by most respondents (Jamil &amp; Muschert, 2023; Tu, 2026). Twenty-seven respondents (71.1%) reported taking required courses online, while 23 (60.5%) reported taking elective courses online. The findings from this self-selected group are treated as exploratory rather than representative. The study does not directly measure institutional localisation practices; instead, it identifies learner-side conditions and experiences that such practices would need to address.</w:t>
       </w:r>
     </w:p>
     <w:p>
@@ -332,7 +332,25 @@
         <w:pStyle w:val="Compact"/>
       </w:pPr>
       <w:r>
-        <w:t xml:space="preserve">In this sample, what relationships were observed between reported household and connectivity conditions, very high stress, and respondents’ appraisals of online learning?</w:t>
+        <w:t xml:space="preserve">In this sample, how were reported household and connectivity conditions associated with selecting</w:t>
+      </w:r>
+      <w:r>
+        <w:t xml:space="preserve"> </w:t>
+      </w:r>
+      <w:r>
+        <w:t xml:space="preserve">“</w:t>
+      </w:r>
+      <w:r>
+        <w:t xml:space="preserve">very high stress</w:t>
+      </w:r>
+      <w:r>
+        <w:t xml:space="preserve">”</w:t>
+      </w:r>
+      <w:r>
+        <w:t xml:space="preserve"> </w:t>
+      </w:r>
+      <w:r>
+        <w:t xml:space="preserve">and with respondents’ appraisals of online learning?</w:t>
       </w:r>
     </w:p>
     <w:p>
@@ -352,7 +370,7 @@
         <w:pStyle w:val="FirstParagraph"/>
       </w:pPr>
       <w:r>
-        <w:t xml:space="preserve">Associations are summarised using counts, Fisher’s exact tests, and Spearman rank correlations. Given the exploratory convenience sample, these analyses are not interpreted as confirmatory tests of population-level relationships.</w:t>
+        <w:t xml:space="preserve">Data are summarised using counts, while associations are explored using Fisher’s exact tests and Spearman rank correlations. Given the exploratory convenience sample, the results are not interpreted as confirmatory tests of population-level relationships.</w:t>
       </w:r>
     </w:p>
     <w:bookmarkEnd w:id="21"/>

</xml_diff>

<commit_message>
Recast the article in Language, Culture and Curriculum structure and researcher voice
Co-authored-by: kristinehina23-rgb <kristinehina23-rgb@users.noreply.github.com>
</commit_message>
<xml_diff>
--- a/papers/q1-masters-covid/word/Rathore-Cao-Xu-When-Chinese-class-moved-home.docx
+++ b/papers/q1-masters-covid/word/Rathore-Cao-Xu-When-Chinese-class-moved-home.docx
@@ -169,7 +169,7 @@
         <w:pStyle w:val="FirstParagraph"/>
       </w:pPr>
       <w:r>
-        <w:t xml:space="preserve">This exploratory questionnaire study examines how 38 self-selected respondents reporting online Chinese-language courses experienced emergency remote teaching. Thirty-seven selected Pakistani nationality. It proposes</w:t>
+        <w:t xml:space="preserve">This article reports an exploratory questionnaire study of how 38 self-selected respondents experienced emergency remote teaching in online Chinese-language courses. Thirty-seven selected Pakistani nationality. It proposes</w:t>
       </w:r>
       <w:r>
         <w:t xml:space="preserve"> </w:t>
@@ -182,7 +182,7 @@
         <w:t xml:space="preserve">localisation of delivery</w:t>
       </w:r>
       <w:r>
-        <w:t xml:space="preserve">: institutional adaptation of time, platform, task, participation mode, and assessment to the receiving context. The study does not measure institutional localisation practices; it identifies learner-side conditions that such practices would need to address. Adults completed a Chinese-language Wenjuan questionnaire in February 2022. Unstable networks (76.3%) and power interruptions (42.1%) were commonly reported, while 36.8% reported very high stress. Respondents who reported that home conditions affected study</w:t>
+        <w:t xml:space="preserve">—the institutional adaptation of time, platform, task, participation mode, and assessment to the receiving context—and uses the questionnaire to identify learner-side conditions that such practices would need to address, rather than to measure institutional adaptation itself. Adults completed a Chinese-language Wenjuan questionnaire in February 2022. Unstable networks (76.3%) and power interruptions (42.1%) were commonly reported, and 36.8% selected</w:t>
       </w:r>
       <w:r>
         <w:t xml:space="preserve"> </w:t>
@@ -191,6 +191,24 @@
         <w:t xml:space="preserve">“</w:t>
       </w:r>
       <w:r>
+        <w:t xml:space="preserve">very high stress.</w:t>
+      </w:r>
+      <w:r>
+        <w:t xml:space="preserve">”</w:t>
+      </w:r>
+      <w:r>
+        <w:t xml:space="preserve"> </w:t>
+      </w:r>
+      <w:r>
+        <w:t xml:space="preserve">Those who said home conditions affected study</w:t>
+      </w:r>
+      <w:r>
+        <w:t xml:space="preserve"> </w:t>
+      </w:r>
+      <w:r>
+        <w:t xml:space="preserve">“</w:t>
+      </w:r>
+      <w:r>
         <w:t xml:space="preserve">very much</w:t>
       </w:r>
       <w:r>
@@ -200,10 +218,10 @@
         <w:t xml:space="preserve"> </w:t>
       </w:r>
       <w:r>
-        <w:t xml:space="preserve">more often reported very high stress (11/14 versus 3/24; Fisher’s exact (p = .00008)). Worse reported internet speed was associated with a more negative appraisal of online learning ((</w:t>
-      </w:r>
-      <w:r>
-        <w:t xml:space="preserve">= .65), 95% bootstrap CI ([.36, .84])). Respondents also reported uneven platform access, with QQ and Chaoxing frequently marked unusable and Zoom and WhatsApp more often marked available. The findings suggest that international Chinese language education (ICLE) localisation may need to address delivery-context fit alongside content and materials adaptation. Given the small 2022 convenience sample, the findings are exploratory and do not represent current hybrid practice.</w:t>
+        <w:t xml:space="preserve">more often selected that stress category (11/14 versus 3/24; Fisher’s exact (p = .00008)). Worse reported internet speed was associated with a more negative appraisal of online learning ((</w:t>
+      </w:r>
+      <w:r>
+        <w:t xml:space="preserve">= .65), 95% bootstrap CI ([.36, .84])). Platform access was uneven: QQ and Chaoxing were frequently marked unusable, while Zoom and WhatsApp were more often marked available. The findings suggest that localisation in international Chinese language education (ICLE) may need to take delivery-context fit as seriously as content and materials. The 2022 convenience sample is small, and the results are not read as evidence of current hybrid practice.</w:t>
       </w:r>
     </w:p>
     <w:p>
@@ -239,7 +257,7 @@
         <w:pStyle w:val="FirstParagraph"/>
       </w:pPr>
       <w:r>
-        <w:t xml:space="preserve">A substantial body of research in international Chinese language education has examined learners and pedagogical practices associated with Chinese-speaking educational settings (Gong et al., 2020b; Ma et al., 2017). When a curriculum is transferred across settings, a prominent strand of localisation research has focused on the adaptation of teaching materials and cultural content (Lu et al., 2024; McDonough &amp; Shaw, 2003; Tomlinson, 2011; Zhao, 2020). Postmethod and localist scholarship argues that pedagogy should respond to a particular learner group and setting (Canagarajah, 2005; Kumaravadivelu, 2001). Recent articles in this journal frame curriculum as lived practice and examine how literacy practices are adapted to local classrooms (Lam, 2024; Shan &amp; Xu, 2024). These approaches remain necessary. They do not settle what happens when the institutional arrangements of the course also move across settings: its timetable, required platforms, tasks, participation mode, and assessment.</w:t>
+        <w:t xml:space="preserve">The relations among language, culture, and curriculum become especially visible when Chinese is taught beyond the setting in which a course was first designed. Research in international Chinese language education has given close attention to learners and pedagogical practices associated with Chinese-speaking educational settings (Gong et al., 2020b; Ma et al., 2017). When that curriculum is taken elsewhere, localisation has usually meant making materials and cultural content speak to the receiving group (Lu et al., 2024; McDonough &amp; Shaw, 2003; Tomlinson, 2011; Zhao, 2020). The same concern runs through postmethod and localist arguments that pedagogy should answer to a particular group of learners and a particular place (Canagarajah, 2005; Kumaravadivelu, 2001), and through recent articles in this journal that treat curriculum as lived practice and trace how literacy work is adapted in local classrooms (Lam, 2024; Shan &amp; Xu, 2024). These approaches remain necessary. What they leave open is a more practical question of implementation: what happens when the institutional arrangements of the course travel as well—its timetable, required platforms, tasks, expected ways of taking part, and assessment.</w:t>
       </w:r>
     </w:p>
     <w:p>
@@ -247,7 +265,7 @@
         <w:pStyle w:val="BodyText"/>
       </w:pPr>
       <w:r>
-        <w:t xml:space="preserve">If the significance of materials lies in their situated use rather than solely in their printed content (Guerrettaz et al., 2021), localisation must extend beyond the page to the conditions under which teaching is delivered. This paper proposes</w:t>
+        <w:t xml:space="preserve">If the significance of materials lies in their situated use rather than only in their printed content (Guerrettaz et al., 2021), localisation cannot stop at the page. This article proposes</w:t>
       </w:r>
       <w:r>
         <w:t xml:space="preserve"> </w:t>
@@ -260,7 +278,10 @@
         <w:t xml:space="preserve">localisation of delivery</w:t>
       </w:r>
       <w:r>
-        <w:t xml:space="preserve">: the institutional adaptation of time, platform, task, participation mode, and assessment to the receiving context. Localisation of delivery does not replace the concepts of accessibility or digital inclusion (Warschauer, 2003). It draws attention specifically to the institutional decisions through which access is enabled or constrained when a course moves across settings. A course may be locally relevant in content but inaccessible in delivery.</w:t>
+        <w:t xml:space="preserve"> </w:t>
+      </w:r>
+      <w:r>
+        <w:t xml:space="preserve">as a way of naming the institutional work of adapting time, platform, task, participation mode, and assessment to the receiving context. The idea is close to, but narrower than, accessibility and digital inclusion (Warschauer, 2003). It asks how institutional decisions enable or constrain access once a course has left the setting for which it was designed. A course may be locally relevant in content but inaccessible in delivery.</w:t>
       </w:r>
     </w:p>
     <w:p>
@@ -268,7 +289,7 @@
         <w:pStyle w:val="BodyText"/>
       </w:pPr>
       <w:r>
-        <w:t xml:space="preserve">Emergency remote teaching during COVID-19 provides the historical setting in which that mismatch became visible, but it is not the theoretical centre of the argument (Hodges et al., 2020). Studies of language programmes shifted to videoconferencing reported thinner interaction, technical disruption, and the increased visibility of domestic conditions during lessons (Gacs et al., 2020; MacIntyre et al., 2020; Moser et al., 2021; Tao &amp; Gao, 2022). Drawing on research concerning emergency remote language teaching (Gacs et al., 2020), this paper uses</w:t>
+        <w:t xml:space="preserve">Emergency remote teaching during COVID-19 provides the historical setting in which that mismatch became visible, but it is not the theoretical centre of the argument (Hodges et al., 2020). When language programmes were shifted to videoconferencing, researchers documented thinner interaction, technical disruption, and the sudden visibility of domestic life during lessons (Gacs et al., 2020; MacIntyre et al., 2020; Moser et al., 2021; Tao &amp; Gao, 2022). Drawing on that emergency-remote-language-teaching literature (Gacs et al., 2020), this article uses</w:t>
       </w:r>
       <w:r>
         <w:t xml:space="preserve"> </w:t>
@@ -284,7 +305,7 @@
         <w:t xml:space="preserve"> </w:t>
       </w:r>
       <w:r>
-        <w:t xml:space="preserve">to describe a course originally designed for one institutional setting but delivered in another. The studies of Chinese-language emergency teaching reviewed here primarily concern pedagogical adaptation on the sending side, for example technology-based character instruction (Xu et al., 2022). Comparatively less attention has been given to whether delivery arrangements remained feasible for learners taking online Chinese-language courses under different household and technological conditions.</w:t>
+        <w:t xml:space="preserve">for a course designed in one institutional setting and taught in another. Studies of Chinese-language emergency teaching have so far said more about pedagogical adaptation on the sending side—for example, technology-based character instruction (Xu et al., 2022)—than about whether the delivery arrangements themselves remained feasible for learners working under different household and technological conditions.</w:t>
       </w:r>
     </w:p>
     <w:p>
@@ -292,7 +313,7 @@
         <w:pStyle w:val="BodyText"/>
       </w:pPr>
       <w:r>
-        <w:t xml:space="preserve">A prominent strand of research on international students of Chinese has examined learners already on a Chinese campus (Gao &amp; Hua, 2021; Gong et al., 2020a). The analysis draws on a February 2022 convenience sample of 38 self-selected respondents to a Chinese-language questionnaire about online Chinese learning. Thirty-seven respondents selected Pakistani nationality, while one selected another nationality. Nationality is the only Pakistan connection established in the dataset; residence, recruitment pathway, institutional affiliation, programme status, and physical location were not verified. Literature on Pakistani educational mobility and university e-learning during COVID-19 is therefore used only as contextual background for the nationality reported by most respondents (Jamil &amp; Muschert, 2023; Tu, 2026). Twenty-seven respondents (71.1%) reported taking required courses online, while 23 (60.5%) reported taking elective courses online. The findings from this self-selected group are treated as exploratory rather than representative. The study does not directly measure institutional localisation practices; instead, it identifies learner-side conditions and experiences that such practices would need to address.</w:t>
+        <w:t xml:space="preserve">Much of the research on international students of Chinese has examined learners already on a Chinese campus (Gao &amp; Hua, 2021; Gong et al., 2020a). The present analysis is more modest in scope. It draws on a February 2022 convenience sample of 38 self-selected respondents to a Chinese-language questionnaire about online Chinese learning. Thirty-seven respondents selected Pakistani nationality, while one selected another nationality. Nationality is the only Pakistan connection established in the dataset; residence, recruitment pathway, institutional affiliation, programme status, and physical location were not verified. Literature on Pakistani educational mobility and university e-learning during COVID-19 is therefore used only as contextual background for the nationality reported by most respondents (Jamil &amp; Muschert, 2023; Tu, 2026). Twenty-seven respondents (71.1%) reported taking required courses online, while 23 (60.5%) reported taking elective courses online. The findings from this self-selected group are treated as exploratory rather than representative. The questionnaire does not measure how institutions localised delivery; it records learner-side conditions and experiences that such practices would need to take seriously.</w:t>
       </w:r>
     </w:p>
     <w:p>
@@ -300,7 +321,7 @@
         <w:pStyle w:val="BodyText"/>
       </w:pPr>
       <w:r>
-        <w:t xml:space="preserve">The questionnaire captured elements of respondents’ immediate learning ecologies, including domestic space, connectivity, and conditions for oral participation (van Lier, 2004; Warschauer, 2003). This study examines the relationships observed in the February 2022 convenience sample between household infrastructure, reported platform access, stress, respondents’ appraisals of online learning, and their judgements of whether online Chinese-language courses could replace campus-based classes.</w:t>
+        <w:t xml:space="preserve">Those conditions belong to respondents’ immediate learning ecologies: the domestic space, the connection, and the circumstances in which oral participation was asked for (van Lier, 2004; Warschauer, 2003). In that sense the article is as much about the culture of the class—the setting in which language work was expected to happen—as it is about the syllabus on the page. It examines how, in this 2022 sample, household infrastructure and reported platform access sat alongside stress, appraisals of online learning, and judgements about whether online Chinese-language courses could replace campus classes.</w:t>
       </w:r>
     </w:p>
     <w:p>
@@ -370,17 +391,17 @@
         <w:pStyle w:val="FirstParagraph"/>
       </w:pPr>
       <w:r>
-        <w:t xml:space="preserve">Data are summarised using counts, while associations are explored using Fisher’s exact tests and Spearman rank correlations. Given the exploratory convenience sample, the results are not interpreted as confirmatory tests of population-level relationships.</w:t>
+        <w:t xml:space="preserve">Counts are used descriptively. Associations are explored with Fisher’s exact tests and Spearman rank correlations and are not read as confirmatory tests of population-level relationships. The article proceeds as follows. Section 2 locates the study in the emergency-remote-teaching literature, in work on digital inequality and home learning ecologies, and in the proposed account of localisation of delivery. Section 3 describes the questionnaire and the limits of the sample. Sections 4 and 5 report and discuss the findings, and the final sections set out implications, limitations, and a bounded conclusion.</w:t>
       </w:r>
     </w:p>
     <w:bookmarkEnd w:id="21"/>
-    <w:bookmarkStart w:id="26" w:name="literature-and-framework"/>
+    <w:bookmarkStart w:id="26" w:name="Xa71efe292272ba0d775f88aaa92c3e49c1e1383"/>
     <w:p>
       <w:pPr>
         <w:pStyle w:val="Heading2"/>
       </w:pPr>
       <w:r>
-        <w:t xml:space="preserve">2. Literature and framework</w:t>
+        <w:t xml:space="preserve">2. Literature review and conceptual framework</w:t>
       </w:r>
     </w:p>
     <w:bookmarkStart w:id="22" w:name="X466d9fa4ba9675c3d2d096fe48fd97f00c4a10c"/>
@@ -397,7 +418,7 @@
         <w:pStyle w:val="FirstParagraph"/>
       </w:pPr>
       <w:r>
-        <w:t xml:space="preserve">Hodges et al. (2020) distinguished emergency remote teaching from planned online or blended courses. Gacs, Goertler and Spasova (2020) applied that distinction to languages. Empirical surveys of language educators report increased workload, stress, and uneven preparedness when instruction moved online (MacIntyre et al., 2020; Moser et al., 2021). Tao and Gao (2022) synthesise the wider online-language literature as a problem of technical disruption, thinner engagement, and the need for language-specific support. Those studies are cited as emergency-teaching context, not as direct evidence of student stress in the present dataset.</w:t>
+        <w:t xml:space="preserve">Hodges et al. (2020) drew a useful line between emergency remote teaching and planned online or blended provision. Gacs, Goertler and Spasova (2020) brought that distinction into language education. Surveys of language teachers from the same period describe heavier workloads, stress, and uneven preparedness once teaching moved online (MacIntyre et al., 2020; Moser et al., 2021), and Tao and Gao (2022) read the wider literature as a story of technical disruption, thinner engagement, and the need for language-specific support. That work is used here to locate the historical moment, not to stand in for the stress reports in the present questionnaire.</w:t>
       </w:r>
     </w:p>
     <w:p>
@@ -405,7 +426,7 @@
         <w:pStyle w:val="BodyText"/>
       </w:pPr>
       <w:r>
-        <w:t xml:space="preserve">Later work described technological normalisation after the return to campus (Moorhouse, 2023; Moorhouse, Wong, &amp; Li, 2023) and warned that copying face-to-face teaching on videoconferencing was a limited lesson from the crisis (Stockwell &amp; Wang, 2023). For Chinese, contemporaneous papers documented</w:t>
+        <w:t xml:space="preserve">After campuses reopened, later studies described a kind of technological normalisation (Moorhouse, 2023; Moorhouse, Wong, &amp; Li, 2023) and cautioned against treating a videoconference copy of the classroom as the main lesson of the crisis (Stockwell &amp; Wang, 2023). For Chinese, contemporaneous accounts recorded the policy of</w:t>
       </w:r>
       <w:r>
         <w:t xml:space="preserve"> </w:t>
@@ -423,17 +444,17 @@
         <w:t xml:space="preserve"> </w:t>
       </w:r>
       <w:r>
-        <w:t xml:space="preserve">and platform trials (Zhang et al., 2020; Xia et al., 2022). Xu et al. (2022) show that Chinese-character teaching during emergency remote instruction was adapted on the sending side. A later review of online ICLE teaching models still lists technical issues, weak interaction, and time-zone problems (Li &amp; Li, 2024). Learner emotion in Chinese as an additional language is already studied in this journal (Wen &amp; Liu, 2025). Much of that literature assumes a relatively stable connection. This exploratory questionnaire cannot test whether that assumption holds for current hybrid ICLE. It can describe what 38 respondents reported in February 2022.</w:t>
+        <w:t xml:space="preserve">and early platform trials (Xia et al., 2022; Zhang et al., 2020). Xu et al. (2022) show how character teaching was adapted on the sending side. Reviews of online ICLE models continue to mention technical problems, weak interaction, and time-zone difficulty (Li &amp; Li, 2024), and learner emotion in Chinese as an additional language is already a topic in this journal (Wen &amp; Liu, 2025). Much of that writing quietly assumes a relatively stable connection. The present questionnaire cannot test whether that assumption holds for current hybrid ICLE; it can only describe what 38 respondents reported in February 2022.</w:t>
       </w:r>
     </w:p>
     <w:bookmarkEnd w:id="22"/>
-    <w:bookmarkStart w:id="23" w:name="X2a1706acb855f9b47e20bf43e0bff03a0be2114"/>
+    <w:bookmarkStart w:id="23" w:name="X8fd0326383b50249221392c76a6b8ab8b037526"/>
     <w:p>
       <w:pPr>
         <w:pStyle w:val="Heading3"/>
       </w:pPr>
       <w:r>
-        <w:t xml:space="preserve">2.2 Digital inequality and home learning ecology</w:t>
+        <w:t xml:space="preserve">2.2 Digital inequality and the home learning ecology</w:t>
       </w:r>
     </w:p>
     <w:p>
@@ -441,7 +462,7 @@
         <w:pStyle w:val="FirstParagraph"/>
       </w:pPr>
       <w:r>
-        <w:t xml:space="preserve">Later digital-divide models describe a sequence of motivational, material, skills, usage, and outcome access (van Dijk, 2020; Helsper, 2021; Warschauer, 2003). Device ownership is not the same as taking part (Ali, 2020). In Pakistani higher education during COVID-19, interview evidence shows that first-level access (internet, devices) and second-level skills were uneven, and that rural and less-resourced students were more exposed (Jamil &amp; Muschert, 2023). Household use of educational technology is also structured by device sharing, care work, and electricity (Raza &amp; Hennessy, 2025). The EdTech Hub report is grey literature. Neither source is treated as a finding about the present 38 respondents.</w:t>
+        <w:t xml:space="preserve">Later models of the digital divide distinguish motivational, material, skills, usage, and outcome access (Helsper, 2021; van Dijk, 2020; Warschauer, 2003). Owning a device is not the same as being able to take part (Ali, 2020). Interview research on Pakistani university e-learning during COVID-19 found uneven first-level access (internet and devices) and second-level skills, with rural and less-resourced students more exposed (Jamil &amp; Muschert, 2023). Household use of educational technology is also shaped by device sharing, care work, and electricity (Raza &amp; Hennessy, 2025). The latter source is a grey-literature report, and neither study is treated as evidence about the 38 respondents here; both are cited only as background for the nationality most of them reported.</w:t>
       </w:r>
     </w:p>
     <w:p>
@@ -449,7 +470,7 @@
         <w:pStyle w:val="BodyText"/>
       </w:pPr>
       <w:r>
-        <w:t xml:space="preserve">Ecological views of language education take the setting of the class, not only the student plus the application, as the unit of analysis (van Lier, 2004; Guerrettaz et al., 2021). In this paper those reported conditions are described as elements of respondents’ immediate learning ecologies: domestic space, paid or care work, and the conditions of oral participation. Electricity interruptions, applications marked unusable, and weak bandwidth are treated as material and infrastructural conditions, not as cultural traits.</w:t>
+        <w:t xml:space="preserve">An ecological view of language education takes the setting of the class, not only the student and the application, as the unit of analysis (Guerrettaz et al., 2021; van Lier, 2004). The conditions reported in this questionnaire—domestic space, paid or care work, and the circumstances of speaking in class—are therefore read as elements of respondents’ immediate learning ecologies. Power interruptions, applications marked unusable, and weak bandwidth are material and infrastructural facts, not cultural traits.</w:t>
       </w:r>
     </w:p>
     <w:bookmarkEnd w:id="23"/>
@@ -467,7 +488,7 @@
         <w:pStyle w:val="FirstParagraph"/>
       </w:pPr>
       <w:r>
-        <w:t xml:space="preserve">In materials work, localisation has meant personalising content so that it speaks to a particular group (McDonough &amp; Shaw, 2003; Tomlinson, 2011). Canagarajah (2005) and Kumaravadivelu (2001) locate pedagogy in a specific group and place. China’s promotion of Chinese has long been tied to institutes, textbooks, and tests (Zhao &amp; Huang, 2010). ICLE studies have applied localisation to curriculum construction and textbook adaptation (Zhao, 2020; Lu et al., 2024). Lam (2024) examines how literacy practices are adapted to a local university classroom. Guerrettaz et al. (2021) extend materials from the page to use. If the significance of materials lies in situated use, localisation must also consider whether learners can access and participate in the class as delivered.</w:t>
+        <w:t xml:space="preserve">In materials work, localisation has usually meant personalising content so that it speaks to a particular group (McDonough &amp; Shaw, 2003; Tomlinson, 2011). Canagarajah (2005) and Kumaravadivelu (2001) locate pedagogy in a specific group and place. The promotion of Chinese has long been organised through institutes, textbooks, and tests (Zhao &amp; Huang, 2010), and ICLE research has applied localisation mainly to curriculum construction and textbook adaptation (Lu et al., 2024; Zhao, 2020). Lam (2024) shows how literacy practices are reshaped in a local university classroom. Guerrettaz et al. (2021) push materials off the page and into use. If that move is taken seriously, localisation also has to ask whether learners can reach and take part in the class as it is delivered.</w:t>
       </w:r>
     </w:p>
     <w:p>
@@ -475,7 +496,7 @@
         <w:pStyle w:val="BodyText"/>
       </w:pPr>
       <w:r>
-        <w:t xml:space="preserve">Four layers can be distinguished:</w:t>
+        <w:t xml:space="preserve">It is helpful to keep four layers distinct:</w:t>
       </w:r>
     </w:p>
     <w:p>
@@ -583,7 +604,7 @@
         <w:pStyle w:val="FirstParagraph"/>
       </w:pPr>
       <w:r>
-        <w:t xml:space="preserve">The analysis addresses only the fourth layer. Localisation of delivery does not replace the concepts of accessibility or digital inclusion. It draws attention specifically to the institutional decisions through which access is enabled or constrained when a course moves across settings: changing the synchronous class session, the required application, the oral task, or the assessment so that the travelling course can be used where learners participate. The questionnaire did not observe institutions adapting. It recorded learner-side conditions and reported experiences that such practices would need to address.</w:t>
+        <w:t xml:space="preserve">This analysis is concerned with the fourth. Localisation of delivery does not replace accessibility or digital inclusion; it names the institutional decisions through which access is made possible or closed off when a course moves—the timing of the class, the required application, the oral task, or the form of assessment. The questionnaire did not observe those institutional decisions. It recorded the learner-side conditions against which such decisions would have to be judged. The claim that follows is therefore conceptual rather than institutional: a course may be locally relevant in content but inaccessible in delivery. It is localised in delivery only when its required time, platform, participation mode, task design, and assessment are feasible where learners actually take part.</w:t>
       </w:r>
     </w:p>
     <w:p>
@@ -591,25 +612,7 @@
         <w:pStyle w:val="BodyText"/>
       </w:pPr>
       <w:r>
-        <w:rPr>
-          <w:bCs/>
-          <w:b/>
-        </w:rPr>
-        <w:t xml:space="preserve">Proposition.</w:t>
-      </w:r>
-      <w:r>
-        <w:t xml:space="preserve"> </w:t>
-      </w:r>
-      <w:r>
-        <w:t xml:space="preserve">A course may be locally relevant in content but inaccessible in delivery. It is localised in delivery only when its required time, platform, participation mode, task design, and assessment are feasible in the setting where learners participate.</w:t>
-      </w:r>
-    </w:p>
-    <w:p>
-      <w:pPr>
-        <w:pStyle w:val="BodyText"/>
-      </w:pPr>
-      <w:r>
-        <w:t xml:space="preserve">Gong et al. (2020b) review ICLE in mainland China for 2014–2018 and are cited for that pre-pandemic field map, not as post-COVID evidence. Gao and Hua (2021) and Gong et al. (2020a) document international students of Chinese</w:t>
+        <w:t xml:space="preserve">Gong et al. (2020b) map ICLE in mainland China for 2014–2018 and are used here as a pre-pandemic field sketch, not as post-COVID evidence. Gao and Hua (2021) and Gong et al. (2020a) write about international students of Chinese</w:t>
       </w:r>
       <w:r>
         <w:t xml:space="preserve"> </w:t>
@@ -625,7 +628,7 @@
         <w:t xml:space="preserve"> </w:t>
       </w:r>
       <w:r>
-        <w:t xml:space="preserve">Chinese universities. Guenier, Xing and Yan (2026) describe a designed online Chinese-culture course, which is planned online teaching rather than emergency remote teaching. The present respondents completed a Chinese-language questionnaire about online Chinese classes. They were not a Confucius Institute classroom sample. Enrolment in a named Chinese university was not independently verified.</w:t>
+        <w:t xml:space="preserve">Chinese universities. Guenier, Xing and Yan (2026) describe a designed online Chinese-culture course, which is planned online teaching rather than emergency remote teaching. The respondents in the present study completed a Chinese-language questionnaire about online Chinese classes. They are not treated as a Confucius Institute classroom sample, and enrolment in a named Chinese university was not independently verified.</w:t>
       </w:r>
     </w:p>
     <w:bookmarkEnd w:id="24"/>
@@ -643,7 +646,7 @@
         <w:pStyle w:val="FirstParagraph"/>
       </w:pPr>
       <w:r>
-        <w:t xml:space="preserve">Figure 1 is a reading model, not a tested path. Household infrastructure and reported platform access are concurrent conditions of a travelling course. They are described as possible constraints on participation. Language investment is not part of the model.</w:t>
+        <w:t xml:space="preserve">Figure 1 is offered as a reading model, not as a tested path. Household infrastructure and reported platform access are concurrent conditions of a travelling course and are interpreted as possible constraints on participation. Language investment is not part of the model.</w:t>
       </w:r>
     </w:p>
     <w:p>
@@ -656,22 +659,13 @@
     </w:p>
     <w:bookmarkEnd w:id="25"/>
     <w:bookmarkEnd w:id="26"/>
-    <w:bookmarkStart w:id="33" w:name="the-study"/>
+    <w:bookmarkStart w:id="32" w:name="the-study"/>
     <w:p>
       <w:pPr>
         <w:pStyle w:val="Heading2"/>
       </w:pPr>
       <w:r>
         <w:t xml:space="preserve">3. The study</w:t>
-      </w:r>
-    </w:p>
-    <w:bookmarkStart w:id="27" w:name="design"/>
-    <w:p>
-      <w:pPr>
-        <w:pStyle w:val="Heading3"/>
-      </w:pPr>
-      <w:r>
-        <w:t xml:space="preserve">3.1 Design</w:t>
       </w:r>
     </w:p>
     <w:p>
@@ -679,17 +673,34 @@
         <w:pStyle w:val="FirstParagraph"/>
       </w:pPr>
       <w:r>
-        <w:t xml:space="preserve">The study is an exploratory, cross-sectional questionnaire. It does not test a pre-registered confirmatory model. The instrument title on the Wenjuan export is 新冠肺炎期间留学生在线中文学习的影响因素 (Influencing factors in international students’ online Chinese learning during COVID-19). Complete cases were submitted between 5 and 8 February 2022 (N = 38).</w:t>
+        <w:t xml:space="preserve">The study is an exploratory, cross-sectional questionnaire. It does not test a pre-registered confirmatory model. What follows describes the instrument, the self-selected group who completed it, and the limits of what the questionnaire can support.</w:t>
+      </w:r>
+    </w:p>
+    <w:bookmarkStart w:id="27" w:name="design-and-context"/>
+    <w:p>
+      <w:pPr>
+        <w:pStyle w:val="Heading3"/>
+      </w:pPr>
+      <w:r>
+        <w:t xml:space="preserve">3.1 Design and context</w:t>
+      </w:r>
+    </w:p>
+    <w:p>
+      <w:pPr>
+        <w:pStyle w:val="FirstParagraph"/>
+      </w:pPr>
+      <w:r>
+        <w:t xml:space="preserve">The instrument title on the Wenjuan export is 新冠肺炎期间留学生在线中文学习的影响因素 (Influencing factors in international students’ online Chinese learning during COVID-19). Complete cases were submitted between 5 and 8 February 2022 (N = 38). The form did not record how the link was circulated—whether through WeChat, WhatsApp, email, or student groups—so the recruitment channel cannot be named. Respondents were adults who completed the Chinese-language questionnaire about online Chinese learning. Completing that questionnaire is not treated as proof of enrolment in a Chinese university. The instrument did not ask host university, city of residence that week, degree versus non-degree status, or scholarship type. Two items asked whether required courses and electives were being taken online: 27 respondents (71.1%) reported required courses online, and 23 (60.5%) reported electives online. Those answers do not identify a named programme. The study therefore concerns a self-selected group of respondents reporting participation in online Chinese-language courses, not a verified enrolment record.</w:t>
       </w:r>
     </w:p>
     <w:bookmarkEnd w:id="27"/>
-    <w:bookmarkStart w:id="28" w:name="recruitment-and-eligibility"/>
+    <w:bookmarkStart w:id="28" w:name="participants"/>
     <w:p>
       <w:pPr>
         <w:pStyle w:val="Heading3"/>
       </w:pPr>
       <w:r>
-        <w:t xml:space="preserve">3.2 Recruitment and eligibility</w:t>
+        <w:t xml:space="preserve">3.2 Participants</w:t>
       </w:r>
     </w:p>
     <w:p>
@@ -697,17 +708,25 @@
         <w:pStyle w:val="FirstParagraph"/>
       </w:pPr>
       <w:r>
-        <w:t xml:space="preserve">The dataset is a convenience sample. The form did not record how the link was distributed (for example WeChat, WhatsApp, email, or student groups). The research team therefore cannot name the recruitment channel. Respondents were adults who completed the Chinese-language questionnaire about online Chinese learning. Completion of the questionnaire is not treated as proof of enrolment in a Chinese university. The questionnaire did not ask host university, city of residence that week, degree versus non-degree status, or scholarship type. Two items asked whether required courses and electives were online: 27 respondents (71.1%) reported taking required courses online, while 23 (60.5%) reported taking elective courses online. Those reports do not identify a named programme. The study therefore concerns a self-selected group of respondents reporting participation in online Chinese-language courses, not verified enrolment records.</w:t>
+        <w:t xml:space="preserve">Of the 38 respondents, 27 were men (71.1%) and 11 were women (28.9%). Thirty-seven selected Pakistani nationality and one selected another nationality. That nationality item is the only Pakistan connection in the dataset. The group is not described as verified Chinese-university enrolment, as Pakistan-resident learners, as CSC students, or as a national sample. Self-rated Chinese level was mostly advanced (22, 57.9%) or intermediate (15, 39.5%), with one beginner; the label is the student’s own, not an HSK band. Years of learning Chinese clustered at three to four years (26, 68.4%). Wenjuan submission metadata classified the operating system as iPhone (24, 63.2%) or Android (14). That variable is the device used to submit the form, not an item about all devices used for class.</w:t>
+      </w:r>
+    </w:p>
+    <w:p>
+      <w:pPr>
+        <w:pStyle w:val="BodyText"/>
+      </w:pPr>
+      <w:r>
+        <w:t xml:space="preserve">Wenjuan automatically recorded an IP-province field. A dummy was coded when that field was a mainland China province name (9 of 38). IP labels are technical metadata. They can be affected by virtual private networks and proxies, and they are not a reliable measure of physical location. They are not used as a participant-location variable and are not the basis of a sensitivity analysis. The dummy, submission dates, and device identifiers are not included in the public dataset.</w:t>
       </w:r>
     </w:p>
     <w:bookmarkEnd w:id="28"/>
-    <w:bookmarkStart w:id="29" w:name="participants"/>
+    <w:bookmarkStart w:id="29" w:name="instrument-and-coding"/>
     <w:p>
       <w:pPr>
         <w:pStyle w:val="Heading3"/>
       </w:pPr>
       <w:r>
-        <w:t xml:space="preserve">3.3 Participants</w:t>
+        <w:t xml:space="preserve">3.3 Instrument and coding</w:t>
       </w:r>
     </w:p>
     <w:p>
@@ -715,41 +734,7 @@
         <w:pStyle w:val="FirstParagraph"/>
       </w:pPr>
       <w:r>
-        <w:t xml:space="preserve">Of 38 respondents, 27 were men (71.1%) and 11 women (28.9%). Thirty-seven selected Pakistani nationality and one selected another nationality. Self-rated Chinese level was mostly advanced (22, 57.9%) or intermediate (15, 39.5%); one beginner. That label is the student’s own, not an HSK band. Years of learning Chinese clustered at three to four years (26, 68.4%). Wenjuan submission metadata classified the operating system as iPhone (24, 63.2%) or Android (14). That variable is the device used to submit the form, not a survey item about all devices used for class.</w:t>
-      </w:r>
-    </w:p>
-    <w:p>
-      <w:pPr>
-        <w:pStyle w:val="BodyText"/>
-      </w:pPr>
-      <w:r>
-        <w:t xml:space="preserve">Wenjuan automatically recorded an IP-province field. The research team coded a dummy when that field was a mainland China province name (9 of 38). IP labels are technical metadata. They can be affected by virtual private networks and proxies and are not a reliable measure of physical location. They are not used as a participant-location variable and are not the basis of a sensitivity analysis. The dummy, submission dates, and device identifiers are not included in the public dataset.</w:t>
-      </w:r>
-    </w:p>
-    <w:p>
-      <w:pPr>
-        <w:pStyle w:val="BodyText"/>
-      </w:pPr>
-      <w:r>
-        <w:t xml:space="preserve">The sample is described as a self-selected group of respondents reporting participation in online Chinese-language courses. Thirty-seven of 38 selected Pakistani nationality. That item is the only Pakistan connection in the dataset. The group is not described as verified Chinese-university enrolment, as Pakistan-resident learners, as CSC students, or as a national sample.</w:t>
-      </w:r>
-    </w:p>
-    <w:bookmarkEnd w:id="29"/>
-    <w:bookmarkStart w:id="30" w:name="instrument-and-coding"/>
-    <w:p>
-      <w:pPr>
-        <w:pStyle w:val="Heading3"/>
-      </w:pPr>
-      <w:r>
-        <w:t xml:space="preserve">3.4 Instrument and coding</w:t>
-      </w:r>
-    </w:p>
-    <w:p>
-      <w:pPr>
-        <w:pStyle w:val="FirstParagraph"/>
-      </w:pPr>
-      <w:r>
-        <w:t xml:space="preserve">The questionnaire comprised about 30 items: demographics, single-choice ordinals, and multiple-response lists. Stems are in Chinese, with some non-native wording (for example 您尝尝用什么平台). English glosses are used for reporting. Self-rated Chinese proficiency was intermediate or advanced for 37 of 38 respondents; the instrument did not include a comprehension check, so completion of the Chinese-language questionnaire is treated only as evidence that respondents were willing to answer in Chinese. Item wording for the appraisal index is given in Appendix A.</w:t>
+        <w:t xml:space="preserve">The questionnaire comprised about 30 items: demographics, single-choice ordinals, and multiple-response lists. Stems are in Chinese, with some non-native wording (for example 您尝尝用什么平台). English glosses are used for reporting. Self-rated Chinese proficiency was intermediate or advanced for 37 of 38 respondents. The instrument did not include a comprehension check, so completion of the Chinese-language questionnaire is treated only as evidence that respondents were willing to answer in Chinese. Item wording for the appraisal index is given in Appendix A.</w:t>
       </w:r>
     </w:p>
     <w:p>
@@ -773,7 +758,7 @@
         <w:t xml:space="preserve"> </w:t>
       </w:r>
       <w:r>
-        <w:t xml:space="preserve">was formed from learned much (Q8), improves Chinese (Q9), and sparks interest (Q10). The items ask related but not identical questions. They are treated as a descriptive index, not as a validated unidimensional scale. Internal consistency was acceptable in this sample (Cronbach’s α = .84); Spearman inter-item correlations ranged from .55 to .75 (Appendix B). Exploratory factor analysis was not used (N = 38). Individual items are also reported. One double-tick on</w:t>
+        <w:t xml:space="preserve">was formed from learned much (Q8), improves Chinese (Q9), and sparks interest (Q10). The items ask related but not identical questions and are treated as a descriptive index, not as a validated unidimensional scale. Internal consistency was acceptable in this sample (Cronbach’s α = .84); Spearman inter-item correlations ranged from .55 to .75 (Appendix B). Exploratory factor analysis was not used (N = 38). Individual items are also reported. One double-tick on</w:t>
       </w:r>
       <w:r>
         <w:t xml:space="preserve"> </w:t>
@@ -815,7 +800,7 @@
         <w:t xml:space="preserve"> </w:t>
       </w:r>
       <w:r>
-        <w:t xml:space="preserve">is that first category (非常高), not an analyst-created threshold or a cut on a multi-item scale. The focal stress analysis uses a dummy for this category and does not reverse the ordinal. Full directions are in Table A1.</w:t>
+        <w:t xml:space="preserve">is that first category (非常高), not an analyst-created threshold or a cut on a multi-item scale. The focal stress analysis uses a dummy for this category and does not reverse the ordinal. Full coding directions are in Table A1.</w:t>
       </w:r>
     </w:p>
     <w:p>
@@ -841,7 +826,7 @@
         <w:t xml:space="preserve"> </w:t>
       </w:r>
       <w:r>
-        <w:t xml:space="preserve">The introduction’s references to load-shedding are contextual. In results we report the item as</w:t>
+        <w:t xml:space="preserve">References to load-shedding elsewhere in the article are contextual. In the results the item is reported as</w:t>
       </w:r>
       <w:r>
         <w:t xml:space="preserve"> </w:t>
@@ -878,14 +863,14 @@
         <w:t xml:space="preserve">is reported as printed on the form; the option did not name a single provider such as 中国大学MOOC.</w:t>
       </w:r>
     </w:p>
-    <w:bookmarkEnd w:id="30"/>
-    <w:bookmarkStart w:id="31" w:name="analysis"/>
+    <w:bookmarkEnd w:id="29"/>
+    <w:bookmarkStart w:id="30" w:name="analysis"/>
     <w:p>
       <w:pPr>
         <w:pStyle w:val="Heading3"/>
       </w:pPr>
       <w:r>
-        <w:t xml:space="preserve">3.5 Analysis</w:t>
+        <w:t xml:space="preserve">3.4 Analysis</w:t>
       </w:r>
     </w:p>
     <w:p>
@@ -893,7 +878,7 @@
         <w:pStyle w:val="FirstParagraph"/>
       </w:pPr>
       <w:r>
-        <w:t xml:space="preserve">Frequencies are n/38 unless noted. Multiple-response items are the percentage who selected the option. Two associations were treated as focal: (a) home affects study very much × very high stress; (b) internet speed × the appraisal index. For the 2×2 table we report cell counts and two-sided Fisher’s exact</w:t>
+        <w:t xml:space="preserve">Frequencies are n/38 unless noted. Multiple-response items are the percentage who selected the option. Two associations were treated as focal: (a) home affects study very much × very high stress; and (b) internet speed × the appraisal index. For the 2 × 2 table we report cell counts and two-sided Fisher’s exact</w:t>
       </w:r>
       <w:r>
         <w:t xml:space="preserve"> </w:t>
@@ -961,14 +946,14 @@
         <w:t xml:space="preserve">A Pakistani-nationality check (n = 37) is reported only to show that dropping the one non-Pakistani case does not reverse the two focal associations. It is not a location analysis.</w:t>
       </w:r>
     </w:p>
-    <w:bookmarkEnd w:id="31"/>
-    <w:bookmarkStart w:id="32" w:name="ethics-and-data-protection"/>
+    <w:bookmarkEnd w:id="30"/>
+    <w:bookmarkStart w:id="31" w:name="ethics-and-data-protection"/>
     <w:p>
       <w:pPr>
         <w:pStyle w:val="Heading3"/>
       </w:pPr>
       <w:r>
-        <w:t xml:space="preserve">3.6 Ethics and data protection</w:t>
+        <w:t xml:space="preserve">3.5 Ethics and data protection</w:t>
       </w:r>
     </w:p>
     <w:p>
@@ -976,7 +961,7 @@
         <w:pStyle w:val="FirstParagraph"/>
       </w:pPr>
       <w:r>
-        <w:t xml:space="preserve">Adult respondents completed an online form presented as research on online Chinese learning. The form stated that answers would be used for research. Completion and submission were treated as consent. Names, IP addresses, exact timestamps, and device identifiers were removed before the public file was prepared.</w:t>
+        <w:t xml:space="preserve">Adult respondents completed an online form presented as research on online Chinese learning. The form stated that answers would be used for research, and completion and submission were treated as consent. Names, IP addresses, exact timestamps, and device identifiers were removed before the public file was prepared.</w:t>
       </w:r>
     </w:p>
     <w:p>
@@ -984,12 +969,12 @@
         <w:pStyle w:val="BodyText"/>
       </w:pPr>
       <w:r>
-        <w:t xml:space="preserve">No institutional ethics approval number is available for the original 2022 data collection. The first author was then an M.Phil. student; numbered approval was not obtained. This paper reports an anonymised secondary analysis of that file.</w:t>
+        <w:t xml:space="preserve">No institutional ethics approval number is available for the original 2022 data collection. The first author was then an M.Phil. student, and numbered approval was not obtained. This article reports an anonymised secondary analysis of that file.</w:t>
       </w:r>
     </w:p>
+    <w:bookmarkEnd w:id="31"/>
     <w:bookmarkEnd w:id="32"/>
-    <w:bookmarkEnd w:id="33"/>
-    <w:bookmarkStart w:id="38" w:name="results"/>
+    <w:bookmarkStart w:id="37" w:name="results"/>
     <w:p>
       <w:pPr>
         <w:pStyle w:val="Heading2"/>
@@ -998,7 +983,7 @@
         <w:t xml:space="preserve">4. Results</w:t>
       </w:r>
     </w:p>
-    <w:bookmarkStart w:id="34" w:name="respondents-and-reported-conditions"/>
+    <w:bookmarkStart w:id="33" w:name="respondents-and-reported-conditions"/>
     <w:p>
       <w:pPr>
         <w:pStyle w:val="Heading3"/>
@@ -1012,7 +997,7 @@
         <w:pStyle w:val="FirstParagraph"/>
       </w:pPr>
       <w:r>
-        <w:t xml:space="preserve">Table 1 locates the sample. Most respondents (78.9%) said all of their Chinese classes were online. More than half (57.9%) reported working alongside study.</w:t>
+        <w:t xml:space="preserve">Table 1 locates the sample. Most respondents (78.9%) said all of their Chinese classes were online, and more than half (57.9%) reported working alongside study.</w:t>
       </w:r>
     </w:p>
     <w:p>
@@ -1496,7 +1481,7 @@
         <w:pStyle w:val="BodyText"/>
       </w:pPr>
       <w:r>
-        <w:t xml:space="preserve">Table 2 summarises reported conditions. Unstable networks (76.3%) and power interruptions (42.1%) were commonly ticked. Speed was split: 36.8% good or very good, 36.8% average, 26.3% bad or very bad. Four respondents (10.5%) said their country did not have internet, yet all 38 submitted an online form. The item wording does not allow a firm reinterpretation; we report the tick as given. Only 11 of 38 (28.9%) described the home as quiet.</w:t>
+        <w:t xml:space="preserve">Table 2 summarises the conditions respondents reported. Unstable networks (76.3%) and power interruptions (42.1%) were common. Speed was split: 36.8% good or very good, 36.8% average, and 26.3% bad or very bad. Four respondents (10.5%) said their country did not have internet, yet all 38 submitted an online form. The item wording does not allow a firm reinterpretation, so the response is reported as given. Only 11 of 38 (28.9%) described the home as quiet.</w:t>
       </w:r>
     </w:p>
     <w:p>
@@ -1924,7 +1909,25 @@
         <w:pStyle w:val="BodyText"/>
       </w:pPr>
       <w:r>
-        <w:t xml:space="preserve">Among those who said the home affected study very much, 11 of 14 also reported very high psychological stress; among the others, 3 of 24 did (two-sided Fisher’s exact</w:t>
+        <w:t xml:space="preserve">Among those who said the home affected study very much, 11 of 14 also selected</w:t>
+      </w:r>
+      <w:r>
+        <w:t xml:space="preserve"> </w:t>
+      </w:r>
+      <w:r>
+        <w:t xml:space="preserve">“</w:t>
+      </w:r>
+      <w:r>
+        <w:t xml:space="preserve">very high</w:t>
+      </w:r>
+      <w:r>
+        <w:t xml:space="preserve">”</w:t>
+      </w:r>
+      <w:r>
+        <w:t xml:space="preserve"> </w:t>
+      </w:r>
+      <w:r>
+        <w:t xml:space="preserve">psychological stress; among the others, 3 of 24 did (two-sided Fisher’s exact</w:t>
       </w:r>
       <w:r>
         <w:t xml:space="preserve"> </w:t>
@@ -1940,11 +1943,11 @@
         <w:t xml:space="preserve"> </w:t>
       </w:r>
       <w:r>
-        <w:t xml:space="preserve">= .00008). This is a co-occurrence in this dataset. It is not evidence that the household caused stress. The most salient descriptive stress finding was that 36.8% reported very high stress.</w:t>
+        <w:t xml:space="preserve">= .00008). That is a co-occurrence in this dataset, not evidence that the household caused stress. Descriptively, 36.8% of the sample selected the very-high-stress category.</w:t>
       </w:r>
     </w:p>
-    <w:bookmarkEnd w:id="34"/>
-    <w:bookmarkStart w:id="35" w:name="reported-platform-access"/>
+    <w:bookmarkEnd w:id="33"/>
+    <w:bookmarkStart w:id="34" w:name="reported-platform-access"/>
     <w:p>
       <w:pPr>
         <w:pStyle w:val="Heading3"/>
@@ -1958,7 +1961,7 @@
         <w:pStyle w:val="FirstParagraph"/>
       </w:pPr>
       <w:r>
-        <w:t xml:space="preserve">Respondents reported uneven access to institutionally familiar and consumer-facing platforms (Table 3). This pattern is interpreted as a possible platform-geography dimension of delivery-context fit. The survey cannot isolate country restrictions, routing, account rules, skills, or virtual private networks.</w:t>
+        <w:t xml:space="preserve">Respondents reported uneven access to institutionally familiar and consumer-facing platforms (Table 3). The pattern is read as a possible platform-geography dimension of delivery-context fit. The questionnaire cannot isolate country restrictions, routing, account rules, skills, or virtual private networks.</w:t>
       </w:r>
     </w:p>
     <w:p>
@@ -1966,7 +1969,7 @@
         <w:pStyle w:val="BodyText"/>
       </w:pPr>
       <w:r>
-        <w:t xml:space="preserve">Tools reported as used for class were Tencent Meeting (71.1%), Zoom (47.4%), and WeChat (31.6%). Tools marked unusable</w:t>
+        <w:t xml:space="preserve">The tools reported as used for class were Tencent Meeting (71.1%), Zoom (47.4%), and WeChat (31.6%). Those marked unusable</w:t>
       </w:r>
       <w:r>
         <w:t xml:space="preserve"> </w:t>
@@ -1984,7 +1987,7 @@
         <w:t xml:space="preserve"> </w:t>
       </w:r>
       <w:r>
-        <w:t xml:space="preserve">included QQ (50.0%), Chaoxing (42.1%), DingTalk (28.9%), and 中国慕课 (28.9%). Tools marked available included Zoom (71.1%), WhatsApp (68.4%), Tencent Meeting (57.9%), and WeChat (39.5%). WhatsApp appears only as available; the retained form did not code whether it was used for class. Tencent Meeting was the most used class tool but was marked available by fewer respondents. That discrepancy is left as an item-level inconsistency.</w:t>
+        <w:t xml:space="preserve">included QQ (50.0%), Chaoxing (42.1%), DingTalk (28.9%), and 中国慕课 (28.9%). Those marked available included Zoom (71.1%), WhatsApp (68.4%), Tencent Meeting (57.9%), and WeChat (39.5%). WhatsApp appears only as available; the retained form did not code whether it was used for class. Tencent Meeting was the most used class tool but was marked available by fewer respondents, a discrepancy left as an item-level inconsistency.</w:t>
       </w:r>
     </w:p>
     <w:p>
@@ -2532,8 +2535,8 @@
         <w:t xml:space="preserve">follows the item wording and is not a technical claim that the platform was blocked.</w:t>
       </w:r>
     </w:p>
-    <w:bookmarkEnd w:id="35"/>
-    <w:bookmarkStart w:id="36" w:name="perceived-learning-and-internet-speed"/>
+    <w:bookmarkEnd w:id="34"/>
+    <w:bookmarkStart w:id="35" w:name="perceived-learning-and-internet-speed"/>
     <w:p>
       <w:pPr>
         <w:pStyle w:val="Heading3"/>
@@ -2565,7 +2568,7 @@
         <w:t xml:space="preserve"> </w:t>
       </w:r>
       <w:r>
-        <w:t xml:space="preserve">was reported by 6 of 38 (15.8%). Classroom talk, when ticked, was mainly dialogue (76.3%) and question and answer (57.9%). Role-play was rare (7.9%).</w:t>
+        <w:t xml:space="preserve">was reported by 6 of 38 (15.8%). When classroom talk was reported, it was mainly dialogue (76.3%) and question and answer (57.9%). Role-play was rare (7.9%).</w:t>
       </w:r>
     </w:p>
     <w:p>
@@ -2591,7 +2594,7 @@
         <w:t xml:space="preserve"> </w:t>
       </w:r>
       <w:r>
-        <w:t xml:space="preserve">online; 28.9% said little or nothing. Worse internet speed was associated with a worse appraisal index (ρ = .65,</w:t>
+        <w:t xml:space="preserve">online and 28.9% said little or nothing. Worse internet speed was associated with a worse appraisal index (ρ = .65,</w:t>
       </w:r>
       <w:r>
         <w:t xml:space="preserve"> </w:t>
@@ -2607,7 +2610,7 @@
         <w:t xml:space="preserve"> </w:t>
       </w:r>
       <w:r>
-        <w:t xml:space="preserve">&lt; .001, percentile bootstrap 95% CI [.36, .84]). A simple, unvalidated count of selected infrastructure-problem ticks (unstable network, power interruptions, no signal) was not associated with the index (ρ = .02,</w:t>
+        <w:t xml:space="preserve">&lt; .001, percentile bootstrap 95% CI [.36, .84]). A simple, unvalidated count of selected infrastructure-problem options (unstable network, power interruptions, no signal) was not associated with the index (ρ = .02,</w:t>
       </w:r>
       <w:r>
         <w:t xml:space="preserve"> </w:t>
@@ -2623,7 +2626,7 @@
         <w:t xml:space="preserve"> </w:t>
       </w:r>
       <w:r>
-        <w:t xml:space="preserve">= .91, percentile bootstrap 95% CI [−.32, .37]). The count is an exploratory post hoc descriptive indicator. Unstable network and no signal may overlap, and power interruptions are a different infrastructure layer. The non-significant correlation is therefore not interpreted as evidence that speed matters but the number of problems does not. These are rank associations, not effects of infrastructure on learning.</w:t>
+        <w:t xml:space="preserve">= .91, percentile bootstrap 95% CI [−.32, .37]). That count is an exploratory post hoc indicator: unstable network and no signal may overlap, and power interruptions are a different layer of infrastructure. The non-significant correlation is therefore not read as evidence that speed matters but the number of problems does not. These are rank associations, not effects of infrastructure on learning.</w:t>
       </w:r>
     </w:p>
     <w:p>
@@ -2879,8 +2882,8 @@
         <w:t xml:space="preserve">= .00011) and speed × appraisal was ρ = .67 (percentile bootstrap 95% CI [.39, .85]).</w:t>
       </w:r>
     </w:p>
-    <w:bookmarkEnd w:id="36"/>
-    <w:bookmarkStart w:id="37" w:name="X97201ae18f9cce7e94bf1bc756e03fa139ac895"/>
+    <w:bookmarkEnd w:id="35"/>
+    <w:bookmarkStart w:id="36" w:name="X97201ae18f9cce7e94bf1bc756e03fa139ac895"/>
     <w:p>
       <w:pPr>
         <w:pStyle w:val="Heading3"/>
@@ -2894,12 +2897,12 @@
         <w:pStyle w:val="FirstParagraph"/>
       </w:pPr>
       <w:r>
-        <w:t xml:space="preserve">Nineteen of 38 said online study could replace campus classes and 19 said it could not. Among women, 9 of 11 said it could not; among men, 10 of 27 said so. With 11 women this is a cautious exploratory observation of perceived legitimacy in this sample. It is not a gender finding about Pakistani households and is not treated as a focal test (Appendix B).</w:t>
+        <w:t xml:space="preserve">Nineteen of 38 said online study could replace campus classes, and 19 said it could not. Among women, 9 of 11 said it could not; among men, 10 of 27 said so. With only 11 women, this is a cautious observation of perceived legitimacy in this sample. It is not a gender finding about Pakistani households and is not treated as a focal test (Appendix B).</w:t>
       </w:r>
     </w:p>
+    <w:bookmarkEnd w:id="36"/>
     <w:bookmarkEnd w:id="37"/>
-    <w:bookmarkEnd w:id="38"/>
-    <w:bookmarkStart w:id="39" w:name="discussion"/>
+    <w:bookmarkStart w:id="38" w:name="discussion"/>
     <w:p>
       <w:pPr>
         <w:pStyle w:val="Heading2"/>
@@ -2913,7 +2916,7 @@
         <w:pStyle w:val="FirstParagraph"/>
       </w:pPr>
       <w:r>
-        <w:t xml:space="preserve">This historically situated dataset suggests a possible delivery-context mismatch: respondents reporting online Chinese coursework connected to Chinese higher education also reported household power and network problems and uneven access to applications often used in that sector. Localisation of content and materials remains necessary (Zhao, 2020; Lu et al., 2024). In this sample, those layers would not have addressed the synchronous class session that respondents associated with an unstable connection or an application marked unusable.</w:t>
+        <w:t xml:space="preserve">The 2022 questionnaire does not show how institutions adapted. What it does show is a set of learner-side conditions that would have pressed on any travelling Chinese-language course. In this sample, household infrastructure and platform access sat alongside reports of very high stress and more negative appraisals of online learning. Localisation of content and materials would still have been necessary (Lu et al., 2024; Zhao, 2020). It would not, by itself, have answered a synchronous session on an unstable connection, or a required application that respondents marked unusable in their country.</w:t>
       </w:r>
     </w:p>
     <w:p>
@@ -2921,7 +2924,53 @@
         <w:pStyle w:val="BodyText"/>
       </w:pPr>
       <w:r>
-        <w:t xml:space="preserve">Based on these findings, possible design considerations, rather than established solutions, include shorter or asynchronous oral alternatives, assessment that does not assume a campus oral hour, and a required platform that respondents can open. WhatsApp was marked available here; it was not recorded as used for class. The findings do not show that later hybrid ICLE has repeated this pattern. They suggest that hybrid models</w:t>
+        <w:t xml:space="preserve">Those conditions belong to the culture of the class in a narrow, ecological sense: the immediate setting in which language work was asked to happen (van Lier, 2004). They are not a claim about Pakistani culture, nor about a national educational system. Most respondents selected Pakistani nationality, and that is the only Pakistan connection the dataset can support.</w:t>
+      </w:r>
+    </w:p>
+    <w:p>
+      <w:pPr>
+        <w:pStyle w:val="BodyText"/>
+      </w:pPr>
+      <w:r>
+        <w:t xml:space="preserve">The platform pattern is best read as a possible geography of delivery. Applications often used in Chinese-university teaching (QQ, Chaoxing, DingTalk, 中国慕课) were frequently marked unusable, while Zoom and WhatsApp were more often marked available. The questionnaire cannot say whether that pattern reflects country restrictions, routing, account rules, skills, or virtual private networks. It can say that a travelling course which assumes a single institutional toolkit may ask learners to enter a class they cannot reliably open.</w:t>
+      </w:r>
+    </w:p>
+    <w:p>
+      <w:pPr>
+        <w:pStyle w:val="BodyText"/>
+      </w:pPr>
+      <w:r>
+        <w:t xml:space="preserve">Participation in this dataset co-occurred with reported platform access, power and connectivity problems, and a home that many described as not quiet. That is a description of domestic participation conditions, not a claim that inequality is</w:t>
+      </w:r>
+      <w:r>
+        <w:t xml:space="preserve"> </w:t>
+      </w:r>
+      <w:r>
+        <w:t xml:space="preserve">“</w:t>
+      </w:r>
+      <w:r>
+        <w:t xml:space="preserve">cultural.</w:t>
+      </w:r>
+      <w:r>
+        <w:t xml:space="preserve">”</w:t>
+      </w:r>
+    </w:p>
+    <w:bookmarkEnd w:id="38"/>
+    <w:bookmarkStart w:id="39" w:name="Xa4b283138da25a30b7a49a65f021a6e6787929a"/>
+    <w:p>
+      <w:pPr>
+        <w:pStyle w:val="Heading2"/>
+      </w:pPr>
+      <w:r>
+        <w:t xml:space="preserve">6. Implications for curriculum implementation</w:t>
+      </w:r>
+    </w:p>
+    <w:p>
+      <w:pPr>
+        <w:pStyle w:val="FirstParagraph"/>
+      </w:pPr>
+      <w:r>
+        <w:t xml:space="preserve">If localisation is also a question of delivery, course design has to treat time, platform, participation mode, task, and assessment as curricular decisions rather than as technical afterthoughts. The present findings can support only cautious, sample-bound suggestions: shorter or asynchronous oral alternatives; assessment that does not assume a quiet campus hour; and a required platform that respondents can actually open. WhatsApp was marked available here, but it was not recorded as used for class, so the data do not recommend it as a replacement. Nor do they show that later hybrid ICLE has repeated this pattern. They do suggest that hybrid models</w:t>
       </w:r>
       <w:r>
         <w:t xml:space="preserve"> </w:t>
@@ -2937,27 +2986,7 @@
         <w:t xml:space="preserve"> </w:t>
       </w:r>
       <w:r>
-        <w:t xml:space="preserve">reproduce a similar mismatch if delivery assumptions are not examined (Stockwell &amp; Wang, 2023).</w:t>
-      </w:r>
-    </w:p>
-    <w:p>
-      <w:pPr>
-        <w:pStyle w:val="BodyText"/>
-      </w:pPr>
-      <w:r>
-        <w:t xml:space="preserve">Participation in this dataset co-occurred with reported platform access, power and connectivity problems, and a home environment that many described as not quiet. That is a description of domestic participation conditions, not a claim that inequality is</w:t>
-      </w:r>
-      <w:r>
-        <w:t xml:space="preserve"> </w:t>
-      </w:r>
-      <w:r>
-        <w:t xml:space="preserve">“</w:t>
-      </w:r>
-      <w:r>
-        <w:t xml:space="preserve">cultural.</w:t>
-      </w:r>
-      <w:r>
-        <w:t xml:space="preserve">”</w:t>
+        <w:t xml:space="preserve">reproduce a similar mismatch if the delivery assumptions of a travelling course are left unexamined (Stockwell &amp; Wang, 2023).</w:t>
       </w:r>
     </w:p>
     <w:bookmarkEnd w:id="39"/>
@@ -2967,7 +2996,7 @@
         <w:pStyle w:val="Heading2"/>
       </w:pPr>
       <w:r>
-        <w:t xml:space="preserve">6. Limitations</w:t>
+        <w:t xml:space="preserve">7. Limitations</w:t>
       </w:r>
     </w:p>
     <w:p>
@@ -2975,7 +3004,7 @@
         <w:pStyle w:val="FirstParagraph"/>
       </w:pPr>
       <w:r>
-        <w:t xml:space="preserve">The sample is small (N = 38), network-recruited, and majority male. Recruitment channel, host university, programme type, and place of residence that week were not recorded, so Chinese-university enrolment is not independently verified. IP metadata are not a location measure. All outcomes are self-report. The appraisal index is descriptive, not a validated scale. The infrastructure-problem count is an unvalidated post hoc indicator. The form did not measure institutional adaptation, so localisation of delivery is a conceptual reading of student-side conditions. Data are from February 2022 and concern emergency remote teaching. They are not evidence about current hybrid education. No ethics-committee number is available for the 2022 collection (Section 3.6).</w:t>
+        <w:t xml:space="preserve">The sample is small (N = 38), network-recruited, and majority male. Recruitment channel, host university, programme type, and place of residence that week were not recorded, so Chinese-university enrolment is not independently verified. IP metadata are not a location measure. All outcomes are self-report. The appraisal index is descriptive, not a validated scale, and the infrastructure-problem count is an unvalidated post hoc indicator. The form did not measure institutional adaptation, so localisation of delivery remains a conceptual reading of student-side conditions. The data are from February 2022 and concern emergency remote teaching; they are not evidence about current hybrid education. No ethics-committee number is available for the 2022 collection (Section 3.5).</w:t>
       </w:r>
     </w:p>
     <w:bookmarkEnd w:id="40"/>
@@ -2985,7 +3014,7 @@
         <w:pStyle w:val="Heading2"/>
       </w:pPr>
       <w:r>
-        <w:t xml:space="preserve">7. Conclusion</w:t>
+        <w:t xml:space="preserve">8. Conclusion</w:t>
       </w:r>
     </w:p>
     <w:p>
@@ -2993,7 +3022,25 @@
         <w:pStyle w:val="FirstParagraph"/>
       </w:pPr>
       <w:r>
-        <w:t xml:space="preserve">In this exploratory emergency-remote-teaching sample of respondents reporting online Chinese-language courses, reported household infrastructure and platform access co-occurred with very high stress and with more negative appraisals of online learning. The conceptual suggestion is that ICLE localisation may need to include delivery-context fit—time, platform, task, participation mode, and assessment—as well as content adaptation. That suggestion is bounded by N = 38 and by a 2022 dataset.</w:t>
+        <w:t xml:space="preserve">In this exploratory emergency-remote-teaching sample, respondents reporting online Chinese-language courses also reported household infrastructure problems and uneven platform access. Those conditions co-occurred with selecting</w:t>
+      </w:r>
+      <w:r>
+        <w:t xml:space="preserve"> </w:t>
+      </w:r>
+      <w:r>
+        <w:t xml:space="preserve">“</w:t>
+      </w:r>
+      <w:r>
+        <w:t xml:space="preserve">very high stress</w:t>
+      </w:r>
+      <w:r>
+        <w:t xml:space="preserve">”</w:t>
+      </w:r>
+      <w:r>
+        <w:t xml:space="preserve"> </w:t>
+      </w:r>
+      <w:r>
+        <w:t xml:space="preserve">and with more negative appraisals of online learning. The conceptual suggestion, bounded by N = 38 and by a 2022 dataset, is that ICLE localisation may need to take delivery-context fit—time, platform, task, participation mode, and assessment—as seriously as the adaptation of content and materials. A course may be locally relevant in content but inaccessible in delivery. Whether later hybrid arrangements have closed that gap is a question this study cannot answer.</w:t>
       </w:r>
     </w:p>
     <w:bookmarkEnd w:id="41"/>

</xml_diff>

<commit_message>
Put the research problem and the article's answer at the front of the paper
Co-authored-by: kristinehina23-rgb <kristinehina23-rgb@users.noreply.github.com>
</commit_message>
<xml_diff>
--- a/papers/q1-masters-covid/word/Rathore-Cao-Xu-When-Chinese-class-moved-home.docx
+++ b/papers/q1-masters-covid/word/Rathore-Cao-Xu-When-Chinese-class-moved-home.docx
@@ -169,7 +169,7 @@
         <w:pStyle w:val="FirstParagraph"/>
       </w:pPr>
       <w:r>
-        <w:t xml:space="preserve">This article reports an exploratory questionnaire study of how 38 self-selected respondents experienced emergency remote teaching in online Chinese-language courses. Thirty-seven selected Pakistani nationality. It proposes</w:t>
+        <w:t xml:space="preserve">This article investigates a curriculum-implementation problem in international Chinese language education (ICLE): a course may be localised in content and still be difficult to take if its timetable, platforms, tasks, and assessment travel unchanged. A February 2022 Wenjuan questionnaire asked 38 self-selected respondents—37 of whom selected Pakistani nationality—what household, connectivity, and platform-access conditions they faced in online Chinese-language courses, and how those conditions sat alongside stress and appraisals of online learning. The article proposes</w:t>
       </w:r>
       <w:r>
         <w:t xml:space="preserve"> </w:t>
@@ -182,12 +182,15 @@
         <w:t xml:space="preserve">localisation of delivery</w:t>
       </w:r>
       <w:r>
-        <w:t xml:space="preserve">—the institutional adaptation of time, platform, task, participation mode, and assessment to the receiving context—and uses the questionnaire to identify learner-side conditions that such practices would need to address, rather than to measure institutional adaptation itself. Adults completed a Chinese-language Wenjuan questionnaire in February 2022. Unstable networks (76.3%) and power interruptions (42.1%) were commonly reported, and 36.8% selected</w:t>
-      </w:r>
-      <w:r>
         <w:t xml:space="preserve"> </w:t>
       </w:r>
       <w:r>
+        <w:t xml:space="preserve">and uses the questionnaire to identify learner-side conditions that such practices would need to address, not to measure institutional adaptation. Unstable networks (76.3%) and power interruptions (42.1%) were commonly reported, and 36.8% selected</w:t>
+      </w:r>
+      <w:r>
+        <w:t xml:space="preserve"> </w:t>
+      </w:r>
+      <w:r>
         <w:t xml:space="preserve">“</w:t>
       </w:r>
       <w:r>
@@ -218,10 +221,10 @@
         <w:t xml:space="preserve"> </w:t>
       </w:r>
       <w:r>
-        <w:t xml:space="preserve">more often selected that stress category (11/14 versus 3/24; Fisher’s exact (p = .00008)). Worse reported internet speed was associated with a more negative appraisal of online learning ((</w:t>
-      </w:r>
-      <w:r>
-        <w:t xml:space="preserve">= .65), 95% bootstrap CI ([.36, .84])). Platform access was uneven: QQ and Chaoxing were frequently marked unusable, while Zoom and WhatsApp were more often marked available. The findings suggest that localisation in international Chinese language education (ICLE) may need to take delivery-context fit as seriously as content and materials. The 2022 convenience sample is small, and the results are not read as evidence of current hybrid practice.</w:t>
+        <w:t xml:space="preserve">more often selected that category (11/14 versus 3/24; Fisher’s exact (p = .00008)). Worse reported internet speed was associated with a more negative appraisal of online learning ((</w:t>
+      </w:r>
+      <w:r>
+        <w:t xml:space="preserve">= .65), 95% bootstrap CI ([.36, .84])). QQ and Chaoxing were frequently marked unusable; Zoom and WhatsApp were more often marked available. In this sample, delivery-context fit was a live problem for online Chinese learning. The results are exploratory and are not read as evidence of current hybrid practice.</w:t>
       </w:r>
     </w:p>
     <w:p>
@@ -257,7 +260,36 @@
         <w:pStyle w:val="FirstParagraph"/>
       </w:pPr>
       <w:r>
-        <w:t xml:space="preserve">The relations among language, culture, and curriculum become especially visible when Chinese is taught beyond the setting in which a course was first designed. Research in international Chinese language education has given close attention to learners and pedagogical practices associated with Chinese-speaking educational settings (Gong et al., 2020b; Ma et al., 2017). When that curriculum is taken elsewhere, localisation has usually meant making materials and cultural content speak to the receiving group (Lu et al., 2024; McDonough &amp; Shaw, 2003; Tomlinson, 2011; Zhao, 2020). The same concern runs through postmethod and localist arguments that pedagogy should answer to a particular group of learners and a particular place (Canagarajah, 2005; Kumaravadivelu, 2001), and through recent articles in this journal that treat curriculum as lived practice and trace how literacy work is adapted in local classrooms (Lam, 2024; Shan &amp; Xu, 2024). These approaches remain necessary. What they leave open is a more practical question of implementation: what happens when the institutional arrangements of the course travel as well—its timetable, required platforms, tasks, expected ways of taking part, and assessment.</w:t>
+        <w:t xml:space="preserve">The problem this article investigates is easy to miss. International Chinese language education has become skilled at localising what a course</w:t>
+      </w:r>
+      <w:r>
+        <w:t xml:space="preserve"> </w:t>
+      </w:r>
+      <w:r>
+        <w:rPr>
+          <w:iCs/>
+          <w:i/>
+        </w:rPr>
+        <w:t xml:space="preserve">says</w:t>
+      </w:r>
+      <w:r>
+        <w:t xml:space="preserve">: its examples, cultural content, and materials (Lu et al., 2024; McDonough &amp; Shaw, 2003; Tomlinson, 2011; Zhao, 2020). It has said much less about whether the course can still be</w:t>
+      </w:r>
+      <w:r>
+        <w:t xml:space="preserve"> </w:t>
+      </w:r>
+      <w:r>
+        <w:rPr>
+          <w:iCs/>
+          <w:i/>
+        </w:rPr>
+        <w:t xml:space="preserve">taken</w:t>
+      </w:r>
+      <w:r>
+        <w:t xml:space="preserve"> </w:t>
+      </w:r>
+      <w:r>
+        <w:t xml:space="preserve">once it leaves the setting in which it was designed. A travelling course may keep its original timetable, required platforms, oral tasks, and forms of assessment. If those arrangements do not fit the household and technological conditions in which learners actually participate, the curriculum is local in content but closed in delivery. That mismatch—between a course that looks localised and a course that can be joined—is the problem the present study sets out to examine.</w:t>
       </w:r>
     </w:p>
     <w:p>
@@ -265,7 +297,15 @@
         <w:pStyle w:val="BodyText"/>
       </w:pPr>
       <w:r>
-        <w:t xml:space="preserve">If the significance of materials lies in their situated use rather than only in their printed content (Guerrettaz et al., 2021), localisation cannot stop at the page. This article proposes</w:t>
+        <w:t xml:space="preserve">The problem matters because language, culture, and curriculum meet not only in the textbook but in the setting of the class (Guerrettaz et al., 2021; van Lier, 2004). Research in the field has mapped learners and pedagogical practices associated with Chinese-speaking educational settings (Gong et al., 2020b; Ma et al., 2017). Postmethod and localist scholarship already argues that pedagogy should answer to a particular group and place (Canagarajah, 2005; Kumaravadivelu, 2001), and recent articles in this journal treat curriculum as lived practice (Lam, 2024; Shan &amp; Xu, 2024). These approaches remain necessary. They do not, by themselves, tell us whether the institutional arrangements of a course—its time, platforms, tasks, participation mode, and assessment—remain feasible when teaching moves.</w:t>
+      </w:r>
+    </w:p>
+    <w:p>
+      <w:pPr>
+        <w:pStyle w:val="BodyText"/>
+      </w:pPr>
+      <w:r>
+        <w:t xml:space="preserve">This article addresses that implementation gap. It proposes</w:t>
       </w:r>
       <w:r>
         <w:t xml:space="preserve"> </w:t>
@@ -281,7 +321,7 @@
         <w:t xml:space="preserve"> </w:t>
       </w:r>
       <w:r>
-        <w:t xml:space="preserve">as a way of naming the institutional work of adapting time, platform, task, participation mode, and assessment to the receiving context. The idea is close to, but narrower than, accessibility and digital inclusion (Warschauer, 2003). It asks how institutional decisions enable or constrain access once a course has left the setting for which it was designed. A course may be locally relevant in content but inaccessible in delivery.</w:t>
+        <w:t xml:space="preserve">as the name for the missing work: the institutional adaptation of time, platform, task, participation mode, and assessment to the receiving context. The idea is close to, but narrower than, accessibility and digital inclusion (Warschauer, 2003). The claim it seeks to make good is straightforward. A course may be locally relevant in content but inaccessible in delivery. The questionnaire cannot show how institutions adapted. What it can do, and what it is used for here, is to answer a prior empirical question: what learner-side conditions would such adaptation have to take seriously?</w:t>
       </w:r>
     </w:p>
     <w:p>
@@ -289,7 +329,7 @@
         <w:pStyle w:val="BodyText"/>
       </w:pPr>
       <w:r>
-        <w:t xml:space="preserve">Emergency remote teaching during COVID-19 provides the historical setting in which that mismatch became visible, but it is not the theoretical centre of the argument (Hodges et al., 2020). When language programmes were shifted to videoconferencing, researchers documented thinner interaction, technical disruption, and the sudden visibility of domestic life during lessons (Gacs et al., 2020; MacIntyre et al., 2020; Moser et al., 2021; Tao &amp; Gao, 2022). Drawing on that emergency-remote-language-teaching literature (Gacs et al., 2020), this article uses</w:t>
+        <w:t xml:space="preserve">Emergency remote teaching during COVID-19 is the historical setting in which that question became urgent; it is not the theoretical centre of the argument (Hodges et al., 2020). When language programmes were shifted to videoconferencing, researchers documented thinner interaction, technical disruption, and the sudden visibility of domestic life during lessons (Gacs et al., 2020; MacIntyre et al., 2020; Moser et al., 2021; Tao &amp; Gao, 2022). Drawing on that literature (Gacs et al., 2020), this article uses</w:t>
       </w:r>
       <w:r>
         <w:t xml:space="preserve"> </w:t>
@@ -305,7 +345,7 @@
         <w:t xml:space="preserve"> </w:t>
       </w:r>
       <w:r>
-        <w:t xml:space="preserve">for a course designed in one institutional setting and taught in another. Studies of Chinese-language emergency teaching have so far said more about pedagogical adaptation on the sending side—for example, technology-based character instruction (Xu et al., 2022)—than about whether the delivery arrangements themselves remained feasible for learners working under different household and technological conditions.</w:t>
+        <w:t xml:space="preserve">for a course designed in one institutional setting and taught in another. Studies of Chinese-language emergency teaching have so far said more about pedagogical adaptation on the sending side—for example, technology-based character instruction (Xu et al., 2022)—than about whether delivery arrangements remained feasible for learners under different household and technological conditions. That is the gap this study fills.</w:t>
       </w:r>
     </w:p>
     <w:p>
@@ -313,7 +353,7 @@
         <w:pStyle w:val="BodyText"/>
       </w:pPr>
       <w:r>
-        <w:t xml:space="preserve">Much of the research on international students of Chinese has examined learners already on a Chinese campus (Gao &amp; Hua, 2021; Gong et al., 2020a). The present analysis is more modest in scope. It draws on a February 2022 convenience sample of 38 self-selected respondents to a Chinese-language questionnaire about online Chinese learning. Thirty-seven respondents selected Pakistani nationality, while one selected another nationality. Nationality is the only Pakistan connection established in the dataset; residence, recruitment pathway, institutional affiliation, programme status, and physical location were not verified. Literature on Pakistani educational mobility and university e-learning during COVID-19 is therefore used only as contextual background for the nationality reported by most respondents (Jamil &amp; Muschert, 2023; Tu, 2026). Twenty-seven respondents (71.1%) reported taking required courses online, while 23 (60.5%) reported taking elective courses online. The findings from this self-selected group are treated as exploratory rather than representative. The questionnaire does not measure how institutions localised delivery; it records learner-side conditions and experiences that such practices would need to take seriously.</w:t>
+        <w:t xml:space="preserve">The analysis draws on a February 2022 convenience sample of 38 self-selected respondents to a Chinese-language questionnaire about online Chinese learning. Thirty-seven respondents selected Pakistani nationality, while one selected another nationality. Nationality is the only Pakistan connection established in the dataset; residence, recruitment pathway, institutional affiliation, programme status, and physical location were not verified. Literature on Pakistani educational mobility and university e-learning during COVID-19 is therefore used only as contextual background for the nationality reported by most respondents (Jamil &amp; Muschert, 2023; Tu, 2026). Twenty-seven respondents (71.1%) reported taking required courses online, while 23 (60.5%) reported taking elective courses online. The findings from this self-selected group are treated as exploratory rather than representative. Much of the research on international students of Chinese has examined learners already on a Chinese campus (Gao &amp; Hua, 2021; Gong et al., 2020a); this sample cannot be read as that population.</w:t>
       </w:r>
     </w:p>
     <w:p>
@@ -321,15 +361,7 @@
         <w:pStyle w:val="BodyText"/>
       </w:pPr>
       <w:r>
-        <w:t xml:space="preserve">Those conditions belong to respondents’ immediate learning ecologies: the domestic space, the connection, and the circumstances in which oral participation was asked for (van Lier, 2004; Warschauer, 2003). In that sense the article is as much about the culture of the class—the setting in which language work was expected to happen—as it is about the syllabus on the page. It examines how, in this 2022 sample, household infrastructure and reported platform access sat alongside stress, appraisals of online learning, and judgements about whether online Chinese-language courses could replace campus classes.</w:t>
-      </w:r>
-    </w:p>
-    <w:p>
-      <w:pPr>
-        <w:pStyle w:val="BodyText"/>
-      </w:pPr>
-      <w:r>
-        <w:t xml:space="preserve">Three questions guide the analysis:</w:t>
+        <w:t xml:space="preserve">What the article answers, then, is not whether institutions localised delivery, and not whether later hybrid practice has solved the problem. It answers three questions about this 2022 sample:</w:t>
       </w:r>
     </w:p>
     <w:p>
@@ -391,7 +423,7 @@
         <w:pStyle w:val="FirstParagraph"/>
       </w:pPr>
       <w:r>
-        <w:t xml:space="preserve">Counts are used descriptively. Associations are explored with Fisher’s exact tests and Spearman rank correlations and are not read as confirmatory tests of population-level relationships. The article proceeds as follows. Section 2 locates the study in the emergency-remote-teaching literature, in work on digital inequality and home learning ecologies, and in the proposed account of localisation of delivery. Section 3 describes the questionnaire and the limits of the sample. Sections 4 and 5 report and discuss the findings, and the final sections set out implications, limitations, and a bounded conclusion.</w:t>
+        <w:t xml:space="preserve">Those answers are used to argue that ICLE localisation has an implementation problem that content and materials work cannot settle on their own. Counts are used descriptively. Associations are explored with Fisher’s exact tests and Spearman rank correlations and are not read as confirmatory tests of population-level relationships. Section 2 locates the study in the emergency-remote-teaching literature, in work on digital inequality and home learning ecologies, and in the proposed account of localisation of delivery. Section 3 describes the questionnaire. Sections 4 and 5 report and discuss the findings, and the final sections set out implications, limitations, and the article’s answer.</w:t>
       </w:r>
     </w:p>
     <w:bookmarkEnd w:id="21"/>
@@ -604,7 +636,7 @@
         <w:pStyle w:val="FirstParagraph"/>
       </w:pPr>
       <w:r>
-        <w:t xml:space="preserve">This analysis is concerned with the fourth. Localisation of delivery does not replace accessibility or digital inclusion; it names the institutional decisions through which access is made possible or closed off when a course moves—the timing of the class, the required application, the oral task, or the form of assessment. The questionnaire did not observe those institutional decisions. It recorded the learner-side conditions against which such decisions would have to be judged. The claim that follows is therefore conceptual rather than institutional: a course may be locally relevant in content but inaccessible in delivery. It is localised in delivery only when its required time, platform, participation mode, task design, and assessment are feasible where learners actually take part.</w:t>
+        <w:t xml:space="preserve">This analysis is concerned with the fourth, because that is the layer in which the research problem sits. Localisation of delivery does not replace accessibility or digital inclusion; it names the institutional decisions through which access is made possible or closed off when a course moves—the timing of the class, the required application, the oral task, or the form of assessment. The questionnaire did not observe those institutional decisions. It recorded the learner-side conditions against which such decisions would have to be judged, which is the empirical question this study can answer. The claim that follows is therefore conceptual rather than institutional: a course may be locally relevant in content but inaccessible in delivery. It is localised in delivery only when its required time, platform, participation mode, task design, and assessment are feasible where learners actually take part.</w:t>
       </w:r>
     </w:p>
     <w:p>
@@ -2916,7 +2948,43 @@
         <w:pStyle w:val="FirstParagraph"/>
       </w:pPr>
       <w:r>
-        <w:t xml:space="preserve">The 2022 questionnaire does not show how institutions adapted. What it does show is a set of learner-side conditions that would have pressed on any travelling Chinese-language course. In this sample, household infrastructure and platform access sat alongside reports of very high stress and more negative appraisals of online learning. Localisation of content and materials would still have been necessary (Lu et al., 2024; Zhao, 2020). It would not, by itself, have answered a synchronous session on an unstable connection, or a required application that respondents marked unusable in their country.</w:t>
+        <w:t xml:space="preserve">The study set out to establish whether delivery-context fit was a live problem for online Chinese learning in this 2022 sample. The answer is yes. Respondents commonly reported unstable networks, power interruptions, and uneven platform access. Those who said the home affected study</w:t>
+      </w:r>
+      <w:r>
+        <w:t xml:space="preserve"> </w:t>
+      </w:r>
+      <w:r>
+        <w:t xml:space="preserve">“</w:t>
+      </w:r>
+      <w:r>
+        <w:t xml:space="preserve">very much</w:t>
+      </w:r>
+      <w:r>
+        <w:t xml:space="preserve">”</w:t>
+      </w:r>
+      <w:r>
+        <w:t xml:space="preserve"> </w:t>
+      </w:r>
+      <w:r>
+        <w:t xml:space="preserve">more often selected</w:t>
+      </w:r>
+      <w:r>
+        <w:t xml:space="preserve"> </w:t>
+      </w:r>
+      <w:r>
+        <w:t xml:space="preserve">“</w:t>
+      </w:r>
+      <w:r>
+        <w:t xml:space="preserve">very high stress,</w:t>
+      </w:r>
+      <w:r>
+        <w:t xml:space="preserve">”</w:t>
+      </w:r>
+      <w:r>
+        <w:t xml:space="preserve"> </w:t>
+      </w:r>
+      <w:r>
+        <w:t xml:space="preserve">and worse reported internet speed was associated with a more negative appraisal of online learning. The questionnaire does not show how institutions adapted. What it does show is the learner-side conditions that would have pressed on any travelling Chinese-language course. Localisation of content and materials would still have been necessary (Lu et al., 2024; Zhao, 2020). It would not, by itself, have answered a synchronous session on an unstable connection, or a required application that respondents marked unusable in their country.</w:t>
       </w:r>
     </w:p>
     <w:p>
@@ -3022,7 +3090,7 @@
         <w:pStyle w:val="FirstParagraph"/>
       </w:pPr>
       <w:r>
-        <w:t xml:space="preserve">In this exploratory emergency-remote-teaching sample, respondents reporting online Chinese-language courses also reported household infrastructure problems and uneven platform access. Those conditions co-occurred with selecting</w:t>
+        <w:t xml:space="preserve">This article asked whether a Chinese-language course can be localised in content and still be difficult to take if its delivery arrangements travel unchanged. In this 2022 sample the answer is that it can. Respondents reporting online Chinese-language courses also reported household infrastructure problems and uneven platform access. Those conditions co-occurred with selecting</w:t>
       </w:r>
       <w:r>
         <w:t xml:space="preserve"> </w:t>
@@ -3040,7 +3108,23 @@
         <w:t xml:space="preserve"> </w:t>
       </w:r>
       <w:r>
-        <w:t xml:space="preserve">and with more negative appraisals of online learning. The conceptual suggestion, bounded by N = 38 and by a 2022 dataset, is that ICLE localisation may need to take delivery-context fit—time, platform, task, participation mode, and assessment—as seriously as the adaptation of content and materials. A course may be locally relevant in content but inaccessible in delivery. Whether later hybrid arrangements have closed that gap is a question this study cannot answer.</w:t>
+        <w:t xml:space="preserve">and with more negative appraisals of online learning. The contribution is therefore both conceptual and empirical:</w:t>
+      </w:r>
+      <w:r>
+        <w:t xml:space="preserve"> </w:t>
+      </w:r>
+      <w:r>
+        <w:rPr>
+          <w:iCs/>
+          <w:i/>
+        </w:rPr>
+        <w:t xml:space="preserve">localisation of delivery</w:t>
+      </w:r>
+      <w:r>
+        <w:t xml:space="preserve"> </w:t>
+      </w:r>
+      <w:r>
+        <w:t xml:space="preserve">names the implementation work that content and materials adaptation leave unfinished, and the questionnaire identifies learner-side conditions that such work would need to address. That answer is bounded by N = 38 and by an emergency-remote-teaching dataset. Whether later hybrid arrangements have closed the gap is a question this study cannot answer. The problem it can settle, for this sample, is the more basic one: delivery-context fit is part of what ICLE localisation has to solve.</w:t>
       </w:r>
     </w:p>
     <w:bookmarkEnd w:id="41"/>

</xml_diff>

<commit_message>
Read the questionnaire through later online-Chinese lenses and keep the collection date in the methods
Co-authored-by: kristinehina23-rgb <kristinehina23-rgb@users.noreply.github.com>
</commit_message>
<xml_diff>
--- a/papers/q1-masters-covid/word/Rathore-Cao-Xu-When-Chinese-class-moved-home.docx
+++ b/papers/q1-masters-covid/word/Rathore-Cao-Xu-When-Chinese-class-moved-home.docx
@@ -2,13 +2,13 @@
 <file path=word/document.xml><?xml version="1.0" encoding="utf-8"?>
 <w:document xmlns:w="http://schemas.openxmlformats.org/wordprocessingml/2006/main" xmlns:m="http://schemas.openxmlformats.org/officeDocument/2006/math" xmlns:r="http://schemas.openxmlformats.org/officeDocument/2006/relationships" xmlns:o="urn:schemas-microsoft-com:office:office" xmlns:v="urn:schemas-microsoft-com:vml" xmlns:w10="urn:schemas-microsoft-com:office:word" xmlns:a="http://schemas.openxmlformats.org/drawingml/2006/main" xmlns:pic="http://schemas.openxmlformats.org/drawingml/2006/picture" xmlns:wp="http://schemas.openxmlformats.org/drawingml/2006/wordprocessingDrawing">
   <w:body>
-    <w:bookmarkStart w:id="45" w:name="X98bc7e0e5302306ce1fc1a297b6ba6e6c57c4e4"/>
+    <w:bookmarkStart w:id="45" w:name="Xbabd5ba3a8a1be7c6f1a1769151a851a71c6acf"/>
     <w:p>
       <w:pPr>
         <w:pStyle w:val="Heading1"/>
       </w:pPr>
       <w:r>
-        <w:t xml:space="preserve">Mainly Pakistani respondents reporting online Chinese coursework: household infrastructure and platform access during emergency remote teaching</w:t>
+        <w:t xml:space="preserve">The problem of online Chinese teaching: household infrastructure and platform access among mainly Pakistani respondents during emergency remote teaching</w:t>
       </w:r>
     </w:p>
     <w:p>
@@ -26,7 +26,7 @@
         <w:t xml:space="preserve"> </w:t>
       </w:r>
       <w:r>
-        <w:t xml:space="preserve">Remote Chinese: delivery-context fit</w:t>
+        <w:t xml:space="preserve">Online Chinese teaching: delivery-context fit</w:t>
       </w:r>
     </w:p>
     <w:p>
@@ -169,7 +169,7 @@
         <w:pStyle w:val="FirstParagraph"/>
       </w:pPr>
       <w:r>
-        <w:t xml:space="preserve">This article investigates a curriculum-implementation problem in international Chinese language education (ICLE): a course may be localised in content and still be difficult to take if its timetable, platforms, tasks, and assessment travel unchanged. A February 2022 Wenjuan questionnaire asked 38 self-selected respondents—37 of whom selected Pakistani nationality—what household, connectivity, and platform-access conditions they faced in online Chinese-language courses, and how those conditions sat alongside stress and appraisals of online learning. The article proposes</w:t>
+        <w:t xml:space="preserve">This article investigates a problem in online Chinese teaching: when a Chinese course moves online, learners may not be able to take the class if the timetable, platforms, oral tasks, and assessment do not fit the conditions in which they participate. A Chinese-language questionnaire asked 38 self-selected respondents—37 of whom selected Pakistani nationality—what household, connectivity, and platform-access conditions they faced, and how those conditions sat alongside stress and appraisals of online learning. The responses are read through later work on technological normalisation, online ICLE, and designed online Chinese teaching. The article proposes</w:t>
       </w:r>
       <w:r>
         <w:t xml:space="preserve"> </w:t>
@@ -185,7 +185,7 @@
         <w:t xml:space="preserve"> </w:t>
       </w:r>
       <w:r>
-        <w:t xml:space="preserve">and uses the questionnaire to identify learner-side conditions that such practices would need to address, not to measure institutional adaptation. Unstable networks (76.3%) and power interruptions (42.1%) were commonly reported, and 36.8% selected</w:t>
+        <w:t xml:space="preserve">and identifies learner-side conditions that such teaching would need to address. Unstable networks (76.3%) and power interruptions (42.1%) were commonly reported, and 36.8% selected</w:t>
       </w:r>
       <w:r>
         <w:t xml:space="preserve"> </w:t>
@@ -224,7 +224,7 @@
         <w:t xml:space="preserve">more often selected that category (11/14 versus 3/24; Fisher’s exact (p = .00008)). Worse reported internet speed was associated with a more negative appraisal of online learning ((</w:t>
       </w:r>
       <w:r>
-        <w:t xml:space="preserve">= .65), 95% bootstrap CI ([.36, .84])). QQ and Chaoxing were frequently marked unusable; Zoom and WhatsApp were more often marked available. In this sample, delivery-context fit was a live problem for online Chinese learning. The results are exploratory and are not read as evidence of current hybrid practice.</w:t>
+        <w:t xml:space="preserve">= .65), 95% bootstrap CI ([.36, .84])). QQ and Chaoxing were frequently marked unusable; Zoom and WhatsApp were more often marked available. In this sample, online Chinese teaching was a delivery problem. The results are exploratory and are not read as evidence of current hybrid practice.</w:t>
       </w:r>
     </w:p>
     <w:p>
@@ -242,7 +242,7 @@
         <w:t xml:space="preserve"> </w:t>
       </w:r>
       <w:r>
-        <w:t xml:space="preserve">localisation of delivery; Chinese as an additional language; digital inequality; emergency remote teaching; Pakistan; household infrastructure</w:t>
+        <w:t xml:space="preserve">online Chinese teaching; localisation of delivery; digital inequality; emergency remote teaching; Pakistan; household infrastructure</w:t>
       </w:r>
     </w:p>
     <w:bookmarkEnd w:id="20"/>
@@ -260,7 +260,15 @@
         <w:pStyle w:val="FirstParagraph"/>
       </w:pPr>
       <w:r>
-        <w:t xml:space="preserve">The problem this article investigates is easy to miss. International Chinese language education has become skilled at localising what a course</w:t>
+        <w:t xml:space="preserve">This article investigates a problem in online Chinese teaching. When Chinese is taught online, the course may still look like the original class: the same hours, the same platforms, the same oral tasks, and the same forms of assessment. The research question is whether learners can actually take that class. If household power, network speed, and platform access do not support those arrangements, online Chinese teaching fails as delivery even when the content remains appropriate. That is the problem the present study examines.</w:t>
+      </w:r>
+    </w:p>
+    <w:p>
+      <w:pPr>
+        <w:pStyle w:val="BodyText"/>
+      </w:pPr>
+      <w:r>
+        <w:t xml:space="preserve">The problem is easy to miss because international Chinese language education has become skilled at localising what a course</w:t>
       </w:r>
       <w:r>
         <w:t xml:space="preserve"> </w:t>
@@ -273,7 +281,23 @@
         <w:t xml:space="preserve">says</w:t>
       </w:r>
       <w:r>
-        <w:t xml:space="preserve">: its examples, cultural content, and materials (Lu et al., 2024; McDonough &amp; Shaw, 2003; Tomlinson, 2011; Zhao, 2020). It has said much less about whether the course can still be</w:t>
+        <w:t xml:space="preserve">: its examples, cultural content, and materials (Lu et al., 2024; McDonough &amp; Shaw, 2003; Tomlinson, 2011; Zhao, 2020). It has said much less about whether an</w:t>
+      </w:r>
+      <w:r>
+        <w:t xml:space="preserve"> </w:t>
+      </w:r>
+      <w:r>
+        <w:rPr>
+          <w:iCs/>
+          <w:i/>
+        </w:rPr>
+        <w:t xml:space="preserve">online</w:t>
+      </w:r>
+      <w:r>
+        <w:t xml:space="preserve"> </w:t>
+      </w:r>
+      <w:r>
+        <w:t xml:space="preserve">Chinese course can still be</w:t>
       </w:r>
       <w:r>
         <w:t xml:space="preserve"> </w:t>
@@ -286,10 +310,7 @@
         <w:t xml:space="preserve">taken</w:t>
       </w:r>
       <w:r>
-        <w:t xml:space="preserve"> </w:t>
-      </w:r>
-      <w:r>
-        <w:t xml:space="preserve">once it leaves the setting in which it was designed. A travelling course may keep its original timetable, required platforms, oral tasks, and forms of assessment. If those arrangements do not fit the household and technological conditions in which learners actually participate, the curriculum is local in content but closed in delivery. That mismatch—between a course that looks localised and a course that can be joined—is the problem the present study sets out to examine.</w:t>
+        <w:t xml:space="preserve">. Language, culture, and curriculum meet not only in the textbook but in the setting of the class (Guerrettaz et al., 2021; van Lier, 2004). Research in the field has mapped learners and pedagogical practices associated with Chinese-speaking educational settings (Gong et al., 2020b; Ma et al., 2017). Postmethod and localist scholarship already argues that pedagogy should answer to a particular group and place (Canagarajah, 2005; Kumaravadivelu, 2001), and recent articles in this journal treat curriculum as lived practice (Lam, 2024; Shan &amp; Xu, 2024). These approaches remain necessary. They do not, by themselves, tell us whether the institutional arrangements of online Chinese teaching—its time, platforms, tasks, participation mode, and assessment—remain feasible where learners participate.</w:t>
       </w:r>
     </w:p>
     <w:p>
@@ -297,15 +318,7 @@
         <w:pStyle w:val="BodyText"/>
       </w:pPr>
       <w:r>
-        <w:t xml:space="preserve">The problem matters because language, culture, and curriculum meet not only in the textbook but in the setting of the class (Guerrettaz et al., 2021; van Lier, 2004). Research in the field has mapped learners and pedagogical practices associated with Chinese-speaking educational settings (Gong et al., 2020b; Ma et al., 2017). Postmethod and localist scholarship already argues that pedagogy should answer to a particular group and place (Canagarajah, 2005; Kumaravadivelu, 2001), and recent articles in this journal treat curriculum as lived practice (Lam, 2024; Shan &amp; Xu, 2024). These approaches remain necessary. They do not, by themselves, tell us whether the institutional arrangements of a course—its time, platforms, tasks, participation mode, and assessment—remain feasible when teaching moves.</w:t>
-      </w:r>
-    </w:p>
-    <w:p>
-      <w:pPr>
-        <w:pStyle w:val="BodyText"/>
-      </w:pPr>
-      <w:r>
-        <w:t xml:space="preserve">This article addresses that implementation gap. It proposes</w:t>
+        <w:t xml:space="preserve">This article addresses that problem in online Chinese teaching. It proposes</w:t>
       </w:r>
       <w:r>
         <w:t xml:space="preserve"> </w:t>
@@ -321,7 +334,7 @@
         <w:t xml:space="preserve"> </w:t>
       </w:r>
       <w:r>
-        <w:t xml:space="preserve">as the name for the missing work: the institutional adaptation of time, platform, task, participation mode, and assessment to the receiving context. The idea is close to, but narrower than, accessibility and digital inclusion (Warschauer, 2003). The claim it seeks to make good is straightforward. A course may be locally relevant in content but inaccessible in delivery. The questionnaire cannot show how institutions adapted. What it can do, and what it is used for here, is to answer a prior empirical question: what learner-side conditions would such adaptation have to take seriously?</w:t>
+        <w:t xml:space="preserve">as the name for the missing work: the institutional adaptation of time, platform, task, participation mode, and assessment to the receiving context. The idea is close to, but narrower than, accessibility and digital inclusion (Warschauer, 2003). The claim it seeks to make good is straightforward. An online Chinese course may be locally relevant in content but inaccessible in delivery. The questionnaire cannot show how institutions adapted. What it can do, and what it is used for here, is to answer a prior empirical question: what learner-side conditions would online Chinese teaching have to take seriously?</w:t>
       </w:r>
     </w:p>
     <w:p>
@@ -329,7 +342,7 @@
         <w:pStyle w:val="BodyText"/>
       </w:pPr>
       <w:r>
-        <w:t xml:space="preserve">Emergency remote teaching during COVID-19 is the historical setting in which that question became urgent; it is not the theoretical centre of the argument (Hodges et al., 2020). When language programmes were shifted to videoconferencing, researchers documented thinner interaction, technical disruption, and the sudden visibility of domestic life during lessons (Gacs et al., 2020; MacIntyre et al., 2020; Moser et al., 2021; Tao &amp; Gao, 2022). Drawing on that literature (Gacs et al., 2020), this article uses</w:t>
+        <w:t xml:space="preserve">Emergency remote teaching during COVID-19 is when this problem became urgent; it is not the theoretical centre of the argument (Hodges et al., 2020). When language programmes were shifted to videoconferencing, researchers documented thinner interaction, technical disruption, and the sudden visibility of domestic life during lessons (Gacs et al., 2020; MacIntyre et al., 2020; Moser et al., 2021; Tao &amp; Gao, 2022). Drawing on that literature (Gacs et al., 2020), this article uses</w:t>
       </w:r>
       <w:r>
         <w:t xml:space="preserve"> </w:t>
@@ -345,7 +358,7 @@
         <w:t xml:space="preserve"> </w:t>
       </w:r>
       <w:r>
-        <w:t xml:space="preserve">for a course designed in one institutional setting and taught in another. Studies of Chinese-language emergency teaching have so far said more about pedagogical adaptation on the sending side—for example, technology-based character instruction (Xu et al., 2022)—than about whether delivery arrangements remained feasible for learners under different household and technological conditions. That is the gap this study fills.</w:t>
+        <w:t xml:space="preserve">for a course designed in one institutional setting and taught in another. Studies of Chinese-language emergency teaching said more about pedagogical adaptation on the sending side—for example, technology-based character instruction (Xu et al., 2022)—than about whether online Chinese teaching remained feasible for learners under different household and technological conditions.</w:t>
       </w:r>
     </w:p>
     <w:p>
@@ -353,7 +366,7 @@
         <w:pStyle w:val="BodyText"/>
       </w:pPr>
       <w:r>
-        <w:t xml:space="preserve">The analysis draws on a February 2022 convenience sample of 38 self-selected respondents to a Chinese-language questionnaire about online Chinese learning. Thirty-seven respondents selected Pakistani nationality, while one selected another nationality. Nationality is the only Pakistan connection established in the dataset; residence, recruitment pathway, institutional affiliation, programme status, and physical location were not verified. Literature on Pakistani educational mobility and university e-learning during COVID-19 is therefore used only as contextual background for the nationality reported by most respondents (Jamil &amp; Muschert, 2023; Tu, 2026). Twenty-seven respondents (71.1%) reported taking required courses online, while 23 (60.5%) reported taking elective courses online. The findings from this self-selected group are treated as exploratory rather than representative. Much of the research on international students of Chinese has examined learners already on a Chinese campus (Gao &amp; Hua, 2021; Gong et al., 2020a); this sample cannot be read as that population.</w:t>
+        <w:t xml:space="preserve">The questionnaire is read through later lenses, not as a pandemic story for its own sake. After the return to campus, research on technological normalisation asked what should remain of emergency online practice (Moorhouse, 2023; Moorhouse, Wong, &amp; Li, 2023) and warned against treating a videoconference copy of the classroom as the main lesson of the crisis (Stockwell &amp; Wang, 2023). Reviews of online ICLE still list technical problems, weak interaction, and time-zone difficulty (Li &amp; Li, 2024). Designed online Chinese-culture courses show what planned online teaching can look like (Guenier et al., 2026), and this journal has already treated learner emotion in Chinese as an additional language (Wen &amp; Liu, 2025). Those studies do not describe the present respondents. They supply the conceptual lenses through which the problem of online Chinese teaching is now examined: delivery-context fit is a curriculum question, not only an emergency inconvenience.</w:t>
       </w:r>
     </w:p>
     <w:p>
@@ -361,7 +374,15 @@
         <w:pStyle w:val="BodyText"/>
       </w:pPr>
       <w:r>
-        <w:t xml:space="preserve">What the article answers, then, is not whether institutions localised delivery, and not whether later hybrid practice has solved the problem. It answers three questions about this 2022 sample:</w:t>
+        <w:t xml:space="preserve">The analysis draws on a convenience sample of 38 self-selected respondents to a Chinese-language questionnaire about online Chinese learning, completed during emergency remote teaching. Thirty-seven respondents selected Pakistani nationality, while one selected another nationality. Nationality is the only Pakistan connection established in the dataset; residence, recruitment pathway, institutional affiliation, programme status, and physical location were not verified. Literature on Pakistani educational mobility and university e-learning during COVID-19 is therefore used only as contextual background for the nationality reported by most respondents (Jamil &amp; Muschert, 2023; Tu, 2026). Twenty-seven respondents (71.1%) reported taking required courses online, while 23 (60.5%) reported taking elective courses online. The findings from this self-selected group are treated as exploratory rather than representative. Much of the research on international students of Chinese has examined learners already on a Chinese campus (Gao &amp; Hua, 2021; Gong et al., 2020a); this sample cannot be read as that population.</w:t>
+      </w:r>
+    </w:p>
+    <w:p>
+      <w:pPr>
+        <w:pStyle w:val="BodyText"/>
+      </w:pPr>
+      <w:r>
+        <w:t xml:space="preserve">What the article answers, then, is not whether institutions solved the problem of online Chinese teaching, and not whether later hybrid practice has solved it. It answers three questions about this sample of online Chinese learning:</w:t>
       </w:r>
     </w:p>
     <w:p>
@@ -423,7 +444,7 @@
         <w:pStyle w:val="FirstParagraph"/>
       </w:pPr>
       <w:r>
-        <w:t xml:space="preserve">Those answers are used to argue that ICLE localisation has an implementation problem that content and materials work cannot settle on their own. Counts are used descriptively. Associations are explored with Fisher’s exact tests and Spearman rank correlations and are not read as confirmatory tests of population-level relationships. Section 2 locates the study in the emergency-remote-teaching literature, in work on digital inequality and home learning ecologies, and in the proposed account of localisation of delivery. Section 3 describes the questionnaire. Sections 4 and 5 report and discuss the findings, and the final sections set out implications, limitations, and the article’s answer.</w:t>
+        <w:t xml:space="preserve">Those answers are used to show that the problem of online Chinese teaching is, in this sample, a delivery problem: content and materials work cannot settle it on their own. Counts are used descriptively. Associations are explored with Fisher’s exact tests and Spearman rank correlations and are not read as confirmatory tests of population-level relationships. Section 2 locates the study in later work on online language teaching and online ICLE, in digital inequality and home learning ecologies, and in the proposed account of localisation of delivery. Section 3 reports when and how the questionnaire was completed. Sections 4 and 5 report and discuss the findings, and the final sections set out implications, limitations, and the article’s answer.</w:t>
       </w:r>
     </w:p>
     <w:bookmarkEnd w:id="21"/>
@@ -436,13 +457,13 @@
         <w:t xml:space="preserve">2. Literature review and conceptual framework</w:t>
       </w:r>
     </w:p>
-    <w:bookmarkStart w:id="22" w:name="X466d9fa4ba9675c3d2d096fe48fd97f00c4a10c"/>
+    <w:bookmarkStart w:id="22" w:name="later-lenses-on-online-chinese-teaching"/>
     <w:p>
       <w:pPr>
         <w:pStyle w:val="Heading3"/>
       </w:pPr>
       <w:r>
-        <w:t xml:space="preserve">2.1 Emergency remote teaching as historical context</w:t>
+        <w:t xml:space="preserve">2.1 Later lenses on online Chinese teaching</w:t>
       </w:r>
     </w:p>
     <w:p>
@@ -450,7 +471,7 @@
         <w:pStyle w:val="FirstParagraph"/>
       </w:pPr>
       <w:r>
-        <w:t xml:space="preserve">Hodges et al. (2020) drew a useful line between emergency remote teaching and planned online or blended provision. Gacs, Goertler and Spasova (2020) brought that distinction into language education. Surveys of language teachers from the same period describe heavier workloads, stress, and uneven preparedness once teaching moved online (MacIntyre et al., 2020; Moser et al., 2021), and Tao and Gao (2022) read the wider literature as a story of technical disruption, thinner engagement, and the need for language-specific support. That work is used here to locate the historical moment, not to stand in for the stress reports in the present questionnaire.</w:t>
+        <w:t xml:space="preserve">Hodges et al. (2020) drew a useful line between emergency remote teaching and planned online or blended provision. Gacs, Goertler and Spasova (2020) brought that distinction into language education. Surveys of language teachers from the same period describe heavier workloads, stress, and uneven preparedness once teaching moved online (MacIntyre et al., 2020; Moser et al., 2021), and Tao and Gao (2022) read the wider literature as a story of technical disruption, thinner engagement, and the need for language-specific support. That work locates the moment in which the present questionnaire was completed. It is not used as a substitute for the stress reports in this sample, and it is not the lens through which the problem is now read.</w:t>
       </w:r>
     </w:p>
     <w:p>
@@ -458,7 +479,7 @@
         <w:pStyle w:val="BodyText"/>
       </w:pPr>
       <w:r>
-        <w:t xml:space="preserve">After campuses reopened, later studies described a kind of technological normalisation (Moorhouse, 2023; Moorhouse, Wong, &amp; Li, 2023) and cautioned against treating a videoconference copy of the classroom as the main lesson of the crisis (Stockwell &amp; Wang, 2023). For Chinese, contemporaneous accounts recorded the policy of</w:t>
+        <w:t xml:space="preserve">The later literature is. After the return to campus, studies of technological normalisation asked what should remain of emergency online practice (Moorhouse, 2023; Moorhouse, Wong, &amp; Li, 2023) and cautioned against treating a videoconference copy of the classroom as the main lesson of the crisis (Stockwell &amp; Wang, 2023). For Chinese, contemporaneous accounts recorded the policy of</w:t>
       </w:r>
       <w:r>
         <w:t xml:space="preserve"> </w:t>
@@ -476,7 +497,7 @@
         <w:t xml:space="preserve"> </w:t>
       </w:r>
       <w:r>
-        <w:t xml:space="preserve">and early platform trials (Xia et al., 2022; Zhang et al., 2020). Xu et al. (2022) show how character teaching was adapted on the sending side. Reviews of online ICLE models continue to mention technical problems, weak interaction, and time-zone difficulty (Li &amp; Li, 2024), and learner emotion in Chinese as an additional language is already a topic in this journal (Wen &amp; Liu, 2025). Much of that writing quietly assumes a relatively stable connection. The present questionnaire cannot test whether that assumption holds for current hybrid ICLE; it can only describe what 38 respondents reported in February 2022.</w:t>
+        <w:t xml:space="preserve">and early platform trials (Xia et al., 2022; Zhang et al., 2020). Xu et al. (2022) show how character teaching was adapted on the sending side. What makes those findings still usable is the later ICLE writing: reviews of online teaching models continue to list technical problems, weak interaction, and time-zone difficulty (Li &amp; Li, 2024); designed online Chinese-culture courses show a planned alternative to emergency copying (Guenier et al., 2026); and learner emotion in Chinese as an additional language is already a topic in this journal (Wen &amp; Liu, 2025). Much of that writing still assumes a relatively stable connection. The present questionnaire cannot test whether that assumption holds for current hybrid ICLE. It can show, under the later lens of delivery-context fit, what 38 respondents reported when online Chinese teaching asked them to join a travelling course.</w:t>
       </w:r>
     </w:p>
     <w:bookmarkEnd w:id="22"/>
@@ -636,7 +657,7 @@
         <w:pStyle w:val="FirstParagraph"/>
       </w:pPr>
       <w:r>
-        <w:t xml:space="preserve">This analysis is concerned with the fourth, because that is the layer in which the research problem sits. Localisation of delivery does not replace accessibility or digital inclusion; it names the institutional decisions through which access is made possible or closed off when a course moves—the timing of the class, the required application, the oral task, or the form of assessment. The questionnaire did not observe those institutional decisions. It recorded the learner-side conditions against which such decisions would have to be judged, which is the empirical question this study can answer. The claim that follows is therefore conceptual rather than institutional: a course may be locally relevant in content but inaccessible in delivery. It is localised in delivery only when its required time, platform, participation mode, task design, and assessment are feasible where learners actually take part.</w:t>
+        <w:t xml:space="preserve">This analysis is concerned with the fourth, because that is the layer in which the problem of online Chinese teaching sits. Localisation of delivery does not replace accessibility or digital inclusion; it names the institutional decisions through which access is made possible or closed off when a course moves—the timing of the class, the required application, the oral task, or the form of assessment. The questionnaire did not observe those institutional decisions. It recorded the learner-side conditions against which such decisions would have to be judged, which is the empirical question this study can answer. The claim that follows is therefore conceptual rather than institutional: a course may be locally relevant in content but inaccessible in delivery. It is localised in delivery only when its required time, platform, participation mode, task design, and assessment are feasible where learners actually take part.</w:t>
       </w:r>
     </w:p>
     <w:p>
@@ -722,7 +743,7 @@
         <w:pStyle w:val="FirstParagraph"/>
       </w:pPr>
       <w:r>
-        <w:t xml:space="preserve">The instrument title on the Wenjuan export is 新冠肺炎期间留学生在线中文学习的影响因素 (Influencing factors in international students’ online Chinese learning during COVID-19). Complete cases were submitted between 5 and 8 February 2022 (N = 38). The form did not record how the link was circulated—whether through WeChat, WhatsApp, email, or student groups—so the recruitment channel cannot be named. Respondents were adults who completed the Chinese-language questionnaire about online Chinese learning. Completing that questionnaire is not treated as proof of enrolment in a Chinese university. The instrument did not ask host university, city of residence that week, degree versus non-degree status, or scholarship type. Two items asked whether required courses and electives were being taken online: 27 respondents (71.1%) reported required courses online, and 23 (60.5%) reported electives online. Those answers do not identify a named programme. The study therefore concerns a self-selected group of respondents reporting participation in online Chinese-language courses, not a verified enrolment record.</w:t>
+        <w:t xml:space="preserve">The instrument title on the Wenjuan export is 新冠肺炎期间留学生在线中文学习的影响因素 (Influencing factors in international students’ online Chinese learning during COVID-19). Complete cases were submitted between 5 and 8 February 2022 (N = 38), during emergency remote teaching. That collection window is reported as a methodological fact; the article reads the responses through the later lenses set out in Section 2 and does not treat the sample as a picture of current hybrid practice. The form did not record how the link was circulated—whether through WeChat, WhatsApp, email, or student groups—so the recruitment channel cannot be named. Respondents were adults who completed the Chinese-language questionnaire about online Chinese learning. Completing that questionnaire is not treated as proof of enrolment in a Chinese university. The instrument did not ask host university, city of residence that week, degree versus non-degree status, or scholarship type. Two items asked whether required courses and electives were being taken online: 27 respondents (71.1%) reported required courses online, and 23 (60.5%) reported electives online. Those answers do not identify a named programme. The study therefore concerns a self-selected group of respondents reporting participation in online Chinese-language courses, not a verified enrolment record.</w:t>
       </w:r>
     </w:p>
     <w:bookmarkEnd w:id="27"/>
@@ -2948,7 +2969,7 @@
         <w:pStyle w:val="FirstParagraph"/>
       </w:pPr>
       <w:r>
-        <w:t xml:space="preserve">The study set out to establish whether delivery-context fit was a live problem for online Chinese learning in this 2022 sample. The answer is yes. Respondents commonly reported unstable networks, power interruptions, and uneven platform access. Those who said the home affected study</w:t>
+        <w:t xml:space="preserve">The study set out to establish whether online Chinese teaching ran into a delivery problem in this sample. The answer is yes. Respondents commonly reported unstable networks, power interruptions, and uneven platform access. Those who said the home affected study</w:t>
       </w:r>
       <w:r>
         <w:t xml:space="preserve"> </w:t>
@@ -3024,13 +3045,13 @@
       </w:r>
     </w:p>
     <w:bookmarkEnd w:id="38"/>
-    <w:bookmarkStart w:id="39" w:name="Xa4b283138da25a30b7a49a65f021a6e6787929a"/>
+    <w:bookmarkStart w:id="39" w:name="implications-for-online-chinese-teaching"/>
     <w:p>
       <w:pPr>
         <w:pStyle w:val="Heading2"/>
       </w:pPr>
       <w:r>
-        <w:t xml:space="preserve">6. Implications for curriculum implementation</w:t>
+        <w:t xml:space="preserve">6. Implications for online Chinese teaching</w:t>
       </w:r>
     </w:p>
     <w:p>
@@ -3038,7 +3059,7 @@
         <w:pStyle w:val="FirstParagraph"/>
       </w:pPr>
       <w:r>
-        <w:t xml:space="preserve">If localisation is also a question of delivery, course design has to treat time, platform, participation mode, task, and assessment as curricular decisions rather than as technical afterthoughts. The present findings can support only cautious, sample-bound suggestions: shorter or asynchronous oral alternatives; assessment that does not assume a quiet campus hour; and a required platform that respondents can actually open. WhatsApp was marked available here, but it was not recorded as used for class, so the data do not recommend it as a replacement. Nor do they show that later hybrid ICLE has repeated this pattern. They do suggest that hybrid models</w:t>
+        <w:t xml:space="preserve">If the problem of online Chinese teaching is also a delivery problem, course design has to treat time, platform, participation mode, task, and assessment as teaching decisions rather than as technical afterthoughts. The present findings can support only cautious, sample-bound suggestions: shorter or asynchronous oral alternatives; assessment that does not assume a quiet campus hour; and a required platform that respondents can actually open. WhatsApp was marked available here, but it was not recorded as used for class, so the data do not recommend it as a replacement. Nor do they show that later hybrid ICLE has repeated this pattern. They do suggest that hybrid models</w:t>
       </w:r>
       <w:r>
         <w:t xml:space="preserve"> </w:t>
@@ -3090,7 +3111,7 @@
         <w:pStyle w:val="FirstParagraph"/>
       </w:pPr>
       <w:r>
-        <w:t xml:space="preserve">This article asked whether a Chinese-language course can be localised in content and still be difficult to take if its delivery arrangements travel unchanged. In this 2022 sample the answer is that it can. Respondents reporting online Chinese-language courses also reported household infrastructure problems and uneven platform access. Those conditions co-occurred with selecting</w:t>
+        <w:t xml:space="preserve">This article asked whether online Chinese teaching can fail as delivery even when the content of the course remains appropriate. In this sample the answer is that it can. Respondents reporting online Chinese-language courses also reported household infrastructure problems and uneven platform access. Those conditions co-occurred with selecting</w:t>
       </w:r>
       <w:r>
         <w:t xml:space="preserve"> </w:t>
@@ -3108,7 +3129,7 @@
         <w:t xml:space="preserve"> </w:t>
       </w:r>
       <w:r>
-        <w:t xml:space="preserve">and with more negative appraisals of online learning. The contribution is therefore both conceptual and empirical:</w:t>
+        <w:t xml:space="preserve">and with more negative appraisals of online learning. The contribution is therefore both conceptual and empirical: later work on online language teaching and online ICLE supplies the lenses,</w:t>
       </w:r>
       <w:r>
         <w:t xml:space="preserve"> </w:t>
@@ -3124,7 +3145,7 @@
         <w:t xml:space="preserve"> </w:t>
       </w:r>
       <w:r>
-        <w:t xml:space="preserve">names the implementation work that content and materials adaptation leave unfinished, and the questionnaire identifies learner-side conditions that such work would need to address. That answer is bounded by N = 38 and by an emergency-remote-teaching dataset. Whether later hybrid arrangements have closed the gap is a question this study cannot answer. The problem it can settle, for this sample, is the more basic one: delivery-context fit is part of what ICLE localisation has to solve.</w:t>
+        <w:t xml:space="preserve">names the work that online Chinese teaching still has to do after content and materials have been adapted, and the questionnaire identifies learner-side conditions that such teaching would need to address. That answer is bounded by N = 38 and by data collected during emergency remote teaching (Section 3.1). Whether later hybrid arrangements have closed the gap is a question this study cannot answer. The problem it can settle, for this sample, is the more basic one: online Chinese teaching is not only a content problem. It is also a delivery problem.</w:t>
       </w:r>
     </w:p>
     <w:bookmarkEnd w:id="41"/>

</xml_diff>

<commit_message>
Bring the Chinese draft's problem list into the English article without over-claiming the sample
Co-authored-by: kristinehina23-rgb <kristinehina23-rgb@users.noreply.github.com>
</commit_message>
<xml_diff>
--- a/papers/q1-masters-covid/word/Rathore-Cao-Xu-When-Chinese-class-moved-home.docx
+++ b/papers/q1-masters-covid/word/Rathore-Cao-Xu-When-Chinese-class-moved-home.docx
@@ -169,7 +169,7 @@
         <w:pStyle w:val="FirstParagraph"/>
       </w:pPr>
       <w:r>
-        <w:t xml:space="preserve">This article investigates a problem in online Chinese teaching: when a Chinese course moves online, learners may not be able to take the class if the timetable, platforms, oral tasks, and assessment do not fit the conditions in which they participate. A Chinese-language questionnaire asked 38 self-selected respondents—37 of whom selected Pakistani nationality—what household, connectivity, and platform-access conditions they faced, and how those conditions sat alongside stress and appraisals of online learning. The responses are read through later work on technological normalisation, online ICLE, and designed online Chinese teaching. The article proposes</w:t>
+        <w:t xml:space="preserve">This article investigates a problem in online Chinese teaching: when a Chinese course moves online, learners may not be able to take the class if the timetable, platforms, oral tasks, and assessment do not fit the conditions in which they participate. A Chinese-language questionnaire asked 38 self-selected respondents—37 of whom selected Pakistani nationality—what household, connectivity, and platform-access conditions they faced, and how those conditions sat alongside stress and appraisals of online learning. The responses are read through later work on technological normalisation, online ICLE, and designed online Chinese teaching. The article takes up four difficulties already named in the field—networks, platforms, interaction, and learner affect—and proposes</w:t>
       </w:r>
       <w:r>
         <w:t xml:space="preserve"> </w:t>
@@ -185,7 +185,7 @@
         <w:t xml:space="preserve"> </w:t>
       </w:r>
       <w:r>
-        <w:t xml:space="preserve">and identifies learner-side conditions that such teaching would need to address. Unstable networks (76.3%) and power interruptions (42.1%) were commonly reported, and 36.8% selected</w:t>
+        <w:t xml:space="preserve">as a way to address them. Unstable networks (76.3%) and power interruptions (42.1%) were commonly reported, and 36.8% selected</w:t>
       </w:r>
       <w:r>
         <w:t xml:space="preserve"> </w:t>
@@ -268,6 +268,14 @@
         <w:pStyle w:val="BodyText"/>
       </w:pPr>
       <w:r>
+        <w:t xml:space="preserve">The Chinese-language field has already named the practical difficulties of that move online: uneven network conditions, platforms that are hard to operate, thinner classroom interaction, and unstable learner affect (Li &amp; Li, 2024; Tao &amp; Gao, 2022; Zhang et al., 2020). Those four difficulties are the research object here. The purpose of the article is to describe, in this sample, the household, connectivity, and platform-access conditions of online Chinese learning, and to examine how those conditions sat alongside stress, interaction, and respondents’ appraisals of learning. Time-zone difference and the absence of a Chinese-speaking environment have also been listed as field problems. The present questionnaire did not measure them, so they are left aside. The study also does not treat respondents as students who had returned home or who were unable to re-enter campus. Those were common emergency-period situations; they are not established facts in this dataset.</w:t>
+      </w:r>
+    </w:p>
+    <w:p>
+      <w:pPr>
+        <w:pStyle w:val="BodyText"/>
+      </w:pPr>
+      <w:r>
         <w:t xml:space="preserve">The problem is easy to miss because international Chinese language education has become skilled at localising what a course</w:t>
       </w:r>
       <w:r>
@@ -318,7 +326,7 @@
         <w:pStyle w:val="BodyText"/>
       </w:pPr>
       <w:r>
-        <w:t xml:space="preserve">This article addresses that problem in online Chinese teaching. It proposes</w:t>
+        <w:t xml:space="preserve">This article addresses that problem by proposing</w:t>
       </w:r>
       <w:r>
         <w:t xml:space="preserve"> </w:t>
@@ -331,10 +339,7 @@
         <w:t xml:space="preserve">localisation of delivery</w:t>
       </w:r>
       <w:r>
-        <w:t xml:space="preserve"> </w:t>
-      </w:r>
-      <w:r>
-        <w:t xml:space="preserve">as the name for the missing work: the institutional adaptation of time, platform, task, participation mode, and assessment to the receiving context. The idea is close to, but narrower than, accessibility and digital inclusion (Warschauer, 2003). The claim it seeks to make good is straightforward. An online Chinese course may be locally relevant in content but inaccessible in delivery. The questionnaire cannot show how institutions adapted. What it can do, and what it is used for here, is to answer a prior empirical question: what learner-side conditions would online Chinese teaching have to take seriously?</w:t>
+        <w:t xml:space="preserve">: the institutional adaptation of time, platform, task, participation mode, and assessment to the receiving context. The idea is close to, but narrower than, accessibility and digital inclusion (Warschauer, 2003). The claim it seeks to make good is straightforward. An online Chinese course may be locally relevant in content but inaccessible in delivery. The questionnaire cannot show how institutions adapted. What it can do is answer the empirical question first posed by that purpose: what learner-side conditions would online Chinese teaching have to take seriously?</w:t>
       </w:r>
     </w:p>
     <w:p>
@@ -382,7 +387,7 @@
         <w:pStyle w:val="BodyText"/>
       </w:pPr>
       <w:r>
-        <w:t xml:space="preserve">What the article answers, then, is not whether institutions solved the problem of online Chinese teaching, and not whether later hybrid practice has solved it. It answers three questions about this sample of online Chinese learning:</w:t>
+        <w:t xml:space="preserve">What the article answers, then, is not whether institutions solved the problem of online Chinese teaching, and not whether later hybrid practice has solved it. It answers the purpose above through three questions about this sample:</w:t>
       </w:r>
     </w:p>
     <w:p>
@@ -497,7 +502,7 @@
         <w:t xml:space="preserve"> </w:t>
       </w:r>
       <w:r>
-        <w:t xml:space="preserve">and early platform trials (Xia et al., 2022; Zhang et al., 2020). Xu et al. (2022) show how character teaching was adapted on the sending side. What makes those findings still usable is the later ICLE writing: reviews of online teaching models continue to list technical problems, weak interaction, and time-zone difficulty (Li &amp; Li, 2024); designed online Chinese-culture courses show a planned alternative to emergency copying (Guenier et al., 2026); and learner emotion in Chinese as an additional language is already a topic in this journal (Wen &amp; Liu, 2025). Much of that writing still assumes a relatively stable connection. The present questionnaire cannot test whether that assumption holds for current hybrid ICLE. It can show, under the later lens of delivery-context fit, what 38 respondents reported when online Chinese teaching asked them to join a travelling course.</w:t>
+        <w:t xml:space="preserve">and early platform trials (Xia et al., 2022; Zhang et al., 2020). That writing already listed the same cluster of difficulties that still organise this article: networks, platforms, interaction, and learner affect. Xu et al. (2022) show how character teaching was adapted on the sending side. What makes those findings still usable is the later ICLE writing: reviews of online teaching models continue to list technical problems, weak interaction, and time-zone difficulty (Li &amp; Li, 2024); designed online Chinese-culture courses show a planned alternative to emergency copying (Guenier et al., 2026); and learner emotion in Chinese as an additional language is already a topic in this journal (Wen &amp; Liu, 2025). Much of that writing still assumes a relatively stable connection. The present questionnaire cannot test whether that assumption holds for current hybrid ICLE. It can show, under the later lens of delivery-context fit, what 38 respondents reported when online Chinese teaching asked them to join a travelling course.</w:t>
       </w:r>
     </w:p>
     <w:bookmarkEnd w:id="22"/>
@@ -2969,7 +2974,25 @@
         <w:pStyle w:val="FirstParagraph"/>
       </w:pPr>
       <w:r>
-        <w:t xml:space="preserve">The study set out to establish whether online Chinese teaching ran into a delivery problem in this sample. The answer is yes. Respondents commonly reported unstable networks, power interruptions, and uneven platform access. Those who said the home affected study</w:t>
+        <w:t xml:space="preserve">The study set out to establish whether the difficulties the field has named for online Chinese teaching—networks, platforms, interaction, and affect—were present as learner-side conditions in this sample. The answer is yes. Respondents commonly reported unstable networks, power interruptions, and uneven platform access. Active interaction with the teacher</w:t>
+      </w:r>
+      <w:r>
+        <w:t xml:space="preserve"> </w:t>
+      </w:r>
+      <w:r>
+        <w:t xml:space="preserve">“</w:t>
+      </w:r>
+      <w:r>
+        <w:t xml:space="preserve">very much</w:t>
+      </w:r>
+      <w:r>
+        <w:t xml:space="preserve">”</w:t>
+      </w:r>
+      <w:r>
+        <w:t xml:space="preserve"> </w:t>
+      </w:r>
+      <w:r>
+        <w:t xml:space="preserve">was uncommon. Those who said the home affected study</w:t>
       </w:r>
       <w:r>
         <w:t xml:space="preserve"> </w:t>

</xml_diff>

<commit_message>
Name the delivery problem in the title and the first paragraph
Co-authored-by: kristinehina23-rgb <kristinehina23-rgb@users.noreply.github.com>
</commit_message>
<xml_diff>
--- a/papers/q1-masters-covid/word/Rathore-Cao-Xu-When-Chinese-class-moved-home.docx
+++ b/papers/q1-masters-covid/word/Rathore-Cao-Xu-When-Chinese-class-moved-home.docx
@@ -2,13 +2,13 @@
 <file path=word/document.xml><?xml version="1.0" encoding="utf-8"?>
 <w:document xmlns:w="http://schemas.openxmlformats.org/wordprocessingml/2006/main" xmlns:m="http://schemas.openxmlformats.org/officeDocument/2006/math" xmlns:r="http://schemas.openxmlformats.org/officeDocument/2006/relationships" xmlns:o="urn:schemas-microsoft-com:office:office" xmlns:v="urn:schemas-microsoft-com:vml" xmlns:w10="urn:schemas-microsoft-com:office:word" xmlns:a="http://schemas.openxmlformats.org/drawingml/2006/main" xmlns:pic="http://schemas.openxmlformats.org/drawingml/2006/picture" xmlns:wp="http://schemas.openxmlformats.org/drawingml/2006/wordprocessingDrawing">
   <w:body>
-    <w:bookmarkStart w:id="45" w:name="Xbabd5ba3a8a1be7c6f1a1769151a851a71c6acf"/>
+    <w:bookmarkStart w:id="45" w:name="X8e8457e0f88a3ff475a708e9c7de745fbf1ca60"/>
     <w:p>
       <w:pPr>
         <w:pStyle w:val="Heading1"/>
       </w:pPr>
       <w:r>
-        <w:t xml:space="preserve">The problem of online Chinese teaching: household infrastructure and platform access among mainly Pakistani respondents during emergency remote teaching</w:t>
+        <w:t xml:space="preserve">Localisation of delivery in online Chinese teaching: household infrastructure and platform access</w:t>
       </w:r>
     </w:p>
     <w:p>
@@ -26,7 +26,7 @@
         <w:t xml:space="preserve"> </w:t>
       </w:r>
       <w:r>
-        <w:t xml:space="preserve">Online Chinese teaching: delivery-context fit</w:t>
+        <w:t xml:space="preserve">Localisation of delivery in online Chinese teaching</w:t>
       </w:r>
     </w:p>
     <w:p>
@@ -169,7 +169,7 @@
         <w:pStyle w:val="FirstParagraph"/>
       </w:pPr>
       <w:r>
-        <w:t xml:space="preserve">This article investigates a problem in online Chinese teaching: when a Chinese course moves online, learners may not be able to take the class if the timetable, platforms, oral tasks, and assessment do not fit the conditions in which they participate. A Chinese-language questionnaire asked 38 self-selected respondents—37 of whom selected Pakistani nationality—what household, connectivity, and platform-access conditions they faced, and how those conditions sat alongside stress and appraisals of online learning. The responses are read through later work on technological normalisation, online ICLE, and designed online Chinese teaching. The article takes up four difficulties already named in the field—networks, platforms, interaction, and learner affect—and proposes</w:t>
+        <w:t xml:space="preserve">This article examines a delivery problem in online Chinese teaching: a course may remain appropriate in content and still be difficult to take if its timetable, platforms, oral tasks, and assessment do not fit the conditions in which learners participate. A Chinese-language questionnaire asked 38 self-selected respondents—37 of whom selected Pakistani nationality—what household, connectivity, and platform-access conditions they faced, and how those conditions sat alongside stress and appraisals of online learning. The responses are read through later work on technological normalisation, online ICLE, and designed online Chinese teaching. The article proposes</w:t>
       </w:r>
       <w:r>
         <w:t xml:space="preserve"> </w:t>
@@ -185,7 +185,7 @@
         <w:t xml:space="preserve"> </w:t>
       </w:r>
       <w:r>
-        <w:t xml:space="preserve">as a way to address them. Unstable networks (76.3%) and power interruptions (42.1%) were commonly reported, and 36.8% selected</w:t>
+        <w:t xml:space="preserve">as the name for that missing work. Unstable networks (76.3%) and power interruptions (42.1%) were commonly reported, and 36.8% selected</w:t>
       </w:r>
       <w:r>
         <w:t xml:space="preserve"> </w:t>
@@ -260,7 +260,20 @@
         <w:pStyle w:val="FirstParagraph"/>
       </w:pPr>
       <w:r>
-        <w:t xml:space="preserve">This article investigates a problem in online Chinese teaching. When Chinese is taught online, the course may still look like the original class: the same hours, the same platforms, the same oral tasks, and the same forms of assessment. The research question is whether learners can actually take that class. If household power, network speed, and platform access do not support those arrangements, online Chinese teaching fails as delivery even when the content remains appropriate. That is the problem the present study examines.</w:t>
+        <w:t xml:space="preserve">The problem is this: an online Chinese course can keep its original hours, platforms, oral tasks, and assessment, and still be a course that learners cannot take. If household power, network speed, or platform access does not support those arrangements, the content may remain appropriate while the class is closed. That is a delivery problem, not a content problem. This article examines that problem and names the missing work</w:t>
+      </w:r>
+      <w:r>
+        <w:t xml:space="preserve"> </w:t>
+      </w:r>
+      <w:r>
+        <w:rPr>
+          <w:iCs/>
+          <w:i/>
+        </w:rPr>
+        <w:t xml:space="preserve">localisation of delivery</w:t>
+      </w:r>
+      <w:r>
+        <w:t xml:space="preserve">.</w:t>
       </w:r>
     </w:p>
     <w:p>
@@ -268,7 +281,7 @@
         <w:pStyle w:val="BodyText"/>
       </w:pPr>
       <w:r>
-        <w:t xml:space="preserve">The Chinese-language field has already named the practical difficulties of that move online: uneven network conditions, platforms that are hard to operate, thinner classroom interaction, and unstable learner affect (Li &amp; Li, 2024; Tao &amp; Gao, 2022; Zhang et al., 2020). Those four difficulties are the research object here. The purpose of the article is to describe, in this sample, the household, connectivity, and platform-access conditions of online Chinese learning, and to examine how those conditions sat alongside stress, interaction, and respondents’ appraisals of learning. Time-zone difference and the absence of a Chinese-speaking environment have also been listed as field problems. The present questionnaire did not measure them, so they are left aside. The study also does not treat respondents as students who had returned home or who were unable to re-enter campus. Those were common emergency-period situations; they are not established facts in this dataset.</w:t>
+        <w:t xml:space="preserve">The field has already described how that problem appears: uneven network conditions, platforms that are hard to operate, thinner classroom interaction, and unstable learner affect (Li &amp; Li, 2024; Tao &amp; Gao, 2022; Zhang et al., 2020). The purpose of the article is to describe those learner-side conditions in this sample, and to examine how they sat alongside stress, interaction, and respondents’ appraisals of learning. Time-zone difference and the absence of a Chinese-speaking environment have also been listed as field problems. The present questionnaire did not measure them, so they are left aside. The study also does not treat respondents as students who had returned home or who were unable to re-enter campus. Those were common emergency-period situations; they are not established facts in this dataset.</w:t>
       </w:r>
     </w:p>
     <w:p>
@@ -326,20 +339,17 @@
         <w:pStyle w:val="BodyText"/>
       </w:pPr>
       <w:r>
-        <w:t xml:space="preserve">This article addresses that problem by proposing</w:t>
-      </w:r>
-      <w:r>
-        <w:t xml:space="preserve"> </w:t>
-      </w:r>
-      <w:r>
         <w:rPr>
           <w:iCs/>
           <w:i/>
         </w:rPr>
-        <w:t xml:space="preserve">localisation of delivery</w:t>
-      </w:r>
-      <w:r>
-        <w:t xml:space="preserve">: the institutional adaptation of time, platform, task, participation mode, and assessment to the receiving context. The idea is close to, but narrower than, accessibility and digital inclusion (Warschauer, 2003). The claim it seeks to make good is straightforward. An online Chinese course may be locally relevant in content but inaccessible in delivery. The questionnaire cannot show how institutions adapted. What it can do is answer the empirical question first posed by that purpose: what learner-side conditions would online Chinese teaching have to take seriously?</w:t>
+        <w:t xml:space="preserve">Localisation of delivery</w:t>
+      </w:r>
+      <w:r>
+        <w:t xml:space="preserve"> </w:t>
+      </w:r>
+      <w:r>
+        <w:t xml:space="preserve">is the institutional adaptation of time, platform, task, participation mode, and assessment to the receiving context. The idea is close to, but narrower than, accessibility and digital inclusion (Warschauer, 2003). The claim is the problem restated: a course may be locally relevant in content but inaccessible in delivery. The questionnaire cannot show how institutions adapted. It can show the learner-side conditions that such adaptation would have to take seriously.</w:t>
       </w:r>
     </w:p>
     <w:p>

</xml_diff>

<commit_message>
Take localisation out of the title and the opening
Co-authored-by: kristinehina23-rgb <kristinehina23-rgb@users.noreply.github.com>
</commit_message>
<xml_diff>
--- a/papers/q1-masters-covid/word/Rathore-Cao-Xu-When-Chinese-class-moved-home.docx
+++ b/papers/q1-masters-covid/word/Rathore-Cao-Xu-When-Chinese-class-moved-home.docx
@@ -2,13 +2,13 @@
 <file path=word/document.xml><?xml version="1.0" encoding="utf-8"?>
 <w:document xmlns:w="http://schemas.openxmlformats.org/wordprocessingml/2006/main" xmlns:m="http://schemas.openxmlformats.org/officeDocument/2006/math" xmlns:r="http://schemas.openxmlformats.org/officeDocument/2006/relationships" xmlns:o="urn:schemas-microsoft-com:office:office" xmlns:v="urn:schemas-microsoft-com:vml" xmlns:w10="urn:schemas-microsoft-com:office:word" xmlns:a="http://schemas.openxmlformats.org/drawingml/2006/main" xmlns:pic="http://schemas.openxmlformats.org/drawingml/2006/picture" xmlns:wp="http://schemas.openxmlformats.org/drawingml/2006/wordprocessingDrawing">
   <w:body>
-    <w:bookmarkStart w:id="45" w:name="X8e8457e0f88a3ff475a708e9c7de745fbf1ca60"/>
+    <w:bookmarkStart w:id="45" w:name="Xc2030a6abbb01e5f8d1dabdee28fe1e01100d80"/>
     <w:p>
       <w:pPr>
         <w:pStyle w:val="Heading1"/>
       </w:pPr>
       <w:r>
-        <w:t xml:space="preserve">Localisation of delivery in online Chinese teaching: household infrastructure and platform access</w:t>
+        <w:t xml:space="preserve">Household infrastructure and platform access in online Chinese teaching</w:t>
       </w:r>
     </w:p>
     <w:p>
@@ -26,7 +26,7 @@
         <w:t xml:space="preserve"> </w:t>
       </w:r>
       <w:r>
-        <w:t xml:space="preserve">Localisation of delivery in online Chinese teaching</w:t>
+        <w:t xml:space="preserve">Online Chinese teaching: household and platform access</w:t>
       </w:r>
     </w:p>
     <w:p>
@@ -169,23 +169,7 @@
         <w:pStyle w:val="FirstParagraph"/>
       </w:pPr>
       <w:r>
-        <w:t xml:space="preserve">This article examines a delivery problem in online Chinese teaching: a course may remain appropriate in content and still be difficult to take if its timetable, platforms, oral tasks, and assessment do not fit the conditions in which learners participate. A Chinese-language questionnaire asked 38 self-selected respondents—37 of whom selected Pakistani nationality—what household, connectivity, and platform-access conditions they faced, and how those conditions sat alongside stress and appraisals of online learning. The responses are read through later work on technological normalisation, online ICLE, and designed online Chinese teaching. The article proposes</w:t>
-      </w:r>
-      <w:r>
-        <w:t xml:space="preserve"> </w:t>
-      </w:r>
-      <w:r>
-        <w:rPr>
-          <w:iCs/>
-          <w:i/>
-        </w:rPr>
-        <w:t xml:space="preserve">localisation of delivery</w:t>
-      </w:r>
-      <w:r>
-        <w:t xml:space="preserve"> </w:t>
-      </w:r>
-      <w:r>
-        <w:t xml:space="preserve">as the name for that missing work. Unstable networks (76.3%) and power interruptions (42.1%) were commonly reported, and 36.8% selected</w:t>
+        <w:t xml:space="preserve">This article examines a delivery problem in online Chinese teaching: a course may remain appropriate in content and still be difficult to take if its timetable, platforms, oral tasks, and assessment do not fit the conditions in which learners participate. A Chinese-language questionnaire asked 38 self-selected respondents—37 of whom selected Pakistani nationality—what household, connectivity, and platform-access conditions they faced, and how those conditions sat alongside stress and appraisals of online learning. The responses are read through later work on technological normalisation, online ICLE, and designed online Chinese teaching. Unstable networks (76.3%) and power interruptions (42.1%) were commonly reported, and 36.8% selected</w:t>
       </w:r>
       <w:r>
         <w:t xml:space="preserve"> </w:t>
@@ -242,7 +226,7 @@
         <w:t xml:space="preserve"> </w:t>
       </w:r>
       <w:r>
-        <w:t xml:space="preserve">online Chinese teaching; localisation of delivery; digital inequality; emergency remote teaching; Pakistan; household infrastructure</w:t>
+        <w:t xml:space="preserve">online Chinese teaching; household infrastructure; platform access; digital inequality; emergency remote teaching; Pakistan</w:t>
       </w:r>
     </w:p>
     <w:bookmarkEnd w:id="20"/>
@@ -260,20 +244,7 @@
         <w:pStyle w:val="FirstParagraph"/>
       </w:pPr>
       <w:r>
-        <w:t xml:space="preserve">The problem is this: an online Chinese course can keep its original hours, platforms, oral tasks, and assessment, and still be a course that learners cannot take. If household power, network speed, or platform access does not support those arrangements, the content may remain appropriate while the class is closed. That is a delivery problem, not a content problem. This article examines that problem and names the missing work</w:t>
-      </w:r>
-      <w:r>
-        <w:t xml:space="preserve"> </w:t>
-      </w:r>
-      <w:r>
-        <w:rPr>
-          <w:iCs/>
-          <w:i/>
-        </w:rPr>
-        <w:t xml:space="preserve">localisation of delivery</w:t>
-      </w:r>
-      <w:r>
-        <w:t xml:space="preserve">.</w:t>
+        <w:t xml:space="preserve">The problem is this: an online Chinese course can keep its original hours, platforms, oral tasks, and assessment, and still be a course that learners cannot take. If household power, network speed, or platform access does not support those arrangements, the content may remain appropriate while the class is closed. That is a delivery problem, not a content problem. This article examines that problem.</w:t>
       </w:r>
     </w:p>
     <w:p>
@@ -339,17 +310,7 @@
         <w:pStyle w:val="BodyText"/>
       </w:pPr>
       <w:r>
-        <w:rPr>
-          <w:iCs/>
-          <w:i/>
-        </w:rPr>
-        <w:t xml:space="preserve">Localisation of delivery</w:t>
-      </w:r>
-      <w:r>
-        <w:t xml:space="preserve"> </w:t>
-      </w:r>
-      <w:r>
-        <w:t xml:space="preserve">is the institutional adaptation of time, platform, task, participation mode, and assessment to the receiving context. The idea is close to, but narrower than, accessibility and digital inclusion (Warschauer, 2003). The claim is the problem restated: a course may be locally relevant in content but inaccessible in delivery. The questionnaire cannot show how institutions adapted. It can show the learner-side conditions that such adaptation would have to take seriously.</w:t>
+        <w:t xml:space="preserve">The questionnaire cannot show how institutions adapted time, platform, task, participation mode, or assessment. It can show the learner-side conditions of household infrastructure and platform access, and how those conditions sat alongside stress and appraisals of online learning.</w:t>
       </w:r>
     </w:p>
     <w:p>
@@ -459,7 +420,7 @@
         <w:pStyle w:val="FirstParagraph"/>
       </w:pPr>
       <w:r>
-        <w:t xml:space="preserve">Those answers are used to show that the problem of online Chinese teaching is, in this sample, a delivery problem: content and materials work cannot settle it on their own. Counts are used descriptively. Associations are explored with Fisher’s exact tests and Spearman rank correlations and are not read as confirmatory tests of population-level relationships. Section 2 locates the study in later work on online language teaching and online ICLE, in digital inequality and home learning ecologies, and in the proposed account of localisation of delivery. Section 3 reports when and how the questionnaire was completed. Sections 4 and 5 report and discuss the findings, and the final sections set out implications, limitations, and the article’s answer.</w:t>
+        <w:t xml:space="preserve">Those answers are used to show that the problem of online Chinese teaching is, in this sample, a delivery problem: content and materials work cannot settle it on their own. Counts are used descriptively. Associations are explored with Fisher’s exact tests and Spearman rank correlations and are not read as confirmatory tests of population-level relationships. Section 2 locates the study in later work on online language teaching and online ICLE, and in digital inequality and home learning ecologies. Section 3 reports when and how the questionnaire was completed. Sections 4 and 5 report and discuss the findings, and the final sections set out implications, limitations, and the article’s answer.</w:t>
       </w:r>
     </w:p>
     <w:bookmarkEnd w:id="21"/>
@@ -3126,7 +3087,7 @@
         <w:pStyle w:val="FirstParagraph"/>
       </w:pPr>
       <w:r>
-        <w:t xml:space="preserve">The sample is small (N = 38), network-recruited, and majority male. Recruitment channel, host university, programme type, and place of residence that week were not recorded, so Chinese-university enrolment is not independently verified. IP metadata are not a location measure. All outcomes are self-report. The appraisal index is descriptive, not a validated scale, and the infrastructure-problem count is an unvalidated post hoc indicator. The form did not measure institutional adaptation, so localisation of delivery remains a conceptual reading of student-side conditions. The data are from February 2022 and concern emergency remote teaching; they are not evidence about current hybrid education. No ethics-committee number is available for the 2022 collection (Section 3.5).</w:t>
+        <w:t xml:space="preserve">The sample is small (N = 38), network-recruited, and majority male. Recruitment channel, host university, programme type, and place of residence that week were not recorded, so Chinese-university enrolment is not independently verified. IP metadata are not a location measure. All outcomes are self-report. The appraisal index is descriptive, not a validated scale, and the infrastructure-problem count is an unvalidated post hoc indicator. The form did not measure institutional adaptation. The data are from February 2022 and concern emergency remote teaching; they are not evidence about current hybrid education. No ethics-committee number is available for the 2022 collection (Section 3.5).</w:t>
       </w:r>
     </w:p>
     <w:bookmarkEnd w:id="40"/>
@@ -3162,23 +3123,7 @@
         <w:t xml:space="preserve"> </w:t>
       </w:r>
       <w:r>
-        <w:t xml:space="preserve">and with more negative appraisals of online learning. The contribution is therefore both conceptual and empirical: later work on online language teaching and online ICLE supplies the lenses,</w:t>
-      </w:r>
-      <w:r>
-        <w:t xml:space="preserve"> </w:t>
-      </w:r>
-      <w:r>
-        <w:rPr>
-          <w:iCs/>
-          <w:i/>
-        </w:rPr>
-        <w:t xml:space="preserve">localisation of delivery</w:t>
-      </w:r>
-      <w:r>
-        <w:t xml:space="preserve"> </w:t>
-      </w:r>
-      <w:r>
-        <w:t xml:space="preserve">names the work that online Chinese teaching still has to do after content and materials have been adapted, and the questionnaire identifies learner-side conditions that such teaching would need to address. That answer is bounded by N = 38 and by data collected during emergency remote teaching (Section 3.1). Whether later hybrid arrangements have closed the gap is a question this study cannot answer. The problem it can settle, for this sample, is the more basic one: online Chinese teaching is not only a content problem. It is also a delivery problem.</w:t>
+        <w:t xml:space="preserve">and with more negative appraisals of online learning. Later work on online language teaching and online ICLE supplies the lenses. The questionnaire identifies learner-side conditions that online Chinese teaching would need to address. That answer is bounded by N = 38 and by data collected during emergency remote teaching (Section 3.1). Whether later hybrid arrangements have closed the gap is a question this study cannot answer. The problem it can settle, for this sample, is the more basic one: online Chinese teaching is not only a content problem. It is also a delivery problem.</w:t>
       </w:r>
     </w:p>
     <w:bookmarkEnd w:id="41"/>

</xml_diff>

<commit_message>
Add 12 Crossref-verified papers so the problem is documented in current language-education journals
Co-authored-by: kristinehina23-rgb <kristinehina23-rgb@users.noreply.github.com>
</commit_message>
<xml_diff>
--- a/papers/q1-masters-covid/word/Rathore-Cao-Xu-When-Chinese-class-moved-home.docx
+++ b/papers/q1-masters-covid/word/Rathore-Cao-Xu-When-Chinese-class-moved-home.docx
@@ -244,7 +244,7 @@
         <w:pStyle w:val="FirstParagraph"/>
       </w:pPr>
       <w:r>
-        <w:t xml:space="preserve">The problem is this: when language teaching is moved online, the course often keeps the hours, platforms, and classroom tasks of the original class (Gacs et al., 2020; Hodges et al., 2020; Stockwell &amp; Wang, 2023). Research on online language teaching, and on online international Chinese teaching, has already shown that those arrangements can fail where networks are unstable, platforms are hard to use, interaction thins out, or learners are under strain (Li &amp; Li, 2024; Moser et al., 2021; Tao &amp; Gao, 2022). Studies of household and university e-learning in Pakistan have likewise documented uneven internet access, device sharing, and electricity interruptions (Jamil &amp; Muschert, 2023; Raza &amp; Hennessy, 2025). Owning a device is not the same as being able to take part (Ali, 2020; Warschauer, 2003). If household power, network speed, or platform access does not support the required class, the content may remain appropriate while the class is closed. That is a delivery problem, not a content problem. This article examines that problem.</w:t>
+        <w:t xml:space="preserve">The problem is this: when language teaching is moved online, the course often keeps the hours, platforms, and classroom tasks of the original class (Gacs et al., 2020; Hodges et al., 2020; Stockwell &amp; Wang, 2023). Guides to online language tasks still assume that learners can join a live or collaborative session (González-Lloret, 2020; Payne, 2020). Research on online language teaching, and on online international Chinese teaching, has already shown that those arrangements can fail where networks are unstable, platforms are hard to use, interaction thins out, or learners are under strain (Li &amp; Li, 2024; Moser et al., 2021; Russell, 2020; Tao &amp; Gao, 2022). Digital-inequality research, including studies of online learning in China and of household and university e-learning in Pakistan, has documented uneven internet access, device sharing, and electricity interruptions (Beaunoyer et al., 2020; Guo &amp; Wan, 2022; Jamil &amp; Muschert, 2023; Raza &amp; Hennessy, 2025). Owning a device is not the same as being able to take part (Ali, 2020; Warschauer, 2003). If household power, network speed, or platform access does not support the required class, the content may remain appropriate while the class is closed. That is a delivery problem, not a content problem. This article examines that problem. Distance language learning had already raised that feasibility question before the pandemic (White, 2006).</w:t>
       </w:r>
     </w:p>
     <w:p>
@@ -302,7 +302,7 @@
         <w:t xml:space="preserve">taken</w:t>
       </w:r>
       <w:r>
-        <w:t xml:space="preserve">. Language, culture, and curriculum meet not only in the textbook but in the setting of the class (Guerrettaz et al., 2021; van Lier, 2004). Research in the field has mapped learners and pedagogical practices associated with Chinese-speaking educational settings (Gong et al., 2020b; Ma et al., 2017). Postmethod and localist scholarship already argues that pedagogy should answer to a particular group and place (Canagarajah, 2005; Kumaravadivelu, 2001), and recent articles in this journal treat curriculum as lived practice (Lam, 2024; Shan &amp; Xu, 2024). These approaches remain necessary. They do not, by themselves, tell us whether the institutional arrangements of online Chinese teaching—its time, platforms, tasks, participation mode, and assessment—remain feasible where learners participate.</w:t>
+        <w:t xml:space="preserve">. Language, culture, and curriculum meet not only in the textbook but in the setting of the class (Guerrettaz et al., 2021; van Lier, 2004). Research in the field has mapped learners and pedagogical practices associated with Chinese-speaking educational settings (Gong et al., 2020b; Ma et al., 2017). Postmethod and localist scholarship already argues that pedagogy should answer to a particular group and place (Canagarajah, 2005; Kumaravadivelu, 2001), and recent articles in this journal treat curriculum as lived practice and publish student questionnaires on how courses are experienced (Lam, 2024; Shan &amp; Xu, 2024; Zhang &amp; Pladevall-Ballester, 2021). These approaches remain necessary. They do not, by themselves, tell us whether the institutional arrangements of online Chinese teaching—its time, platforms, tasks, participation mode, and assessment—remain feasible where learners participate.</w:t>
       </w:r>
     </w:p>
     <w:p>
@@ -447,7 +447,7 @@
         <w:pStyle w:val="FirstParagraph"/>
       </w:pPr>
       <w:r>
-        <w:t xml:space="preserve">Hodges et al. (2020) drew a useful line between emergency remote teaching and planned online or blended provision. Gacs, Goertler and Spasova (2020) brought that distinction into language education. Surveys of language teachers from the same period describe heavier workloads, stress, and uneven preparedness once teaching moved online (MacIntyre et al., 2020; Moser et al., 2021), and Tao and Gao (2022) read the wider literature as a story of technical disruption, thinner engagement, and the need for language-specific support. That work locates the moment in which the present questionnaire was completed. It is not used as a substitute for the stress reports in this sample, and it is not the lens through which the problem is now read.</w:t>
+        <w:t xml:space="preserve">Hodges et al. (2020) drew a useful line between emergency remote teaching and planned online or blended provision. Gacs, Goertler and Spasova (2020) brought that distinction into language education. Bond et al. (2021) mapped that first global online semester, and Adedoyin and Soykan (2020) summarised the infrastructural as well as pedagogical strain. Surveys of language teachers from the same period describe heavier workloads, stress, and uneven preparedness once teaching moved online (MacIntyre et al., 2020; Moorhouse &amp; Kohnke, 2021; Moser et al., 2021). Tao and Gao (2022) read the wider literature as a story of technical disruption, thinner engagement, and the need for language-specific support. Russell (2020) treats language anxiety as a condition of the online learner, and Lomicka (2020) treats interaction as a problem of virtual community rather than of a copied campus hour. That work locates the moment in which the present questionnaire was completed. It is not used as a substitute for the stress reports in this sample, and it is not the lens through which the problem is now read.</w:t>
       </w:r>
     </w:p>
     <w:p>
@@ -473,7 +473,7 @@
         <w:t xml:space="preserve"> </w:t>
       </w:r>
       <w:r>
-        <w:t xml:space="preserve">and early platform trials (Xia et al., 2022; Zhang et al., 2020). That writing already listed the same cluster of difficulties that still organise this article: networks, platforms, interaction, and learner affect. Xu et al. (2022) show how character teaching was adapted on the sending side. What makes those findings still usable is the later ICLE writing: reviews of online teaching models continue to list technical problems, weak interaction, and time-zone difficulty (Li &amp; Li, 2024); designed online Chinese-culture courses show a planned alternative to emergency copying (Guenier et al., 2026); and learner emotion in Chinese as an additional language is already a topic in this journal (Wen &amp; Liu, 2025). Much of that writing still assumes a relatively stable connection. The present questionnaire cannot test whether that assumption holds for current hybrid ICLE. It can show, under the later lens of delivery-context fit, what 38 respondents reported when online Chinese teaching asked them to join a travelling course.</w:t>
+        <w:t xml:space="preserve">and early platform trials (Xia et al., 2022; Zhang et al., 2020). That writing already listed the same cluster of difficulties that still organise this article: networks, platforms, interaction, and learner affect. Xu et al. (2022) show how character teaching was adapted on the sending side. Jin et al. (2023) report world-language faculty perceptions of pandemic online teaching. Zhang and Liu (2023) examine online collaborative writing among Chinese-language learners in designed synchronous and asynchronous conditions, which is planned online work rather than a copy of the campus hour. What makes those findings still usable is the later ICLE writing: reviews of online teaching models continue to list technical problems, weak interaction, and time-zone difficulty (Li &amp; Li, 2024); designed online Chinese-culture courses show a planned alternative to emergency copying (Guenier et al., 2026); and learner emotion in Chinese as an additional language is already a topic in this journal (Wen &amp; Liu, 2025). Much of that writing still assumes a relatively stable connection. The present questionnaire cannot test whether that assumption holds for current hybrid ICLE. It can show, under the later lens of delivery-context fit, what 38 respondents reported when online Chinese teaching asked them to join a travelling course.</w:t>
       </w:r>
     </w:p>
     <w:bookmarkEnd w:id="22"/>
@@ -491,7 +491,7 @@
         <w:pStyle w:val="FirstParagraph"/>
       </w:pPr>
       <w:r>
-        <w:t xml:space="preserve">Later models of the digital divide distinguish motivational, material, skills, usage, and outcome access (Helsper, 2021; van Dijk, 2020; Warschauer, 2003). Owning a device is not the same as being able to take part (Ali, 2020). Interview research on Pakistani university e-learning during COVID-19 found uneven first-level access (internet and devices) and second-level skills, with rural and less-resourced students more exposed (Jamil &amp; Muschert, 2023). Household use of educational technology is also shaped by device sharing, care work, and electricity (Raza &amp; Hennessy, 2025). The latter source is a grey-literature report, and neither study is treated as evidence about the 38 respondents here; both are cited only as background for the nationality most of them reported.</w:t>
+        <w:t xml:space="preserve">Later models of the digital divide distinguish motivational, material, skills, usage, and outcome access (Helsper, 2021; van Dijk, 2020; Warschauer, 2003). Owning a device is not the same as being able to take part (Ali, 2020; Beaunoyer et al., 2020). Guo and Wan (2022) document that divide in online learning in China. Interview research on Pakistani university e-learning during COVID-19 found uneven first-level access (internet and devices) and second-level skills, with rural and less-resourced students more exposed (Jamil &amp; Muschert, 2023). Household use of educational technology is also shaped by device sharing, care work, and electricity (Raza &amp; Hennessy, 2025). The latter source is a grey-literature report, and neither study is treated as evidence about the 38 respondents here; both are cited only as background for the nationality most of them reported.</w:t>
       </w:r>
     </w:p>
     <w:p>
@@ -3615,6 +3615,27 @@
         <w:pStyle w:val="FirstParagraph"/>
       </w:pPr>
       <w:r>
+        <w:t xml:space="preserve">Adedoyin, O. B., &amp; Soykan, E. (2020). Covid-19 pandemic and online learning: The challenges and opportunities.</w:t>
+      </w:r>
+      <w:r>
+        <w:t xml:space="preserve"> </w:t>
+      </w:r>
+      <w:r>
+        <w:rPr>
+          <w:iCs/>
+          <w:i/>
+        </w:rPr>
+        <w:t xml:space="preserve">Interactive Learning Environments, 31</w:t>
+      </w:r>
+      <w:r>
+        <w:t xml:space="preserve">(2), 863-875. https://doi.org/10.1080/10494820.2020.1813180</w:t>
+      </w:r>
+    </w:p>
+    <w:p>
+      <w:pPr>
+        <w:pStyle w:val="BodyText"/>
+      </w:pPr>
+      <w:r>
         <w:t xml:space="preserve">Ali, W. (2020). Online and remote learning in higher education institutes: A necessity in light of COVID-19 pandemic.</w:t>
       </w:r>
       <w:r>
@@ -3636,6 +3657,48 @@
         <w:pStyle w:val="BodyText"/>
       </w:pPr>
       <w:r>
+        <w:t xml:space="preserve">Beaunoyer, E., Dupéré, S., &amp; Guitton, M. J. (2020). COVID-19 and digital inequalities: Reciprocal impacts and mitigation strategies.</w:t>
+      </w:r>
+      <w:r>
+        <w:t xml:space="preserve"> </w:t>
+      </w:r>
+      <w:r>
+        <w:rPr>
+          <w:iCs/>
+          <w:i/>
+        </w:rPr>
+        <w:t xml:space="preserve">Computers in Human Behavior, 111</w:t>
+      </w:r>
+      <w:r>
+        <w:t xml:space="preserve">, Article 106424. https://doi.org/10.1016/j.chb.2020.106424</w:t>
+      </w:r>
+    </w:p>
+    <w:p>
+      <w:pPr>
+        <w:pStyle w:val="BodyText"/>
+      </w:pPr>
+      <w:r>
+        <w:t xml:space="preserve">Bond, M., Bedenlier, S., Marín, V. I., &amp; Händel, M. (2021). Emergency remote teaching in higher education: Mapping the first global online semester.</w:t>
+      </w:r>
+      <w:r>
+        <w:t xml:space="preserve"> </w:t>
+      </w:r>
+      <w:r>
+        <w:rPr>
+          <w:iCs/>
+          <w:i/>
+        </w:rPr>
+        <w:t xml:space="preserve">International Journal of Educational Technology in Higher Education, 18</w:t>
+      </w:r>
+      <w:r>
+        <w:t xml:space="preserve">(1), Article 50. https://doi.org/10.1186/s41239-021-00282-x</w:t>
+      </w:r>
+    </w:p>
+    <w:p>
+      <w:pPr>
+        <w:pStyle w:val="BodyText"/>
+      </w:pPr>
+      <w:r>
         <w:t xml:space="preserve">Canagarajah, A. S. (Ed.). (2005).</w:t>
       </w:r>
       <w:r>
@@ -3741,6 +3804,27 @@
         <w:pStyle w:val="BodyText"/>
       </w:pPr>
       <w:r>
+        <w:t xml:space="preserve">González-Lloret, M. (2020). Collaborative tasks for online language teaching.</w:t>
+      </w:r>
+      <w:r>
+        <w:t xml:space="preserve"> </w:t>
+      </w:r>
+      <w:r>
+        <w:rPr>
+          <w:iCs/>
+          <w:i/>
+        </w:rPr>
+        <w:t xml:space="preserve">Foreign Language Annals, 53</w:t>
+      </w:r>
+      <w:r>
+        <w:t xml:space="preserve">(2), 260-269. https://doi.org/10.1111/flan.12466</w:t>
+      </w:r>
+    </w:p>
+    <w:p>
+      <w:pPr>
+        <w:pStyle w:val="BodyText"/>
+      </w:pPr>
+      <w:r>
         <w:t xml:space="preserve">Guenier, A. W., Xing, M., &amp; Yan, J. (2026). From barriers to breakthroughs: Communicating Chinese culture to Irish learners with a multimodality online course.</w:t>
       </w:r>
       <w:r>
@@ -3783,6 +3867,27 @@
         <w:pStyle w:val="BodyText"/>
       </w:pPr>
       <w:r>
+        <w:t xml:space="preserve">Guo, C., &amp; Wan, B. (2022). The digital divide in online learning in China during the COVID-19 pandemic.</w:t>
+      </w:r>
+      <w:r>
+        <w:t xml:space="preserve"> </w:t>
+      </w:r>
+      <w:r>
+        <w:rPr>
+          <w:iCs/>
+          <w:i/>
+        </w:rPr>
+        <w:t xml:space="preserve">Technology in Society, 71</w:t>
+      </w:r>
+      <w:r>
+        <w:t xml:space="preserve">, Article 102122. https://doi.org/10.1016/j.techsoc.2022.102122</w:t>
+      </w:r>
+    </w:p>
+    <w:p>
+      <w:pPr>
+        <w:pStyle w:val="BodyText"/>
+      </w:pPr>
+      <w:r>
         <w:t xml:space="preserve">Helsper, E. (2021).</w:t>
       </w:r>
       <w:r>
@@ -3846,6 +3951,27 @@
         <w:pStyle w:val="BodyText"/>
       </w:pPr>
       <w:r>
+        <w:t xml:space="preserve">Jin, L., Xu, Y., &amp; Deifell, E. (2023). College-level world language faculty background characteristics and their perceptions of online language teaching during the pandemic.</w:t>
+      </w:r>
+      <w:r>
+        <w:t xml:space="preserve"> </w:t>
+      </w:r>
+      <w:r>
+        <w:rPr>
+          <w:iCs/>
+          <w:i/>
+        </w:rPr>
+        <w:t xml:space="preserve">Foreign Language Annals, 57</w:t>
+      </w:r>
+      <w:r>
+        <w:t xml:space="preserve">(1), 137-162. https://doi.org/10.1111/flan.12689</w:t>
+      </w:r>
+    </w:p>
+    <w:p>
+      <w:pPr>
+        <w:pStyle w:val="BodyText"/>
+      </w:pPr>
+      <w:r>
         <w:t xml:space="preserve">Kumaravadivelu, B. (2001). Toward a postmethod pedagogy.</w:t>
       </w:r>
       <w:r>
@@ -3909,6 +4035,27 @@
         <w:pStyle w:val="BodyText"/>
       </w:pPr>
       <w:r>
+        <w:t xml:space="preserve">Lomicka, L. (2020). Creating and sustaining virtual language communities.</w:t>
+      </w:r>
+      <w:r>
+        <w:t xml:space="preserve"> </w:t>
+      </w:r>
+      <w:r>
+        <w:rPr>
+          <w:iCs/>
+          <w:i/>
+        </w:rPr>
+        <w:t xml:space="preserve">Foreign Language Annals, 53</w:t>
+      </w:r>
+      <w:r>
+        <w:t xml:space="preserve">(2), 306-313. https://doi.org/10.1111/flan.12456</w:t>
+      </w:r>
+    </w:p>
+    <w:p>
+      <w:pPr>
+        <w:pStyle w:val="BodyText"/>
+      </w:pPr>
+      <w:r>
         <w:t xml:space="preserve">Lu, X., Tan, A., Ma, Y., Feng, H., &amp; Hanif, B. (2024). Scenario analysis of localization and adaptation of Chinese language teaching.</w:t>
       </w:r>
       <w:r>
@@ -4080,6 +4227,27 @@
         <w:pStyle w:val="BodyText"/>
       </w:pPr>
       <w:r>
+        <w:t xml:space="preserve">Payne, J. S. (2020). Developing L2 productive language skills online and the strategic use of instructional tools.</w:t>
+      </w:r>
+      <w:r>
+        <w:t xml:space="preserve"> </w:t>
+      </w:r>
+      <w:r>
+        <w:rPr>
+          <w:iCs/>
+          <w:i/>
+        </w:rPr>
+        <w:t xml:space="preserve">Foreign Language Annals, 53</w:t>
+      </w:r>
+      <w:r>
+        <w:t xml:space="preserve">(2), 243-249. https://doi.org/10.1111/flan.12457</w:t>
+      </w:r>
+    </w:p>
+    <w:p>
+      <w:pPr>
+        <w:pStyle w:val="BodyText"/>
+      </w:pPr>
+      <w:r>
         <w:t xml:space="preserve">Raza, O., &amp; Hennessy, S. (2025).</w:t>
       </w:r>
       <w:r>
@@ -4101,6 +4269,27 @@
         <w:pStyle w:val="BodyText"/>
       </w:pPr>
       <w:r>
+        <w:t xml:space="preserve">Russell, V. (2020). Language anxiety and the online learner.</w:t>
+      </w:r>
+      <w:r>
+        <w:t xml:space="preserve"> </w:t>
+      </w:r>
+      <w:r>
+        <w:rPr>
+          <w:iCs/>
+          <w:i/>
+        </w:rPr>
+        <w:t xml:space="preserve">Foreign Language Annals, 53</w:t>
+      </w:r>
+      <w:r>
+        <w:t xml:space="preserve">(2), 338-352. https://doi.org/10.1111/flan.12461</w:t>
+      </w:r>
+    </w:p>
+    <w:p>
+      <w:pPr>
+        <w:pStyle w:val="BodyText"/>
+      </w:pPr>
+      <w:r>
         <w:t xml:space="preserve">Shan, Z., &amp; Xu, H. (2024). Students’ conceptions and experiences of institutionalised curriculum for multilingual learning: The case of a dual-foreign-languages programme.</w:t>
       </w:r>
       <w:r>
@@ -4311,6 +4500,27 @@
         <w:pStyle w:val="BodyText"/>
       </w:pPr>
       <w:r>
+        <w:t xml:space="preserve">White, C. (2006). Distance learning of foreign languages.</w:t>
+      </w:r>
+      <w:r>
+        <w:t xml:space="preserve"> </w:t>
+      </w:r>
+      <w:r>
+        <w:rPr>
+          <w:iCs/>
+          <w:i/>
+        </w:rPr>
+        <w:t xml:space="preserve">Language Teaching, 39</w:t>
+      </w:r>
+      <w:r>
+        <w:t xml:space="preserve">(4), 247-264. https://doi.org/10.1017/S0261444806003727</w:t>
+      </w:r>
+    </w:p>
+    <w:p>
+      <w:pPr>
+        <w:pStyle w:val="BodyText"/>
+      </w:pPr>
+      <w:r>
         <w:t xml:space="preserve">Xia, Y., Hu, Y., Wu, C., Yang, L., &amp; Lei, M. (2022). Challenges of online learning amid the COVID-19: College students’ perspective.</w:t>
       </w:r>
       <w:r>
@@ -4346,6 +4556,48 @@
       </w:r>
       <w:r>
         <w:t xml:space="preserve">(1), 72-97. https://doi.org/10.1111/flan.12541</w:t>
+      </w:r>
+    </w:p>
+    <w:p>
+      <w:pPr>
+        <w:pStyle w:val="BodyText"/>
+      </w:pPr>
+      <w:r>
+        <w:t xml:space="preserve">Zhang, M., &amp; Liu, Q. (2023). Synchronous and asynchronous online collaborative writing: A study on Chinese language learners.</w:t>
+      </w:r>
+      <w:r>
+        <w:t xml:space="preserve"> </w:t>
+      </w:r>
+      <w:r>
+        <w:rPr>
+          <w:iCs/>
+          <w:i/>
+        </w:rPr>
+        <w:t xml:space="preserve">Foreign Language Annals, 56</w:t>
+      </w:r>
+      <w:r>
+        <w:t xml:space="preserve">(3), 740-763. https://doi.org/10.1111/flan.12704</w:t>
+      </w:r>
+    </w:p>
+    <w:p>
+      <w:pPr>
+        <w:pStyle w:val="BodyText"/>
+      </w:pPr>
+      <w:r>
+        <w:t xml:space="preserve">Zhang, M., &amp; Pladevall-Ballester, E. (2021). Students’ attitudes and perceptions towards three EMI courses in mainland China.</w:t>
+      </w:r>
+      <w:r>
+        <w:t xml:space="preserve"> </w:t>
+      </w:r>
+      <w:r>
+        <w:rPr>
+          <w:iCs/>
+          <w:i/>
+        </w:rPr>
+        <w:t xml:space="preserve">Language, Culture and Curriculum, 35</w:t>
+      </w:r>
+      <w:r>
+        <w:t xml:space="preserve">(2), 200-216. https://doi.org/10.1080/07908318.2021.1979576</w:t>
       </w:r>
     </w:p>
     <w:p>

</xml_diff>

<commit_message>
Rewrite the introduction as a critical argument and add five 2024-2026 sources
The opening now states the delivery problem, explains why existing work leaves learner-side conditions under-examined, and presents the questionnaire as the study's response. Recent Crossref-verified papers on online CSL anxiety, CFL technology reviews, digital infrastructure, and Pakistan-context digital access are used only as later lenses or nationality background.

Co-authored-by: kristinehina23-rgb <kristinehina23-rgb@users.noreply.github.com>
</commit_message>
<xml_diff>
--- a/papers/q1-masters-covid/word/Rathore-Cao-Xu-When-Chinese-class-moved-home.docx
+++ b/papers/q1-masters-covid/word/Rathore-Cao-Xu-When-Chinese-class-moved-home.docx
@@ -244,7 +244,7 @@
         <w:pStyle w:val="FirstParagraph"/>
       </w:pPr>
       <w:r>
-        <w:t xml:space="preserve">The problem is this: when language teaching is moved online, the course often keeps the hours, platforms, and classroom tasks of the original class (Gacs et al., 2020; Hodges et al., 2020; Stockwell &amp; Wang, 2023). Guides to online language tasks still assume that learners can join a live or collaborative session (González-Lloret, 2020; Payne, 2020). Research on online language teaching, and on online international Chinese teaching, has already shown that those arrangements can fail where networks are unstable, platforms are hard to use, interaction thins out, or learners are under strain (Li &amp; Li, 2024; Moser et al., 2021; Russell, 2020; Tao &amp; Gao, 2022). Digital-inequality research, including studies of online learning in China and of household and university e-learning in Pakistan, has documented uneven internet access, device sharing, and electricity interruptions (Beaunoyer et al., 2020; Guo &amp; Wan, 2022; Jamil &amp; Muschert, 2023; Raza &amp; Hennessy, 2025). Owning a device is not the same as being able to take part (Ali, 2020; Warschauer, 2003). If household power, network speed, or platform access does not support the required class, the content may remain appropriate while the class is closed. That is a delivery problem, not a content problem. This article examines that problem. Distance language learning had already raised that feasibility question before the pandemic (White, 2006).</w:t>
+        <w:t xml:space="preserve">An online Chinese course can keep its original hours, platforms, oral tasks, and assessment, and still be a course learners cannot take. When language teaching is moved online, programmes commonly retain the timetable and classroom tasks of the sending class (Gacs et al., 2020; Hodges et al., 2020; Stockwell &amp; Wang, 2023). Guides to online language work still assume that learners can join a live or collaborative session (González-Lloret, 2020; Payne, 2020). That assumption does not hold where networks are unstable, required platforms are hard to open, interaction thins out, or learners are under strain (Li &amp; Li, 2024; Moser et al., 2021; Qi, 2025; Russell, 2020; Tao &amp; Gao, 2022). Digital-inequality research has already shown that owning a device is not the same as being able to take part: household internet, shared equipment, and electricity interruptions close online classes even when the materials remain available (Ali, 2020; Beaunoyer et al., 2020; Guo &amp; Wan, 2022; Vishnu et al., 2024; Warschauer, 2003). Distance language learning had raised the same feasibility question before the pandemic (White, 2006). If household power, network speed, or platform access does not support the required class, the content may remain appropriate while the class is closed. That is a delivery problem, not a content problem.</w:t>
       </w:r>
     </w:p>
     <w:p>
@@ -252,7 +252,20 @@
         <w:pStyle w:val="BodyText"/>
       </w:pPr>
       <w:r>
-        <w:t xml:space="preserve">The field has already described how that problem appears: uneven network conditions, platforms that are hard to operate, thinner classroom interaction, and unstable learner affect (Li &amp; Li, 2024; Tao &amp; Gao, 2022; Zhang et al., 2020). The purpose of the article is to describe those learner-side conditions in this sample, and to examine how they sat alongside stress, interaction, and respondents’ appraisals of learning. Time-zone difference and the absence of a Chinese-speaking environment have also been listed as field problems. The present questionnaire did not measure them, so they are left aside. The study also does not treat respondents as students who had returned home or who were unable to re-enter campus. Those were common emergency-period situations; they are not established facts in this dataset.</w:t>
+        <w:t xml:space="preserve">The difficulty is not that the field has never named these failures. It is that it has usually treated them as background to something else. Emergency remote teaching made the problem urgent, but much of that writing documented teacher workload, sending-side pedagogical adaptation, or a videoconference copy of the campus hour (MacIntyre et al., 2020; Moser et al., 2021; Xu et al., 2022). Later work on technological normalisation asked what should remain of emergency practice and warned against treating that copy as the lesson of the crisis (Moorhouse, 2023; Moorhouse, Wong, &amp; Li, 2023; Stockwell &amp; Wang, 2023). Reviews of online international Chinese teaching, and of technology in Chinese as a foreign language, still list technical trouble and still leave digital equity and household access under-examined (Li &amp; Li, 2024; Xu, 2024; Zhang &amp; Osborne, 2026). Designed online courses and studies of learner emotion show what planned online Chinese teaching can look like (Guenier et al., 2026; Qi, 2025; Wen &amp; Liu, 2025). They do not tell us whether a</w:t>
+      </w:r>
+      <w:r>
+        <w:t xml:space="preserve"> </w:t>
+      </w:r>
+      <w:r>
+        <w:rPr>
+          <w:iCs/>
+          <w:i/>
+        </w:rPr>
+        <w:t xml:space="preserve">travelling course</w:t>
+      </w:r>
+      <w:r>
+        <w:t xml:space="preserve">—this article’s term, from Gacs et al. (2020), for a course designed in one institutional setting and taught in another—remained feasible where learners actually sat. Time-zone difference and the absence of a Chinese-speaking environment have also been listed as field problems. The present questionnaire did not measure them, so they are left aside. The study also does not treat respondents as students who had returned home or who were unable to re-enter campus. Those were common emergency-period situations; they are not established facts in this dataset.</w:t>
       </w:r>
     </w:p>
     <w:p>
@@ -260,7 +273,7 @@
         <w:pStyle w:val="BodyText"/>
       </w:pPr>
       <w:r>
-        <w:t xml:space="preserve">The problem is easy to miss because international Chinese language education has become skilled at localising what a course</w:t>
+        <w:t xml:space="preserve">What is missing, then, is not another map of online-teaching models. It is learner-side evidence on the conditions that decide whether the class can be taken at all. International Chinese language education has said more about what a course</w:t>
       </w:r>
       <w:r>
         <w:t xml:space="preserve"> </w:t>
@@ -273,23 +286,7 @@
         <w:t xml:space="preserve">says</w:t>
       </w:r>
       <w:r>
-        <w:t xml:space="preserve">: its examples, cultural content, and materials (Lu et al., 2024; McDonough &amp; Shaw, 2003; Tomlinson, 2011; Zhao, 2020). It has said much less about whether an</w:t>
-      </w:r>
-      <w:r>
-        <w:t xml:space="preserve"> </w:t>
-      </w:r>
-      <w:r>
-        <w:rPr>
-          <w:iCs/>
-          <w:i/>
-        </w:rPr>
-        <w:t xml:space="preserve">online</w:t>
-      </w:r>
-      <w:r>
-        <w:t xml:space="preserve"> </w:t>
-      </w:r>
-      <w:r>
-        <w:t xml:space="preserve">Chinese course can still be</w:t>
+        <w:t xml:space="preserve">—its examples, cultural content, and materials—than about whether an online Chinese course can still be</w:t>
       </w:r>
       <w:r>
         <w:t xml:space="preserve"> </w:t>
@@ -302,7 +299,10 @@
         <w:t xml:space="preserve">taken</w:t>
       </w:r>
       <w:r>
-        <w:t xml:space="preserve">. Language, culture, and curriculum meet not only in the textbook but in the setting of the class (Guerrettaz et al., 2021; van Lier, 2004). Research in the field has mapped learners and pedagogical practices associated with Chinese-speaking educational settings (Gong et al., 2020b; Ma et al., 2017). Postmethod and localist scholarship already argues that pedagogy should answer to a particular group and place (Canagarajah, 2005; Kumaravadivelu, 2001), and recent articles in this journal treat curriculum as lived practice and publish student questionnaires on how courses are experienced (Lam, 2024; Shan &amp; Xu, 2024; Zhang &amp; Pladevall-Ballester, 2021). These approaches remain necessary. They do not, by themselves, tell us whether the institutional arrangements of online Chinese teaching—its time, platforms, tasks, participation mode, and assessment—remain feasible where learners participate.</w:t>
+        <w:t xml:space="preserve"> </w:t>
+      </w:r>
+      <w:r>
+        <w:t xml:space="preserve">(Gong et al., 2020b; Lu et al., 2024; Ma et al., 2017; McDonough &amp; Shaw, 2003; Tomlinson, 2011; Zhao, 2020). Language, culture, and curriculum meet in the setting of the class as well as in the textbook (Guerrettaz et al., 2021; van Lier, 2004). Student questionnaires in this journal already treat curriculum as something learners experience, not only something programmes announce (Lam, 2024; Shan &amp; Xu, 2024; Zhang &amp; Pladevall-Ballester, 2021). That is the professional move this study makes. A Chinese-language questionnaire asked a self-selected group of respondents reporting participation in online Chinese-language courses what household, connectivity, and platform-access conditions they faced, and how those conditions sat alongside stress and appraisals of online learning. The instrument cannot show how institutions adapted time, platform, task, participation mode, or assessment. It can show the learner-side conditions against which those arrangements have to be judged.</w:t>
       </w:r>
     </w:p>
     <w:p>
@@ -310,7 +310,7 @@
         <w:pStyle w:val="BodyText"/>
       </w:pPr>
       <w:r>
-        <w:t xml:space="preserve">The questionnaire cannot show how institutions adapted time, platform, task, participation mode, or assessment. It can show the learner-side conditions of household infrastructure and platform access, and how those conditions sat alongside stress and appraisals of online learning.</w:t>
+        <w:t xml:space="preserve">The analysis draws on 38 complete responses collected during emergency remote teaching. Thirty-seven respondents selected Pakistani nationality, while one selected another nationality. Nationality is the only Pakistan connection established in the dataset; residence, recruitment pathway, institutional affiliation, programme status, and physical location were not verified. Literature on Pakistani educational mobility and on university e-learning and digital access in Pakistan is therefore used only as contextual background for the nationality reported by most respondents (Butt &amp; Sadaf, 2026; Jamil &amp; Muschert, 2023; Raza &amp; Hennessy, 2025; Tu, 2026). Twenty-seven respondents (71.1%) reported taking required courses online, while 23 (60.5%) reported taking elective courses online. The findings from this self-selected group are treated as exploratory rather than representative. Much of the research on international students of Chinese has examined learners already on a Chinese campus (Gao &amp; Hua, 2021; Gong et al., 2020a); this sample cannot be read as that population.</w:t>
       </w:r>
     </w:p>
     <w:p>
@@ -318,47 +318,7 @@
         <w:pStyle w:val="BodyText"/>
       </w:pPr>
       <w:r>
-        <w:t xml:space="preserve">Emergency remote teaching during COVID-19 is when this problem became urgent; it is not the theoretical centre of the argument (Hodges et al., 2020). When language programmes were shifted to videoconferencing, researchers documented thinner interaction, technical disruption, and the sudden visibility of domestic life during lessons (Gacs et al., 2020; MacIntyre et al., 2020; Moser et al., 2021; Tao &amp; Gao, 2022). Drawing on that literature (Gacs et al., 2020), this article uses</w:t>
-      </w:r>
-      <w:r>
-        <w:t xml:space="preserve"> </w:t>
-      </w:r>
-      <w:r>
-        <w:rPr>
-          <w:iCs/>
-          <w:i/>
-        </w:rPr>
-        <w:t xml:space="preserve">travelling course</w:t>
-      </w:r>
-      <w:r>
-        <w:t xml:space="preserve"> </w:t>
-      </w:r>
-      <w:r>
-        <w:t xml:space="preserve">for a course designed in one institutional setting and taught in another. Studies of Chinese-language emergency teaching said more about pedagogical adaptation on the sending side—for example, technology-based character instruction (Xu et al., 2022)—than about whether online Chinese teaching remained feasible for learners under different household and technological conditions.</w:t>
-      </w:r>
-    </w:p>
-    <w:p>
-      <w:pPr>
-        <w:pStyle w:val="BodyText"/>
-      </w:pPr>
-      <w:r>
-        <w:t xml:space="preserve">The questionnaire is read through later lenses, not as a pandemic story for its own sake. After the return to campus, research on technological normalisation asked what should remain of emergency online practice (Moorhouse, 2023; Moorhouse, Wong, &amp; Li, 2023) and warned against treating a videoconference copy of the classroom as the main lesson of the crisis (Stockwell &amp; Wang, 2023). Reviews of online ICLE still list technical problems, weak interaction, and time-zone difficulty (Li &amp; Li, 2024). Designed online Chinese-culture courses show what planned online teaching can look like (Guenier et al., 2026), and this journal has already treated learner emotion in Chinese as an additional language (Wen &amp; Liu, 2025). Those studies do not describe the present respondents. They supply the conceptual lenses through which the problem of online Chinese teaching is now examined: delivery-context fit is a curriculum question, not only an emergency inconvenience.</w:t>
-      </w:r>
-    </w:p>
-    <w:p>
-      <w:pPr>
-        <w:pStyle w:val="BodyText"/>
-      </w:pPr>
-      <w:r>
-        <w:t xml:space="preserve">The analysis draws on a convenience sample of 38 self-selected respondents to a Chinese-language questionnaire about online Chinese learning, completed during emergency remote teaching. Thirty-seven respondents selected Pakistani nationality, while one selected another nationality. Nationality is the only Pakistan connection established in the dataset; residence, recruitment pathway, institutional affiliation, programme status, and physical location were not verified. Literature on Pakistani educational mobility and university e-learning during COVID-19 is therefore used only as contextual background for the nationality reported by most respondents (Jamil &amp; Muschert, 2023; Tu, 2026). Twenty-seven respondents (71.1%) reported taking required courses online, while 23 (60.5%) reported taking elective courses online. The findings from this self-selected group are treated as exploratory rather than representative. Much of the research on international students of Chinese has examined learners already on a Chinese campus (Gao &amp; Hua, 2021; Gong et al., 2020a); this sample cannot be read as that population.</w:t>
-      </w:r>
-    </w:p>
-    <w:p>
-      <w:pPr>
-        <w:pStyle w:val="BodyText"/>
-      </w:pPr>
-      <w:r>
-        <w:t xml:space="preserve">What the article answers, then, is not whether institutions solved the problem of online Chinese teaching, and not whether later hybrid practice has solved it. It answers the purpose above through three questions about this sample:</w:t>
+        <w:t xml:space="preserve">The article does not ask whether institutions later solved the problem of online Chinese teaching, and it does not ask whether current hybrid practice has solved it. It asks whether the delivery problem is visible as learner-side conditions in this sample:</w:t>
       </w:r>
     </w:p>
     <w:p>
@@ -420,7 +380,7 @@
         <w:pStyle w:val="FirstParagraph"/>
       </w:pPr>
       <w:r>
-        <w:t xml:space="preserve">Those answers are used to show that the problem of online Chinese teaching is, in this sample, a delivery problem: content and materials work cannot settle it on their own. Counts are used descriptively. Associations are explored with Fisher’s exact tests and Spearman rank correlations and are not read as confirmatory tests of population-level relationships. Section 2 locates the study in later work on online language teaching and online ICLE, and in digital inequality and home learning ecologies. Section 3 reports when and how the questionnaire was completed. Sections 4 and 5 report and discuss the findings, and the final sections set out implications, limitations, and the article’s answer.</w:t>
+        <w:t xml:space="preserve">Those answers are used to establish that, in this sample, online Chinese teaching is a delivery problem: content and materials work cannot settle it on their own. Counts are used descriptively. Associations are explored with Fisher’s exact tests and Spearman rank correlations and are not read as confirmatory tests of population-level relationships. Section 2 locates the study in later work on online language teaching and online ICLE, and in digital inequality and home learning ecologies. Section 3 reports when and how the questionnaire was completed. Sections 4 and 5 report and discuss the findings, and the final sections set out implications, limitations, and the article’s answer.</w:t>
       </w:r>
     </w:p>
     <w:bookmarkEnd w:id="21"/>
@@ -473,7 +433,7 @@
         <w:t xml:space="preserve"> </w:t>
       </w:r>
       <w:r>
-        <w:t xml:space="preserve">and early platform trials (Xia et al., 2022; Zhang et al., 2020). That writing already listed the same cluster of difficulties that still organise this article: networks, platforms, interaction, and learner affect. Xu et al. (2022) show how character teaching was adapted on the sending side. Jin et al. (2023) report world-language faculty perceptions of pandemic online teaching. Zhang and Liu (2023) examine online collaborative writing among Chinese-language learners in designed synchronous and asynchronous conditions, which is planned online work rather than a copy of the campus hour. What makes those findings still usable is the later ICLE writing: reviews of online teaching models continue to list technical problems, weak interaction, and time-zone difficulty (Li &amp; Li, 2024); designed online Chinese-culture courses show a planned alternative to emergency copying (Guenier et al., 2026); and learner emotion in Chinese as an additional language is already a topic in this journal (Wen &amp; Liu, 2025). Much of that writing still assumes a relatively stable connection. The present questionnaire cannot test whether that assumption holds for current hybrid ICLE. It can show, under the later lens of delivery-context fit, what 38 respondents reported when online Chinese teaching asked them to join a travelling course.</w:t>
+        <w:t xml:space="preserve">and early platform trials (Xia et al., 2022; Zhang et al., 2020). That writing already listed the same cluster of difficulties that still organise this article: networks, platforms, interaction, and learner affect. Xu et al. (2022) show how character teaching was adapted on the sending side. Jin et al. (2023) report world-language faculty perceptions of pandemic online teaching. Zhang and Liu (2023) examine online collaborative writing among Chinese-language learners in designed synchronous and asynchronous conditions, which is planned online work rather than a copy of the campus hour. Later reviews of technology in Chinese as a foreign language map acceptance, collaboration, and teacher knowledge more often than household access (Xu, 2024), and a review of digital transformation in the same field still flags digital equity as under-examined (Zhang &amp; Osborne, 2026). Reviews of online teaching models continue to list technical problems, weak interaction, and time-zone difficulty (Li &amp; Li, 2024). Designed online Chinese-culture courses show a planned alternative to emergency copying (Guenier et al., 2026). Learner emotion in Chinese as an additional language is already a topic in this journal (Wen &amp; Liu, 2025), and Qi (2025) shows that an online Chinese class can itself become an anxiety-provoking setting. Those studies do not describe the present respondents or the present stress item. They supply the later lenses. Much of that writing still assumes a relatively stable connection. The present questionnaire cannot test whether that assumption holds for current hybrid ICLE. It can show, under the later lens of delivery-context fit, what 38 respondents reported when online Chinese teaching asked them to join a travelling course.</w:t>
       </w:r>
     </w:p>
     <w:bookmarkEnd w:id="22"/>
@@ -491,7 +451,7 @@
         <w:pStyle w:val="FirstParagraph"/>
       </w:pPr>
       <w:r>
-        <w:t xml:space="preserve">Later models of the digital divide distinguish motivational, material, skills, usage, and outcome access (Helsper, 2021; van Dijk, 2020; Warschauer, 2003). Owning a device is not the same as being able to take part (Ali, 2020; Beaunoyer et al., 2020). Guo and Wan (2022) document that divide in online learning in China. Interview research on Pakistani university e-learning during COVID-19 found uneven first-level access (internet and devices) and second-level skills, with rural and less-resourced students more exposed (Jamil &amp; Muschert, 2023). Household use of educational technology is also shaped by device sharing, care work, and electricity (Raza &amp; Hennessy, 2025). The latter source is a grey-literature report, and neither study is treated as evidence about the 38 respondents here; both are cited only as background for the nationality most of them reported.</w:t>
+        <w:t xml:space="preserve">Later models of the digital divide distinguish motivational, material, skills, usage, and outcome access (Helsper, 2021; van Dijk, 2020; Warschauer, 2003). Owning a device is not the same as being able to take part (Ali, 2020; Beaunoyer et al., 2020). Guo and Wan (2022) document that divide in online learning in China. Vishnu et al. (2024) treat digital infrastructure as a condition of higher-education online learning after the emergency period, not as a temporary inconvenience. Interview research on Pakistani university e-learning during COVID-19 found uneven first-level access (internet and devices) and second-level skills, with rural and less-resourced students more exposed (Jamil &amp; Muschert, 2023). Later survey work continues to report uneven access and skills among Pakistani university students (Butt &amp; Sadaf, 2026). Household use of educational technology is also shaped by device sharing, care work, and electricity (Raza &amp; Hennessy, 2025). The last of those sources is a grey-literature report. None of them is treated as evidence about the 38 respondents here; they are cited only as background for the nationality most of them reported.</w:t>
       </w:r>
     </w:p>
     <w:p>
@@ -3699,6 +3659,27 @@
         <w:pStyle w:val="BodyText"/>
       </w:pPr>
       <w:r>
+        <w:t xml:space="preserve">Butt, A., &amp; Sadaf, M. (2026). Getting around the digital horizon: Recognizing multifaceted digital divide among university students in Pakistan.</w:t>
+      </w:r>
+      <w:r>
+        <w:t xml:space="preserve"> </w:t>
+      </w:r>
+      <w:r>
+        <w:rPr>
+          <w:iCs/>
+          <w:i/>
+        </w:rPr>
+        <w:t xml:space="preserve">Journal of the Knowledge Economy, 17</w:t>
+      </w:r>
+      <w:r>
+        <w:t xml:space="preserve">(4), 9567-9590. https://doi.org/10.1007/s13132-026-03164-7</w:t>
+      </w:r>
+    </w:p>
+    <w:p>
+      <w:pPr>
+        <w:pStyle w:val="BodyText"/>
+      </w:pPr>
+      <w:r>
         <w:t xml:space="preserve">Canagarajah, A. S. (Ed.). (2005).</w:t>
       </w:r>
       <w:r>
@@ -4248,6 +4229,42 @@
         <w:pStyle w:val="BodyText"/>
       </w:pPr>
       <w:r>
+        <w:t xml:space="preserve">Qi, X. (2025).</w:t>
+      </w:r>
+      <w:r>
+        <w:t xml:space="preserve"> </w:t>
+      </w:r>
+      <w:r>
+        <w:t xml:space="preserve">‘</w:t>
+      </w:r>
+      <w:r>
+        <w:t xml:space="preserve">My speech becomes just a voice, a picture</w:t>
+      </w:r>
+      <w:r>
+        <w:t xml:space="preserve">’</w:t>
+      </w:r>
+      <w:r>
+        <w:t xml:space="preserve">: Exploring language anxiety in Chinese as a second language learning in online environments.</w:t>
+      </w:r>
+      <w:r>
+        <w:t xml:space="preserve"> </w:t>
+      </w:r>
+      <w:r>
+        <w:rPr>
+          <w:iCs/>
+          <w:i/>
+        </w:rPr>
+        <w:t xml:space="preserve">Language Teaching Research</w:t>
+      </w:r>
+      <w:r>
+        <w:t xml:space="preserve">. Advance online publication. https://doi.org/10.1177/13621688251387320</w:t>
+      </w:r>
+    </w:p>
+    <w:p>
+      <w:pPr>
+        <w:pStyle w:val="BodyText"/>
+      </w:pPr>
+      <w:r>
         <w:t xml:space="preserve">Raza, O., &amp; Hennessy, S. (2025).</w:t>
       </w:r>
       <w:r>
@@ -4458,6 +4475,27 @@
         <w:pStyle w:val="BodyText"/>
       </w:pPr>
       <w:r>
+        <w:t xml:space="preserve">Vishnu, S., Tengli, M. B., Ramadas, S., Sathyan, A. R., &amp; Bhatt, A. (2024). Bridging the divide: Assessing digital infrastructure for higher education online learning.</w:t>
+      </w:r>
+      <w:r>
+        <w:t xml:space="preserve"> </w:t>
+      </w:r>
+      <w:r>
+        <w:rPr>
+          <w:iCs/>
+          <w:i/>
+        </w:rPr>
+        <w:t xml:space="preserve">TechTrends, 68</w:t>
+      </w:r>
+      <w:r>
+        <w:t xml:space="preserve">(6), 1107-1116. https://doi.org/10.1007/s11528-024-00997-4</w:t>
+      </w:r>
+    </w:p>
+    <w:p>
+      <w:pPr>
+        <w:pStyle w:val="BodyText"/>
+      </w:pPr>
+      <w:r>
         <w:t xml:space="preserve">Warschauer, M. (2003).</w:t>
       </w:r>
       <w:r>
@@ -4542,6 +4580,27 @@
         <w:pStyle w:val="BodyText"/>
       </w:pPr>
       <w:r>
+        <w:t xml:space="preserve">Xu, B. (2024). Technology integration into Chinese as a foreign language learning in higher education: An integrated bibliometric analysis and systematic review (2000–2024).</w:t>
+      </w:r>
+      <w:r>
+        <w:t xml:space="preserve"> </w:t>
+      </w:r>
+      <w:r>
+        <w:rPr>
+          <w:iCs/>
+          <w:i/>
+        </w:rPr>
+        <w:t xml:space="preserve">Language Teaching Research</w:t>
+      </w:r>
+      <w:r>
+        <w:t xml:space="preserve">. Advance online publication. https://doi.org/10.1177/13621688241277911</w:t>
+      </w:r>
+    </w:p>
+    <w:p>
+      <w:pPr>
+        <w:pStyle w:val="BodyText"/>
+      </w:pPr>
+      <w:r>
         <w:t xml:space="preserve">Xu, Y., Jin, L., Deifell, E., &amp; Angus, K. (2022). Facilitating technology-based character learning in emergency remote teaching.</w:t>
       </w:r>
       <w:r>
@@ -4598,6 +4657,27 @@
       </w:r>
       <w:r>
         <w:t xml:space="preserve">(2), 200-216. https://doi.org/10.1080/07908318.2021.1979576</w:t>
+      </w:r>
+    </w:p>
+    <w:p>
+      <w:pPr>
+        <w:pStyle w:val="BodyText"/>
+      </w:pPr>
+      <w:r>
+        <w:t xml:space="preserve">Zhang, Q., &amp; Osborne, C. (2026). Readiness for digital transformation in Chinese as a foreign language education: A semi-systematic review.</w:t>
+      </w:r>
+      <w:r>
+        <w:t xml:space="preserve"> </w:t>
+      </w:r>
+      <w:r>
+        <w:rPr>
+          <w:iCs/>
+          <w:i/>
+        </w:rPr>
+        <w:t xml:space="preserve">Chinese as a Second Language Research, 15</w:t>
+      </w:r>
+      <w:r>
+        <w:t xml:space="preserve">(1), 11-43. https://doi.org/10.1515/caslar-2026-2002</w:t>
       </w:r>
     </w:p>
     <w:p>

</xml_diff>

<commit_message>
Rewrite the introduction as a critical argument for the delivery problem
The opening now states that the problem is real, explains why naming it is not the same as studying it, and presents the questionnaire as the empirical response. Sample caveats are shortened so the research questions follow the argument.

Co-authored-by: kristinehina23-rgb <kristinehina23-rgb@users.noreply.github.com>
</commit_message>
<xml_diff>
--- a/papers/q1-masters-covid/word/Rathore-Cao-Xu-When-Chinese-class-moved-home.docx
+++ b/papers/q1-masters-covid/word/Rathore-Cao-Xu-When-Chinese-class-moved-home.docx
@@ -169,7 +169,7 @@
         <w:pStyle w:val="FirstParagraph"/>
       </w:pPr>
       <w:r>
-        <w:t xml:space="preserve">This article examines a delivery problem in online Chinese teaching: a course may remain appropriate in content and still be difficult to take if its timetable, platforms, oral tasks, and assessment do not fit the conditions in which learners participate. A Chinese-language questionnaire asked 38 self-selected respondents—37 of whom selected Pakistani nationality—what household, connectivity, and platform-access conditions they faced, and how those conditions sat alongside stress and appraisals of online learning. The responses are read through later work on technological normalisation, online ICLE, and designed online Chinese teaching. Unstable networks (76.3%) and power interruptions (42.1%) were commonly reported, and 36.8% selected</w:t>
+        <w:t xml:space="preserve">This article examines a delivery problem in online Chinese teaching: a course may remain appropriate in content and still be a course learners cannot take if its timetable, platforms, oral tasks, and assessment do not fit the conditions in which they participate. To treat that problem as a research question rather than as an emergency inconvenience, a Chinese-language questionnaire asked 38 self-selected respondents—37 of whom selected Pakistani nationality—what household, connectivity, and platform-access conditions they faced, and how those conditions sat alongside stress and appraisals of online learning. The responses are read through later work on technological normalisation, online ICLE, and designed online Chinese teaching. Unstable networks (76.3%) and power interruptions (42.1%) were commonly reported, and 36.8% selected</w:t>
       </w:r>
       <w:r>
         <w:t xml:space="preserve"> </w:t>
@@ -244,7 +244,7 @@
         <w:pStyle w:val="FirstParagraph"/>
       </w:pPr>
       <w:r>
-        <w:t xml:space="preserve">An online Chinese course can keep its original hours, platforms, oral tasks, and assessment, and still be a course learners cannot take. When language teaching is moved online, programmes commonly retain the timetable and classroom tasks of the sending class (Gacs et al., 2020; Hodges et al., 2020; Stockwell &amp; Wang, 2023). Guides to online language work still assume that learners can join a live or collaborative session (González-Lloret, 2020; Payne, 2020). That assumption does not hold where networks are unstable, required platforms are hard to open, interaction thins out, or learners are under strain (Li &amp; Li, 2024; Moser et al., 2021; Qi, 2025; Russell, 2020; Tao &amp; Gao, 2022). Digital-inequality research has already shown that owning a device is not the same as being able to take part: household internet, shared equipment, and electricity interruptions close online classes even when the materials remain available (Ali, 2020; Beaunoyer et al., 2020; Guo &amp; Wan, 2022; Vishnu et al., 2024; Warschauer, 2003). Distance language learning had raised the same feasibility question before the pandemic (White, 2006). If household power, network speed, or platform access does not support the required class, the content may remain appropriate while the class is closed. That is a delivery problem, not a content problem.</w:t>
+        <w:t xml:space="preserve">The problem this article addresses is real. An online Chinese course can keep its hours, platforms, oral tasks, and assessment, and still be a course learners cannot take. Online language programmes commonly retain the timetable and classroom tasks of the sending class, and task guides still assume that learners can join a live or collaborative session (Gacs et al., 2020; González-Lloret, 2020; Hodges et al., 2020; Payne, 2020; Stockwell &amp; Wang, 2023). That assumption is already known to fail. Research on online language teaching, and on online international Chinese teaching, has documented unstable networks, platforms that are hard to open, thinner interaction, and learner strain (Li &amp; Li, 2024; Moser et al., 2021; Qi, 2025; Russell, 2020; Tao &amp; Gao, 2022). From the household side, owning a device is not participation when power, speed, or a usable application is missing (Ali, 2020; Beaunoyer et al., 2020; Guo &amp; Wan, 2022; Vishnu et al., 2024; Warschauer, 2003). Distance language learning had already asked whether a remote class was feasible (White, 2006). If household power, network speed, or platform access does not support the required class, the content may remain appropriate while the class is closed. That is a delivery problem, not a content problem.</w:t>
       </w:r>
     </w:p>
     <w:p>
@@ -252,7 +252,7 @@
         <w:pStyle w:val="BodyText"/>
       </w:pPr>
       <w:r>
-        <w:t xml:space="preserve">The difficulty is not that the field has never named these failures. It is that it has usually treated them as background to something else. Emergency remote teaching made the problem urgent, but much of that writing documented teacher workload, sending-side pedagogical adaptation, or a videoconference copy of the campus hour (MacIntyre et al., 2020; Moser et al., 2021; Xu et al., 2022). Later work on technological normalisation asked what should remain of emergency practice and warned against treating that copy as the lesson of the crisis (Moorhouse, 2023; Moorhouse, Wong, &amp; Li, 2023; Stockwell &amp; Wang, 2023). Reviews of online international Chinese teaching, and of technology in Chinese as a foreign language, still list technical trouble and still leave digital equity and household access under-examined (Li &amp; Li, 2024; Xu, 2024; Zhang &amp; Osborne, 2026). Designed online courses and studies of learner emotion show what planned online Chinese teaching can look like (Guenier et al., 2026; Qi, 2025; Wen &amp; Liu, 2025). They do not tell us whether a</w:t>
+        <w:t xml:space="preserve">The field has named this failure more often than it has taken it as the object of study. Emergency remote teaching made the problem urgent, but much of that writing used it as a setting for teacher workload, sending-side pedagogical adaptation, or a videoconference copy of the campus hour (MacIntyre et al., 2020; Moser et al., 2021; Xu et al., 2022). Later work asked what should remain of emergency practice and warned against treating that copy as the lesson of the crisis (Moorhouse, 2023; Moorhouse, Wong, &amp; Li, 2023; Stockwell &amp; Wang, 2023). Reviews of online international Chinese teaching, and of technology in Chinese as a foreign language, still list technical trouble and still leave household access and digital equity under-examined (Li &amp; Li, 2024; Xu, 2024; Zhang &amp; Osborne, 2026). Designed online courses and studies of learner emotion show what planned online Chinese teaching can look like (Guenier et al., 2026; Qi, 2025; Wen &amp; Liu, 2025). They do not show whether a</w:t>
       </w:r>
       <w:r>
         <w:t xml:space="preserve"> </w:t>
@@ -265,15 +265,7 @@
         <w:t xml:space="preserve">travelling course</w:t>
       </w:r>
       <w:r>
-        <w:t xml:space="preserve">—this article’s term, from Gacs et al. (2020), for a course designed in one institutional setting and taught in another—remained feasible where learners actually sat. Time-zone difference and the absence of a Chinese-speaking environment have also been listed as field problems. The present questionnaire did not measure them, so they are left aside. The study also does not treat respondents as students who had returned home or who were unable to re-enter campus. Those were common emergency-period situations; they are not established facts in this dataset.</w:t>
-      </w:r>
-    </w:p>
-    <w:p>
-      <w:pPr>
-        <w:pStyle w:val="BodyText"/>
-      </w:pPr>
-      <w:r>
-        <w:t xml:space="preserve">What is missing, then, is not another map of online-teaching models. It is learner-side evidence on the conditions that decide whether the class can be taken at all. International Chinese language education has said more about what a course</w:t>
+        <w:t xml:space="preserve">—this article’s term, from Gacs et al. (2020), for a course designed in one institutional setting and taught in another—could still be taken where learners sat. International Chinese language education has said more about what a course</w:t>
       </w:r>
       <w:r>
         <w:t xml:space="preserve"> </w:t>
@@ -302,7 +294,7 @@
         <w:t xml:space="preserve"> </w:t>
       </w:r>
       <w:r>
-        <w:t xml:space="preserve">(Gong et al., 2020b; Lu et al., 2024; Ma et al., 2017; McDonough &amp; Shaw, 2003; Tomlinson, 2011; Zhao, 2020). Language, culture, and curriculum meet in the setting of the class as well as in the textbook (Guerrettaz et al., 2021; van Lier, 2004). Student questionnaires in this journal already treat curriculum as something learners experience, not only something programmes announce (Lam, 2024; Shan &amp; Xu, 2024; Zhang &amp; Pladevall-Ballester, 2021). That is the professional move this study makes. A Chinese-language questionnaire asked a self-selected group of respondents reporting participation in online Chinese-language courses what household, connectivity, and platform-access conditions they faced, and how those conditions sat alongside stress and appraisals of online learning. The instrument cannot show how institutions adapted time, platform, task, participation mode, or assessment. It can show the learner-side conditions against which those arrangements have to be judged.</w:t>
+        <w:t xml:space="preserve">(Gong et al., 2020b; Lu et al., 2024; Ma et al., 2017; McDonough &amp; Shaw, 2003; Tomlinson, 2011; Zhao, 2020). Listing the difficulty is not the same as measuring the conditions that produce it.</w:t>
       </w:r>
     </w:p>
     <w:p>
@@ -310,7 +302,7 @@
         <w:pStyle w:val="BodyText"/>
       </w:pPr>
       <w:r>
-        <w:t xml:space="preserve">The analysis draws on 38 complete responses collected during emergency remote teaching. Thirty-seven respondents selected Pakistani nationality, while one selected another nationality. Nationality is the only Pakistan connection established in the dataset; residence, recruitment pathway, institutional affiliation, programme status, and physical location were not verified. Literature on Pakistani educational mobility and on university e-learning and digital access in Pakistan is therefore used only as contextual background for the nationality reported by most respondents (Butt &amp; Sadaf, 2026; Jamil &amp; Muschert, 2023; Raza &amp; Hennessy, 2025; Tu, 2026). Twenty-seven respondents (71.1%) reported taking required courses online, while 23 (60.5%) reported taking elective courses online. The findings from this self-selected group are treated as exploratory rather than representative. Much of the research on international students of Chinese has examined learners already on a Chinese campus (Gao &amp; Hua, 2021; Gong et al., 2020a); this sample cannot be read as that population.</w:t>
+        <w:t xml:space="preserve">To treat the problem as a research problem, rather than as an emergency inconvenience, this study collected a Chinese-language questionnaire on the learner-side conditions that decide whether the class can be entered at all. Language, culture, and curriculum meet in the setting of the class as well as in the textbook (Guerrettaz et al., 2021; van Lier, 2004). Student questionnaires in this journal already treat curriculum as something learners experience, not only something programmes announce (Lam, 2024; Shan &amp; Xu, 2024; Zhang &amp; Pladevall-Ballester, 2021). The same move is required here. A self-selected group of respondents reporting participation in online Chinese-language courses was asked what household, connectivity, and platform-access conditions they faced, and how those conditions sat alongside stress and appraisals of online learning. The instrument cannot show how institutions adapted time, platform, task, participation mode, or assessment. It can show the conditions against which those arrangements have to be judged. Time-zone difference and the absence of a Chinese-speaking environment have also been listed as field problems; they were not measured, so they are left aside. Respondents are not treated as students who had returned home or who were unable to re-enter campus. Those were common emergency-period situations; they are not established facts in this dataset.</w:t>
       </w:r>
     </w:p>
     <w:p>
@@ -318,7 +310,7 @@
         <w:pStyle w:val="BodyText"/>
       </w:pPr>
       <w:r>
-        <w:t xml:space="preserve">The article does not ask whether institutions later solved the problem of online Chinese teaching, and it does not ask whether current hybrid practice has solved it. It asks whether the delivery problem is visible as learner-side conditions in this sample:</w:t>
+        <w:t xml:space="preserve">Thirty-eight complete responses were collected during emergency remote teaching. Thirty-seven respondents selected Pakistani nationality. Nationality is the only Pakistan connection in the dataset; residence, recruitment pathway, institutional affiliation, programme status, and physical location were not verified. Literature on Pakistani educational mobility and university e-learning is used only as background for that reported nationality (Butt &amp; Sadaf, 2026; Jamil &amp; Muschert, 2023; Raza &amp; Hennessy, 2025; Tu, 2026). The group is not a verified campus population (Gao &amp; Hua, 2021; Gong et al., 2020a), and the findings are exploratory. The article does not ask whether later hybrid practice has closed the gap. It asks whether the delivery problem is visible as learner-side conditions in this sample:</w:t>
       </w:r>
     </w:p>
     <w:p>

</xml_diff>

<commit_message>
Retarget the manuscript to Foreign Language Annals patterns
Follow FLA/ACTFL/Wiley submission practice: Challenge statement, ~150-word abstract, Methods, pedagogical implications, APA, American English, and a cover letter to the FLA editors. Stop positioning the paper as an LCC submission.

Co-authored-by: kristinehina23-rgb <kristinehina23-rgb@users.noreply.github.com>
</commit_message>
<xml_diff>
--- a/papers/q1-masters-covid/word/Rathore-Cao-Xu-When-Chinese-class-moved-home.docx
+++ b/papers/q1-masters-covid/word/Rathore-Cao-Xu-When-Chinese-class-moved-home.docx
@@ -2,7 +2,7 @@
 <file path=word/document.xml><?xml version="1.0" encoding="utf-8"?>
 <w:document xmlns:w="http://schemas.openxmlformats.org/wordprocessingml/2006/main" xmlns:m="http://schemas.openxmlformats.org/officeDocument/2006/math" xmlns:r="http://schemas.openxmlformats.org/officeDocument/2006/relationships" xmlns:o="urn:schemas-microsoft-com:office:office" xmlns:v="urn:schemas-microsoft-com:vml" xmlns:w10="urn:schemas-microsoft-com:office:word" xmlns:a="http://schemas.openxmlformats.org/drawingml/2006/main" xmlns:pic="http://schemas.openxmlformats.org/drawingml/2006/picture" xmlns:wp="http://schemas.openxmlformats.org/drawingml/2006/wordprocessingDrawing">
   <w:body>
-    <w:bookmarkStart w:id="45" w:name="Xc2030a6abbb01e5f8d1dabdee28fe1e01100d80"/>
+    <w:bookmarkStart w:id="46" w:name="Xc2030a6abbb01e5f8d1dabdee28fe1e01100d80"/>
     <w:p>
       <w:pPr>
         <w:pStyle w:val="Heading1"/>
@@ -92,7 +92,7 @@
           <w:bCs/>
           <w:b/>
         </w:rPr>
-        <w:t xml:space="preserve">Acknowledgements.</w:t>
+        <w:t xml:space="preserve">Acknowledgments.</w:t>
       </w:r>
       <w:r>
         <w:t xml:space="preserve"> </w:t>
@@ -110,13 +110,13 @@
           <w:bCs/>
           <w:b/>
         </w:rPr>
-        <w:t xml:space="preserve">Disclosure statement.</w:t>
+        <w:t xml:space="preserve">Conflict of interest.</w:t>
       </w:r>
       <w:r>
         <w:t xml:space="preserve"> </w:t>
       </w:r>
       <w:r>
-        <w:t xml:space="preserve">No potential conflict of interest was reported by the authors.</w:t>
+        <w:t xml:space="preserve">The authors declare no conflict of interest.</w:t>
       </w:r>
     </w:p>
     <w:p>
@@ -169,7 +169,7 @@
         <w:pStyle w:val="FirstParagraph"/>
       </w:pPr>
       <w:r>
-        <w:t xml:space="preserve">This article examines a delivery problem in online Chinese teaching: a course may remain appropriate in content and still be a course learners cannot take if its timetable, platforms, oral tasks, and assessment do not fit the conditions in which they participate. To treat that problem as a research question rather than as an emergency inconvenience, a Chinese-language questionnaire asked 38 self-selected respondents—37 of whom selected Pakistani nationality—what household, connectivity, and platform-access conditions they faced, and how those conditions sat alongside stress and appraisals of online learning. The responses are read through later work on technological normalisation, online ICLE, and designed online Chinese teaching. Unstable networks (76.3%) and power interruptions (42.1%) were commonly reported, and 36.8% selected</w:t>
+        <w:t xml:space="preserve">This article examines a delivery problem in online Chinese teaching: content may remain appropriate while the class is closed if household power, network speed, or platform access does not support the required timetable, platforms, oral tasks, and assessment. A Chinese-language questionnaire asked 38 self-selected respondents (37 selected Pakistani nationality) about those conditions, stress, and appraisals of online learning. Unstable networks (76.3%) and power interruptions (42.1%) were common; 36.8% selected</w:t>
       </w:r>
       <w:r>
         <w:t xml:space="preserve"> </w:t>
@@ -187,7 +187,7 @@
         <w:t xml:space="preserve"> </w:t>
       </w:r>
       <w:r>
-        <w:t xml:space="preserve">Those who said home conditions affected study</w:t>
+        <w:t xml:space="preserve">Home affecting study</w:t>
       </w:r>
       <w:r>
         <w:t xml:space="preserve"> </w:t>
@@ -205,10 +205,10 @@
         <w:t xml:space="preserve"> </w:t>
       </w:r>
       <w:r>
-        <w:t xml:space="preserve">more often selected that category (11/14 versus 3/24; Fisher’s exact (p = .00008)). Worse reported internet speed was associated with a more negative appraisal of online learning ((</w:t>
-      </w:r>
-      <w:r>
-        <w:t xml:space="preserve">= .65), 95% bootstrap CI ([.36, .84])). QQ and Chaoxing were frequently marked unusable; Zoom and WhatsApp were more often marked available. In this sample, online Chinese teaching was a delivery problem. The results are exploratory and are not read as evidence of current hybrid practice.</w:t>
+        <w:t xml:space="preserve">co-occurred with that category (11/14 versus 3/24; Fisher’s exact (p = .00008)). Worse reported internet speed was associated with a more negative appraisal ((</w:t>
+      </w:r>
+      <w:r>
+        <w:t xml:space="preserve">= .65), 95% bootstrap CI ([.36, .84])). QQ and Chaoxing were often marked unusable; Zoom and WhatsApp were more often marked available. Time, platform, task, and assessment therefore have to be judged against learner-side conditions. The results are exploratory and are not evidence of current hybrid practice.</w:t>
       </w:r>
     </w:p>
     <w:p>
@@ -226,17 +226,17 @@
         <w:t xml:space="preserve"> </w:t>
       </w:r>
       <w:r>
-        <w:t xml:space="preserve">online Chinese teaching; household infrastructure; platform access; digital inequality; emergency remote teaching; Pakistan</w:t>
+        <w:t xml:space="preserve">Chinese; online language teaching; household infrastructure; platform access; emergency remote teaching</w:t>
       </w:r>
     </w:p>
     <w:bookmarkEnd w:id="20"/>
-    <w:bookmarkStart w:id="21" w:name="introduction"/>
+    <w:bookmarkStart w:id="21" w:name="the-challenge"/>
     <w:p>
       <w:pPr>
         <w:pStyle w:val="Heading2"/>
       </w:pPr>
       <w:r>
-        <w:t xml:space="preserve">1. Introduction</w:t>
+        <w:t xml:space="preserve">The Challenge</w:t>
       </w:r>
     </w:p>
     <w:p>
@@ -244,7 +244,25 @@
         <w:pStyle w:val="FirstParagraph"/>
       </w:pPr>
       <w:r>
-        <w:t xml:space="preserve">The problem this article addresses is real. An online Chinese course can keep its hours, platforms, oral tasks, and assessment, and still be a course learners cannot take. Online language programmes commonly retain the timetable and classroom tasks of the sending class, and task guides still assume that learners can join a live or collaborative session (Gacs et al., 2020; González-Lloret, 2020; Hodges et al., 2020; Payne, 2020; Stockwell &amp; Wang, 2023). That assumption is already known to fail. Research on online language teaching, and on online international Chinese teaching, has documented unstable networks, platforms that are hard to open, thinner interaction, and learner strain (Li &amp; Li, 2024; Moser et al., 2021; Qi, 2025; Russell, 2020; Tao &amp; Gao, 2022). From the household side, owning a device is not participation when power, speed, or a usable application is missing (Ali, 2020; Beaunoyer et al., 2020; Guo &amp; Wan, 2022; Vishnu et al., 2024; Warschauer, 2003). Distance language learning had already asked whether a remote class was feasible (White, 2006). If household power, network speed, or platform access does not support the required class, the content may remain appropriate while the class is closed. That is a delivery problem, not a content problem.</w:t>
+        <w:t xml:space="preserve">An online Chinese course can keep its hours, platforms, oral tasks, and assessment, and still be a course learners cannot take. When household power, network speed, or a required application fails, content may remain appropriate while the class is closed. How should world-language programs treat that as a teaching problem rather than a technical inconvenience?</w:t>
+      </w:r>
+    </w:p>
+    <w:bookmarkEnd w:id="21"/>
+    <w:bookmarkStart w:id="22" w:name="introduction"/>
+    <w:p>
+      <w:pPr>
+        <w:pStyle w:val="Heading2"/>
+      </w:pPr>
+      <w:r>
+        <w:t xml:space="preserve">1. Introduction</w:t>
+      </w:r>
+    </w:p>
+    <w:p>
+      <w:pPr>
+        <w:pStyle w:val="FirstParagraph"/>
+      </w:pPr>
+      <w:r>
+        <w:t xml:space="preserve">The problem this article addresses is real. An online Chinese course can keep its hours, platforms, oral tasks, and assessment, and still be a course learners cannot take. Online language programs commonly retain the timetable and classroom tasks of the sending class, and task guides still assume that learners can join a live or collaborative session (Gacs et al., 2020; González-Lloret, 2020; Hodges et al., 2020; Payne, 2020; Stockwell &amp; Wang, 2023). That assumption is already known to fail. Research on online language teaching, and on online international Chinese teaching, has documented unstable networks, platforms that are hard to open, thinner interaction, and learner strain (Li &amp; Li, 2024; Moser et al., 2021; Qi, 2025; Russell, 2020; Tao &amp; Gao, 2022). From the household side, owning a device is not participation when power, speed, or a usable application is missing (Ali, 2020; Beaunoyer et al., 2020; Guo &amp; Wan, 2022; Vishnu et al., 2024; Warschauer, 2003). Distance language learning had already asked whether a remote class was feasible (White, 2006). If household power, network speed, or platform access does not support the required class, the content may remain appropriate while the class is closed. That is a delivery problem, not a content problem.</w:t>
       </w:r>
     </w:p>
     <w:p>
@@ -302,7 +320,7 @@
         <w:pStyle w:val="BodyText"/>
       </w:pPr>
       <w:r>
-        <w:t xml:space="preserve">To treat the problem as a research problem, rather than as an emergency inconvenience, this study collected a Chinese-language questionnaire on the learner-side conditions that decide whether the class can be entered at all. Language, culture, and curriculum meet in the setting of the class as well as in the textbook (Guerrettaz et al., 2021; van Lier, 2004). Student questionnaires in this journal already treat curriculum as something learners experience, not only something programmes announce (Lam, 2024; Shan &amp; Xu, 2024; Zhang &amp; Pladevall-Ballester, 2021). The same move is required here. A self-selected group of respondents reporting participation in online Chinese-language courses was asked what household, connectivity, and platform-access conditions they faced, and how those conditions sat alongside stress and appraisals of online learning. The instrument cannot show how institutions adapted time, platform, task, participation mode, or assessment. It can show the conditions against which those arrangements have to be judged. Time-zone difference and the absence of a Chinese-speaking environment have also been listed as field problems; they were not measured, so they are left aside. Respondents are not treated as students who had returned home or who were unable to re-enter campus. Those were common emergency-period situations; they are not established facts in this dataset.</w:t>
+        <w:t xml:space="preserve">To treat the problem as a research problem, rather than as an emergency inconvenience, this study collected a Chinese-language questionnaire on the learner-side conditions that decide whether the class can be entered at all. Empirical work in this journal has already treated online world-language teaching as a problem of access, task design, interaction, anxiety, and emergency adaptation, not only of content (Gacs et al., 2020; González-Lloret, 2020; Jin et al., 2023; Lomicka, 2020; Payne, 2020; Russell, 2020; Xu et al., 2022; Zhang &amp; Liu, 2023). The same move is required here for the conditions of a travelling Chinese course. A self-selected group of respondents reporting participation in online Chinese-language courses was asked what household, connectivity, and platform-access conditions they faced, and how those conditions sat alongside stress and appraisals of online learning. The instrument cannot show how institutions adapted time, platform, task, participation mode, or assessment. It can show the conditions against which those arrangements have to be judged. Time-zone difference and the absence of a Chinese-speaking environment have also been listed as field problems; they were not measured, so they are left aside. Respondents are not treated as students who had returned home or who were unable to re-enter campus. Those were common emergency-period situations; they are not established facts in this dataset.</w:t>
       </w:r>
     </w:p>
     <w:p>
@@ -310,7 +328,7 @@
         <w:pStyle w:val="BodyText"/>
       </w:pPr>
       <w:r>
-        <w:t xml:space="preserve">Thirty-eight complete responses were collected during emergency remote teaching. Thirty-seven respondents selected Pakistani nationality. Nationality is the only Pakistan connection in the dataset; residence, recruitment pathway, institutional affiliation, programme status, and physical location were not verified. Literature on Pakistani educational mobility and university e-learning is used only as background for that reported nationality (Butt &amp; Sadaf, 2026; Jamil &amp; Muschert, 2023; Raza &amp; Hennessy, 2025; Tu, 2026). The group is not a verified campus population (Gao &amp; Hua, 2021; Gong et al., 2020a), and the findings are exploratory. The article does not ask whether later hybrid practice has closed the gap. It asks whether the delivery problem is visible as learner-side conditions in this sample:</w:t>
+        <w:t xml:space="preserve">Thirty-eight complete responses were collected during emergency remote teaching. Thirty-seven respondents selected Pakistani nationality. Nationality is the only Pakistan connection in the dataset; residence, recruitment pathway, institutional affiliation, program status, and physical location were not verified. Literature on Pakistani educational mobility and university e-learning is used only as background for that reported nationality (Butt &amp; Sadaf, 2026; Jamil &amp; Muschert, 2023; Raza &amp; Hennessy, 2025; Tu, 2026). The group is not a verified campus population (Gao &amp; Hua, 2021; Gong et al., 2020a), and the findings are exploratory. The article does not ask whether later hybrid practice has closed the gap. It asks whether the delivery problem is visible as learner-side conditions in this sample:</w:t>
       </w:r>
     </w:p>
     <w:p>
@@ -375,8 +393,8 @@
         <w:t xml:space="preserve">Those answers are used to establish that, in this sample, online Chinese teaching is a delivery problem: content and materials work cannot settle it on their own. Counts are used descriptively. Associations are explored with Fisher’s exact tests and Spearman rank correlations and are not read as confirmatory tests of population-level relationships. Section 2 locates the study in later work on online language teaching and online ICLE, and in digital inequality and home learning ecologies. Section 3 reports when and how the questionnaire was completed. Sections 4 and 5 report and discuss the findings, and the final sections set out implications, limitations, and the article’s answer.</w:t>
       </w:r>
     </w:p>
-    <w:bookmarkEnd w:id="21"/>
-    <w:bookmarkStart w:id="26" w:name="Xa71efe292272ba0d775f88aaa92c3e49c1e1383"/>
+    <w:bookmarkEnd w:id="22"/>
+    <w:bookmarkStart w:id="27" w:name="Xa71efe292272ba0d775f88aaa92c3e49c1e1383"/>
     <w:p>
       <w:pPr>
         <w:pStyle w:val="Heading2"/>
@@ -385,7 +403,7 @@
         <w:t xml:space="preserve">2. Literature review and conceptual framework</w:t>
       </w:r>
     </w:p>
-    <w:bookmarkStart w:id="22" w:name="later-lenses-on-online-chinese-teaching"/>
+    <w:bookmarkStart w:id="23" w:name="later-lenses-on-online-chinese-teaching"/>
     <w:p>
       <w:pPr>
         <w:pStyle w:val="Heading3"/>
@@ -407,7 +425,7 @@
         <w:pStyle w:val="BodyText"/>
       </w:pPr>
       <w:r>
-        <w:t xml:space="preserve">The later literature is. After the return to campus, studies of technological normalisation asked what should remain of emergency online practice (Moorhouse, 2023; Moorhouse, Wong, &amp; Li, 2023) and cautioned against treating a videoconference copy of the classroom as the main lesson of the crisis (Stockwell &amp; Wang, 2023). For Chinese, contemporaneous accounts recorded the policy of</w:t>
+        <w:t xml:space="preserve">The later literature is. After the return to campus, studies of technological normalization asked what should remain of emergency online practice (Moorhouse, 2023; Moorhouse, Wong, &amp; Li, 2023) and cautioned against treating a videoconference copy of the classroom as the main lesson of the crisis (Stockwell &amp; Wang, 2023). For Chinese, contemporaneous accounts recorded the policy of</w:t>
       </w:r>
       <w:r>
         <w:t xml:space="preserve"> </w:t>
@@ -425,11 +443,11 @@
         <w:t xml:space="preserve"> </w:t>
       </w:r>
       <w:r>
-        <w:t xml:space="preserve">and early platform trials (Xia et al., 2022; Zhang et al., 2020). That writing already listed the same cluster of difficulties that still organise this article: networks, platforms, interaction, and learner affect. Xu et al. (2022) show how character teaching was adapted on the sending side. Jin et al. (2023) report world-language faculty perceptions of pandemic online teaching. Zhang and Liu (2023) examine online collaborative writing among Chinese-language learners in designed synchronous and asynchronous conditions, which is planned online work rather than a copy of the campus hour. Later reviews of technology in Chinese as a foreign language map acceptance, collaboration, and teacher knowledge more often than household access (Xu, 2024), and a review of digital transformation in the same field still flags digital equity as under-examined (Zhang &amp; Osborne, 2026). Reviews of online teaching models continue to list technical problems, weak interaction, and time-zone difficulty (Li &amp; Li, 2024). Designed online Chinese-culture courses show a planned alternative to emergency copying (Guenier et al., 2026). Learner emotion in Chinese as an additional language is already a topic in this journal (Wen &amp; Liu, 2025), and Qi (2025) shows that an online Chinese class can itself become an anxiety-provoking setting. Those studies do not describe the present respondents or the present stress item. They supply the later lenses. Much of that writing still assumes a relatively stable connection. The present questionnaire cannot test whether that assumption holds for current hybrid ICLE. It can show, under the later lens of delivery-context fit, what 38 respondents reported when online Chinese teaching asked them to join a travelling course.</w:t>
+        <w:t xml:space="preserve">and early platform trials (Xia et al., 2022; Zhang et al., 2020). That writing already listed the same cluster of difficulties that still organize this article: networks, platforms, interaction, and learner affect. Xu et al. (2022) show how character teaching was adapted on the sending side. Jin et al. (2023) report world-language faculty perceptions of pandemic online teaching. Zhang and Liu (2023) examine online collaborative writing among Chinese-language learners in designed synchronous and asynchronous conditions, which is planned online work rather than a copy of the campus hour. Later reviews of technology in Chinese as a foreign language map acceptance, collaboration, and teacher knowledge more often than household access (Xu, 2024), and a review of digital transformation in the same field still flags digital equity as under-examined (Zhang &amp; Osborne, 2026). Reviews of online teaching models continue to list technical problems, weak interaction, and time-zone difficulty (Li &amp; Li, 2024). Designed online Chinese-culture courses show a planned alternative to emergency copying (Guenier et al., 2026). In this journal, Russell (2020) already treats language anxiety as a condition of the online learner; Qi (2025) shows that an online Chinese class can itself become an anxiety-provoking setting. Those studies do not describe the present respondents or the present stress item. They supply the later lenses. Much of that writing still assumes a relatively stable connection. The present questionnaire cannot test whether that assumption holds for current hybrid ICLE. It can show, under the later lens of delivery-context fit, what 38 respondents reported when online Chinese teaching asked them to join a travelling course.</w:t>
       </w:r>
     </w:p>
-    <w:bookmarkEnd w:id="22"/>
-    <w:bookmarkStart w:id="23" w:name="X8fd0326383b50249221392c76a6b8ab8b037526"/>
+    <w:bookmarkEnd w:id="23"/>
+    <w:bookmarkStart w:id="24" w:name="X8fd0326383b50249221392c76a6b8ab8b037526"/>
     <w:p>
       <w:pPr>
         <w:pStyle w:val="Heading3"/>
@@ -454,14 +472,14 @@
         <w:t xml:space="preserve">An ecological view of language education takes the setting of the class, not only the student and the application, as the unit of analysis (Guerrettaz et al., 2021; van Lier, 2004). The conditions reported in this questionnaire—domestic space, paid or care work, and the circumstances of speaking in class—are therefore read as elements of respondents’ immediate learning ecologies. Power interruptions, applications marked unusable, and weak bandwidth are material and infrastructural facts, not cultural traits.</w:t>
       </w:r>
     </w:p>
-    <w:bookmarkEnd w:id="23"/>
-    <w:bookmarkStart w:id="24" w:name="localisation-of-delivery"/>
+    <w:bookmarkEnd w:id="24"/>
+    <w:bookmarkStart w:id="25" w:name="localization-of-delivery"/>
     <w:p>
       <w:pPr>
         <w:pStyle w:val="Heading3"/>
       </w:pPr>
       <w:r>
-        <w:t xml:space="preserve">2.3 Localisation of delivery</w:t>
+        <w:t xml:space="preserve">2.3 Localization of delivery</w:t>
       </w:r>
     </w:p>
     <w:p>
@@ -469,7 +487,7 @@
         <w:pStyle w:val="FirstParagraph"/>
       </w:pPr>
       <w:r>
-        <w:t xml:space="preserve">In materials work, localisation has usually meant personalising content so that it speaks to a particular group (McDonough &amp; Shaw, 2003; Tomlinson, 2011). Canagarajah (2005) and Kumaravadivelu (2001) locate pedagogy in a specific group and place. The promotion of Chinese has long been organised through institutes, textbooks, and tests (Zhao &amp; Huang, 2010), and ICLE research has applied localisation mainly to curriculum construction and textbook adaptation (Lu et al., 2024; Zhao, 2020). Lam (2024) shows how literacy practices are reshaped in a local university classroom. Guerrettaz et al. (2021) push materials off the page and into use. If that move is taken seriously, localisation also has to ask whether learners can reach and take part in the class as it is delivered.</w:t>
+        <w:t xml:space="preserve">In materials work, localization has usually meant personalizing content so that it speaks to a particular group (McDonough &amp; Shaw, 2003; Tomlinson, 2011). Canagarajah (2005) and Kumaravadivelu (2001) locate pedagogy in a specific group and place. The promotion of Chinese has long been organized through institutes, textbooks, and tests (Zhao &amp; Huang, 2010), and ICLE research has applied localization mainly to curriculum construction and textbook adaptation (Lu et al., 2024; Zhao, 2020). Lam (2024) shows how literacy practices are reshaped in a local university classroom. Guerrettaz et al. (2021) push materials off the page and into use. If that move is taken seriously, localization also has to ask whether learners can reach and take part in the class as it is delivered.</w:t>
       </w:r>
     </w:p>
     <w:p>
@@ -489,7 +507,7 @@
         <w:pStyle w:val="Compact"/>
       </w:pPr>
       <w:r>
-        <w:t xml:space="preserve">Localisation of</w:t>
+        <w:t xml:space="preserve">Localization of</w:t>
       </w:r>
       <w:r>
         <w:t xml:space="preserve"> </w:t>
@@ -514,7 +532,7 @@
         <w:pStyle w:val="Compact"/>
       </w:pPr>
       <w:r>
-        <w:t xml:space="preserve">Localisation of</w:t>
+        <w:t xml:space="preserve">Localization of</w:t>
       </w:r>
       <w:r>
         <w:t xml:space="preserve"> </w:t>
@@ -539,7 +557,7 @@
         <w:pStyle w:val="Compact"/>
       </w:pPr>
       <w:r>
-        <w:t xml:space="preserve">Localisation of</w:t>
+        <w:t xml:space="preserve">Localization of</w:t>
       </w:r>
       <w:r>
         <w:t xml:space="preserve"> </w:t>
@@ -552,7 +570,7 @@
         <w:t xml:space="preserve">curriculum</w:t>
       </w:r>
       <w:r>
-        <w:t xml:space="preserve">: pathway, hours, and assessment of a named programme (Shan &amp; Xu, 2024; Zhao, 2020).</w:t>
+        <w:t xml:space="preserve">: pathway, hours, and assessment of a named program (Shan &amp; Xu, 2024; Zhao, 2020).</w:t>
       </w:r>
     </w:p>
     <w:p>
@@ -564,7 +582,7 @@
         <w:pStyle w:val="Compact"/>
       </w:pPr>
       <w:r>
-        <w:t xml:space="preserve">Localisation of</w:t>
+        <w:t xml:space="preserve">Localization of</w:t>
       </w:r>
       <w:r>
         <w:t xml:space="preserve"> </w:t>
@@ -585,7 +603,7 @@
         <w:pStyle w:val="FirstParagraph"/>
       </w:pPr>
       <w:r>
-        <w:t xml:space="preserve">This analysis is concerned with the fourth, because that is the layer in which the problem of online Chinese teaching sits. Localisation of delivery does not replace accessibility or digital inclusion; it names the institutional decisions through which access is made possible or closed off when a course moves—the timing of the class, the required application, the oral task, or the form of assessment. The questionnaire did not observe those institutional decisions. It recorded the learner-side conditions against which such decisions would have to be judged, which is the empirical question this study can answer. The claim that follows is therefore conceptual rather than institutional: a course may be locally relevant in content but inaccessible in delivery. It is localised in delivery only when its required time, platform, participation mode, task design, and assessment are feasible where learners actually take part.</w:t>
+        <w:t xml:space="preserve">This analysis is concerned with the fourth, because that is the layer in which the problem of online Chinese teaching sits. Localization of delivery does not replace accessibility or digital inclusion; it names the institutional decisions through which access is made possible or closed off when a course moves—the timing of the class, the required application, the oral task, or the form of assessment. The questionnaire did not observe those institutional decisions. It recorded the learner-side conditions against which such decisions would have to be judged, which is the empirical question this study can answer. The claim that follows is therefore conceptual rather than institutional: a course may be locally relevant in content but inaccessible in delivery. It is localized in delivery only when its required time, platform, participation mode, task design, and assessment are feasible where learners actually take part.</w:t>
       </w:r>
     </w:p>
     <w:p>
@@ -609,11 +627,11 @@
         <w:t xml:space="preserve"> </w:t>
       </w:r>
       <w:r>
-        <w:t xml:space="preserve">Chinese universities. Guenier, Xing and Yan (2026) describe a designed online Chinese-culture course, which is planned online teaching rather than emergency remote teaching. The respondents in the present study completed a Chinese-language questionnaire about online Chinese classes. They are not treated as a Confucius Institute classroom sample, and enrolment in a named Chinese university was not independently verified.</w:t>
+        <w:t xml:space="preserve">Chinese universities. Guenier, Xing and Yan (2026) describe a designed online Chinese-culture course, which is planned online teaching rather than emergency remote teaching. The respondents in the present study completed a Chinese-language questionnaire about online Chinese classes. They are not treated as a Confucius Institute classroom sample, and enrollment in a named Chinese university was not independently verified.</w:t>
       </w:r>
     </w:p>
-    <w:bookmarkEnd w:id="24"/>
-    <w:bookmarkStart w:id="25" w:name="conceptual-model"/>
+    <w:bookmarkEnd w:id="25"/>
+    <w:bookmarkStart w:id="26" w:name="conceptual-model"/>
     <w:p>
       <w:pPr>
         <w:pStyle w:val="Heading3"/>
@@ -635,18 +653,18 @@
         <w:pStyle w:val="BodyText"/>
       </w:pPr>
       <w:r>
-        <w:t xml:space="preserve">Figure 1. Localisation of delivery as delivery-context fit (reading model). Household infrastructure (power interruptions, network stability, speed) and reported platform access are concurrent conditions. They are interpreted as possible constraints on participation and on self-reported stress, interaction, appraisal, and replacement judgements. The figure is not a causal path.</w:t>
+        <w:t xml:space="preserve">Figure 1. Localization of delivery as delivery-context fit (reading model). Household infrastructure (power interruptions, network stability, speed) and reported platform access are concurrent conditions. They are interpreted as possible constraints on participation and on self-reported stress, interaction, appraisal, and replacement judgments. The figure is not a causal path.</w:t>
       </w:r>
     </w:p>
-    <w:bookmarkEnd w:id="25"/>
     <w:bookmarkEnd w:id="26"/>
-    <w:bookmarkStart w:id="32" w:name="the-study"/>
+    <w:bookmarkEnd w:id="27"/>
+    <w:bookmarkStart w:id="33" w:name="methods"/>
     <w:p>
       <w:pPr>
         <w:pStyle w:val="Heading2"/>
       </w:pPr>
       <w:r>
-        <w:t xml:space="preserve">3. The study</w:t>
+        <w:t xml:space="preserve">3. Methods</w:t>
       </w:r>
     </w:p>
     <w:p>
@@ -657,7 +675,7 @@
         <w:t xml:space="preserve">The study is an exploratory, cross-sectional questionnaire. It does not test a pre-registered confirmatory model. What follows describes the instrument, the self-selected group who completed it, and the limits of what the questionnaire can support.</w:t>
       </w:r>
     </w:p>
-    <w:bookmarkStart w:id="27" w:name="design-and-context"/>
+    <w:bookmarkStart w:id="28" w:name="design-and-context"/>
     <w:p>
       <w:pPr>
         <w:pStyle w:val="Heading3"/>
@@ -671,11 +689,11 @@
         <w:pStyle w:val="FirstParagraph"/>
       </w:pPr>
       <w:r>
-        <w:t xml:space="preserve">The instrument title on the Wenjuan export is 新冠肺炎期间留学生在线中文学习的影响因素 (Influencing factors in international students’ online Chinese learning during COVID-19). Complete cases were submitted between 5 and 8 February 2022 (N = 38), during emergency remote teaching. That collection window is reported as a methodological fact; the article reads the responses through the later lenses set out in Section 2 and does not treat the sample as a picture of current hybrid practice. The form did not record how the link was circulated—whether through WeChat, WhatsApp, email, or student groups—so the recruitment channel cannot be named. Respondents were adults who completed the Chinese-language questionnaire about online Chinese learning. Completing that questionnaire is not treated as proof of enrolment in a Chinese university. The instrument did not ask host university, city of residence that week, degree versus non-degree status, or scholarship type. Two items asked whether required courses and electives were being taken online: 27 respondents (71.1%) reported required courses online, and 23 (60.5%) reported electives online. Those answers do not identify a named programme. The study therefore concerns a self-selected group of respondents reporting participation in online Chinese-language courses, not a verified enrolment record.</w:t>
+        <w:t xml:space="preserve">The instrument title on the Wenjuan export is 新冠肺炎期间留学生在线中文学习的影响因素 (Influencing factors in international students’ online Chinese learning during COVID-19). Complete cases were submitted between 5 and 8 February 2022 (N = 38), during emergency remote teaching. That collection window is reported as a methodological fact; the article reads the responses through the later lenses set out in Section 2 and does not treat the sample as a picture of current hybrid practice. The form did not record how the link was circulated—whether through WeChat, WhatsApp, email, or student groups—so the recruitment channel cannot be named. Respondents were adults who completed the Chinese-language questionnaire about online Chinese learning. Completing that questionnaire is not treated as proof of enrollment in a Chinese university. The instrument did not ask host university, city of residence that week, degree versus non-degree status, or scholarship type. Two items asked whether required courses and electives were being taken online: 27 respondents (71.1%) reported required courses online, and 23 (60.5%) reported electives online. Those answers do not identify a named programme. The study therefore concerns a self-selected group of respondents reporting participation in online Chinese-language courses, not a verified enrolment record.</w:t>
       </w:r>
     </w:p>
-    <w:bookmarkEnd w:id="27"/>
-    <w:bookmarkStart w:id="28" w:name="participants"/>
+    <w:bookmarkEnd w:id="28"/>
+    <w:bookmarkStart w:id="29" w:name="participants"/>
     <w:p>
       <w:pPr>
         <w:pStyle w:val="Heading3"/>
@@ -689,7 +707,7 @@
         <w:pStyle w:val="FirstParagraph"/>
       </w:pPr>
       <w:r>
-        <w:t xml:space="preserve">Of the 38 respondents, 27 were men (71.1%) and 11 were women (28.9%). Thirty-seven selected Pakistani nationality and one selected another nationality. That nationality item is the only Pakistan connection in the dataset. The group is not described as verified Chinese-university enrolment, as Pakistan-resident learners, as CSC students, or as a national sample. Self-rated Chinese level was mostly advanced (22, 57.9%) or intermediate (15, 39.5%), with one beginner; the label is the student’s own, not an HSK band. Years of learning Chinese clustered at three to four years (26, 68.4%). Wenjuan submission metadata classified the operating system as iPhone (24, 63.2%) or Android (14). That variable is the device used to submit the form, not an item about all devices used for class.</w:t>
+        <w:t xml:space="preserve">Of the 38 respondents, 27 were men (71.1%) and 11 were women (28.9%). Thirty-seven selected Pakistani nationality and one selected another nationality. That nationality item is the only Pakistan connection in the dataset. The group is not described as verified Chinese-university enrollment, as Pakistan-resident learners, as CSC students, or as a national sample. Self-rated Chinese level was mostly advanced (22, 57.9%) or intermediate (15, 39.5%), with one beginner; the label is the student’s own, not an HSK band. Years of learning Chinese clustered at three to four years (26, 68.4%). Wenjuan submission metadata classified the operating system as iPhone (24, 63.2%) or Android (14). That variable is the device used to submit the form, not an item about all devices used for class.</w:t>
       </w:r>
     </w:p>
     <w:p>
@@ -700,8 +718,8 @@
         <w:t xml:space="preserve">Wenjuan automatically recorded an IP-province field. A dummy was coded when that field was a mainland China province name (9 of 38). IP labels are technical metadata. They can be affected by virtual private networks and proxies, and they are not a reliable measure of physical location. They are not used as a participant-location variable and are not the basis of a sensitivity analysis. The dummy, submission dates, and device identifiers are not included in the public dataset.</w:t>
       </w:r>
     </w:p>
-    <w:bookmarkEnd w:id="28"/>
-    <w:bookmarkStart w:id="29" w:name="instrument-and-coding"/>
+    <w:bookmarkEnd w:id="29"/>
+    <w:bookmarkStart w:id="30" w:name="instrument-and-coding"/>
     <w:p>
       <w:pPr>
         <w:pStyle w:val="Heading3"/>
@@ -715,7 +733,7 @@
         <w:pStyle w:val="FirstParagraph"/>
       </w:pPr>
       <w:r>
-        <w:t xml:space="preserve">The questionnaire comprised about 30 items: demographics, single-choice ordinals, and multiple-response lists. Stems are in Chinese, with some non-native wording (for example 您尝尝用什么平台). English glosses are used for reporting. Self-rated Chinese proficiency was intermediate or advanced for 37 of 38 respondents. The instrument did not include a comprehension check, so completion of the Chinese-language questionnaire is treated only as evidence that respondents were willing to answer in Chinese. Item wording for the appraisal index is given in Appendix A.</w:t>
+        <w:t xml:space="preserve">The questionnaire comprised about 30 items: demographics, single-choice ordinals, and multiple-response lists. Stems are in Chinese, with some non-native wording (for example 您尝尝用什么平台). English glosses are used for reporting. Self-rated Chinese level was intermediate or advanced for 37 of 38 respondents. The instrument did not include a comprehension check, so completion of the Chinese-language questionnaire is treated only as evidence that respondents were willing to answer in Chinese. Item wording for the appraisal index is given in Appendix A.</w:t>
       </w:r>
     </w:p>
     <w:p>
@@ -789,7 +807,7 @@
         <w:pStyle w:val="BodyText"/>
       </w:pPr>
       <w:r>
-        <w:t xml:space="preserve">The export labelled one multiple-response problem as</w:t>
+        <w:t xml:space="preserve">The export labeled one multiple-response problem as</w:t>
       </w:r>
       <w:r>
         <w:t xml:space="preserve"> </w:t>
@@ -844,8 +862,8 @@
         <w:t xml:space="preserve">is reported as printed on the form; the option did not name a single provider such as 中国大学MOOC.</w:t>
       </w:r>
     </w:p>
-    <w:bookmarkEnd w:id="29"/>
-    <w:bookmarkStart w:id="30" w:name="analysis"/>
+    <w:bookmarkEnd w:id="30"/>
+    <w:bookmarkStart w:id="31" w:name="analysis"/>
     <w:p>
       <w:pPr>
         <w:pStyle w:val="Heading3"/>
@@ -927,8 +945,8 @@
         <w:t xml:space="preserve">A Pakistani-nationality check (n = 37) is reported only to show that dropping the one non-Pakistani case does not reverse the two focal associations. It is not a location analysis.</w:t>
       </w:r>
     </w:p>
-    <w:bookmarkEnd w:id="30"/>
-    <w:bookmarkStart w:id="31" w:name="ethics-and-data-protection"/>
+    <w:bookmarkEnd w:id="31"/>
+    <w:bookmarkStart w:id="32" w:name="ethics-and-data-protection"/>
     <w:p>
       <w:pPr>
         <w:pStyle w:val="Heading3"/>
@@ -953,9 +971,9 @@
         <w:t xml:space="preserve">No institutional ethics approval number is available for the original 2022 data collection. The first author was then an M.Phil. student, and numbered approval was not obtained. This article reports an anonymised secondary analysis of that file.</w:t>
       </w:r>
     </w:p>
-    <w:bookmarkEnd w:id="31"/>
     <w:bookmarkEnd w:id="32"/>
-    <w:bookmarkStart w:id="37" w:name="results"/>
+    <w:bookmarkEnd w:id="33"/>
+    <w:bookmarkStart w:id="38" w:name="results"/>
     <w:p>
       <w:pPr>
         <w:pStyle w:val="Heading2"/>
@@ -964,7 +982,7 @@
         <w:t xml:space="preserve">4. Results</w:t>
       </w:r>
     </w:p>
-    <w:bookmarkStart w:id="33" w:name="respondents-and-reported-conditions"/>
+    <w:bookmarkStart w:id="34" w:name="respondents-and-reported-conditions"/>
     <w:p>
       <w:pPr>
         <w:pStyle w:val="Heading3"/>
@@ -1927,8 +1945,8 @@
         <w:t xml:space="preserve">= .00008). That is a co-occurrence in this dataset, not evidence that the household caused stress. Descriptively, 36.8% of the sample selected the very-high-stress category.</w:t>
       </w:r>
     </w:p>
-    <w:bookmarkEnd w:id="33"/>
-    <w:bookmarkStart w:id="34" w:name="reported-platform-access"/>
+    <w:bookmarkEnd w:id="34"/>
+    <w:bookmarkStart w:id="35" w:name="reported-platform-access"/>
     <w:p>
       <w:pPr>
         <w:pStyle w:val="Heading3"/>
@@ -2516,8 +2534,8 @@
         <w:t xml:space="preserve">follows the item wording and is not a technical claim that the platform was blocked.</w:t>
       </w:r>
     </w:p>
-    <w:bookmarkEnd w:id="34"/>
-    <w:bookmarkStart w:id="35" w:name="perceived-learning-and-internet-speed"/>
+    <w:bookmarkEnd w:id="35"/>
+    <w:bookmarkStart w:id="36" w:name="perceived-learning-and-internet-speed"/>
     <w:p>
       <w:pPr>
         <w:pStyle w:val="Heading3"/>
@@ -2863,14 +2881,14 @@
         <w:t xml:space="preserve">= .00011) and speed × appraisal was ρ = .67 (percentile bootstrap 95% CI [.39, .85]).</w:t>
       </w:r>
     </w:p>
-    <w:bookmarkEnd w:id="35"/>
-    <w:bookmarkStart w:id="36" w:name="X97201ae18f9cce7e94bf1bc756e03fa139ac895"/>
+    <w:bookmarkEnd w:id="36"/>
+    <w:bookmarkStart w:id="37" w:name="X7b675b68a71662490495bf3cb9cb7095edb5ac5"/>
     <w:p>
       <w:pPr>
         <w:pStyle w:val="Heading3"/>
       </w:pPr>
       <w:r>
-        <w:t xml:space="preserve">4.4 Replacement judgement (secondary gender note)</w:t>
+        <w:t xml:space="preserve">4.4 Replacement judgment (secondary gender note)</w:t>
       </w:r>
     </w:p>
     <w:p>
@@ -2881,9 +2899,9 @@
         <w:t xml:space="preserve">Nineteen of 38 said online study could replace campus classes, and 19 said it could not. Among women, 9 of 11 said it could not; among men, 10 of 27 said so. With only 11 women, this is a cautious observation of perceived legitimacy in this sample. It is not a gender finding about Pakistani households and is not treated as a focal test (Appendix B).</w:t>
       </w:r>
     </w:p>
-    <w:bookmarkEnd w:id="36"/>
     <w:bookmarkEnd w:id="37"/>
-    <w:bookmarkStart w:id="38" w:name="discussion"/>
+    <w:bookmarkEnd w:id="38"/>
+    <w:bookmarkStart w:id="39" w:name="discussion"/>
     <w:p>
       <w:pPr>
         <w:pStyle w:val="Heading2"/>
@@ -2951,7 +2969,7 @@
         <w:t xml:space="preserve"> </w:t>
       </w:r>
       <w:r>
-        <w:t xml:space="preserve">and worse reported internet speed was associated with a more negative appraisal of online learning. The questionnaire does not show how institutions adapted. What it does show is the learner-side conditions that would have pressed on any travelling Chinese-language course. Localisation of content and materials would still have been necessary (Lu et al., 2024; Zhao, 2020). It would not, by itself, have answered a synchronous session on an unstable connection, or a required application that respondents marked unusable in their country.</w:t>
+        <w:t xml:space="preserve">and worse reported internet speed was associated with a more negative appraisal of online learning. The questionnaire does not show how institutions adapted. What it does show is the learner-side conditions that would have pressed on any travelling Chinese-language course. Localization of content and materials would still have been necessary (Lu et al., 2024; Zhao, 2020). It would not, by itself, have answered a synchronous session on an unstable connection, or a required application that respondents marked unusable in their country.</w:t>
       </w:r>
     </w:p>
     <w:p>
@@ -2990,14 +3008,14 @@
         <w:t xml:space="preserve">”</w:t>
       </w:r>
     </w:p>
-    <w:bookmarkEnd w:id="38"/>
-    <w:bookmarkStart w:id="39" w:name="implications-for-online-chinese-teaching"/>
+    <w:bookmarkEnd w:id="39"/>
+    <w:bookmarkStart w:id="40" w:name="pedagogical-implications"/>
     <w:p>
       <w:pPr>
         <w:pStyle w:val="Heading2"/>
       </w:pPr>
       <w:r>
-        <w:t xml:space="preserve">6. Implications for online Chinese teaching</w:t>
+        <w:t xml:space="preserve">6. Pedagogical implications</w:t>
       </w:r>
     </w:p>
     <w:p>
@@ -3005,7 +3023,59 @@
         <w:pStyle w:val="FirstParagraph"/>
       </w:pPr>
       <w:r>
-        <w:t xml:space="preserve">If the problem of online Chinese teaching is also a delivery problem, course design has to treat time, platform, participation mode, task, and assessment as teaching decisions rather than as technical afterthoughts. The present findings can support only cautious, sample-bound suggestions: shorter or asynchronous oral alternatives; assessment that does not assume a quiet campus hour; and a required platform that respondents can actually open. WhatsApp was marked available here, but it was not recorded as used for class, so the data do not recommend it as a replacement. Nor do they show that later hybrid ICLE has repeated this pattern. They do suggest that hybrid models</w:t>
+        <w:t xml:space="preserve">In this sample, the questionnaire can support only a small set of classroom decisions.</w:t>
+      </w:r>
+    </w:p>
+    <w:p>
+      <w:pPr>
+        <w:pStyle w:val="BodyText"/>
+      </w:pPr>
+      <w:r>
+        <w:t xml:space="preserve">First, do not treat the sending-side toolkit as given. QQ, Chaoxing, DingTalk, and 中国慕课 were frequently marked unusable. Before a program requires a platform, it has to ask whether learners can open it where they sit, and it has to name a usable alternative. WhatsApp was marked available here, but it was not recorded as used for class, so the data do not recommend it as a replacement.</w:t>
+      </w:r>
+    </w:p>
+    <w:p>
+      <w:pPr>
+        <w:pStyle w:val="BodyText"/>
+      </w:pPr>
+      <w:r>
+        <w:t xml:space="preserve">Second, do not treat a live oral hour as the only assessable performance. Only 28.9% described the home as quiet, 42.1% reported power interruptions, and 76.3% reported unstable networks. Assessment that assumes a quiet, continuous campus hour will mark some of those conditions as learner failure.</w:t>
+      </w:r>
+    </w:p>
+    <w:p>
+      <w:pPr>
+        <w:pStyle w:val="BodyText"/>
+      </w:pPr>
+      <w:r>
+        <w:t xml:space="preserve">Third, offer a shorter live slot or an asynchronous oral alternative. Preferred live length here was 45 minutes for half of the respondents and 30 minutes for 28.9%. One open comment said that even one minute online was</w:t>
+      </w:r>
+      <w:r>
+        <w:t xml:space="preserve"> </w:t>
+      </w:r>
+      <w:r>
+        <w:t xml:space="preserve">“</w:t>
+      </w:r>
+      <w:r>
+        <w:t xml:space="preserve">not suitable.</w:t>
+      </w:r>
+      <w:r>
+        <w:t xml:space="preserve">”</w:t>
+      </w:r>
+    </w:p>
+    <w:p>
+      <w:pPr>
+        <w:pStyle w:val="BodyText"/>
+      </w:pPr>
+      <w:r>
+        <w:t xml:space="preserve">Fourth, collect household and access conditions as part of course design, not after complaints. The form shows those conditions. It does not show how institutions adapted.</w:t>
+      </w:r>
+    </w:p>
+    <w:p>
+      <w:pPr>
+        <w:pStyle w:val="BodyText"/>
+      </w:pPr>
+      <w:r>
+        <w:t xml:space="preserve">These suggestions are bound to this sample. They are not a national policy, and they are not evidence that later hybrid ICLE has repeated this pattern. They do suggest that hybrid models</w:t>
       </w:r>
       <w:r>
         <w:t xml:space="preserve"> </w:t>
@@ -3024,8 +3094,8 @@
         <w:t xml:space="preserve">reproduce a similar mismatch if the delivery assumptions of a travelling course are left unexamined (Stockwell &amp; Wang, 2023).</w:t>
       </w:r>
     </w:p>
-    <w:bookmarkEnd w:id="39"/>
-    <w:bookmarkStart w:id="40" w:name="limitations"/>
+    <w:bookmarkEnd w:id="40"/>
+    <w:bookmarkStart w:id="41" w:name="limitations"/>
     <w:p>
       <w:pPr>
         <w:pStyle w:val="Heading2"/>
@@ -3039,11 +3109,11 @@
         <w:pStyle w:val="FirstParagraph"/>
       </w:pPr>
       <w:r>
-        <w:t xml:space="preserve">The sample is small (N = 38), network-recruited, and majority male. Recruitment channel, host university, programme type, and place of residence that week were not recorded, so Chinese-university enrolment is not independently verified. IP metadata are not a location measure. All outcomes are self-report. The appraisal index is descriptive, not a validated scale, and the infrastructure-problem count is an unvalidated post hoc indicator. The form did not measure institutional adaptation. The data are from February 2022 and concern emergency remote teaching; they are not evidence about current hybrid education. No ethics-committee number is available for the 2022 collection (Section 3.5).</w:t>
+        <w:t xml:space="preserve">The sample is small (N = 38), network-recruited, and majority male. Recruitment channel, host university, program type, and place of residence that week were not recorded, so Chinese-university enrollment is not independently verified. IP metadata are not a location measure. All outcomes are self-report. The appraisal index is descriptive, not a validated scale, and the infrastructure-problem count is an unvalidated post hoc indicator. The form did not measure institutional adaptation. The data are from February 2022 and concern emergency remote teaching; they are not evidence about current hybrid education. No ethics-committee number is available for the 2022 collection (Section 3.5).</w:t>
       </w:r>
     </w:p>
-    <w:bookmarkEnd w:id="40"/>
-    <w:bookmarkStart w:id="41" w:name="conclusion"/>
+    <w:bookmarkEnd w:id="41"/>
+    <w:bookmarkStart w:id="42" w:name="conclusion"/>
     <w:p>
       <w:pPr>
         <w:pStyle w:val="Heading2"/>
@@ -3078,8 +3148,8 @@
         <w:t xml:space="preserve">and with more negative appraisals of online learning. Later work on online language teaching and online ICLE supplies the lenses. The questionnaire identifies learner-side conditions that online Chinese teaching would need to address. That answer is bounded by N = 38 and by data collected during emergency remote teaching (Section 3.1). Whether later hybrid arrangements have closed the gap is a question this study cannot answer. The problem it can settle, for this sample, is the more basic one: online Chinese teaching is not only a content problem. It is also a delivery problem.</w:t>
       </w:r>
     </w:p>
-    <w:bookmarkEnd w:id="41"/>
-    <w:bookmarkStart w:id="42" w:name="appendix-a.-appraisal-items-and-coding"/>
+    <w:bookmarkEnd w:id="42"/>
+    <w:bookmarkStart w:id="43" w:name="appendix-a.-appraisal-items-and-coding"/>
     <w:p>
       <w:pPr>
         <w:pStyle w:val="Heading2"/>
@@ -3471,8 +3541,8 @@
         <w:t xml:space="preserve">Index = mean of Q8, Q9, and Q10 (n = 38; no missing on these three).</w:t>
       </w:r>
     </w:p>
-    <w:bookmarkEnd w:id="42"/>
-    <w:bookmarkStart w:id="43" w:name="appendix-b.-secondary-statistics"/>
+    <w:bookmarkEnd w:id="43"/>
+    <w:bookmarkStart w:id="44" w:name="appendix-b.-secondary-statistics"/>
     <w:p>
       <w:pPr>
         <w:pStyle w:val="Heading2"/>
@@ -3552,8 +3622,8 @@
         <w:t xml:space="preserve">≥ .36.</w:t>
       </w:r>
     </w:p>
-    <w:bookmarkEnd w:id="43"/>
-    <w:bookmarkStart w:id="44" w:name="references"/>
+    <w:bookmarkEnd w:id="44"/>
+    <w:bookmarkStart w:id="45" w:name="references"/>
     <w:p>
       <w:pPr>
         <w:pStyle w:val="Heading2"/>
@@ -4635,27 +4705,6 @@
         <w:pStyle w:val="BodyText"/>
       </w:pPr>
       <w:r>
-        <w:t xml:space="preserve">Zhang, M., &amp; Pladevall-Ballester, E. (2021). Students’ attitudes and perceptions towards three EMI courses in mainland China.</w:t>
-      </w:r>
-      <w:r>
-        <w:t xml:space="preserve"> </w:t>
-      </w:r>
-      <w:r>
-        <w:rPr>
-          <w:iCs/>
-          <w:i/>
-        </w:rPr>
-        <w:t xml:space="preserve">Language, Culture and Curriculum, 35</w:t>
-      </w:r>
-      <w:r>
-        <w:t xml:space="preserve">(2), 200-216. https://doi.org/10.1080/07908318.2021.1979576</w:t>
-      </w:r>
-    </w:p>
-    <w:p>
-      <w:pPr>
-        <w:pStyle w:val="BodyText"/>
-      </w:pPr>
-      <w:r>
         <w:t xml:space="preserve">Zhang, Q., &amp; Osborne, C. (2026). Readiness for digital transformation in Chinese as a foreign language education: A semi-systematic review.</w:t>
       </w:r>
       <w:r>
@@ -4735,8 +4784,8 @@
         <w:t xml:space="preserve">(2), 263-288. https://doi.org/10.1515/glochi-2020-0014</w:t>
       </w:r>
     </w:p>
-    <w:bookmarkEnd w:id="44"/>
     <w:bookmarkEnd w:id="45"/>
+    <w:bookmarkEnd w:id="46"/>
     <w:sectPr>
       <w:pgSz w:h="15840" w:w="12240"/>
       <w:pgMar w:bottom="1440" w:footer="720" w:gutter="0" w:header="720" w:left="1440" w:right="1440" w:top="1440"/>

</xml_diff>

<commit_message>
Tighten the FLA manuscript to the section-by-section review map
Make the problem-gap-RQ path explicit, elevate localization of delivery as the reading framework, cut repeated numbers and unused citations, and rebuild the Word reading copy. No new data or invented pilot.

Co-authored-by: kristinehina23-rgb <kristinehina23-rgb@users.noreply.github.com>
</commit_message>
<xml_diff>
--- a/papers/q1-masters-covid/word/Rathore-Cao-Xu-When-Chinese-class-moved-home.docx
+++ b/papers/q1-masters-covid/word/Rathore-Cao-Xu-When-Chinese-class-moved-home.docx
@@ -2,13 +2,13 @@
 <file path=word/document.xml><?xml version="1.0" encoding="utf-8"?>
 <w:document xmlns:w="http://schemas.openxmlformats.org/wordprocessingml/2006/main" xmlns:m="http://schemas.openxmlformats.org/officeDocument/2006/math" xmlns:r="http://schemas.openxmlformats.org/officeDocument/2006/relationships" xmlns:o="urn:schemas-microsoft-com:office:office" xmlns:v="urn:schemas-microsoft-com:vml" xmlns:w10="urn:schemas-microsoft-com:office:word" xmlns:a="http://schemas.openxmlformats.org/drawingml/2006/main" xmlns:pic="http://schemas.openxmlformats.org/drawingml/2006/picture" xmlns:wp="http://schemas.openxmlformats.org/drawingml/2006/wordprocessingDrawing">
   <w:body>
-    <w:bookmarkStart w:id="46" w:name="Xc2030a6abbb01e5f8d1dabdee28fe1e01100d80"/>
+    <w:bookmarkStart w:id="51" w:name="Xfe8d4829385d4367282f3ebdb9ea45ec57d310c"/>
     <w:p>
       <w:pPr>
         <w:pStyle w:val="Heading1"/>
       </w:pPr>
       <w:r>
-        <w:t xml:space="preserve">Household infrastructure and platform access in online Chinese teaching</w:t>
+        <w:t xml:space="preserve">Household infrastructure and platform access in online Chinese teaching: Localization of delivery in a travelling course</w:t>
       </w:r>
     </w:p>
     <w:p>
@@ -169,7 +169,7 @@
         <w:pStyle w:val="FirstParagraph"/>
       </w:pPr>
       <w:r>
-        <w:t xml:space="preserve">This article examines a delivery problem in online Chinese teaching: content may remain appropriate while the class is closed if household power, network speed, or platform access does not support the required timetable, platforms, oral tasks, and assessment. A Chinese-language questionnaire asked 38 self-selected respondents (37 selected Pakistani nationality) about those conditions, stress, and appraisals of online learning. Unstable networks (76.3%) and power interruptions (42.1%) were common; 36.8% selected</w:t>
+        <w:t xml:space="preserve">Online Chinese teaching can fail as delivery: content may remain appropriate while the class is closed if household power, network speed, or platform access does not support the required timetable, platforms, oral tasks, and assessment. The study proposes localization of delivery—the fit of time, platform, task, participation mode, and assessment to the receiving context—as a distinct layer of localization work for a travelling online Chinese course. A Chinese-language questionnaire asked 38 self-selected respondents (37 selected Pakistani nationality) about those learner-side conditions. Unstable networks and power interruptions were common. Home affecting study</w:t>
       </w:r>
       <w:r>
         <w:t xml:space="preserve"> </w:t>
@@ -178,7 +178,7 @@
         <w:t xml:space="preserve">“</w:t>
       </w:r>
       <w:r>
-        <w:t xml:space="preserve">very high stress.</w:t>
+        <w:t xml:space="preserve">very much</w:t>
       </w:r>
       <w:r>
         <w:t xml:space="preserve">”</w:t>
@@ -187,7 +187,7 @@
         <w:t xml:space="preserve"> </w:t>
       </w:r>
       <w:r>
-        <w:t xml:space="preserve">Home affecting study</w:t>
+        <w:t xml:space="preserve">co-occurred with</w:t>
       </w:r>
       <w:r>
         <w:t xml:space="preserve"> </w:t>
@@ -196,7 +196,7 @@
         <w:t xml:space="preserve">“</w:t>
       </w:r>
       <w:r>
-        <w:t xml:space="preserve">very much</w:t>
+        <w:t xml:space="preserve">very high stress,</w:t>
       </w:r>
       <w:r>
         <w:t xml:space="preserve">”</w:t>
@@ -205,10 +205,7 @@
         <w:t xml:space="preserve"> </w:t>
       </w:r>
       <w:r>
-        <w:t xml:space="preserve">co-occurred with that category (11/14 versus 3/24; Fisher’s exact (p = .00008)). Worse reported internet speed was associated with a more negative appraisal ((</w:t>
-      </w:r>
-      <w:r>
-        <w:t xml:space="preserve">= .65), 95% bootstrap CI ([.36, .84])). QQ and Chaoxing were often marked unusable; Zoom and WhatsApp were more often marked available. Time, platform, task, and assessment therefore have to be judged against learner-side conditions. The results are exploratory and are not evidence of current hybrid practice.</w:t>
+        <w:t xml:space="preserve">and worse reported internet speed was associated with a more negative appraisal of online learning. QQ and Chaoxing were often marked unusable; Zoom and WhatsApp were more often marked available. Findings are exploratory and specific to a small convenience sample during emergency remote teaching; they are not evidence about current hybrid practice.</w:t>
       </w:r>
     </w:p>
     <w:p>
@@ -244,7 +241,7 @@
         <w:pStyle w:val="FirstParagraph"/>
       </w:pPr>
       <w:r>
-        <w:t xml:space="preserve">An online Chinese course can keep its hours, platforms, oral tasks, and assessment, and still be a course learners cannot take. When household power, network speed, or a required application fails, content may remain appropriate while the class is closed. How should world-language programs treat that as a teaching problem rather than a technical inconvenience?</w:t>
+        <w:t xml:space="preserve">When a Chinese course moves online, programs still have to decide the hour, the application, the oral task, and the form of assessment. If household power, network speed, or a required platform does not support those decisions, how should the program treat the failure: as a technical inconvenience, or as a teaching problem?</w:t>
       </w:r>
     </w:p>
     <w:bookmarkEnd w:id="21"/>
@@ -262,7 +259,7 @@
         <w:pStyle w:val="FirstParagraph"/>
       </w:pPr>
       <w:r>
-        <w:t xml:space="preserve">The problem this article addresses is real. An online Chinese course can keep its hours, platforms, oral tasks, and assessment, and still be a course learners cannot take. Online language programs commonly retain the timetable and classroom tasks of the sending class, and task guides still assume that learners can join a live or collaborative session (Gacs et al., 2020; González-Lloret, 2020; Hodges et al., 2020; Payne, 2020; Stockwell &amp; Wang, 2023). That assumption is already known to fail. Research on online language teaching, and on online international Chinese teaching, has documented unstable networks, platforms that are hard to open, thinner interaction, and learner strain (Li &amp; Li, 2024; Moser et al., 2021; Qi, 2025; Russell, 2020; Tao &amp; Gao, 2022). From the household side, owning a device is not participation when power, speed, or a usable application is missing (Ali, 2020; Beaunoyer et al., 2020; Guo &amp; Wan, 2022; Vishnu et al., 2024; Warschauer, 2003). Distance language learning had already asked whether a remote class was feasible (White, 2006). If household power, network speed, or platform access does not support the required class, the content may remain appropriate while the class is closed. That is a delivery problem, not a content problem.</w:t>
+        <w:t xml:space="preserve">An online Chinese course can keep its hours, platforms, oral tasks, and assessment, and still be a course learners cannot take. Online language programs commonly retain the timetable and classroom tasks of the sending class. Task guides still assume that learners can join a live or collaborative session (Gacs et al., 2020; González-Lloret, 2020; Hodges et al., 2020; Payne, 2020; Stockwell &amp; Wang, 2023). That assumption is already known to fail. Research on online language teaching, and on online international Chinese teaching, has documented unstable networks, platforms that are hard to open, thinner interaction, and learner strain (Li &amp; Li, 2024; Moser et al., 2021; Qi, 2025; Russell, 2020; Tao &amp; Gao, 2022). Owning a device is not participation when power, speed, or a usable application is missing (Ali, 2020; Beaunoyer et al., 2020; Guo &amp; Wan, 2022; Vishnu et al., 2024; Warschauer, 2003). Distance language learning had already asked whether a remote class was feasible (White, 2006). If those conditions do not support the required class, the content may remain appropriate while the class is closed. That is a delivery problem, not a content problem.</w:t>
       </w:r>
     </w:p>
     <w:p>
@@ -270,7 +267,7 @@
         <w:pStyle w:val="BodyText"/>
       </w:pPr>
       <w:r>
-        <w:t xml:space="preserve">The field has named this failure more often than it has taken it as the object of study. Emergency remote teaching made the problem urgent, but much of that writing used it as a setting for teacher workload, sending-side pedagogical adaptation, or a videoconference copy of the campus hour (MacIntyre et al., 2020; Moser et al., 2021; Xu et al., 2022). Later work asked what should remain of emergency practice and warned against treating that copy as the lesson of the crisis (Moorhouse, 2023; Moorhouse, Wong, &amp; Li, 2023; Stockwell &amp; Wang, 2023). Reviews of online international Chinese teaching, and of technology in Chinese as a foreign language, still list technical trouble and still leave household access and digital equity under-examined (Li &amp; Li, 2024; Xu, 2024; Zhang &amp; Osborne, 2026). Designed online courses and studies of learner emotion show what planned online Chinese teaching can look like (Guenier et al., 2026; Qi, 2025; Wen &amp; Liu, 2025). They do not show whether a</w:t>
+        <w:t xml:space="preserve">What existing work has not done is to make those learner-side delivery conditions the primary object of study for online international Chinese teaching. Emergency writing used the failure as a setting for teacher workload, sending-side adaptation, or a videoconference copy of the campus hour (MacIntyre et al., 2020; Moser et al., 2021; Xu et al., 2022). Later work asked what should remain of emergency practice (Moorhouse, 2023; Stockwell &amp; Wang, 2023). Reviews still list technical trouble and still leave household access and digital equity under-examined (Li &amp; Li, 2024; Xu, 2024; Zhang &amp; Osborne, 2026). Designed online courses and studies of learner emotion show what planned online Chinese teaching can look like (Guenier et al., 2026; Qi, 2025; Wen &amp; Liu, 2025). They do not show whether a</w:t>
       </w:r>
       <w:r>
         <w:t xml:space="preserve"> </w:t>
@@ -296,7 +293,10 @@
         <w:t xml:space="preserve">says</w:t>
       </w:r>
       <w:r>
-        <w:t xml:space="preserve">—its examples, cultural content, and materials—than about whether an online Chinese course can still be</w:t>
+        <w:t xml:space="preserve"> </w:t>
+      </w:r>
+      <w:r>
+        <w:t xml:space="preserve">than about whether it can still be</w:t>
       </w:r>
       <w:r>
         <w:t xml:space="preserve"> </w:t>
@@ -312,7 +312,7 @@
         <w:t xml:space="preserve"> </w:t>
       </w:r>
       <w:r>
-        <w:t xml:space="preserve">(Gong et al., 2020b; Lu et al., 2024; Ma et al., 2017; McDonough &amp; Shaw, 2003; Tomlinson, 2011; Zhao, 2020). Listing the difficulty is not the same as measuring the conditions that produce it.</w:t>
+        <w:t xml:space="preserve">(Gong et al., 2020b; Lu et al., 2024; Zhao, 2020). Listing the difficulty is not the same as measuring the conditions that produce it.</w:t>
       </w:r>
     </w:p>
     <w:p>
@@ -320,7 +320,7 @@
         <w:pStyle w:val="BodyText"/>
       </w:pPr>
       <w:r>
-        <w:t xml:space="preserve">To treat the problem as a research problem, rather than as an emergency inconvenience, this study collected a Chinese-language questionnaire on the learner-side conditions that decide whether the class can be entered at all. Empirical work in this journal has already treated online world-language teaching as a problem of access, task design, interaction, anxiety, and emergency adaptation, not only of content (Gacs et al., 2020; González-Lloret, 2020; Jin et al., 2023; Lomicka, 2020; Payne, 2020; Russell, 2020; Xu et al., 2022; Zhang &amp; Liu, 2023). The same move is required here for the conditions of a travelling Chinese course. A self-selected group of respondents reporting participation in online Chinese-language courses was asked what household, connectivity, and platform-access conditions they faced, and how those conditions sat alongside stress and appraisals of online learning. The instrument cannot show how institutions adapted time, platform, task, participation mode, or assessment. It can show the conditions against which those arrangements have to be judged. Time-zone difference and the absence of a Chinese-speaking environment have also been listed as field problems; they were not measured, so they are left aside. Respondents are not treated as students who had returned home or who were unable to re-enter campus. Those were common emergency-period situations; they are not established facts in this dataset.</w:t>
+        <w:t xml:space="preserve">This study treats that gap as a research problem. Empirical work in this journal has already treated online world-language teaching as a problem of access, task design, interaction, anxiety, and emergency adaptation (Gacs et al., 2020; González-Lloret, 2020; Jin et al., 2023; Lomicka, 2020; Payne, 2020; Russell, 2020; Xu et al., 2022; Zhang &amp; Liu, 2023). The same move is required here for the conditions of a travelling Chinese course. A Chinese-language questionnaire asked a self-selected group of respondents reporting participation in online Chinese-language courses what household, connectivity, and platform-access conditions they faced, and how those conditions sat alongside stress and appraisals of online learning. The instrument cannot show how institutions adapted. It can show the conditions against which those arrangements have to be judged. Time-zone difference and the absence of a Chinese-speaking environment were not measured, so they are left aside. Respondents are not treated as students who had returned home or who were unable to re-enter campus. Those were common emergency-period situations; they are not established facts in this dataset.</w:t>
       </w:r>
     </w:p>
     <w:p>
@@ -328,7 +328,7 @@
         <w:pStyle w:val="BodyText"/>
       </w:pPr>
       <w:r>
-        <w:t xml:space="preserve">Thirty-eight complete responses were collected during emergency remote teaching. Thirty-seven respondents selected Pakistani nationality. Nationality is the only Pakistan connection in the dataset; residence, recruitment pathway, institutional affiliation, program status, and physical location were not verified. Literature on Pakistani educational mobility and university e-learning is used only as background for that reported nationality (Butt &amp; Sadaf, 2026; Jamil &amp; Muschert, 2023; Raza &amp; Hennessy, 2025; Tu, 2026). The group is not a verified campus population (Gao &amp; Hua, 2021; Gong et al., 2020a), and the findings are exploratory. The article does not ask whether later hybrid practice has closed the gap. It asks whether the delivery problem is visible as learner-side conditions in this sample:</w:t>
+        <w:t xml:space="preserve">Thirty-eight complete responses were collected during emergency remote teaching. Thirty-seven respondents selected Pakistani nationality. Nationality is the only Pakistan connection in the dataset. Residence, recruitment pathway, institutional affiliation, program status, and physical location were not verified. Literature on Pakistani educational mobility and university e-learning is used only as background for that reported nationality (Butt &amp; Sadaf, 2026; Jamil &amp; Muschert, 2023; Raza &amp; Hennessy, 2025; Tu, 2026). The group is not a verified campus population (Gao &amp; Hua, 2021; Gong et al., 2020a). The article does not ask whether later hybrid practice has closed the gap. It asks whether the delivery problem is visible as learner-side conditions in this sample:</w:t>
       </w:r>
     </w:p>
     <w:p>
@@ -340,6 +340,16 @@
         <w:pStyle w:val="Compact"/>
       </w:pPr>
       <w:r>
+        <w:rPr>
+          <w:bCs/>
+          <w:b/>
+        </w:rPr>
+        <w:t xml:space="preserve">RQ1.</w:t>
+      </w:r>
+      <w:r>
+        <w:t xml:space="preserve"> </w:t>
+      </w:r>
+      <w:r>
         <w:t xml:space="preserve">What household, connectivity, and platform-access conditions did respondents report?</w:t>
       </w:r>
     </w:p>
@@ -352,6 +362,16 @@
         <w:pStyle w:val="Compact"/>
       </w:pPr>
       <w:r>
+        <w:rPr>
+          <w:bCs/>
+          <w:b/>
+        </w:rPr>
+        <w:t xml:space="preserve">RQ2.</w:t>
+      </w:r>
+      <w:r>
+        <w:t xml:space="preserve"> </w:t>
+      </w:r>
+      <w:r>
         <w:t xml:space="preserve">In this sample, how were reported household and connectivity conditions associated with selecting</w:t>
       </w:r>
       <w:r>
@@ -382,6 +402,16 @@
         <w:pStyle w:val="Compact"/>
       </w:pPr>
       <w:r>
+        <w:rPr>
+          <w:bCs/>
+          <w:b/>
+        </w:rPr>
+        <w:t xml:space="preserve">RQ3.</w:t>
+      </w:r>
+      <w:r>
+        <w:t xml:space="preserve"> </w:t>
+      </w:r>
+      <w:r>
         <w:t xml:space="preserve">How did respondents judge whether online Chinese-language courses could replace campus-based classes?</w:t>
       </w:r>
     </w:p>
@@ -390,11 +420,11 @@
         <w:pStyle w:val="FirstParagraph"/>
       </w:pPr>
       <w:r>
-        <w:t xml:space="preserve">Those answers are used to establish that, in this sample, online Chinese teaching is a delivery problem: content and materials work cannot settle it on their own. Counts are used descriptively. Associations are explored with Fisher’s exact tests and Spearman rank correlations and are not read as confirmatory tests of population-level relationships. Section 2 locates the study in later work on online language teaching and online ICLE, and in digital inequality and home learning ecologies. Section 3 reports when and how the questionnaire was completed. Sections 4 and 5 report and discuss the findings, and the final sections set out implications, limitations, and the article’s answer.</w:t>
+        <w:t xml:space="preserve">Counts are used descriptively. Associations are exploratory and are not read as confirmatory tests of population-level relationships. Section 2 locates the study and sets out the four-layer reading of localization. Section 3 reports the methods. Section 4 addresses RQ1–RQ3 in turn. Sections 5–8 discuss the findings, set out pedagogical implications, and state the limits of the answer.</w:t>
       </w:r>
     </w:p>
     <w:bookmarkEnd w:id="22"/>
-    <w:bookmarkStart w:id="27" w:name="Xa71efe292272ba0d775f88aaa92c3e49c1e1383"/>
+    <w:bookmarkStart w:id="28" w:name="Xa71efe292272ba0d775f88aaa92c3e49c1e1383"/>
     <w:p>
       <w:pPr>
         <w:pStyle w:val="Heading2"/>
@@ -417,7 +447,7 @@
         <w:pStyle w:val="FirstParagraph"/>
       </w:pPr>
       <w:r>
-        <w:t xml:space="preserve">Hodges et al. (2020) drew a useful line between emergency remote teaching and planned online or blended provision. Gacs, Goertler and Spasova (2020) brought that distinction into language education. Bond et al. (2021) mapped that first global online semester, and Adedoyin and Soykan (2020) summarised the infrastructural as well as pedagogical strain. Surveys of language teachers from the same period describe heavier workloads, stress, and uneven preparedness once teaching moved online (MacIntyre et al., 2020; Moorhouse &amp; Kohnke, 2021; Moser et al., 2021). Tao and Gao (2022) read the wider literature as a story of technical disruption, thinner engagement, and the need for language-specific support. Russell (2020) treats language anxiety as a condition of the online learner, and Lomicka (2020) treats interaction as a problem of virtual community rather than of a copied campus hour. That work locates the moment in which the present questionnaire was completed. It is not used as a substitute for the stress reports in this sample, and it is not the lens through which the problem is now read.</w:t>
+        <w:t xml:space="preserve">Hodges et al. (2020) distinguished emergency remote teaching from planned online provision. Gacs, Goertler, and Spasova (2020) brought that distinction into language education. Language-teacher surveys from the same period describe heavier workloads and uneven preparedness (Moser et al., 2021). Tao and Gao (2022) read the wider literature as a story of technical disruption and thinner engagement. In this journal, Russell (2020) treats language anxiety as a condition of the online learner, and Lomicka (2020) treats interaction as a problem of virtual community rather than of a copied campus hour. That work locates the moment in which the present questionnaire was completed. It is not a substitute for the stress reports in this sample.</w:t>
       </w:r>
     </w:p>
     <w:p>
@@ -425,7 +455,7 @@
         <w:pStyle w:val="BodyText"/>
       </w:pPr>
       <w:r>
-        <w:t xml:space="preserve">The later literature is. After the return to campus, studies of technological normalization asked what should remain of emergency online practice (Moorhouse, 2023; Moorhouse, Wong, &amp; Li, 2023) and cautioned against treating a videoconference copy of the classroom as the main lesson of the crisis (Stockwell &amp; Wang, 2023). For Chinese, contemporaneous accounts recorded the policy of</w:t>
+        <w:t xml:space="preserve">The later literature is the reading lens. After the return to campus, studies of technological normalization asked what should remain of emergency online practice (Moorhouse, 2023) and cautioned against treating a videoconference copy of the classroom as the lesson of the crisis (Stockwell &amp; Wang, 2023). For Chinese, contemporaneous policy writing recorded</w:t>
       </w:r>
       <w:r>
         <w:t xml:space="preserve"> </w:t>
@@ -443,7 +473,7 @@
         <w:t xml:space="preserve"> </w:t>
       </w:r>
       <w:r>
-        <w:t xml:space="preserve">and early platform trials (Xia et al., 2022; Zhang et al., 2020). That writing already listed the same cluster of difficulties that still organize this article: networks, platforms, interaction, and learner affect. Xu et al. (2022) show how character teaching was adapted on the sending side. Jin et al. (2023) report world-language faculty perceptions of pandemic online teaching. Zhang and Liu (2023) examine online collaborative writing among Chinese-language learners in designed synchronous and asynchronous conditions, which is planned online work rather than a copy of the campus hour. Later reviews of technology in Chinese as a foreign language map acceptance, collaboration, and teacher knowledge more often than household access (Xu, 2024), and a review of digital transformation in the same field still flags digital equity as under-examined (Zhang &amp; Osborne, 2026). Reviews of online teaching models continue to list technical problems, weak interaction, and time-zone difficulty (Li &amp; Li, 2024). Designed online Chinese-culture courses show a planned alternative to emergency copying (Guenier et al., 2026). In this journal, Russell (2020) already treats language anxiety as a condition of the online learner; Qi (2025) shows that an online Chinese class can itself become an anxiety-provoking setting. Those studies do not describe the present respondents or the present stress item. They supply the later lenses. Much of that writing still assumes a relatively stable connection. The present questionnaire cannot test whether that assumption holds for current hybrid ICLE. It can show, under the later lens of delivery-context fit, what 38 respondents reported when online Chinese teaching asked them to join a travelling course.</w:t>
+        <w:t xml:space="preserve">(Zhang et al., 2020). Xu et al. (2022) show how character teaching was adapted on the sending side. Jin et al. (2023) report faculty perceptions of pandemic online teaching. Zhang and Liu (2023) examine online collaborative writing among Chinese-language learners in designed conditions. Later reviews still say more about tools than about household access, and they still flag digital equity as under-examined (Li &amp; Li, 2024; Xu, 2024; Zhang &amp; Osborne, 2026). Designed online Chinese-culture courses show a planned alternative to emergency copying (Guenier et al., 2026). Qi (2025) shows that an online Chinese class can itself become an anxiety-provoking setting. Those studies do not describe the present respondents. Much of that writing still assumes a relatively stable connection. The present questionnaire cannot test whether that assumption holds for current hybrid ICLE. It can show what 38 respondents reported when a travelling course asked them to join.</w:t>
       </w:r>
     </w:p>
     <w:bookmarkEnd w:id="23"/>
@@ -461,7 +491,7 @@
         <w:pStyle w:val="FirstParagraph"/>
       </w:pPr>
       <w:r>
-        <w:t xml:space="preserve">Later models of the digital divide distinguish motivational, material, skills, usage, and outcome access (Helsper, 2021; van Dijk, 2020; Warschauer, 2003). Owning a device is not the same as being able to take part (Ali, 2020; Beaunoyer et al., 2020). Guo and Wan (2022) document that divide in online learning in China. Vishnu et al. (2024) treat digital infrastructure as a condition of higher-education online learning after the emergency period, not as a temporary inconvenience. Interview research on Pakistani university e-learning during COVID-19 found uneven first-level access (internet and devices) and second-level skills, with rural and less-resourced students more exposed (Jamil &amp; Muschert, 2023). Later survey work continues to report uneven access and skills among Pakistani university students (Butt &amp; Sadaf, 2026). Household use of educational technology is also shaped by device sharing, care work, and electricity (Raza &amp; Hennessy, 2025). The last of those sources is a grey-literature report. None of them is treated as evidence about the 38 respondents here; they are cited only as background for the nationality most of them reported.</w:t>
+        <w:t xml:space="preserve">Later models of the digital divide distinguish material access from skills, usage, and outcomes (Helsper, 2021; van Dijk, 2020; Warschauer, 2003). Owning a device is not the same as being able to take part (Ali, 2020; Beaunoyer et al., 2020; Guo &amp; Wan, 2022; Vishnu et al., 2024). Work on Pakistani university e-learning reports uneven access, skills, electricity, and household device sharing (Butt &amp; Sadaf, 2026; Jamil &amp; Muschert, 2023; Raza &amp; Hennessy, 2025). The last of those sources is a grey-literature report. None of them is evidence about the 38 respondents here; they are background only for the nationality most of them reported.</w:t>
       </w:r>
     </w:p>
     <w:p>
@@ -469,11 +499,11 @@
         <w:pStyle w:val="BodyText"/>
       </w:pPr>
       <w:r>
-        <w:t xml:space="preserve">An ecological view of language education takes the setting of the class, not only the student and the application, as the unit of analysis (Guerrettaz et al., 2021; van Lier, 2004). The conditions reported in this questionnaire—domestic space, paid or care work, and the circumstances of speaking in class—are therefore read as elements of respondents’ immediate learning ecologies. Power interruptions, applications marked unusable, and weak bandwidth are material and infrastructural facts, not cultural traits.</w:t>
+        <w:t xml:space="preserve">An ecological view of language education takes the setting of the class, not only the student and the application, as the unit of analysis (Guerrettaz et al., 2021; van Lier, 2004). Domestic space, paid or care work, power interruptions, and applications marked unusable are therefore read as elements of respondents’ immediate learning ecologies. They are material facts, not cultural traits.</w:t>
       </w:r>
     </w:p>
     <w:bookmarkEnd w:id="24"/>
-    <w:bookmarkStart w:id="25" w:name="localization-of-delivery"/>
+    <w:bookmarkStart w:id="26" w:name="localization-of-delivery"/>
     <w:p>
       <w:pPr>
         <w:pStyle w:val="Heading3"/>
@@ -487,15 +517,24 @@
         <w:pStyle w:val="FirstParagraph"/>
       </w:pPr>
       <w:r>
-        <w:t xml:space="preserve">In materials work, localization has usually meant personalizing content so that it speaks to a particular group (McDonough &amp; Shaw, 2003; Tomlinson, 2011). Canagarajah (2005) and Kumaravadivelu (2001) locate pedagogy in a specific group and place. The promotion of Chinese has long been organized through institutes, textbooks, and tests (Zhao &amp; Huang, 2010), and ICLE research has applied localization mainly to curriculum construction and textbook adaptation (Lu et al., 2024; Zhao, 2020). Lam (2024) shows how literacy practices are reshaped in a local university classroom. Guerrettaz et al. (2021) push materials off the page and into use. If that move is taken seriously, localization also has to ask whether learners can reach and take part in the class as it is delivered.</w:t>
+        <w:t xml:space="preserve">In materials work, localization has usually meant personalizing content so that it speaks to a particular group (McDonough &amp; Shaw, 2003; Tomlinson, 2011). Canagarajah (2005) and Kumaravadivelu (2001) locate pedagogy in a specific group and place. ICLE research has applied localization mainly to curriculum construction and textbook adaptation (Lu et al., 2024; Zhao, 2020; Zhao &amp; Huang, 2010). Guerrettaz et al. (2021) push materials off the page and into use. If that move is taken seriously, localization also has to ask whether learners can reach and take part in the class as it is delivered.</w:t>
+      </w:r>
+    </w:p>
+    <w:bookmarkStart w:id="25" w:name="four-layers-of-localization"/>
+    <w:p>
+      <w:pPr>
+        <w:pStyle w:val="Heading4"/>
+      </w:pPr>
+      <w:r>
+        <w:t xml:space="preserve">2.3.1 Four layers of localization</w:t>
       </w:r>
     </w:p>
     <w:p>
       <w:pPr>
-        <w:pStyle w:val="BodyText"/>
-      </w:pPr>
-      <w:r>
-        <w:t xml:space="preserve">It is helpful to keep four layers distinct:</w:t>
+        <w:pStyle w:val="FirstParagraph"/>
+      </w:pPr>
+      <w:r>
+        <w:t xml:space="preserve">The following four layers are the proposed framework for reading the present data. They are a conceptual distinction, not a tested path:</w:t>
       </w:r>
     </w:p>
     <w:p>
@@ -603,7 +642,7 @@
         <w:pStyle w:val="FirstParagraph"/>
       </w:pPr>
       <w:r>
-        <w:t xml:space="preserve">This analysis is concerned with the fourth, because that is the layer in which the problem of online Chinese teaching sits. Localization of delivery does not replace accessibility or digital inclusion; it names the institutional decisions through which access is made possible or closed off when a course moves—the timing of the class, the required application, the oral task, or the form of assessment. The questionnaire did not observe those institutional decisions. It recorded the learner-side conditions against which such decisions would have to be judged, which is the empirical question this study can answer. The claim that follows is therefore conceptual rather than institutional: a course may be locally relevant in content but inaccessible in delivery. It is localized in delivery only when its required time, platform, participation mode, task design, and assessment are feasible where learners actually take part.</w:t>
+        <w:t xml:space="preserve">This analysis is concerned with the fourth. Localization of delivery does not replace accessibility or digital inclusion. It names the institutional decisions through which access is made possible or closed off when a course moves. The questionnaire did not observe those institutional decisions. It recorded the learner-side conditions against which such decisions would have to be judged. The claim is therefore conceptual rather than institutional: a course may be locally relevant in content but inaccessible in delivery. It is localized in delivery only when its required time, platform, participation mode, task design, and assessment are feasible where learners actually take part.</w:t>
       </w:r>
     </w:p>
     <w:p>
@@ -611,7 +650,7 @@
         <w:pStyle w:val="BodyText"/>
       </w:pPr>
       <w:r>
-        <w:t xml:space="preserve">Gong et al. (2020b) map ICLE in mainland China for 2014–2018 and are used here as a pre-pandemic field sketch, not as post-COVID evidence. Gao and Hua (2021) and Gong et al. (2020a) write about international students of Chinese</w:t>
+        <w:t xml:space="preserve">Gong et al. (2020b) map ICLE in mainland China for 2014–2018 and are used here as a pre-pandemic field sketch. Gao and Hua (2021) and Gong et al. (2020a) write about international students of Chinese</w:t>
       </w:r>
       <w:r>
         <w:t xml:space="preserve"> </w:t>
@@ -627,11 +666,12 @@
         <w:t xml:space="preserve"> </w:t>
       </w:r>
       <w:r>
-        <w:t xml:space="preserve">Chinese universities. Guenier, Xing and Yan (2026) describe a designed online Chinese-culture course, which is planned online teaching rather than emergency remote teaching. The respondents in the present study completed a Chinese-language questionnaire about online Chinese classes. They are not treated as a Confucius Institute classroom sample, and enrollment in a named Chinese university was not independently verified.</w:t>
+        <w:t xml:space="preserve">Chinese universities. Guenier, Xing, and Yan (2026) describe a designed online Chinese-culture course. The present respondents completed a Chinese-language questionnaire about online Chinese classes. They are not treated as a Confucius Institute classroom sample, and enrollment in a named Chinese university was not independently verified.</w:t>
       </w:r>
     </w:p>
     <w:bookmarkEnd w:id="25"/>
-    <w:bookmarkStart w:id="26" w:name="conceptual-model"/>
+    <w:bookmarkEnd w:id="26"/>
+    <w:bookmarkStart w:id="27" w:name="conceptual-model"/>
     <w:p>
       <w:pPr>
         <w:pStyle w:val="Heading3"/>
@@ -656,9 +696,9 @@
         <w:t xml:space="preserve">Figure 1. Localization of delivery as delivery-context fit (reading model). Household infrastructure (power interruptions, network stability, speed) and reported platform access are concurrent conditions. They are interpreted as possible constraints on participation and on self-reported stress, interaction, appraisal, and replacement judgments. The figure is not a causal path.</w:t>
       </w:r>
     </w:p>
-    <w:bookmarkEnd w:id="26"/>
     <w:bookmarkEnd w:id="27"/>
-    <w:bookmarkStart w:id="33" w:name="methods"/>
+    <w:bookmarkEnd w:id="28"/>
+    <w:bookmarkStart w:id="34" w:name="methods"/>
     <w:p>
       <w:pPr>
         <w:pStyle w:val="Heading2"/>
@@ -675,7 +715,7 @@
         <w:t xml:space="preserve">The study is an exploratory, cross-sectional questionnaire. It does not test a pre-registered confirmatory model. What follows describes the instrument, the self-selected group who completed it, and the limits of what the questionnaire can support.</w:t>
       </w:r>
     </w:p>
-    <w:bookmarkStart w:id="28" w:name="design-and-context"/>
+    <w:bookmarkStart w:id="29" w:name="design-and-context"/>
     <w:p>
       <w:pPr>
         <w:pStyle w:val="Heading3"/>
@@ -689,11 +729,11 @@
         <w:pStyle w:val="FirstParagraph"/>
       </w:pPr>
       <w:r>
-        <w:t xml:space="preserve">The instrument title on the Wenjuan export is 新冠肺炎期间留学生在线中文学习的影响因素 (Influencing factors in international students’ online Chinese learning during COVID-19). Complete cases were submitted between 5 and 8 February 2022 (N = 38), during emergency remote teaching. That collection window is reported as a methodological fact; the article reads the responses through the later lenses set out in Section 2 and does not treat the sample as a picture of current hybrid practice. The form did not record how the link was circulated—whether through WeChat, WhatsApp, email, or student groups—so the recruitment channel cannot be named. Respondents were adults who completed the Chinese-language questionnaire about online Chinese learning. Completing that questionnaire is not treated as proof of enrollment in a Chinese university. The instrument did not ask host university, city of residence that week, degree versus non-degree status, or scholarship type. Two items asked whether required courses and electives were being taken online: 27 respondents (71.1%) reported required courses online, and 23 (60.5%) reported electives online. Those answers do not identify a named programme. The study therefore concerns a self-selected group of respondents reporting participation in online Chinese-language courses, not a verified enrolment record.</w:t>
+        <w:t xml:space="preserve">The instrument title on the Wenjuan export is 新冠肺炎期间留学生在线中文学习的影响因素 (Influencing factors in international students’ online Chinese learning during COVID-19). The items are those on that retained form. No separate validation study or recorded pilot of the instrument is available. This article is a secondary analysis of the completed file. Complete cases were submitted between 5 and 8 February 2022 (N = 38), during emergency remote teaching. That collection window is a methodological fact; the article does not treat the sample as a picture of current hybrid practice. The form did not record how the link was circulated, so the recruitment channel cannot be named. Respondents were adults who completed the Chinese-language questionnaire about online Chinese learning. Completing that questionnaire is not treated as proof of enrollment in a Chinese university. The instrument did not ask host university, city of residence that week, degree versus non-degree status, or scholarship type. Two items asked whether required courses and electives were being taken online: 27 respondents (71.1%) reported required courses online, and 23 (60.5%) reported electives online. Those answers do not identify a named program. The study therefore concerns a self-selected group of respondents reporting participation in online Chinese-language courses, not a verified enrollment record.</w:t>
       </w:r>
     </w:p>
-    <w:bookmarkEnd w:id="28"/>
-    <w:bookmarkStart w:id="29" w:name="participants"/>
+    <w:bookmarkEnd w:id="29"/>
+    <w:bookmarkStart w:id="30" w:name="participants"/>
     <w:p>
       <w:pPr>
         <w:pStyle w:val="Heading3"/>
@@ -718,8 +758,8 @@
         <w:t xml:space="preserve">Wenjuan automatically recorded an IP-province field. A dummy was coded when that field was a mainland China province name (9 of 38). IP labels are technical metadata. They can be affected by virtual private networks and proxies, and they are not a reliable measure of physical location. They are not used as a participant-location variable and are not the basis of a sensitivity analysis. The dummy, submission dates, and device identifiers are not included in the public dataset.</w:t>
       </w:r>
     </w:p>
-    <w:bookmarkEnd w:id="29"/>
-    <w:bookmarkStart w:id="30" w:name="instrument-and-coding"/>
+    <w:bookmarkEnd w:id="30"/>
+    <w:bookmarkStart w:id="31" w:name="instrument-and-coding"/>
     <w:p>
       <w:pPr>
         <w:pStyle w:val="Heading3"/>
@@ -862,8 +902,8 @@
         <w:t xml:space="preserve">is reported as printed on the form; the option did not name a single provider such as 中国大学MOOC.</w:t>
       </w:r>
     </w:p>
-    <w:bookmarkEnd w:id="30"/>
-    <w:bookmarkStart w:id="31" w:name="analysis"/>
+    <w:bookmarkEnd w:id="31"/>
+    <w:bookmarkStart w:id="32" w:name="analysis"/>
     <w:p>
       <w:pPr>
         <w:pStyle w:val="Heading3"/>
@@ -877,7 +917,7 @@
         <w:pStyle w:val="FirstParagraph"/>
       </w:pPr>
       <w:r>
-        <w:t xml:space="preserve">Frequencies are n/38 unless noted. Multiple-response items are the percentage who selected the option. Two associations were treated as focal: (a) home affects study very much × very high stress; and (b) internet speed × the appraisal index. For the 2 × 2 table we report cell counts and two-sided Fisher’s exact</w:t>
+        <w:t xml:space="preserve">The analyses are mapped to the research questions. RQ1 is addressed with descriptive frequencies (Tables 1–3). RQ2 is addressed with two focal associations: home affects study very much × very high stress (two-sided Fisher’s exact</w:t>
       </w:r>
       <w:r>
         <w:t xml:space="preserve"> </w:t>
@@ -890,10 +930,7 @@
         <w:t xml:space="preserve">p</w:t>
       </w:r>
       <w:r>
-        <w:t xml:space="preserve"> </w:t>
-      </w:r>
-      <w:r>
-        <w:t xml:space="preserve">(SciPy</w:t>
+        <w:t xml:space="preserve">; SciPy</w:t>
       </w:r>
       <w:r>
         <w:t xml:space="preserve"> </w:t>
@@ -905,7 +942,7 @@
         <w:t xml:space="preserve">fisher_exact</w:t>
       </w:r>
       <w:r>
-        <w:t xml:space="preserve">). Odds ratios and Wald confidence intervals are not reported: at N = 38 they are unstable, and a Wald interval can disagree with Fisher’s</w:t>
+        <w:t xml:space="preserve">) and internet speed × the appraisal index (Spearman’s ρ with a percentile bootstrap 95% confidence interval from 5,000 resamples). RQ3 is addressed with frequencies of the replacement judgment. Odds ratios and Wald confidence intervals are not reported: at N = 38 they are unstable. Other associations, including gender, are secondary and are placed in Appendix B. Frequencies are n/38 unless noted. Multiple-response items are the percentage who selected the option.</w:t>
       </w:r>
       <w:r>
         <w:t xml:space="preserve"> </w:t>
@@ -918,19 +955,6 @@
         <w:t xml:space="preserve">p</w:t>
       </w:r>
       <w:r>
-        <w:t xml:space="preserve">. For the ordinal pair we report Spearman’s ρ and a percentile bootstrap 95% confidence interval calculated from 5,000 resamples. Other associations, including gender, are secondary and are placed in Appendix B.</w:t>
-      </w:r>
-      <w:r>
-        <w:t xml:space="preserve"> </w:t>
-      </w:r>
-      <w:r>
-        <w:rPr>
-          <w:iCs/>
-          <w:i/>
-        </w:rPr>
-        <w:t xml:space="preserve">p</w:t>
-      </w:r>
-      <w:r>
         <w:t xml:space="preserve"> </w:t>
       </w:r>
       <w:r>
@@ -945,8 +969,8 @@
         <w:t xml:space="preserve">A Pakistani-nationality check (n = 37) is reported only to show that dropping the one non-Pakistani case does not reverse the two focal associations. It is not a location analysis.</w:t>
       </w:r>
     </w:p>
-    <w:bookmarkEnd w:id="31"/>
-    <w:bookmarkStart w:id="32" w:name="ethics-and-data-protection"/>
+    <w:bookmarkEnd w:id="32"/>
+    <w:bookmarkStart w:id="33" w:name="ethics-and-data-protection"/>
     <w:p>
       <w:pPr>
         <w:pStyle w:val="Heading3"/>
@@ -960,7 +984,7 @@
         <w:pStyle w:val="FirstParagraph"/>
       </w:pPr>
       <w:r>
-        <w:t xml:space="preserve">Adult respondents completed an online form presented as research on online Chinese learning. The form stated that answers would be used for research, and completion and submission were treated as consent. Names, IP addresses, exact timestamps, and device identifiers were removed before the public file was prepared.</w:t>
+        <w:t xml:space="preserve">Adult respondents completed an online form presented as research on online Chinese learning. The form stated that answers would be used for research, and completion and submission were treated as consent.</w:t>
       </w:r>
     </w:p>
     <w:p>
@@ -968,12 +992,12 @@
         <w:pStyle w:val="BodyText"/>
       </w:pPr>
       <w:r>
-        <w:t xml:space="preserve">No institutional ethics approval number is available for the original 2022 data collection. The first author was then an M.Phil. student, and numbered approval was not obtained. This article reports an anonymised secondary analysis of that file.</w:t>
+        <w:t xml:space="preserve">No institutional ethics approval number is available for the original 2022 data collection. The first author was then an M.Phil. student, and numbered approval was not obtained. This article reports an anonymized secondary analysis of that file. No new data were collected. Names, IP addresses, exact timestamps, and device identifiers were removed before the public file was prepared.</w:t>
       </w:r>
     </w:p>
-    <w:bookmarkEnd w:id="32"/>
     <w:bookmarkEnd w:id="33"/>
-    <w:bookmarkStart w:id="38" w:name="results"/>
+    <w:bookmarkEnd w:id="34"/>
+    <w:bookmarkStart w:id="39" w:name="results"/>
     <w:p>
       <w:pPr>
         <w:pStyle w:val="Heading2"/>
@@ -982,13 +1006,13 @@
         <w:t xml:space="preserve">4. Results</w:t>
       </w:r>
     </w:p>
-    <w:bookmarkStart w:id="34" w:name="respondents-and-reported-conditions"/>
+    <w:bookmarkStart w:id="35" w:name="Xc19e6556867f37cf5943d55d08f36cc3acc822b"/>
     <w:p>
       <w:pPr>
         <w:pStyle w:val="Heading3"/>
       </w:pPr>
       <w:r>
-        <w:t xml:space="preserve">4.1 Respondents and reported conditions</w:t>
+        <w:t xml:space="preserve">4.1 Addressing RQ1: respondents and household conditions</w:t>
       </w:r>
     </w:p>
     <w:p>
@@ -996,7 +1020,7 @@
         <w:pStyle w:val="FirstParagraph"/>
       </w:pPr>
       <w:r>
-        <w:t xml:space="preserve">Table 1 locates the sample. Most respondents (78.9%) said all of their Chinese classes were online, and more than half (57.9%) reported working alongside study.</w:t>
+        <w:t xml:space="preserve">Table 1 locates the sample. Most respondents said all of their Chinese classes were online, and more than half reported working alongside study.</w:t>
       </w:r>
     </w:p>
     <w:p>
@@ -1480,7 +1504,7 @@
         <w:pStyle w:val="BodyText"/>
       </w:pPr>
       <w:r>
-        <w:t xml:space="preserve">Table 2 summarises the conditions respondents reported. Unstable networks (76.3%) and power interruptions (42.1%) were common. Speed was split: 36.8% good or very good, 36.8% average, and 26.3% bad or very bad. Four respondents (10.5%) said their country did not have internet, yet all 38 submitted an online form. The item wording does not allow a firm reinterpretation, so the response is reported as given. Only 11 of 38 (28.9%) described the home as quiet.</w:t>
+        <w:t xml:space="preserve">Table 2 reports the household and connectivity conditions. The key figures are unstable networks (76.3%), power interruptions (42.1%), and very high stress (36.8%). Four respondents said their country did not have internet, yet all 38 submitted an online form. The item wording does not allow a firm reinterpretation, so the response is reported as given. Only 11 of 38 described the home as quiet.</w:t>
       </w:r>
     </w:p>
     <w:p>
@@ -1903,56 +1927,14 @@
         </w:tc>
       </w:tr>
     </w:tbl>
+    <w:bookmarkEnd w:id="35"/>
+    <w:bookmarkStart w:id="36" w:name="addressing-rq1-platform-access"/>
     <w:p>
       <w:pPr>
-        <w:pStyle w:val="BodyText"/>
-      </w:pPr>
-      <w:r>
-        <w:t xml:space="preserve">Among those who said the home affected study very much, 11 of 14 also selected</w:t>
-      </w:r>
-      <w:r>
-        <w:t xml:space="preserve"> </w:t>
-      </w:r>
-      <w:r>
-        <w:t xml:space="preserve">“</w:t>
-      </w:r>
-      <w:r>
-        <w:t xml:space="preserve">very high</w:t>
-      </w:r>
-      <w:r>
-        <w:t xml:space="preserve">”</w:t>
-      </w:r>
-      <w:r>
-        <w:t xml:space="preserve"> </w:t>
-      </w:r>
-      <w:r>
-        <w:t xml:space="preserve">psychological stress; among the others, 3 of 24 did (two-sided Fisher’s exact</w:t>
-      </w:r>
-      <w:r>
-        <w:t xml:space="preserve"> </w:t>
-      </w:r>
-      <w:r>
-        <w:rPr>
-          <w:iCs/>
-          <w:i/>
-        </w:rPr>
-        <w:t xml:space="preserve">p</w:t>
-      </w:r>
-      <w:r>
-        <w:t xml:space="preserve"> </w:t>
-      </w:r>
-      <w:r>
-        <w:t xml:space="preserve">= .00008). That is a co-occurrence in this dataset, not evidence that the household caused stress. Descriptively, 36.8% of the sample selected the very-high-stress category.</w:t>
-      </w:r>
-    </w:p>
-    <w:bookmarkEnd w:id="34"/>
-    <w:bookmarkStart w:id="35" w:name="reported-platform-access"/>
-    <w:p>
-      <w:pPr>
         <w:pStyle w:val="Heading3"/>
       </w:pPr>
       <w:r>
-        <w:t xml:space="preserve">4.2 Reported platform access</w:t>
+        <w:t xml:space="preserve">4.2 Addressing RQ1: platform access</w:t>
       </w:r>
     </w:p>
     <w:p>
@@ -1960,33 +1942,7 @@
         <w:pStyle w:val="FirstParagraph"/>
       </w:pPr>
       <w:r>
-        <w:t xml:space="preserve">Respondents reported uneven access to institutionally familiar and consumer-facing platforms (Table 3). The pattern is read as a possible platform-geography dimension of delivery-context fit. The questionnaire cannot isolate country restrictions, routing, account rules, skills, or virtual private networks.</w:t>
-      </w:r>
-    </w:p>
-    <w:p>
-      <w:pPr>
-        <w:pStyle w:val="BodyText"/>
-      </w:pPr>
-      <w:r>
-        <w:t xml:space="preserve">The tools reported as used for class were Tencent Meeting (71.1%), Zoom (47.4%), and WeChat (31.6%). Those marked unusable</w:t>
-      </w:r>
-      <w:r>
-        <w:t xml:space="preserve"> </w:t>
-      </w:r>
-      <w:r>
-        <w:t xml:space="preserve">“</w:t>
-      </w:r>
-      <w:r>
-        <w:t xml:space="preserve">in my country</w:t>
-      </w:r>
-      <w:r>
-        <w:t xml:space="preserve">”</w:t>
-      </w:r>
-      <w:r>
-        <w:t xml:space="preserve"> </w:t>
-      </w:r>
-      <w:r>
-        <w:t xml:space="preserve">included QQ (50.0%), Chaoxing (42.1%), DingTalk (28.9%), and 中国慕课 (28.9%). Those marked available included Zoom (71.1%), WhatsApp (68.4%), Tencent Meeting (57.9%), and WeChat (39.5%). WhatsApp appears only as available; the retained form did not code whether it was used for class. Tencent Meeting was the most used class tool but was marked available by fewer respondents, a discrepancy left as an item-level inconsistency.</w:t>
+        <w:t xml:space="preserve">Table 3 shows uneven access to institutionally familiar and consumer-facing platforms. The questionnaire cannot isolate country restrictions, routing, account rules, skills, or virtual private networks. The pattern used for later discussion is that QQ and Chaoxing were frequently marked unusable, while Zoom and WhatsApp were more often marked available. WhatsApp appears only as available; the retained form did not code whether it was used for class. Tencent Meeting was the most used class tool but was marked available by fewer respondents, a discrepancy left as an item-level inconsistency.</w:t>
       </w:r>
     </w:p>
     <w:p>
@@ -2534,14 +2490,14 @@
         <w:t xml:space="preserve">follows the item wording and is not a technical claim that the platform was blocked.</w:t>
       </w:r>
     </w:p>
-    <w:bookmarkEnd w:id="35"/>
-    <w:bookmarkStart w:id="36" w:name="perceived-learning-and-internet-speed"/>
+    <w:bookmarkEnd w:id="36"/>
+    <w:bookmarkStart w:id="37" w:name="addressing-rq2-stress-and-appraisals"/>
     <w:p>
       <w:pPr>
         <w:pStyle w:val="Heading3"/>
       </w:pPr>
       <w:r>
-        <w:t xml:space="preserve">4.3 Perceived learning and internet speed</w:t>
+        <w:t xml:space="preserve">4.3 Addressing RQ2: stress and appraisals</w:t>
       </w:r>
     </w:p>
     <w:p>
@@ -2549,7 +2505,7 @@
         <w:pStyle w:val="FirstParagraph"/>
       </w:pPr>
       <w:r>
-        <w:t xml:space="preserve">Active interaction with the teacher</w:t>
+        <w:t xml:space="preserve">Among those who said the home affected study very much, 11 of 14 also selected</w:t>
       </w:r>
       <w:r>
         <w:t xml:space="preserve"> </w:t>
@@ -2558,7 +2514,7 @@
         <w:t xml:space="preserve">“</w:t>
       </w:r>
       <w:r>
-        <w:t xml:space="preserve">very much</w:t>
+        <w:t xml:space="preserve">very high</w:t>
       </w:r>
       <w:r>
         <w:t xml:space="preserve">”</w:t>
@@ -2567,33 +2523,7 @@
         <w:t xml:space="preserve"> </w:t>
       </w:r>
       <w:r>
-        <w:t xml:space="preserve">was reported by 6 of 38 (15.8%). When classroom talk was reported, it was mainly dialogue (76.3%) and question and answer (57.9%). Role-play was rare (7.9%).</w:t>
-      </w:r>
-    </w:p>
-    <w:p>
-      <w:pPr>
-        <w:pStyle w:val="BodyText"/>
-      </w:pPr>
-      <w:r>
-        <w:t xml:space="preserve">On the appraisal items, 18.4% said they could learn</w:t>
-      </w:r>
-      <w:r>
-        <w:t xml:space="preserve"> </w:t>
-      </w:r>
-      <w:r>
-        <w:t xml:space="preserve">“</w:t>
-      </w:r>
-      <w:r>
-        <w:t xml:space="preserve">a lot</w:t>
-      </w:r>
-      <w:r>
-        <w:t xml:space="preserve">”</w:t>
-      </w:r>
-      <w:r>
-        <w:t xml:space="preserve"> </w:t>
-      </w:r>
-      <w:r>
-        <w:t xml:space="preserve">online and 28.9% said little or nothing. Worse internet speed was associated with a worse appraisal index (ρ = .65,</w:t>
+        <w:t xml:space="preserve">psychological stress; among the others, 3 of 24 did (two-sided Fisher’s exact</w:t>
       </w:r>
       <w:r>
         <w:t xml:space="preserve"> </w:t>
@@ -2609,7 +2539,15 @@
         <w:t xml:space="preserve"> </w:t>
       </w:r>
       <w:r>
-        <w:t xml:space="preserve">&lt; .001, percentile bootstrap 95% CI [.36, .84]). A simple, unvalidated count of selected infrastructure-problem options (unstable network, power interruptions, no signal) was not associated with the index (ρ = .02,</w:t>
+        <w:t xml:space="preserve">= .00008). That is a co-occurrence in this dataset, not evidence that the household caused stress.</w:t>
+      </w:r>
+    </w:p>
+    <w:p>
+      <w:pPr>
+        <w:pStyle w:val="BodyText"/>
+      </w:pPr>
+      <w:r>
+        <w:t xml:space="preserve">Worse internet speed was associated with a worse appraisal index (ρ = .65,</w:t>
       </w:r>
       <w:r>
         <w:t xml:space="preserve"> </w:t>
@@ -2625,7 +2563,7 @@
         <w:t xml:space="preserve"> </w:t>
       </w:r>
       <w:r>
-        <w:t xml:space="preserve">= .91, percentile bootstrap 95% CI [−.32, .37]). That count is an exploratory post hoc indicator: unstable network and no signal may overlap, and power interruptions are a different layer of infrastructure. The non-significant correlation is therefore not read as evidence that speed matters but the number of problems does not. These are rank associations, not effects of infrastructure on learning.</w:t>
+        <w:t xml:space="preserve">&lt; .001, percentile bootstrap 95% CI [.36, .84]; Table 4). An unvalidated post hoc count of selected infrastructure-problem options (unstable network, power interruptions, no signal) was not associated with the index (ρ = .02). That count is not interpreted as evidence against the role of infrastructure.</w:t>
       </w:r>
     </w:p>
     <w:p>
@@ -2633,7 +2571,25 @@
         <w:pStyle w:val="BodyText"/>
       </w:pPr>
       <w:r>
-        <w:t xml:space="preserve">Preferred live length was 45 minutes for 50% and 30 minutes for 28.9%. One open comment said that even one minute online was</w:t>
+        <w:t xml:space="preserve">Active interaction with the teacher</w:t>
+      </w:r>
+      <w:r>
+        <w:t xml:space="preserve"> </w:t>
+      </w:r>
+      <w:r>
+        <w:t xml:space="preserve">“</w:t>
+      </w:r>
+      <w:r>
+        <w:t xml:space="preserve">very much</w:t>
+      </w:r>
+      <w:r>
+        <w:t xml:space="preserve">”</w:t>
+      </w:r>
+      <w:r>
+        <w:t xml:space="preserve"> </w:t>
+      </w:r>
+      <w:r>
+        <w:t xml:space="preserve">was uncommon (6 of 38). Preferred live length was 45 minutes for half of the respondents and 30 minutes for 28.9%. One open comment said that even one minute online was</w:t>
       </w:r>
       <w:r>
         <w:t xml:space="preserve"> </w:t>
@@ -2881,14 +2837,14 @@
         <w:t xml:space="preserve">= .00011) and speed × appraisal was ρ = .67 (percentile bootstrap 95% CI [.39, .85]).</w:t>
       </w:r>
     </w:p>
-    <w:bookmarkEnd w:id="36"/>
-    <w:bookmarkStart w:id="37" w:name="X7b675b68a71662490495bf3cb9cb7095edb5ac5"/>
+    <w:bookmarkEnd w:id="37"/>
+    <w:bookmarkStart w:id="38" w:name="addressing-rq3-replacement-judgment"/>
     <w:p>
       <w:pPr>
         <w:pStyle w:val="Heading3"/>
       </w:pPr>
       <w:r>
-        <w:t xml:space="preserve">4.4 Replacement judgment (secondary gender note)</w:t>
+        <w:t xml:space="preserve">4.4 Addressing RQ3: replacement judgment</w:t>
       </w:r>
     </w:p>
     <w:p>
@@ -2899,9 +2855,9 @@
         <w:t xml:space="preserve">Nineteen of 38 said online study could replace campus classes, and 19 said it could not. Among women, 9 of 11 said it could not; among men, 10 of 27 said so. With only 11 women, this is a cautious observation of perceived legitimacy in this sample. It is not a gender finding about Pakistani households and is not treated as a focal test (Appendix B).</w:t>
       </w:r>
     </w:p>
-    <w:bookmarkEnd w:id="37"/>
     <w:bookmarkEnd w:id="38"/>
-    <w:bookmarkStart w:id="39" w:name="discussion"/>
+    <w:bookmarkEnd w:id="39"/>
+    <w:bookmarkStart w:id="40" w:name="discussion"/>
     <w:p>
       <w:pPr>
         <w:pStyle w:val="Heading2"/>
@@ -2915,61 +2871,7 @@
         <w:pStyle w:val="FirstParagraph"/>
       </w:pPr>
       <w:r>
-        <w:t xml:space="preserve">The study set out to establish whether the difficulties the field has named for online Chinese teaching—networks, platforms, interaction, and affect—were present as learner-side conditions in this sample. The answer is yes. Respondents commonly reported unstable networks, power interruptions, and uneven platform access. Active interaction with the teacher</w:t>
-      </w:r>
-      <w:r>
-        <w:t xml:space="preserve"> </w:t>
-      </w:r>
-      <w:r>
-        <w:t xml:space="preserve">“</w:t>
-      </w:r>
-      <w:r>
-        <w:t xml:space="preserve">very much</w:t>
-      </w:r>
-      <w:r>
-        <w:t xml:space="preserve">”</w:t>
-      </w:r>
-      <w:r>
-        <w:t xml:space="preserve"> </w:t>
-      </w:r>
-      <w:r>
-        <w:t xml:space="preserve">was uncommon. Those who said the home affected study</w:t>
-      </w:r>
-      <w:r>
-        <w:t xml:space="preserve"> </w:t>
-      </w:r>
-      <w:r>
-        <w:t xml:space="preserve">“</w:t>
-      </w:r>
-      <w:r>
-        <w:t xml:space="preserve">very much</w:t>
-      </w:r>
-      <w:r>
-        <w:t xml:space="preserve">”</w:t>
-      </w:r>
-      <w:r>
-        <w:t xml:space="preserve"> </w:t>
-      </w:r>
-      <w:r>
-        <w:t xml:space="preserve">more often selected</w:t>
-      </w:r>
-      <w:r>
-        <w:t xml:space="preserve"> </w:t>
-      </w:r>
-      <w:r>
-        <w:t xml:space="preserve">“</w:t>
-      </w:r>
-      <w:r>
-        <w:t xml:space="preserve">very high stress,</w:t>
-      </w:r>
-      <w:r>
-        <w:t xml:space="preserve">”</w:t>
-      </w:r>
-      <w:r>
-        <w:t xml:space="preserve"> </w:t>
-      </w:r>
-      <w:r>
-        <w:t xml:space="preserve">and worse reported internet speed was associated with a more negative appraisal of online learning. The questionnaire does not show how institutions adapted. What it does show is the learner-side conditions that would have pressed on any travelling Chinese-language course. Localization of content and materials would still have been necessary (Lu et al., 2024; Zhao, 2020). It would not, by itself, have answered a synchronous session on an unstable connection, or a required application that respondents marked unusable in their country.</w:t>
+        <w:t xml:space="preserve">The contribution of this article is threefold. Empirically, it documents learner-side household and platform-access conditions for a travelling online Chinese course in a small emergency-period sample. Conceptually, it treats localization of delivery, or delivery-context fit, as a distinct layer of localization work. In relation to existing online ICLE research, it complements sending-side accounts of emergency adaptation (Xu et al., 2022) and designed online Chinese work (Zhang &amp; Liu, 2023) with the conditions against which those arrangements have to be judged.</w:t>
       </w:r>
     </w:p>
     <w:p>
@@ -2977,7 +2879,43 @@
         <w:pStyle w:val="BodyText"/>
       </w:pPr>
       <w:r>
-        <w:t xml:space="preserve">Those conditions belong to the culture of the class in a narrow, ecological sense: the immediate setting in which language work was asked to happen (van Lier, 2004). They are not a claim about Pakistani culture, nor about a national educational system. Most respondents selected Pakistani nationality, and that is the only Pakistan connection the dataset can support.</w:t>
+        <w:t xml:space="preserve">The study set out to establish whether the difficulties the field has named—networks, platforms, interaction, and affect—were present as learner-side conditions in this sample. The answer is yes. Those who said the home affected study</w:t>
+      </w:r>
+      <w:r>
+        <w:t xml:space="preserve"> </w:t>
+      </w:r>
+      <w:r>
+        <w:t xml:space="preserve">“</w:t>
+      </w:r>
+      <w:r>
+        <w:t xml:space="preserve">very much</w:t>
+      </w:r>
+      <w:r>
+        <w:t xml:space="preserve">”</w:t>
+      </w:r>
+      <w:r>
+        <w:t xml:space="preserve"> </w:t>
+      </w:r>
+      <w:r>
+        <w:t xml:space="preserve">more often selected</w:t>
+      </w:r>
+      <w:r>
+        <w:t xml:space="preserve"> </w:t>
+      </w:r>
+      <w:r>
+        <w:t xml:space="preserve">“</w:t>
+      </w:r>
+      <w:r>
+        <w:t xml:space="preserve">very high stress,</w:t>
+      </w:r>
+      <w:r>
+        <w:t xml:space="preserve">”</w:t>
+      </w:r>
+      <w:r>
+        <w:t xml:space="preserve"> </w:t>
+      </w:r>
+      <w:r>
+        <w:t xml:space="preserve">and worse reported internet speed was associated with a more negative appraisal of online learning. The questionnaire does not show how institutions adapted. Localization of content and materials would still have been necessary (Lu et al., 2024; Zhao, 2020). It would not, by itself, have answered a synchronous session on an unstable connection, or a required application that respondents marked unusable in their country.</w:t>
       </w:r>
     </w:p>
     <w:p>
@@ -2985,7 +2923,7 @@
         <w:pStyle w:val="BodyText"/>
       </w:pPr>
       <w:r>
-        <w:t xml:space="preserve">The platform pattern is best read as a possible geography of delivery. Applications often used in Chinese-university teaching (QQ, Chaoxing, DingTalk, 中国慕课) were frequently marked unusable, while Zoom and WhatsApp were more often marked available. The questionnaire cannot say whether that pattern reflects country restrictions, routing, account rules, skills, or virtual private networks. It can say that a travelling course which assumes a single institutional toolkit may ask learners to enter a class they cannot reliably open.</w:t>
+        <w:t xml:space="preserve">Those conditions belong to the culture of the class in a narrow, ecological sense: the immediate setting in which language work was asked to happen (van Lier, 2004). They are not a claim about Pakistani culture, nor about a national educational system. Most respondents selected Pakistani nationality, and that is the only Pakistan connection the dataset can support.</w:t>
       </w:r>
     </w:p>
     <w:p>
@@ -2993,81 +2931,134 @@
         <w:pStyle w:val="BodyText"/>
       </w:pPr>
       <w:r>
-        <w:t xml:space="preserve">Participation in this dataset co-occurred with reported platform access, power and connectivity problems, and a home that many described as not quiet. That is a description of domestic participation conditions, not a claim that inequality is</w:t>
-      </w:r>
-      <w:r>
-        <w:t xml:space="preserve"> </w:t>
-      </w:r>
-      <w:r>
-        <w:t xml:space="preserve">“</w:t>
-      </w:r>
-      <w:r>
-        <w:t xml:space="preserve">cultural.</w:t>
-      </w:r>
-      <w:r>
-        <w:t xml:space="preserve">”</w:t>
-      </w:r>
-    </w:p>
-    <w:bookmarkEnd w:id="39"/>
-    <w:bookmarkStart w:id="40" w:name="pedagogical-implications"/>
-    <w:p>
-      <w:pPr>
-        <w:pStyle w:val="Heading2"/>
-      </w:pPr>
-      <w:r>
-        <w:t xml:space="preserve">6. Pedagogical implications</w:t>
+        <w:t xml:space="preserve">The platform pattern is best read as a possible geography of delivery. Applications often used in Chinese-university teaching (QQ, Chaoxing, DingTalk, 中国慕课) were frequently marked unusable, while Zoom and WhatsApp were more often marked available. The questionnaire cannot say whether that pattern reflects country restrictions, routing, account rules, skills, or virtual private networks. It can say that a travelling course which assumes a single institutional toolkit may ask learners to enter a class they cannot reliably open.</w:t>
       </w:r>
     </w:p>
     <w:p>
       <w:pPr>
-        <w:pStyle w:val="FirstParagraph"/>
-      </w:pPr>
-      <w:r>
-        <w:t xml:space="preserve">In this sample, the questionnaire can support only a small set of classroom decisions.</w:t>
+        <w:pStyle w:val="BodyText"/>
+      </w:pPr>
+      <w:r>
+        <w:t xml:space="preserve">Participation in this dataset co-occurred with reported platform access, power and connectivity problems, and a home that many described as not quiet. That is a description of domestic participation conditions, not a claim that inequality is</w:t>
+      </w:r>
+      <w:r>
+        <w:t xml:space="preserve"> </w:t>
+      </w:r>
+      <w:r>
+        <w:t xml:space="preserve">“</w:t>
+      </w:r>
+      <w:r>
+        <w:t xml:space="preserve">cultural.</w:t>
+      </w:r>
+      <w:r>
+        <w:t xml:space="preserve">”</w:t>
+      </w:r>
+    </w:p>
+    <w:bookmarkEnd w:id="40"/>
+    <w:bookmarkStart w:id="45" w:name="pedagogical-implications"/>
+    <w:p>
+      <w:pPr>
+        <w:pStyle w:val="Heading2"/>
+      </w:pPr>
+      <w:r>
+        <w:t xml:space="preserve">6. Pedagogical implications</w:t>
       </w:r>
     </w:p>
     <w:p>
       <w:pPr>
-        <w:pStyle w:val="BodyText"/>
-      </w:pPr>
-      <w:r>
-        <w:t xml:space="preserve">First, do not treat the sending-side toolkit as given. QQ, Chaoxing, DingTalk, and 中国慕课 were frequently marked unusable. Before a program requires a platform, it has to ask whether learners can open it where they sit, and it has to name a usable alternative. WhatsApp was marked available here, but it was not recorded as used for class, so the data do not recommend it as a replacement.</w:t>
+        <w:pStyle w:val="FirstParagraph"/>
+      </w:pPr>
+      <w:r>
+        <w:t xml:space="preserve">In this sample, the questionnaire can support only a small set of classroom decisions.</w:t>
+      </w:r>
+    </w:p>
+    <w:bookmarkStart w:id="41" w:name="platform-selection"/>
+    <w:p>
+      <w:pPr>
+        <w:pStyle w:val="Heading3"/>
+      </w:pPr>
+      <w:r>
+        <w:t xml:space="preserve">Platform selection</w:t>
       </w:r>
     </w:p>
     <w:p>
       <w:pPr>
-        <w:pStyle w:val="BodyText"/>
-      </w:pPr>
-      <w:r>
-        <w:t xml:space="preserve">Second, do not treat a live oral hour as the only assessable performance. Only 28.9% described the home as quiet, 42.1% reported power interruptions, and 76.3% reported unstable networks. Assessment that assumes a quiet, continuous campus hour will mark some of those conditions as learner failure.</w:t>
+        <w:pStyle w:val="FirstParagraph"/>
+      </w:pPr>
+      <w:r>
+        <w:t xml:space="preserve">Because QQ and Chaoxing were frequently marked unusable (Table 3), a program should not treat the sending-side toolkit as given. Before it requires a platform, it has to ask whether learners can open it where they sit, and it has to name a usable alternative. WhatsApp was marked available here, but it was not recorded as used for class, so the data do not recommend it as a replacement.</w:t>
+      </w:r>
+    </w:p>
+    <w:bookmarkEnd w:id="41"/>
+    <w:bookmarkStart w:id="42" w:name="assessment-modes"/>
+    <w:p>
+      <w:pPr>
+        <w:pStyle w:val="Heading3"/>
+      </w:pPr>
+      <w:r>
+        <w:t xml:space="preserve">Assessment modes</w:t>
       </w:r>
     </w:p>
     <w:p>
       <w:pPr>
-        <w:pStyle w:val="BodyText"/>
-      </w:pPr>
-      <w:r>
-        <w:t xml:space="preserve">Third, offer a shorter live slot or an asynchronous oral alternative. Preferred live length here was 45 minutes for half of the respondents and 30 minutes for 28.9%. One open comment said that even one minute online was</w:t>
-      </w:r>
-      <w:r>
-        <w:t xml:space="preserve"> </w:t>
-      </w:r>
-      <w:r>
-        <w:t xml:space="preserve">“</w:t>
-      </w:r>
-      <w:r>
-        <w:t xml:space="preserve">not suitable.</w:t>
-      </w:r>
-      <w:r>
-        <w:t xml:space="preserve">”</w:t>
+        <w:pStyle w:val="FirstParagraph"/>
+      </w:pPr>
+      <w:r>
+        <w:t xml:space="preserve">Because only 28.9% described the home as quiet, 42.1% reported power interruptions, and 76.3% reported unstable networks (Table 2), institutions should not treat a live oral hour as the only assessable performance. Assessment that assumes a quiet, continuous campus hour will mark some of those conditions as learner failure.</w:t>
+      </w:r>
+    </w:p>
+    <w:bookmarkEnd w:id="42"/>
+    <w:bookmarkStart w:id="43" w:name="live-session-duration"/>
+    <w:p>
+      <w:pPr>
+        <w:pStyle w:val="Heading3"/>
+      </w:pPr>
+      <w:r>
+        <w:t xml:space="preserve">Live session duration</w:t>
       </w:r>
     </w:p>
     <w:p>
       <w:pPr>
-        <w:pStyle w:val="BodyText"/>
-      </w:pPr>
-      <w:r>
-        <w:t xml:space="preserve">Fourth, collect household and access conditions as part of course design, not after complaints. The form shows those conditions. It does not show how institutions adapted.</w:t>
+        <w:pStyle w:val="FirstParagraph"/>
+      </w:pPr>
+      <w:r>
+        <w:t xml:space="preserve">Preferred live length here was 45 minutes for half of the respondents and 30 minutes for 28.9%. One open comment said that even one minute online was</w:t>
+      </w:r>
+      <w:r>
+        <w:t xml:space="preserve"> </w:t>
+      </w:r>
+      <w:r>
+        <w:t xml:space="preserve">“</w:t>
+      </w:r>
+      <w:r>
+        <w:t xml:space="preserve">not suitable.</w:t>
+      </w:r>
+      <w:r>
+        <w:t xml:space="preserve">”</w:t>
+      </w:r>
+      <w:r>
+        <w:t xml:space="preserve"> </w:t>
+      </w:r>
+      <w:r>
+        <w:t xml:space="preserve">A shorter live slot or an asynchronous oral alternative is the suggestion the data can support.</w:t>
+      </w:r>
+    </w:p>
+    <w:bookmarkEnd w:id="43"/>
+    <w:bookmarkStart w:id="44" w:name="collecting-access-data"/>
+    <w:p>
+      <w:pPr>
+        <w:pStyle w:val="Heading3"/>
+      </w:pPr>
+      <w:r>
+        <w:t xml:space="preserve">Collecting access data</w:t>
+      </w:r>
+    </w:p>
+    <w:p>
+      <w:pPr>
+        <w:pStyle w:val="FirstParagraph"/>
+      </w:pPr>
+      <w:r>
+        <w:t xml:space="preserve">The form shows household and access conditions. It does not show how institutions adapted. Those conditions should be collected as part of course design, not after complaints.</w:t>
       </w:r>
     </w:p>
     <w:p>
@@ -3094,8 +3085,9 @@
         <w:t xml:space="preserve">reproduce a similar mismatch if the delivery assumptions of a travelling course are left unexamined (Stockwell &amp; Wang, 2023).</w:t>
       </w:r>
     </w:p>
-    <w:bookmarkEnd w:id="40"/>
-    <w:bookmarkStart w:id="41" w:name="limitations"/>
+    <w:bookmarkEnd w:id="44"/>
+    <w:bookmarkEnd w:id="45"/>
+    <w:bookmarkStart w:id="46" w:name="limitations"/>
     <w:p>
       <w:pPr>
         <w:pStyle w:val="Heading2"/>
@@ -3109,11 +3101,11 @@
         <w:pStyle w:val="FirstParagraph"/>
       </w:pPr>
       <w:r>
-        <w:t xml:space="preserve">The sample is small (N = 38), network-recruited, and majority male. Recruitment channel, host university, program type, and place of residence that week were not recorded, so Chinese-university enrollment is not independently verified. IP metadata are not a location measure. All outcomes are self-report. The appraisal index is descriptive, not a validated scale, and the infrastructure-problem count is an unvalidated post hoc indicator. The form did not measure institutional adaptation. The data are from February 2022 and concern emergency remote teaching; they are not evidence about current hybrid education. No ethics-committee number is available for the 2022 collection (Section 3.5).</w:t>
+        <w:t xml:space="preserve">The sample is small (N = 38), network-recruited, and majority male; recruitment channel, host university, program type, and place of residence were not recorded, so all outcomes are self-report from a convenience group whose enrollment was not independently verified. The data are from February 2022 and concern emergency remote teaching; they are not evidence about current hybrid education. The appraisal index is descriptive rather than a validated scale, the infrastructure-problem count is an unvalidated post hoc indicator, the form did not measure institutional adaptation, IP metadata are not a location measure, and no ethics-committee number is available for the 2022 collection (Section 3.5).</w:t>
       </w:r>
     </w:p>
-    <w:bookmarkEnd w:id="41"/>
-    <w:bookmarkStart w:id="42" w:name="conclusion"/>
+    <w:bookmarkEnd w:id="46"/>
+    <w:bookmarkStart w:id="47" w:name="conclusion"/>
     <w:p>
       <w:pPr>
         <w:pStyle w:val="Heading2"/>
@@ -3127,7 +3119,7 @@
         <w:pStyle w:val="FirstParagraph"/>
       </w:pPr>
       <w:r>
-        <w:t xml:space="preserve">This article asked whether online Chinese teaching can fail as delivery even when the content of the course remains appropriate. In this sample the answer is that it can. Respondents reporting online Chinese-language courses also reported household infrastructure problems and uneven platform access. Those conditions co-occurred with selecting</w:t>
+        <w:t xml:space="preserve">In this sample, respondents reporting online Chinese-language courses also reported household infrastructure problems and uneven platform access. Those conditions co-occurred with selecting</w:t>
       </w:r>
       <w:r>
         <w:t xml:space="preserve"> </w:t>
@@ -3145,11 +3137,11 @@
         <w:t xml:space="preserve"> </w:t>
       </w:r>
       <w:r>
-        <w:t xml:space="preserve">and with more negative appraisals of online learning. Later work on online language teaching and online ICLE supplies the lenses. The questionnaire identifies learner-side conditions that online Chinese teaching would need to address. That answer is bounded by N = 38 and by data collected during emergency remote teaching (Section 3.1). Whether later hybrid arrangements have closed the gap is a question this study cannot answer. The problem it can settle, for this sample, is the more basic one: online Chinese teaching is not only a content problem. It is also a delivery problem.</w:t>
+        <w:t xml:space="preserve">and with more negative appraisals of online learning. That answer is bounded by N = 38 and by emergency remote teaching (Section 3.1). Whether later hybrid arrangements have closed the gap is a question this study cannot answer. Online Chinese teaching is not only a content problem. It is also a delivery problem.</w:t>
       </w:r>
     </w:p>
-    <w:bookmarkEnd w:id="42"/>
-    <w:bookmarkStart w:id="43" w:name="appendix-a.-appraisal-items-and-coding"/>
+    <w:bookmarkEnd w:id="47"/>
+    <w:bookmarkStart w:id="48" w:name="appendix-a.-appraisal-items-and-coding"/>
     <w:p>
       <w:pPr>
         <w:pStyle w:val="Heading2"/>
@@ -3541,8 +3533,8 @@
         <w:t xml:space="preserve">Index = mean of Q8, Q9, and Q10 (n = 38; no missing on these three).</w:t>
       </w:r>
     </w:p>
-    <w:bookmarkEnd w:id="43"/>
-    <w:bookmarkStart w:id="44" w:name="appendix-b.-secondary-statistics"/>
+    <w:bookmarkEnd w:id="48"/>
+    <w:bookmarkStart w:id="49" w:name="appendix-b.-secondary-statistics"/>
     <w:p>
       <w:pPr>
         <w:pStyle w:val="Heading2"/>
@@ -3622,8 +3614,8 @@
         <w:t xml:space="preserve">≥ .36.</w:t>
       </w:r>
     </w:p>
-    <w:bookmarkEnd w:id="44"/>
-    <w:bookmarkStart w:id="45" w:name="references"/>
+    <w:bookmarkEnd w:id="49"/>
+    <w:bookmarkStart w:id="50" w:name="references"/>
     <w:p>
       <w:pPr>
         <w:pStyle w:val="Heading2"/>
@@ -3635,27 +3627,6 @@
     <w:p>
       <w:pPr>
         <w:pStyle w:val="FirstParagraph"/>
-      </w:pPr>
-      <w:r>
-        <w:t xml:space="preserve">Adedoyin, O. B., &amp; Soykan, E. (2020). Covid-19 pandemic and online learning: The challenges and opportunities.</w:t>
-      </w:r>
-      <w:r>
-        <w:t xml:space="preserve"> </w:t>
-      </w:r>
-      <w:r>
-        <w:rPr>
-          <w:iCs/>
-          <w:i/>
-        </w:rPr>
-        <w:t xml:space="preserve">Interactive Learning Environments, 31</w:t>
-      </w:r>
-      <w:r>
-        <w:t xml:space="preserve">(2), 863-875. https://doi.org/10.1080/10494820.2020.1813180</w:t>
-      </w:r>
-    </w:p>
-    <w:p>
-      <w:pPr>
-        <w:pStyle w:val="BodyText"/>
       </w:pPr>
       <w:r>
         <w:t xml:space="preserve">Ali, W. (2020). Online and remote learning in higher education institutes: A necessity in light of COVID-19 pandemic.</w:t>
@@ -3700,27 +3671,6 @@
         <w:pStyle w:val="BodyText"/>
       </w:pPr>
       <w:r>
-        <w:t xml:space="preserve">Bond, M., Bedenlier, S., Marín, V. I., &amp; Händel, M. (2021). Emergency remote teaching in higher education: Mapping the first global online semester.</w:t>
-      </w:r>
-      <w:r>
-        <w:t xml:space="preserve"> </w:t>
-      </w:r>
-      <w:r>
-        <w:rPr>
-          <w:iCs/>
-          <w:i/>
-        </w:rPr>
-        <w:t xml:space="preserve">International Journal of Educational Technology in Higher Education, 18</w:t>
-      </w:r>
-      <w:r>
-        <w:t xml:space="preserve">(1), Article 50. https://doi.org/10.1186/s41239-021-00282-x</w:t>
-      </w:r>
-    </w:p>
-    <w:p>
-      <w:pPr>
-        <w:pStyle w:val="BodyText"/>
-      </w:pPr>
-      <w:r>
         <w:t xml:space="preserve">Butt, A., &amp; Sadaf, M. (2026). Getting around the digital horizon: Recognizing multifaceted digital divide among university students in Pakistan.</w:t>
       </w:r>
       <w:r>
@@ -4036,7 +3986,256 @@
         <w:pStyle w:val="BodyText"/>
       </w:pPr>
       <w:r>
-        <w:t xml:space="preserve">Lam, K. Y. (2024). At the intersection of multiliteracies and glocalisation: A case study in a university in Taiwan.</w:t>
+        <w:t xml:space="preserve">Li, J., &amp; Li, C. (2024). A scoping review of the research on the teaching models of online international Chinese language teaching.</w:t>
+      </w:r>
+      <w:r>
+        <w:t xml:space="preserve"> </w:t>
+      </w:r>
+      <w:r>
+        <w:rPr>
+          <w:iCs/>
+          <w:i/>
+        </w:rPr>
+        <w:t xml:space="preserve">Journal of Education and Learning, 13</w:t>
+      </w:r>
+      <w:r>
+        <w:t xml:space="preserve">(4), Article 255. https://doi.org/10.5539/jel.v13n4p255</w:t>
+      </w:r>
+    </w:p>
+    <w:p>
+      <w:pPr>
+        <w:pStyle w:val="BodyText"/>
+      </w:pPr>
+      <w:r>
+        <w:t xml:space="preserve">Lomicka, L. (2020). Creating and sustaining virtual language communities.</w:t>
+      </w:r>
+      <w:r>
+        <w:t xml:space="preserve"> </w:t>
+      </w:r>
+      <w:r>
+        <w:rPr>
+          <w:iCs/>
+          <w:i/>
+        </w:rPr>
+        <w:t xml:space="preserve">Foreign Language Annals, 53</w:t>
+      </w:r>
+      <w:r>
+        <w:t xml:space="preserve">(2), 306-313. https://doi.org/10.1111/flan.12456</w:t>
+      </w:r>
+    </w:p>
+    <w:p>
+      <w:pPr>
+        <w:pStyle w:val="BodyText"/>
+      </w:pPr>
+      <w:r>
+        <w:t xml:space="preserve">Lu, X., Tan, A., Ma, Y., Feng, H., &amp; Hanif, B. (2024). Scenario analysis of localization and adaptation of Chinese language teaching.</w:t>
+      </w:r>
+      <w:r>
+        <w:t xml:space="preserve"> </w:t>
+      </w:r>
+      <w:r>
+        <w:rPr>
+          <w:iCs/>
+          <w:i/>
+        </w:rPr>
+        <w:t xml:space="preserve">Pakistan Journal of Humanities and Social Sciences, 12</w:t>
+      </w:r>
+      <w:r>
+        <w:t xml:space="preserve">(4), 3257-3281. https://doi.org/10.52131/pjhss.2024.v12i4.2553</w:t>
+      </w:r>
+    </w:p>
+    <w:p>
+      <w:pPr>
+        <w:pStyle w:val="BodyText"/>
+      </w:pPr>
+      <w:r>
+        <w:t xml:space="preserve">MacIntyre, P. D., Gregersen, T., &amp; Mercer, S. (2020). Language teachers’ coping strategies during the Covid-19 conversion to online teaching: Correlations with stress, wellbeing and negative emotions.</w:t>
+      </w:r>
+      <w:r>
+        <w:t xml:space="preserve"> </w:t>
+      </w:r>
+      <w:r>
+        <w:rPr>
+          <w:iCs/>
+          <w:i/>
+        </w:rPr>
+        <w:t xml:space="preserve">System, 94</w:t>
+      </w:r>
+      <w:r>
+        <w:t xml:space="preserve">, Article 102352. https://doi.org/10.1016/j.system.2020.102352</w:t>
+      </w:r>
+    </w:p>
+    <w:p>
+      <w:pPr>
+        <w:pStyle w:val="BodyText"/>
+      </w:pPr>
+      <w:r>
+        <w:t xml:space="preserve">McDonough, J., &amp; Shaw, C. (2003).</w:t>
+      </w:r>
+      <w:r>
+        <w:t xml:space="preserve"> </w:t>
+      </w:r>
+      <w:r>
+        <w:rPr>
+          <w:iCs/>
+          <w:i/>
+        </w:rPr>
+        <w:t xml:space="preserve">Materials and methods in ELT: A teacher’s guide</w:t>
+      </w:r>
+      <w:r>
+        <w:t xml:space="preserve"> </w:t>
+      </w:r>
+      <w:r>
+        <w:t xml:space="preserve">(2nd ed.). Blackwell.</w:t>
+      </w:r>
+    </w:p>
+    <w:p>
+      <w:pPr>
+        <w:pStyle w:val="BodyText"/>
+      </w:pPr>
+      <w:r>
+        <w:t xml:space="preserve">Moorhouse, B. L. (2023). Teachers’ digital technology use after a period of online teaching.</w:t>
+      </w:r>
+      <w:r>
+        <w:t xml:space="preserve"> </w:t>
+      </w:r>
+      <w:r>
+        <w:rPr>
+          <w:iCs/>
+          <w:i/>
+        </w:rPr>
+        <w:t xml:space="preserve">ELT Journal, 77</w:t>
+      </w:r>
+      <w:r>
+        <w:t xml:space="preserve">(4), 445-457. https://doi.org/10.1093/elt/ccac050</w:t>
+      </w:r>
+    </w:p>
+    <w:p>
+      <w:pPr>
+        <w:pStyle w:val="BodyText"/>
+      </w:pPr>
+      <w:r>
+        <w:t xml:space="preserve">Moser, K. M., Wei, T., &amp; Brenner, D. (2021). Remote teaching during COVID-19: Implications from a national survey of language educators.</w:t>
+      </w:r>
+      <w:r>
+        <w:t xml:space="preserve"> </w:t>
+      </w:r>
+      <w:r>
+        <w:rPr>
+          <w:iCs/>
+          <w:i/>
+        </w:rPr>
+        <w:t xml:space="preserve">System, 97</w:t>
+      </w:r>
+      <w:r>
+        <w:t xml:space="preserve">, Article 102431. https://doi.org/10.1016/j.system.2020.102431</w:t>
+      </w:r>
+    </w:p>
+    <w:p>
+      <w:pPr>
+        <w:pStyle w:val="BodyText"/>
+      </w:pPr>
+      <w:r>
+        <w:t xml:space="preserve">Payne, J. S. (2020). Developing L2 productive language skills online and the strategic use of instructional tools.</w:t>
+      </w:r>
+      <w:r>
+        <w:t xml:space="preserve"> </w:t>
+      </w:r>
+      <w:r>
+        <w:rPr>
+          <w:iCs/>
+          <w:i/>
+        </w:rPr>
+        <w:t xml:space="preserve">Foreign Language Annals, 53</w:t>
+      </w:r>
+      <w:r>
+        <w:t xml:space="preserve">(2), 243-249. https://doi.org/10.1111/flan.12457</w:t>
+      </w:r>
+    </w:p>
+    <w:p>
+      <w:pPr>
+        <w:pStyle w:val="BodyText"/>
+      </w:pPr>
+      <w:r>
+        <w:t xml:space="preserve">Qi, X. (2025).</w:t>
+      </w:r>
+      <w:r>
+        <w:t xml:space="preserve"> </w:t>
+      </w:r>
+      <w:r>
+        <w:t xml:space="preserve">‘</w:t>
+      </w:r>
+      <w:r>
+        <w:t xml:space="preserve">My speech becomes just a voice, a picture</w:t>
+      </w:r>
+      <w:r>
+        <w:t xml:space="preserve">’</w:t>
+      </w:r>
+      <w:r>
+        <w:t xml:space="preserve">: Exploring language anxiety in Chinese as a second language learning in online environments.</w:t>
+      </w:r>
+      <w:r>
+        <w:t xml:space="preserve"> </w:t>
+      </w:r>
+      <w:r>
+        <w:rPr>
+          <w:iCs/>
+          <w:i/>
+        </w:rPr>
+        <w:t xml:space="preserve">Language Teaching Research</w:t>
+      </w:r>
+      <w:r>
+        <w:t xml:space="preserve">. Advance online publication. https://doi.org/10.1177/13621688251387320</w:t>
+      </w:r>
+    </w:p>
+    <w:p>
+      <w:pPr>
+        <w:pStyle w:val="BodyText"/>
+      </w:pPr>
+      <w:r>
+        <w:t xml:space="preserve">Raza, O., &amp; Hennessy, S. (2025).</w:t>
+      </w:r>
+      <w:r>
+        <w:t xml:space="preserve"> </w:t>
+      </w:r>
+      <w:r>
+        <w:rPr>
+          <w:iCs/>
+          <w:i/>
+        </w:rPr>
+        <w:t xml:space="preserve">Exploring the gender differences in technology use for educational purposes at home among students in Pakistan</w:t>
+      </w:r>
+      <w:r>
+        <w:t xml:space="preserve">. EdTech Hub. https://doi.org/10.53832/edtechhub.1099</w:t>
+      </w:r>
+    </w:p>
+    <w:p>
+      <w:pPr>
+        <w:pStyle w:val="BodyText"/>
+      </w:pPr>
+      <w:r>
+        <w:t xml:space="preserve">Russell, V. (2020). Language anxiety and the online learner.</w:t>
+      </w:r>
+      <w:r>
+        <w:t xml:space="preserve"> </w:t>
+      </w:r>
+      <w:r>
+        <w:rPr>
+          <w:iCs/>
+          <w:i/>
+        </w:rPr>
+        <w:t xml:space="preserve">Foreign Language Annals, 53</w:t>
+      </w:r>
+      <w:r>
+        <w:t xml:space="preserve">(2), 338-352. https://doi.org/10.1111/flan.12461</w:t>
+      </w:r>
+    </w:p>
+    <w:p>
+      <w:pPr>
+        <w:pStyle w:val="BodyText"/>
+      </w:pPr>
+      <w:r>
+        <w:t xml:space="preserve">Shan, Z., &amp; Xu, H. (2024). Students’ conceptions and experiences of institutionalised curriculum for multilingual learning: The case of a dual-foreign-languages programme.</w:t>
       </w:r>
       <w:r>
         <w:t xml:space="preserve"> </w:t>
@@ -4049,7 +4248,7 @@
         <w:t xml:space="preserve">Language, Culture and Curriculum, 37</w:t>
       </w:r>
       <w:r>
-        <w:t xml:space="preserve">(4), 472-496. https://doi.org/10.1080/07908318.2024.2354874</w:t>
+        <w:t xml:space="preserve">(2), 230-246. https://doi.org/10.1080/07908318.2024.2313984</w:t>
       </w:r>
     </w:p>
     <w:p>
@@ -4057,178 +4256,7 @@
         <w:pStyle w:val="BodyText"/>
       </w:pPr>
       <w:r>
-        <w:t xml:space="preserve">Li, J., &amp; Li, C. (2024). A scoping review of the research on the teaching models of online international Chinese language teaching.</w:t>
-      </w:r>
-      <w:r>
-        <w:t xml:space="preserve"> </w:t>
-      </w:r>
-      <w:r>
-        <w:rPr>
-          <w:iCs/>
-          <w:i/>
-        </w:rPr>
-        <w:t xml:space="preserve">Journal of Education and Learning, 13</w:t>
-      </w:r>
-      <w:r>
-        <w:t xml:space="preserve">(4), Article 255. https://doi.org/10.5539/jel.v13n4p255</w:t>
-      </w:r>
-    </w:p>
-    <w:p>
-      <w:pPr>
-        <w:pStyle w:val="BodyText"/>
-      </w:pPr>
-      <w:r>
-        <w:t xml:space="preserve">Lomicka, L. (2020). Creating and sustaining virtual language communities.</w:t>
-      </w:r>
-      <w:r>
-        <w:t xml:space="preserve"> </w:t>
-      </w:r>
-      <w:r>
-        <w:rPr>
-          <w:iCs/>
-          <w:i/>
-        </w:rPr>
-        <w:t xml:space="preserve">Foreign Language Annals, 53</w:t>
-      </w:r>
-      <w:r>
-        <w:t xml:space="preserve">(2), 306-313. https://doi.org/10.1111/flan.12456</w:t>
-      </w:r>
-    </w:p>
-    <w:p>
-      <w:pPr>
-        <w:pStyle w:val="BodyText"/>
-      </w:pPr>
-      <w:r>
-        <w:t xml:space="preserve">Lu, X., Tan, A., Ma, Y., Feng, H., &amp; Hanif, B. (2024). Scenario analysis of localization and adaptation of Chinese language teaching.</w:t>
-      </w:r>
-      <w:r>
-        <w:t xml:space="preserve"> </w:t>
-      </w:r>
-      <w:r>
-        <w:rPr>
-          <w:iCs/>
-          <w:i/>
-        </w:rPr>
-        <w:t xml:space="preserve">Pakistan Journal of Humanities and Social Sciences, 12</w:t>
-      </w:r>
-      <w:r>
-        <w:t xml:space="preserve">(4), 3257-3281. https://doi.org/10.52131/pjhss.2024.v12i4.2553</w:t>
-      </w:r>
-    </w:p>
-    <w:p>
-      <w:pPr>
-        <w:pStyle w:val="BodyText"/>
-      </w:pPr>
-      <w:r>
-        <w:t xml:space="preserve">Ma, X., Gong, Y., Gao, X., &amp; Xiang, Y. (2017). The teaching of Chinese as a second or foreign language: A systematic review of the literature 2005-2015.</w:t>
-      </w:r>
-      <w:r>
-        <w:t xml:space="preserve"> </w:t>
-      </w:r>
-      <w:r>
-        <w:rPr>
-          <w:iCs/>
-          <w:i/>
-        </w:rPr>
-        <w:t xml:space="preserve">Journal of Multilingual and Multicultural Development, 38</w:t>
-      </w:r>
-      <w:r>
-        <w:t xml:space="preserve">(9), 815-830. https://doi.org/10.1080/01434632.2016.1268146</w:t>
-      </w:r>
-    </w:p>
-    <w:p>
-      <w:pPr>
-        <w:pStyle w:val="BodyText"/>
-      </w:pPr>
-      <w:r>
-        <w:t xml:space="preserve">MacIntyre, P. D., Gregersen, T., &amp; Mercer, S. (2020). Language teachers’ coping strategies during the Covid-19 conversion to online teaching: Correlations with stress, wellbeing and negative emotions.</w:t>
-      </w:r>
-      <w:r>
-        <w:t xml:space="preserve"> </w:t>
-      </w:r>
-      <w:r>
-        <w:rPr>
-          <w:iCs/>
-          <w:i/>
-        </w:rPr>
-        <w:t xml:space="preserve">System, 94</w:t>
-      </w:r>
-      <w:r>
-        <w:t xml:space="preserve">, Article 102352. https://doi.org/10.1016/j.system.2020.102352</w:t>
-      </w:r>
-    </w:p>
-    <w:p>
-      <w:pPr>
-        <w:pStyle w:val="BodyText"/>
-      </w:pPr>
-      <w:r>
-        <w:t xml:space="preserve">McDonough, J., &amp; Shaw, C. (2003).</w:t>
-      </w:r>
-      <w:r>
-        <w:t xml:space="preserve"> </w:t>
-      </w:r>
-      <w:r>
-        <w:rPr>
-          <w:iCs/>
-          <w:i/>
-        </w:rPr>
-        <w:t xml:space="preserve">Materials and methods in ELT: A teacher’s guide</w:t>
-      </w:r>
-      <w:r>
-        <w:t xml:space="preserve"> </w:t>
-      </w:r>
-      <w:r>
-        <w:t xml:space="preserve">(2nd ed.). Blackwell.</w:t>
-      </w:r>
-    </w:p>
-    <w:p>
-      <w:pPr>
-        <w:pStyle w:val="BodyText"/>
-      </w:pPr>
-      <w:r>
-        <w:t xml:space="preserve">Moorhouse, B. L. (2023). Teachers’ digital technology use after a period of online teaching.</w:t>
-      </w:r>
-      <w:r>
-        <w:t xml:space="preserve"> </w:t>
-      </w:r>
-      <w:r>
-        <w:rPr>
-          <w:iCs/>
-          <w:i/>
-        </w:rPr>
-        <w:t xml:space="preserve">ELT Journal, 77</w:t>
-      </w:r>
-      <w:r>
-        <w:t xml:space="preserve">(4), 445-457. https://doi.org/10.1093/elt/ccac050</w:t>
-      </w:r>
-    </w:p>
-    <w:p>
-      <w:pPr>
-        <w:pStyle w:val="BodyText"/>
-      </w:pPr>
-      <w:r>
-        <w:t xml:space="preserve">Moorhouse, B. L., &amp; Kohnke, L. (2021). Responses of the English-language-teaching community to the COVID-19 pandemic.</w:t>
-      </w:r>
-      <w:r>
-        <w:t xml:space="preserve"> </w:t>
-      </w:r>
-      <w:r>
-        <w:rPr>
-          <w:iCs/>
-          <w:i/>
-        </w:rPr>
-        <w:t xml:space="preserve">RELC Journal, 52</w:t>
-      </w:r>
-      <w:r>
-        <w:t xml:space="preserve">(3), 359-378. https://doi.org/10.1177/00336882211053052</w:t>
-      </w:r>
-    </w:p>
-    <w:p>
-      <w:pPr>
-        <w:pStyle w:val="BodyText"/>
-      </w:pPr>
-      <w:r>
-        <w:t xml:space="preserve">Moorhouse, B. L., Wong, K. M., &amp; Li, L. (2023). Teaching with technology in the post-pandemic digital age: Technological normalisation and AI-induced disruptions.</w:t>
+        <w:t xml:space="preserve">Stockwell, G., &amp; Wang, Y. (2023). Exploring the challenges of technology in language teaching in the aftermath of the pandemic.</w:t>
       </w:r>
       <w:r>
         <w:t xml:space="preserve"> </w:t>
@@ -4241,7 +4269,7 @@
         <w:t xml:space="preserve">RELC Journal, 54</w:t>
       </w:r>
       <w:r>
-        <w:t xml:space="preserve">(2), 311-320. https://doi.org/10.1177/00336882231176929</w:t>
+        <w:t xml:space="preserve">(2), 474-482. https://doi.org/10.1177/00336882231168438</w:t>
       </w:r>
     </w:p>
     <w:p>
@@ -4249,7 +4277,7 @@
         <w:pStyle w:val="BodyText"/>
       </w:pPr>
       <w:r>
-        <w:t xml:space="preserve">Moser, K. M., Wei, T., &amp; Brenner, D. (2021). Remote teaching during COVID-19: Implications from a national survey of language educators.</w:t>
+        <w:t xml:space="preserve">Tao, J., &amp; Gao, X. (2022). Teaching and learning languages online: Challenges and responses.</w:t>
       </w:r>
       <w:r>
         <w:t xml:space="preserve"> </w:t>
@@ -4259,10 +4287,10 @@
           <w:iCs/>
           <w:i/>
         </w:rPr>
-        <w:t xml:space="preserve">System, 97</w:t>
-      </w:r>
-      <w:r>
-        <w:t xml:space="preserve">, Article 102431. https://doi.org/10.1016/j.system.2020.102431</w:t>
+        <w:t xml:space="preserve">System, 107</w:t>
+      </w:r>
+      <w:r>
+        <w:t xml:space="preserve">, Article 102819. https://doi.org/10.1016/j.system.2022.102819</w:t>
       </w:r>
     </w:p>
     <w:p>
@@ -4270,7 +4298,7 @@
         <w:pStyle w:val="BodyText"/>
       </w:pPr>
       <w:r>
-        <w:t xml:space="preserve">Payne, J. S. (2020). Developing L2 productive language skills online and the strategic use of instructional tools.</w:t>
+        <w:t xml:space="preserve">Tomlinson, B. (Ed.). (2011).</w:t>
       </w:r>
       <w:r>
         <w:t xml:space="preserve"> </w:t>
@@ -4280,10 +4308,13 @@
           <w:iCs/>
           <w:i/>
         </w:rPr>
-        <w:t xml:space="preserve">Foreign Language Annals, 53</w:t>
-      </w:r>
-      <w:r>
-        <w:t xml:space="preserve">(2), 243-249. https://doi.org/10.1111/flan.12457</w:t>
+        <w:t xml:space="preserve">Materials development in language teaching</w:t>
+      </w:r>
+      <w:r>
+        <w:t xml:space="preserve"> </w:t>
+      </w:r>
+      <w:r>
+        <w:t xml:space="preserve">(2nd ed.). Cambridge University Press.</w:t>
       </w:r>
     </w:p>
     <w:p>
@@ -4291,7 +4322,7 @@
         <w:pStyle w:val="BodyText"/>
       </w:pPr>
       <w:r>
-        <w:t xml:space="preserve">Qi, X. (2025).</w:t>
+        <w:t xml:space="preserve">Tu, M. (2026). Time and precarity in</w:t>
       </w:r>
       <w:r>
         <w:t xml:space="preserve"> </w:t>
@@ -4300,13 +4331,163 @@
         <w:t xml:space="preserve">‘</w:t>
       </w:r>
       <w:r>
-        <w:t xml:space="preserve">My speech becomes just a voice, a picture</w:t>
+        <w:t xml:space="preserve">South–South</w:t>
       </w:r>
       <w:r>
         <w:t xml:space="preserve">’</w:t>
       </w:r>
       <w:r>
-        <w:t xml:space="preserve">: Exploring language anxiety in Chinese as a second language learning in online environments.</w:t>
+        <w:t xml:space="preserve"> </w:t>
+      </w:r>
+      <w:r>
+        <w:t xml:space="preserve">academic mobility: A 2019–2023 longitudinal study of Pakistani PhD students and recent graduates in China.</w:t>
+      </w:r>
+      <w:r>
+        <w:t xml:space="preserve"> </w:t>
+      </w:r>
+      <w:r>
+        <w:rPr>
+          <w:iCs/>
+          <w:i/>
+        </w:rPr>
+        <w:t xml:space="preserve">Population, Space and Place, 32</w:t>
+      </w:r>
+      <w:r>
+        <w:t xml:space="preserve">(2), Article e70227. https://doi.org/10.1002/psp.70227</w:t>
+      </w:r>
+    </w:p>
+    <w:p>
+      <w:pPr>
+        <w:pStyle w:val="BodyText"/>
+      </w:pPr>
+      <w:r>
+        <w:t xml:space="preserve">van Dijk, J. (2020).</w:t>
+      </w:r>
+      <w:r>
+        <w:t xml:space="preserve"> </w:t>
+      </w:r>
+      <w:r>
+        <w:rPr>
+          <w:iCs/>
+          <w:i/>
+        </w:rPr>
+        <w:t xml:space="preserve">The digital divide</w:t>
+      </w:r>
+      <w:r>
+        <w:t xml:space="preserve">. Polity.</w:t>
+      </w:r>
+    </w:p>
+    <w:p>
+      <w:pPr>
+        <w:pStyle w:val="BodyText"/>
+      </w:pPr>
+      <w:r>
+        <w:t xml:space="preserve">van Lier, L. (2004).</w:t>
+      </w:r>
+      <w:r>
+        <w:t xml:space="preserve"> </w:t>
+      </w:r>
+      <w:r>
+        <w:rPr>
+          <w:iCs/>
+          <w:i/>
+        </w:rPr>
+        <w:t xml:space="preserve">The ecology and semiotics of language learning: A sociocultural perspective</w:t>
+      </w:r>
+      <w:r>
+        <w:t xml:space="preserve">. Kluwer.</w:t>
+      </w:r>
+    </w:p>
+    <w:p>
+      <w:pPr>
+        <w:pStyle w:val="BodyText"/>
+      </w:pPr>
+      <w:r>
+        <w:t xml:space="preserve">Vishnu, S., Tengli, M. B., Ramadas, S., Sathyan, A. R., &amp; Bhatt, A. (2024). Bridging the divide: Assessing digital infrastructure for higher education online learning.</w:t>
+      </w:r>
+      <w:r>
+        <w:t xml:space="preserve"> </w:t>
+      </w:r>
+      <w:r>
+        <w:rPr>
+          <w:iCs/>
+          <w:i/>
+        </w:rPr>
+        <w:t xml:space="preserve">TechTrends, 68</w:t>
+      </w:r>
+      <w:r>
+        <w:t xml:space="preserve">(6), 1107-1116. https://doi.org/10.1007/s11528-024-00997-4</w:t>
+      </w:r>
+    </w:p>
+    <w:p>
+      <w:pPr>
+        <w:pStyle w:val="BodyText"/>
+      </w:pPr>
+      <w:r>
+        <w:t xml:space="preserve">Warschauer, M. (2003).</w:t>
+      </w:r>
+      <w:r>
+        <w:t xml:space="preserve"> </w:t>
+      </w:r>
+      <w:r>
+        <w:rPr>
+          <w:iCs/>
+          <w:i/>
+        </w:rPr>
+        <w:t xml:space="preserve">Technology and social inclusion: Rethinking the digital divide</w:t>
+      </w:r>
+      <w:r>
+        <w:t xml:space="preserve">. MIT Press.</w:t>
+      </w:r>
+    </w:p>
+    <w:p>
+      <w:pPr>
+        <w:pStyle w:val="BodyText"/>
+      </w:pPr>
+      <w:r>
+        <w:t xml:space="preserve">Wen, X., &amp; Liu, F. (2025). Emotional dynamics of advanced Chinese as a second language learners: A Q methodology study.</w:t>
+      </w:r>
+      <w:r>
+        <w:t xml:space="preserve"> </w:t>
+      </w:r>
+      <w:r>
+        <w:rPr>
+          <w:iCs/>
+          <w:i/>
+        </w:rPr>
+        <w:t xml:space="preserve">Language, Culture and Curriculum, 38</w:t>
+      </w:r>
+      <w:r>
+        <w:t xml:space="preserve">(3), 380-400. https://doi.org/10.1080/07908318.2025.2486449</w:t>
+      </w:r>
+    </w:p>
+    <w:p>
+      <w:pPr>
+        <w:pStyle w:val="BodyText"/>
+      </w:pPr>
+      <w:r>
+        <w:t xml:space="preserve">White, C. (2006). Distance learning of foreign languages.</w:t>
+      </w:r>
+      <w:r>
+        <w:t xml:space="preserve"> </w:t>
+      </w:r>
+      <w:r>
+        <w:rPr>
+          <w:iCs/>
+          <w:i/>
+        </w:rPr>
+        <w:t xml:space="preserve">Language Teaching, 39</w:t>
+      </w:r>
+      <w:r>
+        <w:t xml:space="preserve">(4), 247-264. https://doi.org/10.1017/S0261444806003727</w:t>
+      </w:r>
+    </w:p>
+    <w:p>
+      <w:pPr>
+        <w:pStyle w:val="BodyText"/>
+      </w:pPr>
+      <w:r>
+        <w:t xml:space="preserve">Xu, B. (2024). Technology integration into Chinese as a foreign language learning in higher education: An integrated bibliometric analysis and systematic review (2000–2024).</w:t>
       </w:r>
       <w:r>
         <w:t xml:space="preserve"> </w:t>
@@ -4319,342 +4500,6 @@
         <w:t xml:space="preserve">Language Teaching Research</w:t>
       </w:r>
       <w:r>
-        <w:t xml:space="preserve">. Advance online publication. https://doi.org/10.1177/13621688251387320</w:t>
-      </w:r>
-    </w:p>
-    <w:p>
-      <w:pPr>
-        <w:pStyle w:val="BodyText"/>
-      </w:pPr>
-      <w:r>
-        <w:t xml:space="preserve">Raza, O., &amp; Hennessy, S. (2025).</w:t>
-      </w:r>
-      <w:r>
-        <w:t xml:space="preserve"> </w:t>
-      </w:r>
-      <w:r>
-        <w:rPr>
-          <w:iCs/>
-          <w:i/>
-        </w:rPr>
-        <w:t xml:space="preserve">Exploring the gender differences in technology use for educational purposes at home among students in Pakistan</w:t>
-      </w:r>
-      <w:r>
-        <w:t xml:space="preserve">. EdTech Hub. https://doi.org/10.53832/edtechhub.1099</w:t>
-      </w:r>
-    </w:p>
-    <w:p>
-      <w:pPr>
-        <w:pStyle w:val="BodyText"/>
-      </w:pPr>
-      <w:r>
-        <w:t xml:space="preserve">Russell, V. (2020). Language anxiety and the online learner.</w:t>
-      </w:r>
-      <w:r>
-        <w:t xml:space="preserve"> </w:t>
-      </w:r>
-      <w:r>
-        <w:rPr>
-          <w:iCs/>
-          <w:i/>
-        </w:rPr>
-        <w:t xml:space="preserve">Foreign Language Annals, 53</w:t>
-      </w:r>
-      <w:r>
-        <w:t xml:space="preserve">(2), 338-352. https://doi.org/10.1111/flan.12461</w:t>
-      </w:r>
-    </w:p>
-    <w:p>
-      <w:pPr>
-        <w:pStyle w:val="BodyText"/>
-      </w:pPr>
-      <w:r>
-        <w:t xml:space="preserve">Shan, Z., &amp; Xu, H. (2024). Students’ conceptions and experiences of institutionalised curriculum for multilingual learning: The case of a dual-foreign-languages programme.</w:t>
-      </w:r>
-      <w:r>
-        <w:t xml:space="preserve"> </w:t>
-      </w:r>
-      <w:r>
-        <w:rPr>
-          <w:iCs/>
-          <w:i/>
-        </w:rPr>
-        <w:t xml:space="preserve">Language, Culture and Curriculum, 37</w:t>
-      </w:r>
-      <w:r>
-        <w:t xml:space="preserve">(2), 230-246. https://doi.org/10.1080/07908318.2024.2313984</w:t>
-      </w:r>
-    </w:p>
-    <w:p>
-      <w:pPr>
-        <w:pStyle w:val="BodyText"/>
-      </w:pPr>
-      <w:r>
-        <w:t xml:space="preserve">Stockwell, G., &amp; Wang, Y. (2023). Exploring the challenges of technology in language teaching in the aftermath of the pandemic.</w:t>
-      </w:r>
-      <w:r>
-        <w:t xml:space="preserve"> </w:t>
-      </w:r>
-      <w:r>
-        <w:rPr>
-          <w:iCs/>
-          <w:i/>
-        </w:rPr>
-        <w:t xml:space="preserve">RELC Journal, 54</w:t>
-      </w:r>
-      <w:r>
-        <w:t xml:space="preserve">(2), 474-482. https://doi.org/10.1177/00336882231168438</w:t>
-      </w:r>
-    </w:p>
-    <w:p>
-      <w:pPr>
-        <w:pStyle w:val="BodyText"/>
-      </w:pPr>
-      <w:r>
-        <w:t xml:space="preserve">Tao, J., &amp; Gao, X. (2022). Teaching and learning languages online: Challenges and responses.</w:t>
-      </w:r>
-      <w:r>
-        <w:t xml:space="preserve"> </w:t>
-      </w:r>
-      <w:r>
-        <w:rPr>
-          <w:iCs/>
-          <w:i/>
-        </w:rPr>
-        <w:t xml:space="preserve">System, 107</w:t>
-      </w:r>
-      <w:r>
-        <w:t xml:space="preserve">, Article 102819. https://doi.org/10.1016/j.system.2022.102819</w:t>
-      </w:r>
-    </w:p>
-    <w:p>
-      <w:pPr>
-        <w:pStyle w:val="BodyText"/>
-      </w:pPr>
-      <w:r>
-        <w:t xml:space="preserve">Tomlinson, B. (Ed.). (2011).</w:t>
-      </w:r>
-      <w:r>
-        <w:t xml:space="preserve"> </w:t>
-      </w:r>
-      <w:r>
-        <w:rPr>
-          <w:iCs/>
-          <w:i/>
-        </w:rPr>
-        <w:t xml:space="preserve">Materials development in language teaching</w:t>
-      </w:r>
-      <w:r>
-        <w:t xml:space="preserve"> </w:t>
-      </w:r>
-      <w:r>
-        <w:t xml:space="preserve">(2nd ed.). Cambridge University Press.</w:t>
-      </w:r>
-    </w:p>
-    <w:p>
-      <w:pPr>
-        <w:pStyle w:val="BodyText"/>
-      </w:pPr>
-      <w:r>
-        <w:t xml:space="preserve">Tu, M. (2026). Time and precarity in</w:t>
-      </w:r>
-      <w:r>
-        <w:t xml:space="preserve"> </w:t>
-      </w:r>
-      <w:r>
-        <w:t xml:space="preserve">‘</w:t>
-      </w:r>
-      <w:r>
-        <w:t xml:space="preserve">South–South</w:t>
-      </w:r>
-      <w:r>
-        <w:t xml:space="preserve">’</w:t>
-      </w:r>
-      <w:r>
-        <w:t xml:space="preserve"> </w:t>
-      </w:r>
-      <w:r>
-        <w:t xml:space="preserve">academic mobility: A 2019–2023 longitudinal study of Pakistani PhD students and recent graduates in China.</w:t>
-      </w:r>
-      <w:r>
-        <w:t xml:space="preserve"> </w:t>
-      </w:r>
-      <w:r>
-        <w:rPr>
-          <w:iCs/>
-          <w:i/>
-        </w:rPr>
-        <w:t xml:space="preserve">Population, Space and Place, 32</w:t>
-      </w:r>
-      <w:r>
-        <w:t xml:space="preserve">(2), Article e70227. https://doi.org/10.1002/psp.70227</w:t>
-      </w:r>
-    </w:p>
-    <w:p>
-      <w:pPr>
-        <w:pStyle w:val="BodyText"/>
-      </w:pPr>
-      <w:r>
-        <w:t xml:space="preserve">van Dijk, J. (2020).</w:t>
-      </w:r>
-      <w:r>
-        <w:t xml:space="preserve"> </w:t>
-      </w:r>
-      <w:r>
-        <w:rPr>
-          <w:iCs/>
-          <w:i/>
-        </w:rPr>
-        <w:t xml:space="preserve">The digital divide</w:t>
-      </w:r>
-      <w:r>
-        <w:t xml:space="preserve">. Polity.</w:t>
-      </w:r>
-    </w:p>
-    <w:p>
-      <w:pPr>
-        <w:pStyle w:val="BodyText"/>
-      </w:pPr>
-      <w:r>
-        <w:t xml:space="preserve">van Lier, L. (2004).</w:t>
-      </w:r>
-      <w:r>
-        <w:t xml:space="preserve"> </w:t>
-      </w:r>
-      <w:r>
-        <w:rPr>
-          <w:iCs/>
-          <w:i/>
-        </w:rPr>
-        <w:t xml:space="preserve">The ecology and semiotics of language learning: A sociocultural perspective</w:t>
-      </w:r>
-      <w:r>
-        <w:t xml:space="preserve">. Kluwer.</w:t>
-      </w:r>
-    </w:p>
-    <w:p>
-      <w:pPr>
-        <w:pStyle w:val="BodyText"/>
-      </w:pPr>
-      <w:r>
-        <w:t xml:space="preserve">Vishnu, S., Tengli, M. B., Ramadas, S., Sathyan, A. R., &amp; Bhatt, A. (2024). Bridging the divide: Assessing digital infrastructure for higher education online learning.</w:t>
-      </w:r>
-      <w:r>
-        <w:t xml:space="preserve"> </w:t>
-      </w:r>
-      <w:r>
-        <w:rPr>
-          <w:iCs/>
-          <w:i/>
-        </w:rPr>
-        <w:t xml:space="preserve">TechTrends, 68</w:t>
-      </w:r>
-      <w:r>
-        <w:t xml:space="preserve">(6), 1107-1116. https://doi.org/10.1007/s11528-024-00997-4</w:t>
-      </w:r>
-    </w:p>
-    <w:p>
-      <w:pPr>
-        <w:pStyle w:val="BodyText"/>
-      </w:pPr>
-      <w:r>
-        <w:t xml:space="preserve">Warschauer, M. (2003).</w:t>
-      </w:r>
-      <w:r>
-        <w:t xml:space="preserve"> </w:t>
-      </w:r>
-      <w:r>
-        <w:rPr>
-          <w:iCs/>
-          <w:i/>
-        </w:rPr>
-        <w:t xml:space="preserve">Technology and social inclusion: Rethinking the digital divide</w:t>
-      </w:r>
-      <w:r>
-        <w:t xml:space="preserve">. MIT Press.</w:t>
-      </w:r>
-    </w:p>
-    <w:p>
-      <w:pPr>
-        <w:pStyle w:val="BodyText"/>
-      </w:pPr>
-      <w:r>
-        <w:t xml:space="preserve">Wen, X., &amp; Liu, F. (2025). Emotional dynamics of advanced Chinese as a second language learners: A Q methodology study.</w:t>
-      </w:r>
-      <w:r>
-        <w:t xml:space="preserve"> </w:t>
-      </w:r>
-      <w:r>
-        <w:rPr>
-          <w:iCs/>
-          <w:i/>
-        </w:rPr>
-        <w:t xml:space="preserve">Language, Culture and Curriculum, 38</w:t>
-      </w:r>
-      <w:r>
-        <w:t xml:space="preserve">(3), 380-400. https://doi.org/10.1080/07908318.2025.2486449</w:t>
-      </w:r>
-    </w:p>
-    <w:p>
-      <w:pPr>
-        <w:pStyle w:val="BodyText"/>
-      </w:pPr>
-      <w:r>
-        <w:t xml:space="preserve">White, C. (2006). Distance learning of foreign languages.</w:t>
-      </w:r>
-      <w:r>
-        <w:t xml:space="preserve"> </w:t>
-      </w:r>
-      <w:r>
-        <w:rPr>
-          <w:iCs/>
-          <w:i/>
-        </w:rPr>
-        <w:t xml:space="preserve">Language Teaching, 39</w:t>
-      </w:r>
-      <w:r>
-        <w:t xml:space="preserve">(4), 247-264. https://doi.org/10.1017/S0261444806003727</w:t>
-      </w:r>
-    </w:p>
-    <w:p>
-      <w:pPr>
-        <w:pStyle w:val="BodyText"/>
-      </w:pPr>
-      <w:r>
-        <w:t xml:space="preserve">Xia, Y., Hu, Y., Wu, C., Yang, L., &amp; Lei, M. (2022). Challenges of online learning amid the COVID-19: College students’ perspective.</w:t>
-      </w:r>
-      <w:r>
-        <w:t xml:space="preserve"> </w:t>
-      </w:r>
-      <w:r>
-        <w:rPr>
-          <w:iCs/>
-          <w:i/>
-        </w:rPr>
-        <w:t xml:space="preserve">Frontiers in Psychology, 13</w:t>
-      </w:r>
-      <w:r>
-        <w:t xml:space="preserve">, 1037311. https://doi.org/10.3389/fpsyg.2022.1037311</w:t>
-      </w:r>
-    </w:p>
-    <w:p>
-      <w:pPr>
-        <w:pStyle w:val="BodyText"/>
-      </w:pPr>
-      <w:r>
-        <w:t xml:space="preserve">Xu, B. (2024). Technology integration into Chinese as a foreign language learning in higher education: An integrated bibliometric analysis and systematic review (2000–2024).</w:t>
-      </w:r>
-      <w:r>
-        <w:t xml:space="preserve"> </w:t>
-      </w:r>
-      <w:r>
-        <w:rPr>
-          <w:iCs/>
-          <w:i/>
-        </w:rPr>
-        <w:t xml:space="preserve">Language Teaching Research</w:t>
-      </w:r>
-      <w:r>
         <w:t xml:space="preserve">. Advance online publication. https://doi.org/10.1177/13621688241277911</w:t>
       </w:r>
     </w:p>
@@ -4784,8 +4629,8 @@
         <w:t xml:space="preserve">(2), 263-288. https://doi.org/10.1515/glochi-2020-0014</w:t>
       </w:r>
     </w:p>
-    <w:bookmarkEnd w:id="45"/>
-    <w:bookmarkEnd w:id="46"/>
+    <w:bookmarkEnd w:id="50"/>
+    <w:bookmarkEnd w:id="51"/>
     <w:sectPr>
       <w:pgSz w:h="15840" w:w="12240"/>
       <w:pgMar w:bottom="1440" w:footer="720" w:gutter="0" w:header="720" w:left="1440" w:right="1440" w:top="1440"/>
@@ -5062,6 +4907,82 @@
     <w:lvl w:ilvl="8">
       <w:numFmt w:val="bullet"/>
       <w:lvlText w:val=" "/>
+      <w:lvlJc w:val="left"/>
+      <w:pPr>
+        <w:ind w:left="6480" w:hanging="480"/>
+      </w:pPr>
+    </w:lvl>
+  </w:abstractNum>
+  <w:abstractNum w:abstractNumId="991">
+    <w:nsid w:val="A991"/>
+    <w:multiLevelType w:val="multilevel"/>
+    <w:lvl w:ilvl="0">
+      <w:numFmt w:val="bullet"/>
+      <w:lvlText w:val="•"/>
+      <w:lvlJc w:val="left"/>
+      <w:pPr>
+        <w:ind w:left="720" w:hanging="480"/>
+      </w:pPr>
+    </w:lvl>
+    <w:lvl w:ilvl="1">
+      <w:numFmt w:val="bullet"/>
+      <w:lvlText w:val="–"/>
+      <w:lvlJc w:val="left"/>
+      <w:pPr>
+        <w:ind w:left="1440" w:hanging="480"/>
+      </w:pPr>
+    </w:lvl>
+    <w:lvl w:ilvl="2">
+      <w:numFmt w:val="bullet"/>
+      <w:lvlText w:val="•"/>
+      <w:lvlJc w:val="left"/>
+      <w:pPr>
+        <w:ind w:left="2160" w:hanging="480"/>
+      </w:pPr>
+    </w:lvl>
+    <w:lvl w:ilvl="3">
+      <w:numFmt w:val="bullet"/>
+      <w:lvlText w:val="–"/>
+      <w:lvlJc w:val="left"/>
+      <w:pPr>
+        <w:ind w:left="2880" w:hanging="480"/>
+      </w:pPr>
+    </w:lvl>
+    <w:lvl w:ilvl="4">
+      <w:numFmt w:val="bullet"/>
+      <w:lvlText w:val="•"/>
+      <w:lvlJc w:val="left"/>
+      <w:pPr>
+        <w:ind w:left="3600" w:hanging="480"/>
+      </w:pPr>
+    </w:lvl>
+    <w:lvl w:ilvl="5">
+      <w:numFmt w:val="bullet"/>
+      <w:lvlText w:val="–"/>
+      <w:lvlJc w:val="left"/>
+      <w:pPr>
+        <w:ind w:left="4320" w:hanging="480"/>
+      </w:pPr>
+    </w:lvl>
+    <w:lvl w:ilvl="6">
+      <w:numFmt w:val="bullet"/>
+      <w:lvlText w:val="•"/>
+      <w:lvlJc w:val="left"/>
+      <w:pPr>
+        <w:ind w:left="5040" w:hanging="480"/>
+      </w:pPr>
+    </w:lvl>
+    <w:lvl w:ilvl="7">
+      <w:numFmt w:val="bullet"/>
+      <w:lvlText w:val="–"/>
+      <w:lvlJc w:val="left"/>
+      <w:pPr>
+        <w:ind w:left="5760" w:hanging="480"/>
+      </w:pPr>
+    </w:lvl>
+    <w:lvl w:ilvl="8">
+      <w:numFmt w:val="bullet"/>
+      <w:lvlText w:val="•"/>
       <w:lvlJc w:val="left"/>
       <w:pPr>
         <w:ind w:left="6480" w:hanging="480"/>
@@ -5184,34 +5105,7 @@
     <w:abstractNumId w:val="990"/>
   </w:num>
   <w:num w:numId="1001">
-    <w:abstractNumId w:val="99411"/>
-    <w:lvlOverride w:ilvl="0">
-      <w:startOverride w:val="1"/>
-    </w:lvlOverride>
-    <w:lvlOverride w:ilvl="1">
-      <w:startOverride w:val="1"/>
-    </w:lvlOverride>
-    <w:lvlOverride w:ilvl="2">
-      <w:startOverride w:val="1"/>
-    </w:lvlOverride>
-    <w:lvlOverride w:ilvl="3">
-      <w:startOverride w:val="1"/>
-    </w:lvlOverride>
-    <w:lvlOverride w:ilvl="4">
-      <w:startOverride w:val="1"/>
-    </w:lvlOverride>
-    <w:lvlOverride w:ilvl="5">
-      <w:startOverride w:val="1"/>
-    </w:lvlOverride>
-    <w:lvlOverride w:ilvl="6">
-      <w:startOverride w:val="1"/>
-    </w:lvlOverride>
-    <w:lvlOverride w:ilvl="7">
-      <w:startOverride w:val="1"/>
-    </w:lvlOverride>
-    <w:lvlOverride w:ilvl="8">
-      <w:startOverride w:val="1"/>
-    </w:lvlOverride>
+    <w:abstractNumId w:val="991"/>
   </w:num>
   <w:num w:numId="1002">
     <w:abstractNumId w:val="99411"/>

</xml_diff>

<commit_message>
Narrow the title and core question to the 2022 questionnaire
The paper now asks what 38 respondents marked about home conditions and named-platform access. It does not claim a verified population of online Chinese learners, or that a class could still be taken.

Co-authored-by: kristinehina23-rgb <kristinehina23-rgb@users.noreply.github.com>
</commit_message>
<xml_diff>
--- a/papers/q1-masters-covid/word/Rathore-Cao-Xu-When-Chinese-class-moved-home.docx
+++ b/papers/q1-masters-covid/word/Rathore-Cao-Xu-When-Chinese-class-moved-home.docx
@@ -2,13 +2,13 @@
 <file path=word/document.xml><?xml version="1.0" encoding="utf-8"?>
 <w:document xmlns:w="http://schemas.openxmlformats.org/wordprocessingml/2006/main" xmlns:m="http://schemas.openxmlformats.org/officeDocument/2006/math" xmlns:r="http://schemas.openxmlformats.org/officeDocument/2006/relationships" xmlns:o="urn:schemas-microsoft-com:office:office" xmlns:v="urn:schemas-microsoft-com:vml" xmlns:w10="urn:schemas-microsoft-com:office:word" xmlns:a="http://schemas.openxmlformats.org/drawingml/2006/main" xmlns:pic="http://schemas.openxmlformats.org/drawingml/2006/picture" xmlns:wp="http://schemas.openxmlformats.org/drawingml/2006/wordprocessingDrawing">
   <w:body>
-    <w:bookmarkStart w:id="51" w:name="Xfe8d4829385d4367282f3ebdb9ea45ec57d310c"/>
+    <w:bookmarkStart w:id="29" w:name="X3dd3c1113d3a06d75a25a5882d015703c70c3b5"/>
     <w:p>
       <w:pPr>
         <w:pStyle w:val="Heading1"/>
       </w:pPr>
       <w:r>
-        <w:t xml:space="preserve">Household infrastructure and platform access in online Chinese teaching: Localization of delivery in a travelling course</w:t>
+        <w:t xml:space="preserve">Home conditions and platform access in a 2022 online Chinese questionnaire</w:t>
       </w:r>
     </w:p>
     <w:p>
@@ -26,133 +26,7 @@
         <w:t xml:space="preserve"> </w:t>
       </w:r>
       <w:r>
-        <w:t xml:space="preserve">Online Chinese teaching: household and platform access</w:t>
-      </w:r>
-    </w:p>
-    <w:p>
-      <w:pPr>
-        <w:pStyle w:val="BodyText"/>
-      </w:pPr>
-      <w:r>
-        <w:t xml:space="preserve">Heena Rathore (corresponding author)</w:t>
-      </w:r>
-      <w:r>
-        <w:br/>
-      </w:r>
-      <w:r>
-        <w:t xml:space="preserve">PhD student, School of Foreign Languages, Sun Yat-sen University, Guangzhou, China</w:t>
-      </w:r>
-      <w:r>
-        <w:br/>
-      </w:r>
-      <w:r>
-        <w:t xml:space="preserve">Email: kristine_2020@qq.com</w:t>
-      </w:r>
-    </w:p>
-    <w:p>
-      <w:pPr>
-        <w:pStyle w:val="BodyText"/>
-      </w:pPr>
-      <w:r>
-        <w:t xml:space="preserve">Cao Huimin</w:t>
-      </w:r>
-      <w:r>
-        <w:br/>
-      </w:r>
-      <w:r>
-        <w:t xml:space="preserve">Institute for International Communication of Chinese Culture, Beijing Foreign Studies University, Beijing, China</w:t>
-      </w:r>
-    </w:p>
-    <w:p>
-      <w:pPr>
-        <w:pStyle w:val="BodyText"/>
-      </w:pPr>
-      <w:r>
-        <w:t xml:space="preserve">Xu Yiru (徐翌茹)</w:t>
-      </w:r>
-      <w:r>
-        <w:br/>
-      </w:r>
-      <w:r>
-        <w:t xml:space="preserve">School of Foreign Languages, Sun Yat-sen University, Guangzhou, China</w:t>
-      </w:r>
-      <w:r>
-        <w:br/>
-      </w:r>
-      <w:r>
-        <w:t xml:space="preserve">Email: xuyiru@mail.sysu.edu.cn</w:t>
-      </w:r>
-    </w:p>
-    <w:p>
-      <w:pPr>
-        <w:pStyle w:val="BodyText"/>
-      </w:pPr>
-      <w:r>
-        <w:rPr>
-          <w:bCs/>
-          <w:b/>
-        </w:rPr>
-        <w:t xml:space="preserve">Acknowledgments.</w:t>
-      </w:r>
-      <w:r>
-        <w:t xml:space="preserve"> </w:t>
-      </w:r>
-      <w:r>
-        <w:t xml:space="preserve">Data were collected while the first author was an M.Phil. scholar at the School of International Cultural Exchange, Central China Normal University. We thank the students who took part.</w:t>
-      </w:r>
-    </w:p>
-    <w:p>
-      <w:pPr>
-        <w:pStyle w:val="BodyText"/>
-      </w:pPr>
-      <w:r>
-        <w:rPr>
-          <w:bCs/>
-          <w:b/>
-        </w:rPr>
-        <w:t xml:space="preserve">Conflict of interest.</w:t>
-      </w:r>
-      <w:r>
-        <w:t xml:space="preserve"> </w:t>
-      </w:r>
-      <w:r>
-        <w:t xml:space="preserve">The authors declare no conflict of interest.</w:t>
-      </w:r>
-    </w:p>
-    <w:p>
-      <w:pPr>
-        <w:pStyle w:val="BodyText"/>
-      </w:pPr>
-      <w:r>
-        <w:rPr>
-          <w:bCs/>
-          <w:b/>
-        </w:rPr>
-        <w:t xml:space="preserve">Funding.</w:t>
-      </w:r>
-      <w:r>
-        <w:t xml:space="preserve"> </w:t>
-      </w:r>
-      <w:r>
-        <w:t xml:space="preserve">None.</w:t>
-      </w:r>
-    </w:p>
-    <w:p>
-      <w:pPr>
-        <w:pStyle w:val="BodyText"/>
-      </w:pPr>
-      <w:r>
-        <w:rPr>
-          <w:bCs/>
-          <w:b/>
-        </w:rPr>
-        <w:t xml:space="preserve">Data availability.</w:t>
-      </w:r>
-      <w:r>
-        <w:t xml:space="preserve"> </w:t>
-      </w:r>
-      <w:r>
-        <w:t xml:space="preserve">A de-identified analytical dataset, codebook, and analysis syntax are available in a public repository. Variables that could increase re-identification risk in this small convenience sample have been removed or coarsened. Files containing names, IP addresses, timestamps, or device identifiers will not be shared.</w:t>
+        <w:t xml:space="preserve">Home and platform access</w:t>
       </w:r>
     </w:p>
     <w:bookmarkStart w:id="20" w:name="abstract"/>
@@ -169,43 +43,7 @@
         <w:pStyle w:val="FirstParagraph"/>
       </w:pPr>
       <w:r>
-        <w:t xml:space="preserve">Online Chinese teaching can fail as delivery: content may remain appropriate while the class is closed if household power, network speed, or platform access does not support the required timetable, platforms, oral tasks, and assessment. The study proposes localization of delivery—the fit of time, platform, task, participation mode, and assessment to the receiving context—as a distinct layer of localization work for a travelling online Chinese course. A Chinese-language questionnaire asked 38 self-selected respondents (37 selected Pakistani nationality) about those learner-side conditions. Unstable networks and power interruptions were common. Home affecting study</w:t>
-      </w:r>
-      <w:r>
-        <w:t xml:space="preserve"> </w:t>
-      </w:r>
-      <w:r>
-        <w:t xml:space="preserve">“</w:t>
-      </w:r>
-      <w:r>
-        <w:t xml:space="preserve">very much</w:t>
-      </w:r>
-      <w:r>
-        <w:t xml:space="preserve">”</w:t>
-      </w:r>
-      <w:r>
-        <w:t xml:space="preserve"> </w:t>
-      </w:r>
-      <w:r>
-        <w:t xml:space="preserve">co-occurred with</w:t>
-      </w:r>
-      <w:r>
-        <w:t xml:space="preserve"> </w:t>
-      </w:r>
-      <w:r>
-        <w:t xml:space="preserve">“</w:t>
-      </w:r>
-      <w:r>
-        <w:t xml:space="preserve">very high stress,</w:t>
-      </w:r>
-      <w:r>
-        <w:t xml:space="preserve">”</w:t>
-      </w:r>
-      <w:r>
-        <w:t xml:space="preserve"> </w:t>
-      </w:r>
-      <w:r>
-        <w:t xml:space="preserve">and worse reported internet speed was associated with a more negative appraisal of online learning. QQ and Chaoxing were often marked unusable; Zoom and WhatsApp were more often marked available. Findings are exploratory and specific to a small convenience sample during emergency remote teaching; they are not evidence about current hybrid practice.</w:t>
+        <w:t xml:space="preserve">This study reports 38 completed questionnaires, written in Chinese, collected in February 2022 from respondents who said they were taking online Chinese courses. Thirty-seven selected Pakistani nationality. The question is what they marked about home conditions, connectivity, and named-platform access. The study does not ask whether a verified class could still be taken. Unstable networks and power interruptions were common. Respondents who said home conditions affected study very much also more often selected very high stress. Worse reported internet speed went with a more negative view of online learning. QQ and Chaoxing were often marked unusable. Zoom and WhatsApp were more often marked available. The sample is small. The questionnaires were collected during emergency remote teaching, so the results do not describe current hybrid practice.</w:t>
       </w:r>
     </w:p>
     <w:p>
@@ -227,25 +65,7 @@
       </w:r>
     </w:p>
     <w:bookmarkEnd w:id="20"/>
-    <w:bookmarkStart w:id="21" w:name="the-challenge"/>
-    <w:p>
-      <w:pPr>
-        <w:pStyle w:val="Heading2"/>
-      </w:pPr>
-      <w:r>
-        <w:t xml:space="preserve">The Challenge</w:t>
-      </w:r>
-    </w:p>
-    <w:p>
-      <w:pPr>
-        <w:pStyle w:val="FirstParagraph"/>
-      </w:pPr>
-      <w:r>
-        <w:t xml:space="preserve">When a Chinese course moves online, programs still have to decide the hour, the application, the oral task, and the form of assessment. If household power, network speed, or a required platform does not support those decisions, how should the program treat the failure: as a technical inconvenience, or as a teaching problem?</w:t>
-      </w:r>
-    </w:p>
-    <w:bookmarkEnd w:id="21"/>
-    <w:bookmarkStart w:id="22" w:name="introduction"/>
+    <w:bookmarkStart w:id="21" w:name="introduction"/>
     <w:p>
       <w:pPr>
         <w:pStyle w:val="Heading2"/>
@@ -259,7 +79,7 @@
         <w:pStyle w:val="FirstParagraph"/>
       </w:pPr>
       <w:r>
-        <w:t xml:space="preserve">An online Chinese course can keep its hours, platforms, oral tasks, and assessment, and still be a course learners cannot take. Online language programs commonly retain the timetable and classroom tasks of the sending class. Task guides still assume that learners can join a live or collaborative session (Gacs et al., 2020; González-Lloret, 2020; Hodges et al., 2020; Payne, 2020; Stockwell &amp; Wang, 2023). That assumption is already known to fail. Research on online language teaching, and on online international Chinese teaching, has documented unstable networks, platforms that are hard to open, thinner interaction, and learner strain (Li &amp; Li, 2024; Moser et al., 2021; Qi, 2025; Russell, 2020; Tao &amp; Gao, 2022). Owning a device is not participation when power, speed, or a usable application is missing (Ali, 2020; Beaunoyer et al., 2020; Guo &amp; Wan, 2022; Vishnu et al., 2024; Warschauer, 2003). Distance language learning had already asked whether a remote class was feasible (White, 2006). If those conditions do not support the required class, the content may remain appropriate while the class is closed. That is a delivery problem, not a content problem.</w:t>
+        <w:t xml:space="preserve">During COVID-19, many language programs moved a campus hour online without redesigning it as a planned online course. Hodges et al. (2020) called that emergency remote teaching. Gacs, Goertler, and Spasova (2020) made the same point for language classes: a live hour still assumes that students can join. Tao and Gao (2022) read the emergency literature as a story of technical disruption and thinner talk. A device in the house is not enough if there is no power, little speed, or no usable application (Warschauer, 2003). Those are learner-side conditions. This paper counts them on one form. It does not test whether a named program’s class remained open.</w:t>
       </w:r>
     </w:p>
     <w:p>
@@ -267,52 +87,7 @@
         <w:pStyle w:val="BodyText"/>
       </w:pPr>
       <w:r>
-        <w:t xml:space="preserve">What existing work has not done is to make those learner-side delivery conditions the primary object of study for online international Chinese teaching. Emergency writing used the failure as a setting for teacher workload, sending-side adaptation, or a videoconference copy of the campus hour (MacIntyre et al., 2020; Moser et al., 2021; Xu et al., 2022). Later work asked what should remain of emergency practice (Moorhouse, 2023; Stockwell &amp; Wang, 2023). Reviews still list technical trouble and still leave household access and digital equity under-examined (Li &amp; Li, 2024; Xu, 2024; Zhang &amp; Osborne, 2026). Designed online courses and studies of learner emotion show what planned online Chinese teaching can look like (Guenier et al., 2026; Qi, 2025; Wen &amp; Liu, 2025). They do not show whether a</w:t>
-      </w:r>
-      <w:r>
-        <w:t xml:space="preserve"> </w:t>
-      </w:r>
-      <w:r>
-        <w:rPr>
-          <w:iCs/>
-          <w:i/>
-        </w:rPr>
-        <w:t xml:space="preserve">travelling course</w:t>
-      </w:r>
-      <w:r>
-        <w:t xml:space="preserve">—this article’s term, from Gacs et al. (2020), for a course designed in one institutional setting and taught in another—could still be taken where learners sat. International Chinese language education has said more about what a course</w:t>
-      </w:r>
-      <w:r>
-        <w:t xml:space="preserve"> </w:t>
-      </w:r>
-      <w:r>
-        <w:rPr>
-          <w:iCs/>
-          <w:i/>
-        </w:rPr>
-        <w:t xml:space="preserve">says</w:t>
-      </w:r>
-      <w:r>
-        <w:t xml:space="preserve"> </w:t>
-      </w:r>
-      <w:r>
-        <w:t xml:space="preserve">than about whether it can still be</w:t>
-      </w:r>
-      <w:r>
-        <w:t xml:space="preserve"> </w:t>
-      </w:r>
-      <w:r>
-        <w:rPr>
-          <w:iCs/>
-          <w:i/>
-        </w:rPr>
-        <w:t xml:space="preserve">taken</w:t>
-      </w:r>
-      <w:r>
-        <w:t xml:space="preserve"> </w:t>
-      </w:r>
-      <w:r>
-        <w:t xml:space="preserve">(Gong et al., 2020b; Lu et al., 2024; Zhao, 2020). Listing the difficulty is not the same as measuring the conditions that produce it.</w:t>
+        <w:t xml:space="preserve">Those difficulties are often named. They are less often counted from the learner’s side, with household items and named platforms on the same questionnaire. Xu, Jin, Deifell, and Angus (2022) showed how character teaching was adapted on the sending side. Yu and Xu (2022) surveyed 153 South Asian students in China on online learning during the pandemic. They reported generally positive learning status, and they linked autonomous learning to how students judged the effect. Their form did not count household power, network speed, or whether named applications were marked unusable. Jin, Xu, and Deifell (2023) reported what faculty thought about pandemic online teaching. Li and Li (2024) still say more about tools than about household access.</w:t>
       </w:r>
     </w:p>
     <w:p>
@@ -320,7 +95,7 @@
         <w:pStyle w:val="BodyText"/>
       </w:pPr>
       <w:r>
-        <w:t xml:space="preserve">This study treats that gap as a research problem. Empirical work in this journal has already treated online world-language teaching as a problem of access, task design, interaction, anxiety, and emergency adaptation (Gacs et al., 2020; González-Lloret, 2020; Jin et al., 2023; Lomicka, 2020; Payne, 2020; Russell, 2020; Xu et al., 2022; Zhang &amp; Liu, 2023). The same move is required here for the conditions of a travelling Chinese course. A Chinese-language questionnaire asked a self-selected group of respondents reporting participation in online Chinese-language courses what household, connectivity, and platform-access conditions they faced, and how those conditions sat alongside stress and appraisals of online learning. The instrument cannot show how institutions adapted. It can show the conditions against which those arrangements have to be judged. Time-zone difference and the absence of a Chinese-speaking environment were not measured, so they are left aside. Respondents are not treated as students who had returned home or who were unable to re-enter campus. Those were common emergency-period situations; they are not established facts in this dataset.</w:t>
+        <w:t xml:space="preserve">This study reports questionnaire data from the learner side. Thirty-eight respondents who said they were taking online Chinese courses completed a form written in Chinese in February 2022. The form asked about home conditions, connectivity, and platform access, and about stress and their view of online learning. Thirty-seven selected Pakistani nationality. Residence, university, and program were not asked, so those boxes are not inferred. Completing the form is not treated as proof of enrollment.</w:t>
       </w:r>
     </w:p>
     <w:p>
@@ -328,16 +103,12 @@
         <w:pStyle w:val="BodyText"/>
       </w:pPr>
       <w:r>
-        <w:t xml:space="preserve">Thirty-eight complete responses were collected during emergency remote teaching. Thirty-seven respondents selected Pakistani nationality. Nationality is the only Pakistan connection in the dataset. Residence, recruitment pathway, institutional affiliation, program status, and physical location were not verified. Literature on Pakistani educational mobility and university e-learning is used only as background for that reported nationality (Butt &amp; Sadaf, 2026; Jamil &amp; Muschert, 2023; Raza &amp; Hennessy, 2025; Tu, 2026). The group is not a verified campus population (Gao &amp; Hua, 2021; Gong et al., 2020a). The article does not ask whether later hybrid practice has closed the gap. It asks whether the delivery problem is visible as learner-side conditions in this sample:</w:t>
+        <w:t xml:space="preserve">What household, connectivity, and named-platform conditions did these 38 respondents report in February 2022? The paper does not ask whether a verified class could still be taken, and it does not describe current hybrid teaching.</w:t>
       </w:r>
     </w:p>
     <w:p>
       <w:pPr>
-        <w:numPr>
-          <w:ilvl w:val="0"/>
-          <w:numId w:val="1001"/>
-        </w:numPr>
-        <w:pStyle w:val="Compact"/>
+        <w:pStyle w:val="BodyText"/>
       </w:pPr>
       <w:r>
         <w:rPr>
@@ -350,29 +121,25 @@
         <w:t xml:space="preserve"> </w:t>
       </w:r>
       <w:r>
-        <w:t xml:space="preserve">What household, connectivity, and platform-access conditions did respondents report?</w:t>
+        <w:t xml:space="preserve">What household, connectivity, and platform-access conditions did the 38 respondents report?</w:t>
       </w:r>
     </w:p>
     <w:p>
       <w:pPr>
-        <w:numPr>
-          <w:ilvl w:val="0"/>
-          <w:numId w:val="1001"/>
-        </w:numPr>
-        <w:pStyle w:val="Compact"/>
+        <w:pStyle w:val="BodyText"/>
       </w:pPr>
       <w:r>
         <w:rPr>
           <w:bCs/>
           <w:b/>
         </w:rPr>
-        <w:t xml:space="preserve">RQ2.</w:t>
+        <w:t xml:space="preserve">RQ2 (exploratory).</w:t>
       </w:r>
       <w:r>
         <w:t xml:space="preserve"> </w:t>
       </w:r>
       <w:r>
-        <w:t xml:space="preserve">In this sample, how were reported household and connectivity conditions associated with selecting</w:t>
+        <w:t xml:space="preserve">In the same form, how did those reports sit alongside</w:t>
       </w:r>
       <w:r>
         <w:t xml:space="preserve"> </w:t>
@@ -390,29 +157,33 @@
         <w:t xml:space="preserve"> </w:t>
       </w:r>
       <w:r>
-        <w:t xml:space="preserve">and with respondents’ appraisals of online learning?</w:t>
+        <w:t xml:space="preserve">and a three-item appraisal of online learning?</w:t>
       </w:r>
     </w:p>
     <w:p>
       <w:pPr>
-        <w:numPr>
-          <w:ilvl w:val="0"/>
-          <w:numId w:val="1001"/>
-        </w:numPr>
-        <w:pStyle w:val="Compact"/>
+        <w:pStyle w:val="BodyText"/>
       </w:pPr>
       <w:r>
-        <w:rPr>
-          <w:bCs/>
-          <w:b/>
-        </w:rPr>
-        <w:t xml:space="preserve">RQ3.</w:t>
+        <w:t xml:space="preserve">RQ1 is the question these 38 questionnaires can answer. RQ2 reports co-occurrence on the same form. It is not a causal test.</w:t>
       </w:r>
+    </w:p>
+    <w:p>
+      <w:pPr>
+        <w:pStyle w:val="BodyText"/>
+      </w:pPr>
       <w:r>
-        <w:t xml:space="preserve"> </w:t>
+        <w:t xml:space="preserve">The answers are presented as three themes that follow the items on the form: home and connection, named platforms, and stress with appraisal.</w:t>
       </w:r>
+    </w:p>
+    <w:bookmarkEnd w:id="21"/>
+    <w:bookmarkStart w:id="22" w:name="methods"/>
+    <w:p>
+      <w:pPr>
+        <w:pStyle w:val="Heading2"/>
+      </w:pPr>
       <w:r>
-        <w:t xml:space="preserve">How did respondents judge whether online Chinese-language courses could replace campus-based classes?</w:t>
+        <w:t xml:space="preserve">2. Methods</w:t>
       </w:r>
     </w:p>
     <w:p>
@@ -420,34 +191,7 @@
         <w:pStyle w:val="FirstParagraph"/>
       </w:pPr>
       <w:r>
-        <w:t xml:space="preserve">Counts are used descriptively. Associations are exploratory and are not read as confirmatory tests of population-level relationships. Section 2 locates the study and sets out the four-layer reading of localization. Section 3 reports the methods. Section 4 addresses RQ1–RQ3 in turn. Sections 5–8 discuss the findings, set out pedagogical implications, and state the limits of the answer.</w:t>
-      </w:r>
-    </w:p>
-    <w:bookmarkEnd w:id="22"/>
-    <w:bookmarkStart w:id="28" w:name="Xa71efe292272ba0d775f88aaa92c3e49c1e1383"/>
-    <w:p>
-      <w:pPr>
-        <w:pStyle w:val="Heading2"/>
-      </w:pPr>
-      <w:r>
-        <w:t xml:space="preserve">2. Literature review and conceptual framework</w:t>
-      </w:r>
-    </w:p>
-    <w:bookmarkStart w:id="23" w:name="later-lenses-on-online-chinese-teaching"/>
-    <w:p>
-      <w:pPr>
-        <w:pStyle w:val="Heading3"/>
-      </w:pPr>
-      <w:r>
-        <w:t xml:space="preserve">2.1 Later lenses on online Chinese teaching</w:t>
-      </w:r>
-    </w:p>
-    <w:p>
-      <w:pPr>
-        <w:pStyle w:val="FirstParagraph"/>
-      </w:pPr>
-      <w:r>
-        <w:t xml:space="preserve">Hodges et al. (2020) distinguished emergency remote teaching from planned online provision. Gacs, Goertler, and Spasova (2020) brought that distinction into language education. Language-teacher surveys from the same period describe heavier workloads and uneven preparedness (Moser et al., 2021). Tao and Gao (2022) read the wider literature as a story of technical disruption and thinner engagement. In this journal, Russell (2020) treats language anxiety as a condition of the online learner, and Lomicka (2020) treats interaction as a problem of virtual community rather than of a copied campus hour. That work locates the moment in which the present questionnaire was completed. It is not a substitute for the stress reports in this sample.</w:t>
+        <w:t xml:space="preserve">The study is an exploratory, cross-sectional questionnaire. Complete cases were submitted on Wenjuan between 5 and 8 February 2022 (N = 38). The export title is Influencing factors in international students’ online Chinese learning during COVID-19. The items are those on that form. There was no recorded pilot. The link circulation was not stored. Completing a questionnaire written in Chinese is not treated as proof of enrollment in a named university.</w:t>
       </w:r>
     </w:p>
     <w:p>
@@ -455,43 +199,7 @@
         <w:pStyle w:val="BodyText"/>
       </w:pPr>
       <w:r>
-        <w:t xml:space="preserve">The later literature is the reading lens. After the return to campus, studies of technological normalization asked what should remain of emergency online practice (Moorhouse, 2023) and cautioned against treating a videoconference copy of the classroom as the lesson of the crisis (Stockwell &amp; Wang, 2023). For Chinese, contemporaneous policy writing recorded</w:t>
-      </w:r>
-      <w:r>
-        <w:t xml:space="preserve"> </w:t>
-      </w:r>
-      <w:r>
-        <w:t xml:space="preserve">“</w:t>
-      </w:r>
-      <w:r>
-        <w:t xml:space="preserve">suspending classes without stopping learning</w:t>
-      </w:r>
-      <w:r>
-        <w:t xml:space="preserve">”</w:t>
-      </w:r>
-      <w:r>
-        <w:t xml:space="preserve"> </w:t>
-      </w:r>
-      <w:r>
-        <w:t xml:space="preserve">(Zhang et al., 2020). Xu et al. (2022) show how character teaching was adapted on the sending side. Jin et al. (2023) report faculty perceptions of pandemic online teaching. Zhang and Liu (2023) examine online collaborative writing among Chinese-language learners in designed conditions. Later reviews still say more about tools than about household access, and they still flag digital equity as under-examined (Li &amp; Li, 2024; Xu, 2024; Zhang &amp; Osborne, 2026). Designed online Chinese-culture courses show a planned alternative to emergency copying (Guenier et al., 2026). Qi (2025) shows that an online Chinese class can itself become an anxiety-provoking setting. Those studies do not describe the present respondents. Much of that writing still assumes a relatively stable connection. The present questionnaire cannot test whether that assumption holds for current hybrid ICLE. It can show what 38 respondents reported when a travelling course asked them to join.</w:t>
-      </w:r>
-    </w:p>
-    <w:bookmarkEnd w:id="23"/>
-    <w:bookmarkStart w:id="24" w:name="X8fd0326383b50249221392c76a6b8ab8b037526"/>
-    <w:p>
-      <w:pPr>
-        <w:pStyle w:val="Heading3"/>
-      </w:pPr>
-      <w:r>
-        <w:t xml:space="preserve">2.2 Digital inequality and the home learning ecology</w:t>
-      </w:r>
-    </w:p>
-    <w:p>
-      <w:pPr>
-        <w:pStyle w:val="FirstParagraph"/>
-      </w:pPr>
-      <w:r>
-        <w:t xml:space="preserve">Later models of the digital divide distinguish material access from skills, usage, and outcomes (Helsper, 2021; van Dijk, 2020; Warschauer, 2003). Owning a device is not the same as being able to take part (Ali, 2020; Beaunoyer et al., 2020; Guo &amp; Wan, 2022; Vishnu et al., 2024). Work on Pakistani university e-learning reports uneven access, skills, electricity, and household device sharing (Butt &amp; Sadaf, 2026; Jamil &amp; Muschert, 2023; Raza &amp; Hennessy, 2025). The last of those sources is a grey-literature report. None of them is evidence about the 38 respondents here; they are background only for the nationality most of them reported.</w:t>
+        <w:t xml:space="preserve">Of the 38 respondents, 27 were men and 11 were women. Thirty-seven selected Pakistani nationality. Self-rated Chinese was advanced for 22, intermediate for 15, and beginner for one. Years of learning Chinese clustered at three to four years (26 of 38). Twenty-seven said required courses were online, and 23 said electives were. Thirty said all of their Chinese classes were online. Twenty-two said they were working while studying. Submission operating system was iPhone (24) or Android (14). That is the device used to send the form. An IP-province field was stored; nine labels were mainland China province names. IP is not used as a location variable.</w:t>
       </w:r>
     </w:p>
     <w:p>
@@ -499,331 +207,7 @@
         <w:pStyle w:val="BodyText"/>
       </w:pPr>
       <w:r>
-        <w:t xml:space="preserve">An ecological view of language education takes the setting of the class, not only the student and the application, as the unit of analysis (Guerrettaz et al., 2021; van Lier, 2004). Domestic space, paid or care work, power interruptions, and applications marked unusable are therefore read as elements of respondents’ immediate learning ecologies. They are material facts, not cultural traits.</w:t>
-      </w:r>
-    </w:p>
-    <w:bookmarkEnd w:id="24"/>
-    <w:bookmarkStart w:id="26" w:name="localization-of-delivery"/>
-    <w:p>
-      <w:pPr>
-        <w:pStyle w:val="Heading3"/>
-      </w:pPr>
-      <w:r>
-        <w:t xml:space="preserve">2.3 Localization of delivery</w:t>
-      </w:r>
-    </w:p>
-    <w:p>
-      <w:pPr>
-        <w:pStyle w:val="FirstParagraph"/>
-      </w:pPr>
-      <w:r>
-        <w:t xml:space="preserve">In materials work, localization has usually meant personalizing content so that it speaks to a particular group (McDonough &amp; Shaw, 2003; Tomlinson, 2011). Canagarajah (2005) and Kumaravadivelu (2001) locate pedagogy in a specific group and place. ICLE research has applied localization mainly to curriculum construction and textbook adaptation (Lu et al., 2024; Zhao, 2020; Zhao &amp; Huang, 2010). Guerrettaz et al. (2021) push materials off the page and into use. If that move is taken seriously, localization also has to ask whether learners can reach and take part in the class as it is delivered.</w:t>
-      </w:r>
-    </w:p>
-    <w:bookmarkStart w:id="25" w:name="four-layers-of-localization"/>
-    <w:p>
-      <w:pPr>
-        <w:pStyle w:val="Heading4"/>
-      </w:pPr>
-      <w:r>
-        <w:t xml:space="preserve">2.3.1 Four layers of localization</w:t>
-      </w:r>
-    </w:p>
-    <w:p>
-      <w:pPr>
-        <w:pStyle w:val="FirstParagraph"/>
-      </w:pPr>
-      <w:r>
-        <w:t xml:space="preserve">The following four layers are the proposed framework for reading the present data. They are a conceptual distinction, not a tested path:</w:t>
-      </w:r>
-    </w:p>
-    <w:p>
-      <w:pPr>
-        <w:numPr>
-          <w:ilvl w:val="0"/>
-          <w:numId w:val="1002"/>
-        </w:numPr>
-        <w:pStyle w:val="Compact"/>
-      </w:pPr>
-      <w:r>
-        <w:t xml:space="preserve">Localization of</w:t>
-      </w:r>
-      <w:r>
-        <w:t xml:space="preserve"> </w:t>
-      </w:r>
-      <w:r>
-        <w:rPr>
-          <w:iCs/>
-          <w:i/>
-        </w:rPr>
-        <w:t xml:space="preserve">content</w:t>
-      </w:r>
-      <w:r>
-        <w:t xml:space="preserve">: examples, festivals, and cultural comparison.</w:t>
-      </w:r>
-    </w:p>
-    <w:p>
-      <w:pPr>
-        <w:numPr>
-          <w:ilvl w:val="0"/>
-          <w:numId w:val="1002"/>
-        </w:numPr>
-        <w:pStyle w:val="Compact"/>
-      </w:pPr>
-      <w:r>
-        <w:t xml:space="preserve">Localization of</w:t>
-      </w:r>
-      <w:r>
-        <w:t xml:space="preserve"> </w:t>
-      </w:r>
-      <w:r>
-        <w:rPr>
-          <w:iCs/>
-          <w:i/>
-        </w:rPr>
-        <w:t xml:space="preserve">materials</w:t>
-      </w:r>
-      <w:r>
-        <w:t xml:space="preserve">: annotation, mediation language, and page redesign.</w:t>
-      </w:r>
-    </w:p>
-    <w:p>
-      <w:pPr>
-        <w:numPr>
-          <w:ilvl w:val="0"/>
-          <w:numId w:val="1002"/>
-        </w:numPr>
-        <w:pStyle w:val="Compact"/>
-      </w:pPr>
-      <w:r>
-        <w:t xml:space="preserve">Localization of</w:t>
-      </w:r>
-      <w:r>
-        <w:t xml:space="preserve"> </w:t>
-      </w:r>
-      <w:r>
-        <w:rPr>
-          <w:iCs/>
-          <w:i/>
-        </w:rPr>
-        <w:t xml:space="preserve">curriculum</w:t>
-      </w:r>
-      <w:r>
-        <w:t xml:space="preserve">: pathway, hours, and assessment of a named program (Shan &amp; Xu, 2024; Zhao, 2020).</w:t>
-      </w:r>
-    </w:p>
-    <w:p>
-      <w:pPr>
-        <w:numPr>
-          <w:ilvl w:val="0"/>
-          <w:numId w:val="1002"/>
-        </w:numPr>
-        <w:pStyle w:val="Compact"/>
-      </w:pPr>
-      <w:r>
-        <w:t xml:space="preserve">Localization of</w:t>
-      </w:r>
-      <w:r>
-        <w:t xml:space="preserve"> </w:t>
-      </w:r>
-      <w:r>
-        <w:rPr>
-          <w:iCs/>
-          <w:i/>
-        </w:rPr>
-        <w:t xml:space="preserve">delivery</w:t>
-      </w:r>
-      <w:r>
-        <w:t xml:space="preserve">: institutional adaptation of time, platform, task, participation mode, and assessment to the receiving context.</w:t>
-      </w:r>
-    </w:p>
-    <w:p>
-      <w:pPr>
-        <w:pStyle w:val="FirstParagraph"/>
-      </w:pPr>
-      <w:r>
-        <w:t xml:space="preserve">This analysis is concerned with the fourth. Localization of delivery does not replace accessibility or digital inclusion. It names the institutional decisions through which access is made possible or closed off when a course moves. The questionnaire did not observe those institutional decisions. It recorded the learner-side conditions against which such decisions would have to be judged. The claim is therefore conceptual rather than institutional: a course may be locally relevant in content but inaccessible in delivery. It is localized in delivery only when its required time, platform, participation mode, task design, and assessment are feasible where learners actually take part.</w:t>
-      </w:r>
-    </w:p>
-    <w:p>
-      <w:pPr>
-        <w:pStyle w:val="BodyText"/>
-      </w:pPr>
-      <w:r>
-        <w:t xml:space="preserve">Gong et al. (2020b) map ICLE in mainland China for 2014–2018 and are used here as a pre-pandemic field sketch. Gao and Hua (2021) and Gong et al. (2020a) write about international students of Chinese</w:t>
-      </w:r>
-      <w:r>
-        <w:t xml:space="preserve"> </w:t>
-      </w:r>
-      <w:r>
-        <w:rPr>
-          <w:iCs/>
-          <w:i/>
-        </w:rPr>
-        <w:t xml:space="preserve">in</w:t>
-      </w:r>
-      <w:r>
-        <w:t xml:space="preserve"> </w:t>
-      </w:r>
-      <w:r>
-        <w:t xml:space="preserve">Chinese universities. Guenier, Xing, and Yan (2026) describe a designed online Chinese-culture course. The present respondents completed a Chinese-language questionnaire about online Chinese classes. They are not treated as a Confucius Institute classroom sample, and enrollment in a named Chinese university was not independently verified.</w:t>
-      </w:r>
-    </w:p>
-    <w:bookmarkEnd w:id="25"/>
-    <w:bookmarkEnd w:id="26"/>
-    <w:bookmarkStart w:id="27" w:name="conceptual-model"/>
-    <w:p>
-      <w:pPr>
-        <w:pStyle w:val="Heading3"/>
-      </w:pPr>
-      <w:r>
-        <w:t xml:space="preserve">2.4 Conceptual model</w:t>
-      </w:r>
-    </w:p>
-    <w:p>
-      <w:pPr>
-        <w:pStyle w:val="FirstParagraph"/>
-      </w:pPr>
-      <w:r>
-        <w:t xml:space="preserve">Figure 1 is offered as a reading model, not as a tested path. Household infrastructure and reported platform access are concurrent conditions of a travelling course and are interpreted as possible constraints on participation. Language investment is not part of the model.</w:t>
-      </w:r>
-    </w:p>
-    <w:p>
-      <w:pPr>
-        <w:pStyle w:val="BodyText"/>
-      </w:pPr>
-      <w:r>
-        <w:t xml:space="preserve">Figure 1. Localization of delivery as delivery-context fit (reading model). Household infrastructure (power interruptions, network stability, speed) and reported platform access are concurrent conditions. They are interpreted as possible constraints on participation and on self-reported stress, interaction, appraisal, and replacement judgments. The figure is not a causal path.</w:t>
-      </w:r>
-    </w:p>
-    <w:bookmarkEnd w:id="27"/>
-    <w:bookmarkEnd w:id="28"/>
-    <w:bookmarkStart w:id="34" w:name="methods"/>
-    <w:p>
-      <w:pPr>
-        <w:pStyle w:val="Heading2"/>
-      </w:pPr>
-      <w:r>
-        <w:t xml:space="preserve">3. Methods</w:t>
-      </w:r>
-    </w:p>
-    <w:p>
-      <w:pPr>
-        <w:pStyle w:val="FirstParagraph"/>
-      </w:pPr>
-      <w:r>
-        <w:t xml:space="preserve">The study is an exploratory, cross-sectional questionnaire. It does not test a pre-registered confirmatory model. What follows describes the instrument, the self-selected group who completed it, and the limits of what the questionnaire can support.</w:t>
-      </w:r>
-    </w:p>
-    <w:bookmarkStart w:id="29" w:name="design-and-context"/>
-    <w:p>
-      <w:pPr>
-        <w:pStyle w:val="Heading3"/>
-      </w:pPr>
-      <w:r>
-        <w:t xml:space="preserve">3.1 Design and context</w:t>
-      </w:r>
-    </w:p>
-    <w:p>
-      <w:pPr>
-        <w:pStyle w:val="FirstParagraph"/>
-      </w:pPr>
-      <w:r>
-        <w:t xml:space="preserve">The instrument title on the Wenjuan export is 新冠肺炎期间留学生在线中文学习的影响因素 (Influencing factors in international students’ online Chinese learning during COVID-19). The items are those on that retained form. No separate validation study or recorded pilot of the instrument is available. This article is a secondary analysis of the completed file. Complete cases were submitted between 5 and 8 February 2022 (N = 38), during emergency remote teaching. That collection window is a methodological fact; the article does not treat the sample as a picture of current hybrid practice. The form did not record how the link was circulated, so the recruitment channel cannot be named. Respondents were adults who completed the Chinese-language questionnaire about online Chinese learning. Completing that questionnaire is not treated as proof of enrollment in a Chinese university. The instrument did not ask host university, city of residence that week, degree versus non-degree status, or scholarship type. Two items asked whether required courses and electives were being taken online: 27 respondents (71.1%) reported required courses online, and 23 (60.5%) reported electives online. Those answers do not identify a named program. The study therefore concerns a self-selected group of respondents reporting participation in online Chinese-language courses, not a verified enrollment record.</w:t>
-      </w:r>
-    </w:p>
-    <w:bookmarkEnd w:id="29"/>
-    <w:bookmarkStart w:id="30" w:name="participants"/>
-    <w:p>
-      <w:pPr>
-        <w:pStyle w:val="Heading3"/>
-      </w:pPr>
-      <w:r>
-        <w:t xml:space="preserve">3.2 Participants</w:t>
-      </w:r>
-    </w:p>
-    <w:p>
-      <w:pPr>
-        <w:pStyle w:val="FirstParagraph"/>
-      </w:pPr>
-      <w:r>
-        <w:t xml:space="preserve">Of the 38 respondents, 27 were men (71.1%) and 11 were women (28.9%). Thirty-seven selected Pakistani nationality and one selected another nationality. That nationality item is the only Pakistan connection in the dataset. The group is not described as verified Chinese-university enrollment, as Pakistan-resident learners, as CSC students, or as a national sample. Self-rated Chinese level was mostly advanced (22, 57.9%) or intermediate (15, 39.5%), with one beginner; the label is the student’s own, not an HSK band. Years of learning Chinese clustered at three to four years (26, 68.4%). Wenjuan submission metadata classified the operating system as iPhone (24, 63.2%) or Android (14). That variable is the device used to submit the form, not an item about all devices used for class.</w:t>
-      </w:r>
-    </w:p>
-    <w:p>
-      <w:pPr>
-        <w:pStyle w:val="BodyText"/>
-      </w:pPr>
-      <w:r>
-        <w:t xml:space="preserve">Wenjuan automatically recorded an IP-province field. A dummy was coded when that field was a mainland China province name (9 of 38). IP labels are technical metadata. They can be affected by virtual private networks and proxies, and they are not a reliable measure of physical location. They are not used as a participant-location variable and are not the basis of a sensitivity analysis. The dummy, submission dates, and device identifiers are not included in the public dataset.</w:t>
-      </w:r>
-    </w:p>
-    <w:bookmarkEnd w:id="30"/>
-    <w:bookmarkStart w:id="31" w:name="instrument-and-coding"/>
-    <w:p>
-      <w:pPr>
-        <w:pStyle w:val="Heading3"/>
-      </w:pPr>
-      <w:r>
-        <w:t xml:space="preserve">3.3 Instrument and coding</w:t>
-      </w:r>
-    </w:p>
-    <w:p>
-      <w:pPr>
-        <w:pStyle w:val="FirstParagraph"/>
-      </w:pPr>
-      <w:r>
-        <w:t xml:space="preserve">The questionnaire comprised about 30 items: demographics, single-choice ordinals, and multiple-response lists. Stems are in Chinese, with some non-native wording (for example 您尝尝用什么平台). English glosses are used for reporting. Self-rated Chinese level was intermediate or advanced for 37 of 38 respondents. The instrument did not include a comprehension check, so completion of the Chinese-language questionnaire is treated only as evidence that respondents were willing to answer in Chinese. Item wording for the appraisal index is given in Appendix A.</w:t>
-      </w:r>
-    </w:p>
-    <w:p>
-      <w:pPr>
-        <w:pStyle w:val="BodyText"/>
-      </w:pPr>
-      <w:r>
-        <w:t xml:space="preserve">A three-item</w:t>
-      </w:r>
-      <w:r>
-        <w:t xml:space="preserve"> </w:t>
-      </w:r>
-      <w:r>
-        <w:rPr>
-          <w:iCs/>
-          <w:i/>
-        </w:rPr>
-        <w:t xml:space="preserve">perceived online-learning appraisal index</w:t>
-      </w:r>
-      <w:r>
-        <w:t xml:space="preserve"> </w:t>
-      </w:r>
-      <w:r>
-        <w:t xml:space="preserve">was formed from learned much (Q8), improves Chinese (Q9), and sparks interest (Q10). The items ask related but not identical questions and are treated as a descriptive index, not as a validated unidimensional scale. Internal consistency was acceptable in this sample (Cronbach’s α = .84); Spearman inter-item correlations ranged from .55 to .75 (Appendix B). Exploratory factor analysis was not used (N = 38). Individual items are also reported. One double-tick on</w:t>
-      </w:r>
-      <w:r>
-        <w:t xml:space="preserve"> </w:t>
-      </w:r>
-      <w:r>
-        <w:t xml:space="preserve">“</w:t>
-      </w:r>
-      <w:r>
-        <w:t xml:space="preserve">like online classes</w:t>
-      </w:r>
-      <w:r>
-        <w:t xml:space="preserve">”</w:t>
-      </w:r>
-      <w:r>
-        <w:t xml:space="preserve"> </w:t>
-      </w:r>
-      <w:r>
-        <w:t xml:space="preserve">was excluded for that item only (n = 37 valid).</w:t>
-      </w:r>
-    </w:p>
-    <w:p>
-      <w:pPr>
-        <w:pStyle w:val="BodyText"/>
-      </w:pPr>
-      <w:r>
-        <w:t xml:space="preserve">Coding follows the Wenjuan export. Higher values on speed, learned, improve, interest, and teacher interaction indicate a more negative report (worse speed; less learning, improvement, or interest; thinner interaction). Stress (Q24) is a four-category questionnaire item coded 1 = very high to 4 = none.</w:t>
+        <w:t xml:space="preserve">The questionnaire had about 30 items. Reporting uses English glosses. A three-item appraisal mean was formed from learned much (Q8), improves Chinese (Q9), and sparks interest (Q10). Cronbach’s α was .84 in this sample. The mean is descriptive, not a validated scale. Higher values on speed and on the three appraisal items indicate a worse report.</w:t>
       </w:r>
       <w:r>
         <w:t xml:space="preserve"> </w:t>
@@ -839,15 +223,23 @@
         <w:t xml:space="preserve"> </w:t>
       </w:r>
       <w:r>
-        <w:t xml:space="preserve">is that first category (非常高), not an analyst-created threshold or a cut on a multi-item scale. The focal stress analysis uses a dummy for this category and does not reverse the ordinal. Full coding directions are in Table A1.</w:t>
+        <w:t xml:space="preserve">is the first category on a four-category item.</w:t>
       </w:r>
-    </w:p>
-    <w:p>
-      <w:pPr>
-        <w:pStyle w:val="BodyText"/>
-      </w:pPr>
       <w:r>
-        <w:t xml:space="preserve">The export labeled one multiple-response problem as</w:t>
+        <w:t xml:space="preserve"> </w:t>
+      </w:r>
+      <w:r>
+        <w:rPr>
+          <w:iCs/>
+          <w:i/>
+        </w:rPr>
+        <w:t xml:space="preserve">Power interruptions</w:t>
+      </w:r>
+      <w:r>
+        <w:t xml:space="preserve"> </w:t>
+      </w:r>
+      <w:r>
+        <w:t xml:space="preserve">is the export option</w:t>
       </w:r>
       <w:r>
         <w:t xml:space="preserve"> </w:t>
@@ -865,51 +257,33 @@
         <w:t xml:space="preserve"> </w:t>
       </w:r>
       <w:r>
-        <w:t xml:space="preserve">References to load-shedding elsewhere in the article are contextual. In the results the item is reported as</w:t>
-      </w:r>
-      <w:r>
-        <w:t xml:space="preserve"> </w:t>
-      </w:r>
-      <w:r>
-        <w:rPr>
-          <w:iCs/>
-          <w:i/>
-        </w:rPr>
-        <w:t xml:space="preserve">power interruptions</w:t>
-      </w:r>
-      <w:r>
-        <w:t xml:space="preserve"> </w:t>
-      </w:r>
-      <w:r>
-        <w:t xml:space="preserve">(export label: no electricity).</w:t>
-      </w:r>
-      <w:r>
-        <w:t xml:space="preserve"> </w:t>
-      </w:r>
-      <w:r>
-        <w:t xml:space="preserve">“</w:t>
-      </w:r>
-      <w:r>
-        <w:t xml:space="preserve">中国慕课</w:t>
-      </w:r>
-      <w:r>
-        <w:t xml:space="preserve">”</w:t>
-      </w:r>
-      <w:r>
-        <w:t xml:space="preserve"> </w:t>
-      </w:r>
-      <w:r>
-        <w:t xml:space="preserve">is reported as printed on the form; the option did not name a single provider such as 中国大学MOOC.</w:t>
+        <w:t xml:space="preserve">Chinese MOOC is reported as printed on the form.</w:t>
       </w:r>
     </w:p>
-    <w:bookmarkEnd w:id="31"/>
-    <w:bookmarkStart w:id="32" w:name="analysis"/>
     <w:p>
       <w:pPr>
-        <w:pStyle w:val="Heading3"/>
+        <w:pStyle w:val="BodyText"/>
       </w:pPr>
       <w:r>
-        <w:t xml:space="preserve">3.4 Analysis</w:t>
+        <w:t xml:space="preserve">Household and platform answers are frequencies. Two associations are reported: home affects study very much with very high stress (two-sided Fisher’s exact test), and internet speed with the appraisal mean (Spearman’s ρ, percentile bootstrap 95% CI, 5,000 resamples). The replacement item is a count. Odds ratios are not reported. Frequencies are n/38 unless noted.</w:t>
+      </w:r>
+    </w:p>
+    <w:p>
+      <w:pPr>
+        <w:pStyle w:val="BodyText"/>
+      </w:pPr>
+      <w:r>
+        <w:t xml:space="preserve">The form said answers would be used for research. Completion was treated as consent. No ethics-committee number is available for the 2022 collection. Names, IP addresses, exact timestamps, and device identifiers were removed before the public dataset was prepared.</w:t>
+      </w:r>
+    </w:p>
+    <w:bookmarkEnd w:id="22"/>
+    <w:bookmarkStart w:id="26" w:name="themes"/>
+    <w:p>
+      <w:pPr>
+        <w:pStyle w:val="Heading2"/>
+      </w:pPr>
+      <w:r>
+        <w:t xml:space="preserve">3. Themes</w:t>
       </w:r>
     </w:p>
     <w:p>
@@ -917,66 +291,16 @@
         <w:pStyle w:val="FirstParagraph"/>
       </w:pPr>
       <w:r>
-        <w:t xml:space="preserve">The analyses are mapped to the research questions. RQ1 is addressed with descriptive frequencies (Tables 1–3). RQ2 is addressed with two focal associations: home affects study very much × very high stress (two-sided Fisher’s exact</w:t>
-      </w:r>
-      <w:r>
-        <w:t xml:space="preserve"> </w:t>
-      </w:r>
-      <w:r>
-        <w:rPr>
-          <w:iCs/>
-          <w:i/>
-        </w:rPr>
-        <w:t xml:space="preserve">p</w:t>
-      </w:r>
-      <w:r>
-        <w:t xml:space="preserve">; SciPy</w:t>
-      </w:r>
-      <w:r>
-        <w:t xml:space="preserve"> </w:t>
-      </w:r>
-      <w:r>
-        <w:rPr>
-          <w:rStyle w:val="VerbatimChar"/>
-        </w:rPr>
-        <w:t xml:space="preserve">fisher_exact</w:t>
-      </w:r>
-      <w:r>
-        <w:t xml:space="preserve">) and internet speed × the appraisal index (Spearman’s ρ with a percentile bootstrap 95% confidence interval from 5,000 resamples). RQ3 is addressed with frequencies of the replacement judgment. Odds ratios and Wald confidence intervals are not reported: at N = 38 they are unstable. Other associations, including gender, are secondary and are placed in Appendix B. Frequencies are n/38 unless noted. Multiple-response items are the percentage who selected the option.</w:t>
-      </w:r>
-      <w:r>
-        <w:t xml:space="preserve"> </w:t>
-      </w:r>
-      <w:r>
-        <w:rPr>
-          <w:iCs/>
-          <w:i/>
-        </w:rPr>
-        <w:t xml:space="preserve">p</w:t>
-      </w:r>
-      <w:r>
-        <w:t xml:space="preserve"> </w:t>
-      </w:r>
-      <w:r>
-        <w:t xml:space="preserve">values are not adjusted for multiplicity and are not interpreted as confirmatory.</w:t>
+        <w:t xml:space="preserve">The three themes below group the questionnaire items. They are not interview codes.</w:t>
       </w:r>
     </w:p>
-    <w:p>
-      <w:pPr>
-        <w:pStyle w:val="BodyText"/>
-      </w:pPr>
-      <w:r>
-        <w:t xml:space="preserve">A Pakistani-nationality check (n = 37) is reported only to show that dropping the one non-Pakistani case does not reverse the two focal associations. It is not a location analysis.</w:t>
-      </w:r>
-    </w:p>
-    <w:bookmarkEnd w:id="32"/>
-    <w:bookmarkStart w:id="33" w:name="ethics-and-data-protection"/>
+    <w:bookmarkStart w:id="23" w:name="theme-1.-home-and-connection"/>
     <w:p>
       <w:pPr>
         <w:pStyle w:val="Heading3"/>
       </w:pPr>
       <w:r>
-        <w:t xml:space="preserve">3.5 Ethics and data protection</w:t>
+        <w:t xml:space="preserve">Theme 1. Home and connection</w:t>
       </w:r>
     </w:p>
     <w:p>
@@ -984,43 +308,7 @@
         <w:pStyle w:val="FirstParagraph"/>
       </w:pPr>
       <w:r>
-        <w:t xml:space="preserve">Adult respondents completed an online form presented as research on online Chinese learning. The form stated that answers would be used for research, and completion and submission were treated as consent.</w:t>
-      </w:r>
-    </w:p>
-    <w:p>
-      <w:pPr>
-        <w:pStyle w:val="BodyText"/>
-      </w:pPr>
-      <w:r>
-        <w:t xml:space="preserve">No institutional ethics approval number is available for the original 2022 data collection. The first author was then an M.Phil. student, and numbered approval was not obtained. This article reports an anonymized secondary analysis of that file. No new data were collected. Names, IP addresses, exact timestamps, and device identifiers were removed before the public file was prepared.</w:t>
-      </w:r>
-    </w:p>
-    <w:bookmarkEnd w:id="33"/>
-    <w:bookmarkEnd w:id="34"/>
-    <w:bookmarkStart w:id="39" w:name="results"/>
-    <w:p>
-      <w:pPr>
-        <w:pStyle w:val="Heading2"/>
-      </w:pPr>
-      <w:r>
-        <w:t xml:space="preserve">4. Results</w:t>
-      </w:r>
-    </w:p>
-    <w:bookmarkStart w:id="35" w:name="Xc19e6556867f37cf5943d55d08f36cc3acc822b"/>
-    <w:p>
-      <w:pPr>
-        <w:pStyle w:val="Heading3"/>
-      </w:pPr>
-      <w:r>
-        <w:t xml:space="preserve">4.1 Addressing RQ1: respondents and household conditions</w:t>
-      </w:r>
-    </w:p>
-    <w:p>
-      <w:pPr>
-        <w:pStyle w:val="FirstParagraph"/>
-      </w:pPr>
-      <w:r>
-        <w:t xml:space="preserve">Table 1 locates the sample. Most respondents said all of their Chinese classes were online, and more than half reported working alongside study.</w:t>
+        <w:t xml:space="preserve">Most respondents said all of their Chinese classes were online, and more than half said they were working alongside study (Table 1).</w:t>
       </w:r>
     </w:p>
     <w:p>
@@ -1496,7 +784,7 @@
         <w:t xml:space="preserve"> </w:t>
       </w:r>
       <w:r>
-        <w:t xml:space="preserve">Convenience sample, Wenjuan, 5 to 8 February 2022. Device is the operating system recorded at submission, reported only as an aggregate.</w:t>
+        <w:t xml:space="preserve">Wenjuan, 5 to 8 February 2022. Device is the operating system recorded at submission.</w:t>
       </w:r>
     </w:p>
     <w:p>
@@ -1504,7 +792,7 @@
         <w:pStyle w:val="BodyText"/>
       </w:pPr>
       <w:r>
-        <w:t xml:space="preserve">Table 2 reports the household and connectivity conditions. The key figures are unstable networks (76.3%), power interruptions (42.1%), and very high stress (36.8%). Four respondents said their country did not have internet, yet all 38 submitted an online form. The item wording does not allow a firm reinterpretation, so the response is reported as given. Only 11 of 38 described the home as quiet.</w:t>
+        <w:t xml:space="preserve">Twenty-nine of 38 marked an unstable network. Sixteen marked power interruptions. Twenty-seven said the home was not quiet. Fourteen said the home affected study very much. Four people marked that their country did not have internet, yet all 38 submitted an online form. That answer is left as marked.</w:t>
       </w:r>
     </w:p>
     <w:p>
@@ -1528,7 +816,7 @@
           <w:iCs/>
           <w:i/>
         </w:rPr>
-        <w:t xml:space="preserve">Reported conditions and selected outcomes (N = 38)</w:t>
+        <w:t xml:space="preserve">Home and connection items (N = 38)</w:t>
       </w:r>
     </w:p>
     <w:tbl>
@@ -1927,14 +1215,14 @@
         </w:tc>
       </w:tr>
     </w:tbl>
-    <w:bookmarkEnd w:id="35"/>
-    <w:bookmarkStart w:id="36" w:name="addressing-rq1-platform-access"/>
+    <w:bookmarkEnd w:id="23"/>
+    <w:bookmarkStart w:id="24" w:name="theme-2.-named-platforms"/>
     <w:p>
       <w:pPr>
         <w:pStyle w:val="Heading3"/>
       </w:pPr>
       <w:r>
-        <w:t xml:space="preserve">4.2 Addressing RQ1: platform access</w:t>
+        <w:t xml:space="preserve">Theme 2. Named platforms</w:t>
       </w:r>
     </w:p>
     <w:p>
@@ -1942,7 +1230,7 @@
         <w:pStyle w:val="FirstParagraph"/>
       </w:pPr>
       <w:r>
-        <w:t xml:space="preserve">Table 3 shows uneven access to institutionally familiar and consumer-facing platforms. The questionnaire cannot isolate country restrictions, routing, account rules, skills, or virtual private networks. The pattern used for later discussion is that QQ and Chaoxing were frequently marked unusable, while Zoom and WhatsApp were more often marked available. WhatsApp appears only as available; the retained form did not code whether it was used for class. Tencent Meeting was the most used class tool but was marked available by fewer respondents, a discrepancy left as an item-level inconsistency.</w:t>
+        <w:t xml:space="preserve">Table 3 is incomplete by design. Some tools were asked as used for class, some as unusable in my country, and some as can use in my country. QQ and Chaoxing were often marked unusable. Zoom and WhatsApp were more often marked available. WhatsApp has no used-for-class column. Tencent Meeting was marked as used by 71.1% and as available by 57.9%. The table cannot separate blocking, accounts, skill, or a virtual private network.</w:t>
       </w:r>
     </w:p>
     <w:p>
@@ -1966,7 +1254,7 @@
           <w:iCs/>
           <w:i/>
         </w:rPr>
-        <w:t xml:space="preserve">Reported use and perceived availability of platforms (multiple response, N = 38)</w:t>
+        <w:t xml:space="preserve">Named platforms as asked (multiple response, N = 38)</w:t>
       </w:r>
     </w:p>
     <w:tbl>
@@ -2394,7 +1682,7 @@
               <w:jc w:val="left"/>
             </w:pPr>
             <w:r>
-              <w:t xml:space="preserve">中国慕课 (Chinese MOOC, as printed)</w:t>
+              <w:t xml:space="preserve">Chinese MOOC (as printed)</w:t>
             </w:r>
           </w:p>
         </w:tc>
@@ -2469,35 +1757,17 @@
         <w:t xml:space="preserve"> </w:t>
       </w:r>
       <w:r>
-        <w:t xml:space="preserve">is the stem wording. QQ, Chaoxing, DingTalk, and 中国慕课 are platforms often used in Chinese-university teaching; they are not exclusively campus systems.</w:t>
-      </w:r>
-      <w:r>
-        <w:t xml:space="preserve"> </w:t>
-      </w:r>
-      <w:r>
-        <w:t xml:space="preserve">“</w:t>
-      </w:r>
-      <w:r>
-        <w:t xml:space="preserve">Marked unusable</w:t>
-      </w:r>
-      <w:r>
-        <w:t xml:space="preserve">”</w:t>
-      </w:r>
-      <w:r>
-        <w:t xml:space="preserve"> </w:t>
-      </w:r>
-      <w:r>
-        <w:t xml:space="preserve">follows the item wording and is not a technical claim that the platform was blocked.</w:t>
+        <w:t xml:space="preserve">is the stem wording.</w:t>
       </w:r>
     </w:p>
-    <w:bookmarkEnd w:id="36"/>
-    <w:bookmarkStart w:id="37" w:name="addressing-rq2-stress-and-appraisals"/>
+    <w:bookmarkEnd w:id="24"/>
+    <w:bookmarkStart w:id="25" w:name="X30468b93f95d42c3798a667c045b85c0e9d1c4d"/>
     <w:p>
       <w:pPr>
         <w:pStyle w:val="Heading3"/>
       </w:pPr>
       <w:r>
-        <w:t xml:space="preserve">4.3 Addressing RQ2: stress and appraisals</w:t>
+        <w:t xml:space="preserve">Theme 3. Stress, appraisal, and replacement</w:t>
       </w:r>
     </w:p>
     <w:p>
@@ -2505,25 +1775,7 @@
         <w:pStyle w:val="FirstParagraph"/>
       </w:pPr>
       <w:r>
-        <w:t xml:space="preserve">Among those who said the home affected study very much, 11 of 14 also selected</w:t>
-      </w:r>
-      <w:r>
-        <w:t xml:space="preserve"> </w:t>
-      </w:r>
-      <w:r>
-        <w:t xml:space="preserve">“</w:t>
-      </w:r>
-      <w:r>
-        <w:t xml:space="preserve">very high</w:t>
-      </w:r>
-      <w:r>
-        <w:t xml:space="preserve">”</w:t>
-      </w:r>
-      <w:r>
-        <w:t xml:space="preserve"> </w:t>
-      </w:r>
-      <w:r>
-        <w:t xml:space="preserve">psychological stress; among the others, 3 of 24 did (two-sided Fisher’s exact</w:t>
+        <w:t xml:space="preserve">Among those who said the home affected study very much, 11 of 14 also selected very high stress; among the others, 3 of 24 did (two-sided Fisher’s exact</w:t>
       </w:r>
       <w:r>
         <w:t xml:space="preserve"> </w:t>
@@ -2539,15 +1791,7 @@
         <w:t xml:space="preserve"> </w:t>
       </w:r>
       <w:r>
-        <w:t xml:space="preserve">= .00008). That is a co-occurrence in this dataset, not evidence that the household caused stress.</w:t>
-      </w:r>
-    </w:p>
-    <w:p>
-      <w:pPr>
-        <w:pStyle w:val="BodyText"/>
-      </w:pPr>
-      <w:r>
-        <w:t xml:space="preserve">Worse internet speed was associated with a worse appraisal index (ρ = .65,</w:t>
+        <w:t xml:space="preserve">= .00008). Worse internet speed went with a worse appraisal mean (ρ = .65, percentile bootstrap 95% CI [.36, .84],</w:t>
       </w:r>
       <w:r>
         <w:t xml:space="preserve"> </w:t>
@@ -2563,45 +1807,7 @@
         <w:t xml:space="preserve"> </w:t>
       </w:r>
       <w:r>
-        <w:t xml:space="preserve">&lt; .001, percentile bootstrap 95% CI [.36, .84]; Table 4). An unvalidated post hoc count of selected infrastructure-problem options (unstable network, power interruptions, no signal) was not associated with the index (ρ = .02). That count is not interpreted as evidence against the role of infrastructure.</w:t>
-      </w:r>
-    </w:p>
-    <w:p>
-      <w:pPr>
-        <w:pStyle w:val="BodyText"/>
-      </w:pPr>
-      <w:r>
-        <w:t xml:space="preserve">Active interaction with the teacher</w:t>
-      </w:r>
-      <w:r>
-        <w:t xml:space="preserve"> </w:t>
-      </w:r>
-      <w:r>
-        <w:t xml:space="preserve">“</w:t>
-      </w:r>
-      <w:r>
-        <w:t xml:space="preserve">very much</w:t>
-      </w:r>
-      <w:r>
-        <w:t xml:space="preserve">”</w:t>
-      </w:r>
-      <w:r>
-        <w:t xml:space="preserve"> </w:t>
-      </w:r>
-      <w:r>
-        <w:t xml:space="preserve">was uncommon (6 of 38). Preferred live length was 45 minutes for half of the respondents and 30 minutes for 28.9%. One open comment said that even one minute online was</w:t>
-      </w:r>
-      <w:r>
-        <w:t xml:space="preserve"> </w:t>
-      </w:r>
-      <w:r>
-        <w:t xml:space="preserve">“</w:t>
-      </w:r>
-      <w:r>
-        <w:t xml:space="preserve">not suitable.</w:t>
-      </w:r>
-      <w:r>
-        <w:t xml:space="preserve">”</w:t>
+        <w:t xml:space="preserve">&lt; .001). Both pairs come from the same form. They are reported as co-occurrence, not as cause.</w:t>
       </w:r>
     </w:p>
     <w:p>
@@ -2625,7 +1831,7 @@
           <w:iCs/>
           <w:i/>
         </w:rPr>
-        <w:t xml:space="preserve">Focal associations (N = 38)</w:t>
+        <w:t xml:space="preserve">Associations in this sample (N = 38)</w:t>
       </w:r>
     </w:p>
     <w:tbl>
@@ -2752,134 +1958,13 @@
           </w:p>
         </w:tc>
       </w:tr>
-      <w:tr>
-        <w:tc>
-          <w:tcPr/>
-          <w:p>
-            <w:pPr>
-              <w:pStyle w:val="Compact"/>
-              <w:jc w:val="left"/>
-            </w:pPr>
-            <w:r>
-              <w:t xml:space="preserve">Infrastructure-problem count × appraisal index (exploratory post hoc)</w:t>
-            </w:r>
-          </w:p>
-        </w:tc>
-        <w:tc>
-          <w:tcPr/>
-          <w:p>
-            <w:pPr>
-              <w:pStyle w:val="Compact"/>
-              <w:jc w:val="left"/>
-            </w:pPr>
-            <w:r>
-              <w:t xml:space="preserve">ρ = .02, percentile bootstrap 95% CI [−.32, .37],</w:t>
-            </w:r>
-            <w:r>
-              <w:t xml:space="preserve"> </w:t>
-            </w:r>
-            <w:r>
-              <w:rPr>
-                <w:iCs/>
-                <w:i/>
-              </w:rPr>
-              <w:t xml:space="preserve">p</w:t>
-            </w:r>
-            <w:r>
-              <w:t xml:space="preserve"> </w:t>
-            </w:r>
-            <w:r>
-              <w:t xml:space="preserve">= .91</w:t>
-            </w:r>
-          </w:p>
-        </w:tc>
-      </w:tr>
     </w:tbl>
     <w:p>
       <w:pPr>
         <w:pStyle w:val="BodyText"/>
       </w:pPr>
       <w:r>
-        <w:rPr>
-          <w:iCs/>
-          <w:i/>
-        </w:rPr>
-        <w:t xml:space="preserve">Note.</w:t>
-      </w:r>
-      <w:r>
-        <w:t xml:space="preserve"> </w:t>
-      </w:r>
-      <w:r>
-        <w:t xml:space="preserve">Analyses are exploratory. Odds ratios are omitted. The infrastructure-problem count is an unvalidated post hoc indicator and is not treated as a parallel scale.</w:t>
-      </w:r>
-    </w:p>
-    <w:p>
-      <w:pPr>
-        <w:pStyle w:val="BodyText"/>
-      </w:pPr>
-      <w:r>
-        <w:t xml:space="preserve">Among Pakistani-nationality respondents only (n = 37), the home–stress table remained 11/14 versus 3/23 (two-sided Fisher’s exact</w:t>
-      </w:r>
-      <w:r>
-        <w:t xml:space="preserve"> </w:t>
-      </w:r>
-      <w:r>
-        <w:rPr>
-          <w:iCs/>
-          <w:i/>
-        </w:rPr>
-        <w:t xml:space="preserve">p</w:t>
-      </w:r>
-      <w:r>
-        <w:t xml:space="preserve"> </w:t>
-      </w:r>
-      <w:r>
-        <w:t xml:space="preserve">= .00011) and speed × appraisal was ρ = .67 (percentile bootstrap 95% CI [.39, .85]).</w:t>
-      </w:r>
-    </w:p>
-    <w:bookmarkEnd w:id="37"/>
-    <w:bookmarkStart w:id="38" w:name="addressing-rq3-replacement-judgment"/>
-    <w:p>
-      <w:pPr>
-        <w:pStyle w:val="Heading3"/>
-      </w:pPr>
-      <w:r>
-        <w:t xml:space="preserve">4.4 Addressing RQ3: replacement judgment</w:t>
-      </w:r>
-    </w:p>
-    <w:p>
-      <w:pPr>
-        <w:pStyle w:val="FirstParagraph"/>
-      </w:pPr>
-      <w:r>
-        <w:t xml:space="preserve">Nineteen of 38 said online study could replace campus classes, and 19 said it could not. Among women, 9 of 11 said it could not; among men, 10 of 27 said so. With only 11 women, this is a cautious observation of perceived legitimacy in this sample. It is not a gender finding about Pakistani households and is not treated as a focal test (Appendix B).</w:t>
-      </w:r>
-    </w:p>
-    <w:bookmarkEnd w:id="38"/>
-    <w:bookmarkEnd w:id="39"/>
-    <w:bookmarkStart w:id="40" w:name="discussion"/>
-    <w:p>
-      <w:pPr>
-        <w:pStyle w:val="Heading2"/>
-      </w:pPr>
-      <w:r>
-        <w:t xml:space="preserve">5. Discussion</w:t>
-      </w:r>
-    </w:p>
-    <w:p>
-      <w:pPr>
-        <w:pStyle w:val="FirstParagraph"/>
-      </w:pPr>
-      <w:r>
-        <w:t xml:space="preserve">The contribution of this article is threefold. Empirically, it documents learner-side household and platform-access conditions for a travelling online Chinese course in a small emergency-period sample. Conceptually, it treats localization of delivery, or delivery-context fit, as a distinct layer of localization work. In relation to existing online ICLE research, it complements sending-side accounts of emergency adaptation (Xu et al., 2022) and designed online Chinese work (Zhang &amp; Liu, 2023) with the conditions against which those arrangements have to be judged.</w:t>
-      </w:r>
-    </w:p>
-    <w:p>
-      <w:pPr>
-        <w:pStyle w:val="BodyText"/>
-      </w:pPr>
-      <w:r>
-        <w:t xml:space="preserve">The study set out to establish whether the difficulties the field has named—networks, platforms, interaction, and affect—were present as learner-side conditions in this sample. The answer is yes. Those who said the home affected study</w:t>
+        <w:t xml:space="preserve">Active interaction with the teacher</w:t>
       </w:r>
       <w:r>
         <w:t xml:space="preserve"> </w:t>
@@ -2897,132 +1982,7 @@
         <w:t xml:space="preserve"> </w:t>
       </w:r>
       <w:r>
-        <w:t xml:space="preserve">more often selected</w:t>
-      </w:r>
-      <w:r>
-        <w:t xml:space="preserve"> </w:t>
-      </w:r>
-      <w:r>
-        <w:t xml:space="preserve">“</w:t>
-      </w:r>
-      <w:r>
-        <w:t xml:space="preserve">very high stress,</w:t>
-      </w:r>
-      <w:r>
-        <w:t xml:space="preserve">”</w:t>
-      </w:r>
-      <w:r>
-        <w:t xml:space="preserve"> </w:t>
-      </w:r>
-      <w:r>
-        <w:t xml:space="preserve">and worse reported internet speed was associated with a more negative appraisal of online learning. The questionnaire does not show how institutions adapted. Localization of content and materials would still have been necessary (Lu et al., 2024; Zhao, 2020). It would not, by itself, have answered a synchronous session on an unstable connection, or a required application that respondents marked unusable in their country.</w:t>
-      </w:r>
-    </w:p>
-    <w:p>
-      <w:pPr>
-        <w:pStyle w:val="BodyText"/>
-      </w:pPr>
-      <w:r>
-        <w:t xml:space="preserve">Those conditions belong to the culture of the class in a narrow, ecological sense: the immediate setting in which language work was asked to happen (van Lier, 2004). They are not a claim about Pakistani culture, nor about a national educational system. Most respondents selected Pakistani nationality, and that is the only Pakistan connection the dataset can support.</w:t>
-      </w:r>
-    </w:p>
-    <w:p>
-      <w:pPr>
-        <w:pStyle w:val="BodyText"/>
-      </w:pPr>
-      <w:r>
-        <w:t xml:space="preserve">The platform pattern is best read as a possible geography of delivery. Applications often used in Chinese-university teaching (QQ, Chaoxing, DingTalk, 中国慕课) were frequently marked unusable, while Zoom and WhatsApp were more often marked available. The questionnaire cannot say whether that pattern reflects country restrictions, routing, account rules, skills, or virtual private networks. It can say that a travelling course which assumes a single institutional toolkit may ask learners to enter a class they cannot reliably open.</w:t>
-      </w:r>
-    </w:p>
-    <w:p>
-      <w:pPr>
-        <w:pStyle w:val="BodyText"/>
-      </w:pPr>
-      <w:r>
-        <w:t xml:space="preserve">Participation in this dataset co-occurred with reported platform access, power and connectivity problems, and a home that many described as not quiet. That is a description of domestic participation conditions, not a claim that inequality is</w:t>
-      </w:r>
-      <w:r>
-        <w:t xml:space="preserve"> </w:t>
-      </w:r>
-      <w:r>
-        <w:t xml:space="preserve">“</w:t>
-      </w:r>
-      <w:r>
-        <w:t xml:space="preserve">cultural.</w:t>
-      </w:r>
-      <w:r>
-        <w:t xml:space="preserve">”</w:t>
-      </w:r>
-    </w:p>
-    <w:bookmarkEnd w:id="40"/>
-    <w:bookmarkStart w:id="45" w:name="pedagogical-implications"/>
-    <w:p>
-      <w:pPr>
-        <w:pStyle w:val="Heading2"/>
-      </w:pPr>
-      <w:r>
-        <w:t xml:space="preserve">6. Pedagogical implications</w:t>
-      </w:r>
-    </w:p>
-    <w:p>
-      <w:pPr>
-        <w:pStyle w:val="FirstParagraph"/>
-      </w:pPr>
-      <w:r>
-        <w:t xml:space="preserve">In this sample, the questionnaire can support only a small set of classroom decisions.</w:t>
-      </w:r>
-    </w:p>
-    <w:bookmarkStart w:id="41" w:name="platform-selection"/>
-    <w:p>
-      <w:pPr>
-        <w:pStyle w:val="Heading3"/>
-      </w:pPr>
-      <w:r>
-        <w:t xml:space="preserve">Platform selection</w:t>
-      </w:r>
-    </w:p>
-    <w:p>
-      <w:pPr>
-        <w:pStyle w:val="FirstParagraph"/>
-      </w:pPr>
-      <w:r>
-        <w:t xml:space="preserve">Because QQ and Chaoxing were frequently marked unusable (Table 3), a program should not treat the sending-side toolkit as given. Before it requires a platform, it has to ask whether learners can open it where they sit, and it has to name a usable alternative. WhatsApp was marked available here, but it was not recorded as used for class, so the data do not recommend it as a replacement.</w:t>
-      </w:r>
-    </w:p>
-    <w:bookmarkEnd w:id="41"/>
-    <w:bookmarkStart w:id="42" w:name="assessment-modes"/>
-    <w:p>
-      <w:pPr>
-        <w:pStyle w:val="Heading3"/>
-      </w:pPr>
-      <w:r>
-        <w:t xml:space="preserve">Assessment modes</w:t>
-      </w:r>
-    </w:p>
-    <w:p>
-      <w:pPr>
-        <w:pStyle w:val="FirstParagraph"/>
-      </w:pPr>
-      <w:r>
-        <w:t xml:space="preserve">Because only 28.9% described the home as quiet, 42.1% reported power interruptions, and 76.3% reported unstable networks (Table 2), institutions should not treat a live oral hour as the only assessable performance. Assessment that assumes a quiet, continuous campus hour will mark some of those conditions as learner failure.</w:t>
-      </w:r>
-    </w:p>
-    <w:bookmarkEnd w:id="42"/>
-    <w:bookmarkStart w:id="43" w:name="live-session-duration"/>
-    <w:p>
-      <w:pPr>
-        <w:pStyle w:val="Heading3"/>
-      </w:pPr>
-      <w:r>
-        <w:t xml:space="preserve">Live session duration</w:t>
-      </w:r>
-    </w:p>
-    <w:p>
-      <w:pPr>
-        <w:pStyle w:val="FirstParagraph"/>
-      </w:pPr>
-      <w:r>
-        <w:t xml:space="preserve">Preferred live length here was 45 minutes for half of the respondents and 30 minutes for 28.9%. One open comment said that even one minute online was</w:t>
+        <w:t xml:space="preserve">was marked by 6 of 38. Preferred live length was 45 minutes for 19 respondents and 30 minutes for 11. One open comment said that even one minute online was</w:t>
       </w:r>
       <w:r>
         <w:t xml:space="preserve"> </w:t>
@@ -3040,17 +2000,26 @@
         <w:t xml:space="preserve"> </w:t>
       </w:r>
       <w:r>
-        <w:t xml:space="preserve">A shorter live slot or an asynchronous oral alternative is the suggestion the data can support.</w:t>
+        <w:t xml:space="preserve">Nineteen said online study could replace campus classes, and 19 said it could not.</w:t>
       </w:r>
     </w:p>
-    <w:bookmarkEnd w:id="43"/>
-    <w:bookmarkStart w:id="44" w:name="collecting-access-data"/>
     <w:p>
       <w:pPr>
-        <w:pStyle w:val="Heading3"/>
+        <w:pStyle w:val="BodyText"/>
       </w:pPr>
       <w:r>
-        <w:t xml:space="preserve">Collecting access data</w:t>
+        <w:t xml:space="preserve">Among Pakistani-nationality respondents only (n = 37), the home and stress table remained 11/14 versus 3/23 and speed × appraisal was ρ = .67.</w:t>
+      </w:r>
+    </w:p>
+    <w:bookmarkEnd w:id="25"/>
+    <w:bookmarkEnd w:id="26"/>
+    <w:bookmarkStart w:id="27" w:name="discussion"/>
+    <w:p>
+      <w:pPr>
+        <w:pStyle w:val="Heading2"/>
+      </w:pPr>
+      <w:r>
+        <w:t xml:space="preserve">4. Discussion</w:t>
       </w:r>
     </w:p>
     <w:p>
@@ -3058,7 +2027,7 @@
         <w:pStyle w:val="FirstParagraph"/>
       </w:pPr>
       <w:r>
-        <w:t xml:space="preserve">The form shows household and access conditions. It does not show how institutions adapted. Those conditions should be collected as part of course design, not after complaints.</w:t>
+        <w:t xml:space="preserve">The 38 rows show home trouble, unused platforms, and stress sitting together in this sample. That is what the questionnaire can show. It cannot show that a verified Chinese class was closed, or that these respondents stood for online Chinese learners as a group. Tao and Gao (2022) had already named networks, platforms, and strain. Yu and Xu (2022) found overall positive online learning status in a larger South Asian sample. Their questionnaire and this form are not the same sample and are not read here as a single test. The present data add counts of power, quiet, speed, and named tools from February 2022.</w:t>
       </w:r>
     </w:p>
     <w:p>
@@ -3066,556 +2035,35 @@
         <w:pStyle w:val="BodyText"/>
       </w:pPr>
       <w:r>
-        <w:t xml:space="preserve">These suggestions are bound to this sample. They are not a national policy, and they are not evidence that later hybrid ICLE has repeated this pattern. They do suggest that hybrid models</w:t>
-      </w:r>
-      <w:r>
-        <w:t xml:space="preserve"> </w:t>
-      </w:r>
-      <w:r>
-        <w:rPr>
-          <w:iCs/>
-          <w:i/>
-        </w:rPr>
-        <w:t xml:space="preserve">may</w:t>
-      </w:r>
-      <w:r>
-        <w:t xml:space="preserve"> </w:t>
-      </w:r>
-      <w:r>
-        <w:t xml:space="preserve">reproduce a similar mismatch if the delivery assumptions of a travelling course are left unexamined (Stockwell &amp; Wang, 2023).</w:t>
+        <w:t xml:space="preserve">A better textbook would not, by itself, have answered a live session on an unstable connection, or a required application that respondents marked unusable. QQ and Chaoxing were often marked unusable; Zoom and WhatsApp were more often marked available. A teacher who requires one campus application can at least ask whether that application opens. The data do not recommend WhatsApp as a class tool: the form never asked whether it was used for class.</w:t>
       </w:r>
     </w:p>
-    <w:bookmarkEnd w:id="44"/>
-    <w:bookmarkEnd w:id="45"/>
-    <w:bookmarkStart w:id="46" w:name="limitations"/>
-    <w:p>
-      <w:pPr>
-        <w:pStyle w:val="Heading2"/>
-      </w:pPr>
-      <w:r>
-        <w:t xml:space="preserve">7. Limitations</w:t>
-      </w:r>
-    </w:p>
-    <w:p>
-      <w:pPr>
-        <w:pStyle w:val="FirstParagraph"/>
-      </w:pPr>
-      <w:r>
-        <w:t xml:space="preserve">The sample is small (N = 38), network-recruited, and majority male; recruitment channel, host university, program type, and place of residence were not recorded, so all outcomes are self-report from a convenience group whose enrollment was not independently verified. The data are from February 2022 and concern emergency remote teaching; they are not evidence about current hybrid education. The appraisal index is descriptive rather than a validated scale, the infrastructure-problem count is an unvalidated post hoc indicator, the form did not measure institutional adaptation, IP metadata are not a location measure, and no ethics-committee number is available for the 2022 collection (Section 3.5).</w:t>
-      </w:r>
-    </w:p>
-    <w:bookmarkEnd w:id="46"/>
-    <w:bookmarkStart w:id="47" w:name="conclusion"/>
-    <w:p>
-      <w:pPr>
-        <w:pStyle w:val="Heading2"/>
-      </w:pPr>
-      <w:r>
-        <w:t xml:space="preserve">8. Conclusion</w:t>
-      </w:r>
-    </w:p>
-    <w:p>
-      <w:pPr>
-        <w:pStyle w:val="FirstParagraph"/>
-      </w:pPr>
-      <w:r>
-        <w:t xml:space="preserve">In this sample, respondents reporting online Chinese-language courses also reported household infrastructure problems and uneven platform access. Those conditions co-occurred with selecting</w:t>
-      </w:r>
-      <w:r>
-        <w:t xml:space="preserve"> </w:t>
-      </w:r>
-      <w:r>
-        <w:t xml:space="preserve">“</w:t>
-      </w:r>
-      <w:r>
-        <w:t xml:space="preserve">very high stress</w:t>
-      </w:r>
-      <w:r>
-        <w:t xml:space="preserve">”</w:t>
-      </w:r>
-      <w:r>
-        <w:t xml:space="preserve"> </w:t>
-      </w:r>
-      <w:r>
-        <w:t xml:space="preserve">and with more negative appraisals of online learning. That answer is bounded by N = 38 and by emergency remote teaching (Section 3.1). Whether later hybrid arrangements have closed the gap is a question this study cannot answer. Online Chinese teaching is not only a content problem. It is also a delivery problem.</w:t>
-      </w:r>
-    </w:p>
-    <w:bookmarkEnd w:id="47"/>
-    <w:bookmarkStart w:id="48" w:name="appendix-a.-appraisal-items-and-coding"/>
-    <w:p>
-      <w:pPr>
-        <w:pStyle w:val="Heading2"/>
-      </w:pPr>
-      <w:r>
-        <w:t xml:space="preserve">Appendix A. Appraisal items and coding</w:t>
-      </w:r>
-    </w:p>
-    <w:p>
-      <w:pPr>
-        <w:pStyle w:val="FirstParagraph"/>
-      </w:pPr>
-      <w:r>
-        <w:t xml:space="preserve">English glosses of the Chinese stems.</w:t>
-      </w:r>
-    </w:p>
-    <w:tbl>
-      <w:tblPr>
-        <w:tblStyle w:val="Table"/>
-        <w:tblW w:type="pct" w:w="5000"/>
-        <w:tblLook w:firstRow="1" w:lastRow="0" w:firstColumn="0" w:lastColumn="0" w:noHBand="0" w:noVBand="0" w:val="0020"/>
-        <w:jc w:val="start"/>
-      </w:tblPr>
-      <w:tblGrid>
-        <w:gridCol w:w="1980"/>
-        <w:gridCol w:w="1980"/>
-        <w:gridCol w:w="1980"/>
-        <w:gridCol w:w="1980"/>
-      </w:tblGrid>
-      <w:tr>
-        <w:trPr>
-          <w:tblHeader w:val="true"/>
-        </w:trPr>
-        <w:tc>
-          <w:tcPr/>
-          <w:p>
-            <w:pPr>
-              <w:pStyle w:val="Compact"/>
-              <w:jc w:val="left"/>
-            </w:pPr>
-            <w:r>
-              <w:t xml:space="preserve">Item</w:t>
-            </w:r>
-          </w:p>
-        </w:tc>
-        <w:tc>
-          <w:tcPr/>
-          <w:p>
-            <w:pPr>
-              <w:pStyle w:val="Compact"/>
-              <w:jc w:val="left"/>
-            </w:pPr>
-            <w:r>
-              <w:t xml:space="preserve">Stem (gloss)</w:t>
-            </w:r>
-          </w:p>
-        </w:tc>
-        <w:tc>
-          <w:tcPr/>
-          <w:p>
-            <w:pPr>
-              <w:pStyle w:val="Compact"/>
-              <w:jc w:val="left"/>
-            </w:pPr>
-            <w:r>
-              <w:t xml:space="preserve">1</w:t>
-            </w:r>
-          </w:p>
-        </w:tc>
-        <w:tc>
-          <w:tcPr/>
-          <w:p>
-            <w:pPr>
-              <w:pStyle w:val="Compact"/>
-              <w:jc w:val="left"/>
-            </w:pPr>
-            <w:r>
-              <w:t xml:space="preserve">Higher</w:t>
-            </w:r>
-          </w:p>
-        </w:tc>
-      </w:tr>
-      <w:tr>
-        <w:tc>
-          <w:tcPr/>
-          <w:p>
-            <w:pPr>
-              <w:pStyle w:val="Compact"/>
-              <w:jc w:val="left"/>
-            </w:pPr>
-            <w:r>
-              <w:t xml:space="preserve">Learned (Q8)</w:t>
-            </w:r>
-          </w:p>
-        </w:tc>
-        <w:tc>
-          <w:tcPr/>
-          <w:p>
-            <w:pPr>
-              <w:pStyle w:val="Compact"/>
-              <w:jc w:val="left"/>
-            </w:pPr>
-            <w:r>
-              <w:t xml:space="preserve">Can you learn a lot in online class?</w:t>
-            </w:r>
-          </w:p>
-        </w:tc>
-        <w:tc>
-          <w:tcPr/>
-          <w:p>
-            <w:pPr>
-              <w:pStyle w:val="Compact"/>
-              <w:jc w:val="left"/>
-            </w:pPr>
-            <w:r>
-              <w:t xml:space="preserve">a lot</w:t>
-            </w:r>
-          </w:p>
-        </w:tc>
-        <w:tc>
-          <w:tcPr/>
-          <w:p>
-            <w:pPr>
-              <w:pStyle w:val="Compact"/>
-              <w:jc w:val="left"/>
-            </w:pPr>
-            <w:r>
-              <w:t xml:space="preserve">worse appraisal</w:t>
-            </w:r>
-          </w:p>
-        </w:tc>
-      </w:tr>
-      <w:tr>
-        <w:tc>
-          <w:tcPr/>
-          <w:p>
-            <w:pPr>
-              <w:pStyle w:val="Compact"/>
-              <w:jc w:val="left"/>
-            </w:pPr>
-            <w:r>
-              <w:t xml:space="preserve">Improve (Q9)</w:t>
-            </w:r>
-          </w:p>
-        </w:tc>
-        <w:tc>
-          <w:tcPr/>
-          <w:p>
-            <w:pPr>
-              <w:pStyle w:val="Compact"/>
-              <w:jc w:val="left"/>
-            </w:pPr>
-            <w:r>
-              <w:t xml:space="preserve">Can online study improve Chinese?</w:t>
-            </w:r>
-          </w:p>
-        </w:tc>
-        <w:tc>
-          <w:tcPr/>
-          <w:p>
-            <w:pPr>
-              <w:pStyle w:val="Compact"/>
-              <w:jc w:val="left"/>
-            </w:pPr>
-            <w:r>
-              <w:t xml:space="preserve">very much</w:t>
-            </w:r>
-          </w:p>
-        </w:tc>
-        <w:tc>
-          <w:tcPr/>
-          <w:p>
-            <w:pPr>
-              <w:pStyle w:val="Compact"/>
-              <w:jc w:val="left"/>
-            </w:pPr>
-            <w:r>
-              <w:t xml:space="preserve">worse appraisal</w:t>
-            </w:r>
-          </w:p>
-        </w:tc>
-      </w:tr>
-      <w:tr>
-        <w:tc>
-          <w:tcPr/>
-          <w:p>
-            <w:pPr>
-              <w:pStyle w:val="Compact"/>
-              <w:jc w:val="left"/>
-            </w:pPr>
-            <w:r>
-              <w:t xml:space="preserve">Interest (Q10)</w:t>
-            </w:r>
-          </w:p>
-        </w:tc>
-        <w:tc>
-          <w:tcPr/>
-          <w:p>
-            <w:pPr>
-              <w:pStyle w:val="Compact"/>
-              <w:jc w:val="left"/>
-            </w:pPr>
-            <w:r>
-              <w:t xml:space="preserve">Does it spark learning interest?</w:t>
-            </w:r>
-          </w:p>
-        </w:tc>
-        <w:tc>
-          <w:tcPr/>
-          <w:p>
-            <w:pPr>
-              <w:pStyle w:val="Compact"/>
-              <w:jc w:val="left"/>
-            </w:pPr>
-            <w:r>
-              <w:t xml:space="preserve">very much</w:t>
-            </w:r>
-          </w:p>
-        </w:tc>
-        <w:tc>
-          <w:tcPr/>
-          <w:p>
-            <w:pPr>
-              <w:pStyle w:val="Compact"/>
-              <w:jc w:val="left"/>
-            </w:pPr>
-            <w:r>
-              <w:t xml:space="preserve">worse appraisal</w:t>
-            </w:r>
-          </w:p>
-        </w:tc>
-      </w:tr>
-      <w:tr>
-        <w:tc>
-          <w:tcPr/>
-          <w:p>
-            <w:pPr>
-              <w:pStyle w:val="Compact"/>
-              <w:jc w:val="left"/>
-            </w:pPr>
-            <w:r>
-              <w:t xml:space="preserve">Speed (Q14)</w:t>
-            </w:r>
-          </w:p>
-        </w:tc>
-        <w:tc>
-          <w:tcPr/>
-          <w:p>
-            <w:pPr>
-              <w:pStyle w:val="Compact"/>
-              <w:jc w:val="left"/>
-            </w:pPr>
-            <w:r>
-              <w:t xml:space="preserve">Internet speed</w:t>
-            </w:r>
-          </w:p>
-        </w:tc>
-        <w:tc>
-          <w:tcPr/>
-          <w:p>
-            <w:pPr>
-              <w:pStyle w:val="Compact"/>
-              <w:jc w:val="left"/>
-            </w:pPr>
-            <w:r>
-              <w:t xml:space="preserve">very good</w:t>
-            </w:r>
-          </w:p>
-        </w:tc>
-        <w:tc>
-          <w:tcPr/>
-          <w:p>
-            <w:pPr>
-              <w:pStyle w:val="Compact"/>
-              <w:jc w:val="left"/>
-            </w:pPr>
-            <w:r>
-              <w:t xml:space="preserve">worse speed</w:t>
-            </w:r>
-          </w:p>
-        </w:tc>
-      </w:tr>
-      <w:tr>
-        <w:tc>
-          <w:tcPr/>
-          <w:p>
-            <w:pPr>
-              <w:pStyle w:val="Compact"/>
-              <w:jc w:val="left"/>
-            </w:pPr>
-            <w:r>
-              <w:t xml:space="preserve">Stress (Q24)</w:t>
-            </w:r>
-          </w:p>
-        </w:tc>
-        <w:tc>
-          <w:tcPr/>
-          <w:p>
-            <w:pPr>
-              <w:pStyle w:val="Compact"/>
-              <w:jc w:val="left"/>
-            </w:pPr>
-            <w:r>
-              <w:t xml:space="preserve">Psychological stress</w:t>
-            </w:r>
-          </w:p>
-        </w:tc>
-        <w:tc>
-          <w:tcPr/>
-          <w:p>
-            <w:pPr>
-              <w:pStyle w:val="Compact"/>
-              <w:jc w:val="left"/>
-            </w:pPr>
-            <w:r>
-              <w:t xml:space="preserve">very high</w:t>
-            </w:r>
-          </w:p>
-        </w:tc>
-        <w:tc>
-          <w:tcPr/>
-          <w:p>
-            <w:pPr>
-              <w:pStyle w:val="Compact"/>
-              <w:jc w:val="left"/>
-            </w:pPr>
-            <w:r>
-              <w:t xml:space="preserve">less stress</w:t>
-            </w:r>
-          </w:p>
-        </w:tc>
-      </w:tr>
-      <w:tr>
-        <w:tc>
-          <w:tcPr/>
-          <w:p>
-            <w:pPr>
-              <w:pStyle w:val="Compact"/>
-              <w:jc w:val="left"/>
-            </w:pPr>
-            <w:r>
-              <w:t xml:space="preserve">Interaction (Q25)</w:t>
-            </w:r>
-          </w:p>
-        </w:tc>
-        <w:tc>
-          <w:tcPr/>
-          <w:p>
-            <w:pPr>
-              <w:pStyle w:val="Compact"/>
-              <w:jc w:val="left"/>
-            </w:pPr>
-            <w:r>
-              <w:t xml:space="preserve">Active interaction with teacher</w:t>
-            </w:r>
-          </w:p>
-        </w:tc>
-        <w:tc>
-          <w:tcPr/>
-          <w:p>
-            <w:pPr>
-              <w:pStyle w:val="Compact"/>
-              <w:jc w:val="left"/>
-            </w:pPr>
-            <w:r>
-              <w:t xml:space="preserve">very much</w:t>
-            </w:r>
-          </w:p>
-        </w:tc>
-        <w:tc>
-          <w:tcPr/>
-          <w:p>
-            <w:pPr>
-              <w:pStyle w:val="Compact"/>
-              <w:jc w:val="left"/>
-            </w:pPr>
-            <w:r>
-              <w:t xml:space="preserve">thinner interaction</w:t>
-            </w:r>
-          </w:p>
-        </w:tc>
-      </w:tr>
-    </w:tbl>
     <w:p>
       <w:pPr>
         <w:pStyle w:val="BodyText"/>
       </w:pPr>
       <w:r>
-        <w:t xml:space="preserve">Index = mean of Q8, Q9, and Q10 (n = 38; no missing on these three).</w:t>
-      </w:r>
-    </w:p>
-    <w:bookmarkEnd w:id="48"/>
-    <w:bookmarkStart w:id="49" w:name="appendix-b.-secondary-statistics"/>
-    <w:p>
-      <w:pPr>
-        <w:pStyle w:val="Heading2"/>
-      </w:pPr>
-      <w:r>
-        <w:t xml:space="preserve">Appendix B. Secondary statistics</w:t>
+        <w:t xml:space="preserve">A live oral hour that needs a quiet room and a steady line will treat many of the ticks in Table 2 as absence or weak performance. Preferred live length here was 45 or 30 minutes. Those are reports from this sample, not a national rule.</w:t>
       </w:r>
     </w:p>
     <w:p>
       <w:pPr>
-        <w:pStyle w:val="FirstParagraph"/>
+        <w:pStyle w:val="BodyText"/>
       </w:pPr>
       <w:r>
-        <w:t xml:space="preserve">See</w:t>
-      </w:r>
-      <w:r>
-        <w:t xml:space="preserve"> </w:t>
-      </w:r>
-      <w:r>
-        <w:rPr>
-          <w:rStyle w:val="VerbatimChar"/>
-        </w:rPr>
-        <w:t xml:space="preserve">analysis/supplementary_stats.md</w:t>
-      </w:r>
-      <w:r>
-        <w:t xml:space="preserve"> </w:t>
-      </w:r>
-      <w:r>
-        <w:t xml:space="preserve">for full tables. Summary: female × cannot-replace and learned-little × cannot-replace have identical cell counts (9/11 vs 10/27; Fisher’s exact</w:t>
-      </w:r>
-      <w:r>
-        <w:t xml:space="preserve"> </w:t>
-      </w:r>
-      <w:r>
-        <w:rPr>
-          <w:iCs/>
-          <w:i/>
-        </w:rPr>
-        <w:t xml:space="preserve">p</w:t>
-      </w:r>
-      <w:r>
-        <w:t xml:space="preserve"> </w:t>
-      </w:r>
-      <w:r>
-        <w:t xml:space="preserve">= .029). Poor internet × cannot-replace: 8/10 vs 11/28, Fisher’s exact</w:t>
-      </w:r>
-      <w:r>
-        <w:t xml:space="preserve"> </w:t>
-      </w:r>
-      <w:r>
-        <w:rPr>
-          <w:iCs/>
-          <w:i/>
-        </w:rPr>
-        <w:t xml:space="preserve">p</w:t>
-      </w:r>
-      <w:r>
-        <w:t xml:space="preserve"> </w:t>
-      </w:r>
-      <w:r>
-        <w:t xml:space="preserve">= .062. Mann–Whitney tests by gender on ordinals all had</w:t>
-      </w:r>
-      <w:r>
-        <w:t xml:space="preserve"> </w:t>
-      </w:r>
-      <w:r>
-        <w:rPr>
-          <w:iCs/>
-          <w:i/>
-        </w:rPr>
-        <w:t xml:space="preserve">p</w:t>
-      </w:r>
-      <w:r>
-        <w:t xml:space="preserve"> </w:t>
-      </w:r>
-      <w:r>
-        <w:t xml:space="preserve">≥ .36.</w:t>
+        <w:t xml:space="preserve">The sample is 38 self-selected rows from four days in February 2022. Recruitment is unknown. Enrollment was not verified. The instrument was not piloted. Several platform columns were never asked. There is no ethics-committee number for the original collection. The results are not a picture of current hybrid teaching.</w:t>
       </w:r>
     </w:p>
-    <w:bookmarkEnd w:id="49"/>
-    <w:bookmarkStart w:id="50" w:name="references"/>
+    <w:p>
+      <w:pPr>
+        <w:pStyle w:val="BodyText"/>
+      </w:pPr>
+      <w:r>
+        <w:t xml:space="preserve">In these 38 rows, home conditions and named-platform access were part of how respondents marked online Chinese study in February 2022.</w:t>
+      </w:r>
+    </w:p>
+    <w:bookmarkEnd w:id="27"/>
+    <w:bookmarkStart w:id="28" w:name="references"/>
     <w:p>
       <w:pPr>
         <w:pStyle w:val="Heading2"/>
@@ -3627,90 +2075,6 @@
     <w:p>
       <w:pPr>
         <w:pStyle w:val="FirstParagraph"/>
-      </w:pPr>
-      <w:r>
-        <w:t xml:space="preserve">Ali, W. (2020). Online and remote learning in higher education institutes: A necessity in light of COVID-19 pandemic.</w:t>
-      </w:r>
-      <w:r>
-        <w:t xml:space="preserve"> </w:t>
-      </w:r>
-      <w:r>
-        <w:rPr>
-          <w:iCs/>
-          <w:i/>
-        </w:rPr>
-        <w:t xml:space="preserve">Higher Education Studies, 10</w:t>
-      </w:r>
-      <w:r>
-        <w:t xml:space="preserve">(3), 16-25. https://doi.org/10.5539/hes.v10n3p16</w:t>
-      </w:r>
-    </w:p>
-    <w:p>
-      <w:pPr>
-        <w:pStyle w:val="BodyText"/>
-      </w:pPr>
-      <w:r>
-        <w:t xml:space="preserve">Beaunoyer, E., Dupéré, S., &amp; Guitton, M. J. (2020). COVID-19 and digital inequalities: Reciprocal impacts and mitigation strategies.</w:t>
-      </w:r>
-      <w:r>
-        <w:t xml:space="preserve"> </w:t>
-      </w:r>
-      <w:r>
-        <w:rPr>
-          <w:iCs/>
-          <w:i/>
-        </w:rPr>
-        <w:t xml:space="preserve">Computers in Human Behavior, 111</w:t>
-      </w:r>
-      <w:r>
-        <w:t xml:space="preserve">, Article 106424. https://doi.org/10.1016/j.chb.2020.106424</w:t>
-      </w:r>
-    </w:p>
-    <w:p>
-      <w:pPr>
-        <w:pStyle w:val="BodyText"/>
-      </w:pPr>
-      <w:r>
-        <w:t xml:space="preserve">Butt, A., &amp; Sadaf, M. (2026). Getting around the digital horizon: Recognizing multifaceted digital divide among university students in Pakistan.</w:t>
-      </w:r>
-      <w:r>
-        <w:t xml:space="preserve"> </w:t>
-      </w:r>
-      <w:r>
-        <w:rPr>
-          <w:iCs/>
-          <w:i/>
-        </w:rPr>
-        <w:t xml:space="preserve">Journal of the Knowledge Economy, 17</w:t>
-      </w:r>
-      <w:r>
-        <w:t xml:space="preserve">(4), 9567-9590. https://doi.org/10.1007/s13132-026-03164-7</w:t>
-      </w:r>
-    </w:p>
-    <w:p>
-      <w:pPr>
-        <w:pStyle w:val="BodyText"/>
-      </w:pPr>
-      <w:r>
-        <w:t xml:space="preserve">Canagarajah, A. S. (Ed.). (2005).</w:t>
-      </w:r>
-      <w:r>
-        <w:t xml:space="preserve"> </w:t>
-      </w:r>
-      <w:r>
-        <w:rPr>
-          <w:iCs/>
-          <w:i/>
-        </w:rPr>
-        <w:t xml:space="preserve">Reclaiming the local in language policy and practice</w:t>
-      </w:r>
-      <w:r>
-        <w:t xml:space="preserve">. Lawrence Erlbaum.</w:t>
-      </w:r>
-    </w:p>
-    <w:p>
-      <w:pPr>
-        <w:pStyle w:val="BodyText"/>
       </w:pPr>
       <w:r>
         <w:t xml:space="preserve">Gacs, A., Goertler, S., &amp; Spasova, S. (2020). Planned online language education versus crisis-prompted online language teaching: Lessons for the future.</w:t>
@@ -3727,174 +2091,6 @@
       </w:r>
       <w:r>
         <w:t xml:space="preserve">(2), 380-392. https://doi.org/10.1111/flan.12460</w:t>
-      </w:r>
-    </w:p>
-    <w:p>
-      <w:pPr>
-        <w:pStyle w:val="BodyText"/>
-      </w:pPr>
-      <w:r>
-        <w:t xml:space="preserve">Gao, X., &amp; Hua, Z. (2021). Experiencing Chinese education: Learning of language and culture by international students in Chinese universities.</w:t>
-      </w:r>
-      <w:r>
-        <w:t xml:space="preserve"> </w:t>
-      </w:r>
-      <w:r>
-        <w:rPr>
-          <w:iCs/>
-          <w:i/>
-        </w:rPr>
-        <w:t xml:space="preserve">Language, Culture and Curriculum, 34</w:t>
-      </w:r>
-      <w:r>
-        <w:t xml:space="preserve">(4), 353-359. https://doi.org/10.1080/07908318.2020.1871002</w:t>
-      </w:r>
-    </w:p>
-    <w:p>
-      <w:pPr>
-        <w:pStyle w:val="BodyText"/>
-      </w:pPr>
-      <w:r>
-        <w:t xml:space="preserve">Gong, Y., Gao, X., Li, M., &amp; Lai, C. (2020a). Cultural adaptation challenges and strategies during study abroad: New Zealand students in China.</w:t>
-      </w:r>
-      <w:r>
-        <w:t xml:space="preserve"> </w:t>
-      </w:r>
-      <w:r>
-        <w:rPr>
-          <w:iCs/>
-          <w:i/>
-        </w:rPr>
-        <w:t xml:space="preserve">Language, Culture and Curriculum, 34</w:t>
-      </w:r>
-      <w:r>
-        <w:t xml:space="preserve">(4), 417-437. https://doi.org/10.1080/07908318.2020.1856129</w:t>
-      </w:r>
-    </w:p>
-    <w:p>
-      <w:pPr>
-        <w:pStyle w:val="BodyText"/>
-      </w:pPr>
-      <w:r>
-        <w:t xml:space="preserve">Gong, Y., Gao, X., &amp; Lyu, B. (2020b). Teaching Chinese as a second or foreign language to non-Chinese learners in mainland China (2014-2018).</w:t>
-      </w:r>
-      <w:r>
-        <w:t xml:space="preserve"> </w:t>
-      </w:r>
-      <w:r>
-        <w:rPr>
-          <w:iCs/>
-          <w:i/>
-        </w:rPr>
-        <w:t xml:space="preserve">Language Teaching, 53</w:t>
-      </w:r>
-      <w:r>
-        <w:t xml:space="preserve">(1), 44-62. https://doi.org/10.1017/S0261444819000387</w:t>
-      </w:r>
-    </w:p>
-    <w:p>
-      <w:pPr>
-        <w:pStyle w:val="BodyText"/>
-      </w:pPr>
-      <w:r>
-        <w:t xml:space="preserve">González-Lloret, M. (2020). Collaborative tasks for online language teaching.</w:t>
-      </w:r>
-      <w:r>
-        <w:t xml:space="preserve"> </w:t>
-      </w:r>
-      <w:r>
-        <w:rPr>
-          <w:iCs/>
-          <w:i/>
-        </w:rPr>
-        <w:t xml:space="preserve">Foreign Language Annals, 53</w:t>
-      </w:r>
-      <w:r>
-        <w:t xml:space="preserve">(2), 260-269. https://doi.org/10.1111/flan.12466</w:t>
-      </w:r>
-    </w:p>
-    <w:p>
-      <w:pPr>
-        <w:pStyle w:val="BodyText"/>
-      </w:pPr>
-      <w:r>
-        <w:t xml:space="preserve">Guenier, A. W., Xing, M., &amp; Yan, J. (2026). From barriers to breakthroughs: Communicating Chinese culture to Irish learners with a multimodality online course.</w:t>
-      </w:r>
-      <w:r>
-        <w:t xml:space="preserve"> </w:t>
-      </w:r>
-      <w:r>
-        <w:rPr>
-          <w:iCs/>
-          <w:i/>
-        </w:rPr>
-        <w:t xml:space="preserve">Language, Culture and Curriculum</w:t>
-      </w:r>
-      <w:r>
-        <w:t xml:space="preserve">. Advance online publication. https://doi.org/10.1080/07908318.2026.2626775</w:t>
-      </w:r>
-    </w:p>
-    <w:p>
-      <w:pPr>
-        <w:pStyle w:val="BodyText"/>
-      </w:pPr>
-      <w:r>
-        <w:t xml:space="preserve">Guerrettaz, A. M., Engman, M. M., &amp; Matsumoto, Y. (2021). Empirically defining language learning and teaching materials in use through sociomaterial perspectives.</w:t>
-      </w:r>
-      <w:r>
-        <w:t xml:space="preserve"> </w:t>
-      </w:r>
-      <w:r>
-        <w:rPr>
-          <w:iCs/>
-          <w:i/>
-        </w:rPr>
-        <w:t xml:space="preserve">The Modern Language Journal, 105</w:t>
-      </w:r>
-      <w:r>
-        <w:t xml:space="preserve">(S1), 3-20. https://doi.org/10.1111/modl.12691</w:t>
-      </w:r>
-    </w:p>
-    <w:p>
-      <w:pPr>
-        <w:pStyle w:val="BodyText"/>
-      </w:pPr>
-      <w:r>
-        <w:t xml:space="preserve">Guo, C., &amp; Wan, B. (2022). The digital divide in online learning in China during the COVID-19 pandemic.</w:t>
-      </w:r>
-      <w:r>
-        <w:t xml:space="preserve"> </w:t>
-      </w:r>
-      <w:r>
-        <w:rPr>
-          <w:iCs/>
-          <w:i/>
-        </w:rPr>
-        <w:t xml:space="preserve">Technology in Society, 71</w:t>
-      </w:r>
-      <w:r>
-        <w:t xml:space="preserve">, Article 102122. https://doi.org/10.1016/j.techsoc.2022.102122</w:t>
-      </w:r>
-    </w:p>
-    <w:p>
-      <w:pPr>
-        <w:pStyle w:val="BodyText"/>
-      </w:pPr>
-      <w:r>
-        <w:t xml:space="preserve">Helsper, E. (2021).</w:t>
-      </w:r>
-      <w:r>
-        <w:t xml:space="preserve"> </w:t>
-      </w:r>
-      <w:r>
-        <w:rPr>
-          <w:iCs/>
-          <w:i/>
-        </w:rPr>
-        <w:t xml:space="preserve">The digital disconnect: The social causes and consequences of digital inequalities</w:t>
-      </w:r>
-      <w:r>
-        <w:t xml:space="preserve">. SAGE.</w:t>
       </w:r>
     </w:p>
     <w:p>
@@ -3923,27 +2119,6 @@
         <w:pStyle w:val="BodyText"/>
       </w:pPr>
       <w:r>
-        <w:t xml:space="preserve">Jamil, S., &amp; Muschert, G. (2023). The COVID-19 pandemic and e-learning: The digital divide and educational crises in Pakistan’s universities.</w:t>
-      </w:r>
-      <w:r>
-        <w:t xml:space="preserve"> </w:t>
-      </w:r>
-      <w:r>
-        <w:rPr>
-          <w:iCs/>
-          <w:i/>
-        </w:rPr>
-        <w:t xml:space="preserve">American Behavioral Scientist, 68</w:t>
-      </w:r>
-      <w:r>
-        <w:t xml:space="preserve">(9), 1161-1179. https://doi.org/10.1177/00027642231156779</w:t>
-      </w:r>
-    </w:p>
-    <w:p>
-      <w:pPr>
-        <w:pStyle w:val="BodyText"/>
-      </w:pPr>
-      <w:r>
         <w:t xml:space="preserve">Jin, L., Xu, Y., &amp; Deifell, E. (2023). College-level world language faculty background characteristics and their perceptions of online language teaching during the pandemic.</w:t>
       </w:r>
       <w:r>
@@ -3958,27 +2133,6 @@
       </w:r>
       <w:r>
         <w:t xml:space="preserve">(1), 137-162. https://doi.org/10.1111/flan.12689</w:t>
-      </w:r>
-    </w:p>
-    <w:p>
-      <w:pPr>
-        <w:pStyle w:val="BodyText"/>
-      </w:pPr>
-      <w:r>
-        <w:t xml:space="preserve">Kumaravadivelu, B. (2001). Toward a postmethod pedagogy.</w:t>
-      </w:r>
-      <w:r>
-        <w:t xml:space="preserve"> </w:t>
-      </w:r>
-      <w:r>
-        <w:rPr>
-          <w:iCs/>
-          <w:i/>
-        </w:rPr>
-        <w:t xml:space="preserve">TESOL Quarterly, 35</w:t>
-      </w:r>
-      <w:r>
-        <w:t xml:space="preserve">(4), 537-560. https://doi.org/10.2307/3588427</w:t>
       </w:r>
     </w:p>
     <w:p>
@@ -4007,276 +2161,6 @@
         <w:pStyle w:val="BodyText"/>
       </w:pPr>
       <w:r>
-        <w:t xml:space="preserve">Lomicka, L. (2020). Creating and sustaining virtual language communities.</w:t>
-      </w:r>
-      <w:r>
-        <w:t xml:space="preserve"> </w:t>
-      </w:r>
-      <w:r>
-        <w:rPr>
-          <w:iCs/>
-          <w:i/>
-        </w:rPr>
-        <w:t xml:space="preserve">Foreign Language Annals, 53</w:t>
-      </w:r>
-      <w:r>
-        <w:t xml:space="preserve">(2), 306-313. https://doi.org/10.1111/flan.12456</w:t>
-      </w:r>
-    </w:p>
-    <w:p>
-      <w:pPr>
-        <w:pStyle w:val="BodyText"/>
-      </w:pPr>
-      <w:r>
-        <w:t xml:space="preserve">Lu, X., Tan, A., Ma, Y., Feng, H., &amp; Hanif, B. (2024). Scenario analysis of localization and adaptation of Chinese language teaching.</w:t>
-      </w:r>
-      <w:r>
-        <w:t xml:space="preserve"> </w:t>
-      </w:r>
-      <w:r>
-        <w:rPr>
-          <w:iCs/>
-          <w:i/>
-        </w:rPr>
-        <w:t xml:space="preserve">Pakistan Journal of Humanities and Social Sciences, 12</w:t>
-      </w:r>
-      <w:r>
-        <w:t xml:space="preserve">(4), 3257-3281. https://doi.org/10.52131/pjhss.2024.v12i4.2553</w:t>
-      </w:r>
-    </w:p>
-    <w:p>
-      <w:pPr>
-        <w:pStyle w:val="BodyText"/>
-      </w:pPr>
-      <w:r>
-        <w:t xml:space="preserve">MacIntyre, P. D., Gregersen, T., &amp; Mercer, S. (2020). Language teachers’ coping strategies during the Covid-19 conversion to online teaching: Correlations with stress, wellbeing and negative emotions.</w:t>
-      </w:r>
-      <w:r>
-        <w:t xml:space="preserve"> </w:t>
-      </w:r>
-      <w:r>
-        <w:rPr>
-          <w:iCs/>
-          <w:i/>
-        </w:rPr>
-        <w:t xml:space="preserve">System, 94</w:t>
-      </w:r>
-      <w:r>
-        <w:t xml:space="preserve">, Article 102352. https://doi.org/10.1016/j.system.2020.102352</w:t>
-      </w:r>
-    </w:p>
-    <w:p>
-      <w:pPr>
-        <w:pStyle w:val="BodyText"/>
-      </w:pPr>
-      <w:r>
-        <w:t xml:space="preserve">McDonough, J., &amp; Shaw, C. (2003).</w:t>
-      </w:r>
-      <w:r>
-        <w:t xml:space="preserve"> </w:t>
-      </w:r>
-      <w:r>
-        <w:rPr>
-          <w:iCs/>
-          <w:i/>
-        </w:rPr>
-        <w:t xml:space="preserve">Materials and methods in ELT: A teacher’s guide</w:t>
-      </w:r>
-      <w:r>
-        <w:t xml:space="preserve"> </w:t>
-      </w:r>
-      <w:r>
-        <w:t xml:space="preserve">(2nd ed.). Blackwell.</w:t>
-      </w:r>
-    </w:p>
-    <w:p>
-      <w:pPr>
-        <w:pStyle w:val="BodyText"/>
-      </w:pPr>
-      <w:r>
-        <w:t xml:space="preserve">Moorhouse, B. L. (2023). Teachers’ digital technology use after a period of online teaching.</w:t>
-      </w:r>
-      <w:r>
-        <w:t xml:space="preserve"> </w:t>
-      </w:r>
-      <w:r>
-        <w:rPr>
-          <w:iCs/>
-          <w:i/>
-        </w:rPr>
-        <w:t xml:space="preserve">ELT Journal, 77</w:t>
-      </w:r>
-      <w:r>
-        <w:t xml:space="preserve">(4), 445-457. https://doi.org/10.1093/elt/ccac050</w:t>
-      </w:r>
-    </w:p>
-    <w:p>
-      <w:pPr>
-        <w:pStyle w:val="BodyText"/>
-      </w:pPr>
-      <w:r>
-        <w:t xml:space="preserve">Moser, K. M., Wei, T., &amp; Brenner, D. (2021). Remote teaching during COVID-19: Implications from a national survey of language educators.</w:t>
-      </w:r>
-      <w:r>
-        <w:t xml:space="preserve"> </w:t>
-      </w:r>
-      <w:r>
-        <w:rPr>
-          <w:iCs/>
-          <w:i/>
-        </w:rPr>
-        <w:t xml:space="preserve">System, 97</w:t>
-      </w:r>
-      <w:r>
-        <w:t xml:space="preserve">, Article 102431. https://doi.org/10.1016/j.system.2020.102431</w:t>
-      </w:r>
-    </w:p>
-    <w:p>
-      <w:pPr>
-        <w:pStyle w:val="BodyText"/>
-      </w:pPr>
-      <w:r>
-        <w:t xml:space="preserve">Payne, J. S. (2020). Developing L2 productive language skills online and the strategic use of instructional tools.</w:t>
-      </w:r>
-      <w:r>
-        <w:t xml:space="preserve"> </w:t>
-      </w:r>
-      <w:r>
-        <w:rPr>
-          <w:iCs/>
-          <w:i/>
-        </w:rPr>
-        <w:t xml:space="preserve">Foreign Language Annals, 53</w:t>
-      </w:r>
-      <w:r>
-        <w:t xml:space="preserve">(2), 243-249. https://doi.org/10.1111/flan.12457</w:t>
-      </w:r>
-    </w:p>
-    <w:p>
-      <w:pPr>
-        <w:pStyle w:val="BodyText"/>
-      </w:pPr>
-      <w:r>
-        <w:t xml:space="preserve">Qi, X. (2025).</w:t>
-      </w:r>
-      <w:r>
-        <w:t xml:space="preserve"> </w:t>
-      </w:r>
-      <w:r>
-        <w:t xml:space="preserve">‘</w:t>
-      </w:r>
-      <w:r>
-        <w:t xml:space="preserve">My speech becomes just a voice, a picture</w:t>
-      </w:r>
-      <w:r>
-        <w:t xml:space="preserve">’</w:t>
-      </w:r>
-      <w:r>
-        <w:t xml:space="preserve">: Exploring language anxiety in Chinese as a second language learning in online environments.</w:t>
-      </w:r>
-      <w:r>
-        <w:t xml:space="preserve"> </w:t>
-      </w:r>
-      <w:r>
-        <w:rPr>
-          <w:iCs/>
-          <w:i/>
-        </w:rPr>
-        <w:t xml:space="preserve">Language Teaching Research</w:t>
-      </w:r>
-      <w:r>
-        <w:t xml:space="preserve">. Advance online publication. https://doi.org/10.1177/13621688251387320</w:t>
-      </w:r>
-    </w:p>
-    <w:p>
-      <w:pPr>
-        <w:pStyle w:val="BodyText"/>
-      </w:pPr>
-      <w:r>
-        <w:t xml:space="preserve">Raza, O., &amp; Hennessy, S. (2025).</w:t>
-      </w:r>
-      <w:r>
-        <w:t xml:space="preserve"> </w:t>
-      </w:r>
-      <w:r>
-        <w:rPr>
-          <w:iCs/>
-          <w:i/>
-        </w:rPr>
-        <w:t xml:space="preserve">Exploring the gender differences in technology use for educational purposes at home among students in Pakistan</w:t>
-      </w:r>
-      <w:r>
-        <w:t xml:space="preserve">. EdTech Hub. https://doi.org/10.53832/edtechhub.1099</w:t>
-      </w:r>
-    </w:p>
-    <w:p>
-      <w:pPr>
-        <w:pStyle w:val="BodyText"/>
-      </w:pPr>
-      <w:r>
-        <w:t xml:space="preserve">Russell, V. (2020). Language anxiety and the online learner.</w:t>
-      </w:r>
-      <w:r>
-        <w:t xml:space="preserve"> </w:t>
-      </w:r>
-      <w:r>
-        <w:rPr>
-          <w:iCs/>
-          <w:i/>
-        </w:rPr>
-        <w:t xml:space="preserve">Foreign Language Annals, 53</w:t>
-      </w:r>
-      <w:r>
-        <w:t xml:space="preserve">(2), 338-352. https://doi.org/10.1111/flan.12461</w:t>
-      </w:r>
-    </w:p>
-    <w:p>
-      <w:pPr>
-        <w:pStyle w:val="BodyText"/>
-      </w:pPr>
-      <w:r>
-        <w:t xml:space="preserve">Shan, Z., &amp; Xu, H. (2024). Students’ conceptions and experiences of institutionalised curriculum for multilingual learning: The case of a dual-foreign-languages programme.</w:t>
-      </w:r>
-      <w:r>
-        <w:t xml:space="preserve"> </w:t>
-      </w:r>
-      <w:r>
-        <w:rPr>
-          <w:iCs/>
-          <w:i/>
-        </w:rPr>
-        <w:t xml:space="preserve">Language, Culture and Curriculum, 37</w:t>
-      </w:r>
-      <w:r>
-        <w:t xml:space="preserve">(2), 230-246. https://doi.org/10.1080/07908318.2024.2313984</w:t>
-      </w:r>
-    </w:p>
-    <w:p>
-      <w:pPr>
-        <w:pStyle w:val="BodyText"/>
-      </w:pPr>
-      <w:r>
-        <w:t xml:space="preserve">Stockwell, G., &amp; Wang, Y. (2023). Exploring the challenges of technology in language teaching in the aftermath of the pandemic.</w:t>
-      </w:r>
-      <w:r>
-        <w:t xml:space="preserve"> </w:t>
-      </w:r>
-      <w:r>
-        <w:rPr>
-          <w:iCs/>
-          <w:i/>
-        </w:rPr>
-        <w:t xml:space="preserve">RELC Journal, 54</w:t>
-      </w:r>
-      <w:r>
-        <w:t xml:space="preserve">(2), 474-482. https://doi.org/10.1177/00336882231168438</w:t>
-      </w:r>
-    </w:p>
-    <w:p>
-      <w:pPr>
-        <w:pStyle w:val="BodyText"/>
-      </w:pPr>
-      <w:r>
         <w:t xml:space="preserve">Tao, J., &amp; Gao, X. (2022). Teaching and learning languages online: Challenges and responses.</w:t>
       </w:r>
       <w:r>
@@ -4291,132 +2175,6 @@
       </w:r>
       <w:r>
         <w:t xml:space="preserve">, Article 102819. https://doi.org/10.1016/j.system.2022.102819</w:t>
-      </w:r>
-    </w:p>
-    <w:p>
-      <w:pPr>
-        <w:pStyle w:val="BodyText"/>
-      </w:pPr>
-      <w:r>
-        <w:t xml:space="preserve">Tomlinson, B. (Ed.). (2011).</w:t>
-      </w:r>
-      <w:r>
-        <w:t xml:space="preserve"> </w:t>
-      </w:r>
-      <w:r>
-        <w:rPr>
-          <w:iCs/>
-          <w:i/>
-        </w:rPr>
-        <w:t xml:space="preserve">Materials development in language teaching</w:t>
-      </w:r>
-      <w:r>
-        <w:t xml:space="preserve"> </w:t>
-      </w:r>
-      <w:r>
-        <w:t xml:space="preserve">(2nd ed.). Cambridge University Press.</w:t>
-      </w:r>
-    </w:p>
-    <w:p>
-      <w:pPr>
-        <w:pStyle w:val="BodyText"/>
-      </w:pPr>
-      <w:r>
-        <w:t xml:space="preserve">Tu, M. (2026). Time and precarity in</w:t>
-      </w:r>
-      <w:r>
-        <w:t xml:space="preserve"> </w:t>
-      </w:r>
-      <w:r>
-        <w:t xml:space="preserve">‘</w:t>
-      </w:r>
-      <w:r>
-        <w:t xml:space="preserve">South–South</w:t>
-      </w:r>
-      <w:r>
-        <w:t xml:space="preserve">’</w:t>
-      </w:r>
-      <w:r>
-        <w:t xml:space="preserve"> </w:t>
-      </w:r>
-      <w:r>
-        <w:t xml:space="preserve">academic mobility: A 2019–2023 longitudinal study of Pakistani PhD students and recent graduates in China.</w:t>
-      </w:r>
-      <w:r>
-        <w:t xml:space="preserve"> </w:t>
-      </w:r>
-      <w:r>
-        <w:rPr>
-          <w:iCs/>
-          <w:i/>
-        </w:rPr>
-        <w:t xml:space="preserve">Population, Space and Place, 32</w:t>
-      </w:r>
-      <w:r>
-        <w:t xml:space="preserve">(2), Article e70227. https://doi.org/10.1002/psp.70227</w:t>
-      </w:r>
-    </w:p>
-    <w:p>
-      <w:pPr>
-        <w:pStyle w:val="BodyText"/>
-      </w:pPr>
-      <w:r>
-        <w:t xml:space="preserve">van Dijk, J. (2020).</w:t>
-      </w:r>
-      <w:r>
-        <w:t xml:space="preserve"> </w:t>
-      </w:r>
-      <w:r>
-        <w:rPr>
-          <w:iCs/>
-          <w:i/>
-        </w:rPr>
-        <w:t xml:space="preserve">The digital divide</w:t>
-      </w:r>
-      <w:r>
-        <w:t xml:space="preserve">. Polity.</w:t>
-      </w:r>
-    </w:p>
-    <w:p>
-      <w:pPr>
-        <w:pStyle w:val="BodyText"/>
-      </w:pPr>
-      <w:r>
-        <w:t xml:space="preserve">van Lier, L. (2004).</w:t>
-      </w:r>
-      <w:r>
-        <w:t xml:space="preserve"> </w:t>
-      </w:r>
-      <w:r>
-        <w:rPr>
-          <w:iCs/>
-          <w:i/>
-        </w:rPr>
-        <w:t xml:space="preserve">The ecology and semiotics of language learning: A sociocultural perspective</w:t>
-      </w:r>
-      <w:r>
-        <w:t xml:space="preserve">. Kluwer.</w:t>
-      </w:r>
-    </w:p>
-    <w:p>
-      <w:pPr>
-        <w:pStyle w:val="BodyText"/>
-      </w:pPr>
-      <w:r>
-        <w:t xml:space="preserve">Vishnu, S., Tengli, M. B., Ramadas, S., Sathyan, A. R., &amp; Bhatt, A. (2024). Bridging the divide: Assessing digital infrastructure for higher education online learning.</w:t>
-      </w:r>
-      <w:r>
-        <w:t xml:space="preserve"> </w:t>
-      </w:r>
-      <w:r>
-        <w:rPr>
-          <w:iCs/>
-          <w:i/>
-        </w:rPr>
-        <w:t xml:space="preserve">TechTrends, 68</w:t>
-      </w:r>
-      <w:r>
-        <w:t xml:space="preserve">(6), 1107-1116. https://doi.org/10.1007/s11528-024-00997-4</w:t>
       </w:r>
     </w:p>
     <w:p>
@@ -4445,69 +2203,6 @@
         <w:pStyle w:val="BodyText"/>
       </w:pPr>
       <w:r>
-        <w:t xml:space="preserve">Wen, X., &amp; Liu, F. (2025). Emotional dynamics of advanced Chinese as a second language learners: A Q methodology study.</w:t>
-      </w:r>
-      <w:r>
-        <w:t xml:space="preserve"> </w:t>
-      </w:r>
-      <w:r>
-        <w:rPr>
-          <w:iCs/>
-          <w:i/>
-        </w:rPr>
-        <w:t xml:space="preserve">Language, Culture and Curriculum, 38</w:t>
-      </w:r>
-      <w:r>
-        <w:t xml:space="preserve">(3), 380-400. https://doi.org/10.1080/07908318.2025.2486449</w:t>
-      </w:r>
-    </w:p>
-    <w:p>
-      <w:pPr>
-        <w:pStyle w:val="BodyText"/>
-      </w:pPr>
-      <w:r>
-        <w:t xml:space="preserve">White, C. (2006). Distance learning of foreign languages.</w:t>
-      </w:r>
-      <w:r>
-        <w:t xml:space="preserve"> </w:t>
-      </w:r>
-      <w:r>
-        <w:rPr>
-          <w:iCs/>
-          <w:i/>
-        </w:rPr>
-        <w:t xml:space="preserve">Language Teaching, 39</w:t>
-      </w:r>
-      <w:r>
-        <w:t xml:space="preserve">(4), 247-264. https://doi.org/10.1017/S0261444806003727</w:t>
-      </w:r>
-    </w:p>
-    <w:p>
-      <w:pPr>
-        <w:pStyle w:val="BodyText"/>
-      </w:pPr>
-      <w:r>
-        <w:t xml:space="preserve">Xu, B. (2024). Technology integration into Chinese as a foreign language learning in higher education: An integrated bibliometric analysis and systematic review (2000–2024).</w:t>
-      </w:r>
-      <w:r>
-        <w:t xml:space="preserve"> </w:t>
-      </w:r>
-      <w:r>
-        <w:rPr>
-          <w:iCs/>
-          <w:i/>
-        </w:rPr>
-        <w:t xml:space="preserve">Language Teaching Research</w:t>
-      </w:r>
-      <w:r>
-        <w:t xml:space="preserve">. Advance online publication. https://doi.org/10.1177/13621688241277911</w:t>
-      </w:r>
-    </w:p>
-    <w:p>
-      <w:pPr>
-        <w:pStyle w:val="BodyText"/>
-      </w:pPr>
-      <w:r>
         <w:t xml:space="preserve">Xu, Y., Jin, L., Deifell, E., &amp; Angus, K. (2022). Facilitating technology-based character learning in emergency remote teaching.</w:t>
       </w:r>
       <w:r>
@@ -4529,7 +2224,7 @@
         <w:pStyle w:val="BodyText"/>
       </w:pPr>
       <w:r>
-        <w:t xml:space="preserve">Zhang, M., &amp; Liu, Q. (2023). Synchronous and asynchronous online collaborative writing: A study on Chinese language learners.</w:t>
+        <w:t xml:space="preserve">Yu, L., &amp; Xu, L. (2022). Research on the online learning experience of South Asian students during COVID-19: The mediating effect of online learning status on autonomous learning and learning effect evaluation.</w:t>
       </w:r>
       <w:r>
         <w:t xml:space="preserve"> </w:t>
@@ -4539,98 +2234,14 @@
           <w:iCs/>
           <w:i/>
         </w:rPr>
-        <w:t xml:space="preserve">Foreign Language Annals, 56</w:t>
+        <w:t xml:space="preserve">Journal of International Students, 12</w:t>
       </w:r>
       <w:r>
-        <w:t xml:space="preserve">(3), 740-763. https://doi.org/10.1111/flan.12704</w:t>
+        <w:t xml:space="preserve">(S1), 45-60. https://doi.org/10.32674/jis.v12iS1.4607</w:t>
       </w:r>
     </w:p>
-    <w:p>
-      <w:pPr>
-        <w:pStyle w:val="BodyText"/>
-      </w:pPr>
-      <w:r>
-        <w:t xml:space="preserve">Zhang, Q., &amp; Osborne, C. (2026). Readiness for digital transformation in Chinese as a foreign language education: A semi-systematic review.</w:t>
-      </w:r>
-      <w:r>
-        <w:t xml:space="preserve"> </w:t>
-      </w:r>
-      <w:r>
-        <w:rPr>
-          <w:iCs/>
-          <w:i/>
-        </w:rPr>
-        <w:t xml:space="preserve">Chinese as a Second Language Research, 15</w:t>
-      </w:r>
-      <w:r>
-        <w:t xml:space="preserve">(1), 11-43. https://doi.org/10.1515/caslar-2026-2002</w:t>
-      </w:r>
-    </w:p>
-    <w:p>
-      <w:pPr>
-        <w:pStyle w:val="BodyText"/>
-      </w:pPr>
-      <w:r>
-        <w:t xml:space="preserve">Zhang, W., Wang, Y., Yang, L., &amp; Wang, C. (2020). Suspending classes without stopping learning: China’s education emergency management policy in the COVID-19 outbreak.</w:t>
-      </w:r>
-      <w:r>
-        <w:t xml:space="preserve"> </w:t>
-      </w:r>
-      <w:r>
-        <w:rPr>
-          <w:iCs/>
-          <w:i/>
-        </w:rPr>
-        <w:t xml:space="preserve">Journal of Risk and Financial Management, 13</w:t>
-      </w:r>
-      <w:r>
-        <w:t xml:space="preserve">(3), 55. https://doi.org/10.3390/jrfm13030055</w:t>
-      </w:r>
-    </w:p>
-    <w:p>
-      <w:pPr>
-        <w:pStyle w:val="BodyText"/>
-      </w:pPr>
-      <w:r>
-        <w:t xml:space="preserve">Zhao, H., &amp; Huang, J. (2010). China’s policy of Chinese as a foreign language and the use of overseas Confucius Institutes.</w:t>
-      </w:r>
-      <w:r>
-        <w:t xml:space="preserve"> </w:t>
-      </w:r>
-      <w:r>
-        <w:rPr>
-          <w:iCs/>
-          <w:i/>
-        </w:rPr>
-        <w:t xml:space="preserve">Educational Research for Policy and Practice, 9</w:t>
-      </w:r>
-      <w:r>
-        <w:t xml:space="preserve">(2), 127-142. https://doi.org/10.1007/s10671-009-9078-1</w:t>
-      </w:r>
-    </w:p>
-    <w:p>
-      <w:pPr>
-        <w:pStyle w:val="BodyText"/>
-      </w:pPr>
-      <w:r>
-        <w:t xml:space="preserve">Zhao, K. (2020). Localising Chinese language curriculum construction: A case study in an Australian primary school.</w:t>
-      </w:r>
-      <w:r>
-        <w:t xml:space="preserve"> </w:t>
-      </w:r>
-      <w:r>
-        <w:rPr>
-          <w:iCs/>
-          <w:i/>
-        </w:rPr>
-        <w:t xml:space="preserve">Global Chinese, 6</w:t>
-      </w:r>
-      <w:r>
-        <w:t xml:space="preserve">(2), 263-288. https://doi.org/10.1515/glochi-2020-0014</w:t>
-      </w:r>
-    </w:p>
-    <w:bookmarkEnd w:id="50"/>
-    <w:bookmarkEnd w:id="51"/>
+    <w:bookmarkEnd w:id="28"/>
+    <w:bookmarkEnd w:id="29"/>
     <w:sectPr>
       <w:pgSz w:h="15840" w:w="12240"/>
       <w:pgMar w:bottom="1440" w:footer="720" w:gutter="0" w:header="720" w:left="1440" w:right="1440" w:top="1440"/>
@@ -4913,167 +2524,6 @@
       </w:pPr>
     </w:lvl>
   </w:abstractNum>
-  <w:abstractNum w:abstractNumId="991">
-    <w:nsid w:val="A991"/>
-    <w:multiLevelType w:val="multilevel"/>
-    <w:lvl w:ilvl="0">
-      <w:numFmt w:val="bullet"/>
-      <w:lvlText w:val="•"/>
-      <w:lvlJc w:val="left"/>
-      <w:pPr>
-        <w:ind w:left="720" w:hanging="480"/>
-      </w:pPr>
-    </w:lvl>
-    <w:lvl w:ilvl="1">
-      <w:numFmt w:val="bullet"/>
-      <w:lvlText w:val="–"/>
-      <w:lvlJc w:val="left"/>
-      <w:pPr>
-        <w:ind w:left="1440" w:hanging="480"/>
-      </w:pPr>
-    </w:lvl>
-    <w:lvl w:ilvl="2">
-      <w:numFmt w:val="bullet"/>
-      <w:lvlText w:val="•"/>
-      <w:lvlJc w:val="left"/>
-      <w:pPr>
-        <w:ind w:left="2160" w:hanging="480"/>
-      </w:pPr>
-    </w:lvl>
-    <w:lvl w:ilvl="3">
-      <w:numFmt w:val="bullet"/>
-      <w:lvlText w:val="–"/>
-      <w:lvlJc w:val="left"/>
-      <w:pPr>
-        <w:ind w:left="2880" w:hanging="480"/>
-      </w:pPr>
-    </w:lvl>
-    <w:lvl w:ilvl="4">
-      <w:numFmt w:val="bullet"/>
-      <w:lvlText w:val="•"/>
-      <w:lvlJc w:val="left"/>
-      <w:pPr>
-        <w:ind w:left="3600" w:hanging="480"/>
-      </w:pPr>
-    </w:lvl>
-    <w:lvl w:ilvl="5">
-      <w:numFmt w:val="bullet"/>
-      <w:lvlText w:val="–"/>
-      <w:lvlJc w:val="left"/>
-      <w:pPr>
-        <w:ind w:left="4320" w:hanging="480"/>
-      </w:pPr>
-    </w:lvl>
-    <w:lvl w:ilvl="6">
-      <w:numFmt w:val="bullet"/>
-      <w:lvlText w:val="•"/>
-      <w:lvlJc w:val="left"/>
-      <w:pPr>
-        <w:ind w:left="5040" w:hanging="480"/>
-      </w:pPr>
-    </w:lvl>
-    <w:lvl w:ilvl="7">
-      <w:numFmt w:val="bullet"/>
-      <w:lvlText w:val="–"/>
-      <w:lvlJc w:val="left"/>
-      <w:pPr>
-        <w:ind w:left="5760" w:hanging="480"/>
-      </w:pPr>
-    </w:lvl>
-    <w:lvl w:ilvl="8">
-      <w:numFmt w:val="bullet"/>
-      <w:lvlText w:val="•"/>
-      <w:lvlJc w:val="left"/>
-      <w:pPr>
-        <w:ind w:left="6480" w:hanging="480"/>
-      </w:pPr>
-    </w:lvl>
-  </w:abstractNum>
-  <w:abstractNum w:abstractNumId="99411">
-    <w:nsid w:val="A99411"/>
-    <w:multiLevelType w:val="multilevel"/>
-    <w:lvl w:ilvl="0">
-      <w:start w:val="1"/>
-      <w:numFmt w:val="decimal"/>
-      <w:lvlText w:val="%1."/>
-      <w:lvlJc w:val="left"/>
-      <w:pPr>
-        <w:ind w:left="720" w:hanging="480"/>
-      </w:pPr>
-    </w:lvl>
-    <w:lvl w:ilvl="1">
-      <w:start w:val="1"/>
-      <w:numFmt w:val="decimal"/>
-      <w:lvlText w:val="%2."/>
-      <w:lvlJc w:val="left"/>
-      <w:pPr>
-        <w:ind w:left="1440" w:hanging="480"/>
-      </w:pPr>
-    </w:lvl>
-    <w:lvl w:ilvl="2">
-      <w:start w:val="1"/>
-      <w:numFmt w:val="decimal"/>
-      <w:lvlText w:val="%3."/>
-      <w:lvlJc w:val="left"/>
-      <w:pPr>
-        <w:ind w:left="2160" w:hanging="480"/>
-      </w:pPr>
-    </w:lvl>
-    <w:lvl w:ilvl="3">
-      <w:start w:val="1"/>
-      <w:numFmt w:val="decimal"/>
-      <w:lvlText w:val="%4."/>
-      <w:lvlJc w:val="left"/>
-      <w:pPr>
-        <w:ind w:left="2880" w:hanging="480"/>
-      </w:pPr>
-    </w:lvl>
-    <w:lvl w:ilvl="4">
-      <w:start w:val="1"/>
-      <w:numFmt w:val="decimal"/>
-      <w:lvlText w:val="%5."/>
-      <w:lvlJc w:val="left"/>
-      <w:pPr>
-        <w:ind w:left="3600" w:hanging="480"/>
-      </w:pPr>
-    </w:lvl>
-    <w:lvl w:ilvl="5">
-      <w:start w:val="1"/>
-      <w:numFmt w:val="decimal"/>
-      <w:lvlText w:val="%6."/>
-      <w:lvlJc w:val="left"/>
-      <w:pPr>
-        <w:ind w:left="4320" w:hanging="480"/>
-      </w:pPr>
-    </w:lvl>
-    <w:lvl w:ilvl="6">
-      <w:start w:val="1"/>
-      <w:numFmt w:val="decimal"/>
-      <w:lvlText w:val="%7."/>
-      <w:lvlJc w:val="left"/>
-      <w:pPr>
-        <w:ind w:left="5040" w:hanging="480"/>
-      </w:pPr>
-    </w:lvl>
-    <w:lvl w:ilvl="7">
-      <w:start w:val="1"/>
-      <w:numFmt w:val="decimal"/>
-      <w:lvlText w:val="%8."/>
-      <w:lvlJc w:val="left"/>
-      <w:pPr>
-        <w:ind w:left="5760" w:hanging="480"/>
-      </w:pPr>
-    </w:lvl>
-    <w:lvl w:ilvl="8">
-      <w:start w:val="1"/>
-      <w:numFmt w:val="decimal"/>
-      <w:lvlText w:val="%9."/>
-      <w:lvlJc w:val="left"/>
-      <w:pPr>
-        <w:ind w:left="6480" w:hanging="480"/>
-      </w:pPr>
-    </w:lvl>
-  </w:abstractNum>
   <w:num w:numId="1">
     <w:abstractNumId w:val="8"/>
   </w:num>
@@ -5103,39 +2553,6 @@
   </w:num>
   <w:num w:numId="1000">
     <w:abstractNumId w:val="990"/>
-  </w:num>
-  <w:num w:numId="1001">
-    <w:abstractNumId w:val="991"/>
-  </w:num>
-  <w:num w:numId="1002">
-    <w:abstractNumId w:val="99411"/>
-    <w:lvlOverride w:ilvl="0">
-      <w:startOverride w:val="1"/>
-    </w:lvlOverride>
-    <w:lvlOverride w:ilvl="1">
-      <w:startOverride w:val="1"/>
-    </w:lvlOverride>
-    <w:lvlOverride w:ilvl="2">
-      <w:startOverride w:val="1"/>
-    </w:lvlOverride>
-    <w:lvlOverride w:ilvl="3">
-      <w:startOverride w:val="1"/>
-    </w:lvlOverride>
-    <w:lvlOverride w:ilvl="4">
-      <w:startOverride w:val="1"/>
-    </w:lvlOverride>
-    <w:lvlOverride w:ilvl="5">
-      <w:startOverride w:val="1"/>
-    </w:lvlOverride>
-    <w:lvlOverride w:ilvl="6">
-      <w:startOverride w:val="1"/>
-    </w:lvlOverride>
-    <w:lvlOverride w:ilvl="7">
-      <w:startOverride w:val="1"/>
-    </w:lvlOverride>
-    <w:lvlOverride w:ilvl="8">
-      <w:startOverride w:val="1"/>
-    </w:lvlOverride>
   </w:num>
 </w:numbering>
 </file>

</xml_diff>